<commit_message>
ri lavorati scenari 1 2 e 3, il 3 da finire da rivedere
</commit_message>
<xml_diff>
--- a/Deliverables/ProblemStatement_GGEyewear.docx
+++ b/Deliverables/ProblemStatement_GGEyewear.docx
@@ -6,7 +6,7 @@
     <w:tbl>
       <w:tblPr>
         <w:tblW w:w="0" w:type="auto"/>
-        <w:tblInd w:w="55" w:type="dxa"/>
+        <w:jc w:val="center"/>
         <w:tblLayout w:type="fixed"/>
         <w:tblCellMar>
           <w:top w:w="55" w:type="dxa"/>
@@ -22,6 +22,7 @@
       <w:tr>
         <w:trPr>
           <w:trHeight w:val="480"/>
+          <w:jc w:val="center"/>
         </w:trPr>
         <w:tc>
           <w:tcPr>
@@ -45,7 +46,7 @@
           </w:p>
           <w:p>
             <w:pPr>
-              <w:jc w:val="right"/>
+              <w:jc w:val="center"/>
               <w:rPr>
                 <w:rFonts w:ascii="Arial" w:hAnsi="Arial"/>
                 <w:b/>
@@ -198,7 +199,7 @@
           <w:sz w:val="36"/>
           <w:lang w:val="en-US"/>
         </w:rPr>
-        <w:t>0</w:t>
+        <w:t>1</w:t>
       </w:r>
       <w:r>
         <w:rPr>
@@ -1276,6 +1277,12 @@
                 <w:sz w:val="20"/>
               </w:rPr>
             </w:pPr>
+            <w:r>
+              <w:rPr>
+                <w:sz w:val="20"/>
+              </w:rPr>
+              <w:t>12/10/2026</w:t>
+            </w:r>
           </w:p>
         </w:tc>
         <w:tc>
@@ -1294,6 +1301,12 @@
                 <w:sz w:val="20"/>
               </w:rPr>
             </w:pPr>
+            <w:r>
+              <w:rPr>
+                <w:sz w:val="20"/>
+              </w:rPr>
+              <w:t>1.1</w:t>
+            </w:r>
           </w:p>
         </w:tc>
         <w:tc>
@@ -1312,6 +1325,12 @@
                 <w:sz w:val="20"/>
               </w:rPr>
             </w:pPr>
+            <w:r>
+              <w:rPr>
+                <w:sz w:val="20"/>
+              </w:rPr>
+              <w:t>Aggiunta del template ufficiale</w:t>
+            </w:r>
           </w:p>
         </w:tc>
         <w:tc>
@@ -1331,6 +1350,12 @@
                 <w:sz w:val="20"/>
               </w:rPr>
             </w:pPr>
+            <w:r>
+              <w:rPr>
+                <w:sz w:val="20"/>
+              </w:rPr>
+              <w:t>Gennaro Esposito</w:t>
+            </w:r>
           </w:p>
         </w:tc>
       </w:tr>
@@ -1754,21 +1779,7 @@
             <w:rStyle w:val="Collegamentoipertestuale"/>
             <w:noProof/>
           </w:rPr>
-          <w:t xml:space="preserve">PROBLEM </w:t>
-        </w:r>
-        <w:r>
-          <w:rPr>
-            <w:rStyle w:val="Collegamentoipertestuale"/>
-            <w:noProof/>
-          </w:rPr>
-          <w:t>D</w:t>
-        </w:r>
-        <w:r>
-          <w:rPr>
-            <w:rStyle w:val="Collegamentoipertestuale"/>
-            <w:noProof/>
-          </w:rPr>
-          <w:t>OMAIN</w:t>
+          <w:t>PROBLEM DOMAIN</w:t>
         </w:r>
         <w:r>
           <w:rPr>
@@ -1938,21 +1949,7 @@
             <w:rStyle w:val="Collegamentoipertestuale"/>
             <w:noProof/>
           </w:rPr>
-          <w:t>Sce</w:t>
-        </w:r>
-        <w:r>
-          <w:rPr>
-            <w:rStyle w:val="Collegamentoipertestuale"/>
-            <w:noProof/>
-          </w:rPr>
-          <w:t>n</w:t>
-        </w:r>
-        <w:r>
-          <w:rPr>
-            <w:rStyle w:val="Collegamentoipertestuale"/>
-            <w:noProof/>
-          </w:rPr>
-          <w:t>ario 1 - Attore principale: Consumer</w:t>
+          <w:t>Scenario 1 - Attore principale: Consumer</w:t>
         </w:r>
         <w:r>
           <w:rPr>
@@ -2292,21 +2289,7 @@
             <w:rStyle w:val="Collegamentoipertestuale"/>
             <w:noProof/>
           </w:rPr>
-          <w:t>REQUI</w:t>
-        </w:r>
-        <w:r>
-          <w:rPr>
-            <w:rStyle w:val="Collegamentoipertestuale"/>
-            <w:noProof/>
-          </w:rPr>
-          <w:t>S</w:t>
-        </w:r>
-        <w:r>
-          <w:rPr>
-            <w:rStyle w:val="Collegamentoipertestuale"/>
-            <w:noProof/>
-          </w:rPr>
-          <w:t>ITI FUNZIONALI</w:t>
+          <w:t>REQUISITI FUNZIONALI</w:t>
         </w:r>
         <w:r>
           <w:rPr>
@@ -2465,6 +2448,9 @@
       </w:r>
       <w:bookmarkEnd w:id="3"/>
       <w:bookmarkEnd w:id="4"/>
+      <w:r>
+        <w:t xml:space="preserve"> (Marco)</w:t>
+      </w:r>
     </w:p>
     <w:p>
       <w:pPr>
@@ -2472,10 +2458,112 @@
         <w:ind w:left="709"/>
       </w:pPr>
       <w:r>
-        <w:t>Un cliente naviga sul sito e decide di acquistare un paio di occhiali. Clicca sul prodotto e viene portato a una pagina con il dettaglio del prodotto, contenente descrizione, colori disponibili, e la possibilità di sceglierne la quantità. Clicca il pulsante per aggiungere il modello al carrello, decide di continuare al checkout, inserisce i suoi dati per la spedizione e il pagamento. L’ordine infine viene confermato ed è possibile visualizzarlo nella pagina degli ordini effettuati</w:t>
+        <w:t>Marco</w:t>
+      </w:r>
+      <w:r>
+        <w:t xml:space="preserve"> naviga sul sito e decide di acquistare un paio di occhiali. Clicca sul prodotto e viene portato a una pagina con il dettaglio del prodotto</w:t>
+      </w:r>
+      <w:r>
+        <w:t xml:space="preserve"> selezionato</w:t>
+      </w:r>
+      <w:r>
+        <w:t>, contenente</w:t>
+      </w:r>
+      <w:r>
+        <w:t xml:space="preserve"> una foto,</w:t>
+      </w:r>
+      <w:r>
+        <w:t xml:space="preserve"> descrizione, colori disponibili</w:t>
+      </w:r>
+      <w:r>
+        <w:t xml:space="preserve"> per quel paio di occhiali</w:t>
+      </w:r>
+      <w:r>
+        <w:t xml:space="preserve">, e </w:t>
+      </w:r>
+      <w:r>
+        <w:t>un campo di scelta per la</w:t>
+      </w:r>
+      <w:r>
+        <w:t xml:space="preserve"> quantità. Clicca il pulsante per aggiungere il modello al carrello</w:t>
+      </w:r>
+      <w:r>
+        <w:t xml:space="preserve">; </w:t>
+      </w:r>
+      <w:r>
+        <w:t xml:space="preserve">una volta aggiunto </w:t>
+      </w:r>
+      <w:r>
+        <w:t>viene portato al suo carrello attuale</w:t>
+      </w:r>
+      <w:r>
+        <w:t xml:space="preserve"> dove è </w:t>
+      </w:r>
+      <w:r>
+        <w:t xml:space="preserve">presente una tabella con </w:t>
+      </w:r>
+      <w:r>
+        <w:t>gli occhiali presenti</w:t>
+      </w:r>
+      <w:r>
+        <w:t>, le rispettive quantità</w:t>
+      </w:r>
+      <w:r>
+        <w:t xml:space="preserve">, </w:t>
+      </w:r>
+      <w:r>
+        <w:t>prezzi dei singoli, e il prezzo totale</w:t>
       </w:r>
       <w:r>
         <w:t>.</w:t>
+      </w:r>
+      <w:r>
+        <w:t xml:space="preserve"> </w:t>
+      </w:r>
+      <w:r>
+        <w:t>D</w:t>
+      </w:r>
+      <w:r>
+        <w:t>a qui ha la possibilità di tornare al catalogo o procede al checkout.</w:t>
+      </w:r>
+      <w:r>
+        <w:t xml:space="preserve"> </w:t>
+      </w:r>
+      <w:r>
+        <w:t>D</w:t>
+      </w:r>
+      <w:r>
+        <w:t>ecide di continuare al checkout</w:t>
+      </w:r>
+      <w:r>
+        <w:t xml:space="preserve">; dato che non ha mai effettuato il login viene re indirizzato alla pagina dove deve inserire il nome utente associato al suo account, scelto </w:t>
+      </w:r>
+      <w:r>
+        <w:t>da lui al</w:t>
+      </w:r>
+      <w:r>
+        <w:t xml:space="preserve"> momento della registrazione, e la password</w:t>
+      </w:r>
+      <w:r>
+        <w:t xml:space="preserve">, </w:t>
+      </w:r>
+      <w:r>
+        <w:t xml:space="preserve">che sarà oscurata. Il login va a </w:t>
+      </w:r>
+      <w:r>
+        <w:t>buon fine e viene portato alla pagina di checkout, dove sono presenti i campi per l’inserimento dell’indirizzo di spedizione (via, numero civico, città e regione) e quelli per il numero della carta (che è l’unico metodo di pagamento disponibile).</w:t>
+      </w:r>
+      <w:r>
+        <w:t xml:space="preserve"> </w:t>
+      </w:r>
+      <w:r>
+        <w:t>Inserisce i suddetti dati.</w:t>
+      </w:r>
+      <w:r>
+        <w:t xml:space="preserve"> </w:t>
+      </w:r>
+      <w:r>
+        <w:t xml:space="preserve">Se i dati inseriti rispettano i requisiti (indirizzo di spedizione e carta in formati validi) l’ordine viene confermato e Marco viene portato alla pagina dei suoi ordini, assieme a un messaggio di conferma che assicura che l’ordine è andato a buon fine </w:t>
       </w:r>
     </w:p>
     <w:p>
@@ -2494,6 +2582,9 @@
         <w:t>Scenario 2 - Attore principale: Order Manager</w:t>
       </w:r>
       <w:bookmarkEnd w:id="5"/>
+      <w:r>
+        <w:t xml:space="preserve"> (Antonio)</w:t>
+      </w:r>
     </w:p>
     <w:p>
       <w:pPr>
@@ -2501,10 +2592,70 @@
         <w:ind w:left="709"/>
       </w:pPr>
       <w:r>
-        <w:t>Il dipendente preposto al ruolo di Manager degli Ordini, che lavora nel negozio fisico, vede sul sito nella sua area dedicata che un cliente ha ordinato un prodotto. Prende i prodotti ordinati e crea il pacco fisico che verrà spedito, e cambia lo stato dell’ordine da “in lavorazione” a “spedito”</w:t>
-      </w:r>
-      <w:r>
-        <w:t>.</w:t>
+        <w:t>Antonio è il dipendente</w:t>
+      </w:r>
+      <w:r>
+        <w:t xml:space="preserve"> preposto al ruolo di Manager degli Ordini</w:t>
+      </w:r>
+      <w:r>
+        <w:t xml:space="preserve">; lavora nel negozio fisico. Ogni giorno </w:t>
+      </w:r>
+      <w:r>
+        <w:t xml:space="preserve">a un orario prestabilito </w:t>
+      </w:r>
+      <w:r>
+        <w:t>entra</w:t>
+      </w:r>
+      <w:r>
+        <w:t xml:space="preserve"> dalla pagina ordinaria di login,</w:t>
+      </w:r>
+      <w:r>
+        <w:t xml:space="preserve"> </w:t>
+      </w:r>
+      <w:r>
+        <w:t>con nome utente e password che corrispondono a</w:t>
+      </w:r>
+      <w:r>
+        <w:t>l</w:t>
+      </w:r>
+      <w:r>
+        <w:t xml:space="preserve"> </w:t>
+      </w:r>
+      <w:r>
+        <w:t>singolo</w:t>
+      </w:r>
+      <w:r>
+        <w:t xml:space="preserve"> ruolo di Order Manager</w:t>
+      </w:r>
+      <w:r>
+        <w:t>,</w:t>
+      </w:r>
+      <w:r>
+        <w:t xml:space="preserve"> </w:t>
+      </w:r>
+      <w:r>
+        <w:t>nella sua area di gestione sul sito</w:t>
+      </w:r>
+      <w:r>
+        <w:t xml:space="preserve">, </w:t>
+      </w:r>
+      <w:r>
+        <w:t>dove gli è possibile vedere una tabella con gli ordini effettuati, e all’interno di ogni riga sono presenti il nome e il cognome del cliente, l’indirizzo di spedizione, i prodotti ordinati e un pulsante per modificare lo stato dell’ordine. Antonio vede che un cliente ha ordinato un nuovo modello di occhiali aggiunto da poco</w:t>
+      </w:r>
+      <w:r>
+        <w:t>: lo stato dell’ordine è di default a “in lavorazione”</w:t>
+      </w:r>
+      <w:r>
+        <w:t xml:space="preserve">. </w:t>
+      </w:r>
+      <w:r>
+        <w:t>Va nel magazzino del negozio e p</w:t>
+      </w:r>
+      <w:r>
+        <w:t xml:space="preserve">rende </w:t>
+      </w:r>
+      <w:r>
+        <w:t>gli occhiali ordinati, li incarta, mette l’etichetta sul pacco e aspetta che venga spedito. Appena ottiene la conferma della spedizione del pacco aggiorna lo stato dell’ordine in “completato”</w:t>
       </w:r>
     </w:p>
     <w:p>
@@ -2523,6 +2674,9 @@
         <w:t>Scenario 3 - Attore principale: Product Manager</w:t>
       </w:r>
       <w:bookmarkEnd w:id="6"/>
+      <w:r>
+        <w:t xml:space="preserve"> (Vittoria)</w:t>
+      </w:r>
     </w:p>
     <w:p>
       <w:pPr>
@@ -2530,10 +2684,77 @@
         <w:ind w:left="709"/>
       </w:pPr>
       <w:r>
-        <w:t>Il product manager dopo aver comunicato con un fornitore, e finalizzato un accordo, ottiene la merce al negozio e la carica sul sito dalla sua area personale. Oltre al nome, descrizione e modello del prodotto è possibile aggiungere un tag che lo identifica come “esclusiva online” o “scontato”</w:t>
+        <w:t>Vittoria decide di voler portare una nuova linea di occhiali come prodotto disponibile solo sul negozio online per attrarre li nuova clientela. D</w:t>
+      </w:r>
+      <w:r>
+        <w:t xml:space="preserve">opo aver </w:t>
+      </w:r>
+      <w:r>
+        <w:t>fissato un incontro</w:t>
+      </w:r>
+      <w:r>
+        <w:t xml:space="preserve"> con un </w:t>
+      </w:r>
+      <w:r>
+        <w:lastRenderedPageBreak/>
+        <w:t xml:space="preserve">fornitore, e finalizzato un accordo, ottiene la </w:t>
+      </w:r>
+      <w:r>
+        <w:t>nuova merce</w:t>
+      </w:r>
+      <w:r>
+        <w:t xml:space="preserve"> </w:t>
+      </w:r>
+      <w:r>
+        <w:t>in</w:t>
+      </w:r>
+      <w:r>
+        <w:t xml:space="preserve"> negozio</w:t>
       </w:r>
       <w:r>
         <w:t>.</w:t>
+      </w:r>
+      <w:r>
+        <w:t xml:space="preserve"> </w:t>
+      </w:r>
+      <w:r>
+        <w:t xml:space="preserve">Ora questi prodotti vanno aggiunti al sito in modo che siano effettivamente acquistabili. </w:t>
+      </w:r>
+      <w:r>
+        <w:t>Accede</w:t>
+      </w:r>
+      <w:r>
+        <w:t xml:space="preserve"> dalla normale area di login,</w:t>
+      </w:r>
+      <w:r>
+        <w:t xml:space="preserve"> </w:t>
+      </w:r>
+      <w:r>
+        <w:t xml:space="preserve">con nome utente e password che corrispondono al singolo ruolo di </w:t>
+      </w:r>
+      <w:r>
+        <w:t>Product</w:t>
+      </w:r>
+      <w:r>
+        <w:t xml:space="preserve"> Manager</w:t>
+      </w:r>
+      <w:r>
+        <w:t xml:space="preserve">, e viene portata alla sua area gestionale che presenta </w:t>
+      </w:r>
+      <w:r>
+        <w:t xml:space="preserve">tutti i </w:t>
+      </w:r>
+      <w:r>
+        <w:t>prodott</w:t>
+      </w:r>
+      <w:r>
+        <w:t>i</w:t>
+      </w:r>
+      <w:r>
+        <w:t xml:space="preserve"> (quindi un modello di occhiale acquistabile sul sito), il nome, l’immagine, una descrizione, i colori disponibili, il prezzo e la quantità disponibile. Inoltre è presente un pulsante per aggiungere un nuovo prodotto. Clicca quest’ultimo e viene portata a una nuova pagina dove vengono presentati i suddetti campi da compilare in relazione al prodotto che si vuole aggiungere. Continua la compilazione per uno degli occhiali appartenenti alla nuova linea e infine clicca “aggiungi prodotto”</w:t>
+      </w:r>
+      <w:r>
+        <w:t>. Successivamente</w:t>
       </w:r>
     </w:p>
     <w:p>
@@ -2611,7 +2832,6 @@
         <w:ind w:hanging="294"/>
       </w:pPr>
       <w:r>
-        <w:lastRenderedPageBreak/>
         <w:t>l cliente deve poter visualizzare lo storico dei propri ordini e consultare in tempo reale lo stato degli ordini</w:t>
       </w:r>
     </w:p>
@@ -3224,7 +3444,7 @@
         <v:path o:extrusionok="f" gradientshapeok="t" o:connecttype="rect"/>
         <o:lock v:ext="edit" aspectratio="t"/>
       </v:shapetype>
-      <v:shape id="_x0000_i1025" type="#_x0000_t75" style="width:320.25pt;height:249.75pt" o:bullet="t" filled="t">
+      <v:shape id="_x0000_i1080" type="#_x0000_t75" style="width:320.4pt;height:249.6pt" o:bullet="t" filled="t">
         <v:fill color2="black"/>
         <v:imagedata r:id="rId1" o:title=""/>
       </v:shape>

</xml_diff>

<commit_message>
Aggiunta dei requisiti non funzionali nel ProblemStatement
</commit_message>
<xml_diff>
--- a/Deliverables/ProblemStatement_GGEyewear.docx
+++ b/Deliverables/ProblemStatement_GGEyewear.docx
@@ -1,6 +1,6 @@
 
 <file path=word/document.xml><?xml version="1.0" encoding="utf-8"?>
-<w:document xmlns:wpc="http://schemas.microsoft.com/office/word/2010/wordprocessingCanvas" xmlns:cx="http://schemas.microsoft.com/office/drawing/2014/chartex" xmlns:cx1="http://schemas.microsoft.com/office/drawing/2015/9/8/chartex" xmlns:cx2="http://schemas.microsoft.com/office/drawing/2015/10/21/chartex" xmlns:cx3="http://schemas.microsoft.com/office/drawing/2016/5/9/chartex" xmlns:cx4="http://schemas.microsoft.com/office/drawing/2016/5/10/chartex" xmlns:cx5="http://schemas.microsoft.com/office/drawing/2016/5/11/chartex" xmlns:cx6="http://schemas.microsoft.com/office/drawing/2016/5/12/chartex" xmlns:cx7="http://schemas.microsoft.com/office/drawing/2016/5/13/chartex" xmlns:cx8="http://schemas.microsoft.com/office/drawing/2016/5/14/chartex" xmlns:mc="http://schemas.openxmlformats.org/markup-compatibility/2006" xmlns:aink="http://schemas.microsoft.com/office/drawing/2016/ink" xmlns:am3d="http://schemas.microsoft.com/office/drawing/2017/model3d" xmlns:o="urn:schemas-microsoft-com:office:office" xmlns:oel="http://schemas.microsoft.com/office/2019/extlst" xmlns:r="http://schemas.openxmlformats.org/officeDocument/2006/relationships" xmlns:m="http://schemas.openxmlformats.org/officeDocument/2006/math" xmlns:v="urn:schemas-microsoft-com:vml" xmlns:wp14="http://schemas.microsoft.com/office/word/2010/wordprocessingDrawing" xmlns:wp="http://schemas.openxmlformats.org/drawingml/2006/wordprocessingDrawing" xmlns:w10="urn:schemas-microsoft-com:office:word" xmlns:w="http://schemas.openxmlformats.org/wordprocessingml/2006/main" xmlns:w14="http://schemas.microsoft.com/office/word/2010/wordml" xmlns:w15="http://schemas.microsoft.com/office/word/2012/wordml" xmlns:w16cex="http://schemas.microsoft.com/office/word/2018/wordml/cex" xmlns:w16cid="http://schemas.microsoft.com/office/word/2016/wordml/cid" xmlns:w16="http://schemas.microsoft.com/office/word/2018/wordml" xmlns:w16du="http://schemas.microsoft.com/office/word/2023/wordml/word16du" xmlns:w16sdtdh="http://schemas.microsoft.com/office/word/2020/wordml/sdtdatahash" xmlns:w16sdtfl="http://schemas.microsoft.com/office/word/2024/wordml/sdtformatlock" xmlns:w16se="http://schemas.microsoft.com/office/word/2015/wordml/symex" xmlns:wpg="http://schemas.microsoft.com/office/word/2010/wordprocessingGroup" xmlns:wpi="http://schemas.microsoft.com/office/word/2010/wordprocessingInk" xmlns:wne="http://schemas.microsoft.com/office/word/2006/wordml" xmlns:wps="http://schemas.microsoft.com/office/word/2010/wordprocessingShape" mc:Ignorable="w14 w15 w16se w16cid w16 w16cex w16sdtdh w16sdtfl w16du wp14">
+<w:document xmlns:wpc="http://schemas.microsoft.com/office/word/2010/wordprocessingCanvas" xmlns:cx="http://schemas.microsoft.com/office/drawing/2014/chartex" xmlns:cx1="http://schemas.microsoft.com/office/drawing/2015/9/8/chartex" xmlns:cx2="http://schemas.microsoft.com/office/drawing/2015/10/21/chartex" xmlns:cx3="http://schemas.microsoft.com/office/drawing/2016/5/9/chartex" xmlns:cx4="http://schemas.microsoft.com/office/drawing/2016/5/10/chartex" xmlns:cx5="http://schemas.microsoft.com/office/drawing/2016/5/11/chartex" xmlns:cx6="http://schemas.microsoft.com/office/drawing/2016/5/12/chartex" xmlns:cx7="http://schemas.microsoft.com/office/drawing/2016/5/13/chartex" xmlns:cx8="http://schemas.microsoft.com/office/drawing/2016/5/14/chartex" xmlns:mc="http://schemas.openxmlformats.org/markup-compatibility/2006" xmlns:m="http://schemas.openxmlformats.org/officeDocument/2006/math" xmlns:aink="http://schemas.microsoft.com/office/drawing/2016/ink" xmlns:am3d="http://schemas.microsoft.com/office/drawing/2017/model3d" xmlns:oel="http://schemas.microsoft.com/office/2019/extlst" xmlns:r="http://schemas.openxmlformats.org/officeDocument/2006/relationships" xmlns:wp14="http://schemas.microsoft.com/office/word/2010/wordprocessingDrawing" xmlns:wp="http://schemas.openxmlformats.org/drawingml/2006/wordprocessingDrawing" xmlns:wpg="http://schemas.microsoft.com/office/word/2010/wordprocessingGroup" xmlns:wpi="http://schemas.microsoft.com/office/word/2010/wordprocessingInk" xmlns:wps="http://schemas.microsoft.com/office/word/2010/wordprocessingShape" xmlns:o="urn:schemas-microsoft-com:office:office" xmlns:v="urn:schemas-microsoft-com:vml" xmlns:w10="urn:schemas-microsoft-com:office:word" xmlns:w="http://schemas.openxmlformats.org/wordprocessingml/2006/main" xmlns:w14="http://schemas.microsoft.com/office/word/2010/wordml" xmlns:w15="http://schemas.microsoft.com/office/word/2012/wordml" xmlns:w16cex="http://schemas.microsoft.com/office/word/2018/wordml/cex" xmlns:w16cid="http://schemas.microsoft.com/office/word/2016/wordml/cid" xmlns:w16="http://schemas.microsoft.com/office/word/2018/wordml" xmlns:w16sdtdh="http://schemas.microsoft.com/office/word/2020/wordml/sdtdatahash" xmlns:w16sdtfl="http://schemas.microsoft.com/office/word/2024/wordml/sdtformatlock" xmlns:w16se="http://schemas.microsoft.com/office/word/2015/wordml/symex" xmlns:w16du="http://schemas.microsoft.com/office/word/2023/wordml/word16du" xmlns:wne="http://schemas.microsoft.com/office/word/2006/wordml" mc:Ignorable="w14 w15 w16se w16cid w16 w16cex w16sdtdh w16sdtfl w16du wp14">
   <w:body>
     <w:p/>
     <w:tbl>
@@ -153,26 +153,7 @@
           <w:lang w:val="en-US"/>
         </w:rPr>
         <w:br/>
-      </w:r>
-      <w:proofErr w:type="spellStart"/>
-      <w:r>
-        <w:rPr>
-          <w:rFonts w:ascii="Arial" w:hAnsi="Arial"/>
-          <w:b/>
-          <w:sz w:val="36"/>
-          <w:lang w:val="en-US"/>
-        </w:rPr>
-        <w:t>Versione</w:t>
-      </w:r>
-      <w:proofErr w:type="spellEnd"/>
-      <w:r>
-        <w:rPr>
-          <w:rFonts w:ascii="Arial" w:hAnsi="Arial"/>
-          <w:b/>
-          <w:sz w:val="36"/>
-          <w:lang w:val="en-US"/>
-        </w:rPr>
-        <w:t xml:space="preserve"> </w:t>
+        <w:t xml:space="preserve">Versione </w:t>
       </w:r>
       <w:r>
         <w:rPr>
@@ -199,7 +180,7 @@
           <w:sz w:val="36"/>
           <w:lang w:val="en-US"/>
         </w:rPr>
-        <w:t>1</w:t>
+        <w:t>2</w:t>
       </w:r>
       <w:r>
         <w:rPr>
@@ -387,7 +368,13 @@
         <w:rPr>
           <w:sz w:val="32"/>
         </w:rPr>
-        <w:t>10</w:t>
+        <w:t>1</w:t>
+      </w:r>
+      <w:r>
+        <w:rPr>
+          <w:sz w:val="32"/>
+        </w:rPr>
+        <w:t>2</w:t>
       </w:r>
       <w:r>
         <w:rPr>
@@ -1174,49 +1161,7 @@
               <w:rPr>
                 <w:sz w:val="20"/>
               </w:rPr>
-              <w:t xml:space="preserve">del </w:t>
-            </w:r>
-            <w:proofErr w:type="spellStart"/>
-            <w:r>
-              <w:rPr>
-                <w:sz w:val="20"/>
-              </w:rPr>
-              <w:t>problem</w:t>
-            </w:r>
-            <w:proofErr w:type="spellEnd"/>
-            <w:r>
-              <w:rPr>
-                <w:sz w:val="20"/>
-              </w:rPr>
-              <w:t xml:space="preserve"> </w:t>
-            </w:r>
-            <w:proofErr w:type="spellStart"/>
-            <w:r>
-              <w:rPr>
-                <w:sz w:val="20"/>
-              </w:rPr>
-              <w:t>statement</w:t>
-            </w:r>
-            <w:proofErr w:type="spellEnd"/>
-            <w:r>
-              <w:rPr>
-                <w:sz w:val="20"/>
-              </w:rPr>
-              <w:t xml:space="preserve"> con </w:t>
-            </w:r>
-            <w:proofErr w:type="spellStart"/>
-            <w:r>
-              <w:rPr>
-                <w:sz w:val="20"/>
-              </w:rPr>
-              <w:t>problem</w:t>
-            </w:r>
-            <w:proofErr w:type="spellEnd"/>
-            <w:r>
-              <w:rPr>
-                <w:sz w:val="20"/>
-              </w:rPr>
-              <w:t xml:space="preserve"> domain, scenari possibili e requisiti funzionali (</w:t>
+              <w:t>del problem statement con problem domain, scenari possibili e requisiti funzionali (</w:t>
             </w:r>
             <w:r>
               <w:rPr>
@@ -1355,6 +1300,108 @@
                 <w:sz w:val="20"/>
               </w:rPr>
               <w:t>Gennaro Esposito</w:t>
+            </w:r>
+          </w:p>
+        </w:tc>
+      </w:tr>
+      <w:tr>
+        <w:trPr>
+          <w:trHeight w:val="230"/>
+        </w:trPr>
+        <w:tc>
+          <w:tcPr>
+            <w:tcW w:w="1927" w:type="dxa"/>
+            <w:vMerge w:val="restart"/>
+            <w:tcBorders>
+              <w:left w:val="single" w:sz="1" w:space="0" w:color="000000"/>
+              <w:bottom w:val="single" w:sz="1" w:space="0" w:color="000000"/>
+            </w:tcBorders>
+          </w:tcPr>
+          <w:p>
+            <w:pPr>
+              <w:pStyle w:val="Contenutotabella"/>
+              <w:rPr>
+                <w:sz w:val="20"/>
+              </w:rPr>
+            </w:pPr>
+            <w:r>
+              <w:rPr>
+                <w:sz w:val="20"/>
+              </w:rPr>
+              <w:t>12/10/2026</w:t>
+            </w:r>
+          </w:p>
+        </w:tc>
+        <w:tc>
+          <w:tcPr>
+            <w:tcW w:w="964" w:type="dxa"/>
+            <w:vMerge w:val="restart"/>
+            <w:tcBorders>
+              <w:left w:val="single" w:sz="1" w:space="0" w:color="000000"/>
+              <w:bottom w:val="single" w:sz="1" w:space="0" w:color="000000"/>
+            </w:tcBorders>
+          </w:tcPr>
+          <w:p>
+            <w:pPr>
+              <w:pStyle w:val="Contenutotabella"/>
+              <w:rPr>
+                <w:sz w:val="20"/>
+              </w:rPr>
+            </w:pPr>
+            <w:r>
+              <w:rPr>
+                <w:sz w:val="20"/>
+              </w:rPr>
+              <w:t>1.2</w:t>
+            </w:r>
+          </w:p>
+        </w:tc>
+        <w:tc>
+          <w:tcPr>
+            <w:tcW w:w="4336" w:type="dxa"/>
+            <w:vMerge w:val="restart"/>
+            <w:tcBorders>
+              <w:left w:val="single" w:sz="1" w:space="0" w:color="000000"/>
+              <w:bottom w:val="single" w:sz="1" w:space="0" w:color="000000"/>
+            </w:tcBorders>
+          </w:tcPr>
+          <w:p>
+            <w:pPr>
+              <w:pStyle w:val="Contenutotabella"/>
+              <w:rPr>
+                <w:sz w:val="20"/>
+              </w:rPr>
+            </w:pPr>
+            <w:r>
+              <w:rPr>
+                <w:sz w:val="20"/>
+              </w:rPr>
+              <w:t>Aggiunta dei requisiti non funzionali</w:t>
+            </w:r>
+          </w:p>
+        </w:tc>
+        <w:tc>
+          <w:tcPr>
+            <w:tcW w:w="2410" w:type="dxa"/>
+            <w:vMerge w:val="restart"/>
+            <w:tcBorders>
+              <w:left w:val="single" w:sz="1" w:space="0" w:color="000000"/>
+              <w:bottom w:val="single" w:sz="1" w:space="0" w:color="000000"/>
+              <w:right w:val="single" w:sz="1" w:space="0" w:color="000000"/>
+            </w:tcBorders>
+          </w:tcPr>
+          <w:p>
+            <w:pPr>
+              <w:pStyle w:val="Contenutotabella"/>
+              <w:rPr>
+                <w:sz w:val="20"/>
+              </w:rPr>
+            </w:pPr>
+            <w:r>
+              <w:rPr>
+                <w:sz w:val="20"/>
+              </w:rPr>
+              <w:t>Gerardo Vertolomo</w:t>
             </w:r>
           </w:p>
         </w:tc>
@@ -1593,84 +1640,6 @@
           </w:p>
         </w:tc>
       </w:tr>
-      <w:tr>
-        <w:trPr>
-          <w:trHeight w:val="230"/>
-        </w:trPr>
-        <w:tc>
-          <w:tcPr>
-            <w:tcW w:w="1927" w:type="dxa"/>
-            <w:vMerge w:val="restart"/>
-            <w:tcBorders>
-              <w:left w:val="single" w:sz="1" w:space="0" w:color="000000"/>
-              <w:bottom w:val="single" w:sz="1" w:space="0" w:color="000000"/>
-            </w:tcBorders>
-          </w:tcPr>
-          <w:p>
-            <w:pPr>
-              <w:pStyle w:val="Contenutotabella"/>
-              <w:rPr>
-                <w:sz w:val="20"/>
-              </w:rPr>
-            </w:pPr>
-          </w:p>
-        </w:tc>
-        <w:tc>
-          <w:tcPr>
-            <w:tcW w:w="964" w:type="dxa"/>
-            <w:vMerge w:val="restart"/>
-            <w:tcBorders>
-              <w:left w:val="single" w:sz="1" w:space="0" w:color="000000"/>
-              <w:bottom w:val="single" w:sz="1" w:space="0" w:color="000000"/>
-            </w:tcBorders>
-          </w:tcPr>
-          <w:p>
-            <w:pPr>
-              <w:pStyle w:val="Contenutotabella"/>
-              <w:rPr>
-                <w:sz w:val="20"/>
-              </w:rPr>
-            </w:pPr>
-          </w:p>
-        </w:tc>
-        <w:tc>
-          <w:tcPr>
-            <w:tcW w:w="4336" w:type="dxa"/>
-            <w:vMerge w:val="restart"/>
-            <w:tcBorders>
-              <w:left w:val="single" w:sz="1" w:space="0" w:color="000000"/>
-              <w:bottom w:val="single" w:sz="1" w:space="0" w:color="000000"/>
-            </w:tcBorders>
-          </w:tcPr>
-          <w:p>
-            <w:pPr>
-              <w:pStyle w:val="Contenutotabella"/>
-              <w:rPr>
-                <w:sz w:val="20"/>
-              </w:rPr>
-            </w:pPr>
-          </w:p>
-        </w:tc>
-        <w:tc>
-          <w:tcPr>
-            <w:tcW w:w="2410" w:type="dxa"/>
-            <w:vMerge w:val="restart"/>
-            <w:tcBorders>
-              <w:left w:val="single" w:sz="1" w:space="0" w:color="000000"/>
-              <w:bottom w:val="single" w:sz="1" w:space="0" w:color="000000"/>
-              <w:right w:val="single" w:sz="1" w:space="0" w:color="000000"/>
-            </w:tcBorders>
-          </w:tcPr>
-          <w:p>
-            <w:pPr>
-              <w:pStyle w:val="Contenutotabella"/>
-              <w:rPr>
-                <w:sz w:val="20"/>
-              </w:rPr>
-            </w:pPr>
-          </w:p>
-        </w:tc>
-      </w:tr>
     </w:tbl>
     <w:p>
       <w:pPr>
@@ -1758,7 +1727,7 @@
       <w:r>
         <w:fldChar w:fldCharType="separate"/>
       </w:r>
-      <w:hyperlink w:anchor="_Toc242705596" w:history="1">
+      <w:hyperlink w:anchor="_Toc242726268" w:history="1">
         <w:r>
           <w:rPr>
             <w:rStyle w:val="Collegamentoipertestuale"/>
@@ -1800,7 +1769,7 @@
             <w:noProof/>
             <w:webHidden/>
           </w:rPr>
-          <w:instrText xml:space="preserve"> PAGEREF _Toc242705596 \h </w:instrText>
+          <w:instrText xml:space="preserve"> PAGEREF _Toc242726268 \h </w:instrText>
         </w:r>
         <w:r>
           <w:rPr>
@@ -1843,7 +1812,7 @@
           <w:kern w:val="2"/>
         </w:rPr>
       </w:pPr>
-      <w:hyperlink w:anchor="_Toc242705597" w:history="1">
+      <w:hyperlink w:anchor="_Toc242726269" w:history="1">
         <w:r>
           <w:rPr>
             <w:rStyle w:val="Collegamentoipertestuale"/>
@@ -1885,7 +1854,7 @@
             <w:noProof/>
             <w:webHidden/>
           </w:rPr>
-          <w:instrText xml:space="preserve"> PAGEREF _Toc242705597 \h </w:instrText>
+          <w:instrText xml:space="preserve"> PAGEREF _Toc242726269 \h </w:instrText>
         </w:r>
         <w:r>
           <w:rPr>
@@ -1928,7 +1897,7 @@
           <w:kern w:val="2"/>
         </w:rPr>
       </w:pPr>
-      <w:hyperlink w:anchor="_Toc242705598" w:history="1">
+      <w:hyperlink w:anchor="_Toc242726270" w:history="1">
         <w:r>
           <w:rPr>
             <w:rStyle w:val="Collegamentoipertestuale"/>
@@ -1949,7 +1918,14 @@
             <w:rStyle w:val="Collegamentoipertestuale"/>
             <w:noProof/>
           </w:rPr>
-          <w:t>Scenario 1 - Attore principale: Consumer</w:t>
+          <w:t>Scenario 1 - Attore principale: Consumer (Marco</w:t>
+        </w:r>
+        <w:r>
+          <w:rPr>
+            <w:rStyle w:val="Collegamentoipertestuale"/>
+            <w:noProof/>
+          </w:rPr>
+          <w:t>)</w:t>
         </w:r>
         <w:r>
           <w:rPr>
@@ -1970,7 +1946,7 @@
             <w:noProof/>
             <w:webHidden/>
           </w:rPr>
-          <w:instrText xml:space="preserve"> PAGEREF _Toc242705598 \h </w:instrText>
+          <w:instrText xml:space="preserve"> PAGEREF _Toc242726270 \h </w:instrText>
         </w:r>
         <w:r>
           <w:rPr>
@@ -2013,7 +1989,7 @@
           <w:kern w:val="2"/>
         </w:rPr>
       </w:pPr>
-      <w:hyperlink w:anchor="_Toc242705599" w:history="1">
+      <w:hyperlink w:anchor="_Toc242726271" w:history="1">
         <w:r>
           <w:rPr>
             <w:rStyle w:val="Collegamentoipertestuale"/>
@@ -2034,7 +2010,7 @@
             <w:rStyle w:val="Collegamentoipertestuale"/>
             <w:noProof/>
           </w:rPr>
-          <w:t>Scenario 2 - Attore principale: Order Manager</w:t>
+          <w:t>Scenario 2 - Attore principale: Order Manager (Antonio)</w:t>
         </w:r>
         <w:r>
           <w:rPr>
@@ -2055,7 +2031,7 @@
             <w:noProof/>
             <w:webHidden/>
           </w:rPr>
-          <w:instrText xml:space="preserve"> PAGEREF _Toc242705599 \h </w:instrText>
+          <w:instrText xml:space="preserve"> PAGEREF _Toc242726271 \h </w:instrText>
         </w:r>
         <w:r>
           <w:rPr>
@@ -2098,7 +2074,7 @@
           <w:kern w:val="2"/>
         </w:rPr>
       </w:pPr>
-      <w:hyperlink w:anchor="_Toc242705600" w:history="1">
+      <w:hyperlink w:anchor="_Toc242726272" w:history="1">
         <w:r>
           <w:rPr>
             <w:rStyle w:val="Collegamentoipertestuale"/>
@@ -2119,7 +2095,7 @@
             <w:rStyle w:val="Collegamentoipertestuale"/>
             <w:noProof/>
           </w:rPr>
-          <w:t>Scenario 3 - Attore principale: Product Manager</w:t>
+          <w:t>Scenario 3 - Attore principale: Product Manager (Vittoria)</w:t>
         </w:r>
         <w:r>
           <w:rPr>
@@ -2140,7 +2116,7 @@
             <w:noProof/>
             <w:webHidden/>
           </w:rPr>
-          <w:instrText xml:space="preserve"> PAGEREF _Toc242705600 \h </w:instrText>
+          <w:instrText xml:space="preserve"> PAGEREF _Toc242726272 \h </w:instrText>
         </w:r>
         <w:r>
           <w:rPr>
@@ -2183,7 +2159,7 @@
           <w:kern w:val="2"/>
         </w:rPr>
       </w:pPr>
-      <w:hyperlink w:anchor="_Toc242705601" w:history="1">
+      <w:hyperlink w:anchor="_Toc242726273" w:history="1">
         <w:r>
           <w:rPr>
             <w:rStyle w:val="Collegamentoipertestuale"/>
@@ -2225,7 +2201,7 @@
             <w:noProof/>
             <w:webHidden/>
           </w:rPr>
-          <w:instrText xml:space="preserve"> PAGEREF _Toc242705601 \h </w:instrText>
+          <w:instrText xml:space="preserve"> PAGEREF _Toc242726273 \h </w:instrText>
         </w:r>
         <w:r>
           <w:rPr>
@@ -2245,7 +2221,7 @@
             <w:noProof/>
             <w:webHidden/>
           </w:rPr>
-          <w:t>4</w:t>
+          <w:t>5</w:t>
         </w:r>
         <w:r>
           <w:rPr>
@@ -2268,7 +2244,7 @@
           <w:kern w:val="2"/>
         </w:rPr>
       </w:pPr>
-      <w:hyperlink w:anchor="_Toc242705602" w:history="1">
+      <w:hyperlink w:anchor="_Toc242726274" w:history="1">
         <w:r>
           <w:rPr>
             <w:rStyle w:val="Collegamentoipertestuale"/>
@@ -2310,7 +2286,7 @@
             <w:noProof/>
             <w:webHidden/>
           </w:rPr>
-          <w:instrText xml:space="preserve"> PAGEREF _Toc242705602 \h </w:instrText>
+          <w:instrText xml:space="preserve"> PAGEREF _Toc242726274 \h </w:instrText>
         </w:r>
         <w:r>
           <w:rPr>
@@ -2330,7 +2306,92 @@
             <w:noProof/>
             <w:webHidden/>
           </w:rPr>
-          <w:t>4</w:t>
+          <w:t>5</w:t>
+        </w:r>
+        <w:r>
+          <w:rPr>
+            <w:noProof/>
+            <w:webHidden/>
+          </w:rPr>
+          <w:fldChar w:fldCharType="end"/>
+        </w:r>
+      </w:hyperlink>
+    </w:p>
+    <w:p>
+      <w:pPr>
+        <w:pStyle w:val="Sommario1"/>
+        <w:tabs>
+          <w:tab w:val="left" w:pos="566"/>
+        </w:tabs>
+        <w:rPr>
+          <w:rFonts w:ascii="Aptos" w:eastAsia="Times New Roman" w:hAnsi="Aptos" w:cs="Times New Roman"/>
+          <w:noProof/>
+          <w:kern w:val="2"/>
+        </w:rPr>
+      </w:pPr>
+      <w:hyperlink w:anchor="_Toc242726275" w:history="1">
+        <w:r>
+          <w:rPr>
+            <w:rStyle w:val="Collegamentoipertestuale"/>
+            <w:noProof/>
+          </w:rPr>
+          <w:t>4.</w:t>
+        </w:r>
+        <w:r>
+          <w:rPr>
+            <w:rFonts w:ascii="Aptos" w:eastAsia="Times New Roman" w:hAnsi="Aptos" w:cs="Times New Roman"/>
+            <w:noProof/>
+            <w:kern w:val="2"/>
+          </w:rPr>
+          <w:tab/>
+        </w:r>
+        <w:r>
+          <w:rPr>
+            <w:rStyle w:val="Collegamentoipertestuale"/>
+            <w:noProof/>
+          </w:rPr>
+          <w:t>REQUISITI NON FUNZIONALI</w:t>
+        </w:r>
+        <w:r>
+          <w:rPr>
+            <w:noProof/>
+            <w:webHidden/>
+          </w:rPr>
+          <w:tab/>
+        </w:r>
+        <w:r>
+          <w:rPr>
+            <w:noProof/>
+            <w:webHidden/>
+          </w:rPr>
+          <w:fldChar w:fldCharType="begin"/>
+        </w:r>
+        <w:r>
+          <w:rPr>
+            <w:noProof/>
+            <w:webHidden/>
+          </w:rPr>
+          <w:instrText xml:space="preserve"> PAGEREF _Toc242726275 \h </w:instrText>
+        </w:r>
+        <w:r>
+          <w:rPr>
+            <w:noProof/>
+            <w:webHidden/>
+          </w:rPr>
+        </w:r>
+        <w:r>
+          <w:rPr>
+            <w:noProof/>
+            <w:webHidden/>
+          </w:rPr>
+          <w:fldChar w:fldCharType="separate"/>
+        </w:r>
+        <w:r>
+          <w:rPr>
+            <w:noProof/>
+            <w:webHidden/>
+          </w:rPr>
+          <w:t>6</w:t>
         </w:r>
         <w:r>
           <w:rPr>
@@ -2387,7 +2448,7 @@
         <w:jc w:val="left"/>
       </w:pPr>
       <w:bookmarkStart w:id="0" w:name="_Ref242705112"/>
-      <w:bookmarkStart w:id="1" w:name="_Toc242705596"/>
+      <w:bookmarkStart w:id="1" w:name="_Toc242726268"/>
       <w:r>
         <w:lastRenderedPageBreak/>
         <w:t>PROBLEM DOMAIN</w:t>
@@ -2424,7 +2485,7 @@
         <w:ind w:left="426" w:hanging="426"/>
         <w:jc w:val="left"/>
       </w:pPr>
-      <w:bookmarkStart w:id="2" w:name="_Toc242705597"/>
+      <w:bookmarkStart w:id="2" w:name="_Toc242726269"/>
       <w:r>
         <w:t>SCENARI</w:t>
       </w:r>
@@ -2442,15 +2503,15 @@
       <w:r>
         <w:t xml:space="preserve"> </w:t>
       </w:r>
-      <w:bookmarkStart w:id="4" w:name="_Toc242705598"/>
+      <w:bookmarkStart w:id="4" w:name="_Toc242726270"/>
       <w:r>
         <w:t>Scenario 1 - Attore principale: Consumer</w:t>
       </w:r>
       <w:bookmarkEnd w:id="3"/>
+      <w:r>
+        <w:t xml:space="preserve"> (Marco)</w:t>
+      </w:r>
       <w:bookmarkEnd w:id="4"/>
-      <w:r>
-        <w:t xml:space="preserve"> (Marco)</w:t>
-      </w:r>
     </w:p>
     <w:p>
       <w:pPr>
@@ -2577,14 +2638,14 @@
       <w:r>
         <w:t xml:space="preserve"> </w:t>
       </w:r>
-      <w:bookmarkStart w:id="5" w:name="_Toc242705599"/>
+      <w:bookmarkStart w:id="5" w:name="_Toc242726271"/>
       <w:r>
         <w:t>Scenario 2 - Attore principale: Order Manager</w:t>
       </w:r>
+      <w:r>
+        <w:t xml:space="preserve"> (Antonio)</w:t>
+      </w:r>
       <w:bookmarkEnd w:id="5"/>
-      <w:r>
-        <w:t xml:space="preserve"> (Antonio)</w:t>
-      </w:r>
     </w:p>
     <w:p>
       <w:pPr>
@@ -2613,25 +2674,7 @@
         <w:t xml:space="preserve"> </w:t>
       </w:r>
       <w:r>
-        <w:t>con nome utente e password che corrispondono a</w:t>
-      </w:r>
-      <w:r>
-        <w:t>l</w:t>
-      </w:r>
-      <w:r>
-        <w:t xml:space="preserve"> </w:t>
-      </w:r>
-      <w:r>
-        <w:t>singolo</w:t>
-      </w:r>
-      <w:r>
-        <w:t xml:space="preserve"> ruolo di Order Manager</w:t>
-      </w:r>
-      <w:r>
-        <w:t>,</w:t>
-      </w:r>
-      <w:r>
-        <w:t xml:space="preserve"> </w:t>
+        <w:t xml:space="preserve">con nome utente e password che corrispondono al singolo ruolo di Order Manager, </w:t>
       </w:r>
       <w:r>
         <w:t>nella sua area di gestione sul sito</w:t>
@@ -2669,14 +2712,14 @@
       <w:r>
         <w:t xml:space="preserve"> </w:t>
       </w:r>
-      <w:bookmarkStart w:id="6" w:name="_Toc242705600"/>
+      <w:bookmarkStart w:id="6" w:name="_Toc242726272"/>
       <w:r>
         <w:t>Scenario 3 - Attore principale: Product Manager</w:t>
       </w:r>
+      <w:r>
+        <w:t xml:space="preserve"> (Vittoria)</w:t>
+      </w:r>
       <w:bookmarkEnd w:id="6"/>
-      <w:r>
-        <w:t xml:space="preserve"> (Vittoria)</w:t>
-      </w:r>
     </w:p>
     <w:p>
       <w:pPr>
@@ -2730,16 +2773,7 @@
         <w:t xml:space="preserve"> </w:t>
       </w:r>
       <w:r>
-        <w:t xml:space="preserve">con nome utente e password che corrispondono al singolo ruolo di </w:t>
-      </w:r>
-      <w:r>
-        <w:t>Product</w:t>
-      </w:r>
-      <w:r>
-        <w:t xml:space="preserve"> Manager</w:t>
-      </w:r>
-      <w:r>
-        <w:t xml:space="preserve">, e viene portata alla sua area gestionale che presenta </w:t>
+        <w:t xml:space="preserve">con nome utente e password che corrispondono al singolo ruolo di Product Manager, e viene portata alla sua area gestionale che presenta </w:t>
       </w:r>
       <w:r>
         <w:t xml:space="preserve">tutti i </w:t>
@@ -2768,7 +2802,7 @@
       <w:r>
         <w:t xml:space="preserve"> </w:t>
       </w:r>
-      <w:bookmarkStart w:id="7" w:name="_Toc242705601"/>
+      <w:bookmarkStart w:id="7" w:name="_Toc242726273"/>
       <w:r>
         <w:t>Scenario 4 - Attore principale: Market Analyzer</w:t>
       </w:r>
@@ -2793,7 +2827,7 @@
         <w:ind w:left="426" w:hanging="426"/>
         <w:jc w:val="left"/>
       </w:pPr>
-      <w:bookmarkStart w:id="8" w:name="_Toc242705602"/>
+      <w:bookmarkStart w:id="8" w:name="_Toc242726274"/>
       <w:r>
         <w:t>REQUISITI FUNZIONALI</w:t>
       </w:r>
@@ -2905,6 +2939,197 @@
       </w:pPr>
       <w:r>
         <w:t>Il Manager degli Ordini deve accedere a una sua area gestionale che mostra i nuovi ordini ricevuti e da preparare nel negozio locale</w:t>
+      </w:r>
+    </w:p>
+    <w:p/>
+    <w:p>
+      <w:pPr>
+        <w:rPr>
+          <w:rFonts w:ascii="Calibri" w:hAnsi="Calibri" w:cs="Calibri"/>
+          <w:b/>
+          <w:bCs/>
+          <w:sz w:val="32"/>
+          <w:szCs w:val="32"/>
+        </w:rPr>
+      </w:pPr>
+    </w:p>
+    <w:p>
+      <w:pPr>
+        <w:ind w:left="426"/>
+        <w:rPr>
+          <w:rFonts w:ascii="Calibri" w:hAnsi="Calibri" w:cs="Calibri"/>
+          <w:b/>
+          <w:bCs/>
+          <w:sz w:val="32"/>
+          <w:szCs w:val="32"/>
+        </w:rPr>
+      </w:pPr>
+    </w:p>
+    <w:p>
+      <w:pPr>
+        <w:ind w:left="426"/>
+        <w:rPr>
+          <w:rFonts w:ascii="Calibri" w:hAnsi="Calibri" w:cs="Calibri"/>
+          <w:b/>
+          <w:bCs/>
+          <w:sz w:val="32"/>
+          <w:szCs w:val="32"/>
+        </w:rPr>
+      </w:pPr>
+    </w:p>
+    <w:p>
+      <w:pPr>
+        <w:rPr>
+          <w:rFonts w:ascii="Calibri" w:hAnsi="Calibri" w:cs="Calibri"/>
+          <w:b/>
+          <w:bCs/>
+          <w:sz w:val="32"/>
+          <w:szCs w:val="32"/>
+        </w:rPr>
+      </w:pPr>
+    </w:p>
+    <w:p>
+      <w:pPr>
+        <w:pStyle w:val="Titolo"/>
+        <w:numPr>
+          <w:ilvl w:val="0"/>
+          <w:numId w:val="6"/>
+        </w:numPr>
+        <w:ind w:left="426" w:hanging="426"/>
+        <w:jc w:val="left"/>
+      </w:pPr>
+      <w:bookmarkStart w:id="9" w:name="_Toc242726275"/>
+      <w:r>
+        <w:lastRenderedPageBreak/>
+        <w:t>REQUISITI NON FUNZIONALI</w:t>
+      </w:r>
+      <w:bookmarkEnd w:id="9"/>
+    </w:p>
+    <w:p>
+      <w:pPr>
+        <w:numPr>
+          <w:ilvl w:val="0"/>
+          <w:numId w:val="21"/>
+        </w:numPr>
+        <w:rPr>
+          <w:b/>
+          <w:bCs/>
+        </w:rPr>
+      </w:pPr>
+      <w:r>
+        <w:t>L'interfaccia utente deve garantire una navigazione fluida riducendo al minimo i tempi di attesa e i ricaricamenti dell'intera pagina.</w:t>
+      </w:r>
+      <w:r>
+        <w:t xml:space="preserve"> Le operazioni frequenti quali la modifica delle quantità del carello, il filtraggio dei prodotti nel catalogo o l’aggiornamento dello stato di un ordine, devono avvenire in modo asincrono, aggiornando istantaneamente solo le porzioni di schermo interessate</w:t>
+      </w:r>
+    </w:p>
+    <w:p>
+      <w:pPr>
+        <w:numPr>
+          <w:ilvl w:val="0"/>
+          <w:numId w:val="18"/>
+        </w:numPr>
+        <w:rPr>
+          <w:b/>
+          <w:bCs/>
+        </w:rPr>
+      </w:pPr>
+      <w:r>
+        <w:t xml:space="preserve">Il sistema deve offrire un layout flessibile in grado di adattarsi automaticamente alle diverse risoluzioni e formati di schermo (smartphone, tablet, laptop e desktop). </w:t>
+      </w:r>
+      <w:r>
+        <w:t>Gli elementi visivi, come le schede prodotto, la tabella degli ordini e i controlli di gestione, devono riorganizzarsi per preservare leggibilità, accessibilità e facilità di tocco/click su qualsiasi dispositivo</w:t>
+      </w:r>
+    </w:p>
+    <w:p>
+      <w:pPr>
+        <w:numPr>
+          <w:ilvl w:val="0"/>
+          <w:numId w:val="18"/>
+        </w:numPr>
+        <w:rPr>
+          <w:b/>
+          <w:bCs/>
+        </w:rPr>
+      </w:pPr>
+      <w:r>
+        <w:t>Il sistema deve rendere costantemente evidente all'utente il risultato delle proprie azioni attraverso notifiche visive contestuali, come banner cromatici di conferma (suc</w:t>
+      </w:r>
+      <w:r>
+        <w:t>cesso o errore)</w:t>
+      </w:r>
+      <w:r>
+        <w:t xml:space="preserve"> e badge di stato ben distinti</w:t>
+      </w:r>
+    </w:p>
+    <w:p>
+      <w:pPr>
+        <w:numPr>
+          <w:ilvl w:val="0"/>
+          <w:numId w:val="18"/>
+        </w:numPr>
+        <w:rPr>
+          <w:b/>
+          <w:bCs/>
+        </w:rPr>
+      </w:pPr>
+      <w:r>
+        <w:t xml:space="preserve">Le </w:t>
+      </w:r>
+      <w:r>
+        <w:t>regole di protezione e controllo degli accessi devono riflettersi chiaramente sull'interfaccia utente. L'utente deve ricevere messaggi espliciti e comprensibili in caso di inserimento di credenziali errate, tentativi di accesso a sezioni non autorizzate o nel caso in cui stia tentando di accedere con un account sospeso o disattivato</w:t>
+      </w:r>
+    </w:p>
+    <w:p>
+      <w:pPr>
+        <w:numPr>
+          <w:ilvl w:val="0"/>
+          <w:numId w:val="18"/>
+        </w:numPr>
+      </w:pPr>
+      <w:r>
+        <w:t>Nelle situazioni in cui una schermata o un componente non presenta contenuti da mostrare (es. carrello degli acquisti vuoto, nessun ordine effettuato, nessun risultato corrispondente a un filtro di ricerca), il sistema non deve mai restituire schermate bianche o layout frammentati. Deve invece mostrare messaggi visivi descrittivi che spieghino chiaramente lo stato attuale e suggeriscano l'azione successiva da compiere</w:t>
+      </w:r>
+    </w:p>
+    <w:p>
+      <w:pPr>
+        <w:numPr>
+          <w:ilvl w:val="0"/>
+          <w:numId w:val="18"/>
+        </w:numPr>
+      </w:pPr>
+      <w:r>
+        <w:t>L'aspetto grafico</w:t>
+      </w:r>
+      <w:r>
+        <w:t xml:space="preserve"> </w:t>
+      </w:r>
+      <w:r>
+        <w:t>delle pagine dev</w:t>
+      </w:r>
+      <w:r>
+        <w:t>e</w:t>
+      </w:r>
+      <w:r>
+        <w:t xml:space="preserve"> risultare identic</w:t>
+      </w:r>
+      <w:r>
+        <w:t>o</w:t>
+      </w:r>
+      <w:r>
+        <w:t xml:space="preserve"> e priv</w:t>
+      </w:r>
+      <w:r>
+        <w:t>o</w:t>
+      </w:r>
+      <w:r>
+        <w:t xml:space="preserve"> di anomalie visive su tutti i principali browser web di uso comune</w:t>
+      </w:r>
+      <w:r>
+        <w:t>,</w:t>
+      </w:r>
+      <w:r>
+        <w:t xml:space="preserve"> garantendo un'esperienza omogenea a prescindere dal client utilizzato</w:t>
       </w:r>
     </w:p>
     <w:p/>
@@ -2952,7 +3177,7 @@
 </file>
 
 <file path=word/endnotes.xml><?xml version="1.0" encoding="utf-8"?>
-<w:endnotes xmlns:wpc="http://schemas.microsoft.com/office/word/2010/wordprocessingCanvas" xmlns:cx="http://schemas.microsoft.com/office/drawing/2014/chartex" xmlns:cx1="http://schemas.microsoft.com/office/drawing/2015/9/8/chartex" xmlns:cx2="http://schemas.microsoft.com/office/drawing/2015/10/21/chartex" xmlns:cx3="http://schemas.microsoft.com/office/drawing/2016/5/9/chartex" xmlns:cx4="http://schemas.microsoft.com/office/drawing/2016/5/10/chartex" xmlns:cx5="http://schemas.microsoft.com/office/drawing/2016/5/11/chartex" xmlns:cx6="http://schemas.microsoft.com/office/drawing/2016/5/12/chartex" xmlns:cx7="http://schemas.microsoft.com/office/drawing/2016/5/13/chartex" xmlns:cx8="http://schemas.microsoft.com/office/drawing/2016/5/14/chartex" xmlns:mc="http://schemas.openxmlformats.org/markup-compatibility/2006" xmlns:aink="http://schemas.microsoft.com/office/drawing/2016/ink" xmlns:am3d="http://schemas.microsoft.com/office/drawing/2017/model3d" xmlns:o="urn:schemas-microsoft-com:office:office" xmlns:oel="http://schemas.microsoft.com/office/2019/extlst" xmlns:r="http://schemas.openxmlformats.org/officeDocument/2006/relationships" xmlns:m="http://schemas.openxmlformats.org/officeDocument/2006/math" xmlns:v="urn:schemas-microsoft-com:vml" xmlns:wp14="http://schemas.microsoft.com/office/word/2010/wordprocessingDrawing" xmlns:wp="http://schemas.openxmlformats.org/drawingml/2006/wordprocessingDrawing" xmlns:w10="urn:schemas-microsoft-com:office:word" xmlns:w="http://schemas.openxmlformats.org/wordprocessingml/2006/main" xmlns:w14="http://schemas.microsoft.com/office/word/2010/wordml" xmlns:w15="http://schemas.microsoft.com/office/word/2012/wordml" xmlns:w16cex="http://schemas.microsoft.com/office/word/2018/wordml/cex" xmlns:w16cid="http://schemas.microsoft.com/office/word/2016/wordml/cid" xmlns:w16="http://schemas.microsoft.com/office/word/2018/wordml" xmlns:w16du="http://schemas.microsoft.com/office/word/2023/wordml/word16du" xmlns:w16sdtdh="http://schemas.microsoft.com/office/word/2020/wordml/sdtdatahash" xmlns:w16sdtfl="http://schemas.microsoft.com/office/word/2024/wordml/sdtformatlock" xmlns:w16se="http://schemas.microsoft.com/office/word/2015/wordml/symex" xmlns:wpg="http://schemas.microsoft.com/office/word/2010/wordprocessingGroup" xmlns:wpi="http://schemas.microsoft.com/office/word/2010/wordprocessingInk" xmlns:wne="http://schemas.microsoft.com/office/word/2006/wordml" xmlns:wps="http://schemas.microsoft.com/office/word/2010/wordprocessingShape" mc:Ignorable="w14 w15 w16se w16cid w16 w16cex w16sdtdh w16sdtfl w16du wp14">
+<w:endnotes xmlns:wpc="http://schemas.microsoft.com/office/word/2010/wordprocessingCanvas" xmlns:cx="http://schemas.microsoft.com/office/drawing/2014/chartex" xmlns:cx1="http://schemas.microsoft.com/office/drawing/2015/9/8/chartex" xmlns:cx2="http://schemas.microsoft.com/office/drawing/2015/10/21/chartex" xmlns:cx3="http://schemas.microsoft.com/office/drawing/2016/5/9/chartex" xmlns:cx4="http://schemas.microsoft.com/office/drawing/2016/5/10/chartex" xmlns:cx5="http://schemas.microsoft.com/office/drawing/2016/5/11/chartex" xmlns:cx6="http://schemas.microsoft.com/office/drawing/2016/5/12/chartex" xmlns:cx7="http://schemas.microsoft.com/office/drawing/2016/5/13/chartex" xmlns:cx8="http://schemas.microsoft.com/office/drawing/2016/5/14/chartex" xmlns:mc="http://schemas.openxmlformats.org/markup-compatibility/2006" xmlns:m="http://schemas.openxmlformats.org/officeDocument/2006/math" xmlns:aink="http://schemas.microsoft.com/office/drawing/2016/ink" xmlns:am3d="http://schemas.microsoft.com/office/drawing/2017/model3d" xmlns:oel="http://schemas.microsoft.com/office/2019/extlst" xmlns:r="http://schemas.openxmlformats.org/officeDocument/2006/relationships" xmlns:wp14="http://schemas.microsoft.com/office/word/2010/wordprocessingDrawing" xmlns:wp="http://schemas.openxmlformats.org/drawingml/2006/wordprocessingDrawing" xmlns:wpg="http://schemas.microsoft.com/office/word/2010/wordprocessingGroup" xmlns:wpi="http://schemas.microsoft.com/office/word/2010/wordprocessingInk" xmlns:wps="http://schemas.microsoft.com/office/word/2010/wordprocessingShape" xmlns:o="urn:schemas-microsoft-com:office:office" xmlns:v="urn:schemas-microsoft-com:vml" xmlns:w10="urn:schemas-microsoft-com:office:word" xmlns:w="http://schemas.openxmlformats.org/wordprocessingml/2006/main" xmlns:w14="http://schemas.microsoft.com/office/word/2010/wordml" xmlns:w15="http://schemas.microsoft.com/office/word/2012/wordml" xmlns:w16cex="http://schemas.microsoft.com/office/word/2018/wordml/cex" xmlns:w16cid="http://schemas.microsoft.com/office/word/2016/wordml/cid" xmlns:w16="http://schemas.microsoft.com/office/word/2018/wordml" xmlns:w16sdtdh="http://schemas.microsoft.com/office/word/2020/wordml/sdtdatahash" xmlns:w16sdtfl="http://schemas.microsoft.com/office/word/2024/wordml/sdtformatlock" xmlns:w16se="http://schemas.microsoft.com/office/word/2015/wordml/symex" xmlns:w16du="http://schemas.microsoft.com/office/word/2023/wordml/word16du" xmlns:wne="http://schemas.microsoft.com/office/word/2006/wordml" mc:Ignorable="w14 w15 w16se w16cid w16 w16cex w16sdtdh w16sdtfl w16du wp14">
   <w:endnote w:type="separator" w:id="-1">
     <w:p>
       <w:r>
@@ -2971,7 +3196,7 @@
 </file>
 
 <file path=word/footer1.xml><?xml version="1.0" encoding="utf-8"?>
-<w:ftr xmlns:wpc="http://schemas.microsoft.com/office/word/2010/wordprocessingCanvas" xmlns:cx="http://schemas.microsoft.com/office/drawing/2014/chartex" xmlns:cx1="http://schemas.microsoft.com/office/drawing/2015/9/8/chartex" xmlns:cx2="http://schemas.microsoft.com/office/drawing/2015/10/21/chartex" xmlns:cx3="http://schemas.microsoft.com/office/drawing/2016/5/9/chartex" xmlns:cx4="http://schemas.microsoft.com/office/drawing/2016/5/10/chartex" xmlns:cx5="http://schemas.microsoft.com/office/drawing/2016/5/11/chartex" xmlns:cx6="http://schemas.microsoft.com/office/drawing/2016/5/12/chartex" xmlns:cx7="http://schemas.microsoft.com/office/drawing/2016/5/13/chartex" xmlns:cx8="http://schemas.microsoft.com/office/drawing/2016/5/14/chartex" xmlns:mc="http://schemas.openxmlformats.org/markup-compatibility/2006" xmlns:aink="http://schemas.microsoft.com/office/drawing/2016/ink" xmlns:am3d="http://schemas.microsoft.com/office/drawing/2017/model3d" xmlns:o="urn:schemas-microsoft-com:office:office" xmlns:oel="http://schemas.microsoft.com/office/2019/extlst" xmlns:r="http://schemas.openxmlformats.org/officeDocument/2006/relationships" xmlns:m="http://schemas.openxmlformats.org/officeDocument/2006/math" xmlns:v="urn:schemas-microsoft-com:vml" xmlns:wp14="http://schemas.microsoft.com/office/word/2010/wordprocessingDrawing" xmlns:wp="http://schemas.openxmlformats.org/drawingml/2006/wordprocessingDrawing" xmlns:w10="urn:schemas-microsoft-com:office:word" xmlns:w="http://schemas.openxmlformats.org/wordprocessingml/2006/main" xmlns:w14="http://schemas.microsoft.com/office/word/2010/wordml" xmlns:w15="http://schemas.microsoft.com/office/word/2012/wordml" xmlns:w16cex="http://schemas.microsoft.com/office/word/2018/wordml/cex" xmlns:w16cid="http://schemas.microsoft.com/office/word/2016/wordml/cid" xmlns:w16="http://schemas.microsoft.com/office/word/2018/wordml" xmlns:w16du="http://schemas.microsoft.com/office/word/2023/wordml/word16du" xmlns:w16sdtdh="http://schemas.microsoft.com/office/word/2020/wordml/sdtdatahash" xmlns:w16sdtfl="http://schemas.microsoft.com/office/word/2024/wordml/sdtformatlock" xmlns:w16se="http://schemas.microsoft.com/office/word/2015/wordml/symex" xmlns:wpg="http://schemas.microsoft.com/office/word/2010/wordprocessingGroup" xmlns:wpi="http://schemas.microsoft.com/office/word/2010/wordprocessingInk" xmlns:wne="http://schemas.microsoft.com/office/word/2006/wordml" xmlns:wps="http://schemas.microsoft.com/office/word/2010/wordprocessingShape" mc:Ignorable="w14 w15 w16se w16cid w16 w16cex w16sdtdh w16sdtfl w16du wp14">
+<w:ftr xmlns:wpc="http://schemas.microsoft.com/office/word/2010/wordprocessingCanvas" xmlns:cx="http://schemas.microsoft.com/office/drawing/2014/chartex" xmlns:cx1="http://schemas.microsoft.com/office/drawing/2015/9/8/chartex" xmlns:cx2="http://schemas.microsoft.com/office/drawing/2015/10/21/chartex" xmlns:cx3="http://schemas.microsoft.com/office/drawing/2016/5/9/chartex" xmlns:cx4="http://schemas.microsoft.com/office/drawing/2016/5/10/chartex" xmlns:cx5="http://schemas.microsoft.com/office/drawing/2016/5/11/chartex" xmlns:cx6="http://schemas.microsoft.com/office/drawing/2016/5/12/chartex" xmlns:cx7="http://schemas.microsoft.com/office/drawing/2016/5/13/chartex" xmlns:cx8="http://schemas.microsoft.com/office/drawing/2016/5/14/chartex" xmlns:mc="http://schemas.openxmlformats.org/markup-compatibility/2006" xmlns:m="http://schemas.openxmlformats.org/officeDocument/2006/math" xmlns:aink="http://schemas.microsoft.com/office/drawing/2016/ink" xmlns:am3d="http://schemas.microsoft.com/office/drawing/2017/model3d" xmlns:oel="http://schemas.microsoft.com/office/2019/extlst" xmlns:r="http://schemas.openxmlformats.org/officeDocument/2006/relationships" xmlns:wp14="http://schemas.microsoft.com/office/word/2010/wordprocessingDrawing" xmlns:wp="http://schemas.openxmlformats.org/drawingml/2006/wordprocessingDrawing" xmlns:wpg="http://schemas.microsoft.com/office/word/2010/wordprocessingGroup" xmlns:wpi="http://schemas.microsoft.com/office/word/2010/wordprocessingInk" xmlns:wps="http://schemas.microsoft.com/office/word/2010/wordprocessingShape" xmlns:o="urn:schemas-microsoft-com:office:office" xmlns:v="urn:schemas-microsoft-com:vml" xmlns:w10="urn:schemas-microsoft-com:office:word" xmlns:w="http://schemas.openxmlformats.org/wordprocessingml/2006/main" xmlns:w14="http://schemas.microsoft.com/office/word/2010/wordml" xmlns:w15="http://schemas.microsoft.com/office/word/2012/wordml" xmlns:w16cex="http://schemas.microsoft.com/office/word/2018/wordml/cex" xmlns:w16cid="http://schemas.microsoft.com/office/word/2016/wordml/cid" xmlns:w16="http://schemas.microsoft.com/office/word/2018/wordml" xmlns:w16sdtdh="http://schemas.microsoft.com/office/word/2020/wordml/sdtdatahash" xmlns:w16sdtfl="http://schemas.microsoft.com/office/word/2024/wordml/sdtformatlock" xmlns:w16se="http://schemas.microsoft.com/office/word/2015/wordml/symex" xmlns:w16du="http://schemas.microsoft.com/office/word/2023/wordml/word16du" xmlns:wne="http://schemas.microsoft.com/office/word/2006/wordml" mc:Ignorable="w14 w15 w16se w16cid w16 w16cex w16sdtdh w16sdtfl w16du wp14">
   <w:tbl>
     <w:tblPr>
       <w:tblW w:w="0" w:type="auto"/>
@@ -3139,31 +3364,31 @@
 </file>
 
 <file path=word/footer2.xml><?xml version="1.0" encoding="utf-8"?>
-<w:ftr xmlns:wpc="http://schemas.microsoft.com/office/word/2010/wordprocessingCanvas" xmlns:cx="http://schemas.microsoft.com/office/drawing/2014/chartex" xmlns:cx1="http://schemas.microsoft.com/office/drawing/2015/9/8/chartex" xmlns:cx2="http://schemas.microsoft.com/office/drawing/2015/10/21/chartex" xmlns:cx3="http://schemas.microsoft.com/office/drawing/2016/5/9/chartex" xmlns:cx4="http://schemas.microsoft.com/office/drawing/2016/5/10/chartex" xmlns:cx5="http://schemas.microsoft.com/office/drawing/2016/5/11/chartex" xmlns:cx6="http://schemas.microsoft.com/office/drawing/2016/5/12/chartex" xmlns:cx7="http://schemas.microsoft.com/office/drawing/2016/5/13/chartex" xmlns:cx8="http://schemas.microsoft.com/office/drawing/2016/5/14/chartex" xmlns:mc="http://schemas.openxmlformats.org/markup-compatibility/2006" xmlns:aink="http://schemas.microsoft.com/office/drawing/2016/ink" xmlns:am3d="http://schemas.microsoft.com/office/drawing/2017/model3d" xmlns:o="urn:schemas-microsoft-com:office:office" xmlns:oel="http://schemas.microsoft.com/office/2019/extlst" xmlns:r="http://schemas.openxmlformats.org/officeDocument/2006/relationships" xmlns:m="http://schemas.openxmlformats.org/officeDocument/2006/math" xmlns:v="urn:schemas-microsoft-com:vml" xmlns:wp14="http://schemas.microsoft.com/office/word/2010/wordprocessingDrawing" xmlns:wp="http://schemas.openxmlformats.org/drawingml/2006/wordprocessingDrawing" xmlns:w10="urn:schemas-microsoft-com:office:word" xmlns:w="http://schemas.openxmlformats.org/wordprocessingml/2006/main" xmlns:w14="http://schemas.microsoft.com/office/word/2010/wordml" xmlns:w15="http://schemas.microsoft.com/office/word/2012/wordml" xmlns:w16cex="http://schemas.microsoft.com/office/word/2018/wordml/cex" xmlns:w16cid="http://schemas.microsoft.com/office/word/2016/wordml/cid" xmlns:w16="http://schemas.microsoft.com/office/word/2018/wordml" xmlns:w16du="http://schemas.microsoft.com/office/word/2023/wordml/word16du" xmlns:w16sdtdh="http://schemas.microsoft.com/office/word/2020/wordml/sdtdatahash" xmlns:w16sdtfl="http://schemas.microsoft.com/office/word/2024/wordml/sdtformatlock" xmlns:w16se="http://schemas.microsoft.com/office/word/2015/wordml/symex" xmlns:wpg="http://schemas.microsoft.com/office/word/2010/wordprocessingGroup" xmlns:wpi="http://schemas.microsoft.com/office/word/2010/wordprocessingInk" xmlns:wne="http://schemas.microsoft.com/office/word/2006/wordml" xmlns:wps="http://schemas.microsoft.com/office/word/2010/wordprocessingShape" mc:Ignorable="w14 w15 w16se w16cid w16 w16cex w16sdtdh w16sdtfl w16du wp14">
+<w:ftr xmlns:wpc="http://schemas.microsoft.com/office/word/2010/wordprocessingCanvas" xmlns:cx="http://schemas.microsoft.com/office/drawing/2014/chartex" xmlns:cx1="http://schemas.microsoft.com/office/drawing/2015/9/8/chartex" xmlns:cx2="http://schemas.microsoft.com/office/drawing/2015/10/21/chartex" xmlns:cx3="http://schemas.microsoft.com/office/drawing/2016/5/9/chartex" xmlns:cx4="http://schemas.microsoft.com/office/drawing/2016/5/10/chartex" xmlns:cx5="http://schemas.microsoft.com/office/drawing/2016/5/11/chartex" xmlns:cx6="http://schemas.microsoft.com/office/drawing/2016/5/12/chartex" xmlns:cx7="http://schemas.microsoft.com/office/drawing/2016/5/13/chartex" xmlns:cx8="http://schemas.microsoft.com/office/drawing/2016/5/14/chartex" xmlns:mc="http://schemas.openxmlformats.org/markup-compatibility/2006" xmlns:m="http://schemas.openxmlformats.org/officeDocument/2006/math" xmlns:aink="http://schemas.microsoft.com/office/drawing/2016/ink" xmlns:am3d="http://schemas.microsoft.com/office/drawing/2017/model3d" xmlns:oel="http://schemas.microsoft.com/office/2019/extlst" xmlns:r="http://schemas.openxmlformats.org/officeDocument/2006/relationships" xmlns:wp14="http://schemas.microsoft.com/office/word/2010/wordprocessingDrawing" xmlns:wp="http://schemas.openxmlformats.org/drawingml/2006/wordprocessingDrawing" xmlns:wpg="http://schemas.microsoft.com/office/word/2010/wordprocessingGroup" xmlns:wpi="http://schemas.microsoft.com/office/word/2010/wordprocessingInk" xmlns:wps="http://schemas.microsoft.com/office/word/2010/wordprocessingShape" xmlns:o="urn:schemas-microsoft-com:office:office" xmlns:v="urn:schemas-microsoft-com:vml" xmlns:w10="urn:schemas-microsoft-com:office:word" xmlns:w="http://schemas.openxmlformats.org/wordprocessingml/2006/main" xmlns:w14="http://schemas.microsoft.com/office/word/2010/wordml" xmlns:w15="http://schemas.microsoft.com/office/word/2012/wordml" xmlns:w16cex="http://schemas.microsoft.com/office/word/2018/wordml/cex" xmlns:w16cid="http://schemas.microsoft.com/office/word/2016/wordml/cid" xmlns:w16="http://schemas.microsoft.com/office/word/2018/wordml" xmlns:w16sdtdh="http://schemas.microsoft.com/office/word/2020/wordml/sdtdatahash" xmlns:w16sdtfl="http://schemas.microsoft.com/office/word/2024/wordml/sdtformatlock" xmlns:w16se="http://schemas.microsoft.com/office/word/2015/wordml/symex" xmlns:w16du="http://schemas.microsoft.com/office/word/2023/wordml/word16du" xmlns:wne="http://schemas.microsoft.com/office/word/2006/wordml" mc:Ignorable="w14 w15 w16se w16cid w16 w16cex w16sdtdh w16sdtfl w16du wp14">
   <w:p/>
 </w:ftr>
 </file>
 
 <file path=word/footer3.xml><?xml version="1.0" encoding="utf-8"?>
-<w:ftr xmlns:wpc="http://schemas.microsoft.com/office/word/2010/wordprocessingCanvas" xmlns:cx="http://schemas.microsoft.com/office/drawing/2014/chartex" xmlns:cx1="http://schemas.microsoft.com/office/drawing/2015/9/8/chartex" xmlns:cx2="http://schemas.microsoft.com/office/drawing/2015/10/21/chartex" xmlns:cx3="http://schemas.microsoft.com/office/drawing/2016/5/9/chartex" xmlns:cx4="http://schemas.microsoft.com/office/drawing/2016/5/10/chartex" xmlns:cx5="http://schemas.microsoft.com/office/drawing/2016/5/11/chartex" xmlns:cx6="http://schemas.microsoft.com/office/drawing/2016/5/12/chartex" xmlns:cx7="http://schemas.microsoft.com/office/drawing/2016/5/13/chartex" xmlns:cx8="http://schemas.microsoft.com/office/drawing/2016/5/14/chartex" xmlns:mc="http://schemas.openxmlformats.org/markup-compatibility/2006" xmlns:aink="http://schemas.microsoft.com/office/drawing/2016/ink" xmlns:am3d="http://schemas.microsoft.com/office/drawing/2017/model3d" xmlns:o="urn:schemas-microsoft-com:office:office" xmlns:oel="http://schemas.microsoft.com/office/2019/extlst" xmlns:r="http://schemas.openxmlformats.org/officeDocument/2006/relationships" xmlns:m="http://schemas.openxmlformats.org/officeDocument/2006/math" xmlns:v="urn:schemas-microsoft-com:vml" xmlns:wp14="http://schemas.microsoft.com/office/word/2010/wordprocessingDrawing" xmlns:wp="http://schemas.openxmlformats.org/drawingml/2006/wordprocessingDrawing" xmlns:w10="urn:schemas-microsoft-com:office:word" xmlns:w="http://schemas.openxmlformats.org/wordprocessingml/2006/main" xmlns:w14="http://schemas.microsoft.com/office/word/2010/wordml" xmlns:w15="http://schemas.microsoft.com/office/word/2012/wordml" xmlns:w16cex="http://schemas.microsoft.com/office/word/2018/wordml/cex" xmlns:w16cid="http://schemas.microsoft.com/office/word/2016/wordml/cid" xmlns:w16="http://schemas.microsoft.com/office/word/2018/wordml" xmlns:w16du="http://schemas.microsoft.com/office/word/2023/wordml/word16du" xmlns:w16sdtdh="http://schemas.microsoft.com/office/word/2020/wordml/sdtdatahash" xmlns:w16sdtfl="http://schemas.microsoft.com/office/word/2024/wordml/sdtformatlock" xmlns:w16se="http://schemas.microsoft.com/office/word/2015/wordml/symex" xmlns:wpg="http://schemas.microsoft.com/office/word/2010/wordprocessingGroup" xmlns:wpi="http://schemas.microsoft.com/office/word/2010/wordprocessingInk" xmlns:wne="http://schemas.microsoft.com/office/word/2006/wordml" xmlns:wps="http://schemas.microsoft.com/office/word/2010/wordprocessingShape" mc:Ignorable="w14 w15 w16se w16cid w16 w16cex w16sdtdh w16sdtfl w16du wp14">
+<w:ftr xmlns:wpc="http://schemas.microsoft.com/office/word/2010/wordprocessingCanvas" xmlns:cx="http://schemas.microsoft.com/office/drawing/2014/chartex" xmlns:cx1="http://schemas.microsoft.com/office/drawing/2015/9/8/chartex" xmlns:cx2="http://schemas.microsoft.com/office/drawing/2015/10/21/chartex" xmlns:cx3="http://schemas.microsoft.com/office/drawing/2016/5/9/chartex" xmlns:cx4="http://schemas.microsoft.com/office/drawing/2016/5/10/chartex" xmlns:cx5="http://schemas.microsoft.com/office/drawing/2016/5/11/chartex" xmlns:cx6="http://schemas.microsoft.com/office/drawing/2016/5/12/chartex" xmlns:cx7="http://schemas.microsoft.com/office/drawing/2016/5/13/chartex" xmlns:cx8="http://schemas.microsoft.com/office/drawing/2016/5/14/chartex" xmlns:mc="http://schemas.openxmlformats.org/markup-compatibility/2006" xmlns:m="http://schemas.openxmlformats.org/officeDocument/2006/math" xmlns:aink="http://schemas.microsoft.com/office/drawing/2016/ink" xmlns:am3d="http://schemas.microsoft.com/office/drawing/2017/model3d" xmlns:oel="http://schemas.microsoft.com/office/2019/extlst" xmlns:r="http://schemas.openxmlformats.org/officeDocument/2006/relationships" xmlns:wp14="http://schemas.microsoft.com/office/word/2010/wordprocessingDrawing" xmlns:wp="http://schemas.openxmlformats.org/drawingml/2006/wordprocessingDrawing" xmlns:wpg="http://schemas.microsoft.com/office/word/2010/wordprocessingGroup" xmlns:wpi="http://schemas.microsoft.com/office/word/2010/wordprocessingInk" xmlns:wps="http://schemas.microsoft.com/office/word/2010/wordprocessingShape" xmlns:o="urn:schemas-microsoft-com:office:office" xmlns:v="urn:schemas-microsoft-com:vml" xmlns:w10="urn:schemas-microsoft-com:office:word" xmlns:w="http://schemas.openxmlformats.org/wordprocessingml/2006/main" xmlns:w14="http://schemas.microsoft.com/office/word/2010/wordml" xmlns:w15="http://schemas.microsoft.com/office/word/2012/wordml" xmlns:w16cex="http://schemas.microsoft.com/office/word/2018/wordml/cex" xmlns:w16cid="http://schemas.microsoft.com/office/word/2016/wordml/cid" xmlns:w16="http://schemas.microsoft.com/office/word/2018/wordml" xmlns:w16sdtdh="http://schemas.microsoft.com/office/word/2020/wordml/sdtdatahash" xmlns:w16sdtfl="http://schemas.microsoft.com/office/word/2024/wordml/sdtformatlock" xmlns:w16se="http://schemas.microsoft.com/office/word/2015/wordml/symex" xmlns:w16du="http://schemas.microsoft.com/office/word/2023/wordml/word16du" xmlns:wne="http://schemas.microsoft.com/office/word/2006/wordml" mc:Ignorable="w14 w15 w16se w16cid w16 w16cex w16sdtdh w16sdtfl w16du wp14">
   <w:p/>
 </w:ftr>
 </file>
 
 <file path=word/footer4.xml><?xml version="1.0" encoding="utf-8"?>
-<w:ftr xmlns:wpc="http://schemas.microsoft.com/office/word/2010/wordprocessingCanvas" xmlns:cx="http://schemas.microsoft.com/office/drawing/2014/chartex" xmlns:cx1="http://schemas.microsoft.com/office/drawing/2015/9/8/chartex" xmlns:cx2="http://schemas.microsoft.com/office/drawing/2015/10/21/chartex" xmlns:cx3="http://schemas.microsoft.com/office/drawing/2016/5/9/chartex" xmlns:cx4="http://schemas.microsoft.com/office/drawing/2016/5/10/chartex" xmlns:cx5="http://schemas.microsoft.com/office/drawing/2016/5/11/chartex" xmlns:cx6="http://schemas.microsoft.com/office/drawing/2016/5/12/chartex" xmlns:cx7="http://schemas.microsoft.com/office/drawing/2016/5/13/chartex" xmlns:cx8="http://schemas.microsoft.com/office/drawing/2016/5/14/chartex" xmlns:mc="http://schemas.openxmlformats.org/markup-compatibility/2006" xmlns:aink="http://schemas.microsoft.com/office/drawing/2016/ink" xmlns:am3d="http://schemas.microsoft.com/office/drawing/2017/model3d" xmlns:o="urn:schemas-microsoft-com:office:office" xmlns:oel="http://schemas.microsoft.com/office/2019/extlst" xmlns:r="http://schemas.openxmlformats.org/officeDocument/2006/relationships" xmlns:m="http://schemas.openxmlformats.org/officeDocument/2006/math" xmlns:v="urn:schemas-microsoft-com:vml" xmlns:wp14="http://schemas.microsoft.com/office/word/2010/wordprocessingDrawing" xmlns:wp="http://schemas.openxmlformats.org/drawingml/2006/wordprocessingDrawing" xmlns:w10="urn:schemas-microsoft-com:office:word" xmlns:w="http://schemas.openxmlformats.org/wordprocessingml/2006/main" xmlns:w14="http://schemas.microsoft.com/office/word/2010/wordml" xmlns:w15="http://schemas.microsoft.com/office/word/2012/wordml" xmlns:w16cex="http://schemas.microsoft.com/office/word/2018/wordml/cex" xmlns:w16cid="http://schemas.microsoft.com/office/word/2016/wordml/cid" xmlns:w16="http://schemas.microsoft.com/office/word/2018/wordml" xmlns:w16du="http://schemas.microsoft.com/office/word/2023/wordml/word16du" xmlns:w16sdtdh="http://schemas.microsoft.com/office/word/2020/wordml/sdtdatahash" xmlns:w16sdtfl="http://schemas.microsoft.com/office/word/2024/wordml/sdtformatlock" xmlns:w16se="http://schemas.microsoft.com/office/word/2015/wordml/symex" xmlns:wpg="http://schemas.microsoft.com/office/word/2010/wordprocessingGroup" xmlns:wpi="http://schemas.microsoft.com/office/word/2010/wordprocessingInk" xmlns:wne="http://schemas.microsoft.com/office/word/2006/wordml" xmlns:wps="http://schemas.microsoft.com/office/word/2010/wordprocessingShape" mc:Ignorable="w14 w15 w16se w16cid w16 w16cex w16sdtdh w16sdtfl w16du wp14">
+<w:ftr xmlns:wpc="http://schemas.microsoft.com/office/word/2010/wordprocessingCanvas" xmlns:cx="http://schemas.microsoft.com/office/drawing/2014/chartex" xmlns:cx1="http://schemas.microsoft.com/office/drawing/2015/9/8/chartex" xmlns:cx2="http://schemas.microsoft.com/office/drawing/2015/10/21/chartex" xmlns:cx3="http://schemas.microsoft.com/office/drawing/2016/5/9/chartex" xmlns:cx4="http://schemas.microsoft.com/office/drawing/2016/5/10/chartex" xmlns:cx5="http://schemas.microsoft.com/office/drawing/2016/5/11/chartex" xmlns:cx6="http://schemas.microsoft.com/office/drawing/2016/5/12/chartex" xmlns:cx7="http://schemas.microsoft.com/office/drawing/2016/5/13/chartex" xmlns:cx8="http://schemas.microsoft.com/office/drawing/2016/5/14/chartex" xmlns:mc="http://schemas.openxmlformats.org/markup-compatibility/2006" xmlns:m="http://schemas.openxmlformats.org/officeDocument/2006/math" xmlns:aink="http://schemas.microsoft.com/office/drawing/2016/ink" xmlns:am3d="http://schemas.microsoft.com/office/drawing/2017/model3d" xmlns:oel="http://schemas.microsoft.com/office/2019/extlst" xmlns:r="http://schemas.openxmlformats.org/officeDocument/2006/relationships" xmlns:wp14="http://schemas.microsoft.com/office/word/2010/wordprocessingDrawing" xmlns:wp="http://schemas.openxmlformats.org/drawingml/2006/wordprocessingDrawing" xmlns:wpg="http://schemas.microsoft.com/office/word/2010/wordprocessingGroup" xmlns:wpi="http://schemas.microsoft.com/office/word/2010/wordprocessingInk" xmlns:wps="http://schemas.microsoft.com/office/word/2010/wordprocessingShape" xmlns:o="urn:schemas-microsoft-com:office:office" xmlns:v="urn:schemas-microsoft-com:vml" xmlns:w10="urn:schemas-microsoft-com:office:word" xmlns:w="http://schemas.openxmlformats.org/wordprocessingml/2006/main" xmlns:w14="http://schemas.microsoft.com/office/word/2010/wordml" xmlns:w15="http://schemas.microsoft.com/office/word/2012/wordml" xmlns:w16cex="http://schemas.microsoft.com/office/word/2018/wordml/cex" xmlns:w16cid="http://schemas.microsoft.com/office/word/2016/wordml/cid" xmlns:w16="http://schemas.microsoft.com/office/word/2018/wordml" xmlns:w16sdtdh="http://schemas.microsoft.com/office/word/2020/wordml/sdtdatahash" xmlns:w16sdtfl="http://schemas.microsoft.com/office/word/2024/wordml/sdtformatlock" xmlns:w16se="http://schemas.microsoft.com/office/word/2015/wordml/symex" xmlns:w16du="http://schemas.microsoft.com/office/word/2023/wordml/word16du" xmlns:wne="http://schemas.microsoft.com/office/word/2006/wordml" mc:Ignorable="w14 w15 w16se w16cid w16 w16cex w16sdtdh w16sdtfl w16du wp14">
   <w:p/>
 </w:ftr>
 </file>
 
 <file path=word/footer5.xml><?xml version="1.0" encoding="utf-8"?>
-<w:ftr xmlns:wpc="http://schemas.microsoft.com/office/word/2010/wordprocessingCanvas" xmlns:cx="http://schemas.microsoft.com/office/drawing/2014/chartex" xmlns:cx1="http://schemas.microsoft.com/office/drawing/2015/9/8/chartex" xmlns:cx2="http://schemas.microsoft.com/office/drawing/2015/10/21/chartex" xmlns:cx3="http://schemas.microsoft.com/office/drawing/2016/5/9/chartex" xmlns:cx4="http://schemas.microsoft.com/office/drawing/2016/5/10/chartex" xmlns:cx5="http://schemas.microsoft.com/office/drawing/2016/5/11/chartex" xmlns:cx6="http://schemas.microsoft.com/office/drawing/2016/5/12/chartex" xmlns:cx7="http://schemas.microsoft.com/office/drawing/2016/5/13/chartex" xmlns:cx8="http://schemas.microsoft.com/office/drawing/2016/5/14/chartex" xmlns:mc="http://schemas.openxmlformats.org/markup-compatibility/2006" xmlns:aink="http://schemas.microsoft.com/office/drawing/2016/ink" xmlns:am3d="http://schemas.microsoft.com/office/drawing/2017/model3d" xmlns:o="urn:schemas-microsoft-com:office:office" xmlns:oel="http://schemas.microsoft.com/office/2019/extlst" xmlns:r="http://schemas.openxmlformats.org/officeDocument/2006/relationships" xmlns:m="http://schemas.openxmlformats.org/officeDocument/2006/math" xmlns:v="urn:schemas-microsoft-com:vml" xmlns:wp14="http://schemas.microsoft.com/office/word/2010/wordprocessingDrawing" xmlns:wp="http://schemas.openxmlformats.org/drawingml/2006/wordprocessingDrawing" xmlns:w10="urn:schemas-microsoft-com:office:word" xmlns:w="http://schemas.openxmlformats.org/wordprocessingml/2006/main" xmlns:w14="http://schemas.microsoft.com/office/word/2010/wordml" xmlns:w15="http://schemas.microsoft.com/office/word/2012/wordml" xmlns:w16cex="http://schemas.microsoft.com/office/word/2018/wordml/cex" xmlns:w16cid="http://schemas.microsoft.com/office/word/2016/wordml/cid" xmlns:w16="http://schemas.microsoft.com/office/word/2018/wordml" xmlns:w16du="http://schemas.microsoft.com/office/word/2023/wordml/word16du" xmlns:w16sdtdh="http://schemas.microsoft.com/office/word/2020/wordml/sdtdatahash" xmlns:w16sdtfl="http://schemas.microsoft.com/office/word/2024/wordml/sdtformatlock" xmlns:w16se="http://schemas.microsoft.com/office/word/2015/wordml/symex" xmlns:wpg="http://schemas.microsoft.com/office/word/2010/wordprocessingGroup" xmlns:wpi="http://schemas.microsoft.com/office/word/2010/wordprocessingInk" xmlns:wne="http://schemas.microsoft.com/office/word/2006/wordml" xmlns:wps="http://schemas.microsoft.com/office/word/2010/wordprocessingShape" mc:Ignorable="w14 w15 w16se w16cid w16 w16cex w16sdtdh w16sdtfl w16du wp14">
+<w:ftr xmlns:wpc="http://schemas.microsoft.com/office/word/2010/wordprocessingCanvas" xmlns:cx="http://schemas.microsoft.com/office/drawing/2014/chartex" xmlns:cx1="http://schemas.microsoft.com/office/drawing/2015/9/8/chartex" xmlns:cx2="http://schemas.microsoft.com/office/drawing/2015/10/21/chartex" xmlns:cx3="http://schemas.microsoft.com/office/drawing/2016/5/9/chartex" xmlns:cx4="http://schemas.microsoft.com/office/drawing/2016/5/10/chartex" xmlns:cx5="http://schemas.microsoft.com/office/drawing/2016/5/11/chartex" xmlns:cx6="http://schemas.microsoft.com/office/drawing/2016/5/12/chartex" xmlns:cx7="http://schemas.microsoft.com/office/drawing/2016/5/13/chartex" xmlns:cx8="http://schemas.microsoft.com/office/drawing/2016/5/14/chartex" xmlns:mc="http://schemas.openxmlformats.org/markup-compatibility/2006" xmlns:m="http://schemas.openxmlformats.org/officeDocument/2006/math" xmlns:aink="http://schemas.microsoft.com/office/drawing/2016/ink" xmlns:am3d="http://schemas.microsoft.com/office/drawing/2017/model3d" xmlns:oel="http://schemas.microsoft.com/office/2019/extlst" xmlns:r="http://schemas.openxmlformats.org/officeDocument/2006/relationships" xmlns:wp14="http://schemas.microsoft.com/office/word/2010/wordprocessingDrawing" xmlns:wp="http://schemas.openxmlformats.org/drawingml/2006/wordprocessingDrawing" xmlns:wpg="http://schemas.microsoft.com/office/word/2010/wordprocessingGroup" xmlns:wpi="http://schemas.microsoft.com/office/word/2010/wordprocessingInk" xmlns:wps="http://schemas.microsoft.com/office/word/2010/wordprocessingShape" xmlns:o="urn:schemas-microsoft-com:office:office" xmlns:v="urn:schemas-microsoft-com:vml" xmlns:w10="urn:schemas-microsoft-com:office:word" xmlns:w="http://schemas.openxmlformats.org/wordprocessingml/2006/main" xmlns:w14="http://schemas.microsoft.com/office/word/2010/wordml" xmlns:w15="http://schemas.microsoft.com/office/word/2012/wordml" xmlns:w16cex="http://schemas.microsoft.com/office/word/2018/wordml/cex" xmlns:w16cid="http://schemas.microsoft.com/office/word/2016/wordml/cid" xmlns:w16="http://schemas.microsoft.com/office/word/2018/wordml" xmlns:w16sdtdh="http://schemas.microsoft.com/office/word/2020/wordml/sdtdatahash" xmlns:w16sdtfl="http://schemas.microsoft.com/office/word/2024/wordml/sdtformatlock" xmlns:w16se="http://schemas.microsoft.com/office/word/2015/wordml/symex" xmlns:w16du="http://schemas.microsoft.com/office/word/2023/wordml/word16du" xmlns:wne="http://schemas.microsoft.com/office/word/2006/wordml" mc:Ignorable="w14 w15 w16se w16cid w16 w16cex w16sdtdh w16sdtfl w16du wp14">
   <w:p/>
 </w:ftr>
 </file>
 
 <file path=word/footnotes.xml><?xml version="1.0" encoding="utf-8"?>
-<w:footnotes xmlns:wpc="http://schemas.microsoft.com/office/word/2010/wordprocessingCanvas" xmlns:cx="http://schemas.microsoft.com/office/drawing/2014/chartex" xmlns:cx1="http://schemas.microsoft.com/office/drawing/2015/9/8/chartex" xmlns:cx2="http://schemas.microsoft.com/office/drawing/2015/10/21/chartex" xmlns:cx3="http://schemas.microsoft.com/office/drawing/2016/5/9/chartex" xmlns:cx4="http://schemas.microsoft.com/office/drawing/2016/5/10/chartex" xmlns:cx5="http://schemas.microsoft.com/office/drawing/2016/5/11/chartex" xmlns:cx6="http://schemas.microsoft.com/office/drawing/2016/5/12/chartex" xmlns:cx7="http://schemas.microsoft.com/office/drawing/2016/5/13/chartex" xmlns:cx8="http://schemas.microsoft.com/office/drawing/2016/5/14/chartex" xmlns:mc="http://schemas.openxmlformats.org/markup-compatibility/2006" xmlns:aink="http://schemas.microsoft.com/office/drawing/2016/ink" xmlns:am3d="http://schemas.microsoft.com/office/drawing/2017/model3d" xmlns:o="urn:schemas-microsoft-com:office:office" xmlns:oel="http://schemas.microsoft.com/office/2019/extlst" xmlns:r="http://schemas.openxmlformats.org/officeDocument/2006/relationships" xmlns:m="http://schemas.openxmlformats.org/officeDocument/2006/math" xmlns:v="urn:schemas-microsoft-com:vml" xmlns:wp14="http://schemas.microsoft.com/office/word/2010/wordprocessingDrawing" xmlns:wp="http://schemas.openxmlformats.org/drawingml/2006/wordprocessingDrawing" xmlns:w10="urn:schemas-microsoft-com:office:word" xmlns:w="http://schemas.openxmlformats.org/wordprocessingml/2006/main" xmlns:w14="http://schemas.microsoft.com/office/word/2010/wordml" xmlns:w15="http://schemas.microsoft.com/office/word/2012/wordml" xmlns:w16cex="http://schemas.microsoft.com/office/word/2018/wordml/cex" xmlns:w16cid="http://schemas.microsoft.com/office/word/2016/wordml/cid" xmlns:w16="http://schemas.microsoft.com/office/word/2018/wordml" xmlns:w16du="http://schemas.microsoft.com/office/word/2023/wordml/word16du" xmlns:w16sdtdh="http://schemas.microsoft.com/office/word/2020/wordml/sdtdatahash" xmlns:w16sdtfl="http://schemas.microsoft.com/office/word/2024/wordml/sdtformatlock" xmlns:w16se="http://schemas.microsoft.com/office/word/2015/wordml/symex" xmlns:wpg="http://schemas.microsoft.com/office/word/2010/wordprocessingGroup" xmlns:wpi="http://schemas.microsoft.com/office/word/2010/wordprocessingInk" xmlns:wne="http://schemas.microsoft.com/office/word/2006/wordml" xmlns:wps="http://schemas.microsoft.com/office/word/2010/wordprocessingShape" mc:Ignorable="w14 w15 w16se w16cid w16 w16cex w16sdtdh w16sdtfl w16du wp14">
+<w:footnotes xmlns:wpc="http://schemas.microsoft.com/office/word/2010/wordprocessingCanvas" xmlns:cx="http://schemas.microsoft.com/office/drawing/2014/chartex" xmlns:cx1="http://schemas.microsoft.com/office/drawing/2015/9/8/chartex" xmlns:cx2="http://schemas.microsoft.com/office/drawing/2015/10/21/chartex" xmlns:cx3="http://schemas.microsoft.com/office/drawing/2016/5/9/chartex" xmlns:cx4="http://schemas.microsoft.com/office/drawing/2016/5/10/chartex" xmlns:cx5="http://schemas.microsoft.com/office/drawing/2016/5/11/chartex" xmlns:cx6="http://schemas.microsoft.com/office/drawing/2016/5/12/chartex" xmlns:cx7="http://schemas.microsoft.com/office/drawing/2016/5/13/chartex" xmlns:cx8="http://schemas.microsoft.com/office/drawing/2016/5/14/chartex" xmlns:mc="http://schemas.openxmlformats.org/markup-compatibility/2006" xmlns:m="http://schemas.openxmlformats.org/officeDocument/2006/math" xmlns:aink="http://schemas.microsoft.com/office/drawing/2016/ink" xmlns:am3d="http://schemas.microsoft.com/office/drawing/2017/model3d" xmlns:oel="http://schemas.microsoft.com/office/2019/extlst" xmlns:r="http://schemas.openxmlformats.org/officeDocument/2006/relationships" xmlns:wp14="http://schemas.microsoft.com/office/word/2010/wordprocessingDrawing" xmlns:wp="http://schemas.openxmlformats.org/drawingml/2006/wordprocessingDrawing" xmlns:wpg="http://schemas.microsoft.com/office/word/2010/wordprocessingGroup" xmlns:wpi="http://schemas.microsoft.com/office/word/2010/wordprocessingInk" xmlns:wps="http://schemas.microsoft.com/office/word/2010/wordprocessingShape" xmlns:o="urn:schemas-microsoft-com:office:office" xmlns:v="urn:schemas-microsoft-com:vml" xmlns:w10="urn:schemas-microsoft-com:office:word" xmlns:w="http://schemas.openxmlformats.org/wordprocessingml/2006/main" xmlns:w14="http://schemas.microsoft.com/office/word/2010/wordml" xmlns:w15="http://schemas.microsoft.com/office/word/2012/wordml" xmlns:w16cex="http://schemas.microsoft.com/office/word/2018/wordml/cex" xmlns:w16cid="http://schemas.microsoft.com/office/word/2016/wordml/cid" xmlns:w16="http://schemas.microsoft.com/office/word/2018/wordml" xmlns:w16sdtdh="http://schemas.microsoft.com/office/word/2020/wordml/sdtdatahash" xmlns:w16sdtfl="http://schemas.microsoft.com/office/word/2024/wordml/sdtformatlock" xmlns:w16se="http://schemas.microsoft.com/office/word/2015/wordml/symex" xmlns:w16du="http://schemas.microsoft.com/office/word/2023/wordml/word16du" xmlns:wne="http://schemas.microsoft.com/office/word/2006/wordml" mc:Ignorable="w14 w15 w16se w16cid w16 w16cex w16sdtdh w16sdtfl w16du wp14">
   <w:footnote w:type="separator" w:id="-1">
     <w:p>
       <w:r>
@@ -3182,7 +3407,7 @@
 </file>
 
 <file path=word/header1.xml><?xml version="1.0" encoding="utf-8"?>
-<w:hdr xmlns:wpc="http://schemas.microsoft.com/office/word/2010/wordprocessingCanvas" xmlns:cx="http://schemas.microsoft.com/office/drawing/2014/chartex" xmlns:cx1="http://schemas.microsoft.com/office/drawing/2015/9/8/chartex" xmlns:cx2="http://schemas.microsoft.com/office/drawing/2015/10/21/chartex" xmlns:cx3="http://schemas.microsoft.com/office/drawing/2016/5/9/chartex" xmlns:cx4="http://schemas.microsoft.com/office/drawing/2016/5/10/chartex" xmlns:cx5="http://schemas.microsoft.com/office/drawing/2016/5/11/chartex" xmlns:cx6="http://schemas.microsoft.com/office/drawing/2016/5/12/chartex" xmlns:cx7="http://schemas.microsoft.com/office/drawing/2016/5/13/chartex" xmlns:cx8="http://schemas.microsoft.com/office/drawing/2016/5/14/chartex" xmlns:mc="http://schemas.openxmlformats.org/markup-compatibility/2006" xmlns:aink="http://schemas.microsoft.com/office/drawing/2016/ink" xmlns:am3d="http://schemas.microsoft.com/office/drawing/2017/model3d" xmlns:o="urn:schemas-microsoft-com:office:office" xmlns:oel="http://schemas.microsoft.com/office/2019/extlst" xmlns:r="http://schemas.openxmlformats.org/officeDocument/2006/relationships" xmlns:m="http://schemas.openxmlformats.org/officeDocument/2006/math" xmlns:v="urn:schemas-microsoft-com:vml" xmlns:wp14="http://schemas.microsoft.com/office/word/2010/wordprocessingDrawing" xmlns:wp="http://schemas.openxmlformats.org/drawingml/2006/wordprocessingDrawing" xmlns:w10="urn:schemas-microsoft-com:office:word" xmlns:w="http://schemas.openxmlformats.org/wordprocessingml/2006/main" xmlns:w14="http://schemas.microsoft.com/office/word/2010/wordml" xmlns:w15="http://schemas.microsoft.com/office/word/2012/wordml" xmlns:w16cex="http://schemas.microsoft.com/office/word/2018/wordml/cex" xmlns:w16cid="http://schemas.microsoft.com/office/word/2016/wordml/cid" xmlns:w16="http://schemas.microsoft.com/office/word/2018/wordml" xmlns:w16du="http://schemas.microsoft.com/office/word/2023/wordml/word16du" xmlns:w16sdtdh="http://schemas.microsoft.com/office/word/2020/wordml/sdtdatahash" xmlns:w16sdtfl="http://schemas.microsoft.com/office/word/2024/wordml/sdtformatlock" xmlns:w16se="http://schemas.microsoft.com/office/word/2015/wordml/symex" xmlns:wpg="http://schemas.microsoft.com/office/word/2010/wordprocessingGroup" xmlns:wpi="http://schemas.microsoft.com/office/word/2010/wordprocessingInk" xmlns:wne="http://schemas.microsoft.com/office/word/2006/wordml" xmlns:wps="http://schemas.microsoft.com/office/word/2010/wordprocessingShape" mc:Ignorable="w14 w15 w16se w16cid w16 w16cex w16sdtdh w16sdtfl w16du wp14">
+<w:hdr xmlns:wpc="http://schemas.microsoft.com/office/word/2010/wordprocessingCanvas" xmlns:cx="http://schemas.microsoft.com/office/drawing/2014/chartex" xmlns:cx1="http://schemas.microsoft.com/office/drawing/2015/9/8/chartex" xmlns:cx2="http://schemas.microsoft.com/office/drawing/2015/10/21/chartex" xmlns:cx3="http://schemas.microsoft.com/office/drawing/2016/5/9/chartex" xmlns:cx4="http://schemas.microsoft.com/office/drawing/2016/5/10/chartex" xmlns:cx5="http://schemas.microsoft.com/office/drawing/2016/5/11/chartex" xmlns:cx6="http://schemas.microsoft.com/office/drawing/2016/5/12/chartex" xmlns:cx7="http://schemas.microsoft.com/office/drawing/2016/5/13/chartex" xmlns:cx8="http://schemas.microsoft.com/office/drawing/2016/5/14/chartex" xmlns:mc="http://schemas.openxmlformats.org/markup-compatibility/2006" xmlns:m="http://schemas.openxmlformats.org/officeDocument/2006/math" xmlns:aink="http://schemas.microsoft.com/office/drawing/2016/ink" xmlns:am3d="http://schemas.microsoft.com/office/drawing/2017/model3d" xmlns:oel="http://schemas.microsoft.com/office/2019/extlst" xmlns:r="http://schemas.openxmlformats.org/officeDocument/2006/relationships" xmlns:wp14="http://schemas.microsoft.com/office/word/2010/wordprocessingDrawing" xmlns:wp="http://schemas.openxmlformats.org/drawingml/2006/wordprocessingDrawing" xmlns:wpg="http://schemas.microsoft.com/office/word/2010/wordprocessingGroup" xmlns:wpi="http://schemas.microsoft.com/office/word/2010/wordprocessingInk" xmlns:wps="http://schemas.microsoft.com/office/word/2010/wordprocessingShape" xmlns:o="urn:schemas-microsoft-com:office:office" xmlns:v="urn:schemas-microsoft-com:vml" xmlns:w10="urn:schemas-microsoft-com:office:word" xmlns:w="http://schemas.openxmlformats.org/wordprocessingml/2006/main" xmlns:w14="http://schemas.microsoft.com/office/word/2010/wordml" xmlns:w15="http://schemas.microsoft.com/office/word/2012/wordml" xmlns:w16cex="http://schemas.microsoft.com/office/word/2018/wordml/cex" xmlns:w16cid="http://schemas.microsoft.com/office/word/2016/wordml/cid" xmlns:w16="http://schemas.microsoft.com/office/word/2018/wordml" xmlns:w16sdtdh="http://schemas.microsoft.com/office/word/2020/wordml/sdtdatahash" xmlns:w16sdtfl="http://schemas.microsoft.com/office/word/2024/wordml/sdtformatlock" xmlns:w16se="http://schemas.microsoft.com/office/word/2015/wordml/symex" xmlns:w16du="http://schemas.microsoft.com/office/word/2023/wordml/word16du" xmlns:wne="http://schemas.microsoft.com/office/word/2006/wordml" mc:Ignorable="w14 w15 w16se w16cid w16 w16cex w16sdtdh w16sdtfl w16du wp14">
   <w:tbl>
     <w:tblPr>
       <w:tblW w:w="0" w:type="auto"/>
@@ -3285,7 +3510,7 @@
               <w:b w:val="0"/>
               <w:sz w:val="20"/>
             </w:rPr>
-            <w:t>0</w:t>
+            <w:t>2</w:t>
           </w:r>
         </w:p>
       </w:tc>
@@ -3316,19 +3541,11 @@
             </w:rPr>
             <w:t xml:space="preserve">Documento: </w:t>
           </w:r>
-          <w:proofErr w:type="spellStart"/>
           <w:r>
             <w:rPr>
               <w:sz w:val="20"/>
             </w:rPr>
-            <w:t>Problem</w:t>
-          </w:r>
-          <w:proofErr w:type="spellEnd"/>
-          <w:r>
-            <w:rPr>
-              <w:sz w:val="20"/>
-            </w:rPr>
-            <w:t xml:space="preserve"> Statement</w:t>
+            <w:t>Problem Statement</w:t>
           </w:r>
         </w:p>
       </w:tc>
@@ -3359,7 +3576,13 @@
             <w:rPr>
               <w:sz w:val="20"/>
             </w:rPr>
-            <w:t>10</w:t>
+            <w:t>1</w:t>
+          </w:r>
+          <w:r>
+            <w:rPr>
+              <w:sz w:val="20"/>
+            </w:rPr>
+            <w:t>2</w:t>
           </w:r>
           <w:r>
             <w:rPr>
@@ -3398,31 +3621,31 @@
 </file>
 
 <file path=word/header2.xml><?xml version="1.0" encoding="utf-8"?>
-<w:hdr xmlns:wpc="http://schemas.microsoft.com/office/word/2010/wordprocessingCanvas" xmlns:cx="http://schemas.microsoft.com/office/drawing/2014/chartex" xmlns:cx1="http://schemas.microsoft.com/office/drawing/2015/9/8/chartex" xmlns:cx2="http://schemas.microsoft.com/office/drawing/2015/10/21/chartex" xmlns:cx3="http://schemas.microsoft.com/office/drawing/2016/5/9/chartex" xmlns:cx4="http://schemas.microsoft.com/office/drawing/2016/5/10/chartex" xmlns:cx5="http://schemas.microsoft.com/office/drawing/2016/5/11/chartex" xmlns:cx6="http://schemas.microsoft.com/office/drawing/2016/5/12/chartex" xmlns:cx7="http://schemas.microsoft.com/office/drawing/2016/5/13/chartex" xmlns:cx8="http://schemas.microsoft.com/office/drawing/2016/5/14/chartex" xmlns:mc="http://schemas.openxmlformats.org/markup-compatibility/2006" xmlns:aink="http://schemas.microsoft.com/office/drawing/2016/ink" xmlns:am3d="http://schemas.microsoft.com/office/drawing/2017/model3d" xmlns:o="urn:schemas-microsoft-com:office:office" xmlns:oel="http://schemas.microsoft.com/office/2019/extlst" xmlns:r="http://schemas.openxmlformats.org/officeDocument/2006/relationships" xmlns:m="http://schemas.openxmlformats.org/officeDocument/2006/math" xmlns:v="urn:schemas-microsoft-com:vml" xmlns:wp14="http://schemas.microsoft.com/office/word/2010/wordprocessingDrawing" xmlns:wp="http://schemas.openxmlformats.org/drawingml/2006/wordprocessingDrawing" xmlns:w10="urn:schemas-microsoft-com:office:word" xmlns:w="http://schemas.openxmlformats.org/wordprocessingml/2006/main" xmlns:w14="http://schemas.microsoft.com/office/word/2010/wordml" xmlns:w15="http://schemas.microsoft.com/office/word/2012/wordml" xmlns:w16cex="http://schemas.microsoft.com/office/word/2018/wordml/cex" xmlns:w16cid="http://schemas.microsoft.com/office/word/2016/wordml/cid" xmlns:w16="http://schemas.microsoft.com/office/word/2018/wordml" xmlns:w16du="http://schemas.microsoft.com/office/word/2023/wordml/word16du" xmlns:w16sdtdh="http://schemas.microsoft.com/office/word/2020/wordml/sdtdatahash" xmlns:w16sdtfl="http://schemas.microsoft.com/office/word/2024/wordml/sdtformatlock" xmlns:w16se="http://schemas.microsoft.com/office/word/2015/wordml/symex" xmlns:wpg="http://schemas.microsoft.com/office/word/2010/wordprocessingGroup" xmlns:wpi="http://schemas.microsoft.com/office/word/2010/wordprocessingInk" xmlns:wne="http://schemas.microsoft.com/office/word/2006/wordml" xmlns:wps="http://schemas.microsoft.com/office/word/2010/wordprocessingShape" mc:Ignorable="w14 w15 w16se w16cid w16 w16cex w16sdtdh w16sdtfl w16du wp14">
+<w:hdr xmlns:wpc="http://schemas.microsoft.com/office/word/2010/wordprocessingCanvas" xmlns:cx="http://schemas.microsoft.com/office/drawing/2014/chartex" xmlns:cx1="http://schemas.microsoft.com/office/drawing/2015/9/8/chartex" xmlns:cx2="http://schemas.microsoft.com/office/drawing/2015/10/21/chartex" xmlns:cx3="http://schemas.microsoft.com/office/drawing/2016/5/9/chartex" xmlns:cx4="http://schemas.microsoft.com/office/drawing/2016/5/10/chartex" xmlns:cx5="http://schemas.microsoft.com/office/drawing/2016/5/11/chartex" xmlns:cx6="http://schemas.microsoft.com/office/drawing/2016/5/12/chartex" xmlns:cx7="http://schemas.microsoft.com/office/drawing/2016/5/13/chartex" xmlns:cx8="http://schemas.microsoft.com/office/drawing/2016/5/14/chartex" xmlns:mc="http://schemas.openxmlformats.org/markup-compatibility/2006" xmlns:m="http://schemas.openxmlformats.org/officeDocument/2006/math" xmlns:aink="http://schemas.microsoft.com/office/drawing/2016/ink" xmlns:am3d="http://schemas.microsoft.com/office/drawing/2017/model3d" xmlns:oel="http://schemas.microsoft.com/office/2019/extlst" xmlns:r="http://schemas.openxmlformats.org/officeDocument/2006/relationships" xmlns:wp14="http://schemas.microsoft.com/office/word/2010/wordprocessingDrawing" xmlns:wp="http://schemas.openxmlformats.org/drawingml/2006/wordprocessingDrawing" xmlns:wpg="http://schemas.microsoft.com/office/word/2010/wordprocessingGroup" xmlns:wpi="http://schemas.microsoft.com/office/word/2010/wordprocessingInk" xmlns:wps="http://schemas.microsoft.com/office/word/2010/wordprocessingShape" xmlns:o="urn:schemas-microsoft-com:office:office" xmlns:v="urn:schemas-microsoft-com:vml" xmlns:w10="urn:schemas-microsoft-com:office:word" xmlns:w="http://schemas.openxmlformats.org/wordprocessingml/2006/main" xmlns:w14="http://schemas.microsoft.com/office/word/2010/wordml" xmlns:w15="http://schemas.microsoft.com/office/word/2012/wordml" xmlns:w16cex="http://schemas.microsoft.com/office/word/2018/wordml/cex" xmlns:w16cid="http://schemas.microsoft.com/office/word/2016/wordml/cid" xmlns:w16="http://schemas.microsoft.com/office/word/2018/wordml" xmlns:w16sdtdh="http://schemas.microsoft.com/office/word/2020/wordml/sdtdatahash" xmlns:w16sdtfl="http://schemas.microsoft.com/office/word/2024/wordml/sdtformatlock" xmlns:w16se="http://schemas.microsoft.com/office/word/2015/wordml/symex" xmlns:w16du="http://schemas.microsoft.com/office/word/2023/wordml/word16du" xmlns:wne="http://schemas.microsoft.com/office/word/2006/wordml" mc:Ignorable="w14 w15 w16se w16cid w16 w16cex w16sdtdh w16sdtfl w16du wp14">
   <w:p/>
 </w:hdr>
 </file>
 
 <file path=word/header3.xml><?xml version="1.0" encoding="utf-8"?>
-<w:hdr xmlns:wpc="http://schemas.microsoft.com/office/word/2010/wordprocessingCanvas" xmlns:cx="http://schemas.microsoft.com/office/drawing/2014/chartex" xmlns:cx1="http://schemas.microsoft.com/office/drawing/2015/9/8/chartex" xmlns:cx2="http://schemas.microsoft.com/office/drawing/2015/10/21/chartex" xmlns:cx3="http://schemas.microsoft.com/office/drawing/2016/5/9/chartex" xmlns:cx4="http://schemas.microsoft.com/office/drawing/2016/5/10/chartex" xmlns:cx5="http://schemas.microsoft.com/office/drawing/2016/5/11/chartex" xmlns:cx6="http://schemas.microsoft.com/office/drawing/2016/5/12/chartex" xmlns:cx7="http://schemas.microsoft.com/office/drawing/2016/5/13/chartex" xmlns:cx8="http://schemas.microsoft.com/office/drawing/2016/5/14/chartex" xmlns:mc="http://schemas.openxmlformats.org/markup-compatibility/2006" xmlns:aink="http://schemas.microsoft.com/office/drawing/2016/ink" xmlns:am3d="http://schemas.microsoft.com/office/drawing/2017/model3d" xmlns:o="urn:schemas-microsoft-com:office:office" xmlns:oel="http://schemas.microsoft.com/office/2019/extlst" xmlns:r="http://schemas.openxmlformats.org/officeDocument/2006/relationships" xmlns:m="http://schemas.openxmlformats.org/officeDocument/2006/math" xmlns:v="urn:schemas-microsoft-com:vml" xmlns:wp14="http://schemas.microsoft.com/office/word/2010/wordprocessingDrawing" xmlns:wp="http://schemas.openxmlformats.org/drawingml/2006/wordprocessingDrawing" xmlns:w10="urn:schemas-microsoft-com:office:word" xmlns:w="http://schemas.openxmlformats.org/wordprocessingml/2006/main" xmlns:w14="http://schemas.microsoft.com/office/word/2010/wordml" xmlns:w15="http://schemas.microsoft.com/office/word/2012/wordml" xmlns:w16cex="http://schemas.microsoft.com/office/word/2018/wordml/cex" xmlns:w16cid="http://schemas.microsoft.com/office/word/2016/wordml/cid" xmlns:w16="http://schemas.microsoft.com/office/word/2018/wordml" xmlns:w16du="http://schemas.microsoft.com/office/word/2023/wordml/word16du" xmlns:w16sdtdh="http://schemas.microsoft.com/office/word/2020/wordml/sdtdatahash" xmlns:w16sdtfl="http://schemas.microsoft.com/office/word/2024/wordml/sdtformatlock" xmlns:w16se="http://schemas.microsoft.com/office/word/2015/wordml/symex" xmlns:wpg="http://schemas.microsoft.com/office/word/2010/wordprocessingGroup" xmlns:wpi="http://schemas.microsoft.com/office/word/2010/wordprocessingInk" xmlns:wne="http://schemas.microsoft.com/office/word/2006/wordml" xmlns:wps="http://schemas.microsoft.com/office/word/2010/wordprocessingShape" mc:Ignorable="w14 w15 w16se w16cid w16 w16cex w16sdtdh w16sdtfl w16du wp14">
+<w:hdr xmlns:wpc="http://schemas.microsoft.com/office/word/2010/wordprocessingCanvas" xmlns:cx="http://schemas.microsoft.com/office/drawing/2014/chartex" xmlns:cx1="http://schemas.microsoft.com/office/drawing/2015/9/8/chartex" xmlns:cx2="http://schemas.microsoft.com/office/drawing/2015/10/21/chartex" xmlns:cx3="http://schemas.microsoft.com/office/drawing/2016/5/9/chartex" xmlns:cx4="http://schemas.microsoft.com/office/drawing/2016/5/10/chartex" xmlns:cx5="http://schemas.microsoft.com/office/drawing/2016/5/11/chartex" xmlns:cx6="http://schemas.microsoft.com/office/drawing/2016/5/12/chartex" xmlns:cx7="http://schemas.microsoft.com/office/drawing/2016/5/13/chartex" xmlns:cx8="http://schemas.microsoft.com/office/drawing/2016/5/14/chartex" xmlns:mc="http://schemas.openxmlformats.org/markup-compatibility/2006" xmlns:m="http://schemas.openxmlformats.org/officeDocument/2006/math" xmlns:aink="http://schemas.microsoft.com/office/drawing/2016/ink" xmlns:am3d="http://schemas.microsoft.com/office/drawing/2017/model3d" xmlns:oel="http://schemas.microsoft.com/office/2019/extlst" xmlns:r="http://schemas.openxmlformats.org/officeDocument/2006/relationships" xmlns:wp14="http://schemas.microsoft.com/office/word/2010/wordprocessingDrawing" xmlns:wp="http://schemas.openxmlformats.org/drawingml/2006/wordprocessingDrawing" xmlns:wpg="http://schemas.microsoft.com/office/word/2010/wordprocessingGroup" xmlns:wpi="http://schemas.microsoft.com/office/word/2010/wordprocessingInk" xmlns:wps="http://schemas.microsoft.com/office/word/2010/wordprocessingShape" xmlns:o="urn:schemas-microsoft-com:office:office" xmlns:v="urn:schemas-microsoft-com:vml" xmlns:w10="urn:schemas-microsoft-com:office:word" xmlns:w="http://schemas.openxmlformats.org/wordprocessingml/2006/main" xmlns:w14="http://schemas.microsoft.com/office/word/2010/wordml" xmlns:w15="http://schemas.microsoft.com/office/word/2012/wordml" xmlns:w16cex="http://schemas.microsoft.com/office/word/2018/wordml/cex" xmlns:w16cid="http://schemas.microsoft.com/office/word/2016/wordml/cid" xmlns:w16="http://schemas.microsoft.com/office/word/2018/wordml" xmlns:w16sdtdh="http://schemas.microsoft.com/office/word/2020/wordml/sdtdatahash" xmlns:w16sdtfl="http://schemas.microsoft.com/office/word/2024/wordml/sdtformatlock" xmlns:w16se="http://schemas.microsoft.com/office/word/2015/wordml/symex" xmlns:w16du="http://schemas.microsoft.com/office/word/2023/wordml/word16du" xmlns:wne="http://schemas.microsoft.com/office/word/2006/wordml" mc:Ignorable="w14 w15 w16se w16cid w16 w16cex w16sdtdh w16sdtfl w16du wp14">
   <w:p/>
 </w:hdr>
 </file>
 
 <file path=word/header4.xml><?xml version="1.0" encoding="utf-8"?>
-<w:hdr xmlns:wpc="http://schemas.microsoft.com/office/word/2010/wordprocessingCanvas" xmlns:cx="http://schemas.microsoft.com/office/drawing/2014/chartex" xmlns:cx1="http://schemas.microsoft.com/office/drawing/2015/9/8/chartex" xmlns:cx2="http://schemas.microsoft.com/office/drawing/2015/10/21/chartex" xmlns:cx3="http://schemas.microsoft.com/office/drawing/2016/5/9/chartex" xmlns:cx4="http://schemas.microsoft.com/office/drawing/2016/5/10/chartex" xmlns:cx5="http://schemas.microsoft.com/office/drawing/2016/5/11/chartex" xmlns:cx6="http://schemas.microsoft.com/office/drawing/2016/5/12/chartex" xmlns:cx7="http://schemas.microsoft.com/office/drawing/2016/5/13/chartex" xmlns:cx8="http://schemas.microsoft.com/office/drawing/2016/5/14/chartex" xmlns:mc="http://schemas.openxmlformats.org/markup-compatibility/2006" xmlns:aink="http://schemas.microsoft.com/office/drawing/2016/ink" xmlns:am3d="http://schemas.microsoft.com/office/drawing/2017/model3d" xmlns:o="urn:schemas-microsoft-com:office:office" xmlns:oel="http://schemas.microsoft.com/office/2019/extlst" xmlns:r="http://schemas.openxmlformats.org/officeDocument/2006/relationships" xmlns:m="http://schemas.openxmlformats.org/officeDocument/2006/math" xmlns:v="urn:schemas-microsoft-com:vml" xmlns:wp14="http://schemas.microsoft.com/office/word/2010/wordprocessingDrawing" xmlns:wp="http://schemas.openxmlformats.org/drawingml/2006/wordprocessingDrawing" xmlns:w10="urn:schemas-microsoft-com:office:word" xmlns:w="http://schemas.openxmlformats.org/wordprocessingml/2006/main" xmlns:w14="http://schemas.microsoft.com/office/word/2010/wordml" xmlns:w15="http://schemas.microsoft.com/office/word/2012/wordml" xmlns:w16cex="http://schemas.microsoft.com/office/word/2018/wordml/cex" xmlns:w16cid="http://schemas.microsoft.com/office/word/2016/wordml/cid" xmlns:w16="http://schemas.microsoft.com/office/word/2018/wordml" xmlns:w16du="http://schemas.microsoft.com/office/word/2023/wordml/word16du" xmlns:w16sdtdh="http://schemas.microsoft.com/office/word/2020/wordml/sdtdatahash" xmlns:w16sdtfl="http://schemas.microsoft.com/office/word/2024/wordml/sdtformatlock" xmlns:w16se="http://schemas.microsoft.com/office/word/2015/wordml/symex" xmlns:wpg="http://schemas.microsoft.com/office/word/2010/wordprocessingGroup" xmlns:wpi="http://schemas.microsoft.com/office/word/2010/wordprocessingInk" xmlns:wne="http://schemas.microsoft.com/office/word/2006/wordml" xmlns:wps="http://schemas.microsoft.com/office/word/2010/wordprocessingShape" mc:Ignorable="w14 w15 w16se w16cid w16 w16cex w16sdtdh w16sdtfl w16du wp14">
+<w:hdr xmlns:wpc="http://schemas.microsoft.com/office/word/2010/wordprocessingCanvas" xmlns:cx="http://schemas.microsoft.com/office/drawing/2014/chartex" xmlns:cx1="http://schemas.microsoft.com/office/drawing/2015/9/8/chartex" xmlns:cx2="http://schemas.microsoft.com/office/drawing/2015/10/21/chartex" xmlns:cx3="http://schemas.microsoft.com/office/drawing/2016/5/9/chartex" xmlns:cx4="http://schemas.microsoft.com/office/drawing/2016/5/10/chartex" xmlns:cx5="http://schemas.microsoft.com/office/drawing/2016/5/11/chartex" xmlns:cx6="http://schemas.microsoft.com/office/drawing/2016/5/12/chartex" xmlns:cx7="http://schemas.microsoft.com/office/drawing/2016/5/13/chartex" xmlns:cx8="http://schemas.microsoft.com/office/drawing/2016/5/14/chartex" xmlns:mc="http://schemas.openxmlformats.org/markup-compatibility/2006" xmlns:m="http://schemas.openxmlformats.org/officeDocument/2006/math" xmlns:aink="http://schemas.microsoft.com/office/drawing/2016/ink" xmlns:am3d="http://schemas.microsoft.com/office/drawing/2017/model3d" xmlns:oel="http://schemas.microsoft.com/office/2019/extlst" xmlns:r="http://schemas.openxmlformats.org/officeDocument/2006/relationships" xmlns:wp14="http://schemas.microsoft.com/office/word/2010/wordprocessingDrawing" xmlns:wp="http://schemas.openxmlformats.org/drawingml/2006/wordprocessingDrawing" xmlns:wpg="http://schemas.microsoft.com/office/word/2010/wordprocessingGroup" xmlns:wpi="http://schemas.microsoft.com/office/word/2010/wordprocessingInk" xmlns:wps="http://schemas.microsoft.com/office/word/2010/wordprocessingShape" xmlns:o="urn:schemas-microsoft-com:office:office" xmlns:v="urn:schemas-microsoft-com:vml" xmlns:w10="urn:schemas-microsoft-com:office:word" xmlns:w="http://schemas.openxmlformats.org/wordprocessingml/2006/main" xmlns:w14="http://schemas.microsoft.com/office/word/2010/wordml" xmlns:w15="http://schemas.microsoft.com/office/word/2012/wordml" xmlns:w16cex="http://schemas.microsoft.com/office/word/2018/wordml/cex" xmlns:w16cid="http://schemas.microsoft.com/office/word/2016/wordml/cid" xmlns:w16="http://schemas.microsoft.com/office/word/2018/wordml" xmlns:w16sdtdh="http://schemas.microsoft.com/office/word/2020/wordml/sdtdatahash" xmlns:w16sdtfl="http://schemas.microsoft.com/office/word/2024/wordml/sdtformatlock" xmlns:w16se="http://schemas.microsoft.com/office/word/2015/wordml/symex" xmlns:w16du="http://schemas.microsoft.com/office/word/2023/wordml/word16du" xmlns:wne="http://schemas.microsoft.com/office/word/2006/wordml" mc:Ignorable="w14 w15 w16se w16cid w16 w16cex w16sdtdh w16sdtfl w16du wp14">
   <w:p/>
 </w:hdr>
 </file>
 
 <file path=word/header5.xml><?xml version="1.0" encoding="utf-8"?>
-<w:hdr xmlns:wpc="http://schemas.microsoft.com/office/word/2010/wordprocessingCanvas" xmlns:cx="http://schemas.microsoft.com/office/drawing/2014/chartex" xmlns:cx1="http://schemas.microsoft.com/office/drawing/2015/9/8/chartex" xmlns:cx2="http://schemas.microsoft.com/office/drawing/2015/10/21/chartex" xmlns:cx3="http://schemas.microsoft.com/office/drawing/2016/5/9/chartex" xmlns:cx4="http://schemas.microsoft.com/office/drawing/2016/5/10/chartex" xmlns:cx5="http://schemas.microsoft.com/office/drawing/2016/5/11/chartex" xmlns:cx6="http://schemas.microsoft.com/office/drawing/2016/5/12/chartex" xmlns:cx7="http://schemas.microsoft.com/office/drawing/2016/5/13/chartex" xmlns:cx8="http://schemas.microsoft.com/office/drawing/2016/5/14/chartex" xmlns:mc="http://schemas.openxmlformats.org/markup-compatibility/2006" xmlns:aink="http://schemas.microsoft.com/office/drawing/2016/ink" xmlns:am3d="http://schemas.microsoft.com/office/drawing/2017/model3d" xmlns:o="urn:schemas-microsoft-com:office:office" xmlns:oel="http://schemas.microsoft.com/office/2019/extlst" xmlns:r="http://schemas.openxmlformats.org/officeDocument/2006/relationships" xmlns:m="http://schemas.openxmlformats.org/officeDocument/2006/math" xmlns:v="urn:schemas-microsoft-com:vml" xmlns:wp14="http://schemas.microsoft.com/office/word/2010/wordprocessingDrawing" xmlns:wp="http://schemas.openxmlformats.org/drawingml/2006/wordprocessingDrawing" xmlns:w10="urn:schemas-microsoft-com:office:word" xmlns:w="http://schemas.openxmlformats.org/wordprocessingml/2006/main" xmlns:w14="http://schemas.microsoft.com/office/word/2010/wordml" xmlns:w15="http://schemas.microsoft.com/office/word/2012/wordml" xmlns:w16cex="http://schemas.microsoft.com/office/word/2018/wordml/cex" xmlns:w16cid="http://schemas.microsoft.com/office/word/2016/wordml/cid" xmlns:w16="http://schemas.microsoft.com/office/word/2018/wordml" xmlns:w16du="http://schemas.microsoft.com/office/word/2023/wordml/word16du" xmlns:w16sdtdh="http://schemas.microsoft.com/office/word/2020/wordml/sdtdatahash" xmlns:w16sdtfl="http://schemas.microsoft.com/office/word/2024/wordml/sdtformatlock" xmlns:w16se="http://schemas.microsoft.com/office/word/2015/wordml/symex" xmlns:wpg="http://schemas.microsoft.com/office/word/2010/wordprocessingGroup" xmlns:wpi="http://schemas.microsoft.com/office/word/2010/wordprocessingInk" xmlns:wne="http://schemas.microsoft.com/office/word/2006/wordml" xmlns:wps="http://schemas.microsoft.com/office/word/2010/wordprocessingShape" mc:Ignorable="w14 w15 w16se w16cid w16 w16cex w16sdtdh w16sdtfl w16du wp14">
+<w:hdr xmlns:wpc="http://schemas.microsoft.com/office/word/2010/wordprocessingCanvas" xmlns:cx="http://schemas.microsoft.com/office/drawing/2014/chartex" xmlns:cx1="http://schemas.microsoft.com/office/drawing/2015/9/8/chartex" xmlns:cx2="http://schemas.microsoft.com/office/drawing/2015/10/21/chartex" xmlns:cx3="http://schemas.microsoft.com/office/drawing/2016/5/9/chartex" xmlns:cx4="http://schemas.microsoft.com/office/drawing/2016/5/10/chartex" xmlns:cx5="http://schemas.microsoft.com/office/drawing/2016/5/11/chartex" xmlns:cx6="http://schemas.microsoft.com/office/drawing/2016/5/12/chartex" xmlns:cx7="http://schemas.microsoft.com/office/drawing/2016/5/13/chartex" xmlns:cx8="http://schemas.microsoft.com/office/drawing/2016/5/14/chartex" xmlns:mc="http://schemas.openxmlformats.org/markup-compatibility/2006" xmlns:m="http://schemas.openxmlformats.org/officeDocument/2006/math" xmlns:aink="http://schemas.microsoft.com/office/drawing/2016/ink" xmlns:am3d="http://schemas.microsoft.com/office/drawing/2017/model3d" xmlns:oel="http://schemas.microsoft.com/office/2019/extlst" xmlns:r="http://schemas.openxmlformats.org/officeDocument/2006/relationships" xmlns:wp14="http://schemas.microsoft.com/office/word/2010/wordprocessingDrawing" xmlns:wp="http://schemas.openxmlformats.org/drawingml/2006/wordprocessingDrawing" xmlns:wpg="http://schemas.microsoft.com/office/word/2010/wordprocessingGroup" xmlns:wpi="http://schemas.microsoft.com/office/word/2010/wordprocessingInk" xmlns:wps="http://schemas.microsoft.com/office/word/2010/wordprocessingShape" xmlns:o="urn:schemas-microsoft-com:office:office" xmlns:v="urn:schemas-microsoft-com:vml" xmlns:w10="urn:schemas-microsoft-com:office:word" xmlns:w="http://schemas.openxmlformats.org/wordprocessingml/2006/main" xmlns:w14="http://schemas.microsoft.com/office/word/2010/wordml" xmlns:w15="http://schemas.microsoft.com/office/word/2012/wordml" xmlns:w16cex="http://schemas.microsoft.com/office/word/2018/wordml/cex" xmlns:w16cid="http://schemas.microsoft.com/office/word/2016/wordml/cid" xmlns:w16="http://schemas.microsoft.com/office/word/2018/wordml" xmlns:w16sdtdh="http://schemas.microsoft.com/office/word/2020/wordml/sdtdatahash" xmlns:w16sdtfl="http://schemas.microsoft.com/office/word/2024/wordml/sdtformatlock" xmlns:w16se="http://schemas.microsoft.com/office/word/2015/wordml/symex" xmlns:w16du="http://schemas.microsoft.com/office/word/2023/wordml/word16du" xmlns:wne="http://schemas.microsoft.com/office/word/2006/wordml" mc:Ignorable="w14 w15 w16se w16cid w16 w16cex w16sdtdh w16sdtfl w16du wp14">
   <w:p/>
 </w:hdr>
 </file>
 
 <file path=word/numbering.xml><?xml version="1.0" encoding="utf-8"?>
-<w:numbering xmlns:wpc="http://schemas.microsoft.com/office/word/2010/wordprocessingCanvas" xmlns:cx="http://schemas.microsoft.com/office/drawing/2014/chartex" xmlns:cx1="http://schemas.microsoft.com/office/drawing/2015/9/8/chartex" xmlns:cx2="http://schemas.microsoft.com/office/drawing/2015/10/21/chartex" xmlns:cx3="http://schemas.microsoft.com/office/drawing/2016/5/9/chartex" xmlns:cx4="http://schemas.microsoft.com/office/drawing/2016/5/10/chartex" xmlns:cx5="http://schemas.microsoft.com/office/drawing/2016/5/11/chartex" xmlns:cx6="http://schemas.microsoft.com/office/drawing/2016/5/12/chartex" xmlns:cx7="http://schemas.microsoft.com/office/drawing/2016/5/13/chartex" xmlns:cx8="http://schemas.microsoft.com/office/drawing/2016/5/14/chartex" xmlns:mc="http://schemas.openxmlformats.org/markup-compatibility/2006" xmlns:aink="http://schemas.microsoft.com/office/drawing/2016/ink" xmlns:am3d="http://schemas.microsoft.com/office/drawing/2017/model3d" xmlns:o="urn:schemas-microsoft-com:office:office" xmlns:oel="http://schemas.microsoft.com/office/2019/extlst" xmlns:r="http://schemas.openxmlformats.org/officeDocument/2006/relationships" xmlns:m="http://schemas.openxmlformats.org/officeDocument/2006/math" xmlns:v="urn:schemas-microsoft-com:vml" xmlns:wp14="http://schemas.microsoft.com/office/word/2010/wordprocessingDrawing" xmlns:wp="http://schemas.openxmlformats.org/drawingml/2006/wordprocessingDrawing" xmlns:w10="urn:schemas-microsoft-com:office:word" xmlns:w="http://schemas.openxmlformats.org/wordprocessingml/2006/main" xmlns:w14="http://schemas.microsoft.com/office/word/2010/wordml" xmlns:w15="http://schemas.microsoft.com/office/word/2012/wordml" xmlns:w16cex="http://schemas.microsoft.com/office/word/2018/wordml/cex" xmlns:w16cid="http://schemas.microsoft.com/office/word/2016/wordml/cid" xmlns:w16="http://schemas.microsoft.com/office/word/2018/wordml" xmlns:w16du="http://schemas.microsoft.com/office/word/2023/wordml/word16du" xmlns:w16sdtdh="http://schemas.microsoft.com/office/word/2020/wordml/sdtdatahash" xmlns:w16sdtfl="http://schemas.microsoft.com/office/word/2024/wordml/sdtformatlock" xmlns:w16se="http://schemas.microsoft.com/office/word/2015/wordml/symex" xmlns:wpg="http://schemas.microsoft.com/office/word/2010/wordprocessingGroup" xmlns:wpi="http://schemas.microsoft.com/office/word/2010/wordprocessingInk" xmlns:wne="http://schemas.microsoft.com/office/word/2006/wordml" xmlns:wps="http://schemas.microsoft.com/office/word/2010/wordprocessingShape" mc:Ignorable="w14 w15 w16se w16cid w16 w16cex w16sdtdh w16sdtfl w16du wp14">
+<w:numbering xmlns:wpc="http://schemas.microsoft.com/office/word/2010/wordprocessingCanvas" xmlns:cx="http://schemas.microsoft.com/office/drawing/2014/chartex" xmlns:cx1="http://schemas.microsoft.com/office/drawing/2015/9/8/chartex" xmlns:cx2="http://schemas.microsoft.com/office/drawing/2015/10/21/chartex" xmlns:cx3="http://schemas.microsoft.com/office/drawing/2016/5/9/chartex" xmlns:cx4="http://schemas.microsoft.com/office/drawing/2016/5/10/chartex" xmlns:cx5="http://schemas.microsoft.com/office/drawing/2016/5/11/chartex" xmlns:cx6="http://schemas.microsoft.com/office/drawing/2016/5/12/chartex" xmlns:cx7="http://schemas.microsoft.com/office/drawing/2016/5/13/chartex" xmlns:cx8="http://schemas.microsoft.com/office/drawing/2016/5/14/chartex" xmlns:mc="http://schemas.openxmlformats.org/markup-compatibility/2006" xmlns:m="http://schemas.openxmlformats.org/officeDocument/2006/math" xmlns:aink="http://schemas.microsoft.com/office/drawing/2016/ink" xmlns:am3d="http://schemas.microsoft.com/office/drawing/2017/model3d" xmlns:oel="http://schemas.microsoft.com/office/2019/extlst" xmlns:r="http://schemas.openxmlformats.org/officeDocument/2006/relationships" xmlns:wp14="http://schemas.microsoft.com/office/word/2010/wordprocessingDrawing" xmlns:wp="http://schemas.openxmlformats.org/drawingml/2006/wordprocessingDrawing" xmlns:wpg="http://schemas.microsoft.com/office/word/2010/wordprocessingGroup" xmlns:wpi="http://schemas.microsoft.com/office/word/2010/wordprocessingInk" xmlns:wps="http://schemas.microsoft.com/office/word/2010/wordprocessingShape" xmlns:o="urn:schemas-microsoft-com:office:office" xmlns:v="urn:schemas-microsoft-com:vml" xmlns:w10="urn:schemas-microsoft-com:office:word" xmlns:w="http://schemas.openxmlformats.org/wordprocessingml/2006/main" xmlns:w14="http://schemas.microsoft.com/office/word/2010/wordml" xmlns:w15="http://schemas.microsoft.com/office/word/2012/wordml" xmlns:w16cex="http://schemas.microsoft.com/office/word/2018/wordml/cex" xmlns:w16cid="http://schemas.microsoft.com/office/word/2016/wordml/cid" xmlns:w16="http://schemas.microsoft.com/office/word/2018/wordml" xmlns:w16sdtdh="http://schemas.microsoft.com/office/word/2020/wordml/sdtdatahash" xmlns:w16sdtfl="http://schemas.microsoft.com/office/word/2024/wordml/sdtformatlock" xmlns:w16se="http://schemas.microsoft.com/office/word/2015/wordml/symex" xmlns:w16du="http://schemas.microsoft.com/office/word/2023/wordml/word16du" xmlns:wne="http://schemas.microsoft.com/office/word/2006/wordml" mc:Ignorable="w14 w15 w16se w16cid w16 w16cex w16sdtdh w16sdtfl w16du wp14">
   <w:numPicBullet w:numPicBulletId="0">
     <w:pict>
       <v:shapetype id="_x0000_t75" coordsize="21600,21600" o:spt="75" o:preferrelative="t" path="m@4@5l@4@11@9@11@9@5xe" filled="f" stroked="f">
@@ -3444,7 +3667,7 @@
         <v:path o:extrusionok="f" gradientshapeok="t" o:connecttype="rect"/>
         <o:lock v:ext="edit" aspectratio="t"/>
       </v:shapetype>
-      <v:shape id="_x0000_i1080" type="#_x0000_t75" style="width:320.4pt;height:249.6pt" o:bullet="t" filled="t">
+      <v:shape id="_x0000_i1025" type="#_x0000_t75" style="width:320.65pt;height:249.5pt" o:bullet="t" filled="t">
         <v:fill color2="black"/>
         <v:imagedata r:id="rId1" o:title=""/>
       </v:shape>
@@ -3619,6 +3842,92 @@
     </w:lvl>
   </w:abstractNum>
   <w:abstractNum w:abstractNumId="5" w15:restartNumberingAfterBreak="0">
+    <w:nsid w:val="067D2422"/>
+    <w:multiLevelType w:val="hybridMultilevel"/>
+    <w:tmpl w:val="B498A5CC"/>
+    <w:lvl w:ilvl="0" w:tplc="0410000F">
+      <w:start w:val="1"/>
+      <w:numFmt w:val="decimal"/>
+      <w:lvlText w:val="%1."/>
+      <w:lvlJc w:val="left"/>
+      <w:pPr>
+        <w:ind w:left="720" w:hanging="360"/>
+      </w:pPr>
+    </w:lvl>
+    <w:lvl w:ilvl="1" w:tplc="04100019" w:tentative="1">
+      <w:start w:val="1"/>
+      <w:numFmt w:val="lowerLetter"/>
+      <w:lvlText w:val="%2."/>
+      <w:lvlJc w:val="left"/>
+      <w:pPr>
+        <w:ind w:left="1440" w:hanging="360"/>
+      </w:pPr>
+    </w:lvl>
+    <w:lvl w:ilvl="2" w:tplc="0410001B" w:tentative="1">
+      <w:start w:val="1"/>
+      <w:numFmt w:val="lowerRoman"/>
+      <w:lvlText w:val="%3."/>
+      <w:lvlJc w:val="right"/>
+      <w:pPr>
+        <w:ind w:left="2160" w:hanging="180"/>
+      </w:pPr>
+    </w:lvl>
+    <w:lvl w:ilvl="3" w:tplc="0410000F" w:tentative="1">
+      <w:start w:val="1"/>
+      <w:numFmt w:val="decimal"/>
+      <w:lvlText w:val="%4."/>
+      <w:lvlJc w:val="left"/>
+      <w:pPr>
+        <w:ind w:left="2880" w:hanging="360"/>
+      </w:pPr>
+    </w:lvl>
+    <w:lvl w:ilvl="4" w:tplc="04100019" w:tentative="1">
+      <w:start w:val="1"/>
+      <w:numFmt w:val="lowerLetter"/>
+      <w:lvlText w:val="%5."/>
+      <w:lvlJc w:val="left"/>
+      <w:pPr>
+        <w:ind w:left="3600" w:hanging="360"/>
+      </w:pPr>
+    </w:lvl>
+    <w:lvl w:ilvl="5" w:tplc="0410001B" w:tentative="1">
+      <w:start w:val="1"/>
+      <w:numFmt w:val="lowerRoman"/>
+      <w:lvlText w:val="%6."/>
+      <w:lvlJc w:val="right"/>
+      <w:pPr>
+        <w:ind w:left="4320" w:hanging="180"/>
+      </w:pPr>
+    </w:lvl>
+    <w:lvl w:ilvl="6" w:tplc="0410000F" w:tentative="1">
+      <w:start w:val="1"/>
+      <w:numFmt w:val="decimal"/>
+      <w:lvlText w:val="%7."/>
+      <w:lvlJc w:val="left"/>
+      <w:pPr>
+        <w:ind w:left="5040" w:hanging="360"/>
+      </w:pPr>
+    </w:lvl>
+    <w:lvl w:ilvl="7" w:tplc="04100019" w:tentative="1">
+      <w:start w:val="1"/>
+      <w:numFmt w:val="lowerLetter"/>
+      <w:lvlText w:val="%8."/>
+      <w:lvlJc w:val="left"/>
+      <w:pPr>
+        <w:ind w:left="5760" w:hanging="360"/>
+      </w:pPr>
+    </w:lvl>
+    <w:lvl w:ilvl="8" w:tplc="0410001B" w:tentative="1">
+      <w:start w:val="1"/>
+      <w:numFmt w:val="lowerRoman"/>
+      <w:lvlText w:val="%9."/>
+      <w:lvlJc w:val="right"/>
+      <w:pPr>
+        <w:ind w:left="6480" w:hanging="180"/>
+      </w:pPr>
+    </w:lvl>
+  </w:abstractNum>
+  <w:abstractNum w:abstractNumId="6" w15:restartNumberingAfterBreak="0">
     <w:nsid w:val="133809EE"/>
     <w:multiLevelType w:val="hybridMultilevel"/>
     <w:tmpl w:val="E3B8B4C0"/>
@@ -3731,7 +4040,120 @@
       </w:rPr>
     </w:lvl>
   </w:abstractNum>
-  <w:abstractNum w:abstractNumId="6" w15:restartNumberingAfterBreak="0">
+  <w:abstractNum w:abstractNumId="7" w15:restartNumberingAfterBreak="0">
+    <w:nsid w:val="1BB53537"/>
+    <w:multiLevelType w:val="hybridMultilevel"/>
+    <w:tmpl w:val="5596C15C"/>
+    <w:lvl w:ilvl="0" w:tplc="04100001">
+      <w:start w:val="1"/>
+      <w:numFmt w:val="bullet"/>
+      <w:lvlText w:val=""/>
+      <w:lvlJc w:val="left"/>
+      <w:pPr>
+        <w:ind w:left="720" w:hanging="360"/>
+      </w:pPr>
+      <w:rPr>
+        <w:rFonts w:ascii="Symbol" w:hAnsi="Symbol" w:hint="default"/>
+      </w:rPr>
+    </w:lvl>
+    <w:lvl w:ilvl="1" w:tplc="04100003" w:tentative="1">
+      <w:start w:val="1"/>
+      <w:numFmt w:val="bullet"/>
+      <w:lvlText w:val="o"/>
+      <w:lvlJc w:val="left"/>
+      <w:pPr>
+        <w:ind w:left="1440" w:hanging="360"/>
+      </w:pPr>
+      <w:rPr>
+        <w:rFonts w:ascii="Courier New" w:hAnsi="Courier New" w:cs="Courier New" w:hint="default"/>
+      </w:rPr>
+    </w:lvl>
+    <w:lvl w:ilvl="2" w:tplc="04100005" w:tentative="1">
+      <w:start w:val="1"/>
+      <w:numFmt w:val="bullet"/>
+      <w:lvlText w:val=""/>
+      <w:lvlJc w:val="left"/>
+      <w:pPr>
+        <w:ind w:left="2160" w:hanging="360"/>
+      </w:pPr>
+      <w:rPr>
+        <w:rFonts w:ascii="Wingdings" w:hAnsi="Wingdings" w:hint="default"/>
+      </w:rPr>
+    </w:lvl>
+    <w:lvl w:ilvl="3" w:tplc="04100001" w:tentative="1">
+      <w:start w:val="1"/>
+      <w:numFmt w:val="bullet"/>
+      <w:lvlText w:val=""/>
+      <w:lvlJc w:val="left"/>
+      <w:pPr>
+        <w:ind w:left="2880" w:hanging="360"/>
+      </w:pPr>
+      <w:rPr>
+        <w:rFonts w:ascii="Symbol" w:hAnsi="Symbol" w:hint="default"/>
+      </w:rPr>
+    </w:lvl>
+    <w:lvl w:ilvl="4" w:tplc="04100003" w:tentative="1">
+      <w:start w:val="1"/>
+      <w:numFmt w:val="bullet"/>
+      <w:lvlText w:val="o"/>
+      <w:lvlJc w:val="left"/>
+      <w:pPr>
+        <w:ind w:left="3600" w:hanging="360"/>
+      </w:pPr>
+      <w:rPr>
+        <w:rFonts w:ascii="Courier New" w:hAnsi="Courier New" w:cs="Courier New" w:hint="default"/>
+      </w:rPr>
+    </w:lvl>
+    <w:lvl w:ilvl="5" w:tplc="04100005" w:tentative="1">
+      <w:start w:val="1"/>
+      <w:numFmt w:val="bullet"/>
+      <w:lvlText w:val=""/>
+      <w:lvlJc w:val="left"/>
+      <w:pPr>
+        <w:ind w:left="4320" w:hanging="360"/>
+      </w:pPr>
+      <w:rPr>
+        <w:rFonts w:ascii="Wingdings" w:hAnsi="Wingdings" w:hint="default"/>
+      </w:rPr>
+    </w:lvl>
+    <w:lvl w:ilvl="6" w:tplc="04100001" w:tentative="1">
+      <w:start w:val="1"/>
+      <w:numFmt w:val="bullet"/>
+      <w:lvlText w:val=""/>
+      <w:lvlJc w:val="left"/>
+      <w:pPr>
+        <w:ind w:left="5040" w:hanging="360"/>
+      </w:pPr>
+      <w:rPr>
+        <w:rFonts w:ascii="Symbol" w:hAnsi="Symbol" w:hint="default"/>
+      </w:rPr>
+    </w:lvl>
+    <w:lvl w:ilvl="7" w:tplc="04100003" w:tentative="1">
+      <w:start w:val="1"/>
+      <w:numFmt w:val="bullet"/>
+      <w:lvlText w:val="o"/>
+      <w:lvlJc w:val="left"/>
+      <w:pPr>
+        <w:ind w:left="5760" w:hanging="360"/>
+      </w:pPr>
+      <w:rPr>
+        <w:rFonts w:ascii="Courier New" w:hAnsi="Courier New" w:cs="Courier New" w:hint="default"/>
+      </w:rPr>
+    </w:lvl>
+    <w:lvl w:ilvl="8" w:tplc="04100005" w:tentative="1">
+      <w:start w:val="1"/>
+      <w:numFmt w:val="bullet"/>
+      <w:lvlText w:val=""/>
+      <w:lvlJc w:val="left"/>
+      <w:pPr>
+        <w:ind w:left="6480" w:hanging="360"/>
+      </w:pPr>
+      <w:rPr>
+        <w:rFonts w:ascii="Wingdings" w:hAnsi="Wingdings" w:hint="default"/>
+      </w:rPr>
+    </w:lvl>
+  </w:abstractNum>
+  <w:abstractNum w:abstractNumId="8" w15:restartNumberingAfterBreak="0">
     <w:nsid w:val="1F8433D7"/>
     <w:multiLevelType w:val="multilevel"/>
     <w:tmpl w:val="0C2E7BA8"/>
@@ -3819,7 +4241,7 @@
       </w:pPr>
     </w:lvl>
   </w:abstractNum>
-  <w:abstractNum w:abstractNumId="7" w15:restartNumberingAfterBreak="0">
+  <w:abstractNum w:abstractNumId="9" w15:restartNumberingAfterBreak="0">
     <w:nsid w:val="237F6CD5"/>
     <w:multiLevelType w:val="hybridMultilevel"/>
     <w:tmpl w:val="FBE6734A"/>
@@ -3932,7 +4354,120 @@
       </w:rPr>
     </w:lvl>
   </w:abstractNum>
-  <w:abstractNum w:abstractNumId="8" w15:restartNumberingAfterBreak="0">
+  <w:abstractNum w:abstractNumId="10" w15:restartNumberingAfterBreak="0">
+    <w:nsid w:val="25D50884"/>
+    <w:multiLevelType w:val="hybridMultilevel"/>
+    <w:tmpl w:val="B022966A"/>
+    <w:lvl w:ilvl="0" w:tplc="04100001">
+      <w:start w:val="1"/>
+      <w:numFmt w:val="bullet"/>
+      <w:lvlText w:val=""/>
+      <w:lvlJc w:val="left"/>
+      <w:pPr>
+        <w:ind w:left="720" w:hanging="360"/>
+      </w:pPr>
+      <w:rPr>
+        <w:rFonts w:ascii="Symbol" w:hAnsi="Symbol" w:hint="default"/>
+      </w:rPr>
+    </w:lvl>
+    <w:lvl w:ilvl="1" w:tplc="04100003" w:tentative="1">
+      <w:start w:val="1"/>
+      <w:numFmt w:val="bullet"/>
+      <w:lvlText w:val="o"/>
+      <w:lvlJc w:val="left"/>
+      <w:pPr>
+        <w:ind w:left="1440" w:hanging="360"/>
+      </w:pPr>
+      <w:rPr>
+        <w:rFonts w:ascii="Courier New" w:hAnsi="Courier New" w:cs="Courier New" w:hint="default"/>
+      </w:rPr>
+    </w:lvl>
+    <w:lvl w:ilvl="2" w:tplc="04100005" w:tentative="1">
+      <w:start w:val="1"/>
+      <w:numFmt w:val="bullet"/>
+      <w:lvlText w:val=""/>
+      <w:lvlJc w:val="left"/>
+      <w:pPr>
+        <w:ind w:left="2160" w:hanging="360"/>
+      </w:pPr>
+      <w:rPr>
+        <w:rFonts w:ascii="Wingdings" w:hAnsi="Wingdings" w:hint="default"/>
+      </w:rPr>
+    </w:lvl>
+    <w:lvl w:ilvl="3" w:tplc="04100001" w:tentative="1">
+      <w:start w:val="1"/>
+      <w:numFmt w:val="bullet"/>
+      <w:lvlText w:val=""/>
+      <w:lvlJc w:val="left"/>
+      <w:pPr>
+        <w:ind w:left="2880" w:hanging="360"/>
+      </w:pPr>
+      <w:rPr>
+        <w:rFonts w:ascii="Symbol" w:hAnsi="Symbol" w:hint="default"/>
+      </w:rPr>
+    </w:lvl>
+    <w:lvl w:ilvl="4" w:tplc="04100003" w:tentative="1">
+      <w:start w:val="1"/>
+      <w:numFmt w:val="bullet"/>
+      <w:lvlText w:val="o"/>
+      <w:lvlJc w:val="left"/>
+      <w:pPr>
+        <w:ind w:left="3600" w:hanging="360"/>
+      </w:pPr>
+      <w:rPr>
+        <w:rFonts w:ascii="Courier New" w:hAnsi="Courier New" w:cs="Courier New" w:hint="default"/>
+      </w:rPr>
+    </w:lvl>
+    <w:lvl w:ilvl="5" w:tplc="04100005" w:tentative="1">
+      <w:start w:val="1"/>
+      <w:numFmt w:val="bullet"/>
+      <w:lvlText w:val=""/>
+      <w:lvlJc w:val="left"/>
+      <w:pPr>
+        <w:ind w:left="4320" w:hanging="360"/>
+      </w:pPr>
+      <w:rPr>
+        <w:rFonts w:ascii="Wingdings" w:hAnsi="Wingdings" w:hint="default"/>
+      </w:rPr>
+    </w:lvl>
+    <w:lvl w:ilvl="6" w:tplc="04100001" w:tentative="1">
+      <w:start w:val="1"/>
+      <w:numFmt w:val="bullet"/>
+      <w:lvlText w:val=""/>
+      <w:lvlJc w:val="left"/>
+      <w:pPr>
+        <w:ind w:left="5040" w:hanging="360"/>
+      </w:pPr>
+      <w:rPr>
+        <w:rFonts w:ascii="Symbol" w:hAnsi="Symbol" w:hint="default"/>
+      </w:rPr>
+    </w:lvl>
+    <w:lvl w:ilvl="7" w:tplc="04100003" w:tentative="1">
+      <w:start w:val="1"/>
+      <w:numFmt w:val="bullet"/>
+      <w:lvlText w:val="o"/>
+      <w:lvlJc w:val="left"/>
+      <w:pPr>
+        <w:ind w:left="5760" w:hanging="360"/>
+      </w:pPr>
+      <w:rPr>
+        <w:rFonts w:ascii="Courier New" w:hAnsi="Courier New" w:cs="Courier New" w:hint="default"/>
+      </w:rPr>
+    </w:lvl>
+    <w:lvl w:ilvl="8" w:tplc="04100005" w:tentative="1">
+      <w:start w:val="1"/>
+      <w:numFmt w:val="bullet"/>
+      <w:lvlText w:val=""/>
+      <w:lvlJc w:val="left"/>
+      <w:pPr>
+        <w:ind w:left="6480" w:hanging="360"/>
+      </w:pPr>
+      <w:rPr>
+        <w:rFonts w:ascii="Wingdings" w:hAnsi="Wingdings" w:hint="default"/>
+      </w:rPr>
+    </w:lvl>
+  </w:abstractNum>
+  <w:abstractNum w:abstractNumId="11" w15:restartNumberingAfterBreak="0">
     <w:nsid w:val="3A6A4225"/>
     <w:multiLevelType w:val="hybridMultilevel"/>
     <w:tmpl w:val="A57E53A0"/>
@@ -4045,7 +4580,7 @@
       </w:rPr>
     </w:lvl>
   </w:abstractNum>
-  <w:abstractNum w:abstractNumId="9" w15:restartNumberingAfterBreak="0">
+  <w:abstractNum w:abstractNumId="12" w15:restartNumberingAfterBreak="0">
     <w:nsid w:val="3AA20608"/>
     <w:multiLevelType w:val="hybridMultilevel"/>
     <w:tmpl w:val="0B589B44"/>
@@ -4158,7 +4693,120 @@
       </w:rPr>
     </w:lvl>
   </w:abstractNum>
-  <w:abstractNum w:abstractNumId="10" w15:restartNumberingAfterBreak="0">
+  <w:abstractNum w:abstractNumId="13" w15:restartNumberingAfterBreak="0">
+    <w:nsid w:val="3B934199"/>
+    <w:multiLevelType w:val="hybridMultilevel"/>
+    <w:tmpl w:val="A2503E10"/>
+    <w:lvl w:ilvl="0" w:tplc="04100001">
+      <w:start w:val="1"/>
+      <w:numFmt w:val="bullet"/>
+      <w:lvlText w:val=""/>
+      <w:lvlJc w:val="left"/>
+      <w:pPr>
+        <w:ind w:left="720" w:hanging="360"/>
+      </w:pPr>
+      <w:rPr>
+        <w:rFonts w:ascii="Symbol" w:hAnsi="Symbol" w:hint="default"/>
+      </w:rPr>
+    </w:lvl>
+    <w:lvl w:ilvl="1" w:tplc="04100003" w:tentative="1">
+      <w:start w:val="1"/>
+      <w:numFmt w:val="bullet"/>
+      <w:lvlText w:val="o"/>
+      <w:lvlJc w:val="left"/>
+      <w:pPr>
+        <w:ind w:left="1440" w:hanging="360"/>
+      </w:pPr>
+      <w:rPr>
+        <w:rFonts w:ascii="Courier New" w:hAnsi="Courier New" w:cs="Courier New" w:hint="default"/>
+      </w:rPr>
+    </w:lvl>
+    <w:lvl w:ilvl="2" w:tplc="04100005" w:tentative="1">
+      <w:start w:val="1"/>
+      <w:numFmt w:val="bullet"/>
+      <w:lvlText w:val=""/>
+      <w:lvlJc w:val="left"/>
+      <w:pPr>
+        <w:ind w:left="2160" w:hanging="360"/>
+      </w:pPr>
+      <w:rPr>
+        <w:rFonts w:ascii="Wingdings" w:hAnsi="Wingdings" w:hint="default"/>
+      </w:rPr>
+    </w:lvl>
+    <w:lvl w:ilvl="3" w:tplc="04100001" w:tentative="1">
+      <w:start w:val="1"/>
+      <w:numFmt w:val="bullet"/>
+      <w:lvlText w:val=""/>
+      <w:lvlJc w:val="left"/>
+      <w:pPr>
+        <w:ind w:left="2880" w:hanging="360"/>
+      </w:pPr>
+      <w:rPr>
+        <w:rFonts w:ascii="Symbol" w:hAnsi="Symbol" w:hint="default"/>
+      </w:rPr>
+    </w:lvl>
+    <w:lvl w:ilvl="4" w:tplc="04100003" w:tentative="1">
+      <w:start w:val="1"/>
+      <w:numFmt w:val="bullet"/>
+      <w:lvlText w:val="o"/>
+      <w:lvlJc w:val="left"/>
+      <w:pPr>
+        <w:ind w:left="3600" w:hanging="360"/>
+      </w:pPr>
+      <w:rPr>
+        <w:rFonts w:ascii="Courier New" w:hAnsi="Courier New" w:cs="Courier New" w:hint="default"/>
+      </w:rPr>
+    </w:lvl>
+    <w:lvl w:ilvl="5" w:tplc="04100005" w:tentative="1">
+      <w:start w:val="1"/>
+      <w:numFmt w:val="bullet"/>
+      <w:lvlText w:val=""/>
+      <w:lvlJc w:val="left"/>
+      <w:pPr>
+        <w:ind w:left="4320" w:hanging="360"/>
+      </w:pPr>
+      <w:rPr>
+        <w:rFonts w:ascii="Wingdings" w:hAnsi="Wingdings" w:hint="default"/>
+      </w:rPr>
+    </w:lvl>
+    <w:lvl w:ilvl="6" w:tplc="04100001" w:tentative="1">
+      <w:start w:val="1"/>
+      <w:numFmt w:val="bullet"/>
+      <w:lvlText w:val=""/>
+      <w:lvlJc w:val="left"/>
+      <w:pPr>
+        <w:ind w:left="5040" w:hanging="360"/>
+      </w:pPr>
+      <w:rPr>
+        <w:rFonts w:ascii="Symbol" w:hAnsi="Symbol" w:hint="default"/>
+      </w:rPr>
+    </w:lvl>
+    <w:lvl w:ilvl="7" w:tplc="04100003" w:tentative="1">
+      <w:start w:val="1"/>
+      <w:numFmt w:val="bullet"/>
+      <w:lvlText w:val="o"/>
+      <w:lvlJc w:val="left"/>
+      <w:pPr>
+        <w:ind w:left="5760" w:hanging="360"/>
+      </w:pPr>
+      <w:rPr>
+        <w:rFonts w:ascii="Courier New" w:hAnsi="Courier New" w:cs="Courier New" w:hint="default"/>
+      </w:rPr>
+    </w:lvl>
+    <w:lvl w:ilvl="8" w:tplc="04100005" w:tentative="1">
+      <w:start w:val="1"/>
+      <w:numFmt w:val="bullet"/>
+      <w:lvlText w:val=""/>
+      <w:lvlJc w:val="left"/>
+      <w:pPr>
+        <w:ind w:left="6480" w:hanging="360"/>
+      </w:pPr>
+      <w:rPr>
+        <w:rFonts w:ascii="Wingdings" w:hAnsi="Wingdings" w:hint="default"/>
+      </w:rPr>
+    </w:lvl>
+  </w:abstractNum>
+  <w:abstractNum w:abstractNumId="14" w15:restartNumberingAfterBreak="0">
     <w:nsid w:val="42F31A3D"/>
     <w:multiLevelType w:val="multilevel"/>
     <w:tmpl w:val="C8F4DA3C"/>
@@ -4279,7 +4927,7 @@
       </w:rPr>
     </w:lvl>
   </w:abstractNum>
-  <w:abstractNum w:abstractNumId="11" w15:restartNumberingAfterBreak="0">
+  <w:abstractNum w:abstractNumId="15" w15:restartNumberingAfterBreak="0">
     <w:nsid w:val="4E351B2A"/>
     <w:multiLevelType w:val="hybridMultilevel"/>
     <w:tmpl w:val="E5E62C26"/>
@@ -4368,7 +5016,7 @@
       </w:pPr>
     </w:lvl>
   </w:abstractNum>
-  <w:abstractNum w:abstractNumId="12" w15:restartNumberingAfterBreak="0">
+  <w:abstractNum w:abstractNumId="16" w15:restartNumberingAfterBreak="0">
     <w:nsid w:val="4F954ED4"/>
     <w:multiLevelType w:val="hybridMultilevel"/>
     <w:tmpl w:val="DE9A52BA"/>
@@ -4481,7 +5129,7 @@
       </w:rPr>
     </w:lvl>
   </w:abstractNum>
-  <w:abstractNum w:abstractNumId="13" w15:restartNumberingAfterBreak="0">
+  <w:abstractNum w:abstractNumId="17" w15:restartNumberingAfterBreak="0">
     <w:nsid w:val="63D3517E"/>
     <w:multiLevelType w:val="hybridMultilevel"/>
     <w:tmpl w:val="50C29578"/>
@@ -4594,7 +5242,7 @@
       </w:rPr>
     </w:lvl>
   </w:abstractNum>
-  <w:abstractNum w:abstractNumId="14" w15:restartNumberingAfterBreak="0">
+  <w:abstractNum w:abstractNumId="18" w15:restartNumberingAfterBreak="0">
     <w:nsid w:val="687E0260"/>
     <w:multiLevelType w:val="multilevel"/>
     <w:tmpl w:val="00000001"/>
@@ -4704,6 +5352,178 @@
           <w:tab w:val="num" w:pos="1584"/>
         </w:tabs>
         <w:ind w:left="1584" w:hanging="1584"/>
+      </w:pPr>
+    </w:lvl>
+  </w:abstractNum>
+  <w:abstractNum w:abstractNumId="19" w15:restartNumberingAfterBreak="0">
+    <w:nsid w:val="74E12702"/>
+    <w:multiLevelType w:val="hybridMultilevel"/>
+    <w:tmpl w:val="60F880AA"/>
+    <w:lvl w:ilvl="0" w:tplc="0410000F">
+      <w:start w:val="1"/>
+      <w:numFmt w:val="decimal"/>
+      <w:lvlText w:val="%1."/>
+      <w:lvlJc w:val="left"/>
+      <w:pPr>
+        <w:ind w:left="720" w:hanging="360"/>
+      </w:pPr>
+    </w:lvl>
+    <w:lvl w:ilvl="1" w:tplc="04100019" w:tentative="1">
+      <w:start w:val="1"/>
+      <w:numFmt w:val="lowerLetter"/>
+      <w:lvlText w:val="%2."/>
+      <w:lvlJc w:val="left"/>
+      <w:pPr>
+        <w:ind w:left="1440" w:hanging="360"/>
+      </w:pPr>
+    </w:lvl>
+    <w:lvl w:ilvl="2" w:tplc="0410001B" w:tentative="1">
+      <w:start w:val="1"/>
+      <w:numFmt w:val="lowerRoman"/>
+      <w:lvlText w:val="%3."/>
+      <w:lvlJc w:val="right"/>
+      <w:pPr>
+        <w:ind w:left="2160" w:hanging="180"/>
+      </w:pPr>
+    </w:lvl>
+    <w:lvl w:ilvl="3" w:tplc="0410000F" w:tentative="1">
+      <w:start w:val="1"/>
+      <w:numFmt w:val="decimal"/>
+      <w:lvlText w:val="%4."/>
+      <w:lvlJc w:val="left"/>
+      <w:pPr>
+        <w:ind w:left="2880" w:hanging="360"/>
+      </w:pPr>
+    </w:lvl>
+    <w:lvl w:ilvl="4" w:tplc="04100019" w:tentative="1">
+      <w:start w:val="1"/>
+      <w:numFmt w:val="lowerLetter"/>
+      <w:lvlText w:val="%5."/>
+      <w:lvlJc w:val="left"/>
+      <w:pPr>
+        <w:ind w:left="3600" w:hanging="360"/>
+      </w:pPr>
+    </w:lvl>
+    <w:lvl w:ilvl="5" w:tplc="0410001B" w:tentative="1">
+      <w:start w:val="1"/>
+      <w:numFmt w:val="lowerRoman"/>
+      <w:lvlText w:val="%6."/>
+      <w:lvlJc w:val="right"/>
+      <w:pPr>
+        <w:ind w:left="4320" w:hanging="180"/>
+      </w:pPr>
+    </w:lvl>
+    <w:lvl w:ilvl="6" w:tplc="0410000F" w:tentative="1">
+      <w:start w:val="1"/>
+      <w:numFmt w:val="decimal"/>
+      <w:lvlText w:val="%7."/>
+      <w:lvlJc w:val="left"/>
+      <w:pPr>
+        <w:ind w:left="5040" w:hanging="360"/>
+      </w:pPr>
+    </w:lvl>
+    <w:lvl w:ilvl="7" w:tplc="04100019" w:tentative="1">
+      <w:start w:val="1"/>
+      <w:numFmt w:val="lowerLetter"/>
+      <w:lvlText w:val="%8."/>
+      <w:lvlJc w:val="left"/>
+      <w:pPr>
+        <w:ind w:left="5760" w:hanging="360"/>
+      </w:pPr>
+    </w:lvl>
+    <w:lvl w:ilvl="8" w:tplc="0410001B" w:tentative="1">
+      <w:start w:val="1"/>
+      <w:numFmt w:val="lowerRoman"/>
+      <w:lvlText w:val="%9."/>
+      <w:lvlJc w:val="right"/>
+      <w:pPr>
+        <w:ind w:left="6480" w:hanging="180"/>
+      </w:pPr>
+    </w:lvl>
+  </w:abstractNum>
+  <w:abstractNum w:abstractNumId="20" w15:restartNumberingAfterBreak="0">
+    <w:nsid w:val="7CCE2BA3"/>
+    <w:multiLevelType w:val="hybridMultilevel"/>
+    <w:tmpl w:val="A20AD9D2"/>
+    <w:lvl w:ilvl="0" w:tplc="0410000F">
+      <w:start w:val="1"/>
+      <w:numFmt w:val="decimal"/>
+      <w:lvlText w:val="%1."/>
+      <w:lvlJc w:val="left"/>
+      <w:pPr>
+        <w:ind w:left="720" w:hanging="360"/>
+      </w:pPr>
+    </w:lvl>
+    <w:lvl w:ilvl="1" w:tplc="04100019" w:tentative="1">
+      <w:start w:val="1"/>
+      <w:numFmt w:val="lowerLetter"/>
+      <w:lvlText w:val="%2."/>
+      <w:lvlJc w:val="left"/>
+      <w:pPr>
+        <w:ind w:left="1440" w:hanging="360"/>
+      </w:pPr>
+    </w:lvl>
+    <w:lvl w:ilvl="2" w:tplc="0410001B" w:tentative="1">
+      <w:start w:val="1"/>
+      <w:numFmt w:val="lowerRoman"/>
+      <w:lvlText w:val="%3."/>
+      <w:lvlJc w:val="right"/>
+      <w:pPr>
+        <w:ind w:left="2160" w:hanging="180"/>
+      </w:pPr>
+    </w:lvl>
+    <w:lvl w:ilvl="3" w:tplc="0410000F" w:tentative="1">
+      <w:start w:val="1"/>
+      <w:numFmt w:val="decimal"/>
+      <w:lvlText w:val="%4."/>
+      <w:lvlJc w:val="left"/>
+      <w:pPr>
+        <w:ind w:left="2880" w:hanging="360"/>
+      </w:pPr>
+    </w:lvl>
+    <w:lvl w:ilvl="4" w:tplc="04100019" w:tentative="1">
+      <w:start w:val="1"/>
+      <w:numFmt w:val="lowerLetter"/>
+      <w:lvlText w:val="%5."/>
+      <w:lvlJc w:val="left"/>
+      <w:pPr>
+        <w:ind w:left="3600" w:hanging="360"/>
+      </w:pPr>
+    </w:lvl>
+    <w:lvl w:ilvl="5" w:tplc="0410001B" w:tentative="1">
+      <w:start w:val="1"/>
+      <w:numFmt w:val="lowerRoman"/>
+      <w:lvlText w:val="%6."/>
+      <w:lvlJc w:val="right"/>
+      <w:pPr>
+        <w:ind w:left="4320" w:hanging="180"/>
+      </w:pPr>
+    </w:lvl>
+    <w:lvl w:ilvl="6" w:tplc="0410000F" w:tentative="1">
+      <w:start w:val="1"/>
+      <w:numFmt w:val="decimal"/>
+      <w:lvlText w:val="%7."/>
+      <w:lvlJc w:val="left"/>
+      <w:pPr>
+        <w:ind w:left="5040" w:hanging="360"/>
+      </w:pPr>
+    </w:lvl>
+    <w:lvl w:ilvl="7" w:tplc="04100019" w:tentative="1">
+      <w:start w:val="1"/>
+      <w:numFmt w:val="lowerLetter"/>
+      <w:lvlText w:val="%8."/>
+      <w:lvlJc w:val="left"/>
+      <w:pPr>
+        <w:ind w:left="5760" w:hanging="360"/>
+      </w:pPr>
+    </w:lvl>
+    <w:lvl w:ilvl="8" w:tplc="0410001B" w:tentative="1">
+      <w:start w:val="1"/>
+      <w:numFmt w:val="lowerRoman"/>
+      <w:lvlText w:val="%9."/>
+      <w:lvlJc w:val="right"/>
+      <w:pPr>
+        <w:ind w:left="6480" w:hanging="180"/>
       </w:pPr>
     </w:lvl>
   </w:abstractNum>
@@ -4723,43 +5543,61 @@
     <w:abstractNumId w:val="4"/>
   </w:num>
   <w:num w:numId="6" w16cid:durableId="1681200572">
+    <w:abstractNumId w:val="14"/>
+  </w:num>
+  <w:num w:numId="7" w16cid:durableId="2071003935">
+    <w:abstractNumId w:val="18"/>
+  </w:num>
+  <w:num w:numId="8" w16cid:durableId="1540438857">
+    <w:abstractNumId w:val="8"/>
+  </w:num>
+  <w:num w:numId="9" w16cid:durableId="354161101">
+    <w:abstractNumId w:val="8"/>
+  </w:num>
+  <w:num w:numId="10" w16cid:durableId="636185670">
+    <w:abstractNumId w:val="11"/>
+  </w:num>
+  <w:num w:numId="11" w16cid:durableId="2026519637">
+    <w:abstractNumId w:val="9"/>
+  </w:num>
+  <w:num w:numId="12" w16cid:durableId="1443572107">
+    <w:abstractNumId w:val="6"/>
+  </w:num>
+  <w:num w:numId="13" w16cid:durableId="1680347482">
+    <w:abstractNumId w:val="15"/>
+  </w:num>
+  <w:num w:numId="14" w16cid:durableId="1266769575">
+    <w:abstractNumId w:val="12"/>
+  </w:num>
+  <w:num w:numId="15" w16cid:durableId="16659908">
+    <w:abstractNumId w:val="17"/>
+  </w:num>
+  <w:num w:numId="16" w16cid:durableId="1862696292">
+    <w:abstractNumId w:val="16"/>
+  </w:num>
+  <w:num w:numId="17" w16cid:durableId="646474099">
+    <w:abstractNumId w:val="7"/>
+  </w:num>
+  <w:num w:numId="18" w16cid:durableId="1793285127">
+    <w:abstractNumId w:val="13"/>
+  </w:num>
+  <w:num w:numId="19" w16cid:durableId="202911112">
+    <w:abstractNumId w:val="20"/>
+  </w:num>
+  <w:num w:numId="20" w16cid:durableId="4943408">
+    <w:abstractNumId w:val="5"/>
+  </w:num>
+  <w:num w:numId="21" w16cid:durableId="709576782">
     <w:abstractNumId w:val="10"/>
   </w:num>
-  <w:num w:numId="7" w16cid:durableId="2071003935">
-    <w:abstractNumId w:val="14"/>
-  </w:num>
-  <w:num w:numId="8" w16cid:durableId="1540438857">
-    <w:abstractNumId w:val="6"/>
-  </w:num>
-  <w:num w:numId="9" w16cid:durableId="354161101">
-    <w:abstractNumId w:val="6"/>
-  </w:num>
-  <w:num w:numId="10" w16cid:durableId="636185670">
-    <w:abstractNumId w:val="8"/>
-  </w:num>
-  <w:num w:numId="11" w16cid:durableId="2026519637">
-    <w:abstractNumId w:val="7"/>
-  </w:num>
-  <w:num w:numId="12" w16cid:durableId="1443572107">
-    <w:abstractNumId w:val="5"/>
-  </w:num>
-  <w:num w:numId="13" w16cid:durableId="1680347482">
-    <w:abstractNumId w:val="11"/>
-  </w:num>
-  <w:num w:numId="14" w16cid:durableId="1266769575">
-    <w:abstractNumId w:val="9"/>
-  </w:num>
-  <w:num w:numId="15" w16cid:durableId="16659908">
-    <w:abstractNumId w:val="13"/>
-  </w:num>
-  <w:num w:numId="16" w16cid:durableId="1862696292">
-    <w:abstractNumId w:val="12"/>
+  <w:num w:numId="22" w16cid:durableId="510147163">
+    <w:abstractNumId w:val="19"/>
   </w:num>
 </w:numbering>
 </file>
 
 <file path=word/styles.xml><?xml version="1.0" encoding="utf-8"?>
-<w:styles xmlns:mc="http://schemas.openxmlformats.org/markup-compatibility/2006" xmlns:r="http://schemas.openxmlformats.org/officeDocument/2006/relationships" xmlns:w="http://schemas.openxmlformats.org/wordprocessingml/2006/main" xmlns:w14="http://schemas.microsoft.com/office/word/2010/wordml" xmlns:w15="http://schemas.microsoft.com/office/word/2012/wordml" xmlns:w16cex="http://schemas.microsoft.com/office/word/2018/wordml/cex" xmlns:w16cid="http://schemas.microsoft.com/office/word/2016/wordml/cid" xmlns:w16="http://schemas.microsoft.com/office/word/2018/wordml" xmlns:w16du="http://schemas.microsoft.com/office/word/2023/wordml/word16du" xmlns:w16sdtdh="http://schemas.microsoft.com/office/word/2020/wordml/sdtdatahash" xmlns:w16sdtfl="http://schemas.microsoft.com/office/word/2024/wordml/sdtformatlock" xmlns:w16se="http://schemas.microsoft.com/office/word/2015/wordml/symex" mc:Ignorable="w14 w15 w16se w16cid w16 w16cex w16sdtdh w16sdtfl w16du">
+<w:styles xmlns:mc="http://schemas.openxmlformats.org/markup-compatibility/2006" xmlns:r="http://schemas.openxmlformats.org/officeDocument/2006/relationships" xmlns:w="http://schemas.openxmlformats.org/wordprocessingml/2006/main" xmlns:w14="http://schemas.microsoft.com/office/word/2010/wordml" xmlns:w15="http://schemas.microsoft.com/office/word/2012/wordml" xmlns:w16cex="http://schemas.microsoft.com/office/word/2018/wordml/cex" xmlns:w16cid="http://schemas.microsoft.com/office/word/2016/wordml/cid" xmlns:w16="http://schemas.microsoft.com/office/word/2018/wordml" xmlns:w16sdtdh="http://schemas.microsoft.com/office/word/2020/wordml/sdtdatahash" xmlns:w16sdtfl="http://schemas.microsoft.com/office/word/2024/wordml/sdtformatlock" xmlns:w16se="http://schemas.microsoft.com/office/word/2015/wordml/symex" xmlns:w16du="http://schemas.microsoft.com/office/word/2023/wordml/word16du" mc:Ignorable="w14 w15 w16se w16cid w16 w16cex w16sdtdh w16sdtfl w16du">
   <w:docDefaults>
     <w:rPrDefault>
       <w:rPr>

</xml_diff>

<commit_message>
Raffinamento degli scenari analizzati, aggiunta di ulteriori requisiti non funzionali e dei deliverables da creare con rispettive deadlines
</commit_message>
<xml_diff>
--- a/Deliverables/ProblemStatement_GGEyewear.docx
+++ b/Deliverables/ProblemStatement_GGEyewear.docx
@@ -1,6 +1,6 @@
 
 <file path=word/document.xml><?xml version="1.0" encoding="utf-8"?>
-<w:document xmlns:wpc="http://schemas.microsoft.com/office/word/2010/wordprocessingCanvas" xmlns:cx="http://schemas.microsoft.com/office/drawing/2014/chartex" xmlns:cx1="http://schemas.microsoft.com/office/drawing/2015/9/8/chartex" xmlns:cx2="http://schemas.microsoft.com/office/drawing/2015/10/21/chartex" xmlns:cx3="http://schemas.microsoft.com/office/drawing/2016/5/9/chartex" xmlns:cx4="http://schemas.microsoft.com/office/drawing/2016/5/10/chartex" xmlns:cx5="http://schemas.microsoft.com/office/drawing/2016/5/11/chartex" xmlns:cx6="http://schemas.microsoft.com/office/drawing/2016/5/12/chartex" xmlns:cx7="http://schemas.microsoft.com/office/drawing/2016/5/13/chartex" xmlns:cx8="http://schemas.microsoft.com/office/drawing/2016/5/14/chartex" xmlns:mc="http://schemas.openxmlformats.org/markup-compatibility/2006" xmlns:m="http://schemas.openxmlformats.org/officeDocument/2006/math" xmlns:aink="http://schemas.microsoft.com/office/drawing/2016/ink" xmlns:am3d="http://schemas.microsoft.com/office/drawing/2017/model3d" xmlns:oel="http://schemas.microsoft.com/office/2019/extlst" xmlns:r="http://schemas.openxmlformats.org/officeDocument/2006/relationships" xmlns:wp14="http://schemas.microsoft.com/office/word/2010/wordprocessingDrawing" xmlns:wp="http://schemas.openxmlformats.org/drawingml/2006/wordprocessingDrawing" xmlns:wpg="http://schemas.microsoft.com/office/word/2010/wordprocessingGroup" xmlns:wpi="http://schemas.microsoft.com/office/word/2010/wordprocessingInk" xmlns:wps="http://schemas.microsoft.com/office/word/2010/wordprocessingShape" xmlns:o="urn:schemas-microsoft-com:office:office" xmlns:v="urn:schemas-microsoft-com:vml" xmlns:w10="urn:schemas-microsoft-com:office:word" xmlns:w="http://schemas.openxmlformats.org/wordprocessingml/2006/main" xmlns:w14="http://schemas.microsoft.com/office/word/2010/wordml" xmlns:w15="http://schemas.microsoft.com/office/word/2012/wordml" xmlns:w16cex="http://schemas.microsoft.com/office/word/2018/wordml/cex" xmlns:w16cid="http://schemas.microsoft.com/office/word/2016/wordml/cid" xmlns:w16="http://schemas.microsoft.com/office/word/2018/wordml" xmlns:w16sdtdh="http://schemas.microsoft.com/office/word/2020/wordml/sdtdatahash" xmlns:w16sdtfl="http://schemas.microsoft.com/office/word/2024/wordml/sdtformatlock" xmlns:w16se="http://schemas.microsoft.com/office/word/2015/wordml/symex" xmlns:w16du="http://schemas.microsoft.com/office/word/2023/wordml/word16du" xmlns:wne="http://schemas.microsoft.com/office/word/2006/wordml" mc:Ignorable="w14 w15 w16se w16cid w16 w16cex w16sdtdh w16sdtfl w16du wp14">
+<w:document xmlns:wpc="http://schemas.microsoft.com/office/word/2010/wordprocessingCanvas" xmlns:cx="http://schemas.microsoft.com/office/drawing/2014/chartex" xmlns:cx1="http://schemas.microsoft.com/office/drawing/2015/9/8/chartex" xmlns:cx2="http://schemas.microsoft.com/office/drawing/2015/10/21/chartex" xmlns:cx3="http://schemas.microsoft.com/office/drawing/2016/5/9/chartex" xmlns:cx4="http://schemas.microsoft.com/office/drawing/2016/5/10/chartex" xmlns:cx5="http://schemas.microsoft.com/office/drawing/2016/5/11/chartex" xmlns:cx6="http://schemas.microsoft.com/office/drawing/2016/5/12/chartex" xmlns:cx7="http://schemas.microsoft.com/office/drawing/2016/5/13/chartex" xmlns:cx8="http://schemas.microsoft.com/office/drawing/2016/5/14/chartex" xmlns:mc="http://schemas.openxmlformats.org/markup-compatibility/2006" xmlns:aink="http://schemas.microsoft.com/office/drawing/2016/ink" xmlns:am3d="http://schemas.microsoft.com/office/drawing/2017/model3d" xmlns:o="urn:schemas-microsoft-com:office:office" xmlns:oel="http://schemas.microsoft.com/office/2019/extlst" xmlns:r="http://schemas.openxmlformats.org/officeDocument/2006/relationships" xmlns:m="http://schemas.openxmlformats.org/officeDocument/2006/math" xmlns:v="urn:schemas-microsoft-com:vml" xmlns:wp14="http://schemas.microsoft.com/office/word/2010/wordprocessingDrawing" xmlns:wp="http://schemas.openxmlformats.org/drawingml/2006/wordprocessingDrawing" xmlns:w10="urn:schemas-microsoft-com:office:word" xmlns:w="http://schemas.openxmlformats.org/wordprocessingml/2006/main" xmlns:w14="http://schemas.microsoft.com/office/word/2010/wordml" xmlns:w15="http://schemas.microsoft.com/office/word/2012/wordml" xmlns:w16cex="http://schemas.microsoft.com/office/word/2018/wordml/cex" xmlns:w16cid="http://schemas.microsoft.com/office/word/2016/wordml/cid" xmlns:w16="http://schemas.microsoft.com/office/word/2018/wordml" xmlns:w16du="http://schemas.microsoft.com/office/word/2023/wordml/word16du" xmlns:w16sdtdh="http://schemas.microsoft.com/office/word/2020/wordml/sdtdatahash" xmlns:w16sdtfl="http://schemas.microsoft.com/office/word/2024/wordml/sdtformatlock" xmlns:w16se="http://schemas.microsoft.com/office/word/2015/wordml/symex" xmlns:wpg="http://schemas.microsoft.com/office/word/2010/wordprocessingGroup" xmlns:wpi="http://schemas.microsoft.com/office/word/2010/wordprocessingInk" xmlns:wne="http://schemas.microsoft.com/office/word/2006/wordml" xmlns:wps="http://schemas.microsoft.com/office/word/2010/wordprocessingShape" mc:Ignorable="w14 w15 w16se w16cid w16 w16cex w16sdtdh w16sdtfl w16du wp14">
   <w:body>
     <w:p/>
     <w:tbl>
@@ -153,7 +153,26 @@
           <w:lang w:val="en-US"/>
         </w:rPr>
         <w:br/>
-        <w:t xml:space="preserve">Versione </w:t>
+      </w:r>
+      <w:proofErr w:type="spellStart"/>
+      <w:r>
+        <w:rPr>
+          <w:rFonts w:ascii="Arial" w:hAnsi="Arial"/>
+          <w:b/>
+          <w:sz w:val="36"/>
+          <w:lang w:val="en-US"/>
+        </w:rPr>
+        <w:t>Versione</w:t>
+      </w:r>
+      <w:proofErr w:type="spellEnd"/>
+      <w:r>
+        <w:rPr>
+          <w:rFonts w:ascii="Arial" w:hAnsi="Arial"/>
+          <w:b/>
+          <w:sz w:val="36"/>
+          <w:lang w:val="en-US"/>
+        </w:rPr>
+        <w:t xml:space="preserve"> </w:t>
       </w:r>
       <w:r>
         <w:rPr>
@@ -180,7 +199,7 @@
           <w:sz w:val="36"/>
           <w:lang w:val="en-US"/>
         </w:rPr>
-        <w:t>2</w:t>
+        <w:t>4</w:t>
       </w:r>
       <w:r>
         <w:rPr>
@@ -374,7 +393,7 @@
         <w:rPr>
           <w:sz w:val="32"/>
         </w:rPr>
-        <w:t>2</w:t>
+        <w:t>3</w:t>
       </w:r>
       <w:r>
         <w:rPr>
@@ -1161,7 +1180,49 @@
               <w:rPr>
                 <w:sz w:val="20"/>
               </w:rPr>
-              <w:t>del problem statement con problem domain, scenari possibili e requisiti funzionali (</w:t>
+              <w:t xml:space="preserve">del </w:t>
+            </w:r>
+            <w:proofErr w:type="spellStart"/>
+            <w:r>
+              <w:rPr>
+                <w:sz w:val="20"/>
+              </w:rPr>
+              <w:t>problem</w:t>
+            </w:r>
+            <w:proofErr w:type="spellEnd"/>
+            <w:r>
+              <w:rPr>
+                <w:sz w:val="20"/>
+              </w:rPr>
+              <w:t xml:space="preserve"> </w:t>
+            </w:r>
+            <w:proofErr w:type="spellStart"/>
+            <w:r>
+              <w:rPr>
+                <w:sz w:val="20"/>
+              </w:rPr>
+              <w:t>statement</w:t>
+            </w:r>
+            <w:proofErr w:type="spellEnd"/>
+            <w:r>
+              <w:rPr>
+                <w:sz w:val="20"/>
+              </w:rPr>
+              <w:t xml:space="preserve"> con </w:t>
+            </w:r>
+            <w:proofErr w:type="spellStart"/>
+            <w:r>
+              <w:rPr>
+                <w:sz w:val="20"/>
+              </w:rPr>
+              <w:t>problem</w:t>
+            </w:r>
+            <w:proofErr w:type="spellEnd"/>
+            <w:r>
+              <w:rPr>
+                <w:sz w:val="20"/>
+              </w:rPr>
+              <w:t xml:space="preserve"> domain, scenari possibili e requisiti funzionali (</w:t>
             </w:r>
             <w:r>
               <w:rPr>
@@ -1376,6 +1437,108 @@
               <w:rPr>
                 <w:sz w:val="20"/>
               </w:rPr>
+              <w:t>Rielaborazione degli scenari</w:t>
+            </w:r>
+          </w:p>
+        </w:tc>
+        <w:tc>
+          <w:tcPr>
+            <w:tcW w:w="2410" w:type="dxa"/>
+            <w:vMerge w:val="restart"/>
+            <w:tcBorders>
+              <w:left w:val="single" w:sz="1" w:space="0" w:color="000000"/>
+              <w:bottom w:val="single" w:sz="1" w:space="0" w:color="000000"/>
+              <w:right w:val="single" w:sz="1" w:space="0" w:color="000000"/>
+            </w:tcBorders>
+          </w:tcPr>
+          <w:p>
+            <w:pPr>
+              <w:pStyle w:val="Contenutotabella"/>
+              <w:rPr>
+                <w:sz w:val="20"/>
+              </w:rPr>
+            </w:pPr>
+            <w:r>
+              <w:rPr>
+                <w:sz w:val="20"/>
+              </w:rPr>
+              <w:t>Angelica D’Aquila</w:t>
+            </w:r>
+          </w:p>
+        </w:tc>
+      </w:tr>
+      <w:tr>
+        <w:trPr>
+          <w:trHeight w:val="230"/>
+        </w:trPr>
+        <w:tc>
+          <w:tcPr>
+            <w:tcW w:w="1927" w:type="dxa"/>
+            <w:vMerge w:val="restart"/>
+            <w:tcBorders>
+              <w:left w:val="single" w:sz="1" w:space="0" w:color="000000"/>
+              <w:bottom w:val="single" w:sz="1" w:space="0" w:color="000000"/>
+            </w:tcBorders>
+          </w:tcPr>
+          <w:p>
+            <w:pPr>
+              <w:pStyle w:val="Contenutotabella"/>
+              <w:rPr>
+                <w:sz w:val="20"/>
+              </w:rPr>
+            </w:pPr>
+            <w:r>
+              <w:rPr>
+                <w:sz w:val="20"/>
+              </w:rPr>
+              <w:t>12/10/2026</w:t>
+            </w:r>
+          </w:p>
+        </w:tc>
+        <w:tc>
+          <w:tcPr>
+            <w:tcW w:w="964" w:type="dxa"/>
+            <w:vMerge w:val="restart"/>
+            <w:tcBorders>
+              <w:left w:val="single" w:sz="1" w:space="0" w:color="000000"/>
+              <w:bottom w:val="single" w:sz="1" w:space="0" w:color="000000"/>
+            </w:tcBorders>
+          </w:tcPr>
+          <w:p>
+            <w:pPr>
+              <w:pStyle w:val="Contenutotabella"/>
+              <w:rPr>
+                <w:sz w:val="20"/>
+              </w:rPr>
+            </w:pPr>
+            <w:r>
+              <w:rPr>
+                <w:sz w:val="20"/>
+              </w:rPr>
+              <w:t>1.3</w:t>
+            </w:r>
+          </w:p>
+        </w:tc>
+        <w:tc>
+          <w:tcPr>
+            <w:tcW w:w="4336" w:type="dxa"/>
+            <w:vMerge w:val="restart"/>
+            <w:tcBorders>
+              <w:left w:val="single" w:sz="1" w:space="0" w:color="000000"/>
+              <w:bottom w:val="single" w:sz="1" w:space="0" w:color="000000"/>
+            </w:tcBorders>
+          </w:tcPr>
+          <w:p>
+            <w:pPr>
+              <w:pStyle w:val="Contenutotabella"/>
+              <w:rPr>
+                <w:sz w:val="20"/>
+              </w:rPr>
+            </w:pPr>
+            <w:r>
+              <w:rPr>
+                <w:sz w:val="20"/>
+              </w:rPr>
               <w:t>Aggiunta dei requisiti non funzionali</w:t>
             </w:r>
           </w:p>
@@ -1426,6 +1589,12 @@
                 <w:sz w:val="20"/>
               </w:rPr>
             </w:pPr>
+            <w:r>
+              <w:rPr>
+                <w:sz w:val="20"/>
+              </w:rPr>
+              <w:t>13/10/2026</w:t>
+            </w:r>
           </w:p>
         </w:tc>
         <w:tc>
@@ -1444,6 +1613,12 @@
                 <w:sz w:val="20"/>
               </w:rPr>
             </w:pPr>
+            <w:r>
+              <w:rPr>
+                <w:sz w:val="20"/>
+              </w:rPr>
+              <w:t>1.4</w:t>
+            </w:r>
           </w:p>
         </w:tc>
         <w:tc>
@@ -1462,6 +1637,12 @@
                 <w:sz w:val="20"/>
               </w:rPr>
             </w:pPr>
+            <w:r>
+              <w:rPr>
+                <w:sz w:val="20"/>
+              </w:rPr>
+              <w:t xml:space="preserve">Raffinamento degli scenari analizzati, aggiunta di ulteriori requisiti non funzionali e dei deliverables con rispettive deadlines </w:t>
+            </w:r>
           </w:p>
         </w:tc>
         <w:tc>
@@ -1481,84 +1662,12 @@
                 <w:sz w:val="20"/>
               </w:rPr>
             </w:pPr>
-          </w:p>
-        </w:tc>
-      </w:tr>
-      <w:tr>
-        <w:trPr>
-          <w:trHeight w:val="230"/>
-        </w:trPr>
-        <w:tc>
-          <w:tcPr>
-            <w:tcW w:w="1927" w:type="dxa"/>
-            <w:vMerge w:val="restart"/>
-            <w:tcBorders>
-              <w:left w:val="single" w:sz="1" w:space="0" w:color="000000"/>
-              <w:bottom w:val="single" w:sz="1" w:space="0" w:color="000000"/>
-            </w:tcBorders>
-          </w:tcPr>
-          <w:p>
-            <w:pPr>
-              <w:pStyle w:val="Contenutotabella"/>
+            <w:r>
               <w:rPr>
                 <w:sz w:val="20"/>
               </w:rPr>
-            </w:pPr>
-          </w:p>
-        </w:tc>
-        <w:tc>
-          <w:tcPr>
-            <w:tcW w:w="964" w:type="dxa"/>
-            <w:vMerge w:val="restart"/>
-            <w:tcBorders>
-              <w:left w:val="single" w:sz="1" w:space="0" w:color="000000"/>
-              <w:bottom w:val="single" w:sz="1" w:space="0" w:color="000000"/>
-            </w:tcBorders>
-          </w:tcPr>
-          <w:p>
-            <w:pPr>
-              <w:pStyle w:val="Contenutotabella"/>
-              <w:rPr>
-                <w:sz w:val="20"/>
-              </w:rPr>
-            </w:pPr>
-          </w:p>
-        </w:tc>
-        <w:tc>
-          <w:tcPr>
-            <w:tcW w:w="4336" w:type="dxa"/>
-            <w:vMerge w:val="restart"/>
-            <w:tcBorders>
-              <w:left w:val="single" w:sz="1" w:space="0" w:color="000000"/>
-              <w:bottom w:val="single" w:sz="1" w:space="0" w:color="000000"/>
-            </w:tcBorders>
-          </w:tcPr>
-          <w:p>
-            <w:pPr>
-              <w:pStyle w:val="Contenutotabella"/>
-              <w:rPr>
-                <w:sz w:val="20"/>
-              </w:rPr>
-            </w:pPr>
-          </w:p>
-        </w:tc>
-        <w:tc>
-          <w:tcPr>
-            <w:tcW w:w="2410" w:type="dxa"/>
-            <w:vMerge w:val="restart"/>
-            <w:tcBorders>
-              <w:left w:val="single" w:sz="1" w:space="0" w:color="000000"/>
-              <w:bottom w:val="single" w:sz="1" w:space="0" w:color="000000"/>
-              <w:right w:val="single" w:sz="1" w:space="0" w:color="000000"/>
-            </w:tcBorders>
-          </w:tcPr>
-          <w:p>
-            <w:pPr>
-              <w:pStyle w:val="Contenutotabella"/>
-              <w:rPr>
-                <w:sz w:val="20"/>
-              </w:rPr>
-            </w:pPr>
+              <w:t>Gennaro Esposito</w:t>
+            </w:r>
           </w:p>
         </w:tc>
       </w:tr>
@@ -1713,9 +1822,10 @@
           <w:tab w:val="left" w:pos="566"/>
         </w:tabs>
         <w:rPr>
-          <w:rFonts w:ascii="Aptos" w:eastAsia="Times New Roman" w:hAnsi="Aptos" w:cs="Times New Roman"/>
+          <w:rFonts w:asciiTheme="minorHAnsi" w:eastAsiaTheme="minorEastAsia" w:hAnsiTheme="minorHAnsi" w:cstheme="minorBidi"/>
           <w:noProof/>
           <w:kern w:val="2"/>
+          <w14:ligatures w14:val="standardContextual"/>
         </w:rPr>
       </w:pPr>
       <w:r>
@@ -1727,7 +1837,7 @@
       <w:r>
         <w:fldChar w:fldCharType="separate"/>
       </w:r>
-      <w:hyperlink w:anchor="_Toc242726268" w:history="1">
+      <w:hyperlink w:anchor="_Toc242783791" w:history="1">
         <w:r>
           <w:rPr>
             <w:rStyle w:val="Collegamentoipertestuale"/>
@@ -1737,9 +1847,10 @@
         </w:r>
         <w:r>
           <w:rPr>
-            <w:rFonts w:ascii="Aptos" w:eastAsia="Times New Roman" w:hAnsi="Aptos" w:cs="Times New Roman"/>
+            <w:rFonts w:asciiTheme="minorHAnsi" w:eastAsiaTheme="minorEastAsia" w:hAnsiTheme="minorHAnsi" w:cstheme="minorBidi"/>
             <w:noProof/>
             <w:kern w:val="2"/>
+            <w14:ligatures w14:val="standardContextual"/>
           </w:rPr>
           <w:tab/>
         </w:r>
@@ -1769,7 +1880,7 @@
             <w:noProof/>
             <w:webHidden/>
           </w:rPr>
-          <w:instrText xml:space="preserve"> PAGEREF _Toc242726268 \h </w:instrText>
+          <w:instrText xml:space="preserve"> PAGEREF _Toc242783791 \h </w:instrText>
         </w:r>
         <w:r>
           <w:rPr>
@@ -1807,12 +1918,13 @@
           <w:tab w:val="left" w:pos="566"/>
         </w:tabs>
         <w:rPr>
-          <w:rFonts w:ascii="Aptos" w:eastAsia="Times New Roman" w:hAnsi="Aptos" w:cs="Times New Roman"/>
+          <w:rFonts w:asciiTheme="minorHAnsi" w:eastAsiaTheme="minorEastAsia" w:hAnsiTheme="minorHAnsi" w:cstheme="minorBidi"/>
           <w:noProof/>
           <w:kern w:val="2"/>
+          <w14:ligatures w14:val="standardContextual"/>
         </w:rPr>
       </w:pPr>
-      <w:hyperlink w:anchor="_Toc242726269" w:history="1">
+      <w:hyperlink w:anchor="_Toc242783792" w:history="1">
         <w:r>
           <w:rPr>
             <w:rStyle w:val="Collegamentoipertestuale"/>
@@ -1822,9 +1934,10 @@
         </w:r>
         <w:r>
           <w:rPr>
-            <w:rFonts w:ascii="Aptos" w:eastAsia="Times New Roman" w:hAnsi="Aptos" w:cs="Times New Roman"/>
+            <w:rFonts w:asciiTheme="minorHAnsi" w:eastAsiaTheme="minorEastAsia" w:hAnsiTheme="minorHAnsi" w:cstheme="minorBidi"/>
             <w:noProof/>
             <w:kern w:val="2"/>
+            <w14:ligatures w14:val="standardContextual"/>
           </w:rPr>
           <w:tab/>
         </w:r>
@@ -1833,7 +1946,7 @@
             <w:rStyle w:val="Collegamentoipertestuale"/>
             <w:noProof/>
           </w:rPr>
-          <w:t>SCENARI</w:t>
+          <w:t>SCENARIOS</w:t>
         </w:r>
         <w:r>
           <w:rPr>
@@ -1854,7 +1967,7 @@
             <w:noProof/>
             <w:webHidden/>
           </w:rPr>
-          <w:instrText xml:space="preserve"> PAGEREF _Toc242726269 \h </w:instrText>
+          <w:instrText xml:space="preserve"> PAGEREF _Toc242783792 \h </w:instrText>
         </w:r>
         <w:r>
           <w:rPr>
@@ -1892,12 +2005,13 @@
           <w:tab w:val="left" w:pos="849"/>
         </w:tabs>
         <w:rPr>
-          <w:rFonts w:ascii="Aptos" w:eastAsia="Times New Roman" w:hAnsi="Aptos" w:cs="Times New Roman"/>
+          <w:rFonts w:asciiTheme="minorHAnsi" w:eastAsiaTheme="minorEastAsia" w:hAnsiTheme="minorHAnsi" w:cstheme="minorBidi"/>
           <w:noProof/>
           <w:kern w:val="2"/>
+          <w14:ligatures w14:val="standardContextual"/>
         </w:rPr>
       </w:pPr>
-      <w:hyperlink w:anchor="_Toc242726270" w:history="1">
+      <w:hyperlink w:anchor="_Toc242783793" w:history="1">
         <w:r>
           <w:rPr>
             <w:rStyle w:val="Collegamentoipertestuale"/>
@@ -1907,9 +2021,10 @@
         </w:r>
         <w:r>
           <w:rPr>
-            <w:rFonts w:ascii="Aptos" w:eastAsia="Times New Roman" w:hAnsi="Aptos" w:cs="Times New Roman"/>
+            <w:rFonts w:asciiTheme="minorHAnsi" w:eastAsiaTheme="minorEastAsia" w:hAnsiTheme="minorHAnsi" w:cstheme="minorBidi"/>
             <w:noProof/>
             <w:kern w:val="2"/>
+            <w14:ligatures w14:val="standardContextual"/>
           </w:rPr>
           <w:tab/>
         </w:r>
@@ -1918,14 +2033,7 @@
             <w:rStyle w:val="Collegamentoipertestuale"/>
             <w:noProof/>
           </w:rPr>
-          <w:t>Scenario 1 - Attore principale: Consumer (Marco</w:t>
-        </w:r>
-        <w:r>
-          <w:rPr>
-            <w:rStyle w:val="Collegamentoipertestuale"/>
-            <w:noProof/>
-          </w:rPr>
-          <w:t>)</w:t>
+          <w:t>Scenario 1: Acquisto del prodotto - Attore principale: Consumer (Marco)</w:t>
         </w:r>
         <w:r>
           <w:rPr>
@@ -1946,7 +2054,7 @@
             <w:noProof/>
             <w:webHidden/>
           </w:rPr>
-          <w:instrText xml:space="preserve"> PAGEREF _Toc242726270 \h </w:instrText>
+          <w:instrText xml:space="preserve"> PAGEREF _Toc242783793 \h </w:instrText>
         </w:r>
         <w:r>
           <w:rPr>
@@ -1984,12 +2092,13 @@
           <w:tab w:val="left" w:pos="849"/>
         </w:tabs>
         <w:rPr>
-          <w:rFonts w:ascii="Aptos" w:eastAsia="Times New Roman" w:hAnsi="Aptos" w:cs="Times New Roman"/>
+          <w:rFonts w:asciiTheme="minorHAnsi" w:eastAsiaTheme="minorEastAsia" w:hAnsiTheme="minorHAnsi" w:cstheme="minorBidi"/>
           <w:noProof/>
           <w:kern w:val="2"/>
+          <w14:ligatures w14:val="standardContextual"/>
         </w:rPr>
       </w:pPr>
-      <w:hyperlink w:anchor="_Toc242726271" w:history="1">
+      <w:hyperlink w:anchor="_Toc242783794" w:history="1">
         <w:r>
           <w:rPr>
             <w:rStyle w:val="Collegamentoipertestuale"/>
@@ -1999,9 +2108,10 @@
         </w:r>
         <w:r>
           <w:rPr>
-            <w:rFonts w:ascii="Aptos" w:eastAsia="Times New Roman" w:hAnsi="Aptos" w:cs="Times New Roman"/>
+            <w:rFonts w:asciiTheme="minorHAnsi" w:eastAsiaTheme="minorEastAsia" w:hAnsiTheme="minorHAnsi" w:cstheme="minorBidi"/>
             <w:noProof/>
             <w:kern w:val="2"/>
+            <w14:ligatures w14:val="standardContextual"/>
           </w:rPr>
           <w:tab/>
         </w:r>
@@ -2010,7 +2120,7 @@
             <w:rStyle w:val="Collegamentoipertestuale"/>
             <w:noProof/>
           </w:rPr>
-          <w:t>Scenario 2 - Attore principale: Order Manager (Antonio)</w:t>
+          <w:t>Scenario 2: Gestione degli ordini - Attore principale: Order Manager (Antonio)</w:t>
         </w:r>
         <w:r>
           <w:rPr>
@@ -2031,7 +2141,7 @@
             <w:noProof/>
             <w:webHidden/>
           </w:rPr>
-          <w:instrText xml:space="preserve"> PAGEREF _Toc242726271 \h </w:instrText>
+          <w:instrText xml:space="preserve"> PAGEREF _Toc242783794 \h </w:instrText>
         </w:r>
         <w:r>
           <w:rPr>
@@ -2069,12 +2179,13 @@
           <w:tab w:val="left" w:pos="849"/>
         </w:tabs>
         <w:rPr>
-          <w:rFonts w:ascii="Aptos" w:eastAsia="Times New Roman" w:hAnsi="Aptos" w:cs="Times New Roman"/>
+          <w:rFonts w:asciiTheme="minorHAnsi" w:eastAsiaTheme="minorEastAsia" w:hAnsiTheme="minorHAnsi" w:cstheme="minorBidi"/>
           <w:noProof/>
           <w:kern w:val="2"/>
+          <w14:ligatures w14:val="standardContextual"/>
         </w:rPr>
       </w:pPr>
-      <w:hyperlink w:anchor="_Toc242726272" w:history="1">
+      <w:hyperlink w:anchor="_Toc242783795" w:history="1">
         <w:r>
           <w:rPr>
             <w:rStyle w:val="Collegamentoipertestuale"/>
@@ -2084,9 +2195,10 @@
         </w:r>
         <w:r>
           <w:rPr>
-            <w:rFonts w:ascii="Aptos" w:eastAsia="Times New Roman" w:hAnsi="Aptos" w:cs="Times New Roman"/>
+            <w:rFonts w:asciiTheme="minorHAnsi" w:eastAsiaTheme="minorEastAsia" w:hAnsiTheme="minorHAnsi" w:cstheme="minorBidi"/>
             <w:noProof/>
             <w:kern w:val="2"/>
+            <w14:ligatures w14:val="standardContextual"/>
           </w:rPr>
           <w:tab/>
         </w:r>
@@ -2095,7 +2207,7 @@
             <w:rStyle w:val="Collegamentoipertestuale"/>
             <w:noProof/>
           </w:rPr>
-          <w:t>Scenario 3 - Attore principale: Product Manager (Vittoria)</w:t>
+          <w:t>Scenario 3: Aggiunta degli occhiali - Attore principale: Product Manager (Vittoria)</w:t>
         </w:r>
         <w:r>
           <w:rPr>
@@ -2116,7 +2228,7 @@
             <w:noProof/>
             <w:webHidden/>
           </w:rPr>
-          <w:instrText xml:space="preserve"> PAGEREF _Toc242726272 \h </w:instrText>
+          <w:instrText xml:space="preserve"> PAGEREF _Toc242783795 \h </w:instrText>
         </w:r>
         <w:r>
           <w:rPr>
@@ -2136,7 +2248,7 @@
             <w:noProof/>
             <w:webHidden/>
           </w:rPr>
-          <w:t>4</w:t>
+          <w:t>5</w:t>
         </w:r>
         <w:r>
           <w:rPr>
@@ -2154,12 +2266,13 @@
           <w:tab w:val="left" w:pos="849"/>
         </w:tabs>
         <w:rPr>
-          <w:rFonts w:ascii="Aptos" w:eastAsia="Times New Roman" w:hAnsi="Aptos" w:cs="Times New Roman"/>
+          <w:rFonts w:asciiTheme="minorHAnsi" w:eastAsiaTheme="minorEastAsia" w:hAnsiTheme="minorHAnsi" w:cstheme="minorBidi"/>
           <w:noProof/>
           <w:kern w:val="2"/>
+          <w14:ligatures w14:val="standardContextual"/>
         </w:rPr>
       </w:pPr>
-      <w:hyperlink w:anchor="_Toc242726273" w:history="1">
+      <w:hyperlink w:anchor="_Toc242783796" w:history="1">
         <w:r>
           <w:rPr>
             <w:rStyle w:val="Collegamentoipertestuale"/>
@@ -2169,9 +2282,10 @@
         </w:r>
         <w:r>
           <w:rPr>
-            <w:rFonts w:ascii="Aptos" w:eastAsia="Times New Roman" w:hAnsi="Aptos" w:cs="Times New Roman"/>
+            <w:rFonts w:asciiTheme="minorHAnsi" w:eastAsiaTheme="minorEastAsia" w:hAnsiTheme="minorHAnsi" w:cstheme="minorBidi"/>
             <w:noProof/>
             <w:kern w:val="2"/>
+            <w14:ligatures w14:val="standardContextual"/>
           </w:rPr>
           <w:tab/>
         </w:r>
@@ -2180,7 +2294,7 @@
             <w:rStyle w:val="Collegamentoipertestuale"/>
             <w:noProof/>
           </w:rPr>
-          <w:t>Scenario 4 - Attore principale: Market Analyzer</w:t>
+          <w:t>Scenario 4: Indagini statistiche - Attore principale: Market Analyzer (Fabio)</w:t>
         </w:r>
         <w:r>
           <w:rPr>
@@ -2201,7 +2315,7 @@
             <w:noProof/>
             <w:webHidden/>
           </w:rPr>
-          <w:instrText xml:space="preserve"> PAGEREF _Toc242726273 \h </w:instrText>
+          <w:instrText xml:space="preserve"> PAGEREF _Toc242783796 \h </w:instrText>
         </w:r>
         <w:r>
           <w:rPr>
@@ -2239,12 +2353,13 @@
           <w:tab w:val="left" w:pos="566"/>
         </w:tabs>
         <w:rPr>
-          <w:rFonts w:ascii="Aptos" w:eastAsia="Times New Roman" w:hAnsi="Aptos" w:cs="Times New Roman"/>
+          <w:rFonts w:asciiTheme="minorHAnsi" w:eastAsiaTheme="minorEastAsia" w:hAnsiTheme="minorHAnsi" w:cstheme="minorBidi"/>
           <w:noProof/>
           <w:kern w:val="2"/>
+          <w14:ligatures w14:val="standardContextual"/>
         </w:rPr>
       </w:pPr>
-      <w:hyperlink w:anchor="_Toc242726274" w:history="1">
+      <w:hyperlink w:anchor="_Toc242783797" w:history="1">
         <w:r>
           <w:rPr>
             <w:rStyle w:val="Collegamentoipertestuale"/>
@@ -2254,9 +2369,10 @@
         </w:r>
         <w:r>
           <w:rPr>
-            <w:rFonts w:ascii="Aptos" w:eastAsia="Times New Roman" w:hAnsi="Aptos" w:cs="Times New Roman"/>
+            <w:rFonts w:asciiTheme="minorHAnsi" w:eastAsiaTheme="minorEastAsia" w:hAnsiTheme="minorHAnsi" w:cstheme="minorBidi"/>
             <w:noProof/>
             <w:kern w:val="2"/>
+            <w14:ligatures w14:val="standardContextual"/>
           </w:rPr>
           <w:tab/>
         </w:r>
@@ -2265,7 +2381,7 @@
             <w:rStyle w:val="Collegamentoipertestuale"/>
             <w:noProof/>
           </w:rPr>
-          <w:t>REQUISITI FUNZIONALI</w:t>
+          <w:t>FUNCTIONAL REQUIREMENTS</w:t>
         </w:r>
         <w:r>
           <w:rPr>
@@ -2286,7 +2402,7 @@
             <w:noProof/>
             <w:webHidden/>
           </w:rPr>
-          <w:instrText xml:space="preserve"> PAGEREF _Toc242726274 \h </w:instrText>
+          <w:instrText xml:space="preserve"> PAGEREF _Toc242783797 \h </w:instrText>
         </w:r>
         <w:r>
           <w:rPr>
@@ -2324,12 +2440,13 @@
           <w:tab w:val="left" w:pos="566"/>
         </w:tabs>
         <w:rPr>
-          <w:rFonts w:ascii="Aptos" w:eastAsia="Times New Roman" w:hAnsi="Aptos" w:cs="Times New Roman"/>
+          <w:rFonts w:asciiTheme="minorHAnsi" w:eastAsiaTheme="minorEastAsia" w:hAnsiTheme="minorHAnsi" w:cstheme="minorBidi"/>
           <w:noProof/>
           <w:kern w:val="2"/>
+          <w14:ligatures w14:val="standardContextual"/>
         </w:rPr>
       </w:pPr>
-      <w:hyperlink w:anchor="_Toc242726275" w:history="1">
+      <w:hyperlink w:anchor="_Toc242783798" w:history="1">
         <w:r>
           <w:rPr>
             <w:rStyle w:val="Collegamentoipertestuale"/>
@@ -2339,9 +2456,10 @@
         </w:r>
         <w:r>
           <w:rPr>
-            <w:rFonts w:ascii="Aptos" w:eastAsia="Times New Roman" w:hAnsi="Aptos" w:cs="Times New Roman"/>
+            <w:rFonts w:asciiTheme="minorHAnsi" w:eastAsiaTheme="minorEastAsia" w:hAnsiTheme="minorHAnsi" w:cstheme="minorBidi"/>
             <w:noProof/>
             <w:kern w:val="2"/>
+            <w14:ligatures w14:val="standardContextual"/>
           </w:rPr>
           <w:tab/>
         </w:r>
@@ -2350,7 +2468,7 @@
             <w:rStyle w:val="Collegamentoipertestuale"/>
             <w:noProof/>
           </w:rPr>
-          <w:t>REQUISITI NON FUNZIONALI</w:t>
+          <w:t>NONFUNCTIONAL REQUIREMENTS</w:t>
         </w:r>
         <w:r>
           <w:rPr>
@@ -2371,7 +2489,181 @@
             <w:noProof/>
             <w:webHidden/>
           </w:rPr>
-          <w:instrText xml:space="preserve"> PAGEREF _Toc242726275 \h </w:instrText>
+          <w:instrText xml:space="preserve"> PAGEREF _Toc242783798 \h </w:instrText>
+        </w:r>
+        <w:r>
+          <w:rPr>
+            <w:noProof/>
+            <w:webHidden/>
+          </w:rPr>
+        </w:r>
+        <w:r>
+          <w:rPr>
+            <w:noProof/>
+            <w:webHidden/>
+          </w:rPr>
+          <w:fldChar w:fldCharType="separate"/>
+        </w:r>
+        <w:r>
+          <w:rPr>
+            <w:noProof/>
+            <w:webHidden/>
+          </w:rPr>
+          <w:t>6</w:t>
+        </w:r>
+        <w:r>
+          <w:rPr>
+            <w:noProof/>
+            <w:webHidden/>
+          </w:rPr>
+          <w:fldChar w:fldCharType="end"/>
+        </w:r>
+      </w:hyperlink>
+    </w:p>
+    <w:p>
+      <w:pPr>
+        <w:pStyle w:val="Sommario1"/>
+        <w:tabs>
+          <w:tab w:val="left" w:pos="566"/>
+        </w:tabs>
+        <w:rPr>
+          <w:rFonts w:asciiTheme="minorHAnsi" w:eastAsiaTheme="minorEastAsia" w:hAnsiTheme="minorHAnsi" w:cstheme="minorBidi"/>
+          <w:noProof/>
+          <w:kern w:val="2"/>
+          <w14:ligatures w14:val="standardContextual"/>
+        </w:rPr>
+      </w:pPr>
+      <w:hyperlink w:anchor="_Toc242783799" w:history="1">
+        <w:r>
+          <w:rPr>
+            <w:rStyle w:val="Collegamentoipertestuale"/>
+            <w:noProof/>
+          </w:rPr>
+          <w:t>5.</w:t>
+        </w:r>
+        <w:r>
+          <w:rPr>
+            <w:rFonts w:asciiTheme="minorHAnsi" w:eastAsiaTheme="minorEastAsia" w:hAnsiTheme="minorHAnsi" w:cstheme="minorBidi"/>
+            <w:noProof/>
+            <w:kern w:val="2"/>
+            <w14:ligatures w14:val="standardContextual"/>
+          </w:rPr>
+          <w:tab/>
+        </w:r>
+        <w:r>
+          <w:rPr>
+            <w:rStyle w:val="Collegamentoipertestuale"/>
+            <w:noProof/>
+          </w:rPr>
+          <w:t>TARGET ENVIRONMENT</w:t>
+        </w:r>
+        <w:r>
+          <w:rPr>
+            <w:noProof/>
+            <w:webHidden/>
+          </w:rPr>
+          <w:tab/>
+        </w:r>
+        <w:r>
+          <w:rPr>
+            <w:noProof/>
+            <w:webHidden/>
+          </w:rPr>
+          <w:fldChar w:fldCharType="begin"/>
+        </w:r>
+        <w:r>
+          <w:rPr>
+            <w:noProof/>
+            <w:webHidden/>
+          </w:rPr>
+          <w:instrText xml:space="preserve"> PAGEREF _Toc242783799 \h </w:instrText>
+        </w:r>
+        <w:r>
+          <w:rPr>
+            <w:noProof/>
+            <w:webHidden/>
+          </w:rPr>
+        </w:r>
+        <w:r>
+          <w:rPr>
+            <w:noProof/>
+            <w:webHidden/>
+          </w:rPr>
+          <w:fldChar w:fldCharType="separate"/>
+        </w:r>
+        <w:r>
+          <w:rPr>
+            <w:noProof/>
+            <w:webHidden/>
+          </w:rPr>
+          <w:t>6</w:t>
+        </w:r>
+        <w:r>
+          <w:rPr>
+            <w:noProof/>
+            <w:webHidden/>
+          </w:rPr>
+          <w:fldChar w:fldCharType="end"/>
+        </w:r>
+      </w:hyperlink>
+    </w:p>
+    <w:p>
+      <w:pPr>
+        <w:pStyle w:val="Sommario1"/>
+        <w:tabs>
+          <w:tab w:val="left" w:pos="566"/>
+        </w:tabs>
+        <w:rPr>
+          <w:rFonts w:asciiTheme="minorHAnsi" w:eastAsiaTheme="minorEastAsia" w:hAnsiTheme="minorHAnsi" w:cstheme="minorBidi"/>
+          <w:noProof/>
+          <w:kern w:val="2"/>
+          <w14:ligatures w14:val="standardContextual"/>
+        </w:rPr>
+      </w:pPr>
+      <w:hyperlink w:anchor="_Toc242783800" w:history="1">
+        <w:r>
+          <w:rPr>
+            <w:rStyle w:val="Collegamentoipertestuale"/>
+            <w:noProof/>
+          </w:rPr>
+          <w:t>6.</w:t>
+        </w:r>
+        <w:r>
+          <w:rPr>
+            <w:rFonts w:asciiTheme="minorHAnsi" w:eastAsiaTheme="minorEastAsia" w:hAnsiTheme="minorHAnsi" w:cstheme="minorBidi"/>
+            <w:noProof/>
+            <w:kern w:val="2"/>
+            <w14:ligatures w14:val="standardContextual"/>
+          </w:rPr>
+          <w:tab/>
+        </w:r>
+        <w:r>
+          <w:rPr>
+            <w:rStyle w:val="Collegamentoipertestuale"/>
+            <w:noProof/>
+          </w:rPr>
+          <w:t>DELIVERABLE &amp; DEADLINES</w:t>
+        </w:r>
+        <w:r>
+          <w:rPr>
+            <w:noProof/>
+            <w:webHidden/>
+          </w:rPr>
+          <w:tab/>
+        </w:r>
+        <w:r>
+          <w:rPr>
+            <w:noProof/>
+            <w:webHidden/>
+          </w:rPr>
+          <w:fldChar w:fldCharType="begin"/>
+        </w:r>
+        <w:r>
+          <w:rPr>
+            <w:noProof/>
+            <w:webHidden/>
+          </w:rPr>
+          <w:instrText xml:space="preserve"> PAGEREF _Toc242783800 \h </w:instrText>
         </w:r>
         <w:r>
           <w:rPr>
@@ -2448,7 +2740,7 @@
         <w:jc w:val="left"/>
       </w:pPr>
       <w:bookmarkStart w:id="0" w:name="_Ref242705112"/>
-      <w:bookmarkStart w:id="1" w:name="_Toc242726268"/>
+      <w:bookmarkStart w:id="1" w:name="_Toc242783791"/>
       <w:r>
         <w:lastRenderedPageBreak/>
         <w:t>PROBLEM DOMAIN</w:t>
@@ -2485,9 +2777,9 @@
         <w:ind w:left="426" w:hanging="426"/>
         <w:jc w:val="left"/>
       </w:pPr>
-      <w:bookmarkStart w:id="2" w:name="_Toc242726269"/>
-      <w:r>
-        <w:t>SCENARI</w:t>
+      <w:bookmarkStart w:id="2" w:name="_Toc242783792"/>
+      <w:r>
+        <w:t>SCENARIOS</w:t>
       </w:r>
       <w:bookmarkEnd w:id="2"/>
     </w:p>
@@ -2503,9 +2795,15 @@
       <w:r>
         <w:t xml:space="preserve"> </w:t>
       </w:r>
-      <w:bookmarkStart w:id="4" w:name="_Toc242726270"/>
-      <w:r>
-        <w:t>Scenario 1 - Attore principale: Consumer</w:t>
+      <w:bookmarkStart w:id="4" w:name="_Toc242783793"/>
+      <w:r>
+        <w:t>Scenario 1</w:t>
+      </w:r>
+      <w:r>
+        <w:t>: Acquisto del prodotto</w:t>
+      </w:r>
+      <w:r>
+        <w:t xml:space="preserve"> - Attore principale: Consumer</w:t>
       </w:r>
       <w:bookmarkEnd w:id="3"/>
       <w:r>
@@ -2516,13 +2814,20 @@
     <w:p>
       <w:pPr>
         <w:pStyle w:val="NormaleWeb"/>
+        <w:spacing w:after="0" w:afterAutospacing="0"/>
         <w:ind w:left="709"/>
       </w:pPr>
       <w:r>
         <w:t>Marco</w:t>
       </w:r>
       <w:r>
-        <w:t xml:space="preserve"> naviga sul sito e decide di acquistare un paio di occhiali. Clicca sul prodotto e viene portato a una pagina con il dettaglio del prodotto</w:t>
+        <w:t xml:space="preserve"> naviga sul sito e decide di acquistare un paio di occhiali. Clicca sul</w:t>
+      </w:r>
+      <w:r>
+        <w:t>l’icona del</w:t>
+      </w:r>
+      <w:r>
+        <w:t xml:space="preserve"> prodotto e viene portato a una pagina con il dettaglio del prodotto</w:t>
       </w:r>
       <w:r>
         <w:t xml:space="preserve"> selezionato</w:t>
@@ -2531,28 +2836,52 @@
         <w:t>, contenente</w:t>
       </w:r>
       <w:r>
-        <w:t xml:space="preserve"> una foto,</w:t>
-      </w:r>
-      <w:r>
-        <w:t xml:space="preserve"> descrizione, colori disponibili</w:t>
+        <w:t xml:space="preserve"> </w:t>
+      </w:r>
+      <w:r>
+        <w:t>due</w:t>
+      </w:r>
+      <w:r>
+        <w:t xml:space="preserve"> foto</w:t>
+      </w:r>
+      <w:r>
+        <w:t xml:space="preserve"> dell’occhiale (dove può selezionare la foto in primo piano da visualizzare)</w:t>
+      </w:r>
+      <w:r>
+        <w:t>,</w:t>
+      </w:r>
+      <w:r>
+        <w:t xml:space="preserve"> una</w:t>
+      </w:r>
+      <w:r>
+        <w:t xml:space="preserve"> descrizione</w:t>
+      </w:r>
+      <w:r>
+        <w:t xml:space="preserve"> con i relativi dettagli come prezzo e valutazione media delle recensioni e</w:t>
+      </w:r>
+      <w:r>
+        <w:t xml:space="preserve"> </w:t>
+      </w:r>
+      <w:r>
+        <w:t xml:space="preserve">i </w:t>
+      </w:r>
+      <w:r>
+        <w:t>colori disponibili</w:t>
       </w:r>
       <w:r>
         <w:t xml:space="preserve"> per quel paio di occhiali</w:t>
       </w:r>
       <w:r>
-        <w:t xml:space="preserve">, e </w:t>
-      </w:r>
-      <w:r>
-        <w:t>un campo di scelta per la</w:t>
-      </w:r>
-      <w:r>
-        <w:t xml:space="preserve"> quantità. Clicca il pulsante per aggiungere il modello al carrello</w:t>
+        <w:t>. Clicca il pulsante per aggiungere il modello al carrello</w:t>
       </w:r>
       <w:r>
         <w:t xml:space="preserve">; </w:t>
       </w:r>
       <w:r>
-        <w:t xml:space="preserve">una volta aggiunto </w:t>
+        <w:t>cliccando,</w:t>
+      </w:r>
+      <w:r>
+        <w:t xml:space="preserve"> </w:t>
       </w:r>
       <w:r>
         <w:t>viene portato al suo carrello attuale</w:t>
@@ -2564,7 +2893,10 @@
         <w:t xml:space="preserve">presente una tabella con </w:t>
       </w:r>
       <w:r>
-        <w:t>gli occhiali presenti</w:t>
+        <w:t xml:space="preserve">gli occhiali </w:t>
+      </w:r>
+      <w:r>
+        <w:t>cercati</w:t>
       </w:r>
       <w:r>
         <w:t>, le rispettive quantità</w:t>
@@ -2573,7 +2905,7 @@
         <w:t xml:space="preserve">, </w:t>
       </w:r>
       <w:r>
-        <w:t>prezzi dei singoli, e il prezzo totale</w:t>
+        <w:t>prezzi dei singoli e il prezzo totale</w:t>
       </w:r>
       <w:r>
         <w:t>.</w:t>
@@ -2585,25 +2917,65 @@
         <w:t>D</w:t>
       </w:r>
       <w:r>
-        <w:t>a qui ha la possibilità di tornare al catalogo o procede al checkout.</w:t>
+        <w:t>a qui ha la possibilità di tornare al catalogo</w:t>
+      </w:r>
+      <w:r>
+        <w:t>, svuotare il carrello,</w:t>
+      </w:r>
+      <w:r>
+        <w:t xml:space="preserve"> o procede al checkout.</w:t>
       </w:r>
       <w:r>
         <w:t xml:space="preserve"> </w:t>
       </w:r>
-      <w:r>
-        <w:t>D</w:t>
+    </w:p>
+    <w:p>
+      <w:pPr>
+        <w:pStyle w:val="NormaleWeb"/>
+        <w:spacing w:before="0" w:beforeAutospacing="0"/>
+        <w:ind w:left="709"/>
+      </w:pPr>
+      <w:r>
+        <w:t>Marco d</w:t>
       </w:r>
       <w:r>
         <w:t>ecide di continuare al checkout</w:t>
       </w:r>
       <w:r>
-        <w:t xml:space="preserve">; dato che non ha mai effettuato il login viene re indirizzato alla pagina dove deve inserire il nome utente associato al suo account, scelto </w:t>
-      </w:r>
-      <w:r>
-        <w:t>da lui al</w:t>
-      </w:r>
-      <w:r>
-        <w:t xml:space="preserve"> momento della registrazione, e la password</w:t>
+        <w:t>. D</w:t>
+      </w:r>
+      <w:r>
+        <w:t xml:space="preserve">ato che non ha mai effettuato il login viene reindirizzato alla pagina </w:t>
+      </w:r>
+      <w:r>
+        <w:t xml:space="preserve">di login </w:t>
+      </w:r>
+      <w:r>
+        <w:t xml:space="preserve">dove deve </w:t>
+      </w:r>
+      <w:r>
+        <w:t>accedere con la propria mail</w:t>
+      </w:r>
+      <w:r>
+        <w:t>, scelt</w:t>
+      </w:r>
+      <w:r>
+        <w:t>a</w:t>
+      </w:r>
+      <w:r>
+        <w:t xml:space="preserve"> </w:t>
+      </w:r>
+      <w:r>
+        <w:t xml:space="preserve">al </w:t>
+      </w:r>
+      <w:r>
+        <w:t xml:space="preserve">momento della registrazione, e la </w:t>
+      </w:r>
+      <w:r>
+        <w:t xml:space="preserve">propria </w:t>
+      </w:r>
+      <w:r>
+        <w:t>password</w:t>
       </w:r>
       <w:r>
         <w:t xml:space="preserve">, </w:t>
@@ -2612,19 +2984,40 @@
         <w:t xml:space="preserve">che sarà oscurata. Il login va a </w:t>
       </w:r>
       <w:r>
-        <w:t>buon fine e viene portato alla pagina di checkout, dove sono presenti i campi per l’inserimento dell’indirizzo di spedizione (via, numero civico, città e regione) e quelli per il numero della carta (che è l’unico metodo di pagamento disponibile).</w:t>
+        <w:t>buon fine e viene portato alla pagina di checkout, dove sono presenti i campi per</w:t>
+      </w:r>
+      <w:r>
+        <w:t xml:space="preserve"> il destinatario, </w:t>
+      </w:r>
+      <w:r>
+        <w:t>l’indirizzo di spedizione (via, numero civico, città e regione)</w:t>
+      </w:r>
+      <w:r>
+        <w:t>, il numero di telefono</w:t>
+      </w:r>
+      <w:r>
+        <w:t xml:space="preserve"> e </w:t>
+      </w:r>
+      <w:r>
+        <w:t>il metodo di pagamento (con carta di credito o in contanti alla consegna).</w:t>
       </w:r>
       <w:r>
         <w:t xml:space="preserve"> </w:t>
       </w:r>
       <w:r>
-        <w:t>Inserisce i suddetti dati.</w:t>
+        <w:t>Inserisce i suddetti dati</w:t>
+      </w:r>
+      <w:r>
+        <w:t>: s</w:t>
+      </w:r>
+      <w:r>
+        <w:t xml:space="preserve">e rispettano formati validi l’ordine viene confermato </w:t>
+      </w:r>
+      <w:r>
+        <w:t>tramite un messaggio di conferma.</w:t>
       </w:r>
       <w:r>
         <w:t xml:space="preserve"> </w:t>
-      </w:r>
-      <w:r>
-        <w:t xml:space="preserve">Se i dati inseriti rispettano i requisiti (indirizzo di spedizione e carta in formati validi) l’ordine viene confermato e Marco viene portato alla pagina dei suoi ordini, assieme a un messaggio di conferma che assicura che l’ordine è andato a buon fine </w:t>
       </w:r>
     </w:p>
     <w:p>
@@ -2638,9 +3031,15 @@
       <w:r>
         <w:t xml:space="preserve"> </w:t>
       </w:r>
-      <w:bookmarkStart w:id="5" w:name="_Toc242726271"/>
-      <w:r>
-        <w:t>Scenario 2 - Attore principale: Order Manager</w:t>
+      <w:bookmarkStart w:id="5" w:name="_Toc242783794"/>
+      <w:r>
+        <w:t>Scenario 2</w:t>
+      </w:r>
+      <w:r>
+        <w:t>: Gestione degli ordini</w:t>
+      </w:r>
+      <w:r>
+        <w:t xml:space="preserve"> - Attore principale: Order Manager</w:t>
       </w:r>
       <w:r>
         <w:t xml:space="preserve"> (Antonio)</w:t>
@@ -2650,6 +3049,7 @@
     <w:p>
       <w:pPr>
         <w:pStyle w:val="NormaleWeb"/>
+        <w:spacing w:after="0" w:afterAutospacing="0"/>
         <w:ind w:left="709"/>
       </w:pPr>
       <w:r>
@@ -2665,25 +3065,99 @@
         <w:t xml:space="preserve">a un orario prestabilito </w:t>
       </w:r>
       <w:r>
-        <w:t>entra</w:t>
-      </w:r>
-      <w:r>
-        <w:t xml:space="preserve"> dalla pagina ordinaria di login,</w:t>
+        <w:t>accede</w:t>
       </w:r>
       <w:r>
         <w:t xml:space="preserve"> </w:t>
       </w:r>
       <w:r>
-        <w:t xml:space="preserve">con nome utente e password che corrispondono al singolo ruolo di Order Manager, </w:t>
-      </w:r>
-      <w:r>
-        <w:t>nella sua area di gestione sul sito</w:t>
-      </w:r>
-      <w:r>
-        <w:t xml:space="preserve">, </w:t>
-      </w:r>
-      <w:r>
-        <w:t>dove gli è possibile vedere una tabella con gli ordini effettuati, e all’interno di ogni riga sono presenti il nome e il cognome del cliente, l’indirizzo di spedizione, i prodotti ordinati e un pulsante per modificare lo stato dell’ordine. Antonio vede che un cliente ha ordinato un nuovo modello di occhiali aggiunto da poco</w:t>
+        <w:t>d</w:t>
+      </w:r>
+      <w:r>
+        <w:t>alla pagina di login</w:t>
+      </w:r>
+      <w:r>
+        <w:t>,</w:t>
+      </w:r>
+      <w:r>
+        <w:t xml:space="preserve"> </w:t>
+      </w:r>
+      <w:r>
+        <w:t xml:space="preserve">con </w:t>
+      </w:r>
+      <w:r>
+        <w:t xml:space="preserve">le proprie credenziali (email </w:t>
+      </w:r>
+      <w:r>
+        <w:t>e password</w:t>
+      </w:r>
+      <w:r>
+        <w:t>)</w:t>
+      </w:r>
+      <w:r>
+        <w:t xml:space="preserve"> di</w:t>
+      </w:r>
+      <w:r>
+        <w:t xml:space="preserve"> Order Manager, </w:t>
+      </w:r>
+      <w:r>
+        <w:t>a</w:t>
+      </w:r>
+      <w:r>
+        <w:t>ll</w:t>
+      </w:r>
+      <w:r>
+        <w:t>’</w:t>
+      </w:r>
+      <w:r>
+        <w:t xml:space="preserve">area di gestione </w:t>
+      </w:r>
+      <w:r>
+        <w:t>degli ordini</w:t>
+      </w:r>
+      <w:r>
+        <w:t xml:space="preserve">. Qui, Antonio può visualizzare l’elenco di tutti </w:t>
+      </w:r>
+      <w:r>
+        <w:t>ordini effettuati</w:t>
+      </w:r>
+      <w:r>
+        <w:t xml:space="preserve"> dai clienti. </w:t>
+      </w:r>
+    </w:p>
+    <w:p>
+      <w:pPr>
+        <w:pStyle w:val="NormaleWeb"/>
+        <w:spacing w:before="0" w:beforeAutospacing="0" w:after="0" w:afterAutospacing="0"/>
+        <w:ind w:left="709"/>
+      </w:pPr>
+      <w:r>
+        <w:t>Per ogni ordine, vengono mostrate le relative informazioni riguardanti il destinatario, come nominativo e indirizzo di spedizione,</w:t>
+      </w:r>
+      <w:r>
+        <w:t xml:space="preserve"> i prodotti ordinati</w:t>
+      </w:r>
+      <w:r>
+        <w:t>, come prezzo e modello, e lo stato dell’ordine assieme dalla data in cui è stato effettuato. Con un</w:t>
+      </w:r>
+      <w:r>
+        <w:t xml:space="preserve"> pulsante</w:t>
+      </w:r>
+      <w:r>
+        <w:t>, Antonio m</w:t>
+      </w:r>
+      <w:r>
+        <w:t>odifica lo stato dell’ordine.</w:t>
+      </w:r>
+    </w:p>
+    <w:p>
+      <w:pPr>
+        <w:pStyle w:val="NormaleWeb"/>
+        <w:spacing w:before="0" w:beforeAutospacing="0"/>
+        <w:ind w:left="709"/>
+      </w:pPr>
+      <w:r>
+        <w:t>Antonio vede che un cliente ha ordinato un nuovo modello di occhiali aggiunto da poco</w:t>
       </w:r>
       <w:r>
         <w:t>: lo stato dell’ordine è di default a “in lavorazione”</w:t>
@@ -2698,7 +3172,29 @@
         <w:t xml:space="preserve">rende </w:t>
       </w:r>
       <w:r>
-        <w:t>gli occhiali ordinati, li incarta, mette l’etichetta sul pacco e aspetta che venga spedito. Appena ottiene la conferma della spedizione del pacco aggiorna lo stato dell’ordine in “completato”</w:t>
+        <w:t xml:space="preserve">gli occhiali ordinati, li incarta, mette l’etichetta sul pacco e </w:t>
+      </w:r>
+      <w:r>
+        <w:t>lo assegna al personale incaricato della spedizione</w:t>
+      </w:r>
+      <w:r>
+        <w:t>. Appena ottiene la conferma della spedizione aggiorna lo stato dell’ordine in “</w:t>
+      </w:r>
+      <w:r>
+        <w:t>spedito</w:t>
+      </w:r>
+      <w:r>
+        <w:t>”</w:t>
+      </w:r>
+      <w:r>
+        <w:t xml:space="preserve">. Quando, invece, riceve notifica del pacco in viaggio, Antonio aggiorna </w:t>
+      </w:r>
+      <w:r>
+        <w:lastRenderedPageBreak/>
+        <w:t>nuovamente lo stato del pacco, questa volta impostandolo a “in consegna”</w:t>
+      </w:r>
+      <w:r>
+        <w:t>; una volta arrivato a destinazione, il pacco l’ordine verrà considerato “consegnato”.</w:t>
       </w:r>
     </w:p>
     <w:p>
@@ -2712,9 +3208,15 @@
       <w:r>
         <w:t xml:space="preserve"> </w:t>
       </w:r>
-      <w:bookmarkStart w:id="6" w:name="_Toc242726272"/>
-      <w:r>
-        <w:t>Scenario 3 - Attore principale: Product Manager</w:t>
+      <w:bookmarkStart w:id="6" w:name="_Toc242783795"/>
+      <w:r>
+        <w:t>Scenario 3</w:t>
+      </w:r>
+      <w:r>
+        <w:t>: Aggiunta degli occhiali</w:t>
+      </w:r>
+      <w:r>
+        <w:t xml:space="preserve"> - Attore principale: Product Manager</w:t>
       </w:r>
       <w:r>
         <w:t xml:space="preserve"> (Vittoria)</w:t>
@@ -2724,10 +3226,17 @@
     <w:p>
       <w:pPr>
         <w:pStyle w:val="NormaleWeb"/>
+        <w:spacing w:after="0" w:afterAutospacing="0"/>
         <w:ind w:left="709"/>
       </w:pPr>
       <w:r>
-        <w:t>Vittoria decide di voler portare una nuova linea di occhiali come prodotto disponibile solo sul negozio online per attrarre li nuova clientela. D</w:t>
+        <w:t>Vittoria decide di voler portare una nuova linea di occhiali come prodotto disponibile solo sul negozio online per attrarre l</w:t>
+      </w:r>
+      <w:r>
+        <w:t>a</w:t>
+      </w:r>
+      <w:r>
+        <w:t xml:space="preserve"> nuova clientela. D</w:t>
       </w:r>
       <w:r>
         <w:t xml:space="preserve">opo aver </w:t>
@@ -2736,11 +3245,7 @@
         <w:t>fissato un incontro</w:t>
       </w:r>
       <w:r>
-        <w:t xml:space="preserve"> con un </w:t>
-      </w:r>
-      <w:r>
-        <w:lastRenderedPageBreak/>
-        <w:t xml:space="preserve">fornitore, e finalizzato un accordo, ottiene la </w:t>
+        <w:t xml:space="preserve"> con un fornitore, e finalizzato un accordo, ottiene la </w:t>
       </w:r>
       <w:r>
         <w:t>nuova merce</w:t>
@@ -2773,22 +3278,104 @@
         <w:t xml:space="preserve"> </w:t>
       </w:r>
       <w:r>
-        <w:t xml:space="preserve">con nome utente e password che corrispondono al singolo ruolo di Product Manager, e viene portata alla sua area gestionale che presenta </w:t>
-      </w:r>
-      <w:r>
-        <w:t xml:space="preserve">tutti i </w:t>
-      </w:r>
-      <w:r>
-        <w:t>prodott</w:t>
+        <w:t xml:space="preserve">con </w:t>
+      </w:r>
+      <w:r>
+        <w:t>le proprie credenziali di Product Manager (email</w:t>
+      </w:r>
+      <w:r>
+        <w:t xml:space="preserve"> e password</w:t>
+      </w:r>
+      <w:r>
+        <w:t>)</w:t>
+      </w:r>
+      <w:r>
+        <w:t xml:space="preserve">, e viene portata alla sua area gestionale che presenta </w:t>
+      </w:r>
+      <w:r>
+        <w:t xml:space="preserve">un elenco di </w:t>
+      </w:r>
+      <w:r>
+        <w:t xml:space="preserve">tutti </w:t>
+      </w:r>
+      <w:r>
+        <w:t xml:space="preserve">gli occhiali acquistabili </w:t>
+      </w:r>
+      <w:r>
+        <w:t>sul sito</w:t>
+      </w:r>
+      <w:r>
+        <w:t xml:space="preserve"> con le corrispondenti informazioni (come immagine dell’occhiale, nome del modello, prezzo e</w:t>
+      </w:r>
+      <w:r>
+        <w:t xml:space="preserve"> quantità disponibil</w:t>
+      </w:r>
+      <w:r>
+        <w:t>e)</w:t>
+      </w:r>
+      <w:r>
+        <w:t>.</w:t>
+      </w:r>
+      <w:r>
+        <w:t xml:space="preserve"> Di ogni prodotto</w:t>
+      </w:r>
+      <w:r>
+        <w:t>, Vittoria</w:t>
+      </w:r>
+      <w:r>
+        <w:t xml:space="preserve"> può modificarne le caratteristiche e aggiornarne le quantità disponibile in ogni variante colore. </w:t>
+      </w:r>
+    </w:p>
+    <w:p>
+      <w:pPr>
+        <w:pStyle w:val="NormaleWeb"/>
+        <w:spacing w:before="0" w:beforeAutospacing="0"/>
+        <w:ind w:left="709"/>
+      </w:pPr>
+      <w:r>
+        <w:t>Assieme all’elenco dei prodotti, nella schermata iniziale, c’è la scheda di aggiunta per nuovi occhiali che Vittoria inizia a compilare, campo per campo, fornendo i dati</w:t>
+      </w:r>
+      <w:r>
+        <w:t>, le quantità disponibili e</w:t>
+      </w:r>
+      <w:r>
+        <w:t xml:space="preserve"> le immagini de</w:t>
       </w:r>
       <w:r>
         <w:t>i</w:t>
       </w:r>
       <w:r>
-        <w:t xml:space="preserve"> (quindi un modello di occhiale acquistabile sul sito), il nome, l’immagine, una descrizione, i colori disponibili, il prezzo e la quantità disponibile. Inoltre è presente un pulsante per aggiungere un nuovo prodotto. Clicca quest’ultimo e viene portata a una nuova pagina dove vengono presentati i suddetti campi da compilare in relazione al prodotto che si vuole aggiungere. Continua la compilazione per uno degli occhiali appartenenti alla nuova linea e infine clicca “aggiungi prodotto”</w:t>
-      </w:r>
-      <w:r>
-        <w:t>. Successivamente</w:t>
+        <w:t xml:space="preserve"> nuov</w:t>
+      </w:r>
+      <w:r>
+        <w:t>i</w:t>
+      </w:r>
+      <w:r>
+        <w:t xml:space="preserve"> prodott</w:t>
+      </w:r>
+      <w:r>
+        <w:t>i</w:t>
+      </w:r>
+      <w:r>
+        <w:t xml:space="preserve">. </w:t>
+      </w:r>
+      <w:r>
+        <w:t>Completata</w:t>
+      </w:r>
+      <w:r>
+        <w:t xml:space="preserve"> la compilazione per uno degli occhiali appartenenti alla nuova linea</w:t>
+      </w:r>
+      <w:r>
+        <w:t xml:space="preserve">, </w:t>
+      </w:r>
+      <w:r>
+        <w:t>clicca “aggiungi prodotto”</w:t>
+      </w:r>
+      <w:r>
+        <w:t>.</w:t>
+      </w:r>
+      <w:r>
+        <w:t xml:space="preserve"> Dopo esser stati validati i campi, viene mostrato a Vittoria un messaggio di corretta aggiunta dell’occhiale, che sarà immediatamente disponibili per i clienti.</w:t>
       </w:r>
     </w:p>
     <w:p>
@@ -2802,9 +3389,18 @@
       <w:r>
         <w:t xml:space="preserve"> </w:t>
       </w:r>
-      <w:bookmarkStart w:id="7" w:name="_Toc242726273"/>
-      <w:r>
-        <w:t>Scenario 4 - Attore principale: Market Analyzer</w:t>
+      <w:bookmarkStart w:id="7" w:name="_Toc242783796"/>
+      <w:r>
+        <w:t>Scenario 4</w:t>
+      </w:r>
+      <w:r>
+        <w:t>: Indagini statistiche</w:t>
+      </w:r>
+      <w:r>
+        <w:t xml:space="preserve"> - Attore principale: Market Analyzer</w:t>
+      </w:r>
+      <w:r>
+        <w:t xml:space="preserve"> (Fabio)</w:t>
       </w:r>
       <w:bookmarkEnd w:id="7"/>
     </w:p>
@@ -2814,7 +3410,40 @@
         <w:ind w:left="709"/>
       </w:pPr>
       <w:r>
-        <w:t>Il Market Analyzer ha il lavoro di analizzare le vendite e capire quali prodotti hanno avuto più successo. Accede alla sua area personale dove può vedere una tabella con i vari prodotti e accanto il numero di volte che quel prodotto è stato acquistato (in 1 settimana, 1 mese, 1 anno, è possibile filtrare). Non sono presenti in questa tabella i dati personali dei clienti</w:t>
+        <w:t>Fabio, i</w:t>
+      </w:r>
+      <w:r>
+        <w:t>l Market Analyzer</w:t>
+      </w:r>
+      <w:r>
+        <w:t xml:space="preserve">, è incaricato </w:t>
+      </w:r>
+      <w:r>
+        <w:t>di analizzare le vendite e capire quali prodotti hanno avuto più successo</w:t>
+      </w:r>
+      <w:r>
+        <w:t xml:space="preserve">. Accede alla sua area personale, con le proprie credenziali (email e password), </w:t>
+      </w:r>
+      <w:r>
+        <w:t xml:space="preserve">dove </w:t>
+      </w:r>
+      <w:r>
+        <w:t>gli viene mostrata</w:t>
+      </w:r>
+      <w:r>
+        <w:t xml:space="preserve"> una tabella con i vari prodotti e il numero di </w:t>
+      </w:r>
+      <w:r>
+        <w:t>acquisti di affianco a ognuno. Per fare indagini più accurate, Fabio inizia a filtrare i prodotti in base a periodi di tempo</w:t>
+      </w:r>
+      <w:r>
+        <w:t xml:space="preserve"> (1 settimana, 1 mese, 1 anno)</w:t>
+      </w:r>
+      <w:r>
+        <w:t>, prezzi crescenti / decrescenti (per poter fare stime sul potere di acquisto dei clienti) e valutazioni medie</w:t>
+      </w:r>
+      <w:r>
+        <w:t>. Non sono presenti in questa tabella i dati personali dei clienti</w:t>
       </w:r>
     </w:p>
     <w:p>
@@ -2827,9 +3456,9 @@
         <w:ind w:left="426" w:hanging="426"/>
         <w:jc w:val="left"/>
       </w:pPr>
-      <w:bookmarkStart w:id="8" w:name="_Toc242726274"/>
-      <w:r>
-        <w:t>REQUISITI FUNZIONALI</w:t>
+      <w:bookmarkStart w:id="8" w:name="_Toc242783797"/>
+      <w:r>
+        <w:t>FUNCTIONAL REQUIREMENTS</w:t>
       </w:r>
       <w:bookmarkEnd w:id="8"/>
     </w:p>
@@ -2842,7 +3471,34 @@
         <w:ind w:hanging="294"/>
       </w:pPr>
       <w:r>
-        <w:t>Il sistema deve consentire ai clienti di registrarsi con nome, cognome, email e password, e di effettuare il login</w:t>
+        <w:t xml:space="preserve">Il sistema deve consentire ai clienti di registrarsi </w:t>
+      </w:r>
+      <w:r>
+        <w:t>fornendo i propri dati personali</w:t>
+      </w:r>
+      <w:r>
+        <w:t xml:space="preserve"> </w:t>
+      </w:r>
+      <w:r>
+        <w:t>(</w:t>
+      </w:r>
+      <w:r>
+        <w:t>nome, cognome, email</w:t>
+      </w:r>
+      <w:r>
+        <w:t>,</w:t>
+      </w:r>
+      <w:r>
+        <w:t xml:space="preserve"> password,</w:t>
+      </w:r>
+      <w:r>
+        <w:t xml:space="preserve"> numero di telefono e indirizzo di spedizione)</w:t>
+      </w:r>
+      <w:r>
+        <w:t xml:space="preserve"> e di effettuare il login</w:t>
+      </w:r>
+      <w:r>
+        <w:t>, fornendo solamente email e password scelte.</w:t>
       </w:r>
     </w:p>
     <w:p>
@@ -2854,7 +3510,13 @@
         <w:ind w:hanging="294"/>
       </w:pPr>
       <w:r>
-        <w:t>Il cliente deve poter visualizzare e modificare le proprie informazioni personali nella sua area personale</w:t>
+        <w:t xml:space="preserve">Il cliente deve poter visualizzare e modificare le proprie informazioni </w:t>
+      </w:r>
+      <w:r>
+        <w:t>all’interno della</w:t>
+      </w:r>
+      <w:r>
+        <w:t xml:space="preserve"> sua area personale</w:t>
       </w:r>
     </w:p>
     <w:p>
@@ -2866,7 +3528,10 @@
         <w:ind w:hanging="294"/>
       </w:pPr>
       <w:r>
-        <w:t>l cliente deve poter visualizzare lo storico dei propri ordini e consultare in tempo reale lo stato degli ordini</w:t>
+        <w:t>l cliente deve poter visualizzare lo storico dei propri ordini e consultare in tempo reale lo stato d</w:t>
+      </w:r>
+      <w:r>
+        <w:t>i ognuno di essi</w:t>
       </w:r>
     </w:p>
     <w:p>
@@ -2878,7 +3543,7 @@
         <w:ind w:hanging="294"/>
       </w:pPr>
       <w:r>
-        <w:t>Il sistema deve permettere la navigazione del catalogo, e la possibilità di applicare filtri alla ricerca come per genere, forma della montatura, colore, prezzo, oppure ricercare un modello tramite la barra di ricerca, e deve poter vedere tramite un tag se un prodotto è un’esclusiva online</w:t>
+        <w:t>Il sistema deve permettere la navigazione del catalogo e la possibilità di applicare filtri alla ricerca come per genere, forma della montatura, colore, prezzo, oppure ricercare un modello tramite la barra di ricerca, e deve poter vedere tramite un tag se un prodotto è un’esclusiva online</w:t>
       </w:r>
     </w:p>
     <w:p>
@@ -2902,7 +3567,40 @@
         <w:ind w:hanging="294"/>
       </w:pPr>
       <w:r>
-        <w:t>Il cliente deve poter aggiungere/rimuovere prodotti al carrello, e nella fase di checkout deve poter inserire il proprio indirizzo di spedizione e dati di pagamento</w:t>
+        <w:t>Il cliente deve poter aggiungere/rimuovere prodotti al carrello</w:t>
+      </w:r>
+      <w:r>
+        <w:t xml:space="preserve"> e aggiornarne le quantità.</w:t>
+      </w:r>
+    </w:p>
+    <w:p>
+      <w:pPr>
+        <w:numPr>
+          <w:ilvl w:val="0"/>
+          <w:numId w:val="14"/>
+        </w:numPr>
+        <w:ind w:hanging="294"/>
+      </w:pPr>
+      <w:r>
+        <w:t>Ne</w:t>
+      </w:r>
+      <w:r>
+        <w:t>lla fase di checkout</w:t>
+      </w:r>
+      <w:r>
+        <w:t>, il cliente</w:t>
+      </w:r>
+      <w:r>
+        <w:t xml:space="preserve"> deve poter </w:t>
+      </w:r>
+      <w:r>
+        <w:t>modificare i campi mostrati (destinatario, recapito di telefono,</w:t>
+      </w:r>
+      <w:r>
+        <w:t xml:space="preserve"> indirizzo di spedizione e dati di pagamento</w:t>
+      </w:r>
+      <w:r>
+        <w:t>) con validazioni immediate sulle modifiche dei campi</w:t>
       </w:r>
       <w:r>
         <w:t>.</w:t>
@@ -2914,8 +3612,10 @@
           <w:ilvl w:val="0"/>
           <w:numId w:val="15"/>
         </w:numPr>
-      </w:pPr>
-      <w:r>
+        <w:ind w:left="709" w:hanging="283"/>
+      </w:pPr>
+      <w:r>
+        <w:lastRenderedPageBreak/>
         <w:t>Il Product Manager deve poter aggiungere nuovi modelli di occhiali al catalogo, specificando prezzi, immagini, e quantità disponibili, e classificarli come esclusiva online o scontati</w:t>
       </w:r>
     </w:p>
@@ -2925,69 +3625,34 @@
           <w:ilvl w:val="0"/>
           <w:numId w:val="15"/>
         </w:numPr>
-      </w:pPr>
-      <w:r>
-        <w:t>Il Product Manager deve poter nascondere o disattivare prodotti dal catalogo pubblico (che è come eliminare il prodotto per gli utenti con una soft delete in modo che sia disponibile comunque per lo storico)</w:t>
+        <w:ind w:left="709" w:hanging="283"/>
+      </w:pPr>
+      <w:r>
+        <w:t>Il Product Manager deve poter nascondere o disattivare prodotti dal catalogo pubblico (</w:t>
+      </w:r>
+      <w:r>
+        <w:t>equivalente a</w:t>
+      </w:r>
+      <w:r>
+        <w:t xml:space="preserve"> eliminare il prodotto per gli utenti con una soft delete in modo che sia disponibile comunque per lo storico)</w:t>
       </w:r>
     </w:p>
     <w:p>
       <w:pPr>
         <w:numPr>
           <w:ilvl w:val="0"/>
-          <w:numId w:val="16"/>
+          <w:numId w:val="15"/>
         </w:numPr>
-      </w:pPr>
-      <w:r>
-        <w:t>Il Manager degli Ordini deve accedere a una sua area gestionale che mostra i nuovi ordini ricevuti e da preparare nel negozio locale</w:t>
+        <w:ind w:left="709" w:hanging="283"/>
+      </w:pPr>
+      <w:r>
+        <w:t>L’Order Manager</w:t>
+      </w:r>
+      <w:r>
+        <w:t xml:space="preserve"> deve accedere a una sua area gestionale che mostra i nuovi ordini ricevuti e da preparare nel negozio locale</w:t>
       </w:r>
     </w:p>
     <w:p/>
-    <w:p>
-      <w:pPr>
-        <w:rPr>
-          <w:rFonts w:ascii="Calibri" w:hAnsi="Calibri" w:cs="Calibri"/>
-          <w:b/>
-          <w:bCs/>
-          <w:sz w:val="32"/>
-          <w:szCs w:val="32"/>
-        </w:rPr>
-      </w:pPr>
-    </w:p>
-    <w:p>
-      <w:pPr>
-        <w:ind w:left="426"/>
-        <w:rPr>
-          <w:rFonts w:ascii="Calibri" w:hAnsi="Calibri" w:cs="Calibri"/>
-          <w:b/>
-          <w:bCs/>
-          <w:sz w:val="32"/>
-          <w:szCs w:val="32"/>
-        </w:rPr>
-      </w:pPr>
-    </w:p>
-    <w:p>
-      <w:pPr>
-        <w:ind w:left="426"/>
-        <w:rPr>
-          <w:rFonts w:ascii="Calibri" w:hAnsi="Calibri" w:cs="Calibri"/>
-          <w:b/>
-          <w:bCs/>
-          <w:sz w:val="32"/>
-          <w:szCs w:val="32"/>
-        </w:rPr>
-      </w:pPr>
-    </w:p>
-    <w:p>
-      <w:pPr>
-        <w:rPr>
-          <w:rFonts w:ascii="Calibri" w:hAnsi="Calibri" w:cs="Calibri"/>
-          <w:b/>
-          <w:bCs/>
-          <w:sz w:val="32"/>
-          <w:szCs w:val="32"/>
-        </w:rPr>
-      </w:pPr>
-    </w:p>
     <w:p>
       <w:pPr>
         <w:pStyle w:val="Titolo"/>
@@ -2998,10 +3663,12 @@
         <w:ind w:left="426" w:hanging="426"/>
         <w:jc w:val="left"/>
       </w:pPr>
-      <w:bookmarkStart w:id="9" w:name="_Toc242726275"/>
-      <w:r>
-        <w:lastRenderedPageBreak/>
-        <w:t>REQUISITI NON FUNZIONALI</w:t>
+      <w:bookmarkStart w:id="9" w:name="_Toc242783798"/>
+      <w:r>
+        <w:t>NON</w:t>
+      </w:r>
+      <w:r>
+        <w:t>FUNCTIONAL REQUIREMENTS</w:t>
       </w:r>
       <w:bookmarkEnd w:id="9"/>
     </w:p>
@@ -3009,8 +3676,9 @@
       <w:pPr>
         <w:numPr>
           <w:ilvl w:val="0"/>
-          <w:numId w:val="21"/>
+          <w:numId w:val="24"/>
         </w:numPr>
+        <w:ind w:left="709" w:hanging="283"/>
         <w:rPr>
           <w:b/>
           <w:bCs/>
@@ -3022,13 +3690,17 @@
       <w:r>
         <w:t xml:space="preserve"> Le operazioni frequenti quali la modifica delle quantità del carello, il filtraggio dei prodotti nel catalogo o l’aggiornamento dello stato di un ordine, devono avvenire in modo asincrono, aggiornando istantaneamente solo le porzioni di schermo interessate</w:t>
       </w:r>
+      <w:r>
+        <w:t>.</w:t>
+      </w:r>
     </w:p>
     <w:p>
       <w:pPr>
         <w:numPr>
           <w:ilvl w:val="0"/>
-          <w:numId w:val="18"/>
+          <w:numId w:val="24"/>
         </w:numPr>
+        <w:ind w:left="709" w:hanging="283"/>
         <w:rPr>
           <w:b/>
           <w:bCs/>
@@ -3038,36 +3710,50 @@
         <w:t xml:space="preserve">Il sistema deve offrire un layout flessibile in grado di adattarsi automaticamente alle diverse risoluzioni e formati di schermo (smartphone, tablet, laptop e desktop). </w:t>
       </w:r>
       <w:r>
-        <w:t>Gli elementi visivi, come le schede prodotto, la tabella degli ordini e i controlli di gestione, devono riorganizzarsi per preservare leggibilità, accessibilità e facilità di tocco/click su qualsiasi dispositivo</w:t>
+        <w:t>Gli elementi visivi, come le schede prodotto, la tabella degli ordini e i controlli di gestione, devono riorganizzarsi per preservare leggibilità, accessibilità e facilità d</w:t>
+      </w:r>
+      <w:r>
+        <w:t>’uso</w:t>
+      </w:r>
+      <w:r>
+        <w:t xml:space="preserve"> su qualsiasi dispositivo</w:t>
+      </w:r>
+      <w:r>
+        <w:t>.</w:t>
       </w:r>
     </w:p>
     <w:p>
       <w:pPr>
         <w:numPr>
           <w:ilvl w:val="0"/>
-          <w:numId w:val="18"/>
+          <w:numId w:val="24"/>
         </w:numPr>
+        <w:ind w:left="709" w:hanging="283"/>
         <w:rPr>
           <w:b/>
           <w:bCs/>
         </w:rPr>
       </w:pPr>
       <w:r>
-        <w:t>Il sistema deve rendere costantemente evidente all'utente il risultato delle proprie azioni attraverso notifiche visive contestuali, come banner cromatici di conferma (suc</w:t>
+        <w:t>Il sistema deve rendere costantemente evidente all'utente il risultato delle proprie azioni attraverso notifiche visive, come banner cromatici di conferma (suc</w:t>
       </w:r>
       <w:r>
         <w:t>cesso o errore)</w:t>
       </w:r>
       <w:r>
         <w:t xml:space="preserve"> e badge di stato ben distinti</w:t>
+      </w:r>
+      <w:r>
+        <w:t>.</w:t>
       </w:r>
     </w:p>
     <w:p>
       <w:pPr>
         <w:numPr>
           <w:ilvl w:val="0"/>
-          <w:numId w:val="18"/>
+          <w:numId w:val="24"/>
         </w:numPr>
+        <w:ind w:left="709" w:hanging="283"/>
         <w:rPr>
           <w:b/>
           <w:bCs/>
@@ -3079,24 +3765,32 @@
       <w:r>
         <w:t>regole di protezione e controllo degli accessi devono riflettersi chiaramente sull'interfaccia utente. L'utente deve ricevere messaggi espliciti e comprensibili in caso di inserimento di credenziali errate, tentativi di accesso a sezioni non autorizzate o nel caso in cui stia tentando di accedere con un account sospeso o disattivato</w:t>
       </w:r>
+      <w:r>
+        <w:t>.</w:t>
+      </w:r>
     </w:p>
     <w:p>
       <w:pPr>
         <w:numPr>
           <w:ilvl w:val="0"/>
-          <w:numId w:val="18"/>
+          <w:numId w:val="24"/>
         </w:numPr>
+        <w:ind w:left="709" w:hanging="283"/>
       </w:pPr>
       <w:r>
         <w:t>Nelle situazioni in cui una schermata o un componente non presenta contenuti da mostrare (es. carrello degli acquisti vuoto, nessun ordine effettuato, nessun risultato corrispondente a un filtro di ricerca), il sistema non deve mai restituire schermate bianche o layout frammentati. Deve invece mostrare messaggi visivi descrittivi che spieghino chiaramente lo stato attuale e suggeriscano l'azione successiva da compiere</w:t>
+      </w:r>
+      <w:r>
+        <w:t>.</w:t>
       </w:r>
     </w:p>
     <w:p>
       <w:pPr>
         <w:numPr>
           <w:ilvl w:val="0"/>
-          <w:numId w:val="18"/>
+          <w:numId w:val="24"/>
         </w:numPr>
+        <w:ind w:left="709" w:hanging="283"/>
       </w:pPr>
       <w:r>
         <w:t>L'aspetto grafico</w:t>
@@ -3131,7 +3825,537 @@
       <w:r>
         <w:t xml:space="preserve"> garantendo un'esperienza omogenea a prescindere dal client utilizzato</w:t>
       </w:r>
+      <w:r>
+        <w:t>.</w:t>
+      </w:r>
     </w:p>
+    <w:p>
+      <w:pPr>
+        <w:numPr>
+          <w:ilvl w:val="0"/>
+          <w:numId w:val="24"/>
+        </w:numPr>
+        <w:ind w:left="709" w:hanging="283"/>
+      </w:pPr>
+      <w:r>
+        <w:t>Per garantire affidabilità e sicurezza dei dati sensibili dei clienti e dei dipendenti, i</w:t>
+      </w:r>
+      <w:r>
+        <w:t xml:space="preserve">l sistema deve essere in grado di resistere a specifici attacchi di sicurezza. </w:t>
+      </w:r>
+      <w:r>
+        <w:t>Vengono, pertanto, richieste all’utente la scelta di password robuste a protezione del suo account; password da dover poi criptare per i fini di sicurezza.</w:t>
+      </w:r>
+    </w:p>
+    <w:p/>
+    <w:p>
+      <w:pPr>
+        <w:pStyle w:val="Titolo"/>
+        <w:numPr>
+          <w:ilvl w:val="0"/>
+          <w:numId w:val="6"/>
+        </w:numPr>
+        <w:ind w:left="426" w:hanging="426"/>
+        <w:jc w:val="left"/>
+      </w:pPr>
+      <w:bookmarkStart w:id="10" w:name="_Toc242783799"/>
+      <w:r>
+        <w:t>TARGET ENVIRONMENT</w:t>
+      </w:r>
+      <w:bookmarkEnd w:id="10"/>
+    </w:p>
+    <w:p/>
+    <w:p>
+      <w:pPr>
+        <w:pStyle w:val="Titolo"/>
+        <w:numPr>
+          <w:ilvl w:val="0"/>
+          <w:numId w:val="6"/>
+        </w:numPr>
+        <w:ind w:left="426" w:hanging="426"/>
+        <w:jc w:val="left"/>
+      </w:pPr>
+      <w:bookmarkStart w:id="11" w:name="_Toc242783800"/>
+      <w:r>
+        <w:t>DELIVERABLE &amp; DEADLINES</w:t>
+      </w:r>
+      <w:bookmarkEnd w:id="11"/>
+    </w:p>
+    <w:tbl>
+      <w:tblPr>
+        <w:tblW w:w="0" w:type="auto"/>
+        <w:tblInd w:w="55" w:type="dxa"/>
+        <w:tblLayout w:type="fixed"/>
+        <w:tblCellMar>
+          <w:top w:w="55" w:type="dxa"/>
+          <w:left w:w="55" w:type="dxa"/>
+          <w:bottom w:w="55" w:type="dxa"/>
+          <w:right w:w="55" w:type="dxa"/>
+        </w:tblCellMar>
+        <w:tblLook w:val="0000" w:firstRow="0" w:lastRow="0" w:firstColumn="0" w:lastColumn="0" w:noHBand="0" w:noVBand="0"/>
+      </w:tblPr>
+      <w:tblGrid>
+        <w:gridCol w:w="5812"/>
+        <w:gridCol w:w="2162"/>
+      </w:tblGrid>
+      <w:tr>
+        <w:trPr>
+          <w:trHeight w:val="233"/>
+        </w:trPr>
+        <w:tc>
+          <w:tcPr>
+            <w:tcW w:w="5812" w:type="dxa"/>
+            <w:tcBorders>
+              <w:top w:val="single" w:sz="1" w:space="0" w:color="000000"/>
+              <w:left w:val="single" w:sz="1" w:space="0" w:color="000000"/>
+              <w:bottom w:val="single" w:sz="1" w:space="0" w:color="000000"/>
+            </w:tcBorders>
+          </w:tcPr>
+          <w:p>
+            <w:pPr>
+              <w:pStyle w:val="Intestazionetabella"/>
+              <w:rPr>
+                <w:szCs w:val="32"/>
+              </w:rPr>
+            </w:pPr>
+            <w:r>
+              <w:rPr>
+                <w:szCs w:val="32"/>
+              </w:rPr>
+              <w:t>Materiale di Consegna</w:t>
+            </w:r>
+          </w:p>
+        </w:tc>
+        <w:tc>
+          <w:tcPr>
+            <w:tcW w:w="2162" w:type="dxa"/>
+            <w:tcBorders>
+              <w:top w:val="single" w:sz="1" w:space="0" w:color="000000"/>
+              <w:left w:val="single" w:sz="1" w:space="0" w:color="000000"/>
+              <w:bottom w:val="single" w:sz="1" w:space="0" w:color="000000"/>
+              <w:right w:val="single" w:sz="1" w:space="0" w:color="000000"/>
+            </w:tcBorders>
+          </w:tcPr>
+          <w:p>
+            <w:pPr>
+              <w:pStyle w:val="Intestazionetabella"/>
+              <w:rPr>
+                <w:szCs w:val="32"/>
+              </w:rPr>
+            </w:pPr>
+            <w:r>
+              <w:rPr>
+                <w:szCs w:val="32"/>
+              </w:rPr>
+              <w:t>Scadenza</w:t>
+            </w:r>
+          </w:p>
+        </w:tc>
+      </w:tr>
+      <w:tr>
+        <w:trPr>
+          <w:trHeight w:val="233"/>
+        </w:trPr>
+        <w:tc>
+          <w:tcPr>
+            <w:tcW w:w="5812" w:type="dxa"/>
+            <w:tcBorders>
+              <w:left w:val="single" w:sz="1" w:space="0" w:color="000000"/>
+              <w:bottom w:val="single" w:sz="1" w:space="0" w:color="000000"/>
+            </w:tcBorders>
+          </w:tcPr>
+          <w:p>
+            <w:pPr>
+              <w:pStyle w:val="Contenutotabella"/>
+              <w:rPr>
+                <w:sz w:val="22"/>
+                <w:szCs w:val="22"/>
+              </w:rPr>
+            </w:pPr>
+            <w:proofErr w:type="spellStart"/>
+            <w:r>
+              <w:rPr>
+                <w:sz w:val="22"/>
+                <w:szCs w:val="22"/>
+              </w:rPr>
+              <w:lastRenderedPageBreak/>
+              <w:t>Problem</w:t>
+            </w:r>
+            <w:proofErr w:type="spellEnd"/>
+            <w:r>
+              <w:rPr>
+                <w:sz w:val="22"/>
+                <w:szCs w:val="22"/>
+              </w:rPr>
+              <w:t xml:space="preserve"> Statement</w:t>
+            </w:r>
+          </w:p>
+        </w:tc>
+        <w:tc>
+          <w:tcPr>
+            <w:tcW w:w="2162" w:type="dxa"/>
+            <w:tcBorders>
+              <w:left w:val="single" w:sz="1" w:space="0" w:color="000000"/>
+              <w:bottom w:val="single" w:sz="1" w:space="0" w:color="000000"/>
+              <w:right w:val="single" w:sz="1" w:space="0" w:color="000000"/>
+            </w:tcBorders>
+            <w:vAlign w:val="center"/>
+          </w:tcPr>
+          <w:p>
+            <w:pPr>
+              <w:pStyle w:val="Contenutotabella"/>
+              <w:jc w:val="center"/>
+              <w:rPr>
+                <w:sz w:val="22"/>
+                <w:szCs w:val="22"/>
+              </w:rPr>
+            </w:pPr>
+            <w:r>
+              <w:rPr>
+                <w:sz w:val="22"/>
+                <w:szCs w:val="22"/>
+              </w:rPr>
+              <w:t>15 ottobre</w:t>
+            </w:r>
+          </w:p>
+        </w:tc>
+      </w:tr>
+      <w:tr>
+        <w:trPr>
+          <w:trHeight w:val="233"/>
+        </w:trPr>
+        <w:tc>
+          <w:tcPr>
+            <w:tcW w:w="5812" w:type="dxa"/>
+            <w:tcBorders>
+              <w:left w:val="single" w:sz="1" w:space="0" w:color="000000"/>
+              <w:bottom w:val="single" w:sz="1" w:space="0" w:color="000000"/>
+            </w:tcBorders>
+          </w:tcPr>
+          <w:p>
+            <w:pPr>
+              <w:pStyle w:val="Contenutotabella"/>
+              <w:rPr>
+                <w:sz w:val="22"/>
+                <w:szCs w:val="22"/>
+              </w:rPr>
+            </w:pPr>
+            <w:r>
+              <w:rPr>
+                <w:sz w:val="22"/>
+                <w:szCs w:val="22"/>
+              </w:rPr>
+              <w:t>Requisiti e casi d’uso</w:t>
+            </w:r>
+          </w:p>
+        </w:tc>
+        <w:tc>
+          <w:tcPr>
+            <w:tcW w:w="2162" w:type="dxa"/>
+            <w:tcBorders>
+              <w:left w:val="single" w:sz="1" w:space="0" w:color="000000"/>
+              <w:bottom w:val="single" w:sz="1" w:space="0" w:color="000000"/>
+              <w:right w:val="single" w:sz="1" w:space="0" w:color="000000"/>
+            </w:tcBorders>
+            <w:vAlign w:val="center"/>
+          </w:tcPr>
+          <w:p>
+            <w:pPr>
+              <w:pStyle w:val="Contenutotabella"/>
+              <w:jc w:val="center"/>
+              <w:rPr>
+                <w:sz w:val="22"/>
+                <w:szCs w:val="22"/>
+              </w:rPr>
+            </w:pPr>
+            <w:r>
+              <w:rPr>
+                <w:sz w:val="22"/>
+                <w:szCs w:val="22"/>
+              </w:rPr>
+              <w:t>29 ottobre</w:t>
+            </w:r>
+          </w:p>
+        </w:tc>
+      </w:tr>
+      <w:tr>
+        <w:trPr>
+          <w:trHeight w:val="233"/>
+        </w:trPr>
+        <w:tc>
+          <w:tcPr>
+            <w:tcW w:w="5812" w:type="dxa"/>
+            <w:tcBorders>
+              <w:left w:val="single" w:sz="1" w:space="0" w:color="000000"/>
+              <w:bottom w:val="single" w:sz="1" w:space="0" w:color="000000"/>
+            </w:tcBorders>
+          </w:tcPr>
+          <w:p>
+            <w:pPr>
+              <w:pStyle w:val="Contenutotabella"/>
+              <w:rPr>
+                <w:sz w:val="22"/>
+                <w:szCs w:val="22"/>
+              </w:rPr>
+            </w:pPr>
+            <w:proofErr w:type="spellStart"/>
+            <w:r>
+              <w:rPr>
+                <w:sz w:val="22"/>
+                <w:szCs w:val="22"/>
+              </w:rPr>
+              <w:t>Requirements</w:t>
+            </w:r>
+            <w:proofErr w:type="spellEnd"/>
+            <w:r>
+              <w:rPr>
+                <w:sz w:val="22"/>
+                <w:szCs w:val="22"/>
+              </w:rPr>
+              <w:t xml:space="preserve"> Analysis </w:t>
+            </w:r>
+            <w:proofErr w:type="spellStart"/>
+            <w:r>
+              <w:rPr>
+                <w:sz w:val="22"/>
+                <w:szCs w:val="22"/>
+              </w:rPr>
+              <w:t>Document</w:t>
+            </w:r>
+            <w:proofErr w:type="spellEnd"/>
+          </w:p>
+        </w:tc>
+        <w:tc>
+          <w:tcPr>
+            <w:tcW w:w="2162" w:type="dxa"/>
+            <w:tcBorders>
+              <w:left w:val="single" w:sz="1" w:space="0" w:color="000000"/>
+              <w:bottom w:val="single" w:sz="1" w:space="0" w:color="000000"/>
+              <w:right w:val="single" w:sz="1" w:space="0" w:color="000000"/>
+            </w:tcBorders>
+            <w:vAlign w:val="center"/>
+          </w:tcPr>
+          <w:p>
+            <w:pPr>
+              <w:pStyle w:val="Contenutotabella"/>
+              <w:jc w:val="center"/>
+              <w:rPr>
+                <w:sz w:val="22"/>
+                <w:szCs w:val="22"/>
+              </w:rPr>
+            </w:pPr>
+            <w:r>
+              <w:rPr>
+                <w:sz w:val="22"/>
+                <w:szCs w:val="22"/>
+              </w:rPr>
+              <w:t>12 novembre</w:t>
+            </w:r>
+          </w:p>
+        </w:tc>
+      </w:tr>
+      <w:tr>
+        <w:trPr>
+          <w:trHeight w:val="233"/>
+        </w:trPr>
+        <w:tc>
+          <w:tcPr>
+            <w:tcW w:w="5812" w:type="dxa"/>
+            <w:tcBorders>
+              <w:left w:val="single" w:sz="1" w:space="0" w:color="000000"/>
+              <w:bottom w:val="single" w:sz="1" w:space="0" w:color="000000"/>
+            </w:tcBorders>
+          </w:tcPr>
+          <w:p>
+            <w:pPr>
+              <w:pStyle w:val="Contenutotabella"/>
+              <w:rPr>
+                <w:sz w:val="22"/>
+                <w:szCs w:val="22"/>
+              </w:rPr>
+            </w:pPr>
+            <w:r>
+              <w:rPr>
+                <w:sz w:val="22"/>
+                <w:szCs w:val="22"/>
+              </w:rPr>
+              <w:t xml:space="preserve">System Design </w:t>
+            </w:r>
+            <w:proofErr w:type="spellStart"/>
+            <w:r>
+              <w:rPr>
+                <w:sz w:val="22"/>
+                <w:szCs w:val="22"/>
+              </w:rPr>
+              <w:t>Document</w:t>
+            </w:r>
+            <w:proofErr w:type="spellEnd"/>
+          </w:p>
+        </w:tc>
+        <w:tc>
+          <w:tcPr>
+            <w:tcW w:w="2162" w:type="dxa"/>
+            <w:tcBorders>
+              <w:left w:val="single" w:sz="1" w:space="0" w:color="000000"/>
+              <w:bottom w:val="single" w:sz="1" w:space="0" w:color="000000"/>
+              <w:right w:val="single" w:sz="1" w:space="0" w:color="000000"/>
+            </w:tcBorders>
+            <w:vAlign w:val="center"/>
+          </w:tcPr>
+          <w:p>
+            <w:pPr>
+              <w:pStyle w:val="Contenutotabella"/>
+              <w:jc w:val="center"/>
+              <w:rPr>
+                <w:sz w:val="22"/>
+                <w:szCs w:val="22"/>
+              </w:rPr>
+            </w:pPr>
+            <w:r>
+              <w:rPr>
+                <w:sz w:val="22"/>
+                <w:szCs w:val="22"/>
+              </w:rPr>
+              <w:t>26 novembre</w:t>
+            </w:r>
+          </w:p>
+        </w:tc>
+      </w:tr>
+      <w:tr>
+        <w:trPr>
+          <w:trHeight w:val="233"/>
+        </w:trPr>
+        <w:tc>
+          <w:tcPr>
+            <w:tcW w:w="5812" w:type="dxa"/>
+            <w:tcBorders>
+              <w:left w:val="single" w:sz="1" w:space="0" w:color="000000"/>
+              <w:bottom w:val="single" w:sz="1" w:space="0" w:color="000000"/>
+            </w:tcBorders>
+          </w:tcPr>
+          <w:p>
+            <w:pPr>
+              <w:pStyle w:val="Contenutotabella"/>
+              <w:rPr>
+                <w:sz w:val="22"/>
+                <w:szCs w:val="22"/>
+              </w:rPr>
+            </w:pPr>
+            <w:r>
+              <w:rPr>
+                <w:sz w:val="22"/>
+                <w:szCs w:val="22"/>
+              </w:rPr>
+              <w:t xml:space="preserve">Specifica delle interfacce dei moduli del sottosistema da implementare (parte dell’Object Design </w:t>
+            </w:r>
+            <w:proofErr w:type="spellStart"/>
+            <w:r>
+              <w:rPr>
+                <w:sz w:val="22"/>
+                <w:szCs w:val="22"/>
+              </w:rPr>
+              <w:t>Document</w:t>
+            </w:r>
+            <w:proofErr w:type="spellEnd"/>
+            <w:r>
+              <w:rPr>
+                <w:sz w:val="22"/>
+                <w:szCs w:val="22"/>
+              </w:rPr>
+              <w:t>)</w:t>
+            </w:r>
+          </w:p>
+        </w:tc>
+        <w:tc>
+          <w:tcPr>
+            <w:tcW w:w="2162" w:type="dxa"/>
+            <w:tcBorders>
+              <w:left w:val="single" w:sz="1" w:space="0" w:color="000000"/>
+              <w:bottom w:val="single" w:sz="1" w:space="0" w:color="000000"/>
+              <w:right w:val="single" w:sz="1" w:space="0" w:color="000000"/>
+            </w:tcBorders>
+            <w:vAlign w:val="center"/>
+          </w:tcPr>
+          <w:p>
+            <w:pPr>
+              <w:pStyle w:val="Contenutotabella"/>
+              <w:jc w:val="center"/>
+              <w:rPr>
+                <w:sz w:val="22"/>
+                <w:szCs w:val="22"/>
+              </w:rPr>
+            </w:pPr>
+            <w:r>
+              <w:rPr>
+                <w:sz w:val="22"/>
+                <w:szCs w:val="22"/>
+              </w:rPr>
+              <w:t>17 dicembre</w:t>
+            </w:r>
+          </w:p>
+        </w:tc>
+      </w:tr>
+      <w:tr>
+        <w:trPr>
+          <w:trHeight w:val="233"/>
+        </w:trPr>
+        <w:tc>
+          <w:tcPr>
+            <w:tcW w:w="5812" w:type="dxa"/>
+            <w:tcBorders>
+              <w:left w:val="single" w:sz="1" w:space="0" w:color="000000"/>
+              <w:bottom w:val="single" w:sz="1" w:space="0" w:color="000000"/>
+            </w:tcBorders>
+          </w:tcPr>
+          <w:p>
+            <w:pPr>
+              <w:pStyle w:val="Contenutotabella"/>
+              <w:rPr>
+                <w:sz w:val="22"/>
+                <w:szCs w:val="22"/>
+              </w:rPr>
+            </w:pPr>
+            <w:r>
+              <w:rPr>
+                <w:sz w:val="22"/>
+                <w:szCs w:val="22"/>
+              </w:rPr>
+              <w:t>Piano di test di sistema e specifica dei casi di test per il sottosistema da implementare</w:t>
+            </w:r>
+          </w:p>
+        </w:tc>
+        <w:tc>
+          <w:tcPr>
+            <w:tcW w:w="2162" w:type="dxa"/>
+            <w:tcBorders>
+              <w:left w:val="single" w:sz="1" w:space="0" w:color="000000"/>
+              <w:bottom w:val="single" w:sz="1" w:space="0" w:color="000000"/>
+              <w:right w:val="single" w:sz="1" w:space="0" w:color="000000"/>
+            </w:tcBorders>
+            <w:vAlign w:val="center"/>
+          </w:tcPr>
+          <w:p>
+            <w:pPr>
+              <w:pStyle w:val="Contenutotabella"/>
+              <w:jc w:val="center"/>
+              <w:rPr>
+                <w:sz w:val="22"/>
+                <w:szCs w:val="22"/>
+              </w:rPr>
+            </w:pPr>
+            <w:r>
+              <w:rPr>
+                <w:sz w:val="22"/>
+                <w:szCs w:val="22"/>
+              </w:rPr>
+              <w:t>17 dicembre</w:t>
+            </w:r>
+          </w:p>
+        </w:tc>
+      </w:tr>
+    </w:tbl>
+    <w:p/>
+    <w:p/>
     <w:p/>
     <w:p/>
     <w:p/>
@@ -3177,7 +4401,7 @@
 </file>
 
 <file path=word/endnotes.xml><?xml version="1.0" encoding="utf-8"?>
-<w:endnotes xmlns:wpc="http://schemas.microsoft.com/office/word/2010/wordprocessingCanvas" xmlns:cx="http://schemas.microsoft.com/office/drawing/2014/chartex" xmlns:cx1="http://schemas.microsoft.com/office/drawing/2015/9/8/chartex" xmlns:cx2="http://schemas.microsoft.com/office/drawing/2015/10/21/chartex" xmlns:cx3="http://schemas.microsoft.com/office/drawing/2016/5/9/chartex" xmlns:cx4="http://schemas.microsoft.com/office/drawing/2016/5/10/chartex" xmlns:cx5="http://schemas.microsoft.com/office/drawing/2016/5/11/chartex" xmlns:cx6="http://schemas.microsoft.com/office/drawing/2016/5/12/chartex" xmlns:cx7="http://schemas.microsoft.com/office/drawing/2016/5/13/chartex" xmlns:cx8="http://schemas.microsoft.com/office/drawing/2016/5/14/chartex" xmlns:mc="http://schemas.openxmlformats.org/markup-compatibility/2006" xmlns:m="http://schemas.openxmlformats.org/officeDocument/2006/math" xmlns:aink="http://schemas.microsoft.com/office/drawing/2016/ink" xmlns:am3d="http://schemas.microsoft.com/office/drawing/2017/model3d" xmlns:oel="http://schemas.microsoft.com/office/2019/extlst" xmlns:r="http://schemas.openxmlformats.org/officeDocument/2006/relationships" xmlns:wp14="http://schemas.microsoft.com/office/word/2010/wordprocessingDrawing" xmlns:wp="http://schemas.openxmlformats.org/drawingml/2006/wordprocessingDrawing" xmlns:wpg="http://schemas.microsoft.com/office/word/2010/wordprocessingGroup" xmlns:wpi="http://schemas.microsoft.com/office/word/2010/wordprocessingInk" xmlns:wps="http://schemas.microsoft.com/office/word/2010/wordprocessingShape" xmlns:o="urn:schemas-microsoft-com:office:office" xmlns:v="urn:schemas-microsoft-com:vml" xmlns:w10="urn:schemas-microsoft-com:office:word" xmlns:w="http://schemas.openxmlformats.org/wordprocessingml/2006/main" xmlns:w14="http://schemas.microsoft.com/office/word/2010/wordml" xmlns:w15="http://schemas.microsoft.com/office/word/2012/wordml" xmlns:w16cex="http://schemas.microsoft.com/office/word/2018/wordml/cex" xmlns:w16cid="http://schemas.microsoft.com/office/word/2016/wordml/cid" xmlns:w16="http://schemas.microsoft.com/office/word/2018/wordml" xmlns:w16sdtdh="http://schemas.microsoft.com/office/word/2020/wordml/sdtdatahash" xmlns:w16sdtfl="http://schemas.microsoft.com/office/word/2024/wordml/sdtformatlock" xmlns:w16se="http://schemas.microsoft.com/office/word/2015/wordml/symex" xmlns:w16du="http://schemas.microsoft.com/office/word/2023/wordml/word16du" xmlns:wne="http://schemas.microsoft.com/office/word/2006/wordml" mc:Ignorable="w14 w15 w16se w16cid w16 w16cex w16sdtdh w16sdtfl w16du wp14">
+<w:endnotes xmlns:wpc="http://schemas.microsoft.com/office/word/2010/wordprocessingCanvas" xmlns:cx="http://schemas.microsoft.com/office/drawing/2014/chartex" xmlns:cx1="http://schemas.microsoft.com/office/drawing/2015/9/8/chartex" xmlns:cx2="http://schemas.microsoft.com/office/drawing/2015/10/21/chartex" xmlns:cx3="http://schemas.microsoft.com/office/drawing/2016/5/9/chartex" xmlns:cx4="http://schemas.microsoft.com/office/drawing/2016/5/10/chartex" xmlns:cx5="http://schemas.microsoft.com/office/drawing/2016/5/11/chartex" xmlns:cx6="http://schemas.microsoft.com/office/drawing/2016/5/12/chartex" xmlns:cx7="http://schemas.microsoft.com/office/drawing/2016/5/13/chartex" xmlns:cx8="http://schemas.microsoft.com/office/drawing/2016/5/14/chartex" xmlns:mc="http://schemas.openxmlformats.org/markup-compatibility/2006" xmlns:aink="http://schemas.microsoft.com/office/drawing/2016/ink" xmlns:am3d="http://schemas.microsoft.com/office/drawing/2017/model3d" xmlns:o="urn:schemas-microsoft-com:office:office" xmlns:oel="http://schemas.microsoft.com/office/2019/extlst" xmlns:r="http://schemas.openxmlformats.org/officeDocument/2006/relationships" xmlns:m="http://schemas.openxmlformats.org/officeDocument/2006/math" xmlns:v="urn:schemas-microsoft-com:vml" xmlns:wp14="http://schemas.microsoft.com/office/word/2010/wordprocessingDrawing" xmlns:wp="http://schemas.openxmlformats.org/drawingml/2006/wordprocessingDrawing" xmlns:w10="urn:schemas-microsoft-com:office:word" xmlns:w="http://schemas.openxmlformats.org/wordprocessingml/2006/main" xmlns:w14="http://schemas.microsoft.com/office/word/2010/wordml" xmlns:w15="http://schemas.microsoft.com/office/word/2012/wordml" xmlns:w16cex="http://schemas.microsoft.com/office/word/2018/wordml/cex" xmlns:w16cid="http://schemas.microsoft.com/office/word/2016/wordml/cid" xmlns:w16="http://schemas.microsoft.com/office/word/2018/wordml" xmlns:w16du="http://schemas.microsoft.com/office/word/2023/wordml/word16du" xmlns:w16sdtdh="http://schemas.microsoft.com/office/word/2020/wordml/sdtdatahash" xmlns:w16sdtfl="http://schemas.microsoft.com/office/word/2024/wordml/sdtformatlock" xmlns:w16se="http://schemas.microsoft.com/office/word/2015/wordml/symex" xmlns:wpg="http://schemas.microsoft.com/office/word/2010/wordprocessingGroup" xmlns:wpi="http://schemas.microsoft.com/office/word/2010/wordprocessingInk" xmlns:wne="http://schemas.microsoft.com/office/word/2006/wordml" xmlns:wps="http://schemas.microsoft.com/office/word/2010/wordprocessingShape" mc:Ignorable="w14 w15 w16se w16cid w16 w16cex w16sdtdh w16sdtfl w16du wp14">
   <w:endnote w:type="separator" w:id="-1">
     <w:p>
       <w:r>
@@ -3196,7 +4420,7 @@
 </file>
 
 <file path=word/footer1.xml><?xml version="1.0" encoding="utf-8"?>
-<w:ftr xmlns:wpc="http://schemas.microsoft.com/office/word/2010/wordprocessingCanvas" xmlns:cx="http://schemas.microsoft.com/office/drawing/2014/chartex" xmlns:cx1="http://schemas.microsoft.com/office/drawing/2015/9/8/chartex" xmlns:cx2="http://schemas.microsoft.com/office/drawing/2015/10/21/chartex" xmlns:cx3="http://schemas.microsoft.com/office/drawing/2016/5/9/chartex" xmlns:cx4="http://schemas.microsoft.com/office/drawing/2016/5/10/chartex" xmlns:cx5="http://schemas.microsoft.com/office/drawing/2016/5/11/chartex" xmlns:cx6="http://schemas.microsoft.com/office/drawing/2016/5/12/chartex" xmlns:cx7="http://schemas.microsoft.com/office/drawing/2016/5/13/chartex" xmlns:cx8="http://schemas.microsoft.com/office/drawing/2016/5/14/chartex" xmlns:mc="http://schemas.openxmlformats.org/markup-compatibility/2006" xmlns:m="http://schemas.openxmlformats.org/officeDocument/2006/math" xmlns:aink="http://schemas.microsoft.com/office/drawing/2016/ink" xmlns:am3d="http://schemas.microsoft.com/office/drawing/2017/model3d" xmlns:oel="http://schemas.microsoft.com/office/2019/extlst" xmlns:r="http://schemas.openxmlformats.org/officeDocument/2006/relationships" xmlns:wp14="http://schemas.microsoft.com/office/word/2010/wordprocessingDrawing" xmlns:wp="http://schemas.openxmlformats.org/drawingml/2006/wordprocessingDrawing" xmlns:wpg="http://schemas.microsoft.com/office/word/2010/wordprocessingGroup" xmlns:wpi="http://schemas.microsoft.com/office/word/2010/wordprocessingInk" xmlns:wps="http://schemas.microsoft.com/office/word/2010/wordprocessingShape" xmlns:o="urn:schemas-microsoft-com:office:office" xmlns:v="urn:schemas-microsoft-com:vml" xmlns:w10="urn:schemas-microsoft-com:office:word" xmlns:w="http://schemas.openxmlformats.org/wordprocessingml/2006/main" xmlns:w14="http://schemas.microsoft.com/office/word/2010/wordml" xmlns:w15="http://schemas.microsoft.com/office/word/2012/wordml" xmlns:w16cex="http://schemas.microsoft.com/office/word/2018/wordml/cex" xmlns:w16cid="http://schemas.microsoft.com/office/word/2016/wordml/cid" xmlns:w16="http://schemas.microsoft.com/office/word/2018/wordml" xmlns:w16sdtdh="http://schemas.microsoft.com/office/word/2020/wordml/sdtdatahash" xmlns:w16sdtfl="http://schemas.microsoft.com/office/word/2024/wordml/sdtformatlock" xmlns:w16se="http://schemas.microsoft.com/office/word/2015/wordml/symex" xmlns:w16du="http://schemas.microsoft.com/office/word/2023/wordml/word16du" xmlns:wne="http://schemas.microsoft.com/office/word/2006/wordml" mc:Ignorable="w14 w15 w16se w16cid w16 w16cex w16sdtdh w16sdtfl w16du wp14">
+<w:ftr xmlns:wpc="http://schemas.microsoft.com/office/word/2010/wordprocessingCanvas" xmlns:cx="http://schemas.microsoft.com/office/drawing/2014/chartex" xmlns:cx1="http://schemas.microsoft.com/office/drawing/2015/9/8/chartex" xmlns:cx2="http://schemas.microsoft.com/office/drawing/2015/10/21/chartex" xmlns:cx3="http://schemas.microsoft.com/office/drawing/2016/5/9/chartex" xmlns:cx4="http://schemas.microsoft.com/office/drawing/2016/5/10/chartex" xmlns:cx5="http://schemas.microsoft.com/office/drawing/2016/5/11/chartex" xmlns:cx6="http://schemas.microsoft.com/office/drawing/2016/5/12/chartex" xmlns:cx7="http://schemas.microsoft.com/office/drawing/2016/5/13/chartex" xmlns:cx8="http://schemas.microsoft.com/office/drawing/2016/5/14/chartex" xmlns:mc="http://schemas.openxmlformats.org/markup-compatibility/2006" xmlns:aink="http://schemas.microsoft.com/office/drawing/2016/ink" xmlns:am3d="http://schemas.microsoft.com/office/drawing/2017/model3d" xmlns:o="urn:schemas-microsoft-com:office:office" xmlns:oel="http://schemas.microsoft.com/office/2019/extlst" xmlns:r="http://schemas.openxmlformats.org/officeDocument/2006/relationships" xmlns:m="http://schemas.openxmlformats.org/officeDocument/2006/math" xmlns:v="urn:schemas-microsoft-com:vml" xmlns:wp14="http://schemas.microsoft.com/office/word/2010/wordprocessingDrawing" xmlns:wp="http://schemas.openxmlformats.org/drawingml/2006/wordprocessingDrawing" xmlns:w10="urn:schemas-microsoft-com:office:word" xmlns:w="http://schemas.openxmlformats.org/wordprocessingml/2006/main" xmlns:w14="http://schemas.microsoft.com/office/word/2010/wordml" xmlns:w15="http://schemas.microsoft.com/office/word/2012/wordml" xmlns:w16cex="http://schemas.microsoft.com/office/word/2018/wordml/cex" xmlns:w16cid="http://schemas.microsoft.com/office/word/2016/wordml/cid" xmlns:w16="http://schemas.microsoft.com/office/word/2018/wordml" xmlns:w16du="http://schemas.microsoft.com/office/word/2023/wordml/word16du" xmlns:w16sdtdh="http://schemas.microsoft.com/office/word/2020/wordml/sdtdatahash" xmlns:w16sdtfl="http://schemas.microsoft.com/office/word/2024/wordml/sdtformatlock" xmlns:w16se="http://schemas.microsoft.com/office/word/2015/wordml/symex" xmlns:wpg="http://schemas.microsoft.com/office/word/2010/wordprocessingGroup" xmlns:wpi="http://schemas.microsoft.com/office/word/2010/wordprocessingInk" xmlns:wne="http://schemas.microsoft.com/office/word/2006/wordml" xmlns:wps="http://schemas.microsoft.com/office/word/2010/wordprocessingShape" mc:Ignorable="w14 w15 w16se w16cid w16 w16cex w16sdtdh w16sdtfl w16du wp14">
   <w:tbl>
     <w:tblPr>
       <w:tblW w:w="0" w:type="auto"/>
@@ -3364,31 +4588,31 @@
 </file>
 
 <file path=word/footer2.xml><?xml version="1.0" encoding="utf-8"?>
-<w:ftr xmlns:wpc="http://schemas.microsoft.com/office/word/2010/wordprocessingCanvas" xmlns:cx="http://schemas.microsoft.com/office/drawing/2014/chartex" xmlns:cx1="http://schemas.microsoft.com/office/drawing/2015/9/8/chartex" xmlns:cx2="http://schemas.microsoft.com/office/drawing/2015/10/21/chartex" xmlns:cx3="http://schemas.microsoft.com/office/drawing/2016/5/9/chartex" xmlns:cx4="http://schemas.microsoft.com/office/drawing/2016/5/10/chartex" xmlns:cx5="http://schemas.microsoft.com/office/drawing/2016/5/11/chartex" xmlns:cx6="http://schemas.microsoft.com/office/drawing/2016/5/12/chartex" xmlns:cx7="http://schemas.microsoft.com/office/drawing/2016/5/13/chartex" xmlns:cx8="http://schemas.microsoft.com/office/drawing/2016/5/14/chartex" xmlns:mc="http://schemas.openxmlformats.org/markup-compatibility/2006" xmlns:m="http://schemas.openxmlformats.org/officeDocument/2006/math" xmlns:aink="http://schemas.microsoft.com/office/drawing/2016/ink" xmlns:am3d="http://schemas.microsoft.com/office/drawing/2017/model3d" xmlns:oel="http://schemas.microsoft.com/office/2019/extlst" xmlns:r="http://schemas.openxmlformats.org/officeDocument/2006/relationships" xmlns:wp14="http://schemas.microsoft.com/office/word/2010/wordprocessingDrawing" xmlns:wp="http://schemas.openxmlformats.org/drawingml/2006/wordprocessingDrawing" xmlns:wpg="http://schemas.microsoft.com/office/word/2010/wordprocessingGroup" xmlns:wpi="http://schemas.microsoft.com/office/word/2010/wordprocessingInk" xmlns:wps="http://schemas.microsoft.com/office/word/2010/wordprocessingShape" xmlns:o="urn:schemas-microsoft-com:office:office" xmlns:v="urn:schemas-microsoft-com:vml" xmlns:w10="urn:schemas-microsoft-com:office:word" xmlns:w="http://schemas.openxmlformats.org/wordprocessingml/2006/main" xmlns:w14="http://schemas.microsoft.com/office/word/2010/wordml" xmlns:w15="http://schemas.microsoft.com/office/word/2012/wordml" xmlns:w16cex="http://schemas.microsoft.com/office/word/2018/wordml/cex" xmlns:w16cid="http://schemas.microsoft.com/office/word/2016/wordml/cid" xmlns:w16="http://schemas.microsoft.com/office/word/2018/wordml" xmlns:w16sdtdh="http://schemas.microsoft.com/office/word/2020/wordml/sdtdatahash" xmlns:w16sdtfl="http://schemas.microsoft.com/office/word/2024/wordml/sdtformatlock" xmlns:w16se="http://schemas.microsoft.com/office/word/2015/wordml/symex" xmlns:w16du="http://schemas.microsoft.com/office/word/2023/wordml/word16du" xmlns:wne="http://schemas.microsoft.com/office/word/2006/wordml" mc:Ignorable="w14 w15 w16se w16cid w16 w16cex w16sdtdh w16sdtfl w16du wp14">
+<w:ftr xmlns:wpc="http://schemas.microsoft.com/office/word/2010/wordprocessingCanvas" xmlns:cx="http://schemas.microsoft.com/office/drawing/2014/chartex" xmlns:cx1="http://schemas.microsoft.com/office/drawing/2015/9/8/chartex" xmlns:cx2="http://schemas.microsoft.com/office/drawing/2015/10/21/chartex" xmlns:cx3="http://schemas.microsoft.com/office/drawing/2016/5/9/chartex" xmlns:cx4="http://schemas.microsoft.com/office/drawing/2016/5/10/chartex" xmlns:cx5="http://schemas.microsoft.com/office/drawing/2016/5/11/chartex" xmlns:cx6="http://schemas.microsoft.com/office/drawing/2016/5/12/chartex" xmlns:cx7="http://schemas.microsoft.com/office/drawing/2016/5/13/chartex" xmlns:cx8="http://schemas.microsoft.com/office/drawing/2016/5/14/chartex" xmlns:mc="http://schemas.openxmlformats.org/markup-compatibility/2006" xmlns:aink="http://schemas.microsoft.com/office/drawing/2016/ink" xmlns:am3d="http://schemas.microsoft.com/office/drawing/2017/model3d" xmlns:o="urn:schemas-microsoft-com:office:office" xmlns:oel="http://schemas.microsoft.com/office/2019/extlst" xmlns:r="http://schemas.openxmlformats.org/officeDocument/2006/relationships" xmlns:m="http://schemas.openxmlformats.org/officeDocument/2006/math" xmlns:v="urn:schemas-microsoft-com:vml" xmlns:wp14="http://schemas.microsoft.com/office/word/2010/wordprocessingDrawing" xmlns:wp="http://schemas.openxmlformats.org/drawingml/2006/wordprocessingDrawing" xmlns:w10="urn:schemas-microsoft-com:office:word" xmlns:w="http://schemas.openxmlformats.org/wordprocessingml/2006/main" xmlns:w14="http://schemas.microsoft.com/office/word/2010/wordml" xmlns:w15="http://schemas.microsoft.com/office/word/2012/wordml" xmlns:w16cex="http://schemas.microsoft.com/office/word/2018/wordml/cex" xmlns:w16cid="http://schemas.microsoft.com/office/word/2016/wordml/cid" xmlns:w16="http://schemas.microsoft.com/office/word/2018/wordml" xmlns:w16du="http://schemas.microsoft.com/office/word/2023/wordml/word16du" xmlns:w16sdtdh="http://schemas.microsoft.com/office/word/2020/wordml/sdtdatahash" xmlns:w16sdtfl="http://schemas.microsoft.com/office/word/2024/wordml/sdtformatlock" xmlns:w16se="http://schemas.microsoft.com/office/word/2015/wordml/symex" xmlns:wpg="http://schemas.microsoft.com/office/word/2010/wordprocessingGroup" xmlns:wpi="http://schemas.microsoft.com/office/word/2010/wordprocessingInk" xmlns:wne="http://schemas.microsoft.com/office/word/2006/wordml" xmlns:wps="http://schemas.microsoft.com/office/word/2010/wordprocessingShape" mc:Ignorable="w14 w15 w16se w16cid w16 w16cex w16sdtdh w16sdtfl w16du wp14">
   <w:p/>
 </w:ftr>
 </file>
 
 <file path=word/footer3.xml><?xml version="1.0" encoding="utf-8"?>
-<w:ftr xmlns:wpc="http://schemas.microsoft.com/office/word/2010/wordprocessingCanvas" xmlns:cx="http://schemas.microsoft.com/office/drawing/2014/chartex" xmlns:cx1="http://schemas.microsoft.com/office/drawing/2015/9/8/chartex" xmlns:cx2="http://schemas.microsoft.com/office/drawing/2015/10/21/chartex" xmlns:cx3="http://schemas.microsoft.com/office/drawing/2016/5/9/chartex" xmlns:cx4="http://schemas.microsoft.com/office/drawing/2016/5/10/chartex" xmlns:cx5="http://schemas.microsoft.com/office/drawing/2016/5/11/chartex" xmlns:cx6="http://schemas.microsoft.com/office/drawing/2016/5/12/chartex" xmlns:cx7="http://schemas.microsoft.com/office/drawing/2016/5/13/chartex" xmlns:cx8="http://schemas.microsoft.com/office/drawing/2016/5/14/chartex" xmlns:mc="http://schemas.openxmlformats.org/markup-compatibility/2006" xmlns:m="http://schemas.openxmlformats.org/officeDocument/2006/math" xmlns:aink="http://schemas.microsoft.com/office/drawing/2016/ink" xmlns:am3d="http://schemas.microsoft.com/office/drawing/2017/model3d" xmlns:oel="http://schemas.microsoft.com/office/2019/extlst" xmlns:r="http://schemas.openxmlformats.org/officeDocument/2006/relationships" xmlns:wp14="http://schemas.microsoft.com/office/word/2010/wordprocessingDrawing" xmlns:wp="http://schemas.openxmlformats.org/drawingml/2006/wordprocessingDrawing" xmlns:wpg="http://schemas.microsoft.com/office/word/2010/wordprocessingGroup" xmlns:wpi="http://schemas.microsoft.com/office/word/2010/wordprocessingInk" xmlns:wps="http://schemas.microsoft.com/office/word/2010/wordprocessingShape" xmlns:o="urn:schemas-microsoft-com:office:office" xmlns:v="urn:schemas-microsoft-com:vml" xmlns:w10="urn:schemas-microsoft-com:office:word" xmlns:w="http://schemas.openxmlformats.org/wordprocessingml/2006/main" xmlns:w14="http://schemas.microsoft.com/office/word/2010/wordml" xmlns:w15="http://schemas.microsoft.com/office/word/2012/wordml" xmlns:w16cex="http://schemas.microsoft.com/office/word/2018/wordml/cex" xmlns:w16cid="http://schemas.microsoft.com/office/word/2016/wordml/cid" xmlns:w16="http://schemas.microsoft.com/office/word/2018/wordml" xmlns:w16sdtdh="http://schemas.microsoft.com/office/word/2020/wordml/sdtdatahash" xmlns:w16sdtfl="http://schemas.microsoft.com/office/word/2024/wordml/sdtformatlock" xmlns:w16se="http://schemas.microsoft.com/office/word/2015/wordml/symex" xmlns:w16du="http://schemas.microsoft.com/office/word/2023/wordml/word16du" xmlns:wne="http://schemas.microsoft.com/office/word/2006/wordml" mc:Ignorable="w14 w15 w16se w16cid w16 w16cex w16sdtdh w16sdtfl w16du wp14">
+<w:ftr xmlns:wpc="http://schemas.microsoft.com/office/word/2010/wordprocessingCanvas" xmlns:cx="http://schemas.microsoft.com/office/drawing/2014/chartex" xmlns:cx1="http://schemas.microsoft.com/office/drawing/2015/9/8/chartex" xmlns:cx2="http://schemas.microsoft.com/office/drawing/2015/10/21/chartex" xmlns:cx3="http://schemas.microsoft.com/office/drawing/2016/5/9/chartex" xmlns:cx4="http://schemas.microsoft.com/office/drawing/2016/5/10/chartex" xmlns:cx5="http://schemas.microsoft.com/office/drawing/2016/5/11/chartex" xmlns:cx6="http://schemas.microsoft.com/office/drawing/2016/5/12/chartex" xmlns:cx7="http://schemas.microsoft.com/office/drawing/2016/5/13/chartex" xmlns:cx8="http://schemas.microsoft.com/office/drawing/2016/5/14/chartex" xmlns:mc="http://schemas.openxmlformats.org/markup-compatibility/2006" xmlns:aink="http://schemas.microsoft.com/office/drawing/2016/ink" xmlns:am3d="http://schemas.microsoft.com/office/drawing/2017/model3d" xmlns:o="urn:schemas-microsoft-com:office:office" xmlns:oel="http://schemas.microsoft.com/office/2019/extlst" xmlns:r="http://schemas.openxmlformats.org/officeDocument/2006/relationships" xmlns:m="http://schemas.openxmlformats.org/officeDocument/2006/math" xmlns:v="urn:schemas-microsoft-com:vml" xmlns:wp14="http://schemas.microsoft.com/office/word/2010/wordprocessingDrawing" xmlns:wp="http://schemas.openxmlformats.org/drawingml/2006/wordprocessingDrawing" xmlns:w10="urn:schemas-microsoft-com:office:word" xmlns:w="http://schemas.openxmlformats.org/wordprocessingml/2006/main" xmlns:w14="http://schemas.microsoft.com/office/word/2010/wordml" xmlns:w15="http://schemas.microsoft.com/office/word/2012/wordml" xmlns:w16cex="http://schemas.microsoft.com/office/word/2018/wordml/cex" xmlns:w16cid="http://schemas.microsoft.com/office/word/2016/wordml/cid" xmlns:w16="http://schemas.microsoft.com/office/word/2018/wordml" xmlns:w16du="http://schemas.microsoft.com/office/word/2023/wordml/word16du" xmlns:w16sdtdh="http://schemas.microsoft.com/office/word/2020/wordml/sdtdatahash" xmlns:w16sdtfl="http://schemas.microsoft.com/office/word/2024/wordml/sdtformatlock" xmlns:w16se="http://schemas.microsoft.com/office/word/2015/wordml/symex" xmlns:wpg="http://schemas.microsoft.com/office/word/2010/wordprocessingGroup" xmlns:wpi="http://schemas.microsoft.com/office/word/2010/wordprocessingInk" xmlns:wne="http://schemas.microsoft.com/office/word/2006/wordml" xmlns:wps="http://schemas.microsoft.com/office/word/2010/wordprocessingShape" mc:Ignorable="w14 w15 w16se w16cid w16 w16cex w16sdtdh w16sdtfl w16du wp14">
   <w:p/>
 </w:ftr>
 </file>
 
 <file path=word/footer4.xml><?xml version="1.0" encoding="utf-8"?>
-<w:ftr xmlns:wpc="http://schemas.microsoft.com/office/word/2010/wordprocessingCanvas" xmlns:cx="http://schemas.microsoft.com/office/drawing/2014/chartex" xmlns:cx1="http://schemas.microsoft.com/office/drawing/2015/9/8/chartex" xmlns:cx2="http://schemas.microsoft.com/office/drawing/2015/10/21/chartex" xmlns:cx3="http://schemas.microsoft.com/office/drawing/2016/5/9/chartex" xmlns:cx4="http://schemas.microsoft.com/office/drawing/2016/5/10/chartex" xmlns:cx5="http://schemas.microsoft.com/office/drawing/2016/5/11/chartex" xmlns:cx6="http://schemas.microsoft.com/office/drawing/2016/5/12/chartex" xmlns:cx7="http://schemas.microsoft.com/office/drawing/2016/5/13/chartex" xmlns:cx8="http://schemas.microsoft.com/office/drawing/2016/5/14/chartex" xmlns:mc="http://schemas.openxmlformats.org/markup-compatibility/2006" xmlns:m="http://schemas.openxmlformats.org/officeDocument/2006/math" xmlns:aink="http://schemas.microsoft.com/office/drawing/2016/ink" xmlns:am3d="http://schemas.microsoft.com/office/drawing/2017/model3d" xmlns:oel="http://schemas.microsoft.com/office/2019/extlst" xmlns:r="http://schemas.openxmlformats.org/officeDocument/2006/relationships" xmlns:wp14="http://schemas.microsoft.com/office/word/2010/wordprocessingDrawing" xmlns:wp="http://schemas.openxmlformats.org/drawingml/2006/wordprocessingDrawing" xmlns:wpg="http://schemas.microsoft.com/office/word/2010/wordprocessingGroup" xmlns:wpi="http://schemas.microsoft.com/office/word/2010/wordprocessingInk" xmlns:wps="http://schemas.microsoft.com/office/word/2010/wordprocessingShape" xmlns:o="urn:schemas-microsoft-com:office:office" xmlns:v="urn:schemas-microsoft-com:vml" xmlns:w10="urn:schemas-microsoft-com:office:word" xmlns:w="http://schemas.openxmlformats.org/wordprocessingml/2006/main" xmlns:w14="http://schemas.microsoft.com/office/word/2010/wordml" xmlns:w15="http://schemas.microsoft.com/office/word/2012/wordml" xmlns:w16cex="http://schemas.microsoft.com/office/word/2018/wordml/cex" xmlns:w16cid="http://schemas.microsoft.com/office/word/2016/wordml/cid" xmlns:w16="http://schemas.microsoft.com/office/word/2018/wordml" xmlns:w16sdtdh="http://schemas.microsoft.com/office/word/2020/wordml/sdtdatahash" xmlns:w16sdtfl="http://schemas.microsoft.com/office/word/2024/wordml/sdtformatlock" xmlns:w16se="http://schemas.microsoft.com/office/word/2015/wordml/symex" xmlns:w16du="http://schemas.microsoft.com/office/word/2023/wordml/word16du" xmlns:wne="http://schemas.microsoft.com/office/word/2006/wordml" mc:Ignorable="w14 w15 w16se w16cid w16 w16cex w16sdtdh w16sdtfl w16du wp14">
+<w:ftr xmlns:wpc="http://schemas.microsoft.com/office/word/2010/wordprocessingCanvas" xmlns:cx="http://schemas.microsoft.com/office/drawing/2014/chartex" xmlns:cx1="http://schemas.microsoft.com/office/drawing/2015/9/8/chartex" xmlns:cx2="http://schemas.microsoft.com/office/drawing/2015/10/21/chartex" xmlns:cx3="http://schemas.microsoft.com/office/drawing/2016/5/9/chartex" xmlns:cx4="http://schemas.microsoft.com/office/drawing/2016/5/10/chartex" xmlns:cx5="http://schemas.microsoft.com/office/drawing/2016/5/11/chartex" xmlns:cx6="http://schemas.microsoft.com/office/drawing/2016/5/12/chartex" xmlns:cx7="http://schemas.microsoft.com/office/drawing/2016/5/13/chartex" xmlns:cx8="http://schemas.microsoft.com/office/drawing/2016/5/14/chartex" xmlns:mc="http://schemas.openxmlformats.org/markup-compatibility/2006" xmlns:aink="http://schemas.microsoft.com/office/drawing/2016/ink" xmlns:am3d="http://schemas.microsoft.com/office/drawing/2017/model3d" xmlns:o="urn:schemas-microsoft-com:office:office" xmlns:oel="http://schemas.microsoft.com/office/2019/extlst" xmlns:r="http://schemas.openxmlformats.org/officeDocument/2006/relationships" xmlns:m="http://schemas.openxmlformats.org/officeDocument/2006/math" xmlns:v="urn:schemas-microsoft-com:vml" xmlns:wp14="http://schemas.microsoft.com/office/word/2010/wordprocessingDrawing" xmlns:wp="http://schemas.openxmlformats.org/drawingml/2006/wordprocessingDrawing" xmlns:w10="urn:schemas-microsoft-com:office:word" xmlns:w="http://schemas.openxmlformats.org/wordprocessingml/2006/main" xmlns:w14="http://schemas.microsoft.com/office/word/2010/wordml" xmlns:w15="http://schemas.microsoft.com/office/word/2012/wordml" xmlns:w16cex="http://schemas.microsoft.com/office/word/2018/wordml/cex" xmlns:w16cid="http://schemas.microsoft.com/office/word/2016/wordml/cid" xmlns:w16="http://schemas.microsoft.com/office/word/2018/wordml" xmlns:w16du="http://schemas.microsoft.com/office/word/2023/wordml/word16du" xmlns:w16sdtdh="http://schemas.microsoft.com/office/word/2020/wordml/sdtdatahash" xmlns:w16sdtfl="http://schemas.microsoft.com/office/word/2024/wordml/sdtformatlock" xmlns:w16se="http://schemas.microsoft.com/office/word/2015/wordml/symex" xmlns:wpg="http://schemas.microsoft.com/office/word/2010/wordprocessingGroup" xmlns:wpi="http://schemas.microsoft.com/office/word/2010/wordprocessingInk" xmlns:wne="http://schemas.microsoft.com/office/word/2006/wordml" xmlns:wps="http://schemas.microsoft.com/office/word/2010/wordprocessingShape" mc:Ignorable="w14 w15 w16se w16cid w16 w16cex w16sdtdh w16sdtfl w16du wp14">
   <w:p/>
 </w:ftr>
 </file>
 
 <file path=word/footer5.xml><?xml version="1.0" encoding="utf-8"?>
-<w:ftr xmlns:wpc="http://schemas.microsoft.com/office/word/2010/wordprocessingCanvas" xmlns:cx="http://schemas.microsoft.com/office/drawing/2014/chartex" xmlns:cx1="http://schemas.microsoft.com/office/drawing/2015/9/8/chartex" xmlns:cx2="http://schemas.microsoft.com/office/drawing/2015/10/21/chartex" xmlns:cx3="http://schemas.microsoft.com/office/drawing/2016/5/9/chartex" xmlns:cx4="http://schemas.microsoft.com/office/drawing/2016/5/10/chartex" xmlns:cx5="http://schemas.microsoft.com/office/drawing/2016/5/11/chartex" xmlns:cx6="http://schemas.microsoft.com/office/drawing/2016/5/12/chartex" xmlns:cx7="http://schemas.microsoft.com/office/drawing/2016/5/13/chartex" xmlns:cx8="http://schemas.microsoft.com/office/drawing/2016/5/14/chartex" xmlns:mc="http://schemas.openxmlformats.org/markup-compatibility/2006" xmlns:m="http://schemas.openxmlformats.org/officeDocument/2006/math" xmlns:aink="http://schemas.microsoft.com/office/drawing/2016/ink" xmlns:am3d="http://schemas.microsoft.com/office/drawing/2017/model3d" xmlns:oel="http://schemas.microsoft.com/office/2019/extlst" xmlns:r="http://schemas.openxmlformats.org/officeDocument/2006/relationships" xmlns:wp14="http://schemas.microsoft.com/office/word/2010/wordprocessingDrawing" xmlns:wp="http://schemas.openxmlformats.org/drawingml/2006/wordprocessingDrawing" xmlns:wpg="http://schemas.microsoft.com/office/word/2010/wordprocessingGroup" xmlns:wpi="http://schemas.microsoft.com/office/word/2010/wordprocessingInk" xmlns:wps="http://schemas.microsoft.com/office/word/2010/wordprocessingShape" xmlns:o="urn:schemas-microsoft-com:office:office" xmlns:v="urn:schemas-microsoft-com:vml" xmlns:w10="urn:schemas-microsoft-com:office:word" xmlns:w="http://schemas.openxmlformats.org/wordprocessingml/2006/main" xmlns:w14="http://schemas.microsoft.com/office/word/2010/wordml" xmlns:w15="http://schemas.microsoft.com/office/word/2012/wordml" xmlns:w16cex="http://schemas.microsoft.com/office/word/2018/wordml/cex" xmlns:w16cid="http://schemas.microsoft.com/office/word/2016/wordml/cid" xmlns:w16="http://schemas.microsoft.com/office/word/2018/wordml" xmlns:w16sdtdh="http://schemas.microsoft.com/office/word/2020/wordml/sdtdatahash" xmlns:w16sdtfl="http://schemas.microsoft.com/office/word/2024/wordml/sdtformatlock" xmlns:w16se="http://schemas.microsoft.com/office/word/2015/wordml/symex" xmlns:w16du="http://schemas.microsoft.com/office/word/2023/wordml/word16du" xmlns:wne="http://schemas.microsoft.com/office/word/2006/wordml" mc:Ignorable="w14 w15 w16se w16cid w16 w16cex w16sdtdh w16sdtfl w16du wp14">
+<w:ftr xmlns:wpc="http://schemas.microsoft.com/office/word/2010/wordprocessingCanvas" xmlns:cx="http://schemas.microsoft.com/office/drawing/2014/chartex" xmlns:cx1="http://schemas.microsoft.com/office/drawing/2015/9/8/chartex" xmlns:cx2="http://schemas.microsoft.com/office/drawing/2015/10/21/chartex" xmlns:cx3="http://schemas.microsoft.com/office/drawing/2016/5/9/chartex" xmlns:cx4="http://schemas.microsoft.com/office/drawing/2016/5/10/chartex" xmlns:cx5="http://schemas.microsoft.com/office/drawing/2016/5/11/chartex" xmlns:cx6="http://schemas.microsoft.com/office/drawing/2016/5/12/chartex" xmlns:cx7="http://schemas.microsoft.com/office/drawing/2016/5/13/chartex" xmlns:cx8="http://schemas.microsoft.com/office/drawing/2016/5/14/chartex" xmlns:mc="http://schemas.openxmlformats.org/markup-compatibility/2006" xmlns:aink="http://schemas.microsoft.com/office/drawing/2016/ink" xmlns:am3d="http://schemas.microsoft.com/office/drawing/2017/model3d" xmlns:o="urn:schemas-microsoft-com:office:office" xmlns:oel="http://schemas.microsoft.com/office/2019/extlst" xmlns:r="http://schemas.openxmlformats.org/officeDocument/2006/relationships" xmlns:m="http://schemas.openxmlformats.org/officeDocument/2006/math" xmlns:v="urn:schemas-microsoft-com:vml" xmlns:wp14="http://schemas.microsoft.com/office/word/2010/wordprocessingDrawing" xmlns:wp="http://schemas.openxmlformats.org/drawingml/2006/wordprocessingDrawing" xmlns:w10="urn:schemas-microsoft-com:office:word" xmlns:w="http://schemas.openxmlformats.org/wordprocessingml/2006/main" xmlns:w14="http://schemas.microsoft.com/office/word/2010/wordml" xmlns:w15="http://schemas.microsoft.com/office/word/2012/wordml" xmlns:w16cex="http://schemas.microsoft.com/office/word/2018/wordml/cex" xmlns:w16cid="http://schemas.microsoft.com/office/word/2016/wordml/cid" xmlns:w16="http://schemas.microsoft.com/office/word/2018/wordml" xmlns:w16du="http://schemas.microsoft.com/office/word/2023/wordml/word16du" xmlns:w16sdtdh="http://schemas.microsoft.com/office/word/2020/wordml/sdtdatahash" xmlns:w16sdtfl="http://schemas.microsoft.com/office/word/2024/wordml/sdtformatlock" xmlns:w16se="http://schemas.microsoft.com/office/word/2015/wordml/symex" xmlns:wpg="http://schemas.microsoft.com/office/word/2010/wordprocessingGroup" xmlns:wpi="http://schemas.microsoft.com/office/word/2010/wordprocessingInk" xmlns:wne="http://schemas.microsoft.com/office/word/2006/wordml" xmlns:wps="http://schemas.microsoft.com/office/word/2010/wordprocessingShape" mc:Ignorable="w14 w15 w16se w16cid w16 w16cex w16sdtdh w16sdtfl w16du wp14">
   <w:p/>
 </w:ftr>
 </file>
 
 <file path=word/footnotes.xml><?xml version="1.0" encoding="utf-8"?>
-<w:footnotes xmlns:wpc="http://schemas.microsoft.com/office/word/2010/wordprocessingCanvas" xmlns:cx="http://schemas.microsoft.com/office/drawing/2014/chartex" xmlns:cx1="http://schemas.microsoft.com/office/drawing/2015/9/8/chartex" xmlns:cx2="http://schemas.microsoft.com/office/drawing/2015/10/21/chartex" xmlns:cx3="http://schemas.microsoft.com/office/drawing/2016/5/9/chartex" xmlns:cx4="http://schemas.microsoft.com/office/drawing/2016/5/10/chartex" xmlns:cx5="http://schemas.microsoft.com/office/drawing/2016/5/11/chartex" xmlns:cx6="http://schemas.microsoft.com/office/drawing/2016/5/12/chartex" xmlns:cx7="http://schemas.microsoft.com/office/drawing/2016/5/13/chartex" xmlns:cx8="http://schemas.microsoft.com/office/drawing/2016/5/14/chartex" xmlns:mc="http://schemas.openxmlformats.org/markup-compatibility/2006" xmlns:m="http://schemas.openxmlformats.org/officeDocument/2006/math" xmlns:aink="http://schemas.microsoft.com/office/drawing/2016/ink" xmlns:am3d="http://schemas.microsoft.com/office/drawing/2017/model3d" xmlns:oel="http://schemas.microsoft.com/office/2019/extlst" xmlns:r="http://schemas.openxmlformats.org/officeDocument/2006/relationships" xmlns:wp14="http://schemas.microsoft.com/office/word/2010/wordprocessingDrawing" xmlns:wp="http://schemas.openxmlformats.org/drawingml/2006/wordprocessingDrawing" xmlns:wpg="http://schemas.microsoft.com/office/word/2010/wordprocessingGroup" xmlns:wpi="http://schemas.microsoft.com/office/word/2010/wordprocessingInk" xmlns:wps="http://schemas.microsoft.com/office/word/2010/wordprocessingShape" xmlns:o="urn:schemas-microsoft-com:office:office" xmlns:v="urn:schemas-microsoft-com:vml" xmlns:w10="urn:schemas-microsoft-com:office:word" xmlns:w="http://schemas.openxmlformats.org/wordprocessingml/2006/main" xmlns:w14="http://schemas.microsoft.com/office/word/2010/wordml" xmlns:w15="http://schemas.microsoft.com/office/word/2012/wordml" xmlns:w16cex="http://schemas.microsoft.com/office/word/2018/wordml/cex" xmlns:w16cid="http://schemas.microsoft.com/office/word/2016/wordml/cid" xmlns:w16="http://schemas.microsoft.com/office/word/2018/wordml" xmlns:w16sdtdh="http://schemas.microsoft.com/office/word/2020/wordml/sdtdatahash" xmlns:w16sdtfl="http://schemas.microsoft.com/office/word/2024/wordml/sdtformatlock" xmlns:w16se="http://schemas.microsoft.com/office/word/2015/wordml/symex" xmlns:w16du="http://schemas.microsoft.com/office/word/2023/wordml/word16du" xmlns:wne="http://schemas.microsoft.com/office/word/2006/wordml" mc:Ignorable="w14 w15 w16se w16cid w16 w16cex w16sdtdh w16sdtfl w16du wp14">
+<w:footnotes xmlns:wpc="http://schemas.microsoft.com/office/word/2010/wordprocessingCanvas" xmlns:cx="http://schemas.microsoft.com/office/drawing/2014/chartex" xmlns:cx1="http://schemas.microsoft.com/office/drawing/2015/9/8/chartex" xmlns:cx2="http://schemas.microsoft.com/office/drawing/2015/10/21/chartex" xmlns:cx3="http://schemas.microsoft.com/office/drawing/2016/5/9/chartex" xmlns:cx4="http://schemas.microsoft.com/office/drawing/2016/5/10/chartex" xmlns:cx5="http://schemas.microsoft.com/office/drawing/2016/5/11/chartex" xmlns:cx6="http://schemas.microsoft.com/office/drawing/2016/5/12/chartex" xmlns:cx7="http://schemas.microsoft.com/office/drawing/2016/5/13/chartex" xmlns:cx8="http://schemas.microsoft.com/office/drawing/2016/5/14/chartex" xmlns:mc="http://schemas.openxmlformats.org/markup-compatibility/2006" xmlns:aink="http://schemas.microsoft.com/office/drawing/2016/ink" xmlns:am3d="http://schemas.microsoft.com/office/drawing/2017/model3d" xmlns:o="urn:schemas-microsoft-com:office:office" xmlns:oel="http://schemas.microsoft.com/office/2019/extlst" xmlns:r="http://schemas.openxmlformats.org/officeDocument/2006/relationships" xmlns:m="http://schemas.openxmlformats.org/officeDocument/2006/math" xmlns:v="urn:schemas-microsoft-com:vml" xmlns:wp14="http://schemas.microsoft.com/office/word/2010/wordprocessingDrawing" xmlns:wp="http://schemas.openxmlformats.org/drawingml/2006/wordprocessingDrawing" xmlns:w10="urn:schemas-microsoft-com:office:word" xmlns:w="http://schemas.openxmlformats.org/wordprocessingml/2006/main" xmlns:w14="http://schemas.microsoft.com/office/word/2010/wordml" xmlns:w15="http://schemas.microsoft.com/office/word/2012/wordml" xmlns:w16cex="http://schemas.microsoft.com/office/word/2018/wordml/cex" xmlns:w16cid="http://schemas.microsoft.com/office/word/2016/wordml/cid" xmlns:w16="http://schemas.microsoft.com/office/word/2018/wordml" xmlns:w16du="http://schemas.microsoft.com/office/word/2023/wordml/word16du" xmlns:w16sdtdh="http://schemas.microsoft.com/office/word/2020/wordml/sdtdatahash" xmlns:w16sdtfl="http://schemas.microsoft.com/office/word/2024/wordml/sdtformatlock" xmlns:w16se="http://schemas.microsoft.com/office/word/2015/wordml/symex" xmlns:wpg="http://schemas.microsoft.com/office/word/2010/wordprocessingGroup" xmlns:wpi="http://schemas.microsoft.com/office/word/2010/wordprocessingInk" xmlns:wne="http://schemas.microsoft.com/office/word/2006/wordml" xmlns:wps="http://schemas.microsoft.com/office/word/2010/wordprocessingShape" mc:Ignorable="w14 w15 w16se w16cid w16 w16cex w16sdtdh w16sdtfl w16du wp14">
   <w:footnote w:type="separator" w:id="-1">
     <w:p>
       <w:r>
@@ -3407,7 +4631,7 @@
 </file>
 
 <file path=word/header1.xml><?xml version="1.0" encoding="utf-8"?>
-<w:hdr xmlns:wpc="http://schemas.microsoft.com/office/word/2010/wordprocessingCanvas" xmlns:cx="http://schemas.microsoft.com/office/drawing/2014/chartex" xmlns:cx1="http://schemas.microsoft.com/office/drawing/2015/9/8/chartex" xmlns:cx2="http://schemas.microsoft.com/office/drawing/2015/10/21/chartex" xmlns:cx3="http://schemas.microsoft.com/office/drawing/2016/5/9/chartex" xmlns:cx4="http://schemas.microsoft.com/office/drawing/2016/5/10/chartex" xmlns:cx5="http://schemas.microsoft.com/office/drawing/2016/5/11/chartex" xmlns:cx6="http://schemas.microsoft.com/office/drawing/2016/5/12/chartex" xmlns:cx7="http://schemas.microsoft.com/office/drawing/2016/5/13/chartex" xmlns:cx8="http://schemas.microsoft.com/office/drawing/2016/5/14/chartex" xmlns:mc="http://schemas.openxmlformats.org/markup-compatibility/2006" xmlns:m="http://schemas.openxmlformats.org/officeDocument/2006/math" xmlns:aink="http://schemas.microsoft.com/office/drawing/2016/ink" xmlns:am3d="http://schemas.microsoft.com/office/drawing/2017/model3d" xmlns:oel="http://schemas.microsoft.com/office/2019/extlst" xmlns:r="http://schemas.openxmlformats.org/officeDocument/2006/relationships" xmlns:wp14="http://schemas.microsoft.com/office/word/2010/wordprocessingDrawing" xmlns:wp="http://schemas.openxmlformats.org/drawingml/2006/wordprocessingDrawing" xmlns:wpg="http://schemas.microsoft.com/office/word/2010/wordprocessingGroup" xmlns:wpi="http://schemas.microsoft.com/office/word/2010/wordprocessingInk" xmlns:wps="http://schemas.microsoft.com/office/word/2010/wordprocessingShape" xmlns:o="urn:schemas-microsoft-com:office:office" xmlns:v="urn:schemas-microsoft-com:vml" xmlns:w10="urn:schemas-microsoft-com:office:word" xmlns:w="http://schemas.openxmlformats.org/wordprocessingml/2006/main" xmlns:w14="http://schemas.microsoft.com/office/word/2010/wordml" xmlns:w15="http://schemas.microsoft.com/office/word/2012/wordml" xmlns:w16cex="http://schemas.microsoft.com/office/word/2018/wordml/cex" xmlns:w16cid="http://schemas.microsoft.com/office/word/2016/wordml/cid" xmlns:w16="http://schemas.microsoft.com/office/word/2018/wordml" xmlns:w16sdtdh="http://schemas.microsoft.com/office/word/2020/wordml/sdtdatahash" xmlns:w16sdtfl="http://schemas.microsoft.com/office/word/2024/wordml/sdtformatlock" xmlns:w16se="http://schemas.microsoft.com/office/word/2015/wordml/symex" xmlns:w16du="http://schemas.microsoft.com/office/word/2023/wordml/word16du" xmlns:wne="http://schemas.microsoft.com/office/word/2006/wordml" mc:Ignorable="w14 w15 w16se w16cid w16 w16cex w16sdtdh w16sdtfl w16du wp14">
+<w:hdr xmlns:wpc="http://schemas.microsoft.com/office/word/2010/wordprocessingCanvas" xmlns:cx="http://schemas.microsoft.com/office/drawing/2014/chartex" xmlns:cx1="http://schemas.microsoft.com/office/drawing/2015/9/8/chartex" xmlns:cx2="http://schemas.microsoft.com/office/drawing/2015/10/21/chartex" xmlns:cx3="http://schemas.microsoft.com/office/drawing/2016/5/9/chartex" xmlns:cx4="http://schemas.microsoft.com/office/drawing/2016/5/10/chartex" xmlns:cx5="http://schemas.microsoft.com/office/drawing/2016/5/11/chartex" xmlns:cx6="http://schemas.microsoft.com/office/drawing/2016/5/12/chartex" xmlns:cx7="http://schemas.microsoft.com/office/drawing/2016/5/13/chartex" xmlns:cx8="http://schemas.microsoft.com/office/drawing/2016/5/14/chartex" xmlns:mc="http://schemas.openxmlformats.org/markup-compatibility/2006" xmlns:aink="http://schemas.microsoft.com/office/drawing/2016/ink" xmlns:am3d="http://schemas.microsoft.com/office/drawing/2017/model3d" xmlns:o="urn:schemas-microsoft-com:office:office" xmlns:oel="http://schemas.microsoft.com/office/2019/extlst" xmlns:r="http://schemas.openxmlformats.org/officeDocument/2006/relationships" xmlns:m="http://schemas.openxmlformats.org/officeDocument/2006/math" xmlns:v="urn:schemas-microsoft-com:vml" xmlns:wp14="http://schemas.microsoft.com/office/word/2010/wordprocessingDrawing" xmlns:wp="http://schemas.openxmlformats.org/drawingml/2006/wordprocessingDrawing" xmlns:w10="urn:schemas-microsoft-com:office:word" xmlns:w="http://schemas.openxmlformats.org/wordprocessingml/2006/main" xmlns:w14="http://schemas.microsoft.com/office/word/2010/wordml" xmlns:w15="http://schemas.microsoft.com/office/word/2012/wordml" xmlns:w16cex="http://schemas.microsoft.com/office/word/2018/wordml/cex" xmlns:w16cid="http://schemas.microsoft.com/office/word/2016/wordml/cid" xmlns:w16="http://schemas.microsoft.com/office/word/2018/wordml" xmlns:w16du="http://schemas.microsoft.com/office/word/2023/wordml/word16du" xmlns:w16sdtdh="http://schemas.microsoft.com/office/word/2020/wordml/sdtdatahash" xmlns:w16sdtfl="http://schemas.microsoft.com/office/word/2024/wordml/sdtformatlock" xmlns:w16se="http://schemas.microsoft.com/office/word/2015/wordml/symex" xmlns:wpg="http://schemas.microsoft.com/office/word/2010/wordprocessingGroup" xmlns:wpi="http://schemas.microsoft.com/office/word/2010/wordprocessingInk" xmlns:wne="http://schemas.microsoft.com/office/word/2006/wordml" xmlns:wps="http://schemas.microsoft.com/office/word/2010/wordprocessingShape" mc:Ignorable="w14 w15 w16se w16cid w16 w16cex w16sdtdh w16sdtfl w16du wp14">
   <w:tbl>
     <w:tblPr>
       <w:tblW w:w="0" w:type="auto"/>
@@ -3510,7 +4734,7 @@
               <w:b w:val="0"/>
               <w:sz w:val="20"/>
             </w:rPr>
-            <w:t>2</w:t>
+            <w:t>4</w:t>
           </w:r>
         </w:p>
       </w:tc>
@@ -3541,11 +4765,19 @@
             </w:rPr>
             <w:t xml:space="preserve">Documento: </w:t>
           </w:r>
+          <w:proofErr w:type="spellStart"/>
           <w:r>
             <w:rPr>
               <w:sz w:val="20"/>
             </w:rPr>
-            <w:t>Problem Statement</w:t>
+            <w:t>Problem</w:t>
+          </w:r>
+          <w:proofErr w:type="spellEnd"/>
+          <w:r>
+            <w:rPr>
+              <w:sz w:val="20"/>
+            </w:rPr>
+            <w:t xml:space="preserve"> Statement</w:t>
           </w:r>
         </w:p>
       </w:tc>
@@ -3582,7 +4814,7 @@
             <w:rPr>
               <w:sz w:val="20"/>
             </w:rPr>
-            <w:t>2</w:t>
+            <w:t>3</w:t>
           </w:r>
           <w:r>
             <w:rPr>
@@ -3621,31 +4853,31 @@
 </file>
 
 <file path=word/header2.xml><?xml version="1.0" encoding="utf-8"?>
-<w:hdr xmlns:wpc="http://schemas.microsoft.com/office/word/2010/wordprocessingCanvas" xmlns:cx="http://schemas.microsoft.com/office/drawing/2014/chartex" xmlns:cx1="http://schemas.microsoft.com/office/drawing/2015/9/8/chartex" xmlns:cx2="http://schemas.microsoft.com/office/drawing/2015/10/21/chartex" xmlns:cx3="http://schemas.microsoft.com/office/drawing/2016/5/9/chartex" xmlns:cx4="http://schemas.microsoft.com/office/drawing/2016/5/10/chartex" xmlns:cx5="http://schemas.microsoft.com/office/drawing/2016/5/11/chartex" xmlns:cx6="http://schemas.microsoft.com/office/drawing/2016/5/12/chartex" xmlns:cx7="http://schemas.microsoft.com/office/drawing/2016/5/13/chartex" xmlns:cx8="http://schemas.microsoft.com/office/drawing/2016/5/14/chartex" xmlns:mc="http://schemas.openxmlformats.org/markup-compatibility/2006" xmlns:m="http://schemas.openxmlformats.org/officeDocument/2006/math" xmlns:aink="http://schemas.microsoft.com/office/drawing/2016/ink" xmlns:am3d="http://schemas.microsoft.com/office/drawing/2017/model3d" xmlns:oel="http://schemas.microsoft.com/office/2019/extlst" xmlns:r="http://schemas.openxmlformats.org/officeDocument/2006/relationships" xmlns:wp14="http://schemas.microsoft.com/office/word/2010/wordprocessingDrawing" xmlns:wp="http://schemas.openxmlformats.org/drawingml/2006/wordprocessingDrawing" xmlns:wpg="http://schemas.microsoft.com/office/word/2010/wordprocessingGroup" xmlns:wpi="http://schemas.microsoft.com/office/word/2010/wordprocessingInk" xmlns:wps="http://schemas.microsoft.com/office/word/2010/wordprocessingShape" xmlns:o="urn:schemas-microsoft-com:office:office" xmlns:v="urn:schemas-microsoft-com:vml" xmlns:w10="urn:schemas-microsoft-com:office:word" xmlns:w="http://schemas.openxmlformats.org/wordprocessingml/2006/main" xmlns:w14="http://schemas.microsoft.com/office/word/2010/wordml" xmlns:w15="http://schemas.microsoft.com/office/word/2012/wordml" xmlns:w16cex="http://schemas.microsoft.com/office/word/2018/wordml/cex" xmlns:w16cid="http://schemas.microsoft.com/office/word/2016/wordml/cid" xmlns:w16="http://schemas.microsoft.com/office/word/2018/wordml" xmlns:w16sdtdh="http://schemas.microsoft.com/office/word/2020/wordml/sdtdatahash" xmlns:w16sdtfl="http://schemas.microsoft.com/office/word/2024/wordml/sdtformatlock" xmlns:w16se="http://schemas.microsoft.com/office/word/2015/wordml/symex" xmlns:w16du="http://schemas.microsoft.com/office/word/2023/wordml/word16du" xmlns:wne="http://schemas.microsoft.com/office/word/2006/wordml" mc:Ignorable="w14 w15 w16se w16cid w16 w16cex w16sdtdh w16sdtfl w16du wp14">
+<w:hdr xmlns:wpc="http://schemas.microsoft.com/office/word/2010/wordprocessingCanvas" xmlns:cx="http://schemas.microsoft.com/office/drawing/2014/chartex" xmlns:cx1="http://schemas.microsoft.com/office/drawing/2015/9/8/chartex" xmlns:cx2="http://schemas.microsoft.com/office/drawing/2015/10/21/chartex" xmlns:cx3="http://schemas.microsoft.com/office/drawing/2016/5/9/chartex" xmlns:cx4="http://schemas.microsoft.com/office/drawing/2016/5/10/chartex" xmlns:cx5="http://schemas.microsoft.com/office/drawing/2016/5/11/chartex" xmlns:cx6="http://schemas.microsoft.com/office/drawing/2016/5/12/chartex" xmlns:cx7="http://schemas.microsoft.com/office/drawing/2016/5/13/chartex" xmlns:cx8="http://schemas.microsoft.com/office/drawing/2016/5/14/chartex" xmlns:mc="http://schemas.openxmlformats.org/markup-compatibility/2006" xmlns:aink="http://schemas.microsoft.com/office/drawing/2016/ink" xmlns:am3d="http://schemas.microsoft.com/office/drawing/2017/model3d" xmlns:o="urn:schemas-microsoft-com:office:office" xmlns:oel="http://schemas.microsoft.com/office/2019/extlst" xmlns:r="http://schemas.openxmlformats.org/officeDocument/2006/relationships" xmlns:m="http://schemas.openxmlformats.org/officeDocument/2006/math" xmlns:v="urn:schemas-microsoft-com:vml" xmlns:wp14="http://schemas.microsoft.com/office/word/2010/wordprocessingDrawing" xmlns:wp="http://schemas.openxmlformats.org/drawingml/2006/wordprocessingDrawing" xmlns:w10="urn:schemas-microsoft-com:office:word" xmlns:w="http://schemas.openxmlformats.org/wordprocessingml/2006/main" xmlns:w14="http://schemas.microsoft.com/office/word/2010/wordml" xmlns:w15="http://schemas.microsoft.com/office/word/2012/wordml" xmlns:w16cex="http://schemas.microsoft.com/office/word/2018/wordml/cex" xmlns:w16cid="http://schemas.microsoft.com/office/word/2016/wordml/cid" xmlns:w16="http://schemas.microsoft.com/office/word/2018/wordml" xmlns:w16du="http://schemas.microsoft.com/office/word/2023/wordml/word16du" xmlns:w16sdtdh="http://schemas.microsoft.com/office/word/2020/wordml/sdtdatahash" xmlns:w16sdtfl="http://schemas.microsoft.com/office/word/2024/wordml/sdtformatlock" xmlns:w16se="http://schemas.microsoft.com/office/word/2015/wordml/symex" xmlns:wpg="http://schemas.microsoft.com/office/word/2010/wordprocessingGroup" xmlns:wpi="http://schemas.microsoft.com/office/word/2010/wordprocessingInk" xmlns:wne="http://schemas.microsoft.com/office/word/2006/wordml" xmlns:wps="http://schemas.microsoft.com/office/word/2010/wordprocessingShape" mc:Ignorable="w14 w15 w16se w16cid w16 w16cex w16sdtdh w16sdtfl w16du wp14">
   <w:p/>
 </w:hdr>
 </file>
 
 <file path=word/header3.xml><?xml version="1.0" encoding="utf-8"?>
-<w:hdr xmlns:wpc="http://schemas.microsoft.com/office/word/2010/wordprocessingCanvas" xmlns:cx="http://schemas.microsoft.com/office/drawing/2014/chartex" xmlns:cx1="http://schemas.microsoft.com/office/drawing/2015/9/8/chartex" xmlns:cx2="http://schemas.microsoft.com/office/drawing/2015/10/21/chartex" xmlns:cx3="http://schemas.microsoft.com/office/drawing/2016/5/9/chartex" xmlns:cx4="http://schemas.microsoft.com/office/drawing/2016/5/10/chartex" xmlns:cx5="http://schemas.microsoft.com/office/drawing/2016/5/11/chartex" xmlns:cx6="http://schemas.microsoft.com/office/drawing/2016/5/12/chartex" xmlns:cx7="http://schemas.microsoft.com/office/drawing/2016/5/13/chartex" xmlns:cx8="http://schemas.microsoft.com/office/drawing/2016/5/14/chartex" xmlns:mc="http://schemas.openxmlformats.org/markup-compatibility/2006" xmlns:m="http://schemas.openxmlformats.org/officeDocument/2006/math" xmlns:aink="http://schemas.microsoft.com/office/drawing/2016/ink" xmlns:am3d="http://schemas.microsoft.com/office/drawing/2017/model3d" xmlns:oel="http://schemas.microsoft.com/office/2019/extlst" xmlns:r="http://schemas.openxmlformats.org/officeDocument/2006/relationships" xmlns:wp14="http://schemas.microsoft.com/office/word/2010/wordprocessingDrawing" xmlns:wp="http://schemas.openxmlformats.org/drawingml/2006/wordprocessingDrawing" xmlns:wpg="http://schemas.microsoft.com/office/word/2010/wordprocessingGroup" xmlns:wpi="http://schemas.microsoft.com/office/word/2010/wordprocessingInk" xmlns:wps="http://schemas.microsoft.com/office/word/2010/wordprocessingShape" xmlns:o="urn:schemas-microsoft-com:office:office" xmlns:v="urn:schemas-microsoft-com:vml" xmlns:w10="urn:schemas-microsoft-com:office:word" xmlns:w="http://schemas.openxmlformats.org/wordprocessingml/2006/main" xmlns:w14="http://schemas.microsoft.com/office/word/2010/wordml" xmlns:w15="http://schemas.microsoft.com/office/word/2012/wordml" xmlns:w16cex="http://schemas.microsoft.com/office/word/2018/wordml/cex" xmlns:w16cid="http://schemas.microsoft.com/office/word/2016/wordml/cid" xmlns:w16="http://schemas.microsoft.com/office/word/2018/wordml" xmlns:w16sdtdh="http://schemas.microsoft.com/office/word/2020/wordml/sdtdatahash" xmlns:w16sdtfl="http://schemas.microsoft.com/office/word/2024/wordml/sdtformatlock" xmlns:w16se="http://schemas.microsoft.com/office/word/2015/wordml/symex" xmlns:w16du="http://schemas.microsoft.com/office/word/2023/wordml/word16du" xmlns:wne="http://schemas.microsoft.com/office/word/2006/wordml" mc:Ignorable="w14 w15 w16se w16cid w16 w16cex w16sdtdh w16sdtfl w16du wp14">
+<w:hdr xmlns:wpc="http://schemas.microsoft.com/office/word/2010/wordprocessingCanvas" xmlns:cx="http://schemas.microsoft.com/office/drawing/2014/chartex" xmlns:cx1="http://schemas.microsoft.com/office/drawing/2015/9/8/chartex" xmlns:cx2="http://schemas.microsoft.com/office/drawing/2015/10/21/chartex" xmlns:cx3="http://schemas.microsoft.com/office/drawing/2016/5/9/chartex" xmlns:cx4="http://schemas.microsoft.com/office/drawing/2016/5/10/chartex" xmlns:cx5="http://schemas.microsoft.com/office/drawing/2016/5/11/chartex" xmlns:cx6="http://schemas.microsoft.com/office/drawing/2016/5/12/chartex" xmlns:cx7="http://schemas.microsoft.com/office/drawing/2016/5/13/chartex" xmlns:cx8="http://schemas.microsoft.com/office/drawing/2016/5/14/chartex" xmlns:mc="http://schemas.openxmlformats.org/markup-compatibility/2006" xmlns:aink="http://schemas.microsoft.com/office/drawing/2016/ink" xmlns:am3d="http://schemas.microsoft.com/office/drawing/2017/model3d" xmlns:o="urn:schemas-microsoft-com:office:office" xmlns:oel="http://schemas.microsoft.com/office/2019/extlst" xmlns:r="http://schemas.openxmlformats.org/officeDocument/2006/relationships" xmlns:m="http://schemas.openxmlformats.org/officeDocument/2006/math" xmlns:v="urn:schemas-microsoft-com:vml" xmlns:wp14="http://schemas.microsoft.com/office/word/2010/wordprocessingDrawing" xmlns:wp="http://schemas.openxmlformats.org/drawingml/2006/wordprocessingDrawing" xmlns:w10="urn:schemas-microsoft-com:office:word" xmlns:w="http://schemas.openxmlformats.org/wordprocessingml/2006/main" xmlns:w14="http://schemas.microsoft.com/office/word/2010/wordml" xmlns:w15="http://schemas.microsoft.com/office/word/2012/wordml" xmlns:w16cex="http://schemas.microsoft.com/office/word/2018/wordml/cex" xmlns:w16cid="http://schemas.microsoft.com/office/word/2016/wordml/cid" xmlns:w16="http://schemas.microsoft.com/office/word/2018/wordml" xmlns:w16du="http://schemas.microsoft.com/office/word/2023/wordml/word16du" xmlns:w16sdtdh="http://schemas.microsoft.com/office/word/2020/wordml/sdtdatahash" xmlns:w16sdtfl="http://schemas.microsoft.com/office/word/2024/wordml/sdtformatlock" xmlns:w16se="http://schemas.microsoft.com/office/word/2015/wordml/symex" xmlns:wpg="http://schemas.microsoft.com/office/word/2010/wordprocessingGroup" xmlns:wpi="http://schemas.microsoft.com/office/word/2010/wordprocessingInk" xmlns:wne="http://schemas.microsoft.com/office/word/2006/wordml" xmlns:wps="http://schemas.microsoft.com/office/word/2010/wordprocessingShape" mc:Ignorable="w14 w15 w16se w16cid w16 w16cex w16sdtdh w16sdtfl w16du wp14">
   <w:p/>
 </w:hdr>
 </file>
 
 <file path=word/header4.xml><?xml version="1.0" encoding="utf-8"?>
-<w:hdr xmlns:wpc="http://schemas.microsoft.com/office/word/2010/wordprocessingCanvas" xmlns:cx="http://schemas.microsoft.com/office/drawing/2014/chartex" xmlns:cx1="http://schemas.microsoft.com/office/drawing/2015/9/8/chartex" xmlns:cx2="http://schemas.microsoft.com/office/drawing/2015/10/21/chartex" xmlns:cx3="http://schemas.microsoft.com/office/drawing/2016/5/9/chartex" xmlns:cx4="http://schemas.microsoft.com/office/drawing/2016/5/10/chartex" xmlns:cx5="http://schemas.microsoft.com/office/drawing/2016/5/11/chartex" xmlns:cx6="http://schemas.microsoft.com/office/drawing/2016/5/12/chartex" xmlns:cx7="http://schemas.microsoft.com/office/drawing/2016/5/13/chartex" xmlns:cx8="http://schemas.microsoft.com/office/drawing/2016/5/14/chartex" xmlns:mc="http://schemas.openxmlformats.org/markup-compatibility/2006" xmlns:m="http://schemas.openxmlformats.org/officeDocument/2006/math" xmlns:aink="http://schemas.microsoft.com/office/drawing/2016/ink" xmlns:am3d="http://schemas.microsoft.com/office/drawing/2017/model3d" xmlns:oel="http://schemas.microsoft.com/office/2019/extlst" xmlns:r="http://schemas.openxmlformats.org/officeDocument/2006/relationships" xmlns:wp14="http://schemas.microsoft.com/office/word/2010/wordprocessingDrawing" xmlns:wp="http://schemas.openxmlformats.org/drawingml/2006/wordprocessingDrawing" xmlns:wpg="http://schemas.microsoft.com/office/word/2010/wordprocessingGroup" xmlns:wpi="http://schemas.microsoft.com/office/word/2010/wordprocessingInk" xmlns:wps="http://schemas.microsoft.com/office/word/2010/wordprocessingShape" xmlns:o="urn:schemas-microsoft-com:office:office" xmlns:v="urn:schemas-microsoft-com:vml" xmlns:w10="urn:schemas-microsoft-com:office:word" xmlns:w="http://schemas.openxmlformats.org/wordprocessingml/2006/main" xmlns:w14="http://schemas.microsoft.com/office/word/2010/wordml" xmlns:w15="http://schemas.microsoft.com/office/word/2012/wordml" xmlns:w16cex="http://schemas.microsoft.com/office/word/2018/wordml/cex" xmlns:w16cid="http://schemas.microsoft.com/office/word/2016/wordml/cid" xmlns:w16="http://schemas.microsoft.com/office/word/2018/wordml" xmlns:w16sdtdh="http://schemas.microsoft.com/office/word/2020/wordml/sdtdatahash" xmlns:w16sdtfl="http://schemas.microsoft.com/office/word/2024/wordml/sdtformatlock" xmlns:w16se="http://schemas.microsoft.com/office/word/2015/wordml/symex" xmlns:w16du="http://schemas.microsoft.com/office/word/2023/wordml/word16du" xmlns:wne="http://schemas.microsoft.com/office/word/2006/wordml" mc:Ignorable="w14 w15 w16se w16cid w16 w16cex w16sdtdh w16sdtfl w16du wp14">
+<w:hdr xmlns:wpc="http://schemas.microsoft.com/office/word/2010/wordprocessingCanvas" xmlns:cx="http://schemas.microsoft.com/office/drawing/2014/chartex" xmlns:cx1="http://schemas.microsoft.com/office/drawing/2015/9/8/chartex" xmlns:cx2="http://schemas.microsoft.com/office/drawing/2015/10/21/chartex" xmlns:cx3="http://schemas.microsoft.com/office/drawing/2016/5/9/chartex" xmlns:cx4="http://schemas.microsoft.com/office/drawing/2016/5/10/chartex" xmlns:cx5="http://schemas.microsoft.com/office/drawing/2016/5/11/chartex" xmlns:cx6="http://schemas.microsoft.com/office/drawing/2016/5/12/chartex" xmlns:cx7="http://schemas.microsoft.com/office/drawing/2016/5/13/chartex" xmlns:cx8="http://schemas.microsoft.com/office/drawing/2016/5/14/chartex" xmlns:mc="http://schemas.openxmlformats.org/markup-compatibility/2006" xmlns:aink="http://schemas.microsoft.com/office/drawing/2016/ink" xmlns:am3d="http://schemas.microsoft.com/office/drawing/2017/model3d" xmlns:o="urn:schemas-microsoft-com:office:office" xmlns:oel="http://schemas.microsoft.com/office/2019/extlst" xmlns:r="http://schemas.openxmlformats.org/officeDocument/2006/relationships" xmlns:m="http://schemas.openxmlformats.org/officeDocument/2006/math" xmlns:v="urn:schemas-microsoft-com:vml" xmlns:wp14="http://schemas.microsoft.com/office/word/2010/wordprocessingDrawing" xmlns:wp="http://schemas.openxmlformats.org/drawingml/2006/wordprocessingDrawing" xmlns:w10="urn:schemas-microsoft-com:office:word" xmlns:w="http://schemas.openxmlformats.org/wordprocessingml/2006/main" xmlns:w14="http://schemas.microsoft.com/office/word/2010/wordml" xmlns:w15="http://schemas.microsoft.com/office/word/2012/wordml" xmlns:w16cex="http://schemas.microsoft.com/office/word/2018/wordml/cex" xmlns:w16cid="http://schemas.microsoft.com/office/word/2016/wordml/cid" xmlns:w16="http://schemas.microsoft.com/office/word/2018/wordml" xmlns:w16du="http://schemas.microsoft.com/office/word/2023/wordml/word16du" xmlns:w16sdtdh="http://schemas.microsoft.com/office/word/2020/wordml/sdtdatahash" xmlns:w16sdtfl="http://schemas.microsoft.com/office/word/2024/wordml/sdtformatlock" xmlns:w16se="http://schemas.microsoft.com/office/word/2015/wordml/symex" xmlns:wpg="http://schemas.microsoft.com/office/word/2010/wordprocessingGroup" xmlns:wpi="http://schemas.microsoft.com/office/word/2010/wordprocessingInk" xmlns:wne="http://schemas.microsoft.com/office/word/2006/wordml" xmlns:wps="http://schemas.microsoft.com/office/word/2010/wordprocessingShape" mc:Ignorable="w14 w15 w16se w16cid w16 w16cex w16sdtdh w16sdtfl w16du wp14">
   <w:p/>
 </w:hdr>
 </file>
 
 <file path=word/header5.xml><?xml version="1.0" encoding="utf-8"?>
-<w:hdr xmlns:wpc="http://schemas.microsoft.com/office/word/2010/wordprocessingCanvas" xmlns:cx="http://schemas.microsoft.com/office/drawing/2014/chartex" xmlns:cx1="http://schemas.microsoft.com/office/drawing/2015/9/8/chartex" xmlns:cx2="http://schemas.microsoft.com/office/drawing/2015/10/21/chartex" xmlns:cx3="http://schemas.microsoft.com/office/drawing/2016/5/9/chartex" xmlns:cx4="http://schemas.microsoft.com/office/drawing/2016/5/10/chartex" xmlns:cx5="http://schemas.microsoft.com/office/drawing/2016/5/11/chartex" xmlns:cx6="http://schemas.microsoft.com/office/drawing/2016/5/12/chartex" xmlns:cx7="http://schemas.microsoft.com/office/drawing/2016/5/13/chartex" xmlns:cx8="http://schemas.microsoft.com/office/drawing/2016/5/14/chartex" xmlns:mc="http://schemas.openxmlformats.org/markup-compatibility/2006" xmlns:m="http://schemas.openxmlformats.org/officeDocument/2006/math" xmlns:aink="http://schemas.microsoft.com/office/drawing/2016/ink" xmlns:am3d="http://schemas.microsoft.com/office/drawing/2017/model3d" xmlns:oel="http://schemas.microsoft.com/office/2019/extlst" xmlns:r="http://schemas.openxmlformats.org/officeDocument/2006/relationships" xmlns:wp14="http://schemas.microsoft.com/office/word/2010/wordprocessingDrawing" xmlns:wp="http://schemas.openxmlformats.org/drawingml/2006/wordprocessingDrawing" xmlns:wpg="http://schemas.microsoft.com/office/word/2010/wordprocessingGroup" xmlns:wpi="http://schemas.microsoft.com/office/word/2010/wordprocessingInk" xmlns:wps="http://schemas.microsoft.com/office/word/2010/wordprocessingShape" xmlns:o="urn:schemas-microsoft-com:office:office" xmlns:v="urn:schemas-microsoft-com:vml" xmlns:w10="urn:schemas-microsoft-com:office:word" xmlns:w="http://schemas.openxmlformats.org/wordprocessingml/2006/main" xmlns:w14="http://schemas.microsoft.com/office/word/2010/wordml" xmlns:w15="http://schemas.microsoft.com/office/word/2012/wordml" xmlns:w16cex="http://schemas.microsoft.com/office/word/2018/wordml/cex" xmlns:w16cid="http://schemas.microsoft.com/office/word/2016/wordml/cid" xmlns:w16="http://schemas.microsoft.com/office/word/2018/wordml" xmlns:w16sdtdh="http://schemas.microsoft.com/office/word/2020/wordml/sdtdatahash" xmlns:w16sdtfl="http://schemas.microsoft.com/office/word/2024/wordml/sdtformatlock" xmlns:w16se="http://schemas.microsoft.com/office/word/2015/wordml/symex" xmlns:w16du="http://schemas.microsoft.com/office/word/2023/wordml/word16du" xmlns:wne="http://schemas.microsoft.com/office/word/2006/wordml" mc:Ignorable="w14 w15 w16se w16cid w16 w16cex w16sdtdh w16sdtfl w16du wp14">
+<w:hdr xmlns:wpc="http://schemas.microsoft.com/office/word/2010/wordprocessingCanvas" xmlns:cx="http://schemas.microsoft.com/office/drawing/2014/chartex" xmlns:cx1="http://schemas.microsoft.com/office/drawing/2015/9/8/chartex" xmlns:cx2="http://schemas.microsoft.com/office/drawing/2015/10/21/chartex" xmlns:cx3="http://schemas.microsoft.com/office/drawing/2016/5/9/chartex" xmlns:cx4="http://schemas.microsoft.com/office/drawing/2016/5/10/chartex" xmlns:cx5="http://schemas.microsoft.com/office/drawing/2016/5/11/chartex" xmlns:cx6="http://schemas.microsoft.com/office/drawing/2016/5/12/chartex" xmlns:cx7="http://schemas.microsoft.com/office/drawing/2016/5/13/chartex" xmlns:cx8="http://schemas.microsoft.com/office/drawing/2016/5/14/chartex" xmlns:mc="http://schemas.openxmlformats.org/markup-compatibility/2006" xmlns:aink="http://schemas.microsoft.com/office/drawing/2016/ink" xmlns:am3d="http://schemas.microsoft.com/office/drawing/2017/model3d" xmlns:o="urn:schemas-microsoft-com:office:office" xmlns:oel="http://schemas.microsoft.com/office/2019/extlst" xmlns:r="http://schemas.openxmlformats.org/officeDocument/2006/relationships" xmlns:m="http://schemas.openxmlformats.org/officeDocument/2006/math" xmlns:v="urn:schemas-microsoft-com:vml" xmlns:wp14="http://schemas.microsoft.com/office/word/2010/wordprocessingDrawing" xmlns:wp="http://schemas.openxmlformats.org/drawingml/2006/wordprocessingDrawing" xmlns:w10="urn:schemas-microsoft-com:office:word" xmlns:w="http://schemas.openxmlformats.org/wordprocessingml/2006/main" xmlns:w14="http://schemas.microsoft.com/office/word/2010/wordml" xmlns:w15="http://schemas.microsoft.com/office/word/2012/wordml" xmlns:w16cex="http://schemas.microsoft.com/office/word/2018/wordml/cex" xmlns:w16cid="http://schemas.microsoft.com/office/word/2016/wordml/cid" xmlns:w16="http://schemas.microsoft.com/office/word/2018/wordml" xmlns:w16du="http://schemas.microsoft.com/office/word/2023/wordml/word16du" xmlns:w16sdtdh="http://schemas.microsoft.com/office/word/2020/wordml/sdtdatahash" xmlns:w16sdtfl="http://schemas.microsoft.com/office/word/2024/wordml/sdtformatlock" xmlns:w16se="http://schemas.microsoft.com/office/word/2015/wordml/symex" xmlns:wpg="http://schemas.microsoft.com/office/word/2010/wordprocessingGroup" xmlns:wpi="http://schemas.microsoft.com/office/word/2010/wordprocessingInk" xmlns:wne="http://schemas.microsoft.com/office/word/2006/wordml" xmlns:wps="http://schemas.microsoft.com/office/word/2010/wordprocessingShape" mc:Ignorable="w14 w15 w16se w16cid w16 w16cex w16sdtdh w16sdtfl w16du wp14">
   <w:p/>
 </w:hdr>
 </file>
 
 <file path=word/numbering.xml><?xml version="1.0" encoding="utf-8"?>
-<w:numbering xmlns:wpc="http://schemas.microsoft.com/office/word/2010/wordprocessingCanvas" xmlns:cx="http://schemas.microsoft.com/office/drawing/2014/chartex" xmlns:cx1="http://schemas.microsoft.com/office/drawing/2015/9/8/chartex" xmlns:cx2="http://schemas.microsoft.com/office/drawing/2015/10/21/chartex" xmlns:cx3="http://schemas.microsoft.com/office/drawing/2016/5/9/chartex" xmlns:cx4="http://schemas.microsoft.com/office/drawing/2016/5/10/chartex" xmlns:cx5="http://schemas.microsoft.com/office/drawing/2016/5/11/chartex" xmlns:cx6="http://schemas.microsoft.com/office/drawing/2016/5/12/chartex" xmlns:cx7="http://schemas.microsoft.com/office/drawing/2016/5/13/chartex" xmlns:cx8="http://schemas.microsoft.com/office/drawing/2016/5/14/chartex" xmlns:mc="http://schemas.openxmlformats.org/markup-compatibility/2006" xmlns:m="http://schemas.openxmlformats.org/officeDocument/2006/math" xmlns:aink="http://schemas.microsoft.com/office/drawing/2016/ink" xmlns:am3d="http://schemas.microsoft.com/office/drawing/2017/model3d" xmlns:oel="http://schemas.microsoft.com/office/2019/extlst" xmlns:r="http://schemas.openxmlformats.org/officeDocument/2006/relationships" xmlns:wp14="http://schemas.microsoft.com/office/word/2010/wordprocessingDrawing" xmlns:wp="http://schemas.openxmlformats.org/drawingml/2006/wordprocessingDrawing" xmlns:wpg="http://schemas.microsoft.com/office/word/2010/wordprocessingGroup" xmlns:wpi="http://schemas.microsoft.com/office/word/2010/wordprocessingInk" xmlns:wps="http://schemas.microsoft.com/office/word/2010/wordprocessingShape" xmlns:o="urn:schemas-microsoft-com:office:office" xmlns:v="urn:schemas-microsoft-com:vml" xmlns:w10="urn:schemas-microsoft-com:office:word" xmlns:w="http://schemas.openxmlformats.org/wordprocessingml/2006/main" xmlns:w14="http://schemas.microsoft.com/office/word/2010/wordml" xmlns:w15="http://schemas.microsoft.com/office/word/2012/wordml" xmlns:w16cex="http://schemas.microsoft.com/office/word/2018/wordml/cex" xmlns:w16cid="http://schemas.microsoft.com/office/word/2016/wordml/cid" xmlns:w16="http://schemas.microsoft.com/office/word/2018/wordml" xmlns:w16sdtdh="http://schemas.microsoft.com/office/word/2020/wordml/sdtdatahash" xmlns:w16sdtfl="http://schemas.microsoft.com/office/word/2024/wordml/sdtformatlock" xmlns:w16se="http://schemas.microsoft.com/office/word/2015/wordml/symex" xmlns:w16du="http://schemas.microsoft.com/office/word/2023/wordml/word16du" xmlns:wne="http://schemas.microsoft.com/office/word/2006/wordml" mc:Ignorable="w14 w15 w16se w16cid w16 w16cex w16sdtdh w16sdtfl w16du wp14">
+<w:numbering xmlns:wpc="http://schemas.microsoft.com/office/word/2010/wordprocessingCanvas" xmlns:cx="http://schemas.microsoft.com/office/drawing/2014/chartex" xmlns:cx1="http://schemas.microsoft.com/office/drawing/2015/9/8/chartex" xmlns:cx2="http://schemas.microsoft.com/office/drawing/2015/10/21/chartex" xmlns:cx3="http://schemas.microsoft.com/office/drawing/2016/5/9/chartex" xmlns:cx4="http://schemas.microsoft.com/office/drawing/2016/5/10/chartex" xmlns:cx5="http://schemas.microsoft.com/office/drawing/2016/5/11/chartex" xmlns:cx6="http://schemas.microsoft.com/office/drawing/2016/5/12/chartex" xmlns:cx7="http://schemas.microsoft.com/office/drawing/2016/5/13/chartex" xmlns:cx8="http://schemas.microsoft.com/office/drawing/2016/5/14/chartex" xmlns:mc="http://schemas.openxmlformats.org/markup-compatibility/2006" xmlns:aink="http://schemas.microsoft.com/office/drawing/2016/ink" xmlns:am3d="http://schemas.microsoft.com/office/drawing/2017/model3d" xmlns:o="urn:schemas-microsoft-com:office:office" xmlns:oel="http://schemas.microsoft.com/office/2019/extlst" xmlns:r="http://schemas.openxmlformats.org/officeDocument/2006/relationships" xmlns:m="http://schemas.openxmlformats.org/officeDocument/2006/math" xmlns:v="urn:schemas-microsoft-com:vml" xmlns:wp14="http://schemas.microsoft.com/office/word/2010/wordprocessingDrawing" xmlns:wp="http://schemas.openxmlformats.org/drawingml/2006/wordprocessingDrawing" xmlns:w10="urn:schemas-microsoft-com:office:word" xmlns:w="http://schemas.openxmlformats.org/wordprocessingml/2006/main" xmlns:w14="http://schemas.microsoft.com/office/word/2010/wordml" xmlns:w15="http://schemas.microsoft.com/office/word/2012/wordml" xmlns:w16cex="http://schemas.microsoft.com/office/word/2018/wordml/cex" xmlns:w16cid="http://schemas.microsoft.com/office/word/2016/wordml/cid" xmlns:w16="http://schemas.microsoft.com/office/word/2018/wordml" xmlns:w16du="http://schemas.microsoft.com/office/word/2023/wordml/word16du" xmlns:w16sdtdh="http://schemas.microsoft.com/office/word/2020/wordml/sdtdatahash" xmlns:w16sdtfl="http://schemas.microsoft.com/office/word/2024/wordml/sdtformatlock" xmlns:w16se="http://schemas.microsoft.com/office/word/2015/wordml/symex" xmlns:wpg="http://schemas.microsoft.com/office/word/2010/wordprocessingGroup" xmlns:wpi="http://schemas.microsoft.com/office/word/2010/wordprocessingInk" xmlns:wne="http://schemas.microsoft.com/office/word/2006/wordml" xmlns:wps="http://schemas.microsoft.com/office/word/2010/wordprocessingShape" mc:Ignorable="w14 w15 w16se w16cid w16 w16cex w16sdtdh w16sdtfl w16du wp14">
   <w:numPicBullet w:numPicBulletId="0">
     <w:pict>
       <v:shapetype id="_x0000_t75" coordsize="21600,21600" o:spt="75" o:preferrelative="t" path="m@4@5l@4@11@9@11@9@5xe" filled="f" stroked="f">
@@ -3667,7 +4899,7 @@
         <v:path o:extrusionok="f" gradientshapeok="t" o:connecttype="rect"/>
         <o:lock v:ext="edit" aspectratio="t"/>
       </v:shapetype>
-      <v:shape id="_x0000_i1025" type="#_x0000_t75" style="width:320.65pt;height:249.5pt" o:bullet="t" filled="t">
+      <v:shape id="_x0000_i1025" type="#_x0000_t75" style="width:321pt;height:249.75pt" o:bullet="t" filled="t">
         <v:fill color2="black"/>
         <v:imagedata r:id="rId1" o:title=""/>
       </v:shape>
@@ -4468,6 +5700,119 @@
     </w:lvl>
   </w:abstractNum>
   <w:abstractNum w:abstractNumId="11" w15:restartNumberingAfterBreak="0">
+    <w:nsid w:val="282C65A4"/>
+    <w:multiLevelType w:val="hybridMultilevel"/>
+    <w:tmpl w:val="07B27B60"/>
+    <w:lvl w:ilvl="0" w:tplc="0410000B">
+      <w:start w:val="1"/>
+      <w:numFmt w:val="bullet"/>
+      <w:lvlText w:val=""/>
+      <w:lvlJc w:val="left"/>
+      <w:pPr>
+        <w:ind w:left="1080" w:hanging="360"/>
+      </w:pPr>
+      <w:rPr>
+        <w:rFonts w:ascii="Wingdings" w:hAnsi="Wingdings" w:hint="default"/>
+      </w:rPr>
+    </w:lvl>
+    <w:lvl w:ilvl="1" w:tplc="04100003" w:tentative="1">
+      <w:start w:val="1"/>
+      <w:numFmt w:val="bullet"/>
+      <w:lvlText w:val="o"/>
+      <w:lvlJc w:val="left"/>
+      <w:pPr>
+        <w:ind w:left="1800" w:hanging="360"/>
+      </w:pPr>
+      <w:rPr>
+        <w:rFonts w:ascii="Courier New" w:hAnsi="Courier New" w:cs="Courier New" w:hint="default"/>
+      </w:rPr>
+    </w:lvl>
+    <w:lvl w:ilvl="2" w:tplc="04100005" w:tentative="1">
+      <w:start w:val="1"/>
+      <w:numFmt w:val="bullet"/>
+      <w:lvlText w:val=""/>
+      <w:lvlJc w:val="left"/>
+      <w:pPr>
+        <w:ind w:left="2520" w:hanging="360"/>
+      </w:pPr>
+      <w:rPr>
+        <w:rFonts w:ascii="Wingdings" w:hAnsi="Wingdings" w:hint="default"/>
+      </w:rPr>
+    </w:lvl>
+    <w:lvl w:ilvl="3" w:tplc="04100001" w:tentative="1">
+      <w:start w:val="1"/>
+      <w:numFmt w:val="bullet"/>
+      <w:lvlText w:val=""/>
+      <w:lvlJc w:val="left"/>
+      <w:pPr>
+        <w:ind w:left="3240" w:hanging="360"/>
+      </w:pPr>
+      <w:rPr>
+        <w:rFonts w:ascii="Symbol" w:hAnsi="Symbol" w:hint="default"/>
+      </w:rPr>
+    </w:lvl>
+    <w:lvl w:ilvl="4" w:tplc="04100003" w:tentative="1">
+      <w:start w:val="1"/>
+      <w:numFmt w:val="bullet"/>
+      <w:lvlText w:val="o"/>
+      <w:lvlJc w:val="left"/>
+      <w:pPr>
+        <w:ind w:left="3960" w:hanging="360"/>
+      </w:pPr>
+      <w:rPr>
+        <w:rFonts w:ascii="Courier New" w:hAnsi="Courier New" w:cs="Courier New" w:hint="default"/>
+      </w:rPr>
+    </w:lvl>
+    <w:lvl w:ilvl="5" w:tplc="04100005" w:tentative="1">
+      <w:start w:val="1"/>
+      <w:numFmt w:val="bullet"/>
+      <w:lvlText w:val=""/>
+      <w:lvlJc w:val="left"/>
+      <w:pPr>
+        <w:ind w:left="4680" w:hanging="360"/>
+      </w:pPr>
+      <w:rPr>
+        <w:rFonts w:ascii="Wingdings" w:hAnsi="Wingdings" w:hint="default"/>
+      </w:rPr>
+    </w:lvl>
+    <w:lvl w:ilvl="6" w:tplc="04100001" w:tentative="1">
+      <w:start w:val="1"/>
+      <w:numFmt w:val="bullet"/>
+      <w:lvlText w:val=""/>
+      <w:lvlJc w:val="left"/>
+      <w:pPr>
+        <w:ind w:left="5400" w:hanging="360"/>
+      </w:pPr>
+      <w:rPr>
+        <w:rFonts w:ascii="Symbol" w:hAnsi="Symbol" w:hint="default"/>
+      </w:rPr>
+    </w:lvl>
+    <w:lvl w:ilvl="7" w:tplc="04100003" w:tentative="1">
+      <w:start w:val="1"/>
+      <w:numFmt w:val="bullet"/>
+      <w:lvlText w:val="o"/>
+      <w:lvlJc w:val="left"/>
+      <w:pPr>
+        <w:ind w:left="6120" w:hanging="360"/>
+      </w:pPr>
+      <w:rPr>
+        <w:rFonts w:ascii="Courier New" w:hAnsi="Courier New" w:cs="Courier New" w:hint="default"/>
+      </w:rPr>
+    </w:lvl>
+    <w:lvl w:ilvl="8" w:tplc="04100005" w:tentative="1">
+      <w:start w:val="1"/>
+      <w:numFmt w:val="bullet"/>
+      <w:lvlText w:val=""/>
+      <w:lvlJc w:val="left"/>
+      <w:pPr>
+        <w:ind w:left="6840" w:hanging="360"/>
+      </w:pPr>
+      <w:rPr>
+        <w:rFonts w:ascii="Wingdings" w:hAnsi="Wingdings" w:hint="default"/>
+      </w:rPr>
+    </w:lvl>
+  </w:abstractNum>
+  <w:abstractNum w:abstractNumId="12" w15:restartNumberingAfterBreak="0">
     <w:nsid w:val="3A6A4225"/>
     <w:multiLevelType w:val="hybridMultilevel"/>
     <w:tmpl w:val="A57E53A0"/>
@@ -4580,120 +5925,120 @@
       </w:rPr>
     </w:lvl>
   </w:abstractNum>
-  <w:abstractNum w:abstractNumId="12" w15:restartNumberingAfterBreak="0">
+  <w:abstractNum w:abstractNumId="13" w15:restartNumberingAfterBreak="0">
     <w:nsid w:val="3AA20608"/>
     <w:multiLevelType w:val="hybridMultilevel"/>
-    <w:tmpl w:val="0B589B44"/>
-    <w:lvl w:ilvl="0" w:tplc="04100001">
+    <w:tmpl w:val="FD741812"/>
+    <w:lvl w:ilvl="0" w:tplc="0410000B">
+      <w:start w:val="1"/>
+      <w:numFmt w:val="bullet"/>
+      <w:lvlText w:val=""/>
+      <w:lvlJc w:val="left"/>
+      <w:pPr>
+        <w:ind w:left="720" w:hanging="360"/>
+      </w:pPr>
+      <w:rPr>
+        <w:rFonts w:ascii="Wingdings" w:hAnsi="Wingdings" w:hint="default"/>
+      </w:rPr>
+    </w:lvl>
+    <w:lvl w:ilvl="1" w:tplc="04100003" w:tentative="1">
+      <w:start w:val="1"/>
+      <w:numFmt w:val="bullet"/>
+      <w:lvlText w:val="o"/>
+      <w:lvlJc w:val="left"/>
+      <w:pPr>
+        <w:ind w:left="1440" w:hanging="360"/>
+      </w:pPr>
+      <w:rPr>
+        <w:rFonts w:ascii="Courier New" w:hAnsi="Courier New" w:cs="Courier New" w:hint="default"/>
+      </w:rPr>
+    </w:lvl>
+    <w:lvl w:ilvl="2" w:tplc="04100005" w:tentative="1">
+      <w:start w:val="1"/>
+      <w:numFmt w:val="bullet"/>
+      <w:lvlText w:val=""/>
+      <w:lvlJc w:val="left"/>
+      <w:pPr>
+        <w:ind w:left="2160" w:hanging="360"/>
+      </w:pPr>
+      <w:rPr>
+        <w:rFonts w:ascii="Wingdings" w:hAnsi="Wingdings" w:hint="default"/>
+      </w:rPr>
+    </w:lvl>
+    <w:lvl w:ilvl="3" w:tplc="04100001" w:tentative="1">
       <w:start w:val="1"/>
       <w:numFmt w:val="bullet"/>
       <w:lvlText w:val=""/>
       <w:lvlJc w:val="left"/>
       <w:pPr>
-        <w:ind w:left="720" w:hanging="360"/>
+        <w:ind w:left="2880" w:hanging="360"/>
       </w:pPr>
       <w:rPr>
         <w:rFonts w:ascii="Symbol" w:hAnsi="Symbol" w:hint="default"/>
       </w:rPr>
     </w:lvl>
-    <w:lvl w:ilvl="1" w:tplc="04100003" w:tentative="1">
+    <w:lvl w:ilvl="4" w:tplc="04100003" w:tentative="1">
       <w:start w:val="1"/>
       <w:numFmt w:val="bullet"/>
       <w:lvlText w:val="o"/>
       <w:lvlJc w:val="left"/>
       <w:pPr>
-        <w:ind w:left="1440" w:hanging="360"/>
+        <w:ind w:left="3600" w:hanging="360"/>
       </w:pPr>
       <w:rPr>
         <w:rFonts w:ascii="Courier New" w:hAnsi="Courier New" w:cs="Courier New" w:hint="default"/>
       </w:rPr>
     </w:lvl>
-    <w:lvl w:ilvl="2" w:tplc="04100005" w:tentative="1">
+    <w:lvl w:ilvl="5" w:tplc="04100005" w:tentative="1">
       <w:start w:val="1"/>
       <w:numFmt w:val="bullet"/>
       <w:lvlText w:val=""/>
       <w:lvlJc w:val="left"/>
       <w:pPr>
-        <w:ind w:left="2160" w:hanging="360"/>
+        <w:ind w:left="4320" w:hanging="360"/>
       </w:pPr>
       <w:rPr>
         <w:rFonts w:ascii="Wingdings" w:hAnsi="Wingdings" w:hint="default"/>
       </w:rPr>
     </w:lvl>
-    <w:lvl w:ilvl="3" w:tplc="04100001" w:tentative="1">
+    <w:lvl w:ilvl="6" w:tplc="04100001" w:tentative="1">
       <w:start w:val="1"/>
       <w:numFmt w:val="bullet"/>
       <w:lvlText w:val=""/>
       <w:lvlJc w:val="left"/>
       <w:pPr>
-        <w:ind w:left="2880" w:hanging="360"/>
+        <w:ind w:left="5040" w:hanging="360"/>
       </w:pPr>
       <w:rPr>
         <w:rFonts w:ascii="Symbol" w:hAnsi="Symbol" w:hint="default"/>
       </w:rPr>
     </w:lvl>
-    <w:lvl w:ilvl="4" w:tplc="04100003" w:tentative="1">
+    <w:lvl w:ilvl="7" w:tplc="04100003" w:tentative="1">
       <w:start w:val="1"/>
       <w:numFmt w:val="bullet"/>
       <w:lvlText w:val="o"/>
       <w:lvlJc w:val="left"/>
       <w:pPr>
-        <w:ind w:left="3600" w:hanging="360"/>
+        <w:ind w:left="5760" w:hanging="360"/>
       </w:pPr>
       <w:rPr>
         <w:rFonts w:ascii="Courier New" w:hAnsi="Courier New" w:cs="Courier New" w:hint="default"/>
       </w:rPr>
     </w:lvl>
-    <w:lvl w:ilvl="5" w:tplc="04100005" w:tentative="1">
+    <w:lvl w:ilvl="8" w:tplc="04100005" w:tentative="1">
       <w:start w:val="1"/>
       <w:numFmt w:val="bullet"/>
       <w:lvlText w:val=""/>
       <w:lvlJc w:val="left"/>
       <w:pPr>
-        <w:ind w:left="4320" w:hanging="360"/>
+        <w:ind w:left="6480" w:hanging="360"/>
       </w:pPr>
       <w:rPr>
         <w:rFonts w:ascii="Wingdings" w:hAnsi="Wingdings" w:hint="default"/>
       </w:rPr>
     </w:lvl>
-    <w:lvl w:ilvl="6" w:tplc="04100001" w:tentative="1">
-      <w:start w:val="1"/>
-      <w:numFmt w:val="bullet"/>
-      <w:lvlText w:val=""/>
-      <w:lvlJc w:val="left"/>
-      <w:pPr>
-        <w:ind w:left="5040" w:hanging="360"/>
-      </w:pPr>
-      <w:rPr>
-        <w:rFonts w:ascii="Symbol" w:hAnsi="Symbol" w:hint="default"/>
-      </w:rPr>
-    </w:lvl>
-    <w:lvl w:ilvl="7" w:tplc="04100003" w:tentative="1">
-      <w:start w:val="1"/>
-      <w:numFmt w:val="bullet"/>
-      <w:lvlText w:val="o"/>
-      <w:lvlJc w:val="left"/>
-      <w:pPr>
-        <w:ind w:left="5760" w:hanging="360"/>
-      </w:pPr>
-      <w:rPr>
-        <w:rFonts w:ascii="Courier New" w:hAnsi="Courier New" w:cs="Courier New" w:hint="default"/>
-      </w:rPr>
-    </w:lvl>
-    <w:lvl w:ilvl="8" w:tplc="04100005" w:tentative="1">
-      <w:start w:val="1"/>
-      <w:numFmt w:val="bullet"/>
-      <w:lvlText w:val=""/>
-      <w:lvlJc w:val="left"/>
-      <w:pPr>
-        <w:ind w:left="6480" w:hanging="360"/>
-      </w:pPr>
-      <w:rPr>
-        <w:rFonts w:ascii="Wingdings" w:hAnsi="Wingdings" w:hint="default"/>
-      </w:rPr>
-    </w:lvl>
   </w:abstractNum>
-  <w:abstractNum w:abstractNumId="13" w15:restartNumberingAfterBreak="0">
+  <w:abstractNum w:abstractNumId="14" w15:restartNumberingAfterBreak="0">
     <w:nsid w:val="3B934199"/>
     <w:multiLevelType w:val="hybridMultilevel"/>
     <w:tmpl w:val="A2503E10"/>
@@ -4806,7 +6151,120 @@
       </w:rPr>
     </w:lvl>
   </w:abstractNum>
-  <w:abstractNum w:abstractNumId="14" w15:restartNumberingAfterBreak="0">
+  <w:abstractNum w:abstractNumId="15" w15:restartNumberingAfterBreak="0">
+    <w:nsid w:val="3DF2400F"/>
+    <w:multiLevelType w:val="hybridMultilevel"/>
+    <w:tmpl w:val="9CB690B4"/>
+    <w:lvl w:ilvl="0" w:tplc="0410000B">
+      <w:start w:val="1"/>
+      <w:numFmt w:val="bullet"/>
+      <w:lvlText w:val=""/>
+      <w:lvlJc w:val="left"/>
+      <w:pPr>
+        <w:ind w:left="1080" w:hanging="360"/>
+      </w:pPr>
+      <w:rPr>
+        <w:rFonts w:ascii="Wingdings" w:hAnsi="Wingdings" w:hint="default"/>
+      </w:rPr>
+    </w:lvl>
+    <w:lvl w:ilvl="1" w:tplc="04100003" w:tentative="1">
+      <w:start w:val="1"/>
+      <w:numFmt w:val="bullet"/>
+      <w:lvlText w:val="o"/>
+      <w:lvlJc w:val="left"/>
+      <w:pPr>
+        <w:ind w:left="1800" w:hanging="360"/>
+      </w:pPr>
+      <w:rPr>
+        <w:rFonts w:ascii="Courier New" w:hAnsi="Courier New" w:cs="Courier New" w:hint="default"/>
+      </w:rPr>
+    </w:lvl>
+    <w:lvl w:ilvl="2" w:tplc="04100005" w:tentative="1">
+      <w:start w:val="1"/>
+      <w:numFmt w:val="bullet"/>
+      <w:lvlText w:val=""/>
+      <w:lvlJc w:val="left"/>
+      <w:pPr>
+        <w:ind w:left="2520" w:hanging="360"/>
+      </w:pPr>
+      <w:rPr>
+        <w:rFonts w:ascii="Wingdings" w:hAnsi="Wingdings" w:hint="default"/>
+      </w:rPr>
+    </w:lvl>
+    <w:lvl w:ilvl="3" w:tplc="04100001" w:tentative="1">
+      <w:start w:val="1"/>
+      <w:numFmt w:val="bullet"/>
+      <w:lvlText w:val=""/>
+      <w:lvlJc w:val="left"/>
+      <w:pPr>
+        <w:ind w:left="3240" w:hanging="360"/>
+      </w:pPr>
+      <w:rPr>
+        <w:rFonts w:ascii="Symbol" w:hAnsi="Symbol" w:hint="default"/>
+      </w:rPr>
+    </w:lvl>
+    <w:lvl w:ilvl="4" w:tplc="04100003" w:tentative="1">
+      <w:start w:val="1"/>
+      <w:numFmt w:val="bullet"/>
+      <w:lvlText w:val="o"/>
+      <w:lvlJc w:val="left"/>
+      <w:pPr>
+        <w:ind w:left="3960" w:hanging="360"/>
+      </w:pPr>
+      <w:rPr>
+        <w:rFonts w:ascii="Courier New" w:hAnsi="Courier New" w:cs="Courier New" w:hint="default"/>
+      </w:rPr>
+    </w:lvl>
+    <w:lvl w:ilvl="5" w:tplc="04100005" w:tentative="1">
+      <w:start w:val="1"/>
+      <w:numFmt w:val="bullet"/>
+      <w:lvlText w:val=""/>
+      <w:lvlJc w:val="left"/>
+      <w:pPr>
+        <w:ind w:left="4680" w:hanging="360"/>
+      </w:pPr>
+      <w:rPr>
+        <w:rFonts w:ascii="Wingdings" w:hAnsi="Wingdings" w:hint="default"/>
+      </w:rPr>
+    </w:lvl>
+    <w:lvl w:ilvl="6" w:tplc="04100001" w:tentative="1">
+      <w:start w:val="1"/>
+      <w:numFmt w:val="bullet"/>
+      <w:lvlText w:val=""/>
+      <w:lvlJc w:val="left"/>
+      <w:pPr>
+        <w:ind w:left="5400" w:hanging="360"/>
+      </w:pPr>
+      <w:rPr>
+        <w:rFonts w:ascii="Symbol" w:hAnsi="Symbol" w:hint="default"/>
+      </w:rPr>
+    </w:lvl>
+    <w:lvl w:ilvl="7" w:tplc="04100003" w:tentative="1">
+      <w:start w:val="1"/>
+      <w:numFmt w:val="bullet"/>
+      <w:lvlText w:val="o"/>
+      <w:lvlJc w:val="left"/>
+      <w:pPr>
+        <w:ind w:left="6120" w:hanging="360"/>
+      </w:pPr>
+      <w:rPr>
+        <w:rFonts w:ascii="Courier New" w:hAnsi="Courier New" w:cs="Courier New" w:hint="default"/>
+      </w:rPr>
+    </w:lvl>
+    <w:lvl w:ilvl="8" w:tplc="04100005" w:tentative="1">
+      <w:start w:val="1"/>
+      <w:numFmt w:val="bullet"/>
+      <w:lvlText w:val=""/>
+      <w:lvlJc w:val="left"/>
+      <w:pPr>
+        <w:ind w:left="6840" w:hanging="360"/>
+      </w:pPr>
+      <w:rPr>
+        <w:rFonts w:ascii="Wingdings" w:hAnsi="Wingdings" w:hint="default"/>
+      </w:rPr>
+    </w:lvl>
+  </w:abstractNum>
+  <w:abstractNum w:abstractNumId="16" w15:restartNumberingAfterBreak="0">
     <w:nsid w:val="42F31A3D"/>
     <w:multiLevelType w:val="multilevel"/>
     <w:tmpl w:val="C8F4DA3C"/>
@@ -4927,7 +6385,7 @@
       </w:rPr>
     </w:lvl>
   </w:abstractNum>
-  <w:abstractNum w:abstractNumId="15" w15:restartNumberingAfterBreak="0">
+  <w:abstractNum w:abstractNumId="17" w15:restartNumberingAfterBreak="0">
     <w:nsid w:val="4E351B2A"/>
     <w:multiLevelType w:val="hybridMultilevel"/>
     <w:tmpl w:val="E5E62C26"/>
@@ -5016,7 +6474,7 @@
       </w:pPr>
     </w:lvl>
   </w:abstractNum>
-  <w:abstractNum w:abstractNumId="16" w15:restartNumberingAfterBreak="0">
+  <w:abstractNum w:abstractNumId="18" w15:restartNumberingAfterBreak="0">
     <w:nsid w:val="4F954ED4"/>
     <w:multiLevelType w:val="hybridMultilevel"/>
     <w:tmpl w:val="DE9A52BA"/>
@@ -5129,10 +6587,10 @@
       </w:rPr>
     </w:lvl>
   </w:abstractNum>
-  <w:abstractNum w:abstractNumId="17" w15:restartNumberingAfterBreak="0">
+  <w:abstractNum w:abstractNumId="19" w15:restartNumberingAfterBreak="0">
     <w:nsid w:val="63D3517E"/>
     <w:multiLevelType w:val="hybridMultilevel"/>
-    <w:tmpl w:val="50C29578"/>
+    <w:tmpl w:val="420E8CF2"/>
     <w:lvl w:ilvl="0" w:tplc="04100003">
       <w:start w:val="1"/>
       <w:numFmt w:val="bullet"/>
@@ -5242,7 +6700,7 @@
       </w:rPr>
     </w:lvl>
   </w:abstractNum>
-  <w:abstractNum w:abstractNumId="18" w15:restartNumberingAfterBreak="0">
+  <w:abstractNum w:abstractNumId="20" w15:restartNumberingAfterBreak="0">
     <w:nsid w:val="687E0260"/>
     <w:multiLevelType w:val="multilevel"/>
     <w:tmpl w:val="00000001"/>
@@ -5355,7 +6813,7 @@
       </w:pPr>
     </w:lvl>
   </w:abstractNum>
-  <w:abstractNum w:abstractNumId="19" w15:restartNumberingAfterBreak="0">
+  <w:abstractNum w:abstractNumId="21" w15:restartNumberingAfterBreak="0">
     <w:nsid w:val="74E12702"/>
     <w:multiLevelType w:val="hybridMultilevel"/>
     <w:tmpl w:val="60F880AA"/>
@@ -5441,7 +6899,7 @@
       </w:pPr>
     </w:lvl>
   </w:abstractNum>
-  <w:abstractNum w:abstractNumId="20" w15:restartNumberingAfterBreak="0">
+  <w:abstractNum w:abstractNumId="22" w15:restartNumberingAfterBreak="0">
     <w:nsid w:val="7CCE2BA3"/>
     <w:multiLevelType w:val="hybridMultilevel"/>
     <w:tmpl w:val="A20AD9D2"/>
@@ -5543,10 +7001,10 @@
     <w:abstractNumId w:val="4"/>
   </w:num>
   <w:num w:numId="6" w16cid:durableId="1681200572">
-    <w:abstractNumId w:val="14"/>
+    <w:abstractNumId w:val="16"/>
   </w:num>
   <w:num w:numId="7" w16cid:durableId="2071003935">
-    <w:abstractNumId w:val="18"/>
+    <w:abstractNumId w:val="20"/>
   </w:num>
   <w:num w:numId="8" w16cid:durableId="1540438857">
     <w:abstractNumId w:val="8"/>
@@ -5555,7 +7013,7 @@
     <w:abstractNumId w:val="8"/>
   </w:num>
   <w:num w:numId="10" w16cid:durableId="636185670">
-    <w:abstractNumId w:val="11"/>
+    <w:abstractNumId w:val="12"/>
   </w:num>
   <w:num w:numId="11" w16cid:durableId="2026519637">
     <w:abstractNumId w:val="9"/>
@@ -5564,25 +7022,25 @@
     <w:abstractNumId w:val="6"/>
   </w:num>
   <w:num w:numId="13" w16cid:durableId="1680347482">
-    <w:abstractNumId w:val="15"/>
+    <w:abstractNumId w:val="17"/>
   </w:num>
   <w:num w:numId="14" w16cid:durableId="1266769575">
-    <w:abstractNumId w:val="12"/>
+    <w:abstractNumId w:val="13"/>
   </w:num>
   <w:num w:numId="15" w16cid:durableId="16659908">
-    <w:abstractNumId w:val="17"/>
+    <w:abstractNumId w:val="19"/>
   </w:num>
   <w:num w:numId="16" w16cid:durableId="1862696292">
-    <w:abstractNumId w:val="16"/>
+    <w:abstractNumId w:val="18"/>
   </w:num>
   <w:num w:numId="17" w16cid:durableId="646474099">
     <w:abstractNumId w:val="7"/>
   </w:num>
   <w:num w:numId="18" w16cid:durableId="1793285127">
-    <w:abstractNumId w:val="13"/>
+    <w:abstractNumId w:val="14"/>
   </w:num>
   <w:num w:numId="19" w16cid:durableId="202911112">
-    <w:abstractNumId w:val="20"/>
+    <w:abstractNumId w:val="22"/>
   </w:num>
   <w:num w:numId="20" w16cid:durableId="4943408">
     <w:abstractNumId w:val="5"/>
@@ -5591,13 +7049,19 @@
     <w:abstractNumId w:val="10"/>
   </w:num>
   <w:num w:numId="22" w16cid:durableId="510147163">
-    <w:abstractNumId w:val="19"/>
+    <w:abstractNumId w:val="21"/>
+  </w:num>
+  <w:num w:numId="23" w16cid:durableId="1096175075">
+    <w:abstractNumId w:val="15"/>
+  </w:num>
+  <w:num w:numId="24" w16cid:durableId="353848472">
+    <w:abstractNumId w:val="11"/>
   </w:num>
 </w:numbering>
 </file>
 
 <file path=word/styles.xml><?xml version="1.0" encoding="utf-8"?>
-<w:styles xmlns:mc="http://schemas.openxmlformats.org/markup-compatibility/2006" xmlns:r="http://schemas.openxmlformats.org/officeDocument/2006/relationships" xmlns:w="http://schemas.openxmlformats.org/wordprocessingml/2006/main" xmlns:w14="http://schemas.microsoft.com/office/word/2010/wordml" xmlns:w15="http://schemas.microsoft.com/office/word/2012/wordml" xmlns:w16cex="http://schemas.microsoft.com/office/word/2018/wordml/cex" xmlns:w16cid="http://schemas.microsoft.com/office/word/2016/wordml/cid" xmlns:w16="http://schemas.microsoft.com/office/word/2018/wordml" xmlns:w16sdtdh="http://schemas.microsoft.com/office/word/2020/wordml/sdtdatahash" xmlns:w16sdtfl="http://schemas.microsoft.com/office/word/2024/wordml/sdtformatlock" xmlns:w16se="http://schemas.microsoft.com/office/word/2015/wordml/symex" xmlns:w16du="http://schemas.microsoft.com/office/word/2023/wordml/word16du" mc:Ignorable="w14 w15 w16se w16cid w16 w16cex w16sdtdh w16sdtfl w16du">
+<w:styles xmlns:mc="http://schemas.openxmlformats.org/markup-compatibility/2006" xmlns:r="http://schemas.openxmlformats.org/officeDocument/2006/relationships" xmlns:w="http://schemas.openxmlformats.org/wordprocessingml/2006/main" xmlns:w14="http://schemas.microsoft.com/office/word/2010/wordml" xmlns:w15="http://schemas.microsoft.com/office/word/2012/wordml" xmlns:w16cex="http://schemas.microsoft.com/office/word/2018/wordml/cex" xmlns:w16cid="http://schemas.microsoft.com/office/word/2016/wordml/cid" xmlns:w16="http://schemas.microsoft.com/office/word/2018/wordml" xmlns:w16du="http://schemas.microsoft.com/office/word/2023/wordml/word16du" xmlns:w16sdtdh="http://schemas.microsoft.com/office/word/2020/wordml/sdtdatahash" xmlns:w16sdtfl="http://schemas.microsoft.com/office/word/2024/wordml/sdtformatlock" xmlns:w16se="http://schemas.microsoft.com/office/word/2015/wordml/symex" mc:Ignorable="w14 w15 w16se w16cid w16 w16cex w16sdtdh w16sdtfl w16du">
   <w:docDefaults>
     <w:rPrDefault>
       <w:rPr>

</xml_diff>

<commit_message>
corretti alcuni dettagli dei vari scenari, aggiunto un requisito funzionale per il market analyzer
</commit_message>
<xml_diff>
--- a/Deliverables/ProblemStatement_GGEyewear.docx
+++ b/Deliverables/ProblemStatement_GGEyewear.docx
@@ -153,26 +153,7 @@
           <w:lang w:val="en-US"/>
         </w:rPr>
         <w:br/>
-      </w:r>
-      <w:proofErr w:type="spellStart"/>
-      <w:r>
-        <w:rPr>
-          <w:rFonts w:ascii="Arial" w:hAnsi="Arial"/>
-          <w:b/>
-          <w:sz w:val="36"/>
-          <w:lang w:val="en-US"/>
-        </w:rPr>
-        <w:t>Versione</w:t>
-      </w:r>
-      <w:proofErr w:type="spellEnd"/>
-      <w:r>
-        <w:rPr>
-          <w:rFonts w:ascii="Arial" w:hAnsi="Arial"/>
-          <w:b/>
-          <w:sz w:val="36"/>
-          <w:lang w:val="en-US"/>
-        </w:rPr>
-        <w:t xml:space="preserve"> </w:t>
+        <w:t xml:space="preserve">Versione </w:t>
       </w:r>
       <w:r>
         <w:rPr>
@@ -199,7 +180,7 @@
           <w:sz w:val="36"/>
           <w:lang w:val="en-US"/>
         </w:rPr>
-        <w:t>4</w:t>
+        <w:t>5</w:t>
       </w:r>
       <w:r>
         <w:rPr>
@@ -1180,49 +1161,7 @@
               <w:rPr>
                 <w:sz w:val="20"/>
               </w:rPr>
-              <w:t xml:space="preserve">del </w:t>
-            </w:r>
-            <w:proofErr w:type="spellStart"/>
-            <w:r>
-              <w:rPr>
-                <w:sz w:val="20"/>
-              </w:rPr>
-              <w:t>problem</w:t>
-            </w:r>
-            <w:proofErr w:type="spellEnd"/>
-            <w:r>
-              <w:rPr>
-                <w:sz w:val="20"/>
-              </w:rPr>
-              <w:t xml:space="preserve"> </w:t>
-            </w:r>
-            <w:proofErr w:type="spellStart"/>
-            <w:r>
-              <w:rPr>
-                <w:sz w:val="20"/>
-              </w:rPr>
-              <w:t>statement</w:t>
-            </w:r>
-            <w:proofErr w:type="spellEnd"/>
-            <w:r>
-              <w:rPr>
-                <w:sz w:val="20"/>
-              </w:rPr>
-              <w:t xml:space="preserve"> con </w:t>
-            </w:r>
-            <w:proofErr w:type="spellStart"/>
-            <w:r>
-              <w:rPr>
-                <w:sz w:val="20"/>
-              </w:rPr>
-              <w:t>problem</w:t>
-            </w:r>
-            <w:proofErr w:type="spellEnd"/>
-            <w:r>
-              <w:rPr>
-                <w:sz w:val="20"/>
-              </w:rPr>
-              <w:t xml:space="preserve"> domain, scenari possibili e requisiti funzionali (</w:t>
+              <w:t>del problem statement con problem domain, scenari possibili e requisiti funzionali (</w:t>
             </w:r>
             <w:r>
               <w:rPr>
@@ -1691,6 +1630,12 @@
                 <w:sz w:val="20"/>
               </w:rPr>
             </w:pPr>
+            <w:r>
+              <w:rPr>
+                <w:sz w:val="20"/>
+              </w:rPr>
+              <w:t>13/10/2026</w:t>
+            </w:r>
           </w:p>
         </w:tc>
         <w:tc>
@@ -1709,6 +1654,12 @@
                 <w:sz w:val="20"/>
               </w:rPr>
             </w:pPr>
+            <w:r>
+              <w:rPr>
+                <w:sz w:val="20"/>
+              </w:rPr>
+              <w:t>1.5</w:t>
+            </w:r>
           </w:p>
         </w:tc>
         <w:tc>
@@ -1727,6 +1678,12 @@
                 <w:sz w:val="20"/>
               </w:rPr>
             </w:pPr>
+            <w:r>
+              <w:rPr>
+                <w:sz w:val="20"/>
+              </w:rPr>
+              <w:t>Correzioni su scenari, aggiunta di requisito funzionale per Market Analyzer</w:t>
+            </w:r>
           </w:p>
         </w:tc>
         <w:tc>
@@ -1746,6 +1703,12 @@
                 <w:sz w:val="20"/>
               </w:rPr>
             </w:pPr>
+            <w:r>
+              <w:rPr>
+                <w:sz w:val="20"/>
+              </w:rPr>
+              <w:t>Angelica D’Aquila</w:t>
+            </w:r>
           </w:p>
         </w:tc>
       </w:tr>
@@ -1822,10 +1785,9 @@
           <w:tab w:val="left" w:pos="566"/>
         </w:tabs>
         <w:rPr>
-          <w:rFonts w:asciiTheme="minorHAnsi" w:eastAsiaTheme="minorEastAsia" w:hAnsiTheme="minorHAnsi" w:cstheme="minorBidi"/>
+          <w:rFonts w:ascii="Aptos" w:eastAsia="Times New Roman" w:hAnsi="Aptos" w:cs="Times New Roman"/>
           <w:noProof/>
           <w:kern w:val="2"/>
-          <w14:ligatures w14:val="standardContextual"/>
         </w:rPr>
       </w:pPr>
       <w:r>
@@ -1847,10 +1809,9 @@
         </w:r>
         <w:r>
           <w:rPr>
-            <w:rFonts w:asciiTheme="minorHAnsi" w:eastAsiaTheme="minorEastAsia" w:hAnsiTheme="minorHAnsi" w:cstheme="minorBidi"/>
+            <w:rFonts w:ascii="Aptos" w:eastAsia="Times New Roman" w:hAnsi="Aptos" w:cs="Times New Roman"/>
             <w:noProof/>
             <w:kern w:val="2"/>
-            <w14:ligatures w14:val="standardContextual"/>
           </w:rPr>
           <w:tab/>
         </w:r>
@@ -1918,10 +1879,9 @@
           <w:tab w:val="left" w:pos="566"/>
         </w:tabs>
         <w:rPr>
-          <w:rFonts w:asciiTheme="minorHAnsi" w:eastAsiaTheme="minorEastAsia" w:hAnsiTheme="minorHAnsi" w:cstheme="minorBidi"/>
+          <w:rFonts w:ascii="Aptos" w:eastAsia="Times New Roman" w:hAnsi="Aptos" w:cs="Times New Roman"/>
           <w:noProof/>
           <w:kern w:val="2"/>
-          <w14:ligatures w14:val="standardContextual"/>
         </w:rPr>
       </w:pPr>
       <w:hyperlink w:anchor="_Toc242783792" w:history="1">
@@ -1934,10 +1894,9 @@
         </w:r>
         <w:r>
           <w:rPr>
-            <w:rFonts w:asciiTheme="minorHAnsi" w:eastAsiaTheme="minorEastAsia" w:hAnsiTheme="minorHAnsi" w:cstheme="minorBidi"/>
+            <w:rFonts w:ascii="Aptos" w:eastAsia="Times New Roman" w:hAnsi="Aptos" w:cs="Times New Roman"/>
             <w:noProof/>
             <w:kern w:val="2"/>
-            <w14:ligatures w14:val="standardContextual"/>
           </w:rPr>
           <w:tab/>
         </w:r>
@@ -2005,10 +1964,9 @@
           <w:tab w:val="left" w:pos="849"/>
         </w:tabs>
         <w:rPr>
-          <w:rFonts w:asciiTheme="minorHAnsi" w:eastAsiaTheme="minorEastAsia" w:hAnsiTheme="minorHAnsi" w:cstheme="minorBidi"/>
+          <w:rFonts w:ascii="Aptos" w:eastAsia="Times New Roman" w:hAnsi="Aptos" w:cs="Times New Roman"/>
           <w:noProof/>
           <w:kern w:val="2"/>
-          <w14:ligatures w14:val="standardContextual"/>
         </w:rPr>
       </w:pPr>
       <w:hyperlink w:anchor="_Toc242783793" w:history="1">
@@ -2021,10 +1979,9 @@
         </w:r>
         <w:r>
           <w:rPr>
-            <w:rFonts w:asciiTheme="minorHAnsi" w:eastAsiaTheme="minorEastAsia" w:hAnsiTheme="minorHAnsi" w:cstheme="minorBidi"/>
+            <w:rFonts w:ascii="Aptos" w:eastAsia="Times New Roman" w:hAnsi="Aptos" w:cs="Times New Roman"/>
             <w:noProof/>
             <w:kern w:val="2"/>
-            <w14:ligatures w14:val="standardContextual"/>
           </w:rPr>
           <w:tab/>
         </w:r>
@@ -2092,10 +2049,9 @@
           <w:tab w:val="left" w:pos="849"/>
         </w:tabs>
         <w:rPr>
-          <w:rFonts w:asciiTheme="minorHAnsi" w:eastAsiaTheme="minorEastAsia" w:hAnsiTheme="minorHAnsi" w:cstheme="minorBidi"/>
+          <w:rFonts w:ascii="Aptos" w:eastAsia="Times New Roman" w:hAnsi="Aptos" w:cs="Times New Roman"/>
           <w:noProof/>
           <w:kern w:val="2"/>
-          <w14:ligatures w14:val="standardContextual"/>
         </w:rPr>
       </w:pPr>
       <w:hyperlink w:anchor="_Toc242783794" w:history="1">
@@ -2108,10 +2064,9 @@
         </w:r>
         <w:r>
           <w:rPr>
-            <w:rFonts w:asciiTheme="minorHAnsi" w:eastAsiaTheme="minorEastAsia" w:hAnsiTheme="minorHAnsi" w:cstheme="minorBidi"/>
+            <w:rFonts w:ascii="Aptos" w:eastAsia="Times New Roman" w:hAnsi="Aptos" w:cs="Times New Roman"/>
             <w:noProof/>
             <w:kern w:val="2"/>
-            <w14:ligatures w14:val="standardContextual"/>
           </w:rPr>
           <w:tab/>
         </w:r>
@@ -2179,10 +2134,9 @@
           <w:tab w:val="left" w:pos="849"/>
         </w:tabs>
         <w:rPr>
-          <w:rFonts w:asciiTheme="minorHAnsi" w:eastAsiaTheme="minorEastAsia" w:hAnsiTheme="minorHAnsi" w:cstheme="minorBidi"/>
+          <w:rFonts w:ascii="Aptos" w:eastAsia="Times New Roman" w:hAnsi="Aptos" w:cs="Times New Roman"/>
           <w:noProof/>
           <w:kern w:val="2"/>
-          <w14:ligatures w14:val="standardContextual"/>
         </w:rPr>
       </w:pPr>
       <w:hyperlink w:anchor="_Toc242783795" w:history="1">
@@ -2195,10 +2149,9 @@
         </w:r>
         <w:r>
           <w:rPr>
-            <w:rFonts w:asciiTheme="minorHAnsi" w:eastAsiaTheme="minorEastAsia" w:hAnsiTheme="minorHAnsi" w:cstheme="minorBidi"/>
+            <w:rFonts w:ascii="Aptos" w:eastAsia="Times New Roman" w:hAnsi="Aptos" w:cs="Times New Roman"/>
             <w:noProof/>
             <w:kern w:val="2"/>
-            <w14:ligatures w14:val="standardContextual"/>
           </w:rPr>
           <w:tab/>
         </w:r>
@@ -2266,10 +2219,9 @@
           <w:tab w:val="left" w:pos="849"/>
         </w:tabs>
         <w:rPr>
-          <w:rFonts w:asciiTheme="minorHAnsi" w:eastAsiaTheme="minorEastAsia" w:hAnsiTheme="minorHAnsi" w:cstheme="minorBidi"/>
+          <w:rFonts w:ascii="Aptos" w:eastAsia="Times New Roman" w:hAnsi="Aptos" w:cs="Times New Roman"/>
           <w:noProof/>
           <w:kern w:val="2"/>
-          <w14:ligatures w14:val="standardContextual"/>
         </w:rPr>
       </w:pPr>
       <w:hyperlink w:anchor="_Toc242783796" w:history="1">
@@ -2282,10 +2234,9 @@
         </w:r>
         <w:r>
           <w:rPr>
-            <w:rFonts w:asciiTheme="minorHAnsi" w:eastAsiaTheme="minorEastAsia" w:hAnsiTheme="minorHAnsi" w:cstheme="minorBidi"/>
+            <w:rFonts w:ascii="Aptos" w:eastAsia="Times New Roman" w:hAnsi="Aptos" w:cs="Times New Roman"/>
             <w:noProof/>
             <w:kern w:val="2"/>
-            <w14:ligatures w14:val="standardContextual"/>
           </w:rPr>
           <w:tab/>
         </w:r>
@@ -2353,10 +2304,9 @@
           <w:tab w:val="left" w:pos="566"/>
         </w:tabs>
         <w:rPr>
-          <w:rFonts w:asciiTheme="minorHAnsi" w:eastAsiaTheme="minorEastAsia" w:hAnsiTheme="minorHAnsi" w:cstheme="minorBidi"/>
+          <w:rFonts w:ascii="Aptos" w:eastAsia="Times New Roman" w:hAnsi="Aptos" w:cs="Times New Roman"/>
           <w:noProof/>
           <w:kern w:val="2"/>
-          <w14:ligatures w14:val="standardContextual"/>
         </w:rPr>
       </w:pPr>
       <w:hyperlink w:anchor="_Toc242783797" w:history="1">
@@ -2369,10 +2319,9 @@
         </w:r>
         <w:r>
           <w:rPr>
-            <w:rFonts w:asciiTheme="minorHAnsi" w:eastAsiaTheme="minorEastAsia" w:hAnsiTheme="minorHAnsi" w:cstheme="minorBidi"/>
+            <w:rFonts w:ascii="Aptos" w:eastAsia="Times New Roman" w:hAnsi="Aptos" w:cs="Times New Roman"/>
             <w:noProof/>
             <w:kern w:val="2"/>
-            <w14:ligatures w14:val="standardContextual"/>
           </w:rPr>
           <w:tab/>
         </w:r>
@@ -2440,10 +2389,9 @@
           <w:tab w:val="left" w:pos="566"/>
         </w:tabs>
         <w:rPr>
-          <w:rFonts w:asciiTheme="minorHAnsi" w:eastAsiaTheme="minorEastAsia" w:hAnsiTheme="minorHAnsi" w:cstheme="minorBidi"/>
+          <w:rFonts w:ascii="Aptos" w:eastAsia="Times New Roman" w:hAnsi="Aptos" w:cs="Times New Roman"/>
           <w:noProof/>
           <w:kern w:val="2"/>
-          <w14:ligatures w14:val="standardContextual"/>
         </w:rPr>
       </w:pPr>
       <w:hyperlink w:anchor="_Toc242783798" w:history="1">
@@ -2456,10 +2404,9 @@
         </w:r>
         <w:r>
           <w:rPr>
-            <w:rFonts w:asciiTheme="minorHAnsi" w:eastAsiaTheme="minorEastAsia" w:hAnsiTheme="minorHAnsi" w:cstheme="minorBidi"/>
+            <w:rFonts w:ascii="Aptos" w:eastAsia="Times New Roman" w:hAnsi="Aptos" w:cs="Times New Roman"/>
             <w:noProof/>
             <w:kern w:val="2"/>
-            <w14:ligatures w14:val="standardContextual"/>
           </w:rPr>
           <w:tab/>
         </w:r>
@@ -2527,10 +2474,9 @@
           <w:tab w:val="left" w:pos="566"/>
         </w:tabs>
         <w:rPr>
-          <w:rFonts w:asciiTheme="minorHAnsi" w:eastAsiaTheme="minorEastAsia" w:hAnsiTheme="minorHAnsi" w:cstheme="minorBidi"/>
+          <w:rFonts w:ascii="Aptos" w:eastAsia="Times New Roman" w:hAnsi="Aptos" w:cs="Times New Roman"/>
           <w:noProof/>
           <w:kern w:val="2"/>
-          <w14:ligatures w14:val="standardContextual"/>
         </w:rPr>
       </w:pPr>
       <w:hyperlink w:anchor="_Toc242783799" w:history="1">
@@ -2543,10 +2489,9 @@
         </w:r>
         <w:r>
           <w:rPr>
-            <w:rFonts w:asciiTheme="minorHAnsi" w:eastAsiaTheme="minorEastAsia" w:hAnsiTheme="minorHAnsi" w:cstheme="minorBidi"/>
+            <w:rFonts w:ascii="Aptos" w:eastAsia="Times New Roman" w:hAnsi="Aptos" w:cs="Times New Roman"/>
             <w:noProof/>
             <w:kern w:val="2"/>
-            <w14:ligatures w14:val="standardContextual"/>
           </w:rPr>
           <w:tab/>
         </w:r>
@@ -2614,10 +2559,9 @@
           <w:tab w:val="left" w:pos="566"/>
         </w:tabs>
         <w:rPr>
-          <w:rFonts w:asciiTheme="minorHAnsi" w:eastAsiaTheme="minorEastAsia" w:hAnsiTheme="minorHAnsi" w:cstheme="minorBidi"/>
+          <w:rFonts w:ascii="Aptos" w:eastAsia="Times New Roman" w:hAnsi="Aptos" w:cs="Times New Roman"/>
           <w:noProof/>
           <w:kern w:val="2"/>
-          <w14:ligatures w14:val="standardContextual"/>
         </w:rPr>
       </w:pPr>
       <w:hyperlink w:anchor="_Toc242783800" w:history="1">
@@ -2630,10 +2574,9 @@
         </w:r>
         <w:r>
           <w:rPr>
-            <w:rFonts w:asciiTheme="minorHAnsi" w:eastAsiaTheme="minorEastAsia" w:hAnsiTheme="minorHAnsi" w:cstheme="minorBidi"/>
+            <w:rFonts w:ascii="Aptos" w:eastAsia="Times New Roman" w:hAnsi="Aptos" w:cs="Times New Roman"/>
             <w:noProof/>
             <w:kern w:val="2"/>
-            <w14:ligatures w14:val="standardContextual"/>
           </w:rPr>
           <w:tab/>
         </w:r>
@@ -2760,10 +2703,10 @@
     </w:p>
     <w:p>
       <w:r>
-        <w:t>L’obiettivo è quindi di fornire un negozio online che permette ai clienti di avere un’esperienza di acquisto fluida e semplice, e dare alcuni strumenti a delle figure specifiche identificate dal negozio per fare analisi di marketing e portare prodotti che hanno una possibilità maggiore di essere acquistati</w:t>
-      </w:r>
-      <w:r>
-        <w:t>.</w:t>
+        <w:t xml:space="preserve">L’obiettivo è quindi di fornire un negozio online che permette ai clienti di avere un’esperienza di acquisto fluida e semplice, e dare alcuni strumenti a delle figure specifiche identificate dal negozio per fare analisi di marketing e </w:t>
+      </w:r>
+      <w:r>
+        <w:t>di conseguenza capire quali prodotti hanno una maggiore possibilità di essere acquistati</w:t>
       </w:r>
     </w:p>
     <w:p/>
@@ -2827,7 +2770,13 @@
         <w:t>l’icona del</w:t>
       </w:r>
       <w:r>
-        <w:t xml:space="preserve"> prodotto e viene portato a una pagina con il dettaglio del prodotto</w:t>
+        <w:t xml:space="preserve"> prodotto e viene portato a una pagina </w:t>
+      </w:r>
+      <w:r>
+        <w:t xml:space="preserve">con il dettaglio </w:t>
+      </w:r>
+      <w:r>
+        <w:t>del prodotto</w:t>
       </w:r>
       <w:r>
         <w:t xml:space="preserve"> selezionato</w:t>
@@ -2845,19 +2794,28 @@
         <w:t xml:space="preserve"> foto</w:t>
       </w:r>
       <w:r>
-        <w:t xml:space="preserve"> dell’occhiale (dove può selezionare la foto in primo piano da visualizzare)</w:t>
+        <w:t xml:space="preserve"> </w:t>
+      </w:r>
+      <w:r>
+        <w:t>del paio di occhiali</w:t>
+      </w:r>
+      <w:r>
+        <w:t xml:space="preserve"> (dove può selezionare la foto in primo piano da visualizzare)</w:t>
       </w:r>
       <w:r>
         <w:t>,</w:t>
       </w:r>
       <w:r>
-        <w:t xml:space="preserve"> una</w:t>
-      </w:r>
-      <w:r>
-        <w:t xml:space="preserve"> descrizione</w:t>
-      </w:r>
-      <w:r>
-        <w:t xml:space="preserve"> con i relativi dettagli come prezzo e valutazione media delle recensioni e</w:t>
+        <w:t xml:space="preserve"> il </w:t>
+      </w:r>
+      <w:r>
+        <w:t xml:space="preserve"> prezzo</w:t>
+      </w:r>
+      <w:r>
+        <w:t xml:space="preserve">, la </w:t>
+      </w:r>
+      <w:r>
+        <w:t>valutazione media delle recensioni e</w:t>
       </w:r>
       <w:r>
         <w:t xml:space="preserve"> </w:t>
@@ -2896,10 +2854,13 @@
         <w:t xml:space="preserve">gli occhiali </w:t>
       </w:r>
       <w:r>
-        <w:t>cercati</w:t>
+        <w:t>selezionati fino a questo momento</w:t>
       </w:r>
       <w:r>
         <w:t>, le rispettive quantità</w:t>
+      </w:r>
+      <w:r>
+        <w:t xml:space="preserve"> (con la possibilità di aggiungere o diminuire)</w:t>
       </w:r>
       <w:r>
         <w:t xml:space="preserve">, </w:t>
@@ -2951,10 +2912,19 @@
         <w:t xml:space="preserve">di login </w:t>
       </w:r>
       <w:r>
-        <w:t xml:space="preserve">dove deve </w:t>
-      </w:r>
-      <w:r>
-        <w:t>accedere con la propria mail</w:t>
+        <w:t>dove</w:t>
+      </w:r>
+      <w:r>
+        <w:t xml:space="preserve"> </w:t>
+      </w:r>
+      <w:r>
+        <w:t>accede</w:t>
+      </w:r>
+      <w:r>
+        <w:t xml:space="preserve"> </w:t>
+      </w:r>
+      <w:r>
+        <w:t>con la propria mail</w:t>
       </w:r>
       <w:r>
         <w:t>, scelt</w:t>
@@ -3059,10 +3029,22 @@
         <w:t xml:space="preserve"> preposto al ruolo di Manager degli Ordini</w:t>
       </w:r>
       <w:r>
-        <w:t xml:space="preserve">; lavora nel negozio fisico. Ogni giorno </w:t>
-      </w:r>
-      <w:r>
-        <w:t xml:space="preserve">a un orario prestabilito </w:t>
+        <w:t xml:space="preserve">; lavora nel negozio fisico. </w:t>
+      </w:r>
+      <w:r>
+        <w:t>Oggi, come ogni</w:t>
+      </w:r>
+      <w:r>
+        <w:t xml:space="preserve"> giorno </w:t>
+      </w:r>
+      <w:r>
+        <w:t>a un orario prestabilito</w:t>
+      </w:r>
+      <w:r>
+        <w:t>,</w:t>
+      </w:r>
+      <w:r>
+        <w:t xml:space="preserve"> </w:t>
       </w:r>
       <w:r>
         <w:t>accede</w:t>
@@ -3077,9 +3059,6 @@
         <w:t>alla pagina di login</w:t>
       </w:r>
       <w:r>
-        <w:t>,</w:t>
-      </w:r>
-      <w:r>
         <w:t xml:space="preserve"> </w:t>
       </w:r>
       <w:r>
@@ -3101,22 +3080,16 @@
         <w:t xml:space="preserve"> Order Manager, </w:t>
       </w:r>
       <w:r>
-        <w:t>a</w:t>
-      </w:r>
-      <w:r>
-        <w:t>ll</w:t>
-      </w:r>
-      <w:r>
-        <w:t>’</w:t>
-      </w:r>
-      <w:r>
-        <w:t xml:space="preserve">area di gestione </w:t>
+        <w:t>ed entra nell’area</w:t>
+      </w:r>
+      <w:r>
+        <w:t xml:space="preserve"> di gestione </w:t>
       </w:r>
       <w:r>
         <w:t>degli ordini</w:t>
       </w:r>
       <w:r>
-        <w:t xml:space="preserve">. Qui, Antonio può visualizzare l’elenco di tutti </w:t>
+        <w:t xml:space="preserve">. Qui, Antonio visualizza l’elenco di tutti </w:t>
       </w:r>
       <w:r>
         <w:t>ordini effettuati</w:t>
@@ -3138,16 +3111,7 @@
         <w:t xml:space="preserve"> i prodotti ordinati</w:t>
       </w:r>
       <w:r>
-        <w:t>, come prezzo e modello, e lo stato dell’ordine assieme dalla data in cui è stato effettuato. Con un</w:t>
-      </w:r>
-      <w:r>
-        <w:t xml:space="preserve"> pulsante</w:t>
-      </w:r>
-      <w:r>
-        <w:t>, Antonio m</w:t>
-      </w:r>
-      <w:r>
-        <w:t>odifica lo stato dell’ordine.</w:t>
+        <w:t>, come prezzo e modello, e lo stato dell’ordine assieme dalla data in cui è stato effettuato.</w:t>
       </w:r>
     </w:p>
     <w:p>
@@ -3230,100 +3194,91 @@
         <w:ind w:left="709"/>
       </w:pPr>
       <w:r>
-        <w:t>Vittoria decide di voler portare una nuova linea di occhiali come prodotto disponibile solo sul negozio online per attrarre l</w:t>
+        <w:t>Vittoria decide di voler portare una nuova linea di occhiali come prodotto disponibile solo sul negozio online per attrarre nuova clientela. D</w:t>
+      </w:r>
+      <w:r>
+        <w:t xml:space="preserve">opo aver </w:t>
+      </w:r>
+      <w:r>
+        <w:t>fissato un incontro</w:t>
+      </w:r>
+      <w:r>
+        <w:t xml:space="preserve"> con un fornitore, e finalizzato un accordo, ottiene la </w:t>
+      </w:r>
+      <w:r>
+        <w:t>nuova merce</w:t>
+      </w:r>
+      <w:r>
+        <w:t xml:space="preserve"> </w:t>
+      </w:r>
+      <w:r>
+        <w:t>in</w:t>
+      </w:r>
+      <w:r>
+        <w:t xml:space="preserve"> negozio</w:t>
+      </w:r>
+      <w:r>
+        <w:t>.</w:t>
+      </w:r>
+      <w:r>
+        <w:t xml:space="preserve"> Aggiunge questi prodotti al sito:</w:t>
+      </w:r>
+      <w:r>
+        <w:t xml:space="preserve"> </w:t>
       </w:r>
       <w:r>
         <w:t>a</w:t>
       </w:r>
       <w:r>
-        <w:t xml:space="preserve"> nuova clientela. D</w:t>
-      </w:r>
-      <w:r>
-        <w:t xml:space="preserve">opo aver </w:t>
-      </w:r>
-      <w:r>
-        <w:t>fissato un incontro</w:t>
-      </w:r>
-      <w:r>
-        <w:t xml:space="preserve"> con un fornitore, e finalizzato un accordo, ottiene la </w:t>
-      </w:r>
-      <w:r>
-        <w:t>nuova merce</w:t>
+        <w:t>ccede</w:t>
+      </w:r>
+      <w:r>
+        <w:t xml:space="preserve"> dalla normale area di login,</w:t>
       </w:r>
       <w:r>
         <w:t xml:space="preserve"> </w:t>
       </w:r>
       <w:r>
-        <w:t>in</w:t>
-      </w:r>
-      <w:r>
-        <w:t xml:space="preserve"> negozio</w:t>
+        <w:t xml:space="preserve">con </w:t>
+      </w:r>
+      <w:r>
+        <w:t>le proprie credenziali di Product Manager (email</w:t>
+      </w:r>
+      <w:r>
+        <w:t xml:space="preserve"> e password</w:t>
+      </w:r>
+      <w:r>
+        <w:t>)</w:t>
+      </w:r>
+      <w:r>
+        <w:t xml:space="preserve">, e viene portata alla sua area gestionale che presenta </w:t>
+      </w:r>
+      <w:r>
+        <w:t xml:space="preserve">un elenco di </w:t>
+      </w:r>
+      <w:r>
+        <w:t xml:space="preserve">tutti </w:t>
+      </w:r>
+      <w:r>
+        <w:t xml:space="preserve">gli occhiali acquistabili </w:t>
+      </w:r>
+      <w:r>
+        <w:t>sul sito</w:t>
+      </w:r>
+      <w:r>
+        <w:t xml:space="preserve"> con le corrispondenti informazioni (come immagine dell’occhiale, nome del modello, prezzo e</w:t>
+      </w:r>
+      <w:r>
+        <w:t xml:space="preserve"> quantità disponibil</w:t>
+      </w:r>
+      <w:r>
+        <w:t>e)</w:t>
       </w:r>
       <w:r>
         <w:t>.</w:t>
       </w:r>
       <w:r>
         <w:t xml:space="preserve"> </w:t>
-      </w:r>
-      <w:r>
-        <w:t xml:space="preserve">Ora questi prodotti vanno aggiunti al sito in modo che siano effettivamente acquistabili. </w:t>
-      </w:r>
-      <w:r>
-        <w:t>Accede</w:t>
-      </w:r>
-      <w:r>
-        <w:t xml:space="preserve"> dalla normale area di login,</w:t>
-      </w:r>
-      <w:r>
-        <w:t xml:space="preserve"> </w:t>
-      </w:r>
-      <w:r>
-        <w:t xml:space="preserve">con </w:t>
-      </w:r>
-      <w:r>
-        <w:t>le proprie credenziali di Product Manager (email</w:t>
-      </w:r>
-      <w:r>
-        <w:t xml:space="preserve"> e password</w:t>
-      </w:r>
-      <w:r>
-        <w:t>)</w:t>
-      </w:r>
-      <w:r>
-        <w:t xml:space="preserve">, e viene portata alla sua area gestionale che presenta </w:t>
-      </w:r>
-      <w:r>
-        <w:t xml:space="preserve">un elenco di </w:t>
-      </w:r>
-      <w:r>
-        <w:t xml:space="preserve">tutti </w:t>
-      </w:r>
-      <w:r>
-        <w:t xml:space="preserve">gli occhiali acquistabili </w:t>
-      </w:r>
-      <w:r>
-        <w:t>sul sito</w:t>
-      </w:r>
-      <w:r>
-        <w:t xml:space="preserve"> con le corrispondenti informazioni (come immagine dell’occhiale, nome del modello, prezzo e</w:t>
-      </w:r>
-      <w:r>
-        <w:t xml:space="preserve"> quantità disponibil</w:t>
-      </w:r>
-      <w:r>
-        <w:t>e)</w:t>
-      </w:r>
-      <w:r>
-        <w:t>.</w:t>
-      </w:r>
-      <w:r>
-        <w:t xml:space="preserve"> Di ogni prodotto</w:t>
-      </w:r>
-      <w:r>
-        <w:t>, Vittoria</w:t>
-      </w:r>
-      <w:r>
-        <w:t xml:space="preserve"> può modificarne le caratteristiche e aggiornarne le quantità disponibile in ogni variante colore. </w:t>
       </w:r>
     </w:p>
     <w:p>
@@ -3333,28 +3288,16 @@
         <w:ind w:left="709"/>
       </w:pPr>
       <w:r>
-        <w:t>Assieme all’elenco dei prodotti, nella schermata iniziale, c’è la scheda di aggiunta per nuovi occhiali che Vittoria inizia a compilare, campo per campo, fornendo i dati</w:t>
-      </w:r>
-      <w:r>
-        <w:t>, le quantità disponibili e</w:t>
-      </w:r>
-      <w:r>
-        <w:t xml:space="preserve"> le immagini de</w:t>
-      </w:r>
-      <w:r>
-        <w:t>i</w:t>
-      </w:r>
-      <w:r>
-        <w:t xml:space="preserve"> nuov</w:t>
-      </w:r>
-      <w:r>
-        <w:t>i</w:t>
-      </w:r>
-      <w:r>
-        <w:t xml:space="preserve"> prodott</w:t>
-      </w:r>
-      <w:r>
-        <w:t>i</w:t>
+        <w:t xml:space="preserve">Assieme all’elenco dei prodotti, nella schermata iniziale, c’è </w:t>
+      </w:r>
+      <w:r>
+        <w:t>una</w:t>
+      </w:r>
+      <w:r>
+        <w:t xml:space="preserve"> scheda di aggiunta per nuovi occhiali che Vittoria compila, fornendo i dati</w:t>
+      </w:r>
+      <w:r>
+        <w:t xml:space="preserve"> menzionati precedentemente</w:t>
       </w:r>
       <w:r>
         <w:t xml:space="preserve">. </w:t>
@@ -3375,7 +3318,10 @@
         <w:t>.</w:t>
       </w:r>
       <w:r>
-        <w:t xml:space="preserve"> Dopo esser stati validati i campi, viene mostrato a Vittoria un messaggio di corretta aggiunta dell’occhiale, che sarà immediatamente disponibili per i clienti.</w:t>
+        <w:t xml:space="preserve"> Dopo esser stati validati i campi, viene mostrato a Vittoria un messaggio di corretta aggiunta dell’occhiale</w:t>
+      </w:r>
+      <w:r>
+        <w:t>.</w:t>
       </w:r>
     </w:p>
     <w:p>
@@ -3422,7 +3368,19 @@
         <w:t>di analizzare le vendite e capire quali prodotti hanno avuto più successo</w:t>
       </w:r>
       <w:r>
-        <w:t xml:space="preserve">. Accede alla sua area personale, con le proprie credenziali (email e password), </w:t>
+        <w:t>. Accede</w:t>
+      </w:r>
+      <w:r>
+        <w:t xml:space="preserve"> dalla pagina di login</w:t>
+      </w:r>
+      <w:r>
+        <w:t xml:space="preserve"> alla sua area </w:t>
+      </w:r>
+      <w:r>
+        <w:t>gestionale</w:t>
+      </w:r>
+      <w:r>
+        <w:t xml:space="preserve">, con le proprie credenziali (email e password), </w:t>
       </w:r>
       <w:r>
         <w:t xml:space="preserve">dove </w:t>
@@ -3431,10 +3389,28 @@
         <w:t>gli viene mostrata</w:t>
       </w:r>
       <w:r>
-        <w:t xml:space="preserve"> una tabella con i vari prodotti e il numero di </w:t>
-      </w:r>
-      <w:r>
-        <w:t>acquisti di affianco a ognuno. Per fare indagini più accurate, Fabio inizia a filtrare i prodotti in base a periodi di tempo</w:t>
+        <w:t xml:space="preserve"> una tabella con i vari prodotti </w:t>
+      </w:r>
+      <w:r>
+        <w:t xml:space="preserve">del catalogo </w:t>
+      </w:r>
+      <w:r>
+        <w:t xml:space="preserve">e il numero di </w:t>
+      </w:r>
+      <w:r>
+        <w:t xml:space="preserve">acquisti </w:t>
+      </w:r>
+      <w:r>
+        <w:t>per ogni singolo</w:t>
+      </w:r>
+      <w:r>
+        <w:t xml:space="preserve">. Per fare indagini più accurate, Fabio </w:t>
+      </w:r>
+      <w:r>
+        <w:t xml:space="preserve">filtra </w:t>
+      </w:r>
+      <w:r>
+        <w:t xml:space="preserve"> i prodotti in base a periodi di tempo</w:t>
       </w:r>
       <w:r>
         <w:t xml:space="preserve"> (1 settimana, 1 mese, 1 anno)</w:t>
@@ -3444,6 +3420,9 @@
       </w:r>
       <w:r>
         <w:t>. Non sono presenti in questa tabella i dati personali dei clienti</w:t>
+      </w:r>
+      <w:r>
+        <w:t>. Crea un report con i dati ricavati e lo da al Product Manager che lo userà per trovare nuovi prodotti da vendere allineati a questi risultati.</w:t>
       </w:r>
     </w:p>
     <w:p>
@@ -3528,6 +3507,9 @@
         <w:ind w:hanging="294"/>
       </w:pPr>
       <w:r>
+        <w:t>I</w:t>
+      </w:r>
+      <w:r>
         <w:t>l cliente deve poter visualizzare lo storico dei propri ordini e consultare in tempo reale lo stato d</w:t>
       </w:r>
       <w:r>
@@ -3615,8 +3597,11 @@
         <w:ind w:left="709" w:hanging="283"/>
       </w:pPr>
       <w:r>
+        <w:t xml:space="preserve">Il Product Manager deve poter aggiungere nuovi modelli di occhiali al catalogo, </w:t>
+      </w:r>
+      <w:r>
         <w:lastRenderedPageBreak/>
-        <w:t>Il Product Manager deve poter aggiungere nuovi modelli di occhiali al catalogo, specificando prezzi, immagini, e quantità disponibili, e classificarli come esclusiva online o scontati</w:t>
+        <w:t>specificando prezzi, immagini, e quantità disponibili, e classificarli come esclusiva online o scontati</w:t>
       </w:r>
     </w:p>
     <w:p>
@@ -3650,6 +3635,18 @@
       </w:r>
       <w:r>
         <w:t xml:space="preserve"> deve accedere a una sua area gestionale che mostra i nuovi ordini ricevuti e da preparare nel negozio locale</w:t>
+      </w:r>
+    </w:p>
+    <w:p>
+      <w:pPr>
+        <w:numPr>
+          <w:ilvl w:val="0"/>
+          <w:numId w:val="15"/>
+        </w:numPr>
+        <w:ind w:left="709" w:hanging="283"/>
+      </w:pPr>
+      <w:r>
+        <w:t>Il Market Analyzer deve poter accedere a una sua area gestionale dove può vedere una tabella con le statistiche degli ordini</w:t>
       </w:r>
     </w:p>
     <w:p/>
@@ -3922,6 +3919,7 @@
               <w:rPr>
                 <w:szCs w:val="32"/>
               </w:rPr>
+              <w:lastRenderedPageBreak/>
               <w:t>Materiale di Consegna</w:t>
             </w:r>
           </w:p>
@@ -3972,22 +3970,12 @@
                 <w:szCs w:val="22"/>
               </w:rPr>
             </w:pPr>
-            <w:proofErr w:type="spellStart"/>
             <w:r>
               <w:rPr>
                 <w:sz w:val="22"/>
                 <w:szCs w:val="22"/>
               </w:rPr>
-              <w:lastRenderedPageBreak/>
-              <w:t>Problem</w:t>
-            </w:r>
-            <w:proofErr w:type="spellEnd"/>
-            <w:r>
-              <w:rPr>
-                <w:sz w:val="22"/>
-                <w:szCs w:val="22"/>
-              </w:rPr>
-              <w:t xml:space="preserve"> Statement</w:t>
+              <w:t>Problem Statement</w:t>
             </w:r>
           </w:p>
         </w:tc>
@@ -4098,31 +4086,13 @@
                 <w:szCs w:val="22"/>
               </w:rPr>
             </w:pPr>
-            <w:proofErr w:type="spellStart"/>
             <w:r>
               <w:rPr>
                 <w:sz w:val="22"/>
                 <w:szCs w:val="22"/>
               </w:rPr>
-              <w:t>Requirements</w:t>
+              <w:t>Requirements Analysis Document</w:t>
             </w:r>
-            <w:proofErr w:type="spellEnd"/>
-            <w:r>
-              <w:rPr>
-                <w:sz w:val="22"/>
-                <w:szCs w:val="22"/>
-              </w:rPr>
-              <w:t xml:space="preserve"> Analysis </w:t>
-            </w:r>
-            <w:proofErr w:type="spellStart"/>
-            <w:r>
-              <w:rPr>
-                <w:sz w:val="22"/>
-                <w:szCs w:val="22"/>
-              </w:rPr>
-              <w:t>Document</w:t>
-            </w:r>
-            <w:proofErr w:type="spellEnd"/>
           </w:p>
         </w:tc>
         <w:tc>
@@ -4179,17 +4149,8 @@
                 <w:sz w:val="22"/>
                 <w:szCs w:val="22"/>
               </w:rPr>
-              <w:t xml:space="preserve">System Design </w:t>
+              <w:t>System Design Document</w:t>
             </w:r>
-            <w:proofErr w:type="spellStart"/>
-            <w:r>
-              <w:rPr>
-                <w:sz w:val="22"/>
-                <w:szCs w:val="22"/>
-              </w:rPr>
-              <w:t>Document</w:t>
-            </w:r>
-            <w:proofErr w:type="spellEnd"/>
           </w:p>
         </w:tc>
         <w:tc>
@@ -4246,23 +4207,7 @@
                 <w:sz w:val="22"/>
                 <w:szCs w:val="22"/>
               </w:rPr>
-              <w:t xml:space="preserve">Specifica delle interfacce dei moduli del sottosistema da implementare (parte dell’Object Design </w:t>
-            </w:r>
-            <w:proofErr w:type="spellStart"/>
-            <w:r>
-              <w:rPr>
-                <w:sz w:val="22"/>
-                <w:szCs w:val="22"/>
-              </w:rPr>
-              <w:t>Document</w:t>
-            </w:r>
-            <w:proofErr w:type="spellEnd"/>
-            <w:r>
-              <w:rPr>
-                <w:sz w:val="22"/>
-                <w:szCs w:val="22"/>
-              </w:rPr>
-              <w:t>)</w:t>
+              <w:t>Specifica delle interfacce dei moduli del sottosistema da implementare (parte dell’Object Design Document)</w:t>
             </w:r>
           </w:p>
         </w:tc>
@@ -4765,19 +4710,11 @@
             </w:rPr>
             <w:t xml:space="preserve">Documento: </w:t>
           </w:r>
-          <w:proofErr w:type="spellStart"/>
           <w:r>
             <w:rPr>
               <w:sz w:val="20"/>
             </w:rPr>
-            <w:t>Problem</w:t>
-          </w:r>
-          <w:proofErr w:type="spellEnd"/>
-          <w:r>
-            <w:rPr>
-              <w:sz w:val="20"/>
-            </w:rPr>
-            <w:t xml:space="preserve"> Statement</w:t>
+            <w:t>Problem Statement</w:t>
           </w:r>
         </w:p>
       </w:tc>
@@ -4899,7 +4836,7 @@
         <v:path o:extrusionok="f" gradientshapeok="t" o:connecttype="rect"/>
         <o:lock v:ext="edit" aspectratio="t"/>
       </v:shapetype>
-      <v:shape id="_x0000_i1025" type="#_x0000_t75" style="width:321pt;height:249.75pt" o:bullet="t" filled="t">
+      <v:shape id="_x0000_i1038" type="#_x0000_t75" style="width:321pt;height:249.6pt" o:bullet="t" filled="t">
         <v:fill color2="black"/>
         <v:imagedata r:id="rId1" o:title=""/>
       </v:shape>

</xml_diff>

<commit_message>
Aggiunta dei Target Environment, correzioni su requisiti non funzionali e Deliverable & Deadlines
</commit_message>
<xml_diff>
--- a/Deliverables/ProblemStatement_GGEyewear.docx
+++ b/Deliverables/ProblemStatement_GGEyewear.docx
@@ -1,6 +1,6 @@
 
 <file path=word/document.xml><?xml version="1.0" encoding="utf-8"?>
-<w:document xmlns:wpc="http://schemas.microsoft.com/office/word/2010/wordprocessingCanvas" xmlns:cx="http://schemas.microsoft.com/office/drawing/2014/chartex" xmlns:cx1="http://schemas.microsoft.com/office/drawing/2015/9/8/chartex" xmlns:cx2="http://schemas.microsoft.com/office/drawing/2015/10/21/chartex" xmlns:cx3="http://schemas.microsoft.com/office/drawing/2016/5/9/chartex" xmlns:cx4="http://schemas.microsoft.com/office/drawing/2016/5/10/chartex" xmlns:cx5="http://schemas.microsoft.com/office/drawing/2016/5/11/chartex" xmlns:cx6="http://schemas.microsoft.com/office/drawing/2016/5/12/chartex" xmlns:cx7="http://schemas.microsoft.com/office/drawing/2016/5/13/chartex" xmlns:cx8="http://schemas.microsoft.com/office/drawing/2016/5/14/chartex" xmlns:mc="http://schemas.openxmlformats.org/markup-compatibility/2006" xmlns:aink="http://schemas.microsoft.com/office/drawing/2016/ink" xmlns:am3d="http://schemas.microsoft.com/office/drawing/2017/model3d" xmlns:o="urn:schemas-microsoft-com:office:office" xmlns:oel="http://schemas.microsoft.com/office/2019/extlst" xmlns:r="http://schemas.openxmlformats.org/officeDocument/2006/relationships" xmlns:m="http://schemas.openxmlformats.org/officeDocument/2006/math" xmlns:v="urn:schemas-microsoft-com:vml" xmlns:wp14="http://schemas.microsoft.com/office/word/2010/wordprocessingDrawing" xmlns:wp="http://schemas.openxmlformats.org/drawingml/2006/wordprocessingDrawing" xmlns:w10="urn:schemas-microsoft-com:office:word" xmlns:w="http://schemas.openxmlformats.org/wordprocessingml/2006/main" xmlns:w14="http://schemas.microsoft.com/office/word/2010/wordml" xmlns:w15="http://schemas.microsoft.com/office/word/2012/wordml" xmlns:w16cex="http://schemas.microsoft.com/office/word/2018/wordml/cex" xmlns:w16cid="http://schemas.microsoft.com/office/word/2016/wordml/cid" xmlns:w16="http://schemas.microsoft.com/office/word/2018/wordml" xmlns:w16du="http://schemas.microsoft.com/office/word/2023/wordml/word16du" xmlns:w16sdtdh="http://schemas.microsoft.com/office/word/2020/wordml/sdtdatahash" xmlns:w16sdtfl="http://schemas.microsoft.com/office/word/2024/wordml/sdtformatlock" xmlns:w16se="http://schemas.microsoft.com/office/word/2015/wordml/symex" xmlns:wpg="http://schemas.microsoft.com/office/word/2010/wordprocessingGroup" xmlns:wpi="http://schemas.microsoft.com/office/word/2010/wordprocessingInk" xmlns:wne="http://schemas.microsoft.com/office/word/2006/wordml" xmlns:wps="http://schemas.microsoft.com/office/word/2010/wordprocessingShape" mc:Ignorable="w14 w15 w16se w16cid w16 w16cex w16sdtdh w16sdtfl w16du wp14">
+<w:document xmlns:wpc="http://schemas.microsoft.com/office/word/2010/wordprocessingCanvas" xmlns:cx="http://schemas.microsoft.com/office/drawing/2014/chartex" xmlns:cx1="http://schemas.microsoft.com/office/drawing/2015/9/8/chartex" xmlns:cx2="http://schemas.microsoft.com/office/drawing/2015/10/21/chartex" xmlns:cx3="http://schemas.microsoft.com/office/drawing/2016/5/9/chartex" xmlns:cx4="http://schemas.microsoft.com/office/drawing/2016/5/10/chartex" xmlns:cx5="http://schemas.microsoft.com/office/drawing/2016/5/11/chartex" xmlns:cx6="http://schemas.microsoft.com/office/drawing/2016/5/12/chartex" xmlns:cx7="http://schemas.microsoft.com/office/drawing/2016/5/13/chartex" xmlns:cx8="http://schemas.microsoft.com/office/drawing/2016/5/14/chartex" xmlns:mc="http://schemas.openxmlformats.org/markup-compatibility/2006" xmlns:m="http://schemas.openxmlformats.org/officeDocument/2006/math" xmlns:aink="http://schemas.microsoft.com/office/drawing/2016/ink" xmlns:am3d="http://schemas.microsoft.com/office/drawing/2017/model3d" xmlns:oel="http://schemas.microsoft.com/office/2019/extlst" xmlns:r="http://schemas.openxmlformats.org/officeDocument/2006/relationships" xmlns:wp14="http://schemas.microsoft.com/office/word/2010/wordprocessingDrawing" xmlns:wp="http://schemas.openxmlformats.org/drawingml/2006/wordprocessingDrawing" xmlns:wpg="http://schemas.microsoft.com/office/word/2010/wordprocessingGroup" xmlns:wpi="http://schemas.microsoft.com/office/word/2010/wordprocessingInk" xmlns:wps="http://schemas.microsoft.com/office/word/2010/wordprocessingShape" xmlns:o="urn:schemas-microsoft-com:office:office" xmlns:v="urn:schemas-microsoft-com:vml" xmlns:w10="urn:schemas-microsoft-com:office:word" xmlns:w="http://schemas.openxmlformats.org/wordprocessingml/2006/main" xmlns:w14="http://schemas.microsoft.com/office/word/2010/wordml" xmlns:w15="http://schemas.microsoft.com/office/word/2012/wordml" xmlns:w16cex="http://schemas.microsoft.com/office/word/2018/wordml/cex" xmlns:w16cid="http://schemas.microsoft.com/office/word/2016/wordml/cid" xmlns:w16="http://schemas.microsoft.com/office/word/2018/wordml" xmlns:w16sdtdh="http://schemas.microsoft.com/office/word/2020/wordml/sdtdatahash" xmlns:w16sdtfl="http://schemas.microsoft.com/office/word/2024/wordml/sdtformatlock" xmlns:w16se="http://schemas.microsoft.com/office/word/2015/wordml/symex" xmlns:w16du="http://schemas.microsoft.com/office/word/2023/wordml/word16du" xmlns:wne="http://schemas.microsoft.com/office/word/2006/wordml" mc:Ignorable="w14 w15 w16se w16cid w16 w16cex w16sdtdh w16sdtfl w16du wp14">
   <w:body>
     <w:p/>
     <w:tbl>
@@ -180,7 +180,7 @@
           <w:sz w:val="36"/>
           <w:lang w:val="en-US"/>
         </w:rPr>
-        <w:t>5</w:t>
+        <w:t>6</w:t>
       </w:r>
       <w:r>
         <w:rPr>
@@ -260,23 +260,18 @@
       </w:pPr>
       <w:r>
         <w:rPr>
-          <w:rFonts w:ascii="Arial" w:hAnsi="Arial"/>
           <w:b/>
-          <w:sz w:val="36"/>
-        </w:rPr>
-        <w:t>LOGO PROGETTO</w:t>
-      </w:r>
-    </w:p>
-    <w:p>
-      <w:pPr>
-        <w:jc w:val="center"/>
-        <w:rPr>
-          <w:b/>
+          <w:noProof/>
           <w:color w:val="FF0000"/>
           <w:sz w:val="28"/>
           <w:szCs w:val="28"/>
         </w:rPr>
-      </w:pPr>
+        <w:pict w14:anchorId="575A38CD">
+          <v:shape id="Immagine 1" o:spid="_x0000_i1025" type="#_x0000_t75" style="width:280.15pt;height:70.2pt;visibility:visible;mso-wrap-style:square">
+            <v:imagedata r:id="rId8" o:title=""/>
+          </v:shape>
+        </w:pict>
+      </w:r>
     </w:p>
     <w:p>
       <w:pPr>
@@ -1620,7 +1615,7 @@
             <w:vMerge w:val="restart"/>
             <w:tcBorders>
               <w:left w:val="single" w:sz="1" w:space="0" w:color="000000"/>
-              <w:bottom w:val="single" w:sz="1" w:space="0" w:color="000000"/>
+              <w:bottom w:val="single" w:sz="4" w:space="0" w:color="auto"/>
             </w:tcBorders>
           </w:tcPr>
           <w:p>
@@ -1644,7 +1639,7 @@
             <w:vMerge w:val="restart"/>
             <w:tcBorders>
               <w:left w:val="single" w:sz="1" w:space="0" w:color="000000"/>
-              <w:bottom w:val="single" w:sz="1" w:space="0" w:color="000000"/>
+              <w:bottom w:val="single" w:sz="4" w:space="0" w:color="auto"/>
             </w:tcBorders>
           </w:tcPr>
           <w:p>
@@ -1668,7 +1663,7 @@
             <w:vMerge w:val="restart"/>
             <w:tcBorders>
               <w:left w:val="single" w:sz="1" w:space="0" w:color="000000"/>
-              <w:bottom w:val="single" w:sz="1" w:space="0" w:color="000000"/>
+              <w:bottom w:val="single" w:sz="4" w:space="0" w:color="auto"/>
             </w:tcBorders>
           </w:tcPr>
           <w:p>
@@ -1692,7 +1687,7 @@
             <w:vMerge w:val="restart"/>
             <w:tcBorders>
               <w:left w:val="single" w:sz="1" w:space="0" w:color="000000"/>
-              <w:bottom w:val="single" w:sz="1" w:space="0" w:color="000000"/>
+              <w:bottom w:val="single" w:sz="4" w:space="0" w:color="auto"/>
               <w:right w:val="single" w:sz="1" w:space="0" w:color="000000"/>
             </w:tcBorders>
           </w:tcPr>
@@ -1708,6 +1703,129 @@
                 <w:sz w:val="20"/>
               </w:rPr>
               <w:t>Angelica D’Aquila</w:t>
+            </w:r>
+          </w:p>
+        </w:tc>
+      </w:tr>
+      <w:tr>
+        <w:trPr>
+          <w:trHeight w:val="230"/>
+        </w:trPr>
+        <w:tc>
+          <w:tcPr>
+            <w:tcW w:w="1927" w:type="dxa"/>
+            <w:tcBorders>
+              <w:top w:val="single" w:sz="4" w:space="0" w:color="auto"/>
+              <w:left w:val="single" w:sz="4" w:space="0" w:color="auto"/>
+              <w:bottom w:val="single" w:sz="4" w:space="0" w:color="auto"/>
+              <w:right w:val="single" w:sz="4" w:space="0" w:color="auto"/>
+            </w:tcBorders>
+          </w:tcPr>
+          <w:p>
+            <w:pPr>
+              <w:pStyle w:val="Contenutotabella"/>
+              <w:rPr>
+                <w:sz w:val="20"/>
+              </w:rPr>
+            </w:pPr>
+            <w:r>
+              <w:rPr>
+                <w:sz w:val="20"/>
+              </w:rPr>
+              <w:t>13/10/2026</w:t>
+            </w:r>
+          </w:p>
+        </w:tc>
+        <w:tc>
+          <w:tcPr>
+            <w:tcW w:w="964" w:type="dxa"/>
+            <w:tcBorders>
+              <w:top w:val="single" w:sz="4" w:space="0" w:color="auto"/>
+              <w:left w:val="single" w:sz="4" w:space="0" w:color="auto"/>
+              <w:bottom w:val="single" w:sz="4" w:space="0" w:color="auto"/>
+              <w:right w:val="single" w:sz="4" w:space="0" w:color="auto"/>
+            </w:tcBorders>
+          </w:tcPr>
+          <w:p>
+            <w:pPr>
+              <w:pStyle w:val="Contenutotabella"/>
+              <w:rPr>
+                <w:sz w:val="20"/>
+              </w:rPr>
+            </w:pPr>
+            <w:r>
+              <w:rPr>
+                <w:sz w:val="20"/>
+              </w:rPr>
+              <w:t>1.6</w:t>
+            </w:r>
+          </w:p>
+        </w:tc>
+        <w:tc>
+          <w:tcPr>
+            <w:tcW w:w="4336" w:type="dxa"/>
+            <w:tcBorders>
+              <w:top w:val="single" w:sz="4" w:space="0" w:color="auto"/>
+              <w:left w:val="single" w:sz="4" w:space="0" w:color="auto"/>
+              <w:bottom w:val="single" w:sz="4" w:space="0" w:color="auto"/>
+              <w:right w:val="single" w:sz="4" w:space="0" w:color="auto"/>
+            </w:tcBorders>
+          </w:tcPr>
+          <w:p>
+            <w:pPr>
+              <w:pStyle w:val="Contenutotabella"/>
+              <w:rPr>
+                <w:sz w:val="20"/>
+              </w:rPr>
+            </w:pPr>
+            <w:r>
+              <w:rPr>
+                <w:sz w:val="20"/>
+              </w:rPr>
+              <w:t>Aggiunta dei Target Environment, correzioni su requisiti non funzionali e D</w:t>
+            </w:r>
+            <w:r>
+              <w:rPr>
+                <w:sz w:val="20"/>
+              </w:rPr>
+              <w:t xml:space="preserve">eliverable &amp; </w:t>
+            </w:r>
+            <w:r>
+              <w:rPr>
+                <w:sz w:val="20"/>
+              </w:rPr>
+              <w:t>D</w:t>
+            </w:r>
+            <w:r>
+              <w:rPr>
+                <w:sz w:val="20"/>
+              </w:rPr>
+              <w:t>eadlines</w:t>
+            </w:r>
+          </w:p>
+        </w:tc>
+        <w:tc>
+          <w:tcPr>
+            <w:tcW w:w="2410" w:type="dxa"/>
+            <w:tcBorders>
+              <w:top w:val="single" w:sz="4" w:space="0" w:color="auto"/>
+              <w:left w:val="single" w:sz="4" w:space="0" w:color="auto"/>
+              <w:bottom w:val="single" w:sz="4" w:space="0" w:color="auto"/>
+              <w:right w:val="single" w:sz="4" w:space="0" w:color="auto"/>
+            </w:tcBorders>
+          </w:tcPr>
+          <w:p>
+            <w:pPr>
+              <w:pStyle w:val="Contenutotabella"/>
+              <w:rPr>
+                <w:sz w:val="20"/>
+              </w:rPr>
+            </w:pPr>
+            <w:r>
+              <w:rPr>
+                <w:sz w:val="20"/>
+              </w:rPr>
+              <w:t>Gerardo Vertolomo</w:t>
             </w:r>
           </w:p>
         </w:tc>
@@ -1722,10 +1840,10 @@
           <w:sz w:val="32"/>
         </w:rPr>
         <w:sectPr>
-          <w:headerReference w:type="default" r:id="rId8"/>
-          <w:footerReference w:type="default" r:id="rId9"/>
-          <w:headerReference w:type="first" r:id="rId10"/>
-          <w:footerReference w:type="first" r:id="rId11"/>
+          <w:headerReference w:type="default" r:id="rId9"/>
+          <w:footerReference w:type="default" r:id="rId10"/>
+          <w:headerReference w:type="first" r:id="rId11"/>
+          <w:footerReference w:type="first" r:id="rId12"/>
           <w:footnotePr>
             <w:pos w:val="beneathText"/>
           </w:footnotePr>
@@ -1751,12 +1869,12 @@
       <w:pPr>
         <w:pStyle w:val="Intestazioneindice"/>
         <w:sectPr>
-          <w:headerReference w:type="even" r:id="rId12"/>
-          <w:headerReference w:type="default" r:id="rId13"/>
-          <w:footerReference w:type="even" r:id="rId14"/>
-          <w:footerReference w:type="default" r:id="rId15"/>
-          <w:headerReference w:type="first" r:id="rId16"/>
-          <w:footerReference w:type="first" r:id="rId17"/>
+          <w:headerReference w:type="even" r:id="rId13"/>
+          <w:headerReference w:type="default" r:id="rId14"/>
+          <w:footerReference w:type="even" r:id="rId15"/>
+          <w:footerReference w:type="default" r:id="rId16"/>
+          <w:headerReference w:type="first" r:id="rId17"/>
+          <w:footerReference w:type="first" r:id="rId18"/>
           <w:footnotePr>
             <w:pos w:val="beneathText"/>
           </w:footnotePr>
@@ -1799,7 +1917,7 @@
       <w:r>
         <w:fldChar w:fldCharType="separate"/>
       </w:r>
-      <w:hyperlink w:anchor="_Toc242783791" w:history="1">
+      <w:hyperlink w:anchor="_Toc242815305" w:history="1">
         <w:r>
           <w:rPr>
             <w:rStyle w:val="Collegamentoipertestuale"/>
@@ -1841,7 +1959,7 @@
             <w:noProof/>
             <w:webHidden/>
           </w:rPr>
-          <w:instrText xml:space="preserve"> PAGEREF _Toc242783791 \h </w:instrText>
+          <w:instrText xml:space="preserve"> PAGEREF _Toc242815305 \h </w:instrText>
         </w:r>
         <w:r>
           <w:rPr>
@@ -1884,7 +2002,7 @@
           <w:kern w:val="2"/>
         </w:rPr>
       </w:pPr>
-      <w:hyperlink w:anchor="_Toc242783792" w:history="1">
+      <w:hyperlink w:anchor="_Toc242815306" w:history="1">
         <w:r>
           <w:rPr>
             <w:rStyle w:val="Collegamentoipertestuale"/>
@@ -1926,7 +2044,7 @@
             <w:noProof/>
             <w:webHidden/>
           </w:rPr>
-          <w:instrText xml:space="preserve"> PAGEREF _Toc242783792 \h </w:instrText>
+          <w:instrText xml:space="preserve"> PAGEREF _Toc242815306 \h </w:instrText>
         </w:r>
         <w:r>
           <w:rPr>
@@ -1969,7 +2087,7 @@
           <w:kern w:val="2"/>
         </w:rPr>
       </w:pPr>
-      <w:hyperlink w:anchor="_Toc242783793" w:history="1">
+      <w:hyperlink w:anchor="_Toc242815307" w:history="1">
         <w:r>
           <w:rPr>
             <w:rStyle w:val="Collegamentoipertestuale"/>
@@ -2011,7 +2129,7 @@
             <w:noProof/>
             <w:webHidden/>
           </w:rPr>
-          <w:instrText xml:space="preserve"> PAGEREF _Toc242783793 \h </w:instrText>
+          <w:instrText xml:space="preserve"> PAGEREF _Toc242815307 \h </w:instrText>
         </w:r>
         <w:r>
           <w:rPr>
@@ -2054,7 +2172,7 @@
           <w:kern w:val="2"/>
         </w:rPr>
       </w:pPr>
-      <w:hyperlink w:anchor="_Toc242783794" w:history="1">
+      <w:hyperlink w:anchor="_Toc242815308" w:history="1">
         <w:r>
           <w:rPr>
             <w:rStyle w:val="Collegamentoipertestuale"/>
@@ -2096,7 +2214,7 @@
             <w:noProof/>
             <w:webHidden/>
           </w:rPr>
-          <w:instrText xml:space="preserve"> PAGEREF _Toc242783794 \h </w:instrText>
+          <w:instrText xml:space="preserve"> PAGEREF _Toc242815308 \h </w:instrText>
         </w:r>
         <w:r>
           <w:rPr>
@@ -2139,7 +2257,7 @@
           <w:kern w:val="2"/>
         </w:rPr>
       </w:pPr>
-      <w:hyperlink w:anchor="_Toc242783795" w:history="1">
+      <w:hyperlink w:anchor="_Toc242815309" w:history="1">
         <w:r>
           <w:rPr>
             <w:rStyle w:val="Collegamentoipertestuale"/>
@@ -2181,7 +2299,7 @@
             <w:noProof/>
             <w:webHidden/>
           </w:rPr>
-          <w:instrText xml:space="preserve"> PAGEREF _Toc242783795 \h </w:instrText>
+          <w:instrText xml:space="preserve"> PAGEREF _Toc242815309 \h </w:instrText>
         </w:r>
         <w:r>
           <w:rPr>
@@ -2224,7 +2342,7 @@
           <w:kern w:val="2"/>
         </w:rPr>
       </w:pPr>
-      <w:hyperlink w:anchor="_Toc242783796" w:history="1">
+      <w:hyperlink w:anchor="_Toc242815310" w:history="1">
         <w:r>
           <w:rPr>
             <w:rStyle w:val="Collegamentoipertestuale"/>
@@ -2266,7 +2384,7 @@
             <w:noProof/>
             <w:webHidden/>
           </w:rPr>
-          <w:instrText xml:space="preserve"> PAGEREF _Toc242783796 \h </w:instrText>
+          <w:instrText xml:space="preserve"> PAGEREF _Toc242815310 \h </w:instrText>
         </w:r>
         <w:r>
           <w:rPr>
@@ -2309,7 +2427,7 @@
           <w:kern w:val="2"/>
         </w:rPr>
       </w:pPr>
-      <w:hyperlink w:anchor="_Toc242783797" w:history="1">
+      <w:hyperlink w:anchor="_Toc242815311" w:history="1">
         <w:r>
           <w:rPr>
             <w:rStyle w:val="Collegamentoipertestuale"/>
@@ -2351,7 +2469,7 @@
             <w:noProof/>
             <w:webHidden/>
           </w:rPr>
-          <w:instrText xml:space="preserve"> PAGEREF _Toc242783797 \h </w:instrText>
+          <w:instrText xml:space="preserve"> PAGEREF _Toc242815311 \h </w:instrText>
         </w:r>
         <w:r>
           <w:rPr>
@@ -2394,7 +2512,7 @@
           <w:kern w:val="2"/>
         </w:rPr>
       </w:pPr>
-      <w:hyperlink w:anchor="_Toc242783798" w:history="1">
+      <w:hyperlink w:anchor="_Toc242815312" w:history="1">
         <w:r>
           <w:rPr>
             <w:rStyle w:val="Collegamentoipertestuale"/>
@@ -2436,7 +2554,347 @@
             <w:noProof/>
             <w:webHidden/>
           </w:rPr>
-          <w:instrText xml:space="preserve"> PAGEREF _Toc242783798 \h </w:instrText>
+          <w:instrText xml:space="preserve"> PAGEREF _Toc242815312 \h </w:instrText>
+        </w:r>
+        <w:r>
+          <w:rPr>
+            <w:noProof/>
+            <w:webHidden/>
+          </w:rPr>
+        </w:r>
+        <w:r>
+          <w:rPr>
+            <w:noProof/>
+            <w:webHidden/>
+          </w:rPr>
+          <w:fldChar w:fldCharType="separate"/>
+        </w:r>
+        <w:r>
+          <w:rPr>
+            <w:noProof/>
+            <w:webHidden/>
+          </w:rPr>
+          <w:t>6</w:t>
+        </w:r>
+        <w:r>
+          <w:rPr>
+            <w:noProof/>
+            <w:webHidden/>
+          </w:rPr>
+          <w:fldChar w:fldCharType="end"/>
+        </w:r>
+      </w:hyperlink>
+    </w:p>
+    <w:p>
+      <w:pPr>
+        <w:pStyle w:val="Sommario2"/>
+        <w:tabs>
+          <w:tab w:val="left" w:pos="1132"/>
+        </w:tabs>
+        <w:rPr>
+          <w:rFonts w:ascii="Aptos" w:eastAsia="Times New Roman" w:hAnsi="Aptos" w:cs="Times New Roman"/>
+          <w:noProof/>
+          <w:kern w:val="2"/>
+        </w:rPr>
+      </w:pPr>
+      <w:hyperlink w:anchor="_Toc242815313" w:history="1">
+        <w:r>
+          <w:rPr>
+            <w:rStyle w:val="Collegamentoipertestuale"/>
+            <w:noProof/>
+          </w:rPr>
+          <w:t>4.1.</w:t>
+        </w:r>
+        <w:r>
+          <w:rPr>
+            <w:rFonts w:ascii="Aptos" w:eastAsia="Times New Roman" w:hAnsi="Aptos" w:cs="Times New Roman"/>
+            <w:noProof/>
+            <w:kern w:val="2"/>
+          </w:rPr>
+          <w:tab/>
+        </w:r>
+        <w:r>
+          <w:rPr>
+            <w:rStyle w:val="Collegamentoipertestuale"/>
+            <w:noProof/>
+          </w:rPr>
+          <w:t>Usability</w:t>
+        </w:r>
+        <w:r>
+          <w:rPr>
+            <w:noProof/>
+            <w:webHidden/>
+          </w:rPr>
+          <w:tab/>
+        </w:r>
+        <w:r>
+          <w:rPr>
+            <w:noProof/>
+            <w:webHidden/>
+          </w:rPr>
+          <w:fldChar w:fldCharType="begin"/>
+        </w:r>
+        <w:r>
+          <w:rPr>
+            <w:noProof/>
+            <w:webHidden/>
+          </w:rPr>
+          <w:instrText xml:space="preserve"> PAGEREF _Toc242815313 \h </w:instrText>
+        </w:r>
+        <w:r>
+          <w:rPr>
+            <w:noProof/>
+            <w:webHidden/>
+          </w:rPr>
+        </w:r>
+        <w:r>
+          <w:rPr>
+            <w:noProof/>
+            <w:webHidden/>
+          </w:rPr>
+          <w:fldChar w:fldCharType="separate"/>
+        </w:r>
+        <w:r>
+          <w:rPr>
+            <w:noProof/>
+            <w:webHidden/>
+          </w:rPr>
+          <w:t>6</w:t>
+        </w:r>
+        <w:r>
+          <w:rPr>
+            <w:noProof/>
+            <w:webHidden/>
+          </w:rPr>
+          <w:fldChar w:fldCharType="end"/>
+        </w:r>
+      </w:hyperlink>
+    </w:p>
+    <w:p>
+      <w:pPr>
+        <w:pStyle w:val="Sommario2"/>
+        <w:tabs>
+          <w:tab w:val="left" w:pos="1132"/>
+        </w:tabs>
+        <w:rPr>
+          <w:rFonts w:ascii="Aptos" w:eastAsia="Times New Roman" w:hAnsi="Aptos" w:cs="Times New Roman"/>
+          <w:noProof/>
+          <w:kern w:val="2"/>
+        </w:rPr>
+      </w:pPr>
+      <w:hyperlink w:anchor="_Toc242815314" w:history="1">
+        <w:r>
+          <w:rPr>
+            <w:rStyle w:val="Collegamentoipertestuale"/>
+            <w:noProof/>
+          </w:rPr>
+          <w:t>4.2.</w:t>
+        </w:r>
+        <w:r>
+          <w:rPr>
+            <w:rFonts w:ascii="Aptos" w:eastAsia="Times New Roman" w:hAnsi="Aptos" w:cs="Times New Roman"/>
+            <w:noProof/>
+            <w:kern w:val="2"/>
+          </w:rPr>
+          <w:tab/>
+        </w:r>
+        <w:r>
+          <w:rPr>
+            <w:rStyle w:val="Collegamentoipertestuale"/>
+            <w:noProof/>
+          </w:rPr>
+          <w:t>Performance</w:t>
+        </w:r>
+        <w:r>
+          <w:rPr>
+            <w:noProof/>
+            <w:webHidden/>
+          </w:rPr>
+          <w:tab/>
+        </w:r>
+        <w:r>
+          <w:rPr>
+            <w:noProof/>
+            <w:webHidden/>
+          </w:rPr>
+          <w:fldChar w:fldCharType="begin"/>
+        </w:r>
+        <w:r>
+          <w:rPr>
+            <w:noProof/>
+            <w:webHidden/>
+          </w:rPr>
+          <w:instrText xml:space="preserve"> PAGEREF _Toc242815314 \h </w:instrText>
+        </w:r>
+        <w:r>
+          <w:rPr>
+            <w:noProof/>
+            <w:webHidden/>
+          </w:rPr>
+        </w:r>
+        <w:r>
+          <w:rPr>
+            <w:noProof/>
+            <w:webHidden/>
+          </w:rPr>
+          <w:fldChar w:fldCharType="separate"/>
+        </w:r>
+        <w:r>
+          <w:rPr>
+            <w:noProof/>
+            <w:webHidden/>
+          </w:rPr>
+          <w:t>6</w:t>
+        </w:r>
+        <w:r>
+          <w:rPr>
+            <w:noProof/>
+            <w:webHidden/>
+          </w:rPr>
+          <w:fldChar w:fldCharType="end"/>
+        </w:r>
+      </w:hyperlink>
+    </w:p>
+    <w:p>
+      <w:pPr>
+        <w:pStyle w:val="Sommario2"/>
+        <w:tabs>
+          <w:tab w:val="left" w:pos="1132"/>
+        </w:tabs>
+        <w:rPr>
+          <w:rFonts w:ascii="Aptos" w:eastAsia="Times New Roman" w:hAnsi="Aptos" w:cs="Times New Roman"/>
+          <w:noProof/>
+          <w:kern w:val="2"/>
+        </w:rPr>
+      </w:pPr>
+      <w:hyperlink w:anchor="_Toc242815315" w:history="1">
+        <w:r>
+          <w:rPr>
+            <w:rStyle w:val="Collegamentoipertestuale"/>
+            <w:noProof/>
+          </w:rPr>
+          <w:t>4.3.</w:t>
+        </w:r>
+        <w:r>
+          <w:rPr>
+            <w:rFonts w:ascii="Aptos" w:eastAsia="Times New Roman" w:hAnsi="Aptos" w:cs="Times New Roman"/>
+            <w:noProof/>
+            <w:kern w:val="2"/>
+          </w:rPr>
+          <w:tab/>
+        </w:r>
+        <w:r>
+          <w:rPr>
+            <w:rStyle w:val="Collegamentoipertestuale"/>
+            <w:noProof/>
+          </w:rPr>
+          <w:t>Reliability</w:t>
+        </w:r>
+        <w:r>
+          <w:rPr>
+            <w:noProof/>
+            <w:webHidden/>
+          </w:rPr>
+          <w:tab/>
+        </w:r>
+        <w:r>
+          <w:rPr>
+            <w:noProof/>
+            <w:webHidden/>
+          </w:rPr>
+          <w:fldChar w:fldCharType="begin"/>
+        </w:r>
+        <w:r>
+          <w:rPr>
+            <w:noProof/>
+            <w:webHidden/>
+          </w:rPr>
+          <w:instrText xml:space="preserve"> PAGEREF _Toc242815315 \h </w:instrText>
+        </w:r>
+        <w:r>
+          <w:rPr>
+            <w:noProof/>
+            <w:webHidden/>
+          </w:rPr>
+        </w:r>
+        <w:r>
+          <w:rPr>
+            <w:noProof/>
+            <w:webHidden/>
+          </w:rPr>
+          <w:fldChar w:fldCharType="separate"/>
+        </w:r>
+        <w:r>
+          <w:rPr>
+            <w:noProof/>
+            <w:webHidden/>
+          </w:rPr>
+          <w:t>6</w:t>
+        </w:r>
+        <w:r>
+          <w:rPr>
+            <w:noProof/>
+            <w:webHidden/>
+          </w:rPr>
+          <w:fldChar w:fldCharType="end"/>
+        </w:r>
+      </w:hyperlink>
+    </w:p>
+    <w:p>
+      <w:pPr>
+        <w:pStyle w:val="Sommario2"/>
+        <w:tabs>
+          <w:tab w:val="left" w:pos="1132"/>
+        </w:tabs>
+        <w:rPr>
+          <w:rFonts w:ascii="Aptos" w:eastAsia="Times New Roman" w:hAnsi="Aptos" w:cs="Times New Roman"/>
+          <w:noProof/>
+          <w:kern w:val="2"/>
+        </w:rPr>
+      </w:pPr>
+      <w:hyperlink w:anchor="_Toc242815316" w:history="1">
+        <w:r>
+          <w:rPr>
+            <w:rStyle w:val="Collegamentoipertestuale"/>
+            <w:noProof/>
+          </w:rPr>
+          <w:t>4.4.</w:t>
+        </w:r>
+        <w:r>
+          <w:rPr>
+            <w:rFonts w:ascii="Aptos" w:eastAsia="Times New Roman" w:hAnsi="Aptos" w:cs="Times New Roman"/>
+            <w:noProof/>
+            <w:kern w:val="2"/>
+          </w:rPr>
+          <w:tab/>
+        </w:r>
+        <w:r>
+          <w:rPr>
+            <w:rStyle w:val="Collegamentoipertestuale"/>
+            <w:noProof/>
+          </w:rPr>
+          <w:t>Supportability</w:t>
+        </w:r>
+        <w:r>
+          <w:rPr>
+            <w:noProof/>
+            <w:webHidden/>
+          </w:rPr>
+          <w:tab/>
+        </w:r>
+        <w:r>
+          <w:rPr>
+            <w:noProof/>
+            <w:webHidden/>
+          </w:rPr>
+          <w:fldChar w:fldCharType="begin"/>
+        </w:r>
+        <w:r>
+          <w:rPr>
+            <w:noProof/>
+            <w:webHidden/>
+          </w:rPr>
+          <w:instrText xml:space="preserve"> PAGEREF _Toc242815316 \h </w:instrText>
         </w:r>
         <w:r>
           <w:rPr>
@@ -2479,7 +2937,7 @@
           <w:kern w:val="2"/>
         </w:rPr>
       </w:pPr>
-      <w:hyperlink w:anchor="_Toc242783799" w:history="1">
+      <w:hyperlink w:anchor="_Toc242815317" w:history="1">
         <w:r>
           <w:rPr>
             <w:rStyle w:val="Collegamentoipertestuale"/>
@@ -2521,7 +2979,7 @@
             <w:noProof/>
             <w:webHidden/>
           </w:rPr>
-          <w:instrText xml:space="preserve"> PAGEREF _Toc242783799 \h </w:instrText>
+          <w:instrText xml:space="preserve"> PAGEREF _Toc242815317 \h </w:instrText>
         </w:r>
         <w:r>
           <w:rPr>
@@ -2541,7 +2999,7 @@
             <w:noProof/>
             <w:webHidden/>
           </w:rPr>
-          <w:t>6</w:t>
+          <w:t>7</w:t>
         </w:r>
         <w:r>
           <w:rPr>
@@ -2564,7 +3022,7 @@
           <w:kern w:val="2"/>
         </w:rPr>
       </w:pPr>
-      <w:hyperlink w:anchor="_Toc242783800" w:history="1">
+      <w:hyperlink w:anchor="_Toc242815318" w:history="1">
         <w:r>
           <w:rPr>
             <w:rStyle w:val="Collegamentoipertestuale"/>
@@ -2606,7 +3064,7 @@
             <w:noProof/>
             <w:webHidden/>
           </w:rPr>
-          <w:instrText xml:space="preserve"> PAGEREF _Toc242783800 \h </w:instrText>
+          <w:instrText xml:space="preserve"> PAGEREF _Toc242815318 \h </w:instrText>
         </w:r>
         <w:r>
           <w:rPr>
@@ -2626,7 +3084,7 @@
             <w:noProof/>
             <w:webHidden/>
           </w:rPr>
-          <w:t>6</w:t>
+          <w:t>7</w:t>
         </w:r>
         <w:r>
           <w:rPr>
@@ -2683,7 +3141,7 @@
         <w:jc w:val="left"/>
       </w:pPr>
       <w:bookmarkStart w:id="0" w:name="_Ref242705112"/>
-      <w:bookmarkStart w:id="1" w:name="_Toc242783791"/>
+      <w:bookmarkStart w:id="1" w:name="_Toc242815305"/>
       <w:r>
         <w:lastRenderedPageBreak/>
         <w:t>PROBLEM DOMAIN</w:t>
@@ -2720,7 +3178,7 @@
         <w:ind w:left="426" w:hanging="426"/>
         <w:jc w:val="left"/>
       </w:pPr>
-      <w:bookmarkStart w:id="2" w:name="_Toc242783792"/>
+      <w:bookmarkStart w:id="2" w:name="_Toc242815306"/>
       <w:r>
         <w:t>SCENARIOS</w:t>
       </w:r>
@@ -2738,7 +3196,7 @@
       <w:r>
         <w:t xml:space="preserve"> </w:t>
       </w:r>
-      <w:bookmarkStart w:id="4" w:name="_Toc242783793"/>
+      <w:bookmarkStart w:id="4" w:name="_Toc242815307"/>
       <w:r>
         <w:t>Scenario 1</w:t>
       </w:r>
@@ -3001,7 +3459,7 @@
       <w:r>
         <w:t xml:space="preserve"> </w:t>
       </w:r>
-      <w:bookmarkStart w:id="5" w:name="_Toc242783794"/>
+      <w:bookmarkStart w:id="5" w:name="_Toc242815308"/>
       <w:r>
         <w:t>Scenario 2</w:t>
       </w:r>
@@ -3172,7 +3630,7 @@
       <w:r>
         <w:t xml:space="preserve"> </w:t>
       </w:r>
-      <w:bookmarkStart w:id="6" w:name="_Toc242783795"/>
+      <w:bookmarkStart w:id="6" w:name="_Toc242815309"/>
       <w:r>
         <w:t>Scenario 3</w:t>
       </w:r>
@@ -3335,7 +3793,7 @@
       <w:r>
         <w:t xml:space="preserve"> </w:t>
       </w:r>
-      <w:bookmarkStart w:id="7" w:name="_Toc242783796"/>
+      <w:bookmarkStart w:id="7" w:name="_Toc242815310"/>
       <w:r>
         <w:t>Scenario 4</w:t>
       </w:r>
@@ -3422,7 +3880,13 @@
         <w:t>. Non sono presenti in questa tabella i dati personali dei clienti</w:t>
       </w:r>
       <w:r>
-        <w:t>. Crea un report con i dati ricavati e lo da al Product Manager che lo userà per trovare nuovi prodotti da vendere allineati a questi risultati.</w:t>
+        <w:t xml:space="preserve">. Crea un report con i dati ricavati e lo </w:t>
+      </w:r>
+      <w:r>
+        <w:t>fornisce</w:t>
+      </w:r>
+      <w:r>
+        <w:t xml:space="preserve"> al Product Manager che lo userà per trovare nuovi prodotti da vendere allineati a questi risultati.</w:t>
       </w:r>
     </w:p>
     <w:p>
@@ -3435,7 +3899,7 @@
         <w:ind w:left="426" w:hanging="426"/>
         <w:jc w:val="left"/>
       </w:pPr>
-      <w:bookmarkStart w:id="8" w:name="_Toc242783797"/>
+      <w:bookmarkStart w:id="8" w:name="_Toc242815311"/>
       <w:r>
         <w:t>FUNCTIONAL REQUIREMENTS</w:t>
       </w:r>
@@ -3597,11 +4061,11 @@
         <w:ind w:left="709" w:hanging="283"/>
       </w:pPr>
       <w:r>
-        <w:t xml:space="preserve">Il Product Manager deve poter aggiungere nuovi modelli di occhiali al catalogo, </w:t>
+        <w:t xml:space="preserve">Il Product Manager deve poter aggiungere nuovi modelli di occhiali al catalogo,specificando </w:t>
       </w:r>
       <w:r>
         <w:lastRenderedPageBreak/>
-        <w:t>specificando prezzi, immagini, e quantità disponibili, e classificarli come esclusiva online o scontati</w:t>
+        <w:t>prezzi, immagini, e quantità disponibili, e classificarli come esclusiva online o scontati</w:t>
       </w:r>
     </w:p>
     <w:p>
@@ -3660,7 +4124,7 @@
         <w:ind w:left="426" w:hanging="426"/>
         <w:jc w:val="left"/>
       </w:pPr>
-      <w:bookmarkStart w:id="9" w:name="_Toc242783798"/>
+      <w:bookmarkStart w:id="9" w:name="_Toc242815312"/>
       <w:r>
         <w:t>NON</w:t>
       </w:r>
@@ -3668,6 +4132,24 @@
         <w:t>FUNCTIONAL REQUIREMENTS</w:t>
       </w:r>
       <w:bookmarkEnd w:id="9"/>
+    </w:p>
+    <w:p>
+      <w:pPr>
+        <w:pStyle w:val="Titolo2"/>
+        <w:numPr>
+          <w:ilvl w:val="0"/>
+          <w:numId w:val="28"/>
+        </w:numPr>
+        <w:tabs>
+          <w:tab w:val="left" w:pos="284"/>
+        </w:tabs>
+        <w:ind w:left="426" w:hanging="284"/>
+      </w:pPr>
+      <w:bookmarkStart w:id="10" w:name="_Toc242815313"/>
+      <w:r>
+        <w:t>Usability</w:t>
+      </w:r>
+      <w:bookmarkEnd w:id="10"/>
     </w:p>
     <w:p>
       <w:pPr>
@@ -3682,10 +4164,31 @@
         </w:rPr>
       </w:pPr>
       <w:r>
-        <w:t>L'interfaccia utente deve garantire una navigazione fluida riducendo al minimo i tempi di attesa e i ricaricamenti dell'intera pagina.</w:t>
-      </w:r>
-      <w:r>
-        <w:t xml:space="preserve"> Le operazioni frequenti quali la modifica delle quantità del carello, il filtraggio dei prodotti nel catalogo o l’aggiornamento dello stato di un ordine, devono avvenire in modo asincrono, aggiornando istantaneamente solo le porzioni di schermo interessate</w:t>
+        <w:t xml:space="preserve">Il sistema deve offrire un layout flessibile in grado di adattarsi automaticamente alle diverse risoluzioni e formati di schermo (smartphone, tablet, laptop e desktop). </w:t>
+      </w:r>
+      <w:r>
+        <w:t>Gli elementi visivi, come le schede prodotto, la tabella degli ordini e i controlli di gestione, devono riorganizzarsi per preservare leggibilità, accessibilità e facilità d</w:t>
+      </w:r>
+      <w:r>
+        <w:t>’uso</w:t>
+      </w:r>
+      <w:r>
+        <w:t xml:space="preserve"> su qualsiasi dispositivo</w:t>
+      </w:r>
+      <w:r>
+        <w:t>.</w:t>
+      </w:r>
+    </w:p>
+    <w:p>
+      <w:pPr>
+        <w:numPr>
+          <w:ilvl w:val="0"/>
+          <w:numId w:val="24"/>
+        </w:numPr>
+        <w:ind w:left="709" w:hanging="283"/>
+      </w:pPr>
+      <w:r>
+        <w:t>Nelle situazioni in cui una schermata o un componente non presenta contenuti da mostrare (es. carrello degli acquisti vuoto, nessun ordine effettuato, nessun risultato corrispondente a un filtro di ricerca), il sistema non deve mai restituire schermate bianche o layout frammentati. Deve invece mostrare messaggi visivi descrittivi che spieghino chiaramente lo stato attuale e suggeriscano l'azione successiva da compiere</w:t>
       </w:r>
       <w:r>
         <w:t>.</w:t>
@@ -3704,16 +4207,13 @@
         </w:rPr>
       </w:pPr>
       <w:r>
-        <w:t xml:space="preserve">Il sistema deve offrire un layout flessibile in grado di adattarsi automaticamente alle diverse risoluzioni e formati di schermo (smartphone, tablet, laptop e desktop). </w:t>
-      </w:r>
-      <w:r>
-        <w:t>Gli elementi visivi, come le schede prodotto, la tabella degli ordini e i controlli di gestione, devono riorganizzarsi per preservare leggibilità, accessibilità e facilità d</w:t>
-      </w:r>
-      <w:r>
-        <w:t>’uso</w:t>
-      </w:r>
-      <w:r>
-        <w:t xml:space="preserve"> su qualsiasi dispositivo</w:t>
+        <w:t>Il sistema deve rendere costantemente evidente all'utente il risultato delle proprie azioni attraverso notifiche visive, come banner cromatici di conferma (suc</w:t>
+      </w:r>
+      <w:r>
+        <w:t>cesso o errore)</w:t>
+      </w:r>
+      <w:r>
+        <w:t xml:space="preserve"> e badge di stato ben distinti</w:t>
       </w:r>
       <w:r>
         <w:t>.</w:t>
@@ -3732,17 +4232,32 @@
         </w:rPr>
       </w:pPr>
       <w:r>
-        <w:t>Il sistema deve rendere costantemente evidente all'utente il risultato delle proprie azioni attraverso notifiche visive, come banner cromatici di conferma (suc</w:t>
-      </w:r>
-      <w:r>
-        <w:t>cesso o errore)</w:t>
-      </w:r>
-      <w:r>
-        <w:t xml:space="preserve"> e badge di stato ben distinti</w:t>
+        <w:t xml:space="preserve">Le </w:t>
+      </w:r>
+      <w:r>
+        <w:t>regole di protezione e controllo degli accessi devono riflettersi chiaramente sull'interfaccia utente. L'utente deve ricevere messaggi espliciti e comprensibili in caso di inserimento di credenziali errate, tentativi di accesso a sezioni non autorizzate o nel caso in cui stia tentando di accedere con un account sospeso o disattivato</w:t>
       </w:r>
       <w:r>
         <w:t>.</w:t>
       </w:r>
+    </w:p>
+    <w:p>
+      <w:pPr>
+        <w:pStyle w:val="Titolo2"/>
+        <w:numPr>
+          <w:ilvl w:val="0"/>
+          <w:numId w:val="28"/>
+        </w:numPr>
+        <w:tabs>
+          <w:tab w:val="left" w:pos="284"/>
+        </w:tabs>
+        <w:ind w:left="426" w:hanging="284"/>
+      </w:pPr>
+      <w:bookmarkStart w:id="11" w:name="_Toc242815314"/>
+      <w:r>
+        <w:t>Performance</w:t>
+      </w:r>
+      <w:bookmarkEnd w:id="11"/>
     </w:p>
     <w:p>
       <w:pPr>
@@ -3757,14 +4272,26 @@
         </w:rPr>
       </w:pPr>
       <w:r>
-        <w:t xml:space="preserve">Le </w:t>
-      </w:r>
-      <w:r>
-        <w:t>regole di protezione e controllo degli accessi devono riflettersi chiaramente sull'interfaccia utente. L'utente deve ricevere messaggi espliciti e comprensibili in caso di inserimento di credenziali errate, tentativi di accesso a sezioni non autorizzate o nel caso in cui stia tentando di accedere con un account sospeso o disattivato</w:t>
-      </w:r>
-      <w:r>
-        <w:t>.</w:t>
-      </w:r>
+        <w:t>L'interfaccia utente deve garantire una navigazione fluida riducendo al minimo i tempi di attesa e i ricaricamenti dell'intera pagina, i quali comporterebbero fastidiose interruzioni visive e attese stimate tra 0,5 e 3 secondi per ogni singola azione. Le operazioni frequenti quali la modifica delle quantità del carrello, il filtraggio dei prodotti nel catalogo o l'aggiornamento dello stato di un ordine, devono avvenire in modo asincrono. Questo significa che il sistema deve aggiornare istantaneamente (in circa 100-300 millisecondi) solo le porzioni di schermo interessate dal cambiamento, evitando di dover scaricare e ridisegnare da zero l'intera pagina web per ogni minima modifica.</w:t>
+      </w:r>
+    </w:p>
+    <w:p>
+      <w:pPr>
+        <w:pStyle w:val="Titolo2"/>
+        <w:numPr>
+          <w:ilvl w:val="0"/>
+          <w:numId w:val="28"/>
+        </w:numPr>
+        <w:tabs>
+          <w:tab w:val="left" w:pos="284"/>
+        </w:tabs>
+        <w:ind w:left="426" w:hanging="284"/>
+      </w:pPr>
+      <w:bookmarkStart w:id="12" w:name="_Toc242815315"/>
+      <w:r>
+        <w:t>Reliability</w:t>
+      </w:r>
+      <w:bookmarkEnd w:id="12"/>
     </w:p>
     <w:p>
       <w:pPr>
@@ -3775,11 +4302,26 @@
         <w:ind w:left="709" w:hanging="283"/>
       </w:pPr>
       <w:r>
-        <w:t>Nelle situazioni in cui una schermata o un componente non presenta contenuti da mostrare (es. carrello degli acquisti vuoto, nessun ordine effettuato, nessun risultato corrispondente a un filtro di ricerca), il sistema non deve mai restituire schermate bianche o layout frammentati. Deve invece mostrare messaggi visivi descrittivi che spieghino chiaramente lo stato attuale e suggeriscano l'azione successiva da compiere</w:t>
-      </w:r>
-      <w:r>
-        <w:t>.</w:t>
-      </w:r>
+        <w:t>Per garantire affidabilità e sicurezza dei dati sensibili dei clienti e dei dipendenti, il sistema deve essere in grado di resistere a specifici attacchi di sicurezza. Vengono, pertanto, richieste all'utente la scelta di password robuste a protezione del suo account. Password che verranno poi criptate per i fini di sicurezza e conservate all'interno di un database (DB) protetto da un Firewall.</w:t>
+      </w:r>
+    </w:p>
+    <w:p>
+      <w:pPr>
+        <w:pStyle w:val="Titolo2"/>
+        <w:numPr>
+          <w:ilvl w:val="0"/>
+          <w:numId w:val="28"/>
+        </w:numPr>
+        <w:tabs>
+          <w:tab w:val="left" w:pos="284"/>
+        </w:tabs>
+        <w:ind w:left="426" w:hanging="284"/>
+      </w:pPr>
+      <w:bookmarkStart w:id="13" w:name="_Toc242815316"/>
+      <w:r>
+        <w:t>Supportability</w:t>
+      </w:r>
+      <w:bookmarkEnd w:id="13"/>
     </w:p>
     <w:p>
       <w:pPr>
@@ -3788,6 +4330,7 @@
           <w:numId w:val="24"/>
         </w:numPr>
         <w:ind w:left="709" w:hanging="283"/>
+        <w:jc w:val="both"/>
       </w:pPr>
       <w:r>
         <w:t>L'aspetto grafico</w:t>
@@ -3826,25 +4369,6 @@
         <w:t>.</w:t>
       </w:r>
     </w:p>
-    <w:p>
-      <w:pPr>
-        <w:numPr>
-          <w:ilvl w:val="0"/>
-          <w:numId w:val="24"/>
-        </w:numPr>
-        <w:ind w:left="709" w:hanging="283"/>
-      </w:pPr>
-      <w:r>
-        <w:t>Per garantire affidabilità e sicurezza dei dati sensibili dei clienti e dei dipendenti, i</w:t>
-      </w:r>
-      <w:r>
-        <w:t xml:space="preserve">l sistema deve essere in grado di resistere a specifici attacchi di sicurezza. </w:t>
-      </w:r>
-      <w:r>
-        <w:t>Vengono, pertanto, richieste all’utente la scelta di password robuste a protezione del suo account; password da dover poi criptare per i fini di sicurezza.</w:t>
-      </w:r>
-    </w:p>
-    <w:p/>
     <w:p>
       <w:pPr>
         <w:pStyle w:val="Titolo"/>
@@ -3855,13 +4379,182 @@
         <w:ind w:left="426" w:hanging="426"/>
         <w:jc w:val="left"/>
       </w:pPr>
-      <w:bookmarkStart w:id="10" w:name="_Toc242783799"/>
-      <w:r>
+      <w:bookmarkStart w:id="14" w:name="_Toc242815317"/>
+      <w:r>
+        <w:lastRenderedPageBreak/>
         <w:t>TARGET ENVIRONMENT</w:t>
       </w:r>
-      <w:bookmarkEnd w:id="10"/>
+      <w:bookmarkEnd w:id="14"/>
     </w:p>
-    <w:p/>
+    <w:p>
+      <w:pPr>
+        <w:numPr>
+          <w:ilvl w:val="0"/>
+          <w:numId w:val="25"/>
+        </w:numPr>
+      </w:pPr>
+      <w:r>
+        <w:rPr>
+          <w:b/>
+          <w:bCs/>
+        </w:rPr>
+        <w:t>Ambiente Lato Server</w:t>
+      </w:r>
+      <w:r>
+        <w:t>:</w:t>
+      </w:r>
+      <w:r>
+        <w:t xml:space="preserve"> </w:t>
+      </w:r>
+      <w:r>
+        <w:t>I</w:t>
+      </w:r>
+      <w:r>
+        <w:t>l progetto</w:t>
+      </w:r>
+      <w:r>
+        <w:t xml:space="preserve"> GG-Eyewear è</w:t>
+      </w:r>
+      <w:r>
+        <w:t xml:space="preserve"> basato sull'architettura MVC con Jakarta EE e JSP</w:t>
+      </w:r>
+      <w:r>
+        <w:t xml:space="preserve">, pertanto </w:t>
+      </w:r>
+      <w:r>
+        <w:t>l</w:t>
+      </w:r>
+      <w:r>
+        <w:t>’</w:t>
+      </w:r>
+      <w:r>
+        <w:t>ambiente di destinazione includerà un Application Server/Web Container (</w:t>
+      </w:r>
+      <w:r>
+        <w:t xml:space="preserve">come </w:t>
+      </w:r>
+      <w:r>
+        <w:t xml:space="preserve">Apache Tomcat) dotato di Java Runtime Environment (JRE). </w:t>
+      </w:r>
+      <w:r>
+        <w:t>P</w:t>
+      </w:r>
+      <w:r>
+        <w:t>er memorizzare le entità del Model (catalogo occhiali, dati degli utenti, ordini)</w:t>
+      </w:r>
+      <w:r>
+        <w:t xml:space="preserve"> sarà necessario l’utilizzo di </w:t>
+      </w:r>
+      <w:r>
+        <w:t>un server di Database relazionale (</w:t>
+      </w:r>
+      <w:r>
+        <w:t xml:space="preserve">come </w:t>
+      </w:r>
+      <w:r>
+        <w:t>MySQL)</w:t>
+      </w:r>
+      <w:r>
+        <w:t>.</w:t>
+      </w:r>
+    </w:p>
+    <w:p>
+      <w:pPr>
+        <w:numPr>
+          <w:ilvl w:val="0"/>
+          <w:numId w:val="25"/>
+        </w:numPr>
+      </w:pPr>
+      <w:r>
+        <w:rPr>
+          <w:b/>
+          <w:bCs/>
+        </w:rPr>
+        <w:t>Ambiente Lato Client</w:t>
+      </w:r>
+      <w:r>
+        <w:t>:</w:t>
+      </w:r>
+      <w:r>
+        <w:t xml:space="preserve"> </w:t>
+      </w:r>
+      <w:r>
+        <w:t>Dato che il sito è sviluppato con un approccio "full responsive", l'ambiente di destinazione lato client è costituito dai moderni browser web (Chrome, Safari, Firefox, Edge) esegui</w:t>
+      </w:r>
+      <w:r>
+        <w:t>bili</w:t>
+      </w:r>
+      <w:r>
+        <w:t xml:space="preserve"> su una moltitudine di dispositivi: PC Desktop, tablet e smartphone. L'ambiente client deve supportare l'esecuzione di</w:t>
+      </w:r>
+      <w:r>
+        <w:t xml:space="preserve"> codice</w:t>
+      </w:r>
+      <w:r>
+        <w:t xml:space="preserve"> JavaScript</w:t>
+      </w:r>
+      <w:r>
+        <w:t xml:space="preserve"> (per l’esecuzione di chiamate asincrone</w:t>
+      </w:r>
+      <w:r>
+        <w:t xml:space="preserve"> AJAX</w:t>
+      </w:r>
+      <w:r>
+        <w:t xml:space="preserve"> e di validazioni dei campi</w:t>
+      </w:r>
+      <w:r>
+        <w:t xml:space="preserve">) e l'interpretazione di CSS avanzato (animazioni e media queries). </w:t>
+      </w:r>
+    </w:p>
+    <w:p>
+      <w:pPr>
+        <w:numPr>
+          <w:ilvl w:val="0"/>
+          <w:numId w:val="25"/>
+        </w:numPr>
+      </w:pPr>
+      <w:r>
+        <w:rPr>
+          <w:b/>
+          <w:bCs/>
+        </w:rPr>
+        <w:t>Ambiente Operativo</w:t>
+      </w:r>
+      <w:r>
+        <w:t>:</w:t>
+      </w:r>
+      <w:r>
+        <w:t xml:space="preserve"> Per consentire un corretto operato da parte delle figure manageriali (Order Manager, </w:t>
+      </w:r>
+      <w:r>
+        <w:t>Product Manager</w:t>
+      </w:r>
+      <w:r>
+        <w:t>, Market Analyzer)</w:t>
+      </w:r>
+      <w:r>
+        <w:t xml:space="preserve"> il negozio presenta degli uffici interni dotati di postazioni </w:t>
+      </w:r>
+      <w:r>
+        <w:t>PC desktop</w:t>
+      </w:r>
+      <w:r>
+        <w:t xml:space="preserve"> e </w:t>
+      </w:r>
+      <w:r>
+        <w:t>laptop connessi alla rete del negozio</w:t>
+      </w:r>
+      <w:r>
+        <w:t>.</w:t>
+      </w:r>
+    </w:p>
+    <w:p>
+      <w:pPr>
+        <w:pStyle w:val="Titolo"/>
+        <w:ind w:left="426"/>
+        <w:jc w:val="left"/>
+      </w:pPr>
+    </w:p>
     <w:p>
       <w:pPr>
         <w:pStyle w:val="Titolo"/>
@@ -3872,11 +4565,11 @@
         <w:ind w:left="426" w:hanging="426"/>
         <w:jc w:val="left"/>
       </w:pPr>
-      <w:bookmarkStart w:id="11" w:name="_Toc242783800"/>
+      <w:bookmarkStart w:id="15" w:name="_Toc242815318"/>
       <w:r>
         <w:t>DELIVERABLE &amp; DEADLINES</w:t>
       </w:r>
-      <w:bookmarkEnd w:id="11"/>
+      <w:bookmarkEnd w:id="15"/>
     </w:p>
     <w:tbl>
       <w:tblPr>
@@ -3919,7 +4612,6 @@
               <w:rPr>
                 <w:szCs w:val="32"/>
               </w:rPr>
-              <w:lastRenderedPageBreak/>
               <w:t>Materiale di Consegna</w:t>
             </w:r>
           </w:p>
@@ -4207,7 +4899,14 @@
                 <w:sz w:val="22"/>
                 <w:szCs w:val="22"/>
               </w:rPr>
-              <w:t>Specifica delle interfacce dei moduli del sottosistema da implementare (parte dell’Object Design Document)</w:t>
+              <w:t>Object Design Document: parte sulla s</w:t>
+            </w:r>
+            <w:r>
+              <w:rPr>
+                <w:sz w:val="22"/>
+                <w:szCs w:val="22"/>
+              </w:rPr>
+              <w:t xml:space="preserve">pecifica delle interfacce dei moduli del sottosistema da implementare </w:t>
             </w:r>
           </w:p>
         </w:tc>
@@ -4249,7 +4948,7 @@
             <w:tcW w:w="5812" w:type="dxa"/>
             <w:tcBorders>
               <w:left w:val="single" w:sz="1" w:space="0" w:color="000000"/>
-              <w:bottom w:val="single" w:sz="1" w:space="0" w:color="000000"/>
+              <w:bottom w:val="single" w:sz="4" w:space="0" w:color="auto"/>
             </w:tcBorders>
           </w:tcPr>
           <w:p>
@@ -4273,6 +4972,134 @@
           <w:tcPr>
             <w:tcW w:w="2162" w:type="dxa"/>
             <w:tcBorders>
+              <w:left w:val="single" w:sz="1" w:space="0" w:color="000000"/>
+              <w:bottom w:val="single" w:sz="4" w:space="0" w:color="auto"/>
+              <w:right w:val="single" w:sz="1" w:space="0" w:color="000000"/>
+            </w:tcBorders>
+            <w:vAlign w:val="center"/>
+          </w:tcPr>
+          <w:p>
+            <w:pPr>
+              <w:pStyle w:val="Contenutotabella"/>
+              <w:jc w:val="center"/>
+              <w:rPr>
+                <w:sz w:val="22"/>
+                <w:szCs w:val="22"/>
+              </w:rPr>
+            </w:pPr>
+            <w:r>
+              <w:rPr>
+                <w:sz w:val="22"/>
+                <w:szCs w:val="22"/>
+              </w:rPr>
+              <w:t>17 dicembre</w:t>
+            </w:r>
+          </w:p>
+        </w:tc>
+      </w:tr>
+      <w:tr>
+        <w:trPr>
+          <w:trHeight w:val="233"/>
+        </w:trPr>
+        <w:tc>
+          <w:tcPr>
+            <w:tcW w:w="5812" w:type="dxa"/>
+            <w:tcBorders>
+              <w:top w:val="single" w:sz="4" w:space="0" w:color="auto"/>
+              <w:left w:val="single" w:sz="4" w:space="0" w:color="auto"/>
+              <w:bottom w:val="single" w:sz="4" w:space="0" w:color="auto"/>
+              <w:right w:val="single" w:sz="4" w:space="0" w:color="auto"/>
+            </w:tcBorders>
+          </w:tcPr>
+          <w:p>
+            <w:pPr>
+              <w:pStyle w:val="Contenutotabella"/>
+              <w:rPr>
+                <w:sz w:val="22"/>
+                <w:szCs w:val="22"/>
+              </w:rPr>
+            </w:pPr>
+            <w:r>
+              <w:rPr>
+                <w:sz w:val="22"/>
+                <w:szCs w:val="22"/>
+              </w:rPr>
+              <w:t>Object Design Document</w:t>
+            </w:r>
+          </w:p>
+        </w:tc>
+        <w:tc>
+          <w:tcPr>
+            <w:tcW w:w="2162" w:type="dxa"/>
+            <w:tcBorders>
+              <w:top w:val="single" w:sz="4" w:space="0" w:color="auto"/>
+              <w:left w:val="single" w:sz="4" w:space="0" w:color="auto"/>
+              <w:bottom w:val="single" w:sz="4" w:space="0" w:color="auto"/>
+              <w:right w:val="single" w:sz="4" w:space="0" w:color="auto"/>
+            </w:tcBorders>
+            <w:vAlign w:val="center"/>
+          </w:tcPr>
+          <w:p>
+            <w:pPr>
+              <w:pStyle w:val="Contenutotabella"/>
+              <w:jc w:val="center"/>
+              <w:rPr>
+                <w:sz w:val="22"/>
+                <w:szCs w:val="22"/>
+              </w:rPr>
+            </w:pPr>
+            <w:r>
+              <w:rPr>
+                <w:sz w:val="22"/>
+                <w:szCs w:val="22"/>
+              </w:rPr>
+              <w:t>8</w:t>
+            </w:r>
+            <w:r>
+              <w:rPr>
+                <w:sz w:val="22"/>
+                <w:szCs w:val="22"/>
+              </w:rPr>
+              <w:t xml:space="preserve"> gennaio</w:t>
+            </w:r>
+          </w:p>
+        </w:tc>
+      </w:tr>
+      <w:tr>
+        <w:trPr>
+          <w:trHeight w:val="233"/>
+        </w:trPr>
+        <w:tc>
+          <w:tcPr>
+            <w:tcW w:w="5812" w:type="dxa"/>
+            <w:tcBorders>
+              <w:top w:val="single" w:sz="4" w:space="0" w:color="auto"/>
+              <w:left w:val="single" w:sz="1" w:space="0" w:color="000000"/>
+              <w:bottom w:val="single" w:sz="1" w:space="0" w:color="000000"/>
+            </w:tcBorders>
+          </w:tcPr>
+          <w:p>
+            <w:pPr>
+              <w:pStyle w:val="Contenutotabella"/>
+              <w:rPr>
+                <w:sz w:val="22"/>
+                <w:szCs w:val="22"/>
+              </w:rPr>
+            </w:pPr>
+            <w:r>
+              <w:rPr>
+                <w:sz w:val="22"/>
+                <w:szCs w:val="22"/>
+              </w:rPr>
+              <w:t>Documenti di Esecuzione del Test</w:t>
+            </w:r>
+          </w:p>
+        </w:tc>
+        <w:tc>
+          <w:tcPr>
+            <w:tcW w:w="2162" w:type="dxa"/>
+            <w:tcBorders>
+              <w:top w:val="single" w:sz="4" w:space="0" w:color="auto"/>
               <w:left w:val="single" w:sz="1" w:space="0" w:color="000000"/>
               <w:bottom w:val="single" w:sz="1" w:space="0" w:color="000000"/>
               <w:right w:val="single" w:sz="1" w:space="0" w:color="000000"/>
@@ -4293,7 +5120,14 @@
                 <w:sz w:val="22"/>
                 <w:szCs w:val="22"/>
               </w:rPr>
-              <w:t>17 dicembre</w:t>
+              <w:t>8</w:t>
+            </w:r>
+            <w:r>
+              <w:rPr>
+                <w:sz w:val="22"/>
+                <w:szCs w:val="22"/>
+              </w:rPr>
+              <w:t xml:space="preserve"> gennaio</w:t>
             </w:r>
           </w:p>
         </w:tc>
@@ -4346,7 +5180,7 @@
 </file>
 
 <file path=word/endnotes.xml><?xml version="1.0" encoding="utf-8"?>
-<w:endnotes xmlns:wpc="http://schemas.microsoft.com/office/word/2010/wordprocessingCanvas" xmlns:cx="http://schemas.microsoft.com/office/drawing/2014/chartex" xmlns:cx1="http://schemas.microsoft.com/office/drawing/2015/9/8/chartex" xmlns:cx2="http://schemas.microsoft.com/office/drawing/2015/10/21/chartex" xmlns:cx3="http://schemas.microsoft.com/office/drawing/2016/5/9/chartex" xmlns:cx4="http://schemas.microsoft.com/office/drawing/2016/5/10/chartex" xmlns:cx5="http://schemas.microsoft.com/office/drawing/2016/5/11/chartex" xmlns:cx6="http://schemas.microsoft.com/office/drawing/2016/5/12/chartex" xmlns:cx7="http://schemas.microsoft.com/office/drawing/2016/5/13/chartex" xmlns:cx8="http://schemas.microsoft.com/office/drawing/2016/5/14/chartex" xmlns:mc="http://schemas.openxmlformats.org/markup-compatibility/2006" xmlns:aink="http://schemas.microsoft.com/office/drawing/2016/ink" xmlns:am3d="http://schemas.microsoft.com/office/drawing/2017/model3d" xmlns:o="urn:schemas-microsoft-com:office:office" xmlns:oel="http://schemas.microsoft.com/office/2019/extlst" xmlns:r="http://schemas.openxmlformats.org/officeDocument/2006/relationships" xmlns:m="http://schemas.openxmlformats.org/officeDocument/2006/math" xmlns:v="urn:schemas-microsoft-com:vml" xmlns:wp14="http://schemas.microsoft.com/office/word/2010/wordprocessingDrawing" xmlns:wp="http://schemas.openxmlformats.org/drawingml/2006/wordprocessingDrawing" xmlns:w10="urn:schemas-microsoft-com:office:word" xmlns:w="http://schemas.openxmlformats.org/wordprocessingml/2006/main" xmlns:w14="http://schemas.microsoft.com/office/word/2010/wordml" xmlns:w15="http://schemas.microsoft.com/office/word/2012/wordml" xmlns:w16cex="http://schemas.microsoft.com/office/word/2018/wordml/cex" xmlns:w16cid="http://schemas.microsoft.com/office/word/2016/wordml/cid" xmlns:w16="http://schemas.microsoft.com/office/word/2018/wordml" xmlns:w16du="http://schemas.microsoft.com/office/word/2023/wordml/word16du" xmlns:w16sdtdh="http://schemas.microsoft.com/office/word/2020/wordml/sdtdatahash" xmlns:w16sdtfl="http://schemas.microsoft.com/office/word/2024/wordml/sdtformatlock" xmlns:w16se="http://schemas.microsoft.com/office/word/2015/wordml/symex" xmlns:wpg="http://schemas.microsoft.com/office/word/2010/wordprocessingGroup" xmlns:wpi="http://schemas.microsoft.com/office/word/2010/wordprocessingInk" xmlns:wne="http://schemas.microsoft.com/office/word/2006/wordml" xmlns:wps="http://schemas.microsoft.com/office/word/2010/wordprocessingShape" mc:Ignorable="w14 w15 w16se w16cid w16 w16cex w16sdtdh w16sdtfl w16du wp14">
+<w:endnotes xmlns:wpc="http://schemas.microsoft.com/office/word/2010/wordprocessingCanvas" xmlns:cx="http://schemas.microsoft.com/office/drawing/2014/chartex" xmlns:cx1="http://schemas.microsoft.com/office/drawing/2015/9/8/chartex" xmlns:cx2="http://schemas.microsoft.com/office/drawing/2015/10/21/chartex" xmlns:cx3="http://schemas.microsoft.com/office/drawing/2016/5/9/chartex" xmlns:cx4="http://schemas.microsoft.com/office/drawing/2016/5/10/chartex" xmlns:cx5="http://schemas.microsoft.com/office/drawing/2016/5/11/chartex" xmlns:cx6="http://schemas.microsoft.com/office/drawing/2016/5/12/chartex" xmlns:cx7="http://schemas.microsoft.com/office/drawing/2016/5/13/chartex" xmlns:cx8="http://schemas.microsoft.com/office/drawing/2016/5/14/chartex" xmlns:mc="http://schemas.openxmlformats.org/markup-compatibility/2006" xmlns:m="http://schemas.openxmlformats.org/officeDocument/2006/math" xmlns:aink="http://schemas.microsoft.com/office/drawing/2016/ink" xmlns:am3d="http://schemas.microsoft.com/office/drawing/2017/model3d" xmlns:oel="http://schemas.microsoft.com/office/2019/extlst" xmlns:r="http://schemas.openxmlformats.org/officeDocument/2006/relationships" xmlns:wp14="http://schemas.microsoft.com/office/word/2010/wordprocessingDrawing" xmlns:wp="http://schemas.openxmlformats.org/drawingml/2006/wordprocessingDrawing" xmlns:wpg="http://schemas.microsoft.com/office/word/2010/wordprocessingGroup" xmlns:wpi="http://schemas.microsoft.com/office/word/2010/wordprocessingInk" xmlns:wps="http://schemas.microsoft.com/office/word/2010/wordprocessingShape" xmlns:o="urn:schemas-microsoft-com:office:office" xmlns:v="urn:schemas-microsoft-com:vml" xmlns:w10="urn:schemas-microsoft-com:office:word" xmlns:w="http://schemas.openxmlformats.org/wordprocessingml/2006/main" xmlns:w14="http://schemas.microsoft.com/office/word/2010/wordml" xmlns:w15="http://schemas.microsoft.com/office/word/2012/wordml" xmlns:w16cex="http://schemas.microsoft.com/office/word/2018/wordml/cex" xmlns:w16cid="http://schemas.microsoft.com/office/word/2016/wordml/cid" xmlns:w16="http://schemas.microsoft.com/office/word/2018/wordml" xmlns:w16sdtdh="http://schemas.microsoft.com/office/word/2020/wordml/sdtdatahash" xmlns:w16sdtfl="http://schemas.microsoft.com/office/word/2024/wordml/sdtformatlock" xmlns:w16se="http://schemas.microsoft.com/office/word/2015/wordml/symex" xmlns:w16du="http://schemas.microsoft.com/office/word/2023/wordml/word16du" xmlns:wne="http://schemas.microsoft.com/office/word/2006/wordml" mc:Ignorable="w14 w15 w16se w16cid w16 w16cex w16sdtdh w16sdtfl w16du wp14">
   <w:endnote w:type="separator" w:id="-1">
     <w:p>
       <w:r>
@@ -4365,7 +5199,7 @@
 </file>
 
 <file path=word/footer1.xml><?xml version="1.0" encoding="utf-8"?>
-<w:ftr xmlns:wpc="http://schemas.microsoft.com/office/word/2010/wordprocessingCanvas" xmlns:cx="http://schemas.microsoft.com/office/drawing/2014/chartex" xmlns:cx1="http://schemas.microsoft.com/office/drawing/2015/9/8/chartex" xmlns:cx2="http://schemas.microsoft.com/office/drawing/2015/10/21/chartex" xmlns:cx3="http://schemas.microsoft.com/office/drawing/2016/5/9/chartex" xmlns:cx4="http://schemas.microsoft.com/office/drawing/2016/5/10/chartex" xmlns:cx5="http://schemas.microsoft.com/office/drawing/2016/5/11/chartex" xmlns:cx6="http://schemas.microsoft.com/office/drawing/2016/5/12/chartex" xmlns:cx7="http://schemas.microsoft.com/office/drawing/2016/5/13/chartex" xmlns:cx8="http://schemas.microsoft.com/office/drawing/2016/5/14/chartex" xmlns:mc="http://schemas.openxmlformats.org/markup-compatibility/2006" xmlns:aink="http://schemas.microsoft.com/office/drawing/2016/ink" xmlns:am3d="http://schemas.microsoft.com/office/drawing/2017/model3d" xmlns:o="urn:schemas-microsoft-com:office:office" xmlns:oel="http://schemas.microsoft.com/office/2019/extlst" xmlns:r="http://schemas.openxmlformats.org/officeDocument/2006/relationships" xmlns:m="http://schemas.openxmlformats.org/officeDocument/2006/math" xmlns:v="urn:schemas-microsoft-com:vml" xmlns:wp14="http://schemas.microsoft.com/office/word/2010/wordprocessingDrawing" xmlns:wp="http://schemas.openxmlformats.org/drawingml/2006/wordprocessingDrawing" xmlns:w10="urn:schemas-microsoft-com:office:word" xmlns:w="http://schemas.openxmlformats.org/wordprocessingml/2006/main" xmlns:w14="http://schemas.microsoft.com/office/word/2010/wordml" xmlns:w15="http://schemas.microsoft.com/office/word/2012/wordml" xmlns:w16cex="http://schemas.microsoft.com/office/word/2018/wordml/cex" xmlns:w16cid="http://schemas.microsoft.com/office/word/2016/wordml/cid" xmlns:w16="http://schemas.microsoft.com/office/word/2018/wordml" xmlns:w16du="http://schemas.microsoft.com/office/word/2023/wordml/word16du" xmlns:w16sdtdh="http://schemas.microsoft.com/office/word/2020/wordml/sdtdatahash" xmlns:w16sdtfl="http://schemas.microsoft.com/office/word/2024/wordml/sdtformatlock" xmlns:w16se="http://schemas.microsoft.com/office/word/2015/wordml/symex" xmlns:wpg="http://schemas.microsoft.com/office/word/2010/wordprocessingGroup" xmlns:wpi="http://schemas.microsoft.com/office/word/2010/wordprocessingInk" xmlns:wne="http://schemas.microsoft.com/office/word/2006/wordml" xmlns:wps="http://schemas.microsoft.com/office/word/2010/wordprocessingShape" mc:Ignorable="w14 w15 w16se w16cid w16 w16cex w16sdtdh w16sdtfl w16du wp14">
+<w:ftr xmlns:wpc="http://schemas.microsoft.com/office/word/2010/wordprocessingCanvas" xmlns:cx="http://schemas.microsoft.com/office/drawing/2014/chartex" xmlns:cx1="http://schemas.microsoft.com/office/drawing/2015/9/8/chartex" xmlns:cx2="http://schemas.microsoft.com/office/drawing/2015/10/21/chartex" xmlns:cx3="http://schemas.microsoft.com/office/drawing/2016/5/9/chartex" xmlns:cx4="http://schemas.microsoft.com/office/drawing/2016/5/10/chartex" xmlns:cx5="http://schemas.microsoft.com/office/drawing/2016/5/11/chartex" xmlns:cx6="http://schemas.microsoft.com/office/drawing/2016/5/12/chartex" xmlns:cx7="http://schemas.microsoft.com/office/drawing/2016/5/13/chartex" xmlns:cx8="http://schemas.microsoft.com/office/drawing/2016/5/14/chartex" xmlns:mc="http://schemas.openxmlformats.org/markup-compatibility/2006" xmlns:m="http://schemas.openxmlformats.org/officeDocument/2006/math" xmlns:aink="http://schemas.microsoft.com/office/drawing/2016/ink" xmlns:am3d="http://schemas.microsoft.com/office/drawing/2017/model3d" xmlns:oel="http://schemas.microsoft.com/office/2019/extlst" xmlns:r="http://schemas.openxmlformats.org/officeDocument/2006/relationships" xmlns:wp14="http://schemas.microsoft.com/office/word/2010/wordprocessingDrawing" xmlns:wp="http://schemas.openxmlformats.org/drawingml/2006/wordprocessingDrawing" xmlns:wpg="http://schemas.microsoft.com/office/word/2010/wordprocessingGroup" xmlns:wpi="http://schemas.microsoft.com/office/word/2010/wordprocessingInk" xmlns:wps="http://schemas.microsoft.com/office/word/2010/wordprocessingShape" xmlns:o="urn:schemas-microsoft-com:office:office" xmlns:v="urn:schemas-microsoft-com:vml" xmlns:w10="urn:schemas-microsoft-com:office:word" xmlns:w="http://schemas.openxmlformats.org/wordprocessingml/2006/main" xmlns:w14="http://schemas.microsoft.com/office/word/2010/wordml" xmlns:w15="http://schemas.microsoft.com/office/word/2012/wordml" xmlns:w16cex="http://schemas.microsoft.com/office/word/2018/wordml/cex" xmlns:w16cid="http://schemas.microsoft.com/office/word/2016/wordml/cid" xmlns:w16="http://schemas.microsoft.com/office/word/2018/wordml" xmlns:w16sdtdh="http://schemas.microsoft.com/office/word/2020/wordml/sdtdatahash" xmlns:w16sdtfl="http://schemas.microsoft.com/office/word/2024/wordml/sdtformatlock" xmlns:w16se="http://schemas.microsoft.com/office/word/2015/wordml/symex" xmlns:w16du="http://schemas.microsoft.com/office/word/2023/wordml/word16du" xmlns:wne="http://schemas.microsoft.com/office/word/2006/wordml" mc:Ignorable="w14 w15 w16se w16cid w16 w16cex w16sdtdh w16sdtfl w16du wp14">
   <w:tbl>
     <w:tblPr>
       <w:tblW w:w="0" w:type="auto"/>
@@ -4533,31 +5367,31 @@
 </file>
 
 <file path=word/footer2.xml><?xml version="1.0" encoding="utf-8"?>
-<w:ftr xmlns:wpc="http://schemas.microsoft.com/office/word/2010/wordprocessingCanvas" xmlns:cx="http://schemas.microsoft.com/office/drawing/2014/chartex" xmlns:cx1="http://schemas.microsoft.com/office/drawing/2015/9/8/chartex" xmlns:cx2="http://schemas.microsoft.com/office/drawing/2015/10/21/chartex" xmlns:cx3="http://schemas.microsoft.com/office/drawing/2016/5/9/chartex" xmlns:cx4="http://schemas.microsoft.com/office/drawing/2016/5/10/chartex" xmlns:cx5="http://schemas.microsoft.com/office/drawing/2016/5/11/chartex" xmlns:cx6="http://schemas.microsoft.com/office/drawing/2016/5/12/chartex" xmlns:cx7="http://schemas.microsoft.com/office/drawing/2016/5/13/chartex" xmlns:cx8="http://schemas.microsoft.com/office/drawing/2016/5/14/chartex" xmlns:mc="http://schemas.openxmlformats.org/markup-compatibility/2006" xmlns:aink="http://schemas.microsoft.com/office/drawing/2016/ink" xmlns:am3d="http://schemas.microsoft.com/office/drawing/2017/model3d" xmlns:o="urn:schemas-microsoft-com:office:office" xmlns:oel="http://schemas.microsoft.com/office/2019/extlst" xmlns:r="http://schemas.openxmlformats.org/officeDocument/2006/relationships" xmlns:m="http://schemas.openxmlformats.org/officeDocument/2006/math" xmlns:v="urn:schemas-microsoft-com:vml" xmlns:wp14="http://schemas.microsoft.com/office/word/2010/wordprocessingDrawing" xmlns:wp="http://schemas.openxmlformats.org/drawingml/2006/wordprocessingDrawing" xmlns:w10="urn:schemas-microsoft-com:office:word" xmlns:w="http://schemas.openxmlformats.org/wordprocessingml/2006/main" xmlns:w14="http://schemas.microsoft.com/office/word/2010/wordml" xmlns:w15="http://schemas.microsoft.com/office/word/2012/wordml" xmlns:w16cex="http://schemas.microsoft.com/office/word/2018/wordml/cex" xmlns:w16cid="http://schemas.microsoft.com/office/word/2016/wordml/cid" xmlns:w16="http://schemas.microsoft.com/office/word/2018/wordml" xmlns:w16du="http://schemas.microsoft.com/office/word/2023/wordml/word16du" xmlns:w16sdtdh="http://schemas.microsoft.com/office/word/2020/wordml/sdtdatahash" xmlns:w16sdtfl="http://schemas.microsoft.com/office/word/2024/wordml/sdtformatlock" xmlns:w16se="http://schemas.microsoft.com/office/word/2015/wordml/symex" xmlns:wpg="http://schemas.microsoft.com/office/word/2010/wordprocessingGroup" xmlns:wpi="http://schemas.microsoft.com/office/word/2010/wordprocessingInk" xmlns:wne="http://schemas.microsoft.com/office/word/2006/wordml" xmlns:wps="http://schemas.microsoft.com/office/word/2010/wordprocessingShape" mc:Ignorable="w14 w15 w16se w16cid w16 w16cex w16sdtdh w16sdtfl w16du wp14">
+<w:ftr xmlns:wpc="http://schemas.microsoft.com/office/word/2010/wordprocessingCanvas" xmlns:cx="http://schemas.microsoft.com/office/drawing/2014/chartex" xmlns:cx1="http://schemas.microsoft.com/office/drawing/2015/9/8/chartex" xmlns:cx2="http://schemas.microsoft.com/office/drawing/2015/10/21/chartex" xmlns:cx3="http://schemas.microsoft.com/office/drawing/2016/5/9/chartex" xmlns:cx4="http://schemas.microsoft.com/office/drawing/2016/5/10/chartex" xmlns:cx5="http://schemas.microsoft.com/office/drawing/2016/5/11/chartex" xmlns:cx6="http://schemas.microsoft.com/office/drawing/2016/5/12/chartex" xmlns:cx7="http://schemas.microsoft.com/office/drawing/2016/5/13/chartex" xmlns:cx8="http://schemas.microsoft.com/office/drawing/2016/5/14/chartex" xmlns:mc="http://schemas.openxmlformats.org/markup-compatibility/2006" xmlns:m="http://schemas.openxmlformats.org/officeDocument/2006/math" xmlns:aink="http://schemas.microsoft.com/office/drawing/2016/ink" xmlns:am3d="http://schemas.microsoft.com/office/drawing/2017/model3d" xmlns:oel="http://schemas.microsoft.com/office/2019/extlst" xmlns:r="http://schemas.openxmlformats.org/officeDocument/2006/relationships" xmlns:wp14="http://schemas.microsoft.com/office/word/2010/wordprocessingDrawing" xmlns:wp="http://schemas.openxmlformats.org/drawingml/2006/wordprocessingDrawing" xmlns:wpg="http://schemas.microsoft.com/office/word/2010/wordprocessingGroup" xmlns:wpi="http://schemas.microsoft.com/office/word/2010/wordprocessingInk" xmlns:wps="http://schemas.microsoft.com/office/word/2010/wordprocessingShape" xmlns:o="urn:schemas-microsoft-com:office:office" xmlns:v="urn:schemas-microsoft-com:vml" xmlns:w10="urn:schemas-microsoft-com:office:word" xmlns:w="http://schemas.openxmlformats.org/wordprocessingml/2006/main" xmlns:w14="http://schemas.microsoft.com/office/word/2010/wordml" xmlns:w15="http://schemas.microsoft.com/office/word/2012/wordml" xmlns:w16cex="http://schemas.microsoft.com/office/word/2018/wordml/cex" xmlns:w16cid="http://schemas.microsoft.com/office/word/2016/wordml/cid" xmlns:w16="http://schemas.microsoft.com/office/word/2018/wordml" xmlns:w16sdtdh="http://schemas.microsoft.com/office/word/2020/wordml/sdtdatahash" xmlns:w16sdtfl="http://schemas.microsoft.com/office/word/2024/wordml/sdtformatlock" xmlns:w16se="http://schemas.microsoft.com/office/word/2015/wordml/symex" xmlns:w16du="http://schemas.microsoft.com/office/word/2023/wordml/word16du" xmlns:wne="http://schemas.microsoft.com/office/word/2006/wordml" mc:Ignorable="w14 w15 w16se w16cid w16 w16cex w16sdtdh w16sdtfl w16du wp14">
   <w:p/>
 </w:ftr>
 </file>
 
 <file path=word/footer3.xml><?xml version="1.0" encoding="utf-8"?>
-<w:ftr xmlns:wpc="http://schemas.microsoft.com/office/word/2010/wordprocessingCanvas" xmlns:cx="http://schemas.microsoft.com/office/drawing/2014/chartex" xmlns:cx1="http://schemas.microsoft.com/office/drawing/2015/9/8/chartex" xmlns:cx2="http://schemas.microsoft.com/office/drawing/2015/10/21/chartex" xmlns:cx3="http://schemas.microsoft.com/office/drawing/2016/5/9/chartex" xmlns:cx4="http://schemas.microsoft.com/office/drawing/2016/5/10/chartex" xmlns:cx5="http://schemas.microsoft.com/office/drawing/2016/5/11/chartex" xmlns:cx6="http://schemas.microsoft.com/office/drawing/2016/5/12/chartex" xmlns:cx7="http://schemas.microsoft.com/office/drawing/2016/5/13/chartex" xmlns:cx8="http://schemas.microsoft.com/office/drawing/2016/5/14/chartex" xmlns:mc="http://schemas.openxmlformats.org/markup-compatibility/2006" xmlns:aink="http://schemas.microsoft.com/office/drawing/2016/ink" xmlns:am3d="http://schemas.microsoft.com/office/drawing/2017/model3d" xmlns:o="urn:schemas-microsoft-com:office:office" xmlns:oel="http://schemas.microsoft.com/office/2019/extlst" xmlns:r="http://schemas.openxmlformats.org/officeDocument/2006/relationships" xmlns:m="http://schemas.openxmlformats.org/officeDocument/2006/math" xmlns:v="urn:schemas-microsoft-com:vml" xmlns:wp14="http://schemas.microsoft.com/office/word/2010/wordprocessingDrawing" xmlns:wp="http://schemas.openxmlformats.org/drawingml/2006/wordprocessingDrawing" xmlns:w10="urn:schemas-microsoft-com:office:word" xmlns:w="http://schemas.openxmlformats.org/wordprocessingml/2006/main" xmlns:w14="http://schemas.microsoft.com/office/word/2010/wordml" xmlns:w15="http://schemas.microsoft.com/office/word/2012/wordml" xmlns:w16cex="http://schemas.microsoft.com/office/word/2018/wordml/cex" xmlns:w16cid="http://schemas.microsoft.com/office/word/2016/wordml/cid" xmlns:w16="http://schemas.microsoft.com/office/word/2018/wordml" xmlns:w16du="http://schemas.microsoft.com/office/word/2023/wordml/word16du" xmlns:w16sdtdh="http://schemas.microsoft.com/office/word/2020/wordml/sdtdatahash" xmlns:w16sdtfl="http://schemas.microsoft.com/office/word/2024/wordml/sdtformatlock" xmlns:w16se="http://schemas.microsoft.com/office/word/2015/wordml/symex" xmlns:wpg="http://schemas.microsoft.com/office/word/2010/wordprocessingGroup" xmlns:wpi="http://schemas.microsoft.com/office/word/2010/wordprocessingInk" xmlns:wne="http://schemas.microsoft.com/office/word/2006/wordml" xmlns:wps="http://schemas.microsoft.com/office/word/2010/wordprocessingShape" mc:Ignorable="w14 w15 w16se w16cid w16 w16cex w16sdtdh w16sdtfl w16du wp14">
+<w:ftr xmlns:wpc="http://schemas.microsoft.com/office/word/2010/wordprocessingCanvas" xmlns:cx="http://schemas.microsoft.com/office/drawing/2014/chartex" xmlns:cx1="http://schemas.microsoft.com/office/drawing/2015/9/8/chartex" xmlns:cx2="http://schemas.microsoft.com/office/drawing/2015/10/21/chartex" xmlns:cx3="http://schemas.microsoft.com/office/drawing/2016/5/9/chartex" xmlns:cx4="http://schemas.microsoft.com/office/drawing/2016/5/10/chartex" xmlns:cx5="http://schemas.microsoft.com/office/drawing/2016/5/11/chartex" xmlns:cx6="http://schemas.microsoft.com/office/drawing/2016/5/12/chartex" xmlns:cx7="http://schemas.microsoft.com/office/drawing/2016/5/13/chartex" xmlns:cx8="http://schemas.microsoft.com/office/drawing/2016/5/14/chartex" xmlns:mc="http://schemas.openxmlformats.org/markup-compatibility/2006" xmlns:m="http://schemas.openxmlformats.org/officeDocument/2006/math" xmlns:aink="http://schemas.microsoft.com/office/drawing/2016/ink" xmlns:am3d="http://schemas.microsoft.com/office/drawing/2017/model3d" xmlns:oel="http://schemas.microsoft.com/office/2019/extlst" xmlns:r="http://schemas.openxmlformats.org/officeDocument/2006/relationships" xmlns:wp14="http://schemas.microsoft.com/office/word/2010/wordprocessingDrawing" xmlns:wp="http://schemas.openxmlformats.org/drawingml/2006/wordprocessingDrawing" xmlns:wpg="http://schemas.microsoft.com/office/word/2010/wordprocessingGroup" xmlns:wpi="http://schemas.microsoft.com/office/word/2010/wordprocessingInk" xmlns:wps="http://schemas.microsoft.com/office/word/2010/wordprocessingShape" xmlns:o="urn:schemas-microsoft-com:office:office" xmlns:v="urn:schemas-microsoft-com:vml" xmlns:w10="urn:schemas-microsoft-com:office:word" xmlns:w="http://schemas.openxmlformats.org/wordprocessingml/2006/main" xmlns:w14="http://schemas.microsoft.com/office/word/2010/wordml" xmlns:w15="http://schemas.microsoft.com/office/word/2012/wordml" xmlns:w16cex="http://schemas.microsoft.com/office/word/2018/wordml/cex" xmlns:w16cid="http://schemas.microsoft.com/office/word/2016/wordml/cid" xmlns:w16="http://schemas.microsoft.com/office/word/2018/wordml" xmlns:w16sdtdh="http://schemas.microsoft.com/office/word/2020/wordml/sdtdatahash" xmlns:w16sdtfl="http://schemas.microsoft.com/office/word/2024/wordml/sdtformatlock" xmlns:w16se="http://schemas.microsoft.com/office/word/2015/wordml/symex" xmlns:w16du="http://schemas.microsoft.com/office/word/2023/wordml/word16du" xmlns:wne="http://schemas.microsoft.com/office/word/2006/wordml" mc:Ignorable="w14 w15 w16se w16cid w16 w16cex w16sdtdh w16sdtfl w16du wp14">
   <w:p/>
 </w:ftr>
 </file>
 
 <file path=word/footer4.xml><?xml version="1.0" encoding="utf-8"?>
-<w:ftr xmlns:wpc="http://schemas.microsoft.com/office/word/2010/wordprocessingCanvas" xmlns:cx="http://schemas.microsoft.com/office/drawing/2014/chartex" xmlns:cx1="http://schemas.microsoft.com/office/drawing/2015/9/8/chartex" xmlns:cx2="http://schemas.microsoft.com/office/drawing/2015/10/21/chartex" xmlns:cx3="http://schemas.microsoft.com/office/drawing/2016/5/9/chartex" xmlns:cx4="http://schemas.microsoft.com/office/drawing/2016/5/10/chartex" xmlns:cx5="http://schemas.microsoft.com/office/drawing/2016/5/11/chartex" xmlns:cx6="http://schemas.microsoft.com/office/drawing/2016/5/12/chartex" xmlns:cx7="http://schemas.microsoft.com/office/drawing/2016/5/13/chartex" xmlns:cx8="http://schemas.microsoft.com/office/drawing/2016/5/14/chartex" xmlns:mc="http://schemas.openxmlformats.org/markup-compatibility/2006" xmlns:aink="http://schemas.microsoft.com/office/drawing/2016/ink" xmlns:am3d="http://schemas.microsoft.com/office/drawing/2017/model3d" xmlns:o="urn:schemas-microsoft-com:office:office" xmlns:oel="http://schemas.microsoft.com/office/2019/extlst" xmlns:r="http://schemas.openxmlformats.org/officeDocument/2006/relationships" xmlns:m="http://schemas.openxmlformats.org/officeDocument/2006/math" xmlns:v="urn:schemas-microsoft-com:vml" xmlns:wp14="http://schemas.microsoft.com/office/word/2010/wordprocessingDrawing" xmlns:wp="http://schemas.openxmlformats.org/drawingml/2006/wordprocessingDrawing" xmlns:w10="urn:schemas-microsoft-com:office:word" xmlns:w="http://schemas.openxmlformats.org/wordprocessingml/2006/main" xmlns:w14="http://schemas.microsoft.com/office/word/2010/wordml" xmlns:w15="http://schemas.microsoft.com/office/word/2012/wordml" xmlns:w16cex="http://schemas.microsoft.com/office/word/2018/wordml/cex" xmlns:w16cid="http://schemas.microsoft.com/office/word/2016/wordml/cid" xmlns:w16="http://schemas.microsoft.com/office/word/2018/wordml" xmlns:w16du="http://schemas.microsoft.com/office/word/2023/wordml/word16du" xmlns:w16sdtdh="http://schemas.microsoft.com/office/word/2020/wordml/sdtdatahash" xmlns:w16sdtfl="http://schemas.microsoft.com/office/word/2024/wordml/sdtformatlock" xmlns:w16se="http://schemas.microsoft.com/office/word/2015/wordml/symex" xmlns:wpg="http://schemas.microsoft.com/office/word/2010/wordprocessingGroup" xmlns:wpi="http://schemas.microsoft.com/office/word/2010/wordprocessingInk" xmlns:wne="http://schemas.microsoft.com/office/word/2006/wordml" xmlns:wps="http://schemas.microsoft.com/office/word/2010/wordprocessingShape" mc:Ignorable="w14 w15 w16se w16cid w16 w16cex w16sdtdh w16sdtfl w16du wp14">
+<w:ftr xmlns:wpc="http://schemas.microsoft.com/office/word/2010/wordprocessingCanvas" xmlns:cx="http://schemas.microsoft.com/office/drawing/2014/chartex" xmlns:cx1="http://schemas.microsoft.com/office/drawing/2015/9/8/chartex" xmlns:cx2="http://schemas.microsoft.com/office/drawing/2015/10/21/chartex" xmlns:cx3="http://schemas.microsoft.com/office/drawing/2016/5/9/chartex" xmlns:cx4="http://schemas.microsoft.com/office/drawing/2016/5/10/chartex" xmlns:cx5="http://schemas.microsoft.com/office/drawing/2016/5/11/chartex" xmlns:cx6="http://schemas.microsoft.com/office/drawing/2016/5/12/chartex" xmlns:cx7="http://schemas.microsoft.com/office/drawing/2016/5/13/chartex" xmlns:cx8="http://schemas.microsoft.com/office/drawing/2016/5/14/chartex" xmlns:mc="http://schemas.openxmlformats.org/markup-compatibility/2006" xmlns:m="http://schemas.openxmlformats.org/officeDocument/2006/math" xmlns:aink="http://schemas.microsoft.com/office/drawing/2016/ink" xmlns:am3d="http://schemas.microsoft.com/office/drawing/2017/model3d" xmlns:oel="http://schemas.microsoft.com/office/2019/extlst" xmlns:r="http://schemas.openxmlformats.org/officeDocument/2006/relationships" xmlns:wp14="http://schemas.microsoft.com/office/word/2010/wordprocessingDrawing" xmlns:wp="http://schemas.openxmlformats.org/drawingml/2006/wordprocessingDrawing" xmlns:wpg="http://schemas.microsoft.com/office/word/2010/wordprocessingGroup" xmlns:wpi="http://schemas.microsoft.com/office/word/2010/wordprocessingInk" xmlns:wps="http://schemas.microsoft.com/office/word/2010/wordprocessingShape" xmlns:o="urn:schemas-microsoft-com:office:office" xmlns:v="urn:schemas-microsoft-com:vml" xmlns:w10="urn:schemas-microsoft-com:office:word" xmlns:w="http://schemas.openxmlformats.org/wordprocessingml/2006/main" xmlns:w14="http://schemas.microsoft.com/office/word/2010/wordml" xmlns:w15="http://schemas.microsoft.com/office/word/2012/wordml" xmlns:w16cex="http://schemas.microsoft.com/office/word/2018/wordml/cex" xmlns:w16cid="http://schemas.microsoft.com/office/word/2016/wordml/cid" xmlns:w16="http://schemas.microsoft.com/office/word/2018/wordml" xmlns:w16sdtdh="http://schemas.microsoft.com/office/word/2020/wordml/sdtdatahash" xmlns:w16sdtfl="http://schemas.microsoft.com/office/word/2024/wordml/sdtformatlock" xmlns:w16se="http://schemas.microsoft.com/office/word/2015/wordml/symex" xmlns:w16du="http://schemas.microsoft.com/office/word/2023/wordml/word16du" xmlns:wne="http://schemas.microsoft.com/office/word/2006/wordml" mc:Ignorable="w14 w15 w16se w16cid w16 w16cex w16sdtdh w16sdtfl w16du wp14">
   <w:p/>
 </w:ftr>
 </file>
 
 <file path=word/footer5.xml><?xml version="1.0" encoding="utf-8"?>
-<w:ftr xmlns:wpc="http://schemas.microsoft.com/office/word/2010/wordprocessingCanvas" xmlns:cx="http://schemas.microsoft.com/office/drawing/2014/chartex" xmlns:cx1="http://schemas.microsoft.com/office/drawing/2015/9/8/chartex" xmlns:cx2="http://schemas.microsoft.com/office/drawing/2015/10/21/chartex" xmlns:cx3="http://schemas.microsoft.com/office/drawing/2016/5/9/chartex" xmlns:cx4="http://schemas.microsoft.com/office/drawing/2016/5/10/chartex" xmlns:cx5="http://schemas.microsoft.com/office/drawing/2016/5/11/chartex" xmlns:cx6="http://schemas.microsoft.com/office/drawing/2016/5/12/chartex" xmlns:cx7="http://schemas.microsoft.com/office/drawing/2016/5/13/chartex" xmlns:cx8="http://schemas.microsoft.com/office/drawing/2016/5/14/chartex" xmlns:mc="http://schemas.openxmlformats.org/markup-compatibility/2006" xmlns:aink="http://schemas.microsoft.com/office/drawing/2016/ink" xmlns:am3d="http://schemas.microsoft.com/office/drawing/2017/model3d" xmlns:o="urn:schemas-microsoft-com:office:office" xmlns:oel="http://schemas.microsoft.com/office/2019/extlst" xmlns:r="http://schemas.openxmlformats.org/officeDocument/2006/relationships" xmlns:m="http://schemas.openxmlformats.org/officeDocument/2006/math" xmlns:v="urn:schemas-microsoft-com:vml" xmlns:wp14="http://schemas.microsoft.com/office/word/2010/wordprocessingDrawing" xmlns:wp="http://schemas.openxmlformats.org/drawingml/2006/wordprocessingDrawing" xmlns:w10="urn:schemas-microsoft-com:office:word" xmlns:w="http://schemas.openxmlformats.org/wordprocessingml/2006/main" xmlns:w14="http://schemas.microsoft.com/office/word/2010/wordml" xmlns:w15="http://schemas.microsoft.com/office/word/2012/wordml" xmlns:w16cex="http://schemas.microsoft.com/office/word/2018/wordml/cex" xmlns:w16cid="http://schemas.microsoft.com/office/word/2016/wordml/cid" xmlns:w16="http://schemas.microsoft.com/office/word/2018/wordml" xmlns:w16du="http://schemas.microsoft.com/office/word/2023/wordml/word16du" xmlns:w16sdtdh="http://schemas.microsoft.com/office/word/2020/wordml/sdtdatahash" xmlns:w16sdtfl="http://schemas.microsoft.com/office/word/2024/wordml/sdtformatlock" xmlns:w16se="http://schemas.microsoft.com/office/word/2015/wordml/symex" xmlns:wpg="http://schemas.microsoft.com/office/word/2010/wordprocessingGroup" xmlns:wpi="http://schemas.microsoft.com/office/word/2010/wordprocessingInk" xmlns:wne="http://schemas.microsoft.com/office/word/2006/wordml" xmlns:wps="http://schemas.microsoft.com/office/word/2010/wordprocessingShape" mc:Ignorable="w14 w15 w16se w16cid w16 w16cex w16sdtdh w16sdtfl w16du wp14">
+<w:ftr xmlns:wpc="http://schemas.microsoft.com/office/word/2010/wordprocessingCanvas" xmlns:cx="http://schemas.microsoft.com/office/drawing/2014/chartex" xmlns:cx1="http://schemas.microsoft.com/office/drawing/2015/9/8/chartex" xmlns:cx2="http://schemas.microsoft.com/office/drawing/2015/10/21/chartex" xmlns:cx3="http://schemas.microsoft.com/office/drawing/2016/5/9/chartex" xmlns:cx4="http://schemas.microsoft.com/office/drawing/2016/5/10/chartex" xmlns:cx5="http://schemas.microsoft.com/office/drawing/2016/5/11/chartex" xmlns:cx6="http://schemas.microsoft.com/office/drawing/2016/5/12/chartex" xmlns:cx7="http://schemas.microsoft.com/office/drawing/2016/5/13/chartex" xmlns:cx8="http://schemas.microsoft.com/office/drawing/2016/5/14/chartex" xmlns:mc="http://schemas.openxmlformats.org/markup-compatibility/2006" xmlns:m="http://schemas.openxmlformats.org/officeDocument/2006/math" xmlns:aink="http://schemas.microsoft.com/office/drawing/2016/ink" xmlns:am3d="http://schemas.microsoft.com/office/drawing/2017/model3d" xmlns:oel="http://schemas.microsoft.com/office/2019/extlst" xmlns:r="http://schemas.openxmlformats.org/officeDocument/2006/relationships" xmlns:wp14="http://schemas.microsoft.com/office/word/2010/wordprocessingDrawing" xmlns:wp="http://schemas.openxmlformats.org/drawingml/2006/wordprocessingDrawing" xmlns:wpg="http://schemas.microsoft.com/office/word/2010/wordprocessingGroup" xmlns:wpi="http://schemas.microsoft.com/office/word/2010/wordprocessingInk" xmlns:wps="http://schemas.microsoft.com/office/word/2010/wordprocessingShape" xmlns:o="urn:schemas-microsoft-com:office:office" xmlns:v="urn:schemas-microsoft-com:vml" xmlns:w10="urn:schemas-microsoft-com:office:word" xmlns:w="http://schemas.openxmlformats.org/wordprocessingml/2006/main" xmlns:w14="http://schemas.microsoft.com/office/word/2010/wordml" xmlns:w15="http://schemas.microsoft.com/office/word/2012/wordml" xmlns:w16cex="http://schemas.microsoft.com/office/word/2018/wordml/cex" xmlns:w16cid="http://schemas.microsoft.com/office/word/2016/wordml/cid" xmlns:w16="http://schemas.microsoft.com/office/word/2018/wordml" xmlns:w16sdtdh="http://schemas.microsoft.com/office/word/2020/wordml/sdtdatahash" xmlns:w16sdtfl="http://schemas.microsoft.com/office/word/2024/wordml/sdtformatlock" xmlns:w16se="http://schemas.microsoft.com/office/word/2015/wordml/symex" xmlns:w16du="http://schemas.microsoft.com/office/word/2023/wordml/word16du" xmlns:wne="http://schemas.microsoft.com/office/word/2006/wordml" mc:Ignorable="w14 w15 w16se w16cid w16 w16cex w16sdtdh w16sdtfl w16du wp14">
   <w:p/>
 </w:ftr>
 </file>
 
 <file path=word/footnotes.xml><?xml version="1.0" encoding="utf-8"?>
-<w:footnotes xmlns:wpc="http://schemas.microsoft.com/office/word/2010/wordprocessingCanvas" xmlns:cx="http://schemas.microsoft.com/office/drawing/2014/chartex" xmlns:cx1="http://schemas.microsoft.com/office/drawing/2015/9/8/chartex" xmlns:cx2="http://schemas.microsoft.com/office/drawing/2015/10/21/chartex" xmlns:cx3="http://schemas.microsoft.com/office/drawing/2016/5/9/chartex" xmlns:cx4="http://schemas.microsoft.com/office/drawing/2016/5/10/chartex" xmlns:cx5="http://schemas.microsoft.com/office/drawing/2016/5/11/chartex" xmlns:cx6="http://schemas.microsoft.com/office/drawing/2016/5/12/chartex" xmlns:cx7="http://schemas.microsoft.com/office/drawing/2016/5/13/chartex" xmlns:cx8="http://schemas.microsoft.com/office/drawing/2016/5/14/chartex" xmlns:mc="http://schemas.openxmlformats.org/markup-compatibility/2006" xmlns:aink="http://schemas.microsoft.com/office/drawing/2016/ink" xmlns:am3d="http://schemas.microsoft.com/office/drawing/2017/model3d" xmlns:o="urn:schemas-microsoft-com:office:office" xmlns:oel="http://schemas.microsoft.com/office/2019/extlst" xmlns:r="http://schemas.openxmlformats.org/officeDocument/2006/relationships" xmlns:m="http://schemas.openxmlformats.org/officeDocument/2006/math" xmlns:v="urn:schemas-microsoft-com:vml" xmlns:wp14="http://schemas.microsoft.com/office/word/2010/wordprocessingDrawing" xmlns:wp="http://schemas.openxmlformats.org/drawingml/2006/wordprocessingDrawing" xmlns:w10="urn:schemas-microsoft-com:office:word" xmlns:w="http://schemas.openxmlformats.org/wordprocessingml/2006/main" xmlns:w14="http://schemas.microsoft.com/office/word/2010/wordml" xmlns:w15="http://schemas.microsoft.com/office/word/2012/wordml" xmlns:w16cex="http://schemas.microsoft.com/office/word/2018/wordml/cex" xmlns:w16cid="http://schemas.microsoft.com/office/word/2016/wordml/cid" xmlns:w16="http://schemas.microsoft.com/office/word/2018/wordml" xmlns:w16du="http://schemas.microsoft.com/office/word/2023/wordml/word16du" xmlns:w16sdtdh="http://schemas.microsoft.com/office/word/2020/wordml/sdtdatahash" xmlns:w16sdtfl="http://schemas.microsoft.com/office/word/2024/wordml/sdtformatlock" xmlns:w16se="http://schemas.microsoft.com/office/word/2015/wordml/symex" xmlns:wpg="http://schemas.microsoft.com/office/word/2010/wordprocessingGroup" xmlns:wpi="http://schemas.microsoft.com/office/word/2010/wordprocessingInk" xmlns:wne="http://schemas.microsoft.com/office/word/2006/wordml" xmlns:wps="http://schemas.microsoft.com/office/word/2010/wordprocessingShape" mc:Ignorable="w14 w15 w16se w16cid w16 w16cex w16sdtdh w16sdtfl w16du wp14">
+<w:footnotes xmlns:wpc="http://schemas.microsoft.com/office/word/2010/wordprocessingCanvas" xmlns:cx="http://schemas.microsoft.com/office/drawing/2014/chartex" xmlns:cx1="http://schemas.microsoft.com/office/drawing/2015/9/8/chartex" xmlns:cx2="http://schemas.microsoft.com/office/drawing/2015/10/21/chartex" xmlns:cx3="http://schemas.microsoft.com/office/drawing/2016/5/9/chartex" xmlns:cx4="http://schemas.microsoft.com/office/drawing/2016/5/10/chartex" xmlns:cx5="http://schemas.microsoft.com/office/drawing/2016/5/11/chartex" xmlns:cx6="http://schemas.microsoft.com/office/drawing/2016/5/12/chartex" xmlns:cx7="http://schemas.microsoft.com/office/drawing/2016/5/13/chartex" xmlns:cx8="http://schemas.microsoft.com/office/drawing/2016/5/14/chartex" xmlns:mc="http://schemas.openxmlformats.org/markup-compatibility/2006" xmlns:m="http://schemas.openxmlformats.org/officeDocument/2006/math" xmlns:aink="http://schemas.microsoft.com/office/drawing/2016/ink" xmlns:am3d="http://schemas.microsoft.com/office/drawing/2017/model3d" xmlns:oel="http://schemas.microsoft.com/office/2019/extlst" xmlns:r="http://schemas.openxmlformats.org/officeDocument/2006/relationships" xmlns:wp14="http://schemas.microsoft.com/office/word/2010/wordprocessingDrawing" xmlns:wp="http://schemas.openxmlformats.org/drawingml/2006/wordprocessingDrawing" xmlns:wpg="http://schemas.microsoft.com/office/word/2010/wordprocessingGroup" xmlns:wpi="http://schemas.microsoft.com/office/word/2010/wordprocessingInk" xmlns:wps="http://schemas.microsoft.com/office/word/2010/wordprocessingShape" xmlns:o="urn:schemas-microsoft-com:office:office" xmlns:v="urn:schemas-microsoft-com:vml" xmlns:w10="urn:schemas-microsoft-com:office:word" xmlns:w="http://schemas.openxmlformats.org/wordprocessingml/2006/main" xmlns:w14="http://schemas.microsoft.com/office/word/2010/wordml" xmlns:w15="http://schemas.microsoft.com/office/word/2012/wordml" xmlns:w16cex="http://schemas.microsoft.com/office/word/2018/wordml/cex" xmlns:w16cid="http://schemas.microsoft.com/office/word/2016/wordml/cid" xmlns:w16="http://schemas.microsoft.com/office/word/2018/wordml" xmlns:w16sdtdh="http://schemas.microsoft.com/office/word/2020/wordml/sdtdatahash" xmlns:w16sdtfl="http://schemas.microsoft.com/office/word/2024/wordml/sdtformatlock" xmlns:w16se="http://schemas.microsoft.com/office/word/2015/wordml/symex" xmlns:w16du="http://schemas.microsoft.com/office/word/2023/wordml/word16du" xmlns:wne="http://schemas.microsoft.com/office/word/2006/wordml" mc:Ignorable="w14 w15 w16se w16cid w16 w16cex w16sdtdh w16sdtfl w16du wp14">
   <w:footnote w:type="separator" w:id="-1">
     <w:p>
       <w:r>
@@ -4576,7 +5410,7 @@
 </file>
 
 <file path=word/header1.xml><?xml version="1.0" encoding="utf-8"?>
-<w:hdr xmlns:wpc="http://schemas.microsoft.com/office/word/2010/wordprocessingCanvas" xmlns:cx="http://schemas.microsoft.com/office/drawing/2014/chartex" xmlns:cx1="http://schemas.microsoft.com/office/drawing/2015/9/8/chartex" xmlns:cx2="http://schemas.microsoft.com/office/drawing/2015/10/21/chartex" xmlns:cx3="http://schemas.microsoft.com/office/drawing/2016/5/9/chartex" xmlns:cx4="http://schemas.microsoft.com/office/drawing/2016/5/10/chartex" xmlns:cx5="http://schemas.microsoft.com/office/drawing/2016/5/11/chartex" xmlns:cx6="http://schemas.microsoft.com/office/drawing/2016/5/12/chartex" xmlns:cx7="http://schemas.microsoft.com/office/drawing/2016/5/13/chartex" xmlns:cx8="http://schemas.microsoft.com/office/drawing/2016/5/14/chartex" xmlns:mc="http://schemas.openxmlformats.org/markup-compatibility/2006" xmlns:aink="http://schemas.microsoft.com/office/drawing/2016/ink" xmlns:am3d="http://schemas.microsoft.com/office/drawing/2017/model3d" xmlns:o="urn:schemas-microsoft-com:office:office" xmlns:oel="http://schemas.microsoft.com/office/2019/extlst" xmlns:r="http://schemas.openxmlformats.org/officeDocument/2006/relationships" xmlns:m="http://schemas.openxmlformats.org/officeDocument/2006/math" xmlns:v="urn:schemas-microsoft-com:vml" xmlns:wp14="http://schemas.microsoft.com/office/word/2010/wordprocessingDrawing" xmlns:wp="http://schemas.openxmlformats.org/drawingml/2006/wordprocessingDrawing" xmlns:w10="urn:schemas-microsoft-com:office:word" xmlns:w="http://schemas.openxmlformats.org/wordprocessingml/2006/main" xmlns:w14="http://schemas.microsoft.com/office/word/2010/wordml" xmlns:w15="http://schemas.microsoft.com/office/word/2012/wordml" xmlns:w16cex="http://schemas.microsoft.com/office/word/2018/wordml/cex" xmlns:w16cid="http://schemas.microsoft.com/office/word/2016/wordml/cid" xmlns:w16="http://schemas.microsoft.com/office/word/2018/wordml" xmlns:w16du="http://schemas.microsoft.com/office/word/2023/wordml/word16du" xmlns:w16sdtdh="http://schemas.microsoft.com/office/word/2020/wordml/sdtdatahash" xmlns:w16sdtfl="http://schemas.microsoft.com/office/word/2024/wordml/sdtformatlock" xmlns:w16se="http://schemas.microsoft.com/office/word/2015/wordml/symex" xmlns:wpg="http://schemas.microsoft.com/office/word/2010/wordprocessingGroup" xmlns:wpi="http://schemas.microsoft.com/office/word/2010/wordprocessingInk" xmlns:wne="http://schemas.microsoft.com/office/word/2006/wordml" xmlns:wps="http://schemas.microsoft.com/office/word/2010/wordprocessingShape" mc:Ignorable="w14 w15 w16se w16cid w16 w16cex w16sdtdh w16sdtfl w16du wp14">
+<w:hdr xmlns:wpc="http://schemas.microsoft.com/office/word/2010/wordprocessingCanvas" xmlns:cx="http://schemas.microsoft.com/office/drawing/2014/chartex" xmlns:cx1="http://schemas.microsoft.com/office/drawing/2015/9/8/chartex" xmlns:cx2="http://schemas.microsoft.com/office/drawing/2015/10/21/chartex" xmlns:cx3="http://schemas.microsoft.com/office/drawing/2016/5/9/chartex" xmlns:cx4="http://schemas.microsoft.com/office/drawing/2016/5/10/chartex" xmlns:cx5="http://schemas.microsoft.com/office/drawing/2016/5/11/chartex" xmlns:cx6="http://schemas.microsoft.com/office/drawing/2016/5/12/chartex" xmlns:cx7="http://schemas.microsoft.com/office/drawing/2016/5/13/chartex" xmlns:cx8="http://schemas.microsoft.com/office/drawing/2016/5/14/chartex" xmlns:mc="http://schemas.openxmlformats.org/markup-compatibility/2006" xmlns:m="http://schemas.openxmlformats.org/officeDocument/2006/math" xmlns:aink="http://schemas.microsoft.com/office/drawing/2016/ink" xmlns:am3d="http://schemas.microsoft.com/office/drawing/2017/model3d" xmlns:oel="http://schemas.microsoft.com/office/2019/extlst" xmlns:r="http://schemas.openxmlformats.org/officeDocument/2006/relationships" xmlns:wp14="http://schemas.microsoft.com/office/word/2010/wordprocessingDrawing" xmlns:wp="http://schemas.openxmlformats.org/drawingml/2006/wordprocessingDrawing" xmlns:wpg="http://schemas.microsoft.com/office/word/2010/wordprocessingGroup" xmlns:wpi="http://schemas.microsoft.com/office/word/2010/wordprocessingInk" xmlns:wps="http://schemas.microsoft.com/office/word/2010/wordprocessingShape" xmlns:o="urn:schemas-microsoft-com:office:office" xmlns:v="urn:schemas-microsoft-com:vml" xmlns:w10="urn:schemas-microsoft-com:office:word" xmlns:w="http://schemas.openxmlformats.org/wordprocessingml/2006/main" xmlns:w14="http://schemas.microsoft.com/office/word/2010/wordml" xmlns:w15="http://schemas.microsoft.com/office/word/2012/wordml" xmlns:w16cex="http://schemas.microsoft.com/office/word/2018/wordml/cex" xmlns:w16cid="http://schemas.microsoft.com/office/word/2016/wordml/cid" xmlns:w16="http://schemas.microsoft.com/office/word/2018/wordml" xmlns:w16sdtdh="http://schemas.microsoft.com/office/word/2020/wordml/sdtdatahash" xmlns:w16sdtfl="http://schemas.microsoft.com/office/word/2024/wordml/sdtformatlock" xmlns:w16se="http://schemas.microsoft.com/office/word/2015/wordml/symex" xmlns:w16du="http://schemas.microsoft.com/office/word/2023/wordml/word16du" xmlns:wne="http://schemas.microsoft.com/office/word/2006/wordml" mc:Ignorable="w14 w15 w16se w16cid w16 w16cex w16sdtdh w16sdtfl w16du wp14">
   <w:tbl>
     <w:tblPr>
       <w:tblW w:w="0" w:type="auto"/>
@@ -4679,7 +5513,7 @@
               <w:b w:val="0"/>
               <w:sz w:val="20"/>
             </w:rPr>
-            <w:t>4</w:t>
+            <w:t>6</w:t>
           </w:r>
         </w:p>
       </w:tc>
@@ -4790,31 +5624,31 @@
 </file>
 
 <file path=word/header2.xml><?xml version="1.0" encoding="utf-8"?>
-<w:hdr xmlns:wpc="http://schemas.microsoft.com/office/word/2010/wordprocessingCanvas" xmlns:cx="http://schemas.microsoft.com/office/drawing/2014/chartex" xmlns:cx1="http://schemas.microsoft.com/office/drawing/2015/9/8/chartex" xmlns:cx2="http://schemas.microsoft.com/office/drawing/2015/10/21/chartex" xmlns:cx3="http://schemas.microsoft.com/office/drawing/2016/5/9/chartex" xmlns:cx4="http://schemas.microsoft.com/office/drawing/2016/5/10/chartex" xmlns:cx5="http://schemas.microsoft.com/office/drawing/2016/5/11/chartex" xmlns:cx6="http://schemas.microsoft.com/office/drawing/2016/5/12/chartex" xmlns:cx7="http://schemas.microsoft.com/office/drawing/2016/5/13/chartex" xmlns:cx8="http://schemas.microsoft.com/office/drawing/2016/5/14/chartex" xmlns:mc="http://schemas.openxmlformats.org/markup-compatibility/2006" xmlns:aink="http://schemas.microsoft.com/office/drawing/2016/ink" xmlns:am3d="http://schemas.microsoft.com/office/drawing/2017/model3d" xmlns:o="urn:schemas-microsoft-com:office:office" xmlns:oel="http://schemas.microsoft.com/office/2019/extlst" xmlns:r="http://schemas.openxmlformats.org/officeDocument/2006/relationships" xmlns:m="http://schemas.openxmlformats.org/officeDocument/2006/math" xmlns:v="urn:schemas-microsoft-com:vml" xmlns:wp14="http://schemas.microsoft.com/office/word/2010/wordprocessingDrawing" xmlns:wp="http://schemas.openxmlformats.org/drawingml/2006/wordprocessingDrawing" xmlns:w10="urn:schemas-microsoft-com:office:word" xmlns:w="http://schemas.openxmlformats.org/wordprocessingml/2006/main" xmlns:w14="http://schemas.microsoft.com/office/word/2010/wordml" xmlns:w15="http://schemas.microsoft.com/office/word/2012/wordml" xmlns:w16cex="http://schemas.microsoft.com/office/word/2018/wordml/cex" xmlns:w16cid="http://schemas.microsoft.com/office/word/2016/wordml/cid" xmlns:w16="http://schemas.microsoft.com/office/word/2018/wordml" xmlns:w16du="http://schemas.microsoft.com/office/word/2023/wordml/word16du" xmlns:w16sdtdh="http://schemas.microsoft.com/office/word/2020/wordml/sdtdatahash" xmlns:w16sdtfl="http://schemas.microsoft.com/office/word/2024/wordml/sdtformatlock" xmlns:w16se="http://schemas.microsoft.com/office/word/2015/wordml/symex" xmlns:wpg="http://schemas.microsoft.com/office/word/2010/wordprocessingGroup" xmlns:wpi="http://schemas.microsoft.com/office/word/2010/wordprocessingInk" xmlns:wne="http://schemas.microsoft.com/office/word/2006/wordml" xmlns:wps="http://schemas.microsoft.com/office/word/2010/wordprocessingShape" mc:Ignorable="w14 w15 w16se w16cid w16 w16cex w16sdtdh w16sdtfl w16du wp14">
+<w:hdr xmlns:wpc="http://schemas.microsoft.com/office/word/2010/wordprocessingCanvas" xmlns:cx="http://schemas.microsoft.com/office/drawing/2014/chartex" xmlns:cx1="http://schemas.microsoft.com/office/drawing/2015/9/8/chartex" xmlns:cx2="http://schemas.microsoft.com/office/drawing/2015/10/21/chartex" xmlns:cx3="http://schemas.microsoft.com/office/drawing/2016/5/9/chartex" xmlns:cx4="http://schemas.microsoft.com/office/drawing/2016/5/10/chartex" xmlns:cx5="http://schemas.microsoft.com/office/drawing/2016/5/11/chartex" xmlns:cx6="http://schemas.microsoft.com/office/drawing/2016/5/12/chartex" xmlns:cx7="http://schemas.microsoft.com/office/drawing/2016/5/13/chartex" xmlns:cx8="http://schemas.microsoft.com/office/drawing/2016/5/14/chartex" xmlns:mc="http://schemas.openxmlformats.org/markup-compatibility/2006" xmlns:m="http://schemas.openxmlformats.org/officeDocument/2006/math" xmlns:aink="http://schemas.microsoft.com/office/drawing/2016/ink" xmlns:am3d="http://schemas.microsoft.com/office/drawing/2017/model3d" xmlns:oel="http://schemas.microsoft.com/office/2019/extlst" xmlns:r="http://schemas.openxmlformats.org/officeDocument/2006/relationships" xmlns:wp14="http://schemas.microsoft.com/office/word/2010/wordprocessingDrawing" xmlns:wp="http://schemas.openxmlformats.org/drawingml/2006/wordprocessingDrawing" xmlns:wpg="http://schemas.microsoft.com/office/word/2010/wordprocessingGroup" xmlns:wpi="http://schemas.microsoft.com/office/word/2010/wordprocessingInk" xmlns:wps="http://schemas.microsoft.com/office/word/2010/wordprocessingShape" xmlns:o="urn:schemas-microsoft-com:office:office" xmlns:v="urn:schemas-microsoft-com:vml" xmlns:w10="urn:schemas-microsoft-com:office:word" xmlns:w="http://schemas.openxmlformats.org/wordprocessingml/2006/main" xmlns:w14="http://schemas.microsoft.com/office/word/2010/wordml" xmlns:w15="http://schemas.microsoft.com/office/word/2012/wordml" xmlns:w16cex="http://schemas.microsoft.com/office/word/2018/wordml/cex" xmlns:w16cid="http://schemas.microsoft.com/office/word/2016/wordml/cid" xmlns:w16="http://schemas.microsoft.com/office/word/2018/wordml" xmlns:w16sdtdh="http://schemas.microsoft.com/office/word/2020/wordml/sdtdatahash" xmlns:w16sdtfl="http://schemas.microsoft.com/office/word/2024/wordml/sdtformatlock" xmlns:w16se="http://schemas.microsoft.com/office/word/2015/wordml/symex" xmlns:w16du="http://schemas.microsoft.com/office/word/2023/wordml/word16du" xmlns:wne="http://schemas.microsoft.com/office/word/2006/wordml" mc:Ignorable="w14 w15 w16se w16cid w16 w16cex w16sdtdh w16sdtfl w16du wp14">
   <w:p/>
 </w:hdr>
 </file>
 
 <file path=word/header3.xml><?xml version="1.0" encoding="utf-8"?>
-<w:hdr xmlns:wpc="http://schemas.microsoft.com/office/word/2010/wordprocessingCanvas" xmlns:cx="http://schemas.microsoft.com/office/drawing/2014/chartex" xmlns:cx1="http://schemas.microsoft.com/office/drawing/2015/9/8/chartex" xmlns:cx2="http://schemas.microsoft.com/office/drawing/2015/10/21/chartex" xmlns:cx3="http://schemas.microsoft.com/office/drawing/2016/5/9/chartex" xmlns:cx4="http://schemas.microsoft.com/office/drawing/2016/5/10/chartex" xmlns:cx5="http://schemas.microsoft.com/office/drawing/2016/5/11/chartex" xmlns:cx6="http://schemas.microsoft.com/office/drawing/2016/5/12/chartex" xmlns:cx7="http://schemas.microsoft.com/office/drawing/2016/5/13/chartex" xmlns:cx8="http://schemas.microsoft.com/office/drawing/2016/5/14/chartex" xmlns:mc="http://schemas.openxmlformats.org/markup-compatibility/2006" xmlns:aink="http://schemas.microsoft.com/office/drawing/2016/ink" xmlns:am3d="http://schemas.microsoft.com/office/drawing/2017/model3d" xmlns:o="urn:schemas-microsoft-com:office:office" xmlns:oel="http://schemas.microsoft.com/office/2019/extlst" xmlns:r="http://schemas.openxmlformats.org/officeDocument/2006/relationships" xmlns:m="http://schemas.openxmlformats.org/officeDocument/2006/math" xmlns:v="urn:schemas-microsoft-com:vml" xmlns:wp14="http://schemas.microsoft.com/office/word/2010/wordprocessingDrawing" xmlns:wp="http://schemas.openxmlformats.org/drawingml/2006/wordprocessingDrawing" xmlns:w10="urn:schemas-microsoft-com:office:word" xmlns:w="http://schemas.openxmlformats.org/wordprocessingml/2006/main" xmlns:w14="http://schemas.microsoft.com/office/word/2010/wordml" xmlns:w15="http://schemas.microsoft.com/office/word/2012/wordml" xmlns:w16cex="http://schemas.microsoft.com/office/word/2018/wordml/cex" xmlns:w16cid="http://schemas.microsoft.com/office/word/2016/wordml/cid" xmlns:w16="http://schemas.microsoft.com/office/word/2018/wordml" xmlns:w16du="http://schemas.microsoft.com/office/word/2023/wordml/word16du" xmlns:w16sdtdh="http://schemas.microsoft.com/office/word/2020/wordml/sdtdatahash" xmlns:w16sdtfl="http://schemas.microsoft.com/office/word/2024/wordml/sdtformatlock" xmlns:w16se="http://schemas.microsoft.com/office/word/2015/wordml/symex" xmlns:wpg="http://schemas.microsoft.com/office/word/2010/wordprocessingGroup" xmlns:wpi="http://schemas.microsoft.com/office/word/2010/wordprocessingInk" xmlns:wne="http://schemas.microsoft.com/office/word/2006/wordml" xmlns:wps="http://schemas.microsoft.com/office/word/2010/wordprocessingShape" mc:Ignorable="w14 w15 w16se w16cid w16 w16cex w16sdtdh w16sdtfl w16du wp14">
+<w:hdr xmlns:wpc="http://schemas.microsoft.com/office/word/2010/wordprocessingCanvas" xmlns:cx="http://schemas.microsoft.com/office/drawing/2014/chartex" xmlns:cx1="http://schemas.microsoft.com/office/drawing/2015/9/8/chartex" xmlns:cx2="http://schemas.microsoft.com/office/drawing/2015/10/21/chartex" xmlns:cx3="http://schemas.microsoft.com/office/drawing/2016/5/9/chartex" xmlns:cx4="http://schemas.microsoft.com/office/drawing/2016/5/10/chartex" xmlns:cx5="http://schemas.microsoft.com/office/drawing/2016/5/11/chartex" xmlns:cx6="http://schemas.microsoft.com/office/drawing/2016/5/12/chartex" xmlns:cx7="http://schemas.microsoft.com/office/drawing/2016/5/13/chartex" xmlns:cx8="http://schemas.microsoft.com/office/drawing/2016/5/14/chartex" xmlns:mc="http://schemas.openxmlformats.org/markup-compatibility/2006" xmlns:m="http://schemas.openxmlformats.org/officeDocument/2006/math" xmlns:aink="http://schemas.microsoft.com/office/drawing/2016/ink" xmlns:am3d="http://schemas.microsoft.com/office/drawing/2017/model3d" xmlns:oel="http://schemas.microsoft.com/office/2019/extlst" xmlns:r="http://schemas.openxmlformats.org/officeDocument/2006/relationships" xmlns:wp14="http://schemas.microsoft.com/office/word/2010/wordprocessingDrawing" xmlns:wp="http://schemas.openxmlformats.org/drawingml/2006/wordprocessingDrawing" xmlns:wpg="http://schemas.microsoft.com/office/word/2010/wordprocessingGroup" xmlns:wpi="http://schemas.microsoft.com/office/word/2010/wordprocessingInk" xmlns:wps="http://schemas.microsoft.com/office/word/2010/wordprocessingShape" xmlns:o="urn:schemas-microsoft-com:office:office" xmlns:v="urn:schemas-microsoft-com:vml" xmlns:w10="urn:schemas-microsoft-com:office:word" xmlns:w="http://schemas.openxmlformats.org/wordprocessingml/2006/main" xmlns:w14="http://schemas.microsoft.com/office/word/2010/wordml" xmlns:w15="http://schemas.microsoft.com/office/word/2012/wordml" xmlns:w16cex="http://schemas.microsoft.com/office/word/2018/wordml/cex" xmlns:w16cid="http://schemas.microsoft.com/office/word/2016/wordml/cid" xmlns:w16="http://schemas.microsoft.com/office/word/2018/wordml" xmlns:w16sdtdh="http://schemas.microsoft.com/office/word/2020/wordml/sdtdatahash" xmlns:w16sdtfl="http://schemas.microsoft.com/office/word/2024/wordml/sdtformatlock" xmlns:w16se="http://schemas.microsoft.com/office/word/2015/wordml/symex" xmlns:w16du="http://schemas.microsoft.com/office/word/2023/wordml/word16du" xmlns:wne="http://schemas.microsoft.com/office/word/2006/wordml" mc:Ignorable="w14 w15 w16se w16cid w16 w16cex w16sdtdh w16sdtfl w16du wp14">
   <w:p/>
 </w:hdr>
 </file>
 
 <file path=word/header4.xml><?xml version="1.0" encoding="utf-8"?>
-<w:hdr xmlns:wpc="http://schemas.microsoft.com/office/word/2010/wordprocessingCanvas" xmlns:cx="http://schemas.microsoft.com/office/drawing/2014/chartex" xmlns:cx1="http://schemas.microsoft.com/office/drawing/2015/9/8/chartex" xmlns:cx2="http://schemas.microsoft.com/office/drawing/2015/10/21/chartex" xmlns:cx3="http://schemas.microsoft.com/office/drawing/2016/5/9/chartex" xmlns:cx4="http://schemas.microsoft.com/office/drawing/2016/5/10/chartex" xmlns:cx5="http://schemas.microsoft.com/office/drawing/2016/5/11/chartex" xmlns:cx6="http://schemas.microsoft.com/office/drawing/2016/5/12/chartex" xmlns:cx7="http://schemas.microsoft.com/office/drawing/2016/5/13/chartex" xmlns:cx8="http://schemas.microsoft.com/office/drawing/2016/5/14/chartex" xmlns:mc="http://schemas.openxmlformats.org/markup-compatibility/2006" xmlns:aink="http://schemas.microsoft.com/office/drawing/2016/ink" xmlns:am3d="http://schemas.microsoft.com/office/drawing/2017/model3d" xmlns:o="urn:schemas-microsoft-com:office:office" xmlns:oel="http://schemas.microsoft.com/office/2019/extlst" xmlns:r="http://schemas.openxmlformats.org/officeDocument/2006/relationships" xmlns:m="http://schemas.openxmlformats.org/officeDocument/2006/math" xmlns:v="urn:schemas-microsoft-com:vml" xmlns:wp14="http://schemas.microsoft.com/office/word/2010/wordprocessingDrawing" xmlns:wp="http://schemas.openxmlformats.org/drawingml/2006/wordprocessingDrawing" xmlns:w10="urn:schemas-microsoft-com:office:word" xmlns:w="http://schemas.openxmlformats.org/wordprocessingml/2006/main" xmlns:w14="http://schemas.microsoft.com/office/word/2010/wordml" xmlns:w15="http://schemas.microsoft.com/office/word/2012/wordml" xmlns:w16cex="http://schemas.microsoft.com/office/word/2018/wordml/cex" xmlns:w16cid="http://schemas.microsoft.com/office/word/2016/wordml/cid" xmlns:w16="http://schemas.microsoft.com/office/word/2018/wordml" xmlns:w16du="http://schemas.microsoft.com/office/word/2023/wordml/word16du" xmlns:w16sdtdh="http://schemas.microsoft.com/office/word/2020/wordml/sdtdatahash" xmlns:w16sdtfl="http://schemas.microsoft.com/office/word/2024/wordml/sdtformatlock" xmlns:w16se="http://schemas.microsoft.com/office/word/2015/wordml/symex" xmlns:wpg="http://schemas.microsoft.com/office/word/2010/wordprocessingGroup" xmlns:wpi="http://schemas.microsoft.com/office/word/2010/wordprocessingInk" xmlns:wne="http://schemas.microsoft.com/office/word/2006/wordml" xmlns:wps="http://schemas.microsoft.com/office/word/2010/wordprocessingShape" mc:Ignorable="w14 w15 w16se w16cid w16 w16cex w16sdtdh w16sdtfl w16du wp14">
+<w:hdr xmlns:wpc="http://schemas.microsoft.com/office/word/2010/wordprocessingCanvas" xmlns:cx="http://schemas.microsoft.com/office/drawing/2014/chartex" xmlns:cx1="http://schemas.microsoft.com/office/drawing/2015/9/8/chartex" xmlns:cx2="http://schemas.microsoft.com/office/drawing/2015/10/21/chartex" xmlns:cx3="http://schemas.microsoft.com/office/drawing/2016/5/9/chartex" xmlns:cx4="http://schemas.microsoft.com/office/drawing/2016/5/10/chartex" xmlns:cx5="http://schemas.microsoft.com/office/drawing/2016/5/11/chartex" xmlns:cx6="http://schemas.microsoft.com/office/drawing/2016/5/12/chartex" xmlns:cx7="http://schemas.microsoft.com/office/drawing/2016/5/13/chartex" xmlns:cx8="http://schemas.microsoft.com/office/drawing/2016/5/14/chartex" xmlns:mc="http://schemas.openxmlformats.org/markup-compatibility/2006" xmlns:m="http://schemas.openxmlformats.org/officeDocument/2006/math" xmlns:aink="http://schemas.microsoft.com/office/drawing/2016/ink" xmlns:am3d="http://schemas.microsoft.com/office/drawing/2017/model3d" xmlns:oel="http://schemas.microsoft.com/office/2019/extlst" xmlns:r="http://schemas.openxmlformats.org/officeDocument/2006/relationships" xmlns:wp14="http://schemas.microsoft.com/office/word/2010/wordprocessingDrawing" xmlns:wp="http://schemas.openxmlformats.org/drawingml/2006/wordprocessingDrawing" xmlns:wpg="http://schemas.microsoft.com/office/word/2010/wordprocessingGroup" xmlns:wpi="http://schemas.microsoft.com/office/word/2010/wordprocessingInk" xmlns:wps="http://schemas.microsoft.com/office/word/2010/wordprocessingShape" xmlns:o="urn:schemas-microsoft-com:office:office" xmlns:v="urn:schemas-microsoft-com:vml" xmlns:w10="urn:schemas-microsoft-com:office:word" xmlns:w="http://schemas.openxmlformats.org/wordprocessingml/2006/main" xmlns:w14="http://schemas.microsoft.com/office/word/2010/wordml" xmlns:w15="http://schemas.microsoft.com/office/word/2012/wordml" xmlns:w16cex="http://schemas.microsoft.com/office/word/2018/wordml/cex" xmlns:w16cid="http://schemas.microsoft.com/office/word/2016/wordml/cid" xmlns:w16="http://schemas.microsoft.com/office/word/2018/wordml" xmlns:w16sdtdh="http://schemas.microsoft.com/office/word/2020/wordml/sdtdatahash" xmlns:w16sdtfl="http://schemas.microsoft.com/office/word/2024/wordml/sdtformatlock" xmlns:w16se="http://schemas.microsoft.com/office/word/2015/wordml/symex" xmlns:w16du="http://schemas.microsoft.com/office/word/2023/wordml/word16du" xmlns:wne="http://schemas.microsoft.com/office/word/2006/wordml" mc:Ignorable="w14 w15 w16se w16cid w16 w16cex w16sdtdh w16sdtfl w16du wp14">
   <w:p/>
 </w:hdr>
 </file>
 
 <file path=word/header5.xml><?xml version="1.0" encoding="utf-8"?>
-<w:hdr xmlns:wpc="http://schemas.microsoft.com/office/word/2010/wordprocessingCanvas" xmlns:cx="http://schemas.microsoft.com/office/drawing/2014/chartex" xmlns:cx1="http://schemas.microsoft.com/office/drawing/2015/9/8/chartex" xmlns:cx2="http://schemas.microsoft.com/office/drawing/2015/10/21/chartex" xmlns:cx3="http://schemas.microsoft.com/office/drawing/2016/5/9/chartex" xmlns:cx4="http://schemas.microsoft.com/office/drawing/2016/5/10/chartex" xmlns:cx5="http://schemas.microsoft.com/office/drawing/2016/5/11/chartex" xmlns:cx6="http://schemas.microsoft.com/office/drawing/2016/5/12/chartex" xmlns:cx7="http://schemas.microsoft.com/office/drawing/2016/5/13/chartex" xmlns:cx8="http://schemas.microsoft.com/office/drawing/2016/5/14/chartex" xmlns:mc="http://schemas.openxmlformats.org/markup-compatibility/2006" xmlns:aink="http://schemas.microsoft.com/office/drawing/2016/ink" xmlns:am3d="http://schemas.microsoft.com/office/drawing/2017/model3d" xmlns:o="urn:schemas-microsoft-com:office:office" xmlns:oel="http://schemas.microsoft.com/office/2019/extlst" xmlns:r="http://schemas.openxmlformats.org/officeDocument/2006/relationships" xmlns:m="http://schemas.openxmlformats.org/officeDocument/2006/math" xmlns:v="urn:schemas-microsoft-com:vml" xmlns:wp14="http://schemas.microsoft.com/office/word/2010/wordprocessingDrawing" xmlns:wp="http://schemas.openxmlformats.org/drawingml/2006/wordprocessingDrawing" xmlns:w10="urn:schemas-microsoft-com:office:word" xmlns:w="http://schemas.openxmlformats.org/wordprocessingml/2006/main" xmlns:w14="http://schemas.microsoft.com/office/word/2010/wordml" xmlns:w15="http://schemas.microsoft.com/office/word/2012/wordml" xmlns:w16cex="http://schemas.microsoft.com/office/word/2018/wordml/cex" xmlns:w16cid="http://schemas.microsoft.com/office/word/2016/wordml/cid" xmlns:w16="http://schemas.microsoft.com/office/word/2018/wordml" xmlns:w16du="http://schemas.microsoft.com/office/word/2023/wordml/word16du" xmlns:w16sdtdh="http://schemas.microsoft.com/office/word/2020/wordml/sdtdatahash" xmlns:w16sdtfl="http://schemas.microsoft.com/office/word/2024/wordml/sdtformatlock" xmlns:w16se="http://schemas.microsoft.com/office/word/2015/wordml/symex" xmlns:wpg="http://schemas.microsoft.com/office/word/2010/wordprocessingGroup" xmlns:wpi="http://schemas.microsoft.com/office/word/2010/wordprocessingInk" xmlns:wne="http://schemas.microsoft.com/office/word/2006/wordml" xmlns:wps="http://schemas.microsoft.com/office/word/2010/wordprocessingShape" mc:Ignorable="w14 w15 w16se w16cid w16 w16cex w16sdtdh w16sdtfl w16du wp14">
+<w:hdr xmlns:wpc="http://schemas.microsoft.com/office/word/2010/wordprocessingCanvas" xmlns:cx="http://schemas.microsoft.com/office/drawing/2014/chartex" xmlns:cx1="http://schemas.microsoft.com/office/drawing/2015/9/8/chartex" xmlns:cx2="http://schemas.microsoft.com/office/drawing/2015/10/21/chartex" xmlns:cx3="http://schemas.microsoft.com/office/drawing/2016/5/9/chartex" xmlns:cx4="http://schemas.microsoft.com/office/drawing/2016/5/10/chartex" xmlns:cx5="http://schemas.microsoft.com/office/drawing/2016/5/11/chartex" xmlns:cx6="http://schemas.microsoft.com/office/drawing/2016/5/12/chartex" xmlns:cx7="http://schemas.microsoft.com/office/drawing/2016/5/13/chartex" xmlns:cx8="http://schemas.microsoft.com/office/drawing/2016/5/14/chartex" xmlns:mc="http://schemas.openxmlformats.org/markup-compatibility/2006" xmlns:m="http://schemas.openxmlformats.org/officeDocument/2006/math" xmlns:aink="http://schemas.microsoft.com/office/drawing/2016/ink" xmlns:am3d="http://schemas.microsoft.com/office/drawing/2017/model3d" xmlns:oel="http://schemas.microsoft.com/office/2019/extlst" xmlns:r="http://schemas.openxmlformats.org/officeDocument/2006/relationships" xmlns:wp14="http://schemas.microsoft.com/office/word/2010/wordprocessingDrawing" xmlns:wp="http://schemas.openxmlformats.org/drawingml/2006/wordprocessingDrawing" xmlns:wpg="http://schemas.microsoft.com/office/word/2010/wordprocessingGroup" xmlns:wpi="http://schemas.microsoft.com/office/word/2010/wordprocessingInk" xmlns:wps="http://schemas.microsoft.com/office/word/2010/wordprocessingShape" xmlns:o="urn:schemas-microsoft-com:office:office" xmlns:v="urn:schemas-microsoft-com:vml" xmlns:w10="urn:schemas-microsoft-com:office:word" xmlns:w="http://schemas.openxmlformats.org/wordprocessingml/2006/main" xmlns:w14="http://schemas.microsoft.com/office/word/2010/wordml" xmlns:w15="http://schemas.microsoft.com/office/word/2012/wordml" xmlns:w16cex="http://schemas.microsoft.com/office/word/2018/wordml/cex" xmlns:w16cid="http://schemas.microsoft.com/office/word/2016/wordml/cid" xmlns:w16="http://schemas.microsoft.com/office/word/2018/wordml" xmlns:w16sdtdh="http://schemas.microsoft.com/office/word/2020/wordml/sdtdatahash" xmlns:w16sdtfl="http://schemas.microsoft.com/office/word/2024/wordml/sdtformatlock" xmlns:w16se="http://schemas.microsoft.com/office/word/2015/wordml/symex" xmlns:w16du="http://schemas.microsoft.com/office/word/2023/wordml/word16du" xmlns:wne="http://schemas.microsoft.com/office/word/2006/wordml" mc:Ignorable="w14 w15 w16se w16cid w16 w16cex w16sdtdh w16sdtfl w16du wp14">
   <w:p/>
 </w:hdr>
 </file>
 
 <file path=word/numbering.xml><?xml version="1.0" encoding="utf-8"?>
-<w:numbering xmlns:wpc="http://schemas.microsoft.com/office/word/2010/wordprocessingCanvas" xmlns:cx="http://schemas.microsoft.com/office/drawing/2014/chartex" xmlns:cx1="http://schemas.microsoft.com/office/drawing/2015/9/8/chartex" xmlns:cx2="http://schemas.microsoft.com/office/drawing/2015/10/21/chartex" xmlns:cx3="http://schemas.microsoft.com/office/drawing/2016/5/9/chartex" xmlns:cx4="http://schemas.microsoft.com/office/drawing/2016/5/10/chartex" xmlns:cx5="http://schemas.microsoft.com/office/drawing/2016/5/11/chartex" xmlns:cx6="http://schemas.microsoft.com/office/drawing/2016/5/12/chartex" xmlns:cx7="http://schemas.microsoft.com/office/drawing/2016/5/13/chartex" xmlns:cx8="http://schemas.microsoft.com/office/drawing/2016/5/14/chartex" xmlns:mc="http://schemas.openxmlformats.org/markup-compatibility/2006" xmlns:aink="http://schemas.microsoft.com/office/drawing/2016/ink" xmlns:am3d="http://schemas.microsoft.com/office/drawing/2017/model3d" xmlns:o="urn:schemas-microsoft-com:office:office" xmlns:oel="http://schemas.microsoft.com/office/2019/extlst" xmlns:r="http://schemas.openxmlformats.org/officeDocument/2006/relationships" xmlns:m="http://schemas.openxmlformats.org/officeDocument/2006/math" xmlns:v="urn:schemas-microsoft-com:vml" xmlns:wp14="http://schemas.microsoft.com/office/word/2010/wordprocessingDrawing" xmlns:wp="http://schemas.openxmlformats.org/drawingml/2006/wordprocessingDrawing" xmlns:w10="urn:schemas-microsoft-com:office:word" xmlns:w="http://schemas.openxmlformats.org/wordprocessingml/2006/main" xmlns:w14="http://schemas.microsoft.com/office/word/2010/wordml" xmlns:w15="http://schemas.microsoft.com/office/word/2012/wordml" xmlns:w16cex="http://schemas.microsoft.com/office/word/2018/wordml/cex" xmlns:w16cid="http://schemas.microsoft.com/office/word/2016/wordml/cid" xmlns:w16="http://schemas.microsoft.com/office/word/2018/wordml" xmlns:w16du="http://schemas.microsoft.com/office/word/2023/wordml/word16du" xmlns:w16sdtdh="http://schemas.microsoft.com/office/word/2020/wordml/sdtdatahash" xmlns:w16sdtfl="http://schemas.microsoft.com/office/word/2024/wordml/sdtformatlock" xmlns:w16se="http://schemas.microsoft.com/office/word/2015/wordml/symex" xmlns:wpg="http://schemas.microsoft.com/office/word/2010/wordprocessingGroup" xmlns:wpi="http://schemas.microsoft.com/office/word/2010/wordprocessingInk" xmlns:wne="http://schemas.microsoft.com/office/word/2006/wordml" xmlns:wps="http://schemas.microsoft.com/office/word/2010/wordprocessingShape" mc:Ignorable="w14 w15 w16se w16cid w16 w16cex w16sdtdh w16sdtfl w16du wp14">
+<w:numbering xmlns:wpc="http://schemas.microsoft.com/office/word/2010/wordprocessingCanvas" xmlns:cx="http://schemas.microsoft.com/office/drawing/2014/chartex" xmlns:cx1="http://schemas.microsoft.com/office/drawing/2015/9/8/chartex" xmlns:cx2="http://schemas.microsoft.com/office/drawing/2015/10/21/chartex" xmlns:cx3="http://schemas.microsoft.com/office/drawing/2016/5/9/chartex" xmlns:cx4="http://schemas.microsoft.com/office/drawing/2016/5/10/chartex" xmlns:cx5="http://schemas.microsoft.com/office/drawing/2016/5/11/chartex" xmlns:cx6="http://schemas.microsoft.com/office/drawing/2016/5/12/chartex" xmlns:cx7="http://schemas.microsoft.com/office/drawing/2016/5/13/chartex" xmlns:cx8="http://schemas.microsoft.com/office/drawing/2016/5/14/chartex" xmlns:mc="http://schemas.openxmlformats.org/markup-compatibility/2006" xmlns:m="http://schemas.openxmlformats.org/officeDocument/2006/math" xmlns:aink="http://schemas.microsoft.com/office/drawing/2016/ink" xmlns:am3d="http://schemas.microsoft.com/office/drawing/2017/model3d" xmlns:oel="http://schemas.microsoft.com/office/2019/extlst" xmlns:r="http://schemas.openxmlformats.org/officeDocument/2006/relationships" xmlns:wp14="http://schemas.microsoft.com/office/word/2010/wordprocessingDrawing" xmlns:wp="http://schemas.openxmlformats.org/drawingml/2006/wordprocessingDrawing" xmlns:wpg="http://schemas.microsoft.com/office/word/2010/wordprocessingGroup" xmlns:wpi="http://schemas.microsoft.com/office/word/2010/wordprocessingInk" xmlns:wps="http://schemas.microsoft.com/office/word/2010/wordprocessingShape" xmlns:o="urn:schemas-microsoft-com:office:office" xmlns:v="urn:schemas-microsoft-com:vml" xmlns:w10="urn:schemas-microsoft-com:office:word" xmlns:w="http://schemas.openxmlformats.org/wordprocessingml/2006/main" xmlns:w14="http://schemas.microsoft.com/office/word/2010/wordml" xmlns:w15="http://schemas.microsoft.com/office/word/2012/wordml" xmlns:w16cex="http://schemas.microsoft.com/office/word/2018/wordml/cex" xmlns:w16cid="http://schemas.microsoft.com/office/word/2016/wordml/cid" xmlns:w16="http://schemas.microsoft.com/office/word/2018/wordml" xmlns:w16sdtdh="http://schemas.microsoft.com/office/word/2020/wordml/sdtdatahash" xmlns:w16sdtfl="http://schemas.microsoft.com/office/word/2024/wordml/sdtformatlock" xmlns:w16se="http://schemas.microsoft.com/office/word/2015/wordml/symex" xmlns:w16du="http://schemas.microsoft.com/office/word/2023/wordml/word16du" xmlns:wne="http://schemas.microsoft.com/office/word/2006/wordml" mc:Ignorable="w14 w15 w16se w16cid w16 w16cex w16sdtdh w16sdtfl w16du wp14">
   <w:numPicBullet w:numPicBulletId="0">
     <w:pict>
       <v:shapetype id="_x0000_t75" coordsize="21600,21600" o:spt="75" o:preferrelative="t" path="m@4@5l@4@11@9@11@9@5xe" filled="f" stroked="f">
@@ -4836,7 +5670,7 @@
         <v:path o:extrusionok="f" gradientshapeok="t" o:connecttype="rect"/>
         <o:lock v:ext="edit" aspectratio="t"/>
       </v:shapetype>
-      <v:shape id="_x0000_i1038" type="#_x0000_t75" style="width:321pt;height:249.6pt" o:bullet="t" filled="t">
+      <v:shape id="_x0000_i1025" type="#_x0000_t75" style="width:320.65pt;height:249.9pt" o:bullet="t" filled="t">
         <v:fill color2="black"/>
         <v:imagedata r:id="rId1" o:title=""/>
       </v:shape>
@@ -5325,7 +6159,7 @@
   <w:abstractNum w:abstractNumId="8" w15:restartNumberingAfterBreak="0">
     <w:nsid w:val="1F8433D7"/>
     <w:multiLevelType w:val="multilevel"/>
-    <w:tmpl w:val="0C2E7BA8"/>
+    <w:tmpl w:val="FB6871AA"/>
     <w:lvl w:ilvl="0">
       <w:start w:val="1"/>
       <w:numFmt w:val="decimal"/>
@@ -5337,13 +6171,15 @@
     </w:lvl>
     <w:lvl w:ilvl="1">
       <w:start w:val="1"/>
-      <w:numFmt w:val="decimal"/>
-      <w:pStyle w:val="Titolo2"/>
-      <w:lvlText w:val="%1.%2."/>
-      <w:lvlJc w:val="left"/>
-      <w:pPr>
-        <w:ind w:left="792" w:hanging="432"/>
-      </w:pPr>
+      <w:numFmt w:val="none"/>
+      <w:lvlText w:val="4.1"/>
+      <w:lvlJc w:val="left"/>
+      <w:pPr>
+        <w:ind w:left="720" w:hanging="360"/>
+      </w:pPr>
+      <w:rPr>
+        <w:rFonts w:hint="default"/>
+      </w:rPr>
     </w:lvl>
     <w:lvl w:ilvl="2">
       <w:start w:val="1"/>
@@ -5411,6 +6247,95 @@
     </w:lvl>
   </w:abstractNum>
   <w:abstractNum w:abstractNumId="9" w15:restartNumberingAfterBreak="0">
+    <w:nsid w:val="228F79FB"/>
+    <w:multiLevelType w:val="hybridMultilevel"/>
+    <w:tmpl w:val="CE6CA2D0"/>
+    <w:lvl w:ilvl="0" w:tplc="1C380042">
+      <w:start w:val="1"/>
+      <w:numFmt w:val="none"/>
+      <w:lvlText w:val="4.1"/>
+      <w:lvlJc w:val="left"/>
+      <w:pPr>
+        <w:ind w:left="720" w:hanging="360"/>
+      </w:pPr>
+      <w:rPr>
+        <w:rFonts w:hint="default"/>
+      </w:rPr>
+    </w:lvl>
+    <w:lvl w:ilvl="1" w:tplc="04100019" w:tentative="1">
+      <w:start w:val="1"/>
+      <w:numFmt w:val="lowerLetter"/>
+      <w:lvlText w:val="%2."/>
+      <w:lvlJc w:val="left"/>
+      <w:pPr>
+        <w:ind w:left="1440" w:hanging="360"/>
+      </w:pPr>
+    </w:lvl>
+    <w:lvl w:ilvl="2" w:tplc="0410001B" w:tentative="1">
+      <w:start w:val="1"/>
+      <w:numFmt w:val="lowerRoman"/>
+      <w:lvlText w:val="%3."/>
+      <w:lvlJc w:val="right"/>
+      <w:pPr>
+        <w:ind w:left="2160" w:hanging="180"/>
+      </w:pPr>
+    </w:lvl>
+    <w:lvl w:ilvl="3" w:tplc="0410000F" w:tentative="1">
+      <w:start w:val="1"/>
+      <w:numFmt w:val="decimal"/>
+      <w:lvlText w:val="%4."/>
+      <w:lvlJc w:val="left"/>
+      <w:pPr>
+        <w:ind w:left="2880" w:hanging="360"/>
+      </w:pPr>
+    </w:lvl>
+    <w:lvl w:ilvl="4" w:tplc="04100019" w:tentative="1">
+      <w:start w:val="1"/>
+      <w:numFmt w:val="lowerLetter"/>
+      <w:lvlText w:val="%5."/>
+      <w:lvlJc w:val="left"/>
+      <w:pPr>
+        <w:ind w:left="3600" w:hanging="360"/>
+      </w:pPr>
+    </w:lvl>
+    <w:lvl w:ilvl="5" w:tplc="0410001B" w:tentative="1">
+      <w:start w:val="1"/>
+      <w:numFmt w:val="lowerRoman"/>
+      <w:lvlText w:val="%6."/>
+      <w:lvlJc w:val="right"/>
+      <w:pPr>
+        <w:ind w:left="4320" w:hanging="180"/>
+      </w:pPr>
+    </w:lvl>
+    <w:lvl w:ilvl="6" w:tplc="0410000F" w:tentative="1">
+      <w:start w:val="1"/>
+      <w:numFmt w:val="decimal"/>
+      <w:lvlText w:val="%7."/>
+      <w:lvlJc w:val="left"/>
+      <w:pPr>
+        <w:ind w:left="5040" w:hanging="360"/>
+      </w:pPr>
+    </w:lvl>
+    <w:lvl w:ilvl="7" w:tplc="04100019" w:tentative="1">
+      <w:start w:val="1"/>
+      <w:numFmt w:val="lowerLetter"/>
+      <w:lvlText w:val="%8."/>
+      <w:lvlJc w:val="left"/>
+      <w:pPr>
+        <w:ind w:left="5760" w:hanging="360"/>
+      </w:pPr>
+    </w:lvl>
+    <w:lvl w:ilvl="8" w:tplc="0410001B" w:tentative="1">
+      <w:start w:val="1"/>
+      <w:numFmt w:val="lowerRoman"/>
+      <w:lvlText w:val="%9."/>
+      <w:lvlJc w:val="right"/>
+      <w:pPr>
+        <w:ind w:left="6480" w:hanging="180"/>
+      </w:pPr>
+    </w:lvl>
+  </w:abstractNum>
+  <w:abstractNum w:abstractNumId="10" w15:restartNumberingAfterBreak="0">
     <w:nsid w:val="237F6CD5"/>
     <w:multiLevelType w:val="hybridMultilevel"/>
     <w:tmpl w:val="FBE6734A"/>
@@ -5523,7 +6448,7 @@
       </w:rPr>
     </w:lvl>
   </w:abstractNum>
-  <w:abstractNum w:abstractNumId="10" w15:restartNumberingAfterBreak="0">
+  <w:abstractNum w:abstractNumId="11" w15:restartNumberingAfterBreak="0">
     <w:nsid w:val="25D50884"/>
     <w:multiLevelType w:val="hybridMultilevel"/>
     <w:tmpl w:val="B022966A"/>
@@ -5636,10 +6561,10 @@
       </w:rPr>
     </w:lvl>
   </w:abstractNum>
-  <w:abstractNum w:abstractNumId="11" w15:restartNumberingAfterBreak="0">
+  <w:abstractNum w:abstractNumId="12" w15:restartNumberingAfterBreak="0">
     <w:nsid w:val="282C65A4"/>
     <w:multiLevelType w:val="hybridMultilevel"/>
-    <w:tmpl w:val="07B27B60"/>
+    <w:tmpl w:val="9D3ECF24"/>
     <w:lvl w:ilvl="0" w:tplc="0410000B">
       <w:start w:val="1"/>
       <w:numFmt w:val="bullet"/>
@@ -5749,7 +6674,96 @@
       </w:rPr>
     </w:lvl>
   </w:abstractNum>
-  <w:abstractNum w:abstractNumId="12" w15:restartNumberingAfterBreak="0">
+  <w:abstractNum w:abstractNumId="13" w15:restartNumberingAfterBreak="0">
+    <w:nsid w:val="29821C42"/>
+    <w:multiLevelType w:val="hybridMultilevel"/>
+    <w:tmpl w:val="64C2F46C"/>
+    <w:lvl w:ilvl="0" w:tplc="5D7E0B50">
+      <w:start w:val="1"/>
+      <w:numFmt w:val="decimal"/>
+      <w:lvlText w:val="4.%1."/>
+      <w:lvlJc w:val="left"/>
+      <w:pPr>
+        <w:ind w:left="1080" w:hanging="360"/>
+      </w:pPr>
+      <w:rPr>
+        <w:rFonts w:hint="default"/>
+      </w:rPr>
+    </w:lvl>
+    <w:lvl w:ilvl="1" w:tplc="04100019" w:tentative="1">
+      <w:start w:val="1"/>
+      <w:numFmt w:val="lowerLetter"/>
+      <w:lvlText w:val="%2."/>
+      <w:lvlJc w:val="left"/>
+      <w:pPr>
+        <w:ind w:left="1513" w:hanging="360"/>
+      </w:pPr>
+    </w:lvl>
+    <w:lvl w:ilvl="2" w:tplc="0410001B" w:tentative="1">
+      <w:start w:val="1"/>
+      <w:numFmt w:val="lowerRoman"/>
+      <w:lvlText w:val="%3."/>
+      <w:lvlJc w:val="right"/>
+      <w:pPr>
+        <w:ind w:left="2233" w:hanging="180"/>
+      </w:pPr>
+    </w:lvl>
+    <w:lvl w:ilvl="3" w:tplc="0410000F" w:tentative="1">
+      <w:start w:val="1"/>
+      <w:numFmt w:val="decimal"/>
+      <w:lvlText w:val="%4."/>
+      <w:lvlJc w:val="left"/>
+      <w:pPr>
+        <w:ind w:left="2953" w:hanging="360"/>
+      </w:pPr>
+    </w:lvl>
+    <w:lvl w:ilvl="4" w:tplc="04100019" w:tentative="1">
+      <w:start w:val="1"/>
+      <w:numFmt w:val="lowerLetter"/>
+      <w:lvlText w:val="%5."/>
+      <w:lvlJc w:val="left"/>
+      <w:pPr>
+        <w:ind w:left="3673" w:hanging="360"/>
+      </w:pPr>
+    </w:lvl>
+    <w:lvl w:ilvl="5" w:tplc="0410001B" w:tentative="1">
+      <w:start w:val="1"/>
+      <w:numFmt w:val="lowerRoman"/>
+      <w:lvlText w:val="%6."/>
+      <w:lvlJc w:val="right"/>
+      <w:pPr>
+        <w:ind w:left="4393" w:hanging="180"/>
+      </w:pPr>
+    </w:lvl>
+    <w:lvl w:ilvl="6" w:tplc="0410000F" w:tentative="1">
+      <w:start w:val="1"/>
+      <w:numFmt w:val="decimal"/>
+      <w:lvlText w:val="%7."/>
+      <w:lvlJc w:val="left"/>
+      <w:pPr>
+        <w:ind w:left="5113" w:hanging="360"/>
+      </w:pPr>
+    </w:lvl>
+    <w:lvl w:ilvl="7" w:tplc="04100019" w:tentative="1">
+      <w:start w:val="1"/>
+      <w:numFmt w:val="lowerLetter"/>
+      <w:lvlText w:val="%8."/>
+      <w:lvlJc w:val="left"/>
+      <w:pPr>
+        <w:ind w:left="5833" w:hanging="360"/>
+      </w:pPr>
+    </w:lvl>
+    <w:lvl w:ilvl="8" w:tplc="0410001B" w:tentative="1">
+      <w:start w:val="1"/>
+      <w:numFmt w:val="lowerRoman"/>
+      <w:lvlText w:val="%9."/>
+      <w:lvlJc w:val="right"/>
+      <w:pPr>
+        <w:ind w:left="6553" w:hanging="180"/>
+      </w:pPr>
+    </w:lvl>
+  </w:abstractNum>
+  <w:abstractNum w:abstractNumId="14" w15:restartNumberingAfterBreak="0">
     <w:nsid w:val="3A6A4225"/>
     <w:multiLevelType w:val="hybridMultilevel"/>
     <w:tmpl w:val="A57E53A0"/>
@@ -5862,7 +6876,7 @@
       </w:rPr>
     </w:lvl>
   </w:abstractNum>
-  <w:abstractNum w:abstractNumId="13" w15:restartNumberingAfterBreak="0">
+  <w:abstractNum w:abstractNumId="15" w15:restartNumberingAfterBreak="0">
     <w:nsid w:val="3AA20608"/>
     <w:multiLevelType w:val="hybridMultilevel"/>
     <w:tmpl w:val="FD741812"/>
@@ -5975,7 +6989,7 @@
       </w:rPr>
     </w:lvl>
   </w:abstractNum>
-  <w:abstractNum w:abstractNumId="14" w15:restartNumberingAfterBreak="0">
+  <w:abstractNum w:abstractNumId="16" w15:restartNumberingAfterBreak="0">
     <w:nsid w:val="3B934199"/>
     <w:multiLevelType w:val="hybridMultilevel"/>
     <w:tmpl w:val="A2503E10"/>
@@ -6088,7 +7102,7 @@
       </w:rPr>
     </w:lvl>
   </w:abstractNum>
-  <w:abstractNum w:abstractNumId="15" w15:restartNumberingAfterBreak="0">
+  <w:abstractNum w:abstractNumId="17" w15:restartNumberingAfterBreak="0">
     <w:nsid w:val="3DF2400F"/>
     <w:multiLevelType w:val="hybridMultilevel"/>
     <w:tmpl w:val="9CB690B4"/>
@@ -6201,7 +7215,120 @@
       </w:rPr>
     </w:lvl>
   </w:abstractNum>
-  <w:abstractNum w:abstractNumId="16" w15:restartNumberingAfterBreak="0">
+  <w:abstractNum w:abstractNumId="18" w15:restartNumberingAfterBreak="0">
+    <w:nsid w:val="42073C55"/>
+    <w:multiLevelType w:val="hybridMultilevel"/>
+    <w:tmpl w:val="493ABF76"/>
+    <w:lvl w:ilvl="0" w:tplc="0410000B">
+      <w:start w:val="1"/>
+      <w:numFmt w:val="bullet"/>
+      <w:lvlText w:val=""/>
+      <w:lvlJc w:val="left"/>
+      <w:pPr>
+        <w:ind w:left="720" w:hanging="360"/>
+      </w:pPr>
+      <w:rPr>
+        <w:rFonts w:ascii="Wingdings" w:hAnsi="Wingdings" w:hint="default"/>
+      </w:rPr>
+    </w:lvl>
+    <w:lvl w:ilvl="1" w:tplc="04100003" w:tentative="1">
+      <w:start w:val="1"/>
+      <w:numFmt w:val="bullet"/>
+      <w:lvlText w:val="o"/>
+      <w:lvlJc w:val="left"/>
+      <w:pPr>
+        <w:ind w:left="1440" w:hanging="360"/>
+      </w:pPr>
+      <w:rPr>
+        <w:rFonts w:ascii="Courier New" w:hAnsi="Courier New" w:cs="Courier New" w:hint="default"/>
+      </w:rPr>
+    </w:lvl>
+    <w:lvl w:ilvl="2" w:tplc="04100005" w:tentative="1">
+      <w:start w:val="1"/>
+      <w:numFmt w:val="bullet"/>
+      <w:lvlText w:val=""/>
+      <w:lvlJc w:val="left"/>
+      <w:pPr>
+        <w:ind w:left="2160" w:hanging="360"/>
+      </w:pPr>
+      <w:rPr>
+        <w:rFonts w:ascii="Wingdings" w:hAnsi="Wingdings" w:hint="default"/>
+      </w:rPr>
+    </w:lvl>
+    <w:lvl w:ilvl="3" w:tplc="04100001" w:tentative="1">
+      <w:start w:val="1"/>
+      <w:numFmt w:val="bullet"/>
+      <w:lvlText w:val=""/>
+      <w:lvlJc w:val="left"/>
+      <w:pPr>
+        <w:ind w:left="2880" w:hanging="360"/>
+      </w:pPr>
+      <w:rPr>
+        <w:rFonts w:ascii="Symbol" w:hAnsi="Symbol" w:hint="default"/>
+      </w:rPr>
+    </w:lvl>
+    <w:lvl w:ilvl="4" w:tplc="04100003" w:tentative="1">
+      <w:start w:val="1"/>
+      <w:numFmt w:val="bullet"/>
+      <w:lvlText w:val="o"/>
+      <w:lvlJc w:val="left"/>
+      <w:pPr>
+        <w:ind w:left="3600" w:hanging="360"/>
+      </w:pPr>
+      <w:rPr>
+        <w:rFonts w:ascii="Courier New" w:hAnsi="Courier New" w:cs="Courier New" w:hint="default"/>
+      </w:rPr>
+    </w:lvl>
+    <w:lvl w:ilvl="5" w:tplc="04100005" w:tentative="1">
+      <w:start w:val="1"/>
+      <w:numFmt w:val="bullet"/>
+      <w:lvlText w:val=""/>
+      <w:lvlJc w:val="left"/>
+      <w:pPr>
+        <w:ind w:left="4320" w:hanging="360"/>
+      </w:pPr>
+      <w:rPr>
+        <w:rFonts w:ascii="Wingdings" w:hAnsi="Wingdings" w:hint="default"/>
+      </w:rPr>
+    </w:lvl>
+    <w:lvl w:ilvl="6" w:tplc="04100001" w:tentative="1">
+      <w:start w:val="1"/>
+      <w:numFmt w:val="bullet"/>
+      <w:lvlText w:val=""/>
+      <w:lvlJc w:val="left"/>
+      <w:pPr>
+        <w:ind w:left="5040" w:hanging="360"/>
+      </w:pPr>
+      <w:rPr>
+        <w:rFonts w:ascii="Symbol" w:hAnsi="Symbol" w:hint="default"/>
+      </w:rPr>
+    </w:lvl>
+    <w:lvl w:ilvl="7" w:tplc="04100003" w:tentative="1">
+      <w:start w:val="1"/>
+      <w:numFmt w:val="bullet"/>
+      <w:lvlText w:val="o"/>
+      <w:lvlJc w:val="left"/>
+      <w:pPr>
+        <w:ind w:left="5760" w:hanging="360"/>
+      </w:pPr>
+      <w:rPr>
+        <w:rFonts w:ascii="Courier New" w:hAnsi="Courier New" w:cs="Courier New" w:hint="default"/>
+      </w:rPr>
+    </w:lvl>
+    <w:lvl w:ilvl="8" w:tplc="04100005" w:tentative="1">
+      <w:start w:val="1"/>
+      <w:numFmt w:val="bullet"/>
+      <w:lvlText w:val=""/>
+      <w:lvlJc w:val="left"/>
+      <w:pPr>
+        <w:ind w:left="6480" w:hanging="360"/>
+      </w:pPr>
+      <w:rPr>
+        <w:rFonts w:ascii="Wingdings" w:hAnsi="Wingdings" w:hint="default"/>
+      </w:rPr>
+    </w:lvl>
+  </w:abstractNum>
+  <w:abstractNum w:abstractNumId="19" w15:restartNumberingAfterBreak="0">
     <w:nsid w:val="42F31A3D"/>
     <w:multiLevelType w:val="multilevel"/>
     <w:tmpl w:val="C8F4DA3C"/>
@@ -6322,7 +7449,7 @@
       </w:rPr>
     </w:lvl>
   </w:abstractNum>
-  <w:abstractNum w:abstractNumId="17" w15:restartNumberingAfterBreak="0">
+  <w:abstractNum w:abstractNumId="20" w15:restartNumberingAfterBreak="0">
     <w:nsid w:val="4E351B2A"/>
     <w:multiLevelType w:val="hybridMultilevel"/>
     <w:tmpl w:val="E5E62C26"/>
@@ -6411,7 +7538,7 @@
       </w:pPr>
     </w:lvl>
   </w:abstractNum>
-  <w:abstractNum w:abstractNumId="18" w15:restartNumberingAfterBreak="0">
+  <w:abstractNum w:abstractNumId="21" w15:restartNumberingAfterBreak="0">
     <w:nsid w:val="4F954ED4"/>
     <w:multiLevelType w:val="hybridMultilevel"/>
     <w:tmpl w:val="DE9A52BA"/>
@@ -6524,7 +7651,7 @@
       </w:rPr>
     </w:lvl>
   </w:abstractNum>
-  <w:abstractNum w:abstractNumId="19" w15:restartNumberingAfterBreak="0">
+  <w:abstractNum w:abstractNumId="22" w15:restartNumberingAfterBreak="0">
     <w:nsid w:val="63D3517E"/>
     <w:multiLevelType w:val="hybridMultilevel"/>
     <w:tmpl w:val="420E8CF2"/>
@@ -6637,7 +7764,7 @@
       </w:rPr>
     </w:lvl>
   </w:abstractNum>
-  <w:abstractNum w:abstractNumId="20" w15:restartNumberingAfterBreak="0">
+  <w:abstractNum w:abstractNumId="23" w15:restartNumberingAfterBreak="0">
     <w:nsid w:val="687E0260"/>
     <w:multiLevelType w:val="multilevel"/>
     <w:tmpl w:val="00000001"/>
@@ -6750,7 +7877,7 @@
       </w:pPr>
     </w:lvl>
   </w:abstractNum>
-  <w:abstractNum w:abstractNumId="21" w15:restartNumberingAfterBreak="0">
+  <w:abstractNum w:abstractNumId="24" w15:restartNumberingAfterBreak="0">
     <w:nsid w:val="74E12702"/>
     <w:multiLevelType w:val="hybridMultilevel"/>
     <w:tmpl w:val="60F880AA"/>
@@ -6836,7 +7963,7 @@
       </w:pPr>
     </w:lvl>
   </w:abstractNum>
-  <w:abstractNum w:abstractNumId="22" w15:restartNumberingAfterBreak="0">
+  <w:abstractNum w:abstractNumId="25" w15:restartNumberingAfterBreak="0">
     <w:nsid w:val="7CCE2BA3"/>
     <w:multiLevelType w:val="hybridMultilevel"/>
     <w:tmpl w:val="A20AD9D2"/>
@@ -6938,10 +8065,10 @@
     <w:abstractNumId w:val="4"/>
   </w:num>
   <w:num w:numId="6" w16cid:durableId="1681200572">
-    <w:abstractNumId w:val="16"/>
+    <w:abstractNumId w:val="19"/>
   </w:num>
   <w:num w:numId="7" w16cid:durableId="2071003935">
-    <w:abstractNumId w:val="20"/>
+    <w:abstractNumId w:val="23"/>
   </w:num>
   <w:num w:numId="8" w16cid:durableId="1540438857">
     <w:abstractNumId w:val="8"/>
@@ -6950,55 +8077,94 @@
     <w:abstractNumId w:val="8"/>
   </w:num>
   <w:num w:numId="10" w16cid:durableId="636185670">
-    <w:abstractNumId w:val="12"/>
+    <w:abstractNumId w:val="14"/>
   </w:num>
   <w:num w:numId="11" w16cid:durableId="2026519637">
-    <w:abstractNumId w:val="9"/>
+    <w:abstractNumId w:val="10"/>
   </w:num>
   <w:num w:numId="12" w16cid:durableId="1443572107">
     <w:abstractNumId w:val="6"/>
   </w:num>
   <w:num w:numId="13" w16cid:durableId="1680347482">
-    <w:abstractNumId w:val="17"/>
+    <w:abstractNumId w:val="20"/>
   </w:num>
   <w:num w:numId="14" w16cid:durableId="1266769575">
-    <w:abstractNumId w:val="13"/>
+    <w:abstractNumId w:val="15"/>
   </w:num>
   <w:num w:numId="15" w16cid:durableId="16659908">
-    <w:abstractNumId w:val="19"/>
+    <w:abstractNumId w:val="22"/>
   </w:num>
   <w:num w:numId="16" w16cid:durableId="1862696292">
-    <w:abstractNumId w:val="18"/>
+    <w:abstractNumId w:val="21"/>
   </w:num>
   <w:num w:numId="17" w16cid:durableId="646474099">
     <w:abstractNumId w:val="7"/>
   </w:num>
   <w:num w:numId="18" w16cid:durableId="1793285127">
-    <w:abstractNumId w:val="14"/>
+    <w:abstractNumId w:val="16"/>
   </w:num>
   <w:num w:numId="19" w16cid:durableId="202911112">
-    <w:abstractNumId w:val="22"/>
+    <w:abstractNumId w:val="25"/>
   </w:num>
   <w:num w:numId="20" w16cid:durableId="4943408">
     <w:abstractNumId w:val="5"/>
   </w:num>
   <w:num w:numId="21" w16cid:durableId="709576782">
-    <w:abstractNumId w:val="10"/>
+    <w:abstractNumId w:val="11"/>
   </w:num>
   <w:num w:numId="22" w16cid:durableId="510147163">
-    <w:abstractNumId w:val="21"/>
+    <w:abstractNumId w:val="24"/>
   </w:num>
   <w:num w:numId="23" w16cid:durableId="1096175075">
-    <w:abstractNumId w:val="15"/>
+    <w:abstractNumId w:val="17"/>
   </w:num>
   <w:num w:numId="24" w16cid:durableId="353848472">
-    <w:abstractNumId w:val="11"/>
+    <w:abstractNumId w:val="12"/>
+  </w:num>
+  <w:num w:numId="25" w16cid:durableId="43260700">
+    <w:abstractNumId w:val="18"/>
+  </w:num>
+  <w:num w:numId="26" w16cid:durableId="741872924">
+    <w:abstractNumId w:val="8"/>
+    <w:lvlOverride w:ilvl="0">
+      <w:startOverride w:val="1"/>
+    </w:lvlOverride>
+    <w:lvlOverride w:ilvl="1">
+      <w:startOverride w:val="1"/>
+    </w:lvlOverride>
+    <w:lvlOverride w:ilvl="2">
+      <w:startOverride w:val="1"/>
+    </w:lvlOverride>
+    <w:lvlOverride w:ilvl="3">
+      <w:startOverride w:val="1"/>
+    </w:lvlOverride>
+    <w:lvlOverride w:ilvl="4">
+      <w:startOverride w:val="1"/>
+    </w:lvlOverride>
+    <w:lvlOverride w:ilvl="5">
+      <w:startOverride w:val="1"/>
+    </w:lvlOverride>
+    <w:lvlOverride w:ilvl="6">
+      <w:startOverride w:val="1"/>
+    </w:lvlOverride>
+    <w:lvlOverride w:ilvl="7">
+      <w:startOverride w:val="1"/>
+    </w:lvlOverride>
+    <w:lvlOverride w:ilvl="8">
+      <w:startOverride w:val="1"/>
+    </w:lvlOverride>
+  </w:num>
+  <w:num w:numId="27" w16cid:durableId="216474933">
+    <w:abstractNumId w:val="9"/>
+  </w:num>
+  <w:num w:numId="28" w16cid:durableId="2068606240">
+    <w:abstractNumId w:val="13"/>
   </w:num>
 </w:numbering>
 </file>
 
 <file path=word/styles.xml><?xml version="1.0" encoding="utf-8"?>
-<w:styles xmlns:mc="http://schemas.openxmlformats.org/markup-compatibility/2006" xmlns:r="http://schemas.openxmlformats.org/officeDocument/2006/relationships" xmlns:w="http://schemas.openxmlformats.org/wordprocessingml/2006/main" xmlns:w14="http://schemas.microsoft.com/office/word/2010/wordml" xmlns:w15="http://schemas.microsoft.com/office/word/2012/wordml" xmlns:w16cex="http://schemas.microsoft.com/office/word/2018/wordml/cex" xmlns:w16cid="http://schemas.microsoft.com/office/word/2016/wordml/cid" xmlns:w16="http://schemas.microsoft.com/office/word/2018/wordml" xmlns:w16du="http://schemas.microsoft.com/office/word/2023/wordml/word16du" xmlns:w16sdtdh="http://schemas.microsoft.com/office/word/2020/wordml/sdtdatahash" xmlns:w16sdtfl="http://schemas.microsoft.com/office/word/2024/wordml/sdtformatlock" xmlns:w16se="http://schemas.microsoft.com/office/word/2015/wordml/symex" mc:Ignorable="w14 w15 w16se w16cid w16 w16cex w16sdtdh w16sdtfl w16du">
+<w:styles xmlns:mc="http://schemas.openxmlformats.org/markup-compatibility/2006" xmlns:r="http://schemas.openxmlformats.org/officeDocument/2006/relationships" xmlns:w="http://schemas.openxmlformats.org/wordprocessingml/2006/main" xmlns:w14="http://schemas.microsoft.com/office/word/2010/wordml" xmlns:w15="http://schemas.microsoft.com/office/word/2012/wordml" xmlns:w16cex="http://schemas.microsoft.com/office/word/2018/wordml/cex" xmlns:w16cid="http://schemas.microsoft.com/office/word/2016/wordml/cid" xmlns:w16="http://schemas.microsoft.com/office/word/2018/wordml" xmlns:w16sdtdh="http://schemas.microsoft.com/office/word/2020/wordml/sdtdatahash" xmlns:w16sdtfl="http://schemas.microsoft.com/office/word/2024/wordml/sdtformatlock" xmlns:w16se="http://schemas.microsoft.com/office/word/2015/wordml/symex" xmlns:w16du="http://schemas.microsoft.com/office/word/2023/wordml/word16du" mc:Ignorable="w14 w15 w16se w16cid w16 w16cex w16sdtdh w16sdtfl w16du">
   <w:docDefaults>
     <w:rPrDefault>
       <w:rPr>
@@ -7429,10 +8595,6 @@
     <w:qFormat/>
     <w:rsid w:val="003E00FB"/>
     <w:pPr>
-      <w:numPr>
-        <w:ilvl w:val="1"/>
-        <w:numId w:val="8"/>
-      </w:numPr>
       <w:outlineLvl w:val="1"/>
     </w:pPr>
     <w:rPr>

</xml_diff>

<commit_message>
Piccolissime correzioni alle spaziature tra paragrafi e aggiunta del file in formato PDF
</commit_message>
<xml_diff>
--- a/Deliverables/ProblemStatement_GGEyewear.docx
+++ b/Deliverables/ProblemStatement_GGEyewear.docx
@@ -1,6 +1,6 @@
 
 <file path=word/document.xml><?xml version="1.0" encoding="utf-8"?>
-<w:document xmlns:wpc="http://schemas.microsoft.com/office/word/2010/wordprocessingCanvas" xmlns:cx="http://schemas.microsoft.com/office/drawing/2014/chartex" xmlns:cx1="http://schemas.microsoft.com/office/drawing/2015/9/8/chartex" xmlns:cx2="http://schemas.microsoft.com/office/drawing/2015/10/21/chartex" xmlns:cx3="http://schemas.microsoft.com/office/drawing/2016/5/9/chartex" xmlns:cx4="http://schemas.microsoft.com/office/drawing/2016/5/10/chartex" xmlns:cx5="http://schemas.microsoft.com/office/drawing/2016/5/11/chartex" xmlns:cx6="http://schemas.microsoft.com/office/drawing/2016/5/12/chartex" xmlns:cx7="http://schemas.microsoft.com/office/drawing/2016/5/13/chartex" xmlns:cx8="http://schemas.microsoft.com/office/drawing/2016/5/14/chartex" xmlns:mc="http://schemas.openxmlformats.org/markup-compatibility/2006" xmlns:m="http://schemas.openxmlformats.org/officeDocument/2006/math" xmlns:aink="http://schemas.microsoft.com/office/drawing/2016/ink" xmlns:am3d="http://schemas.microsoft.com/office/drawing/2017/model3d" xmlns:oel="http://schemas.microsoft.com/office/2019/extlst" xmlns:r="http://schemas.openxmlformats.org/officeDocument/2006/relationships" xmlns:wp14="http://schemas.microsoft.com/office/word/2010/wordprocessingDrawing" xmlns:wp="http://schemas.openxmlformats.org/drawingml/2006/wordprocessingDrawing" xmlns:wpg="http://schemas.microsoft.com/office/word/2010/wordprocessingGroup" xmlns:wpi="http://schemas.microsoft.com/office/word/2010/wordprocessingInk" xmlns:wps="http://schemas.microsoft.com/office/word/2010/wordprocessingShape" xmlns:o="urn:schemas-microsoft-com:office:office" xmlns:v="urn:schemas-microsoft-com:vml" xmlns:w10="urn:schemas-microsoft-com:office:word" xmlns:w="http://schemas.openxmlformats.org/wordprocessingml/2006/main" xmlns:w14="http://schemas.microsoft.com/office/word/2010/wordml" xmlns:w15="http://schemas.microsoft.com/office/word/2012/wordml" xmlns:w16cex="http://schemas.microsoft.com/office/word/2018/wordml/cex" xmlns:w16cid="http://schemas.microsoft.com/office/word/2016/wordml/cid" xmlns:w16="http://schemas.microsoft.com/office/word/2018/wordml" xmlns:w16sdtdh="http://schemas.microsoft.com/office/word/2020/wordml/sdtdatahash" xmlns:w16sdtfl="http://schemas.microsoft.com/office/word/2024/wordml/sdtformatlock" xmlns:w16se="http://schemas.microsoft.com/office/word/2015/wordml/symex" xmlns:w16du="http://schemas.microsoft.com/office/word/2023/wordml/word16du" xmlns:wne="http://schemas.microsoft.com/office/word/2006/wordml" mc:Ignorable="w14 w15 w16se w16cid w16 w16cex w16sdtdh w16sdtfl w16du wp14">
+<w:document xmlns:wpc="http://schemas.microsoft.com/office/word/2010/wordprocessingCanvas" xmlns:cx="http://schemas.microsoft.com/office/drawing/2014/chartex" xmlns:cx1="http://schemas.microsoft.com/office/drawing/2015/9/8/chartex" xmlns:cx2="http://schemas.microsoft.com/office/drawing/2015/10/21/chartex" xmlns:cx3="http://schemas.microsoft.com/office/drawing/2016/5/9/chartex" xmlns:cx4="http://schemas.microsoft.com/office/drawing/2016/5/10/chartex" xmlns:cx5="http://schemas.microsoft.com/office/drawing/2016/5/11/chartex" xmlns:cx6="http://schemas.microsoft.com/office/drawing/2016/5/12/chartex" xmlns:cx7="http://schemas.microsoft.com/office/drawing/2016/5/13/chartex" xmlns:cx8="http://schemas.microsoft.com/office/drawing/2016/5/14/chartex" xmlns:mc="http://schemas.openxmlformats.org/markup-compatibility/2006" xmlns:aink="http://schemas.microsoft.com/office/drawing/2016/ink" xmlns:am3d="http://schemas.microsoft.com/office/drawing/2017/model3d" xmlns:o="urn:schemas-microsoft-com:office:office" xmlns:oel="http://schemas.microsoft.com/office/2019/extlst" xmlns:r="http://schemas.openxmlformats.org/officeDocument/2006/relationships" xmlns:m="http://schemas.openxmlformats.org/officeDocument/2006/math" xmlns:v="urn:schemas-microsoft-com:vml" xmlns:wp14="http://schemas.microsoft.com/office/word/2010/wordprocessingDrawing" xmlns:wp="http://schemas.openxmlformats.org/drawingml/2006/wordprocessingDrawing" xmlns:w10="urn:schemas-microsoft-com:office:word" xmlns:w="http://schemas.openxmlformats.org/wordprocessingml/2006/main" xmlns:w14="http://schemas.microsoft.com/office/word/2010/wordml" xmlns:w15="http://schemas.microsoft.com/office/word/2012/wordml" xmlns:w16cex="http://schemas.microsoft.com/office/word/2018/wordml/cex" xmlns:w16cid="http://schemas.microsoft.com/office/word/2016/wordml/cid" xmlns:w16="http://schemas.microsoft.com/office/word/2018/wordml" xmlns:w16du="http://schemas.microsoft.com/office/word/2023/wordml/word16du" xmlns:w16sdtdh="http://schemas.microsoft.com/office/word/2020/wordml/sdtdatahash" xmlns:w16sdtfl="http://schemas.microsoft.com/office/word/2024/wordml/sdtformatlock" xmlns:w16se="http://schemas.microsoft.com/office/word/2015/wordml/symex" xmlns:wpg="http://schemas.microsoft.com/office/word/2010/wordprocessingGroup" xmlns:wpi="http://schemas.microsoft.com/office/word/2010/wordprocessingInk" xmlns:wne="http://schemas.microsoft.com/office/word/2006/wordml" xmlns:wps="http://schemas.microsoft.com/office/word/2010/wordprocessingShape" mc:Ignorable="w14 w15 w16se w16cid w16 w16cex w16sdtdh w16sdtfl w16du wp14">
   <w:body>
     <w:p/>
     <w:tbl>
@@ -267,7 +267,7 @@
           <w:szCs w:val="28"/>
         </w:rPr>
         <w:pict w14:anchorId="575A38CD">
-          <v:shape id="Immagine 1" o:spid="_x0000_i1025" type="#_x0000_t75" style="width:280.15pt;height:70.2pt;visibility:visible;mso-wrap-style:square">
+          <v:shape id="Immagine 1" o:spid="_x0000_i1026" type="#_x0000_t75" style="width:280.5pt;height:70.5pt;visibility:visible;mso-wrap-style:square">
             <v:imagedata r:id="rId8" o:title=""/>
           </v:shape>
         </w:pict>
@@ -4061,11 +4061,14 @@
         <w:ind w:left="709" w:hanging="283"/>
       </w:pPr>
       <w:r>
-        <w:t xml:space="preserve">Il Product Manager deve poter aggiungere nuovi modelli di occhiali al catalogo,specificando </w:t>
+        <w:t>Il Product Manager deve poter aggiungere nuovi modelli di occhiali al catalogo,</w:t>
+      </w:r>
+      <w:r>
+        <w:t xml:space="preserve"> </w:t>
       </w:r>
       <w:r>
         <w:lastRenderedPageBreak/>
-        <w:t>prezzi, immagini, e quantità disponibili, e classificarli come esclusiva online o scontati</w:t>
+        <w:t>specificando prezzi, immagini, e quantità disponibili, e classificarli come esclusiva online o scontati</w:t>
       </w:r>
     </w:p>
     <w:p>
@@ -4132,6 +4135,117 @@
         <w:t>FUNCTIONAL REQUIREMENTS</w:t>
       </w:r>
       <w:bookmarkEnd w:id="9"/>
+    </w:p>
+    <w:p>
+      <w:pPr>
+        <w:pStyle w:val="Titolo2"/>
+        <w:numPr>
+          <w:ilvl w:val="0"/>
+          <w:numId w:val="28"/>
+        </w:numPr>
+        <w:tabs>
+          <w:tab w:val="left" w:pos="284"/>
+        </w:tabs>
+        <w:spacing w:before="100"/>
+        <w:ind w:left="426" w:hanging="284"/>
+      </w:pPr>
+      <w:bookmarkStart w:id="10" w:name="_Toc242815313"/>
+      <w:r>
+        <w:t>Usability</w:t>
+      </w:r>
+      <w:bookmarkEnd w:id="10"/>
+    </w:p>
+    <w:p>
+      <w:pPr>
+        <w:numPr>
+          <w:ilvl w:val="0"/>
+          <w:numId w:val="24"/>
+        </w:numPr>
+        <w:spacing w:before="100"/>
+        <w:ind w:left="709" w:hanging="283"/>
+        <w:rPr>
+          <w:b/>
+          <w:bCs/>
+        </w:rPr>
+      </w:pPr>
+      <w:r>
+        <w:t xml:space="preserve">Il sistema deve offrire un layout flessibile in grado di adattarsi automaticamente alle diverse risoluzioni e formati di schermo (smartphone, tablet, laptop e desktop). </w:t>
+      </w:r>
+      <w:r>
+        <w:t>Gli elementi visivi, come le schede prodotto, la tabella degli ordini e i controlli di gestione, devono riorganizzarsi per preservare leggibilità, accessibilità e facilità d</w:t>
+      </w:r>
+      <w:r>
+        <w:t>’uso</w:t>
+      </w:r>
+      <w:r>
+        <w:t xml:space="preserve"> su qualsiasi dispositivo</w:t>
+      </w:r>
+      <w:r>
+        <w:t>.</w:t>
+      </w:r>
+    </w:p>
+    <w:p>
+      <w:pPr>
+        <w:numPr>
+          <w:ilvl w:val="0"/>
+          <w:numId w:val="24"/>
+        </w:numPr>
+        <w:ind w:left="709" w:hanging="283"/>
+      </w:pPr>
+      <w:r>
+        <w:t>Nelle situazioni in cui una schermata o un componente non presenta contenuti da mostrare (es. carrello degli acquisti vuoto, nessun ordine effettuato, nessun risultato corrispondente a un filtro di ricerca), il sistema non deve mai restituire schermate bianche o layout frammentati. Deve invece mostrare messaggi visivi descrittivi che spieghino chiaramente lo stato attuale e suggeriscano l'azione successiva da compiere</w:t>
+      </w:r>
+      <w:r>
+        <w:t>.</w:t>
+      </w:r>
+    </w:p>
+    <w:p>
+      <w:pPr>
+        <w:numPr>
+          <w:ilvl w:val="0"/>
+          <w:numId w:val="24"/>
+        </w:numPr>
+        <w:ind w:left="709" w:hanging="283"/>
+        <w:rPr>
+          <w:b/>
+          <w:bCs/>
+        </w:rPr>
+      </w:pPr>
+      <w:r>
+        <w:t>Il sistema deve rendere costantemente evidente all'utente il risultato delle proprie azioni attraverso notifiche visive, come banner cromatici di conferma (suc</w:t>
+      </w:r>
+      <w:r>
+        <w:t>cesso o errore)</w:t>
+      </w:r>
+      <w:r>
+        <w:t xml:space="preserve"> e badge di stato ben distinti</w:t>
+      </w:r>
+      <w:r>
+        <w:t>.</w:t>
+      </w:r>
+    </w:p>
+    <w:p>
+      <w:pPr>
+        <w:numPr>
+          <w:ilvl w:val="0"/>
+          <w:numId w:val="24"/>
+        </w:numPr>
+        <w:spacing w:after="120"/>
+        <w:ind w:left="709" w:hanging="284"/>
+        <w:rPr>
+          <w:b/>
+          <w:bCs/>
+        </w:rPr>
+      </w:pPr>
+      <w:r>
+        <w:t xml:space="preserve">Le </w:t>
+      </w:r>
+      <w:r>
+        <w:t>regole di protezione e controllo degli accessi devono riflettersi chiaramente sull'interfaccia utente. L'utente deve ricevere messaggi espliciti e comprensibili in caso di inserimento di credenziali errate, tentativi di accesso a sezioni non autorizzate o nel caso in cui stia tentando di accedere con un account sospeso o disattivato</w:t>
+      </w:r>
+      <w:r>
+        <w:t>.</w:t>
+      </w:r>
     </w:p>
     <w:p>
       <w:pPr>
@@ -4145,11 +4259,11 @@
         </w:tabs>
         <w:ind w:left="426" w:hanging="284"/>
       </w:pPr>
-      <w:bookmarkStart w:id="10" w:name="_Toc242815313"/>
-      <w:r>
-        <w:t>Usability</w:t>
-      </w:r>
-      <w:bookmarkEnd w:id="10"/>
+      <w:bookmarkStart w:id="11" w:name="_Toc242815314"/>
+      <w:r>
+        <w:t>Performance</w:t>
+      </w:r>
+      <w:bookmarkEnd w:id="11"/>
     </w:p>
     <w:p>
       <w:pPr>
@@ -4157,88 +4271,21 @@
           <w:ilvl w:val="0"/>
           <w:numId w:val="24"/>
         </w:numPr>
-        <w:ind w:left="709" w:hanging="283"/>
+        <w:spacing w:before="100" w:after="120"/>
+        <w:ind w:left="709" w:hanging="284"/>
         <w:rPr>
           <w:b/>
           <w:bCs/>
         </w:rPr>
       </w:pPr>
       <w:r>
-        <w:t xml:space="preserve">Il sistema deve offrire un layout flessibile in grado di adattarsi automaticamente alle diverse risoluzioni e formati di schermo (smartphone, tablet, laptop e desktop). </w:t>
-      </w:r>
-      <w:r>
-        <w:t>Gli elementi visivi, come le schede prodotto, la tabella degli ordini e i controlli di gestione, devono riorganizzarsi per preservare leggibilità, accessibilità e facilità d</w:t>
-      </w:r>
-      <w:r>
-        <w:t>’uso</w:t>
-      </w:r>
-      <w:r>
-        <w:t xml:space="preserve"> su qualsiasi dispositivo</w:t>
-      </w:r>
-      <w:r>
-        <w:t>.</w:t>
-      </w:r>
-    </w:p>
-    <w:p>
-      <w:pPr>
-        <w:numPr>
-          <w:ilvl w:val="0"/>
-          <w:numId w:val="24"/>
-        </w:numPr>
-        <w:ind w:left="709" w:hanging="283"/>
-      </w:pPr>
-      <w:r>
-        <w:t>Nelle situazioni in cui una schermata o un componente non presenta contenuti da mostrare (es. carrello degli acquisti vuoto, nessun ordine effettuato, nessun risultato corrispondente a un filtro di ricerca), il sistema non deve mai restituire schermate bianche o layout frammentati. Deve invece mostrare messaggi visivi descrittivi che spieghino chiaramente lo stato attuale e suggeriscano l'azione successiva da compiere</w:t>
-      </w:r>
-      <w:r>
-        <w:t>.</w:t>
-      </w:r>
-    </w:p>
-    <w:p>
-      <w:pPr>
-        <w:numPr>
-          <w:ilvl w:val="0"/>
-          <w:numId w:val="24"/>
-        </w:numPr>
-        <w:ind w:left="709" w:hanging="283"/>
-        <w:rPr>
-          <w:b/>
-          <w:bCs/>
-        </w:rPr>
-      </w:pPr>
-      <w:r>
-        <w:t>Il sistema deve rendere costantemente evidente all'utente il risultato delle proprie azioni attraverso notifiche visive, come banner cromatici di conferma (suc</w:t>
-      </w:r>
-      <w:r>
-        <w:t>cesso o errore)</w:t>
-      </w:r>
-      <w:r>
-        <w:t xml:space="preserve"> e badge di stato ben distinti</w:t>
-      </w:r>
-      <w:r>
-        <w:t>.</w:t>
-      </w:r>
-    </w:p>
-    <w:p>
-      <w:pPr>
-        <w:numPr>
-          <w:ilvl w:val="0"/>
-          <w:numId w:val="24"/>
-        </w:numPr>
-        <w:ind w:left="709" w:hanging="283"/>
-        <w:rPr>
-          <w:b/>
-          <w:bCs/>
-        </w:rPr>
-      </w:pPr>
-      <w:r>
-        <w:t xml:space="preserve">Le </w:t>
-      </w:r>
-      <w:r>
-        <w:t>regole di protezione e controllo degli accessi devono riflettersi chiaramente sull'interfaccia utente. L'utente deve ricevere messaggi espliciti e comprensibili in caso di inserimento di credenziali errate, tentativi di accesso a sezioni non autorizzate o nel caso in cui stia tentando di accedere con un account sospeso o disattivato</w:t>
-      </w:r>
-      <w:r>
-        <w:t>.</w:t>
+        <w:t>L'interfaccia utente deve garantire una navigazione fluida riducendo al minimo i tempi di attesa e i ricaricamenti dell'intera pagina, i quali comporterebbero fastidiose interruzioni visive e attese stimate tra 0,5 e 3 secondi per ogni singola azione. Le operazioni frequenti</w:t>
+      </w:r>
+      <w:r>
+        <w:t>,</w:t>
+      </w:r>
+      <w:r>
+        <w:t xml:space="preserve"> quali la modifica delle quantità del carrello, il filtraggio dei prodotti nel catalogo o l'aggiornamento dello stato di un ordine, devono avvenire in modo asincrono. Questo significa che il sistema deve aggiornare istantaneamente (in circa 100-300 millisecondi) solo le porzioni di schermo interessate dal cambiamento, evitando di dover scaricare e ridisegnare da zero l'intera pagina web per ogni minima modifica.</w:t>
       </w:r>
     </w:p>
     <w:p>
@@ -4253,11 +4300,11 @@
         </w:tabs>
         <w:ind w:left="426" w:hanging="284"/>
       </w:pPr>
-      <w:bookmarkStart w:id="11" w:name="_Toc242815314"/>
-      <w:r>
-        <w:t>Performance</w:t>
-      </w:r>
-      <w:bookmarkEnd w:id="11"/>
+      <w:bookmarkStart w:id="12" w:name="_Toc242815315"/>
+      <w:r>
+        <w:t>Reliability</w:t>
+      </w:r>
+      <w:bookmarkEnd w:id="12"/>
     </w:p>
     <w:p>
       <w:pPr>
@@ -4265,14 +4312,11 @@
           <w:ilvl w:val="0"/>
           <w:numId w:val="24"/>
         </w:numPr>
-        <w:ind w:left="709" w:hanging="283"/>
-        <w:rPr>
-          <w:b/>
-          <w:bCs/>
-        </w:rPr>
-      </w:pPr>
-      <w:r>
-        <w:t>L'interfaccia utente deve garantire una navigazione fluida riducendo al minimo i tempi di attesa e i ricaricamenti dell'intera pagina, i quali comporterebbero fastidiose interruzioni visive e attese stimate tra 0,5 e 3 secondi per ogni singola azione. Le operazioni frequenti quali la modifica delle quantità del carrello, il filtraggio dei prodotti nel catalogo o l'aggiornamento dello stato di un ordine, devono avvenire in modo asincrono. Questo significa che il sistema deve aggiornare istantaneamente (in circa 100-300 millisecondi) solo le porzioni di schermo interessate dal cambiamento, evitando di dover scaricare e ridisegnare da zero l'intera pagina web per ogni minima modifica.</w:t>
+        <w:spacing w:before="100" w:after="120"/>
+        <w:ind w:left="709" w:hanging="284"/>
+      </w:pPr>
+      <w:r>
+        <w:t>Per garantire affidabilità e sicurezza dei dati sensibili dei clienti e dei dipendenti, il sistema deve essere in grado di resistere a specifici attacchi di sicurezza. Vengono, pertanto, richieste all'utente la scelta di password robuste a protezione del suo account. Password che verranno poi criptate per i fini di sicurezza e conservate all'interno di un database (DB) protetto da un Firewall.</w:t>
       </w:r>
     </w:p>
     <w:p>
@@ -4287,11 +4331,12 @@
         </w:tabs>
         <w:ind w:left="426" w:hanging="284"/>
       </w:pPr>
-      <w:bookmarkStart w:id="12" w:name="_Toc242815315"/>
-      <w:r>
-        <w:t>Reliability</w:t>
-      </w:r>
-      <w:bookmarkEnd w:id="12"/>
+      <w:bookmarkStart w:id="13" w:name="_Toc242815316"/>
+      <w:r>
+        <w:lastRenderedPageBreak/>
+        <w:t>Supportability</w:t>
+      </w:r>
+      <w:bookmarkEnd w:id="13"/>
     </w:p>
     <w:p>
       <w:pPr>
@@ -4299,36 +4344,7 @@
           <w:ilvl w:val="0"/>
           <w:numId w:val="24"/>
         </w:numPr>
-        <w:ind w:left="709" w:hanging="283"/>
-      </w:pPr>
-      <w:r>
-        <w:t>Per garantire affidabilità e sicurezza dei dati sensibili dei clienti e dei dipendenti, il sistema deve essere in grado di resistere a specifici attacchi di sicurezza. Vengono, pertanto, richieste all'utente la scelta di password robuste a protezione del suo account. Password che verranno poi criptate per i fini di sicurezza e conservate all'interno di un database (DB) protetto da un Firewall.</w:t>
-      </w:r>
-    </w:p>
-    <w:p>
-      <w:pPr>
-        <w:pStyle w:val="Titolo2"/>
-        <w:numPr>
-          <w:ilvl w:val="0"/>
-          <w:numId w:val="28"/>
-        </w:numPr>
-        <w:tabs>
-          <w:tab w:val="left" w:pos="284"/>
-        </w:tabs>
-        <w:ind w:left="426" w:hanging="284"/>
-      </w:pPr>
-      <w:bookmarkStart w:id="13" w:name="_Toc242815316"/>
-      <w:r>
-        <w:t>Supportability</w:t>
-      </w:r>
-      <w:bookmarkEnd w:id="13"/>
-    </w:p>
-    <w:p>
-      <w:pPr>
-        <w:numPr>
-          <w:ilvl w:val="0"/>
-          <w:numId w:val="24"/>
-        </w:numPr>
+        <w:spacing w:before="100"/>
         <w:ind w:left="709" w:hanging="283"/>
         <w:jc w:val="both"/>
       </w:pPr>
@@ -4381,7 +4397,6 @@
       </w:pPr>
       <w:bookmarkStart w:id="14" w:name="_Toc242815317"/>
       <w:r>
-        <w:lastRenderedPageBreak/>
         <w:t>TARGET ENVIRONMENT</w:t>
       </w:r>
       <w:bookmarkEnd w:id="14"/>
@@ -4419,7 +4434,16 @@
         <w:t xml:space="preserve"> basato sull'architettura MVC con Jakarta EE e JSP</w:t>
       </w:r>
       <w:r>
-        <w:t xml:space="preserve">, pertanto </w:t>
+        <w:t>. P</w:t>
+      </w:r>
+      <w:r>
+        <w:t>ertanto</w:t>
+      </w:r>
+      <w:r>
+        <w:t>,</w:t>
+      </w:r>
+      <w:r>
+        <w:t xml:space="preserve"> </w:t>
       </w:r>
       <w:r>
         <w:t>l</w:t>
@@ -4512,6 +4536,8 @@
           <w:ilvl w:val="0"/>
           <w:numId w:val="25"/>
         </w:numPr>
+        <w:spacing w:after="120"/>
+        <w:ind w:left="714" w:hanging="357"/>
       </w:pPr>
       <w:r>
         <w:rPr>
@@ -4524,13 +4550,7 @@
         <w:t>:</w:t>
       </w:r>
       <w:r>
-        <w:t xml:space="preserve"> Per consentire un corretto operato da parte delle figure manageriali (Order Manager, </w:t>
-      </w:r>
-      <w:r>
-        <w:t>Product Manager</w:t>
-      </w:r>
-      <w:r>
-        <w:t>, Market Analyzer)</w:t>
+        <w:t xml:space="preserve"> Per consentire un corretto operato da parte delle figure manageriali (Order Manager, Product Manager, Market Analyzer)</w:t>
       </w:r>
       <w:r>
         <w:t xml:space="preserve"> il negozio presenta degli uffici interni dotati di postazioni </w:t>
@@ -4547,13 +4567,6 @@
       <w:r>
         <w:t>.</w:t>
       </w:r>
-    </w:p>
-    <w:p>
-      <w:pPr>
-        <w:pStyle w:val="Titolo"/>
-        <w:ind w:left="426"/>
-        <w:jc w:val="left"/>
-      </w:pPr>
     </w:p>
     <w:p>
       <w:pPr>
@@ -4562,7 +4575,8 @@
           <w:ilvl w:val="0"/>
           <w:numId w:val="6"/>
         </w:numPr>
-        <w:ind w:left="426" w:hanging="426"/>
+        <w:spacing w:before="320"/>
+        <w:ind w:left="425" w:hanging="425"/>
         <w:jc w:val="left"/>
       </w:pPr>
       <w:bookmarkStart w:id="15" w:name="_Toc242815318"/>
@@ -5180,7 +5194,7 @@
 </file>
 
 <file path=word/endnotes.xml><?xml version="1.0" encoding="utf-8"?>
-<w:endnotes xmlns:wpc="http://schemas.microsoft.com/office/word/2010/wordprocessingCanvas" xmlns:cx="http://schemas.microsoft.com/office/drawing/2014/chartex" xmlns:cx1="http://schemas.microsoft.com/office/drawing/2015/9/8/chartex" xmlns:cx2="http://schemas.microsoft.com/office/drawing/2015/10/21/chartex" xmlns:cx3="http://schemas.microsoft.com/office/drawing/2016/5/9/chartex" xmlns:cx4="http://schemas.microsoft.com/office/drawing/2016/5/10/chartex" xmlns:cx5="http://schemas.microsoft.com/office/drawing/2016/5/11/chartex" xmlns:cx6="http://schemas.microsoft.com/office/drawing/2016/5/12/chartex" xmlns:cx7="http://schemas.microsoft.com/office/drawing/2016/5/13/chartex" xmlns:cx8="http://schemas.microsoft.com/office/drawing/2016/5/14/chartex" xmlns:mc="http://schemas.openxmlformats.org/markup-compatibility/2006" xmlns:m="http://schemas.openxmlformats.org/officeDocument/2006/math" xmlns:aink="http://schemas.microsoft.com/office/drawing/2016/ink" xmlns:am3d="http://schemas.microsoft.com/office/drawing/2017/model3d" xmlns:oel="http://schemas.microsoft.com/office/2019/extlst" xmlns:r="http://schemas.openxmlformats.org/officeDocument/2006/relationships" xmlns:wp14="http://schemas.microsoft.com/office/word/2010/wordprocessingDrawing" xmlns:wp="http://schemas.openxmlformats.org/drawingml/2006/wordprocessingDrawing" xmlns:wpg="http://schemas.microsoft.com/office/word/2010/wordprocessingGroup" xmlns:wpi="http://schemas.microsoft.com/office/word/2010/wordprocessingInk" xmlns:wps="http://schemas.microsoft.com/office/word/2010/wordprocessingShape" xmlns:o="urn:schemas-microsoft-com:office:office" xmlns:v="urn:schemas-microsoft-com:vml" xmlns:w10="urn:schemas-microsoft-com:office:word" xmlns:w="http://schemas.openxmlformats.org/wordprocessingml/2006/main" xmlns:w14="http://schemas.microsoft.com/office/word/2010/wordml" xmlns:w15="http://schemas.microsoft.com/office/word/2012/wordml" xmlns:w16cex="http://schemas.microsoft.com/office/word/2018/wordml/cex" xmlns:w16cid="http://schemas.microsoft.com/office/word/2016/wordml/cid" xmlns:w16="http://schemas.microsoft.com/office/word/2018/wordml" xmlns:w16sdtdh="http://schemas.microsoft.com/office/word/2020/wordml/sdtdatahash" xmlns:w16sdtfl="http://schemas.microsoft.com/office/word/2024/wordml/sdtformatlock" xmlns:w16se="http://schemas.microsoft.com/office/word/2015/wordml/symex" xmlns:w16du="http://schemas.microsoft.com/office/word/2023/wordml/word16du" xmlns:wne="http://schemas.microsoft.com/office/word/2006/wordml" mc:Ignorable="w14 w15 w16se w16cid w16 w16cex w16sdtdh w16sdtfl w16du wp14">
+<w:endnotes xmlns:wpc="http://schemas.microsoft.com/office/word/2010/wordprocessingCanvas" xmlns:cx="http://schemas.microsoft.com/office/drawing/2014/chartex" xmlns:cx1="http://schemas.microsoft.com/office/drawing/2015/9/8/chartex" xmlns:cx2="http://schemas.microsoft.com/office/drawing/2015/10/21/chartex" xmlns:cx3="http://schemas.microsoft.com/office/drawing/2016/5/9/chartex" xmlns:cx4="http://schemas.microsoft.com/office/drawing/2016/5/10/chartex" xmlns:cx5="http://schemas.microsoft.com/office/drawing/2016/5/11/chartex" xmlns:cx6="http://schemas.microsoft.com/office/drawing/2016/5/12/chartex" xmlns:cx7="http://schemas.microsoft.com/office/drawing/2016/5/13/chartex" xmlns:cx8="http://schemas.microsoft.com/office/drawing/2016/5/14/chartex" xmlns:mc="http://schemas.openxmlformats.org/markup-compatibility/2006" xmlns:aink="http://schemas.microsoft.com/office/drawing/2016/ink" xmlns:am3d="http://schemas.microsoft.com/office/drawing/2017/model3d" xmlns:o="urn:schemas-microsoft-com:office:office" xmlns:oel="http://schemas.microsoft.com/office/2019/extlst" xmlns:r="http://schemas.openxmlformats.org/officeDocument/2006/relationships" xmlns:m="http://schemas.openxmlformats.org/officeDocument/2006/math" xmlns:v="urn:schemas-microsoft-com:vml" xmlns:wp14="http://schemas.microsoft.com/office/word/2010/wordprocessingDrawing" xmlns:wp="http://schemas.openxmlformats.org/drawingml/2006/wordprocessingDrawing" xmlns:w10="urn:schemas-microsoft-com:office:word" xmlns:w="http://schemas.openxmlformats.org/wordprocessingml/2006/main" xmlns:w14="http://schemas.microsoft.com/office/word/2010/wordml" xmlns:w15="http://schemas.microsoft.com/office/word/2012/wordml" xmlns:w16cex="http://schemas.microsoft.com/office/word/2018/wordml/cex" xmlns:w16cid="http://schemas.microsoft.com/office/word/2016/wordml/cid" xmlns:w16="http://schemas.microsoft.com/office/word/2018/wordml" xmlns:w16du="http://schemas.microsoft.com/office/word/2023/wordml/word16du" xmlns:w16sdtdh="http://schemas.microsoft.com/office/word/2020/wordml/sdtdatahash" xmlns:w16sdtfl="http://schemas.microsoft.com/office/word/2024/wordml/sdtformatlock" xmlns:w16se="http://schemas.microsoft.com/office/word/2015/wordml/symex" xmlns:wpg="http://schemas.microsoft.com/office/word/2010/wordprocessingGroup" xmlns:wpi="http://schemas.microsoft.com/office/word/2010/wordprocessingInk" xmlns:wne="http://schemas.microsoft.com/office/word/2006/wordml" xmlns:wps="http://schemas.microsoft.com/office/word/2010/wordprocessingShape" mc:Ignorable="w14 w15 w16se w16cid w16 w16cex w16sdtdh w16sdtfl w16du wp14">
   <w:endnote w:type="separator" w:id="-1">
     <w:p>
       <w:r>
@@ -5199,7 +5213,7 @@
 </file>
 
 <file path=word/footer1.xml><?xml version="1.0" encoding="utf-8"?>
-<w:ftr xmlns:wpc="http://schemas.microsoft.com/office/word/2010/wordprocessingCanvas" xmlns:cx="http://schemas.microsoft.com/office/drawing/2014/chartex" xmlns:cx1="http://schemas.microsoft.com/office/drawing/2015/9/8/chartex" xmlns:cx2="http://schemas.microsoft.com/office/drawing/2015/10/21/chartex" xmlns:cx3="http://schemas.microsoft.com/office/drawing/2016/5/9/chartex" xmlns:cx4="http://schemas.microsoft.com/office/drawing/2016/5/10/chartex" xmlns:cx5="http://schemas.microsoft.com/office/drawing/2016/5/11/chartex" xmlns:cx6="http://schemas.microsoft.com/office/drawing/2016/5/12/chartex" xmlns:cx7="http://schemas.microsoft.com/office/drawing/2016/5/13/chartex" xmlns:cx8="http://schemas.microsoft.com/office/drawing/2016/5/14/chartex" xmlns:mc="http://schemas.openxmlformats.org/markup-compatibility/2006" xmlns:m="http://schemas.openxmlformats.org/officeDocument/2006/math" xmlns:aink="http://schemas.microsoft.com/office/drawing/2016/ink" xmlns:am3d="http://schemas.microsoft.com/office/drawing/2017/model3d" xmlns:oel="http://schemas.microsoft.com/office/2019/extlst" xmlns:r="http://schemas.openxmlformats.org/officeDocument/2006/relationships" xmlns:wp14="http://schemas.microsoft.com/office/word/2010/wordprocessingDrawing" xmlns:wp="http://schemas.openxmlformats.org/drawingml/2006/wordprocessingDrawing" xmlns:wpg="http://schemas.microsoft.com/office/word/2010/wordprocessingGroup" xmlns:wpi="http://schemas.microsoft.com/office/word/2010/wordprocessingInk" xmlns:wps="http://schemas.microsoft.com/office/word/2010/wordprocessingShape" xmlns:o="urn:schemas-microsoft-com:office:office" xmlns:v="urn:schemas-microsoft-com:vml" xmlns:w10="urn:schemas-microsoft-com:office:word" xmlns:w="http://schemas.openxmlformats.org/wordprocessingml/2006/main" xmlns:w14="http://schemas.microsoft.com/office/word/2010/wordml" xmlns:w15="http://schemas.microsoft.com/office/word/2012/wordml" xmlns:w16cex="http://schemas.microsoft.com/office/word/2018/wordml/cex" xmlns:w16cid="http://schemas.microsoft.com/office/word/2016/wordml/cid" xmlns:w16="http://schemas.microsoft.com/office/word/2018/wordml" xmlns:w16sdtdh="http://schemas.microsoft.com/office/word/2020/wordml/sdtdatahash" xmlns:w16sdtfl="http://schemas.microsoft.com/office/word/2024/wordml/sdtformatlock" xmlns:w16se="http://schemas.microsoft.com/office/word/2015/wordml/symex" xmlns:w16du="http://schemas.microsoft.com/office/word/2023/wordml/word16du" xmlns:wne="http://schemas.microsoft.com/office/word/2006/wordml" mc:Ignorable="w14 w15 w16se w16cid w16 w16cex w16sdtdh w16sdtfl w16du wp14">
+<w:ftr xmlns:wpc="http://schemas.microsoft.com/office/word/2010/wordprocessingCanvas" xmlns:cx="http://schemas.microsoft.com/office/drawing/2014/chartex" xmlns:cx1="http://schemas.microsoft.com/office/drawing/2015/9/8/chartex" xmlns:cx2="http://schemas.microsoft.com/office/drawing/2015/10/21/chartex" xmlns:cx3="http://schemas.microsoft.com/office/drawing/2016/5/9/chartex" xmlns:cx4="http://schemas.microsoft.com/office/drawing/2016/5/10/chartex" xmlns:cx5="http://schemas.microsoft.com/office/drawing/2016/5/11/chartex" xmlns:cx6="http://schemas.microsoft.com/office/drawing/2016/5/12/chartex" xmlns:cx7="http://schemas.microsoft.com/office/drawing/2016/5/13/chartex" xmlns:cx8="http://schemas.microsoft.com/office/drawing/2016/5/14/chartex" xmlns:mc="http://schemas.openxmlformats.org/markup-compatibility/2006" xmlns:aink="http://schemas.microsoft.com/office/drawing/2016/ink" xmlns:am3d="http://schemas.microsoft.com/office/drawing/2017/model3d" xmlns:o="urn:schemas-microsoft-com:office:office" xmlns:oel="http://schemas.microsoft.com/office/2019/extlst" xmlns:r="http://schemas.openxmlformats.org/officeDocument/2006/relationships" xmlns:m="http://schemas.openxmlformats.org/officeDocument/2006/math" xmlns:v="urn:schemas-microsoft-com:vml" xmlns:wp14="http://schemas.microsoft.com/office/word/2010/wordprocessingDrawing" xmlns:wp="http://schemas.openxmlformats.org/drawingml/2006/wordprocessingDrawing" xmlns:w10="urn:schemas-microsoft-com:office:word" xmlns:w="http://schemas.openxmlformats.org/wordprocessingml/2006/main" xmlns:w14="http://schemas.microsoft.com/office/word/2010/wordml" xmlns:w15="http://schemas.microsoft.com/office/word/2012/wordml" xmlns:w16cex="http://schemas.microsoft.com/office/word/2018/wordml/cex" xmlns:w16cid="http://schemas.microsoft.com/office/word/2016/wordml/cid" xmlns:w16="http://schemas.microsoft.com/office/word/2018/wordml" xmlns:w16du="http://schemas.microsoft.com/office/word/2023/wordml/word16du" xmlns:w16sdtdh="http://schemas.microsoft.com/office/word/2020/wordml/sdtdatahash" xmlns:w16sdtfl="http://schemas.microsoft.com/office/word/2024/wordml/sdtformatlock" xmlns:w16se="http://schemas.microsoft.com/office/word/2015/wordml/symex" xmlns:wpg="http://schemas.microsoft.com/office/word/2010/wordprocessingGroup" xmlns:wpi="http://schemas.microsoft.com/office/word/2010/wordprocessingInk" xmlns:wne="http://schemas.microsoft.com/office/word/2006/wordml" xmlns:wps="http://schemas.microsoft.com/office/word/2010/wordprocessingShape" mc:Ignorable="w14 w15 w16se w16cid w16 w16cex w16sdtdh w16sdtfl w16du wp14">
   <w:tbl>
     <w:tblPr>
       <w:tblW w:w="0" w:type="auto"/>
@@ -5367,31 +5381,31 @@
 </file>
 
 <file path=word/footer2.xml><?xml version="1.0" encoding="utf-8"?>
-<w:ftr xmlns:wpc="http://schemas.microsoft.com/office/word/2010/wordprocessingCanvas" xmlns:cx="http://schemas.microsoft.com/office/drawing/2014/chartex" xmlns:cx1="http://schemas.microsoft.com/office/drawing/2015/9/8/chartex" xmlns:cx2="http://schemas.microsoft.com/office/drawing/2015/10/21/chartex" xmlns:cx3="http://schemas.microsoft.com/office/drawing/2016/5/9/chartex" xmlns:cx4="http://schemas.microsoft.com/office/drawing/2016/5/10/chartex" xmlns:cx5="http://schemas.microsoft.com/office/drawing/2016/5/11/chartex" xmlns:cx6="http://schemas.microsoft.com/office/drawing/2016/5/12/chartex" xmlns:cx7="http://schemas.microsoft.com/office/drawing/2016/5/13/chartex" xmlns:cx8="http://schemas.microsoft.com/office/drawing/2016/5/14/chartex" xmlns:mc="http://schemas.openxmlformats.org/markup-compatibility/2006" xmlns:m="http://schemas.openxmlformats.org/officeDocument/2006/math" xmlns:aink="http://schemas.microsoft.com/office/drawing/2016/ink" xmlns:am3d="http://schemas.microsoft.com/office/drawing/2017/model3d" xmlns:oel="http://schemas.microsoft.com/office/2019/extlst" xmlns:r="http://schemas.openxmlformats.org/officeDocument/2006/relationships" xmlns:wp14="http://schemas.microsoft.com/office/word/2010/wordprocessingDrawing" xmlns:wp="http://schemas.openxmlformats.org/drawingml/2006/wordprocessingDrawing" xmlns:wpg="http://schemas.microsoft.com/office/word/2010/wordprocessingGroup" xmlns:wpi="http://schemas.microsoft.com/office/word/2010/wordprocessingInk" xmlns:wps="http://schemas.microsoft.com/office/word/2010/wordprocessingShape" xmlns:o="urn:schemas-microsoft-com:office:office" xmlns:v="urn:schemas-microsoft-com:vml" xmlns:w10="urn:schemas-microsoft-com:office:word" xmlns:w="http://schemas.openxmlformats.org/wordprocessingml/2006/main" xmlns:w14="http://schemas.microsoft.com/office/word/2010/wordml" xmlns:w15="http://schemas.microsoft.com/office/word/2012/wordml" xmlns:w16cex="http://schemas.microsoft.com/office/word/2018/wordml/cex" xmlns:w16cid="http://schemas.microsoft.com/office/word/2016/wordml/cid" xmlns:w16="http://schemas.microsoft.com/office/word/2018/wordml" xmlns:w16sdtdh="http://schemas.microsoft.com/office/word/2020/wordml/sdtdatahash" xmlns:w16sdtfl="http://schemas.microsoft.com/office/word/2024/wordml/sdtformatlock" xmlns:w16se="http://schemas.microsoft.com/office/word/2015/wordml/symex" xmlns:w16du="http://schemas.microsoft.com/office/word/2023/wordml/word16du" xmlns:wne="http://schemas.microsoft.com/office/word/2006/wordml" mc:Ignorable="w14 w15 w16se w16cid w16 w16cex w16sdtdh w16sdtfl w16du wp14">
+<w:ftr xmlns:wpc="http://schemas.microsoft.com/office/word/2010/wordprocessingCanvas" xmlns:cx="http://schemas.microsoft.com/office/drawing/2014/chartex" xmlns:cx1="http://schemas.microsoft.com/office/drawing/2015/9/8/chartex" xmlns:cx2="http://schemas.microsoft.com/office/drawing/2015/10/21/chartex" xmlns:cx3="http://schemas.microsoft.com/office/drawing/2016/5/9/chartex" xmlns:cx4="http://schemas.microsoft.com/office/drawing/2016/5/10/chartex" xmlns:cx5="http://schemas.microsoft.com/office/drawing/2016/5/11/chartex" xmlns:cx6="http://schemas.microsoft.com/office/drawing/2016/5/12/chartex" xmlns:cx7="http://schemas.microsoft.com/office/drawing/2016/5/13/chartex" xmlns:cx8="http://schemas.microsoft.com/office/drawing/2016/5/14/chartex" xmlns:mc="http://schemas.openxmlformats.org/markup-compatibility/2006" xmlns:aink="http://schemas.microsoft.com/office/drawing/2016/ink" xmlns:am3d="http://schemas.microsoft.com/office/drawing/2017/model3d" xmlns:o="urn:schemas-microsoft-com:office:office" xmlns:oel="http://schemas.microsoft.com/office/2019/extlst" xmlns:r="http://schemas.openxmlformats.org/officeDocument/2006/relationships" xmlns:m="http://schemas.openxmlformats.org/officeDocument/2006/math" xmlns:v="urn:schemas-microsoft-com:vml" xmlns:wp14="http://schemas.microsoft.com/office/word/2010/wordprocessingDrawing" xmlns:wp="http://schemas.openxmlformats.org/drawingml/2006/wordprocessingDrawing" xmlns:w10="urn:schemas-microsoft-com:office:word" xmlns:w="http://schemas.openxmlformats.org/wordprocessingml/2006/main" xmlns:w14="http://schemas.microsoft.com/office/word/2010/wordml" xmlns:w15="http://schemas.microsoft.com/office/word/2012/wordml" xmlns:w16cex="http://schemas.microsoft.com/office/word/2018/wordml/cex" xmlns:w16cid="http://schemas.microsoft.com/office/word/2016/wordml/cid" xmlns:w16="http://schemas.microsoft.com/office/word/2018/wordml" xmlns:w16du="http://schemas.microsoft.com/office/word/2023/wordml/word16du" xmlns:w16sdtdh="http://schemas.microsoft.com/office/word/2020/wordml/sdtdatahash" xmlns:w16sdtfl="http://schemas.microsoft.com/office/word/2024/wordml/sdtformatlock" xmlns:w16se="http://schemas.microsoft.com/office/word/2015/wordml/symex" xmlns:wpg="http://schemas.microsoft.com/office/word/2010/wordprocessingGroup" xmlns:wpi="http://schemas.microsoft.com/office/word/2010/wordprocessingInk" xmlns:wne="http://schemas.microsoft.com/office/word/2006/wordml" xmlns:wps="http://schemas.microsoft.com/office/word/2010/wordprocessingShape" mc:Ignorable="w14 w15 w16se w16cid w16 w16cex w16sdtdh w16sdtfl w16du wp14">
   <w:p/>
 </w:ftr>
 </file>
 
 <file path=word/footer3.xml><?xml version="1.0" encoding="utf-8"?>
-<w:ftr xmlns:wpc="http://schemas.microsoft.com/office/word/2010/wordprocessingCanvas" xmlns:cx="http://schemas.microsoft.com/office/drawing/2014/chartex" xmlns:cx1="http://schemas.microsoft.com/office/drawing/2015/9/8/chartex" xmlns:cx2="http://schemas.microsoft.com/office/drawing/2015/10/21/chartex" xmlns:cx3="http://schemas.microsoft.com/office/drawing/2016/5/9/chartex" xmlns:cx4="http://schemas.microsoft.com/office/drawing/2016/5/10/chartex" xmlns:cx5="http://schemas.microsoft.com/office/drawing/2016/5/11/chartex" xmlns:cx6="http://schemas.microsoft.com/office/drawing/2016/5/12/chartex" xmlns:cx7="http://schemas.microsoft.com/office/drawing/2016/5/13/chartex" xmlns:cx8="http://schemas.microsoft.com/office/drawing/2016/5/14/chartex" xmlns:mc="http://schemas.openxmlformats.org/markup-compatibility/2006" xmlns:m="http://schemas.openxmlformats.org/officeDocument/2006/math" xmlns:aink="http://schemas.microsoft.com/office/drawing/2016/ink" xmlns:am3d="http://schemas.microsoft.com/office/drawing/2017/model3d" xmlns:oel="http://schemas.microsoft.com/office/2019/extlst" xmlns:r="http://schemas.openxmlformats.org/officeDocument/2006/relationships" xmlns:wp14="http://schemas.microsoft.com/office/word/2010/wordprocessingDrawing" xmlns:wp="http://schemas.openxmlformats.org/drawingml/2006/wordprocessingDrawing" xmlns:wpg="http://schemas.microsoft.com/office/word/2010/wordprocessingGroup" xmlns:wpi="http://schemas.microsoft.com/office/word/2010/wordprocessingInk" xmlns:wps="http://schemas.microsoft.com/office/word/2010/wordprocessingShape" xmlns:o="urn:schemas-microsoft-com:office:office" xmlns:v="urn:schemas-microsoft-com:vml" xmlns:w10="urn:schemas-microsoft-com:office:word" xmlns:w="http://schemas.openxmlformats.org/wordprocessingml/2006/main" xmlns:w14="http://schemas.microsoft.com/office/word/2010/wordml" xmlns:w15="http://schemas.microsoft.com/office/word/2012/wordml" xmlns:w16cex="http://schemas.microsoft.com/office/word/2018/wordml/cex" xmlns:w16cid="http://schemas.microsoft.com/office/word/2016/wordml/cid" xmlns:w16="http://schemas.microsoft.com/office/word/2018/wordml" xmlns:w16sdtdh="http://schemas.microsoft.com/office/word/2020/wordml/sdtdatahash" xmlns:w16sdtfl="http://schemas.microsoft.com/office/word/2024/wordml/sdtformatlock" xmlns:w16se="http://schemas.microsoft.com/office/word/2015/wordml/symex" xmlns:w16du="http://schemas.microsoft.com/office/word/2023/wordml/word16du" xmlns:wne="http://schemas.microsoft.com/office/word/2006/wordml" mc:Ignorable="w14 w15 w16se w16cid w16 w16cex w16sdtdh w16sdtfl w16du wp14">
+<w:ftr xmlns:wpc="http://schemas.microsoft.com/office/word/2010/wordprocessingCanvas" xmlns:cx="http://schemas.microsoft.com/office/drawing/2014/chartex" xmlns:cx1="http://schemas.microsoft.com/office/drawing/2015/9/8/chartex" xmlns:cx2="http://schemas.microsoft.com/office/drawing/2015/10/21/chartex" xmlns:cx3="http://schemas.microsoft.com/office/drawing/2016/5/9/chartex" xmlns:cx4="http://schemas.microsoft.com/office/drawing/2016/5/10/chartex" xmlns:cx5="http://schemas.microsoft.com/office/drawing/2016/5/11/chartex" xmlns:cx6="http://schemas.microsoft.com/office/drawing/2016/5/12/chartex" xmlns:cx7="http://schemas.microsoft.com/office/drawing/2016/5/13/chartex" xmlns:cx8="http://schemas.microsoft.com/office/drawing/2016/5/14/chartex" xmlns:mc="http://schemas.openxmlformats.org/markup-compatibility/2006" xmlns:aink="http://schemas.microsoft.com/office/drawing/2016/ink" xmlns:am3d="http://schemas.microsoft.com/office/drawing/2017/model3d" xmlns:o="urn:schemas-microsoft-com:office:office" xmlns:oel="http://schemas.microsoft.com/office/2019/extlst" xmlns:r="http://schemas.openxmlformats.org/officeDocument/2006/relationships" xmlns:m="http://schemas.openxmlformats.org/officeDocument/2006/math" xmlns:v="urn:schemas-microsoft-com:vml" xmlns:wp14="http://schemas.microsoft.com/office/word/2010/wordprocessingDrawing" xmlns:wp="http://schemas.openxmlformats.org/drawingml/2006/wordprocessingDrawing" xmlns:w10="urn:schemas-microsoft-com:office:word" xmlns:w="http://schemas.openxmlformats.org/wordprocessingml/2006/main" xmlns:w14="http://schemas.microsoft.com/office/word/2010/wordml" xmlns:w15="http://schemas.microsoft.com/office/word/2012/wordml" xmlns:w16cex="http://schemas.microsoft.com/office/word/2018/wordml/cex" xmlns:w16cid="http://schemas.microsoft.com/office/word/2016/wordml/cid" xmlns:w16="http://schemas.microsoft.com/office/word/2018/wordml" xmlns:w16du="http://schemas.microsoft.com/office/word/2023/wordml/word16du" xmlns:w16sdtdh="http://schemas.microsoft.com/office/word/2020/wordml/sdtdatahash" xmlns:w16sdtfl="http://schemas.microsoft.com/office/word/2024/wordml/sdtformatlock" xmlns:w16se="http://schemas.microsoft.com/office/word/2015/wordml/symex" xmlns:wpg="http://schemas.microsoft.com/office/word/2010/wordprocessingGroup" xmlns:wpi="http://schemas.microsoft.com/office/word/2010/wordprocessingInk" xmlns:wne="http://schemas.microsoft.com/office/word/2006/wordml" xmlns:wps="http://schemas.microsoft.com/office/word/2010/wordprocessingShape" mc:Ignorable="w14 w15 w16se w16cid w16 w16cex w16sdtdh w16sdtfl w16du wp14">
   <w:p/>
 </w:ftr>
 </file>
 
 <file path=word/footer4.xml><?xml version="1.0" encoding="utf-8"?>
-<w:ftr xmlns:wpc="http://schemas.microsoft.com/office/word/2010/wordprocessingCanvas" xmlns:cx="http://schemas.microsoft.com/office/drawing/2014/chartex" xmlns:cx1="http://schemas.microsoft.com/office/drawing/2015/9/8/chartex" xmlns:cx2="http://schemas.microsoft.com/office/drawing/2015/10/21/chartex" xmlns:cx3="http://schemas.microsoft.com/office/drawing/2016/5/9/chartex" xmlns:cx4="http://schemas.microsoft.com/office/drawing/2016/5/10/chartex" xmlns:cx5="http://schemas.microsoft.com/office/drawing/2016/5/11/chartex" xmlns:cx6="http://schemas.microsoft.com/office/drawing/2016/5/12/chartex" xmlns:cx7="http://schemas.microsoft.com/office/drawing/2016/5/13/chartex" xmlns:cx8="http://schemas.microsoft.com/office/drawing/2016/5/14/chartex" xmlns:mc="http://schemas.openxmlformats.org/markup-compatibility/2006" xmlns:m="http://schemas.openxmlformats.org/officeDocument/2006/math" xmlns:aink="http://schemas.microsoft.com/office/drawing/2016/ink" xmlns:am3d="http://schemas.microsoft.com/office/drawing/2017/model3d" xmlns:oel="http://schemas.microsoft.com/office/2019/extlst" xmlns:r="http://schemas.openxmlformats.org/officeDocument/2006/relationships" xmlns:wp14="http://schemas.microsoft.com/office/word/2010/wordprocessingDrawing" xmlns:wp="http://schemas.openxmlformats.org/drawingml/2006/wordprocessingDrawing" xmlns:wpg="http://schemas.microsoft.com/office/word/2010/wordprocessingGroup" xmlns:wpi="http://schemas.microsoft.com/office/word/2010/wordprocessingInk" xmlns:wps="http://schemas.microsoft.com/office/word/2010/wordprocessingShape" xmlns:o="urn:schemas-microsoft-com:office:office" xmlns:v="urn:schemas-microsoft-com:vml" xmlns:w10="urn:schemas-microsoft-com:office:word" xmlns:w="http://schemas.openxmlformats.org/wordprocessingml/2006/main" xmlns:w14="http://schemas.microsoft.com/office/word/2010/wordml" xmlns:w15="http://schemas.microsoft.com/office/word/2012/wordml" xmlns:w16cex="http://schemas.microsoft.com/office/word/2018/wordml/cex" xmlns:w16cid="http://schemas.microsoft.com/office/word/2016/wordml/cid" xmlns:w16="http://schemas.microsoft.com/office/word/2018/wordml" xmlns:w16sdtdh="http://schemas.microsoft.com/office/word/2020/wordml/sdtdatahash" xmlns:w16sdtfl="http://schemas.microsoft.com/office/word/2024/wordml/sdtformatlock" xmlns:w16se="http://schemas.microsoft.com/office/word/2015/wordml/symex" xmlns:w16du="http://schemas.microsoft.com/office/word/2023/wordml/word16du" xmlns:wne="http://schemas.microsoft.com/office/word/2006/wordml" mc:Ignorable="w14 w15 w16se w16cid w16 w16cex w16sdtdh w16sdtfl w16du wp14">
+<w:ftr xmlns:wpc="http://schemas.microsoft.com/office/word/2010/wordprocessingCanvas" xmlns:cx="http://schemas.microsoft.com/office/drawing/2014/chartex" xmlns:cx1="http://schemas.microsoft.com/office/drawing/2015/9/8/chartex" xmlns:cx2="http://schemas.microsoft.com/office/drawing/2015/10/21/chartex" xmlns:cx3="http://schemas.microsoft.com/office/drawing/2016/5/9/chartex" xmlns:cx4="http://schemas.microsoft.com/office/drawing/2016/5/10/chartex" xmlns:cx5="http://schemas.microsoft.com/office/drawing/2016/5/11/chartex" xmlns:cx6="http://schemas.microsoft.com/office/drawing/2016/5/12/chartex" xmlns:cx7="http://schemas.microsoft.com/office/drawing/2016/5/13/chartex" xmlns:cx8="http://schemas.microsoft.com/office/drawing/2016/5/14/chartex" xmlns:mc="http://schemas.openxmlformats.org/markup-compatibility/2006" xmlns:aink="http://schemas.microsoft.com/office/drawing/2016/ink" xmlns:am3d="http://schemas.microsoft.com/office/drawing/2017/model3d" xmlns:o="urn:schemas-microsoft-com:office:office" xmlns:oel="http://schemas.microsoft.com/office/2019/extlst" xmlns:r="http://schemas.openxmlformats.org/officeDocument/2006/relationships" xmlns:m="http://schemas.openxmlformats.org/officeDocument/2006/math" xmlns:v="urn:schemas-microsoft-com:vml" xmlns:wp14="http://schemas.microsoft.com/office/word/2010/wordprocessingDrawing" xmlns:wp="http://schemas.openxmlformats.org/drawingml/2006/wordprocessingDrawing" xmlns:w10="urn:schemas-microsoft-com:office:word" xmlns:w="http://schemas.openxmlformats.org/wordprocessingml/2006/main" xmlns:w14="http://schemas.microsoft.com/office/word/2010/wordml" xmlns:w15="http://schemas.microsoft.com/office/word/2012/wordml" xmlns:w16cex="http://schemas.microsoft.com/office/word/2018/wordml/cex" xmlns:w16cid="http://schemas.microsoft.com/office/word/2016/wordml/cid" xmlns:w16="http://schemas.microsoft.com/office/word/2018/wordml" xmlns:w16du="http://schemas.microsoft.com/office/word/2023/wordml/word16du" xmlns:w16sdtdh="http://schemas.microsoft.com/office/word/2020/wordml/sdtdatahash" xmlns:w16sdtfl="http://schemas.microsoft.com/office/word/2024/wordml/sdtformatlock" xmlns:w16se="http://schemas.microsoft.com/office/word/2015/wordml/symex" xmlns:wpg="http://schemas.microsoft.com/office/word/2010/wordprocessingGroup" xmlns:wpi="http://schemas.microsoft.com/office/word/2010/wordprocessingInk" xmlns:wne="http://schemas.microsoft.com/office/word/2006/wordml" xmlns:wps="http://schemas.microsoft.com/office/word/2010/wordprocessingShape" mc:Ignorable="w14 w15 w16se w16cid w16 w16cex w16sdtdh w16sdtfl w16du wp14">
   <w:p/>
 </w:ftr>
 </file>
 
 <file path=word/footer5.xml><?xml version="1.0" encoding="utf-8"?>
-<w:ftr xmlns:wpc="http://schemas.microsoft.com/office/word/2010/wordprocessingCanvas" xmlns:cx="http://schemas.microsoft.com/office/drawing/2014/chartex" xmlns:cx1="http://schemas.microsoft.com/office/drawing/2015/9/8/chartex" xmlns:cx2="http://schemas.microsoft.com/office/drawing/2015/10/21/chartex" xmlns:cx3="http://schemas.microsoft.com/office/drawing/2016/5/9/chartex" xmlns:cx4="http://schemas.microsoft.com/office/drawing/2016/5/10/chartex" xmlns:cx5="http://schemas.microsoft.com/office/drawing/2016/5/11/chartex" xmlns:cx6="http://schemas.microsoft.com/office/drawing/2016/5/12/chartex" xmlns:cx7="http://schemas.microsoft.com/office/drawing/2016/5/13/chartex" xmlns:cx8="http://schemas.microsoft.com/office/drawing/2016/5/14/chartex" xmlns:mc="http://schemas.openxmlformats.org/markup-compatibility/2006" xmlns:m="http://schemas.openxmlformats.org/officeDocument/2006/math" xmlns:aink="http://schemas.microsoft.com/office/drawing/2016/ink" xmlns:am3d="http://schemas.microsoft.com/office/drawing/2017/model3d" xmlns:oel="http://schemas.microsoft.com/office/2019/extlst" xmlns:r="http://schemas.openxmlformats.org/officeDocument/2006/relationships" xmlns:wp14="http://schemas.microsoft.com/office/word/2010/wordprocessingDrawing" xmlns:wp="http://schemas.openxmlformats.org/drawingml/2006/wordprocessingDrawing" xmlns:wpg="http://schemas.microsoft.com/office/word/2010/wordprocessingGroup" xmlns:wpi="http://schemas.microsoft.com/office/word/2010/wordprocessingInk" xmlns:wps="http://schemas.microsoft.com/office/word/2010/wordprocessingShape" xmlns:o="urn:schemas-microsoft-com:office:office" xmlns:v="urn:schemas-microsoft-com:vml" xmlns:w10="urn:schemas-microsoft-com:office:word" xmlns:w="http://schemas.openxmlformats.org/wordprocessingml/2006/main" xmlns:w14="http://schemas.microsoft.com/office/word/2010/wordml" xmlns:w15="http://schemas.microsoft.com/office/word/2012/wordml" xmlns:w16cex="http://schemas.microsoft.com/office/word/2018/wordml/cex" xmlns:w16cid="http://schemas.microsoft.com/office/word/2016/wordml/cid" xmlns:w16="http://schemas.microsoft.com/office/word/2018/wordml" xmlns:w16sdtdh="http://schemas.microsoft.com/office/word/2020/wordml/sdtdatahash" xmlns:w16sdtfl="http://schemas.microsoft.com/office/word/2024/wordml/sdtformatlock" xmlns:w16se="http://schemas.microsoft.com/office/word/2015/wordml/symex" xmlns:w16du="http://schemas.microsoft.com/office/word/2023/wordml/word16du" xmlns:wne="http://schemas.microsoft.com/office/word/2006/wordml" mc:Ignorable="w14 w15 w16se w16cid w16 w16cex w16sdtdh w16sdtfl w16du wp14">
+<w:ftr xmlns:wpc="http://schemas.microsoft.com/office/word/2010/wordprocessingCanvas" xmlns:cx="http://schemas.microsoft.com/office/drawing/2014/chartex" xmlns:cx1="http://schemas.microsoft.com/office/drawing/2015/9/8/chartex" xmlns:cx2="http://schemas.microsoft.com/office/drawing/2015/10/21/chartex" xmlns:cx3="http://schemas.microsoft.com/office/drawing/2016/5/9/chartex" xmlns:cx4="http://schemas.microsoft.com/office/drawing/2016/5/10/chartex" xmlns:cx5="http://schemas.microsoft.com/office/drawing/2016/5/11/chartex" xmlns:cx6="http://schemas.microsoft.com/office/drawing/2016/5/12/chartex" xmlns:cx7="http://schemas.microsoft.com/office/drawing/2016/5/13/chartex" xmlns:cx8="http://schemas.microsoft.com/office/drawing/2016/5/14/chartex" xmlns:mc="http://schemas.openxmlformats.org/markup-compatibility/2006" xmlns:aink="http://schemas.microsoft.com/office/drawing/2016/ink" xmlns:am3d="http://schemas.microsoft.com/office/drawing/2017/model3d" xmlns:o="urn:schemas-microsoft-com:office:office" xmlns:oel="http://schemas.microsoft.com/office/2019/extlst" xmlns:r="http://schemas.openxmlformats.org/officeDocument/2006/relationships" xmlns:m="http://schemas.openxmlformats.org/officeDocument/2006/math" xmlns:v="urn:schemas-microsoft-com:vml" xmlns:wp14="http://schemas.microsoft.com/office/word/2010/wordprocessingDrawing" xmlns:wp="http://schemas.openxmlformats.org/drawingml/2006/wordprocessingDrawing" xmlns:w10="urn:schemas-microsoft-com:office:word" xmlns:w="http://schemas.openxmlformats.org/wordprocessingml/2006/main" xmlns:w14="http://schemas.microsoft.com/office/word/2010/wordml" xmlns:w15="http://schemas.microsoft.com/office/word/2012/wordml" xmlns:w16cex="http://schemas.microsoft.com/office/word/2018/wordml/cex" xmlns:w16cid="http://schemas.microsoft.com/office/word/2016/wordml/cid" xmlns:w16="http://schemas.microsoft.com/office/word/2018/wordml" xmlns:w16du="http://schemas.microsoft.com/office/word/2023/wordml/word16du" xmlns:w16sdtdh="http://schemas.microsoft.com/office/word/2020/wordml/sdtdatahash" xmlns:w16sdtfl="http://schemas.microsoft.com/office/word/2024/wordml/sdtformatlock" xmlns:w16se="http://schemas.microsoft.com/office/word/2015/wordml/symex" xmlns:wpg="http://schemas.microsoft.com/office/word/2010/wordprocessingGroup" xmlns:wpi="http://schemas.microsoft.com/office/word/2010/wordprocessingInk" xmlns:wne="http://schemas.microsoft.com/office/word/2006/wordml" xmlns:wps="http://schemas.microsoft.com/office/word/2010/wordprocessingShape" mc:Ignorable="w14 w15 w16se w16cid w16 w16cex w16sdtdh w16sdtfl w16du wp14">
   <w:p/>
 </w:ftr>
 </file>
 
 <file path=word/footnotes.xml><?xml version="1.0" encoding="utf-8"?>
-<w:footnotes xmlns:wpc="http://schemas.microsoft.com/office/word/2010/wordprocessingCanvas" xmlns:cx="http://schemas.microsoft.com/office/drawing/2014/chartex" xmlns:cx1="http://schemas.microsoft.com/office/drawing/2015/9/8/chartex" xmlns:cx2="http://schemas.microsoft.com/office/drawing/2015/10/21/chartex" xmlns:cx3="http://schemas.microsoft.com/office/drawing/2016/5/9/chartex" xmlns:cx4="http://schemas.microsoft.com/office/drawing/2016/5/10/chartex" xmlns:cx5="http://schemas.microsoft.com/office/drawing/2016/5/11/chartex" xmlns:cx6="http://schemas.microsoft.com/office/drawing/2016/5/12/chartex" xmlns:cx7="http://schemas.microsoft.com/office/drawing/2016/5/13/chartex" xmlns:cx8="http://schemas.microsoft.com/office/drawing/2016/5/14/chartex" xmlns:mc="http://schemas.openxmlformats.org/markup-compatibility/2006" xmlns:m="http://schemas.openxmlformats.org/officeDocument/2006/math" xmlns:aink="http://schemas.microsoft.com/office/drawing/2016/ink" xmlns:am3d="http://schemas.microsoft.com/office/drawing/2017/model3d" xmlns:oel="http://schemas.microsoft.com/office/2019/extlst" xmlns:r="http://schemas.openxmlformats.org/officeDocument/2006/relationships" xmlns:wp14="http://schemas.microsoft.com/office/word/2010/wordprocessingDrawing" xmlns:wp="http://schemas.openxmlformats.org/drawingml/2006/wordprocessingDrawing" xmlns:wpg="http://schemas.microsoft.com/office/word/2010/wordprocessingGroup" xmlns:wpi="http://schemas.microsoft.com/office/word/2010/wordprocessingInk" xmlns:wps="http://schemas.microsoft.com/office/word/2010/wordprocessingShape" xmlns:o="urn:schemas-microsoft-com:office:office" xmlns:v="urn:schemas-microsoft-com:vml" xmlns:w10="urn:schemas-microsoft-com:office:word" xmlns:w="http://schemas.openxmlformats.org/wordprocessingml/2006/main" xmlns:w14="http://schemas.microsoft.com/office/word/2010/wordml" xmlns:w15="http://schemas.microsoft.com/office/word/2012/wordml" xmlns:w16cex="http://schemas.microsoft.com/office/word/2018/wordml/cex" xmlns:w16cid="http://schemas.microsoft.com/office/word/2016/wordml/cid" xmlns:w16="http://schemas.microsoft.com/office/word/2018/wordml" xmlns:w16sdtdh="http://schemas.microsoft.com/office/word/2020/wordml/sdtdatahash" xmlns:w16sdtfl="http://schemas.microsoft.com/office/word/2024/wordml/sdtformatlock" xmlns:w16se="http://schemas.microsoft.com/office/word/2015/wordml/symex" xmlns:w16du="http://schemas.microsoft.com/office/word/2023/wordml/word16du" xmlns:wne="http://schemas.microsoft.com/office/word/2006/wordml" mc:Ignorable="w14 w15 w16se w16cid w16 w16cex w16sdtdh w16sdtfl w16du wp14">
+<w:footnotes xmlns:wpc="http://schemas.microsoft.com/office/word/2010/wordprocessingCanvas" xmlns:cx="http://schemas.microsoft.com/office/drawing/2014/chartex" xmlns:cx1="http://schemas.microsoft.com/office/drawing/2015/9/8/chartex" xmlns:cx2="http://schemas.microsoft.com/office/drawing/2015/10/21/chartex" xmlns:cx3="http://schemas.microsoft.com/office/drawing/2016/5/9/chartex" xmlns:cx4="http://schemas.microsoft.com/office/drawing/2016/5/10/chartex" xmlns:cx5="http://schemas.microsoft.com/office/drawing/2016/5/11/chartex" xmlns:cx6="http://schemas.microsoft.com/office/drawing/2016/5/12/chartex" xmlns:cx7="http://schemas.microsoft.com/office/drawing/2016/5/13/chartex" xmlns:cx8="http://schemas.microsoft.com/office/drawing/2016/5/14/chartex" xmlns:mc="http://schemas.openxmlformats.org/markup-compatibility/2006" xmlns:aink="http://schemas.microsoft.com/office/drawing/2016/ink" xmlns:am3d="http://schemas.microsoft.com/office/drawing/2017/model3d" xmlns:o="urn:schemas-microsoft-com:office:office" xmlns:oel="http://schemas.microsoft.com/office/2019/extlst" xmlns:r="http://schemas.openxmlformats.org/officeDocument/2006/relationships" xmlns:m="http://schemas.openxmlformats.org/officeDocument/2006/math" xmlns:v="urn:schemas-microsoft-com:vml" xmlns:wp14="http://schemas.microsoft.com/office/word/2010/wordprocessingDrawing" xmlns:wp="http://schemas.openxmlformats.org/drawingml/2006/wordprocessingDrawing" xmlns:w10="urn:schemas-microsoft-com:office:word" xmlns:w="http://schemas.openxmlformats.org/wordprocessingml/2006/main" xmlns:w14="http://schemas.microsoft.com/office/word/2010/wordml" xmlns:w15="http://schemas.microsoft.com/office/word/2012/wordml" xmlns:w16cex="http://schemas.microsoft.com/office/word/2018/wordml/cex" xmlns:w16cid="http://schemas.microsoft.com/office/word/2016/wordml/cid" xmlns:w16="http://schemas.microsoft.com/office/word/2018/wordml" xmlns:w16du="http://schemas.microsoft.com/office/word/2023/wordml/word16du" xmlns:w16sdtdh="http://schemas.microsoft.com/office/word/2020/wordml/sdtdatahash" xmlns:w16sdtfl="http://schemas.microsoft.com/office/word/2024/wordml/sdtformatlock" xmlns:w16se="http://schemas.microsoft.com/office/word/2015/wordml/symex" xmlns:wpg="http://schemas.microsoft.com/office/word/2010/wordprocessingGroup" xmlns:wpi="http://schemas.microsoft.com/office/word/2010/wordprocessingInk" xmlns:wne="http://schemas.microsoft.com/office/word/2006/wordml" xmlns:wps="http://schemas.microsoft.com/office/word/2010/wordprocessingShape" mc:Ignorable="w14 w15 w16se w16cid w16 w16cex w16sdtdh w16sdtfl w16du wp14">
   <w:footnote w:type="separator" w:id="-1">
     <w:p>
       <w:r>
@@ -5410,7 +5424,7 @@
 </file>
 
 <file path=word/header1.xml><?xml version="1.0" encoding="utf-8"?>
-<w:hdr xmlns:wpc="http://schemas.microsoft.com/office/word/2010/wordprocessingCanvas" xmlns:cx="http://schemas.microsoft.com/office/drawing/2014/chartex" xmlns:cx1="http://schemas.microsoft.com/office/drawing/2015/9/8/chartex" xmlns:cx2="http://schemas.microsoft.com/office/drawing/2015/10/21/chartex" xmlns:cx3="http://schemas.microsoft.com/office/drawing/2016/5/9/chartex" xmlns:cx4="http://schemas.microsoft.com/office/drawing/2016/5/10/chartex" xmlns:cx5="http://schemas.microsoft.com/office/drawing/2016/5/11/chartex" xmlns:cx6="http://schemas.microsoft.com/office/drawing/2016/5/12/chartex" xmlns:cx7="http://schemas.microsoft.com/office/drawing/2016/5/13/chartex" xmlns:cx8="http://schemas.microsoft.com/office/drawing/2016/5/14/chartex" xmlns:mc="http://schemas.openxmlformats.org/markup-compatibility/2006" xmlns:m="http://schemas.openxmlformats.org/officeDocument/2006/math" xmlns:aink="http://schemas.microsoft.com/office/drawing/2016/ink" xmlns:am3d="http://schemas.microsoft.com/office/drawing/2017/model3d" xmlns:oel="http://schemas.microsoft.com/office/2019/extlst" xmlns:r="http://schemas.openxmlformats.org/officeDocument/2006/relationships" xmlns:wp14="http://schemas.microsoft.com/office/word/2010/wordprocessingDrawing" xmlns:wp="http://schemas.openxmlformats.org/drawingml/2006/wordprocessingDrawing" xmlns:wpg="http://schemas.microsoft.com/office/word/2010/wordprocessingGroup" xmlns:wpi="http://schemas.microsoft.com/office/word/2010/wordprocessingInk" xmlns:wps="http://schemas.microsoft.com/office/word/2010/wordprocessingShape" xmlns:o="urn:schemas-microsoft-com:office:office" xmlns:v="urn:schemas-microsoft-com:vml" xmlns:w10="urn:schemas-microsoft-com:office:word" xmlns:w="http://schemas.openxmlformats.org/wordprocessingml/2006/main" xmlns:w14="http://schemas.microsoft.com/office/word/2010/wordml" xmlns:w15="http://schemas.microsoft.com/office/word/2012/wordml" xmlns:w16cex="http://schemas.microsoft.com/office/word/2018/wordml/cex" xmlns:w16cid="http://schemas.microsoft.com/office/word/2016/wordml/cid" xmlns:w16="http://schemas.microsoft.com/office/word/2018/wordml" xmlns:w16sdtdh="http://schemas.microsoft.com/office/word/2020/wordml/sdtdatahash" xmlns:w16sdtfl="http://schemas.microsoft.com/office/word/2024/wordml/sdtformatlock" xmlns:w16se="http://schemas.microsoft.com/office/word/2015/wordml/symex" xmlns:w16du="http://schemas.microsoft.com/office/word/2023/wordml/word16du" xmlns:wne="http://schemas.microsoft.com/office/word/2006/wordml" mc:Ignorable="w14 w15 w16se w16cid w16 w16cex w16sdtdh w16sdtfl w16du wp14">
+<w:hdr xmlns:wpc="http://schemas.microsoft.com/office/word/2010/wordprocessingCanvas" xmlns:cx="http://schemas.microsoft.com/office/drawing/2014/chartex" xmlns:cx1="http://schemas.microsoft.com/office/drawing/2015/9/8/chartex" xmlns:cx2="http://schemas.microsoft.com/office/drawing/2015/10/21/chartex" xmlns:cx3="http://schemas.microsoft.com/office/drawing/2016/5/9/chartex" xmlns:cx4="http://schemas.microsoft.com/office/drawing/2016/5/10/chartex" xmlns:cx5="http://schemas.microsoft.com/office/drawing/2016/5/11/chartex" xmlns:cx6="http://schemas.microsoft.com/office/drawing/2016/5/12/chartex" xmlns:cx7="http://schemas.microsoft.com/office/drawing/2016/5/13/chartex" xmlns:cx8="http://schemas.microsoft.com/office/drawing/2016/5/14/chartex" xmlns:mc="http://schemas.openxmlformats.org/markup-compatibility/2006" xmlns:aink="http://schemas.microsoft.com/office/drawing/2016/ink" xmlns:am3d="http://schemas.microsoft.com/office/drawing/2017/model3d" xmlns:o="urn:schemas-microsoft-com:office:office" xmlns:oel="http://schemas.microsoft.com/office/2019/extlst" xmlns:r="http://schemas.openxmlformats.org/officeDocument/2006/relationships" xmlns:m="http://schemas.openxmlformats.org/officeDocument/2006/math" xmlns:v="urn:schemas-microsoft-com:vml" xmlns:wp14="http://schemas.microsoft.com/office/word/2010/wordprocessingDrawing" xmlns:wp="http://schemas.openxmlformats.org/drawingml/2006/wordprocessingDrawing" xmlns:w10="urn:schemas-microsoft-com:office:word" xmlns:w="http://schemas.openxmlformats.org/wordprocessingml/2006/main" xmlns:w14="http://schemas.microsoft.com/office/word/2010/wordml" xmlns:w15="http://schemas.microsoft.com/office/word/2012/wordml" xmlns:w16cex="http://schemas.microsoft.com/office/word/2018/wordml/cex" xmlns:w16cid="http://schemas.microsoft.com/office/word/2016/wordml/cid" xmlns:w16="http://schemas.microsoft.com/office/word/2018/wordml" xmlns:w16du="http://schemas.microsoft.com/office/word/2023/wordml/word16du" xmlns:w16sdtdh="http://schemas.microsoft.com/office/word/2020/wordml/sdtdatahash" xmlns:w16sdtfl="http://schemas.microsoft.com/office/word/2024/wordml/sdtformatlock" xmlns:w16se="http://schemas.microsoft.com/office/word/2015/wordml/symex" xmlns:wpg="http://schemas.microsoft.com/office/word/2010/wordprocessingGroup" xmlns:wpi="http://schemas.microsoft.com/office/word/2010/wordprocessingInk" xmlns:wne="http://schemas.microsoft.com/office/word/2006/wordml" xmlns:wps="http://schemas.microsoft.com/office/word/2010/wordprocessingShape" mc:Ignorable="w14 w15 w16se w16cid w16 w16cex w16sdtdh w16sdtfl w16du wp14">
   <w:tbl>
     <w:tblPr>
       <w:tblW w:w="0" w:type="auto"/>
@@ -5624,31 +5638,31 @@
 </file>
 
 <file path=word/header2.xml><?xml version="1.0" encoding="utf-8"?>
-<w:hdr xmlns:wpc="http://schemas.microsoft.com/office/word/2010/wordprocessingCanvas" xmlns:cx="http://schemas.microsoft.com/office/drawing/2014/chartex" xmlns:cx1="http://schemas.microsoft.com/office/drawing/2015/9/8/chartex" xmlns:cx2="http://schemas.microsoft.com/office/drawing/2015/10/21/chartex" xmlns:cx3="http://schemas.microsoft.com/office/drawing/2016/5/9/chartex" xmlns:cx4="http://schemas.microsoft.com/office/drawing/2016/5/10/chartex" xmlns:cx5="http://schemas.microsoft.com/office/drawing/2016/5/11/chartex" xmlns:cx6="http://schemas.microsoft.com/office/drawing/2016/5/12/chartex" xmlns:cx7="http://schemas.microsoft.com/office/drawing/2016/5/13/chartex" xmlns:cx8="http://schemas.microsoft.com/office/drawing/2016/5/14/chartex" xmlns:mc="http://schemas.openxmlformats.org/markup-compatibility/2006" xmlns:m="http://schemas.openxmlformats.org/officeDocument/2006/math" xmlns:aink="http://schemas.microsoft.com/office/drawing/2016/ink" xmlns:am3d="http://schemas.microsoft.com/office/drawing/2017/model3d" xmlns:oel="http://schemas.microsoft.com/office/2019/extlst" xmlns:r="http://schemas.openxmlformats.org/officeDocument/2006/relationships" xmlns:wp14="http://schemas.microsoft.com/office/word/2010/wordprocessingDrawing" xmlns:wp="http://schemas.openxmlformats.org/drawingml/2006/wordprocessingDrawing" xmlns:wpg="http://schemas.microsoft.com/office/word/2010/wordprocessingGroup" xmlns:wpi="http://schemas.microsoft.com/office/word/2010/wordprocessingInk" xmlns:wps="http://schemas.microsoft.com/office/word/2010/wordprocessingShape" xmlns:o="urn:schemas-microsoft-com:office:office" xmlns:v="urn:schemas-microsoft-com:vml" xmlns:w10="urn:schemas-microsoft-com:office:word" xmlns:w="http://schemas.openxmlformats.org/wordprocessingml/2006/main" xmlns:w14="http://schemas.microsoft.com/office/word/2010/wordml" xmlns:w15="http://schemas.microsoft.com/office/word/2012/wordml" xmlns:w16cex="http://schemas.microsoft.com/office/word/2018/wordml/cex" xmlns:w16cid="http://schemas.microsoft.com/office/word/2016/wordml/cid" xmlns:w16="http://schemas.microsoft.com/office/word/2018/wordml" xmlns:w16sdtdh="http://schemas.microsoft.com/office/word/2020/wordml/sdtdatahash" xmlns:w16sdtfl="http://schemas.microsoft.com/office/word/2024/wordml/sdtformatlock" xmlns:w16se="http://schemas.microsoft.com/office/word/2015/wordml/symex" xmlns:w16du="http://schemas.microsoft.com/office/word/2023/wordml/word16du" xmlns:wne="http://schemas.microsoft.com/office/word/2006/wordml" mc:Ignorable="w14 w15 w16se w16cid w16 w16cex w16sdtdh w16sdtfl w16du wp14">
+<w:hdr xmlns:wpc="http://schemas.microsoft.com/office/word/2010/wordprocessingCanvas" xmlns:cx="http://schemas.microsoft.com/office/drawing/2014/chartex" xmlns:cx1="http://schemas.microsoft.com/office/drawing/2015/9/8/chartex" xmlns:cx2="http://schemas.microsoft.com/office/drawing/2015/10/21/chartex" xmlns:cx3="http://schemas.microsoft.com/office/drawing/2016/5/9/chartex" xmlns:cx4="http://schemas.microsoft.com/office/drawing/2016/5/10/chartex" xmlns:cx5="http://schemas.microsoft.com/office/drawing/2016/5/11/chartex" xmlns:cx6="http://schemas.microsoft.com/office/drawing/2016/5/12/chartex" xmlns:cx7="http://schemas.microsoft.com/office/drawing/2016/5/13/chartex" xmlns:cx8="http://schemas.microsoft.com/office/drawing/2016/5/14/chartex" xmlns:mc="http://schemas.openxmlformats.org/markup-compatibility/2006" xmlns:aink="http://schemas.microsoft.com/office/drawing/2016/ink" xmlns:am3d="http://schemas.microsoft.com/office/drawing/2017/model3d" xmlns:o="urn:schemas-microsoft-com:office:office" xmlns:oel="http://schemas.microsoft.com/office/2019/extlst" xmlns:r="http://schemas.openxmlformats.org/officeDocument/2006/relationships" xmlns:m="http://schemas.openxmlformats.org/officeDocument/2006/math" xmlns:v="urn:schemas-microsoft-com:vml" xmlns:wp14="http://schemas.microsoft.com/office/word/2010/wordprocessingDrawing" xmlns:wp="http://schemas.openxmlformats.org/drawingml/2006/wordprocessingDrawing" xmlns:w10="urn:schemas-microsoft-com:office:word" xmlns:w="http://schemas.openxmlformats.org/wordprocessingml/2006/main" xmlns:w14="http://schemas.microsoft.com/office/word/2010/wordml" xmlns:w15="http://schemas.microsoft.com/office/word/2012/wordml" xmlns:w16cex="http://schemas.microsoft.com/office/word/2018/wordml/cex" xmlns:w16cid="http://schemas.microsoft.com/office/word/2016/wordml/cid" xmlns:w16="http://schemas.microsoft.com/office/word/2018/wordml" xmlns:w16du="http://schemas.microsoft.com/office/word/2023/wordml/word16du" xmlns:w16sdtdh="http://schemas.microsoft.com/office/word/2020/wordml/sdtdatahash" xmlns:w16sdtfl="http://schemas.microsoft.com/office/word/2024/wordml/sdtformatlock" xmlns:w16se="http://schemas.microsoft.com/office/word/2015/wordml/symex" xmlns:wpg="http://schemas.microsoft.com/office/word/2010/wordprocessingGroup" xmlns:wpi="http://schemas.microsoft.com/office/word/2010/wordprocessingInk" xmlns:wne="http://schemas.microsoft.com/office/word/2006/wordml" xmlns:wps="http://schemas.microsoft.com/office/word/2010/wordprocessingShape" mc:Ignorable="w14 w15 w16se w16cid w16 w16cex w16sdtdh w16sdtfl w16du wp14">
   <w:p/>
 </w:hdr>
 </file>
 
 <file path=word/header3.xml><?xml version="1.0" encoding="utf-8"?>
-<w:hdr xmlns:wpc="http://schemas.microsoft.com/office/word/2010/wordprocessingCanvas" xmlns:cx="http://schemas.microsoft.com/office/drawing/2014/chartex" xmlns:cx1="http://schemas.microsoft.com/office/drawing/2015/9/8/chartex" xmlns:cx2="http://schemas.microsoft.com/office/drawing/2015/10/21/chartex" xmlns:cx3="http://schemas.microsoft.com/office/drawing/2016/5/9/chartex" xmlns:cx4="http://schemas.microsoft.com/office/drawing/2016/5/10/chartex" xmlns:cx5="http://schemas.microsoft.com/office/drawing/2016/5/11/chartex" xmlns:cx6="http://schemas.microsoft.com/office/drawing/2016/5/12/chartex" xmlns:cx7="http://schemas.microsoft.com/office/drawing/2016/5/13/chartex" xmlns:cx8="http://schemas.microsoft.com/office/drawing/2016/5/14/chartex" xmlns:mc="http://schemas.openxmlformats.org/markup-compatibility/2006" xmlns:m="http://schemas.openxmlformats.org/officeDocument/2006/math" xmlns:aink="http://schemas.microsoft.com/office/drawing/2016/ink" xmlns:am3d="http://schemas.microsoft.com/office/drawing/2017/model3d" xmlns:oel="http://schemas.microsoft.com/office/2019/extlst" xmlns:r="http://schemas.openxmlformats.org/officeDocument/2006/relationships" xmlns:wp14="http://schemas.microsoft.com/office/word/2010/wordprocessingDrawing" xmlns:wp="http://schemas.openxmlformats.org/drawingml/2006/wordprocessingDrawing" xmlns:wpg="http://schemas.microsoft.com/office/word/2010/wordprocessingGroup" xmlns:wpi="http://schemas.microsoft.com/office/word/2010/wordprocessingInk" xmlns:wps="http://schemas.microsoft.com/office/word/2010/wordprocessingShape" xmlns:o="urn:schemas-microsoft-com:office:office" xmlns:v="urn:schemas-microsoft-com:vml" xmlns:w10="urn:schemas-microsoft-com:office:word" xmlns:w="http://schemas.openxmlformats.org/wordprocessingml/2006/main" xmlns:w14="http://schemas.microsoft.com/office/word/2010/wordml" xmlns:w15="http://schemas.microsoft.com/office/word/2012/wordml" xmlns:w16cex="http://schemas.microsoft.com/office/word/2018/wordml/cex" xmlns:w16cid="http://schemas.microsoft.com/office/word/2016/wordml/cid" xmlns:w16="http://schemas.microsoft.com/office/word/2018/wordml" xmlns:w16sdtdh="http://schemas.microsoft.com/office/word/2020/wordml/sdtdatahash" xmlns:w16sdtfl="http://schemas.microsoft.com/office/word/2024/wordml/sdtformatlock" xmlns:w16se="http://schemas.microsoft.com/office/word/2015/wordml/symex" xmlns:w16du="http://schemas.microsoft.com/office/word/2023/wordml/word16du" xmlns:wne="http://schemas.microsoft.com/office/word/2006/wordml" mc:Ignorable="w14 w15 w16se w16cid w16 w16cex w16sdtdh w16sdtfl w16du wp14">
+<w:hdr xmlns:wpc="http://schemas.microsoft.com/office/word/2010/wordprocessingCanvas" xmlns:cx="http://schemas.microsoft.com/office/drawing/2014/chartex" xmlns:cx1="http://schemas.microsoft.com/office/drawing/2015/9/8/chartex" xmlns:cx2="http://schemas.microsoft.com/office/drawing/2015/10/21/chartex" xmlns:cx3="http://schemas.microsoft.com/office/drawing/2016/5/9/chartex" xmlns:cx4="http://schemas.microsoft.com/office/drawing/2016/5/10/chartex" xmlns:cx5="http://schemas.microsoft.com/office/drawing/2016/5/11/chartex" xmlns:cx6="http://schemas.microsoft.com/office/drawing/2016/5/12/chartex" xmlns:cx7="http://schemas.microsoft.com/office/drawing/2016/5/13/chartex" xmlns:cx8="http://schemas.microsoft.com/office/drawing/2016/5/14/chartex" xmlns:mc="http://schemas.openxmlformats.org/markup-compatibility/2006" xmlns:aink="http://schemas.microsoft.com/office/drawing/2016/ink" xmlns:am3d="http://schemas.microsoft.com/office/drawing/2017/model3d" xmlns:o="urn:schemas-microsoft-com:office:office" xmlns:oel="http://schemas.microsoft.com/office/2019/extlst" xmlns:r="http://schemas.openxmlformats.org/officeDocument/2006/relationships" xmlns:m="http://schemas.openxmlformats.org/officeDocument/2006/math" xmlns:v="urn:schemas-microsoft-com:vml" xmlns:wp14="http://schemas.microsoft.com/office/word/2010/wordprocessingDrawing" xmlns:wp="http://schemas.openxmlformats.org/drawingml/2006/wordprocessingDrawing" xmlns:w10="urn:schemas-microsoft-com:office:word" xmlns:w="http://schemas.openxmlformats.org/wordprocessingml/2006/main" xmlns:w14="http://schemas.microsoft.com/office/word/2010/wordml" xmlns:w15="http://schemas.microsoft.com/office/word/2012/wordml" xmlns:w16cex="http://schemas.microsoft.com/office/word/2018/wordml/cex" xmlns:w16cid="http://schemas.microsoft.com/office/word/2016/wordml/cid" xmlns:w16="http://schemas.microsoft.com/office/word/2018/wordml" xmlns:w16du="http://schemas.microsoft.com/office/word/2023/wordml/word16du" xmlns:w16sdtdh="http://schemas.microsoft.com/office/word/2020/wordml/sdtdatahash" xmlns:w16sdtfl="http://schemas.microsoft.com/office/word/2024/wordml/sdtformatlock" xmlns:w16se="http://schemas.microsoft.com/office/word/2015/wordml/symex" xmlns:wpg="http://schemas.microsoft.com/office/word/2010/wordprocessingGroup" xmlns:wpi="http://schemas.microsoft.com/office/word/2010/wordprocessingInk" xmlns:wne="http://schemas.microsoft.com/office/word/2006/wordml" xmlns:wps="http://schemas.microsoft.com/office/word/2010/wordprocessingShape" mc:Ignorable="w14 w15 w16se w16cid w16 w16cex w16sdtdh w16sdtfl w16du wp14">
   <w:p/>
 </w:hdr>
 </file>
 
 <file path=word/header4.xml><?xml version="1.0" encoding="utf-8"?>
-<w:hdr xmlns:wpc="http://schemas.microsoft.com/office/word/2010/wordprocessingCanvas" xmlns:cx="http://schemas.microsoft.com/office/drawing/2014/chartex" xmlns:cx1="http://schemas.microsoft.com/office/drawing/2015/9/8/chartex" xmlns:cx2="http://schemas.microsoft.com/office/drawing/2015/10/21/chartex" xmlns:cx3="http://schemas.microsoft.com/office/drawing/2016/5/9/chartex" xmlns:cx4="http://schemas.microsoft.com/office/drawing/2016/5/10/chartex" xmlns:cx5="http://schemas.microsoft.com/office/drawing/2016/5/11/chartex" xmlns:cx6="http://schemas.microsoft.com/office/drawing/2016/5/12/chartex" xmlns:cx7="http://schemas.microsoft.com/office/drawing/2016/5/13/chartex" xmlns:cx8="http://schemas.microsoft.com/office/drawing/2016/5/14/chartex" xmlns:mc="http://schemas.openxmlformats.org/markup-compatibility/2006" xmlns:m="http://schemas.openxmlformats.org/officeDocument/2006/math" xmlns:aink="http://schemas.microsoft.com/office/drawing/2016/ink" xmlns:am3d="http://schemas.microsoft.com/office/drawing/2017/model3d" xmlns:oel="http://schemas.microsoft.com/office/2019/extlst" xmlns:r="http://schemas.openxmlformats.org/officeDocument/2006/relationships" xmlns:wp14="http://schemas.microsoft.com/office/word/2010/wordprocessingDrawing" xmlns:wp="http://schemas.openxmlformats.org/drawingml/2006/wordprocessingDrawing" xmlns:wpg="http://schemas.microsoft.com/office/word/2010/wordprocessingGroup" xmlns:wpi="http://schemas.microsoft.com/office/word/2010/wordprocessingInk" xmlns:wps="http://schemas.microsoft.com/office/word/2010/wordprocessingShape" xmlns:o="urn:schemas-microsoft-com:office:office" xmlns:v="urn:schemas-microsoft-com:vml" xmlns:w10="urn:schemas-microsoft-com:office:word" xmlns:w="http://schemas.openxmlformats.org/wordprocessingml/2006/main" xmlns:w14="http://schemas.microsoft.com/office/word/2010/wordml" xmlns:w15="http://schemas.microsoft.com/office/word/2012/wordml" xmlns:w16cex="http://schemas.microsoft.com/office/word/2018/wordml/cex" xmlns:w16cid="http://schemas.microsoft.com/office/word/2016/wordml/cid" xmlns:w16="http://schemas.microsoft.com/office/word/2018/wordml" xmlns:w16sdtdh="http://schemas.microsoft.com/office/word/2020/wordml/sdtdatahash" xmlns:w16sdtfl="http://schemas.microsoft.com/office/word/2024/wordml/sdtformatlock" xmlns:w16se="http://schemas.microsoft.com/office/word/2015/wordml/symex" xmlns:w16du="http://schemas.microsoft.com/office/word/2023/wordml/word16du" xmlns:wne="http://schemas.microsoft.com/office/word/2006/wordml" mc:Ignorable="w14 w15 w16se w16cid w16 w16cex w16sdtdh w16sdtfl w16du wp14">
+<w:hdr xmlns:wpc="http://schemas.microsoft.com/office/word/2010/wordprocessingCanvas" xmlns:cx="http://schemas.microsoft.com/office/drawing/2014/chartex" xmlns:cx1="http://schemas.microsoft.com/office/drawing/2015/9/8/chartex" xmlns:cx2="http://schemas.microsoft.com/office/drawing/2015/10/21/chartex" xmlns:cx3="http://schemas.microsoft.com/office/drawing/2016/5/9/chartex" xmlns:cx4="http://schemas.microsoft.com/office/drawing/2016/5/10/chartex" xmlns:cx5="http://schemas.microsoft.com/office/drawing/2016/5/11/chartex" xmlns:cx6="http://schemas.microsoft.com/office/drawing/2016/5/12/chartex" xmlns:cx7="http://schemas.microsoft.com/office/drawing/2016/5/13/chartex" xmlns:cx8="http://schemas.microsoft.com/office/drawing/2016/5/14/chartex" xmlns:mc="http://schemas.openxmlformats.org/markup-compatibility/2006" xmlns:aink="http://schemas.microsoft.com/office/drawing/2016/ink" xmlns:am3d="http://schemas.microsoft.com/office/drawing/2017/model3d" xmlns:o="urn:schemas-microsoft-com:office:office" xmlns:oel="http://schemas.microsoft.com/office/2019/extlst" xmlns:r="http://schemas.openxmlformats.org/officeDocument/2006/relationships" xmlns:m="http://schemas.openxmlformats.org/officeDocument/2006/math" xmlns:v="urn:schemas-microsoft-com:vml" xmlns:wp14="http://schemas.microsoft.com/office/word/2010/wordprocessingDrawing" xmlns:wp="http://schemas.openxmlformats.org/drawingml/2006/wordprocessingDrawing" xmlns:w10="urn:schemas-microsoft-com:office:word" xmlns:w="http://schemas.openxmlformats.org/wordprocessingml/2006/main" xmlns:w14="http://schemas.microsoft.com/office/word/2010/wordml" xmlns:w15="http://schemas.microsoft.com/office/word/2012/wordml" xmlns:w16cex="http://schemas.microsoft.com/office/word/2018/wordml/cex" xmlns:w16cid="http://schemas.microsoft.com/office/word/2016/wordml/cid" xmlns:w16="http://schemas.microsoft.com/office/word/2018/wordml" xmlns:w16du="http://schemas.microsoft.com/office/word/2023/wordml/word16du" xmlns:w16sdtdh="http://schemas.microsoft.com/office/word/2020/wordml/sdtdatahash" xmlns:w16sdtfl="http://schemas.microsoft.com/office/word/2024/wordml/sdtformatlock" xmlns:w16se="http://schemas.microsoft.com/office/word/2015/wordml/symex" xmlns:wpg="http://schemas.microsoft.com/office/word/2010/wordprocessingGroup" xmlns:wpi="http://schemas.microsoft.com/office/word/2010/wordprocessingInk" xmlns:wne="http://schemas.microsoft.com/office/word/2006/wordml" xmlns:wps="http://schemas.microsoft.com/office/word/2010/wordprocessingShape" mc:Ignorable="w14 w15 w16se w16cid w16 w16cex w16sdtdh w16sdtfl w16du wp14">
   <w:p/>
 </w:hdr>
 </file>
 
 <file path=word/header5.xml><?xml version="1.0" encoding="utf-8"?>
-<w:hdr xmlns:wpc="http://schemas.microsoft.com/office/word/2010/wordprocessingCanvas" xmlns:cx="http://schemas.microsoft.com/office/drawing/2014/chartex" xmlns:cx1="http://schemas.microsoft.com/office/drawing/2015/9/8/chartex" xmlns:cx2="http://schemas.microsoft.com/office/drawing/2015/10/21/chartex" xmlns:cx3="http://schemas.microsoft.com/office/drawing/2016/5/9/chartex" xmlns:cx4="http://schemas.microsoft.com/office/drawing/2016/5/10/chartex" xmlns:cx5="http://schemas.microsoft.com/office/drawing/2016/5/11/chartex" xmlns:cx6="http://schemas.microsoft.com/office/drawing/2016/5/12/chartex" xmlns:cx7="http://schemas.microsoft.com/office/drawing/2016/5/13/chartex" xmlns:cx8="http://schemas.microsoft.com/office/drawing/2016/5/14/chartex" xmlns:mc="http://schemas.openxmlformats.org/markup-compatibility/2006" xmlns:m="http://schemas.openxmlformats.org/officeDocument/2006/math" xmlns:aink="http://schemas.microsoft.com/office/drawing/2016/ink" xmlns:am3d="http://schemas.microsoft.com/office/drawing/2017/model3d" xmlns:oel="http://schemas.microsoft.com/office/2019/extlst" xmlns:r="http://schemas.openxmlformats.org/officeDocument/2006/relationships" xmlns:wp14="http://schemas.microsoft.com/office/word/2010/wordprocessingDrawing" xmlns:wp="http://schemas.openxmlformats.org/drawingml/2006/wordprocessingDrawing" xmlns:wpg="http://schemas.microsoft.com/office/word/2010/wordprocessingGroup" xmlns:wpi="http://schemas.microsoft.com/office/word/2010/wordprocessingInk" xmlns:wps="http://schemas.microsoft.com/office/word/2010/wordprocessingShape" xmlns:o="urn:schemas-microsoft-com:office:office" xmlns:v="urn:schemas-microsoft-com:vml" xmlns:w10="urn:schemas-microsoft-com:office:word" xmlns:w="http://schemas.openxmlformats.org/wordprocessingml/2006/main" xmlns:w14="http://schemas.microsoft.com/office/word/2010/wordml" xmlns:w15="http://schemas.microsoft.com/office/word/2012/wordml" xmlns:w16cex="http://schemas.microsoft.com/office/word/2018/wordml/cex" xmlns:w16cid="http://schemas.microsoft.com/office/word/2016/wordml/cid" xmlns:w16="http://schemas.microsoft.com/office/word/2018/wordml" xmlns:w16sdtdh="http://schemas.microsoft.com/office/word/2020/wordml/sdtdatahash" xmlns:w16sdtfl="http://schemas.microsoft.com/office/word/2024/wordml/sdtformatlock" xmlns:w16se="http://schemas.microsoft.com/office/word/2015/wordml/symex" xmlns:w16du="http://schemas.microsoft.com/office/word/2023/wordml/word16du" xmlns:wne="http://schemas.microsoft.com/office/word/2006/wordml" mc:Ignorable="w14 w15 w16se w16cid w16 w16cex w16sdtdh w16sdtfl w16du wp14">
+<w:hdr xmlns:wpc="http://schemas.microsoft.com/office/word/2010/wordprocessingCanvas" xmlns:cx="http://schemas.microsoft.com/office/drawing/2014/chartex" xmlns:cx1="http://schemas.microsoft.com/office/drawing/2015/9/8/chartex" xmlns:cx2="http://schemas.microsoft.com/office/drawing/2015/10/21/chartex" xmlns:cx3="http://schemas.microsoft.com/office/drawing/2016/5/9/chartex" xmlns:cx4="http://schemas.microsoft.com/office/drawing/2016/5/10/chartex" xmlns:cx5="http://schemas.microsoft.com/office/drawing/2016/5/11/chartex" xmlns:cx6="http://schemas.microsoft.com/office/drawing/2016/5/12/chartex" xmlns:cx7="http://schemas.microsoft.com/office/drawing/2016/5/13/chartex" xmlns:cx8="http://schemas.microsoft.com/office/drawing/2016/5/14/chartex" xmlns:mc="http://schemas.openxmlformats.org/markup-compatibility/2006" xmlns:aink="http://schemas.microsoft.com/office/drawing/2016/ink" xmlns:am3d="http://schemas.microsoft.com/office/drawing/2017/model3d" xmlns:o="urn:schemas-microsoft-com:office:office" xmlns:oel="http://schemas.microsoft.com/office/2019/extlst" xmlns:r="http://schemas.openxmlformats.org/officeDocument/2006/relationships" xmlns:m="http://schemas.openxmlformats.org/officeDocument/2006/math" xmlns:v="urn:schemas-microsoft-com:vml" xmlns:wp14="http://schemas.microsoft.com/office/word/2010/wordprocessingDrawing" xmlns:wp="http://schemas.openxmlformats.org/drawingml/2006/wordprocessingDrawing" xmlns:w10="urn:schemas-microsoft-com:office:word" xmlns:w="http://schemas.openxmlformats.org/wordprocessingml/2006/main" xmlns:w14="http://schemas.microsoft.com/office/word/2010/wordml" xmlns:w15="http://schemas.microsoft.com/office/word/2012/wordml" xmlns:w16cex="http://schemas.microsoft.com/office/word/2018/wordml/cex" xmlns:w16cid="http://schemas.microsoft.com/office/word/2016/wordml/cid" xmlns:w16="http://schemas.microsoft.com/office/word/2018/wordml" xmlns:w16du="http://schemas.microsoft.com/office/word/2023/wordml/word16du" xmlns:w16sdtdh="http://schemas.microsoft.com/office/word/2020/wordml/sdtdatahash" xmlns:w16sdtfl="http://schemas.microsoft.com/office/word/2024/wordml/sdtformatlock" xmlns:w16se="http://schemas.microsoft.com/office/word/2015/wordml/symex" xmlns:wpg="http://schemas.microsoft.com/office/word/2010/wordprocessingGroup" xmlns:wpi="http://schemas.microsoft.com/office/word/2010/wordprocessingInk" xmlns:wne="http://schemas.microsoft.com/office/word/2006/wordml" xmlns:wps="http://schemas.microsoft.com/office/word/2010/wordprocessingShape" mc:Ignorable="w14 w15 w16se w16cid w16 w16cex w16sdtdh w16sdtfl w16du wp14">
   <w:p/>
 </w:hdr>
 </file>
 
 <file path=word/numbering.xml><?xml version="1.0" encoding="utf-8"?>
-<w:numbering xmlns:wpc="http://schemas.microsoft.com/office/word/2010/wordprocessingCanvas" xmlns:cx="http://schemas.microsoft.com/office/drawing/2014/chartex" xmlns:cx1="http://schemas.microsoft.com/office/drawing/2015/9/8/chartex" xmlns:cx2="http://schemas.microsoft.com/office/drawing/2015/10/21/chartex" xmlns:cx3="http://schemas.microsoft.com/office/drawing/2016/5/9/chartex" xmlns:cx4="http://schemas.microsoft.com/office/drawing/2016/5/10/chartex" xmlns:cx5="http://schemas.microsoft.com/office/drawing/2016/5/11/chartex" xmlns:cx6="http://schemas.microsoft.com/office/drawing/2016/5/12/chartex" xmlns:cx7="http://schemas.microsoft.com/office/drawing/2016/5/13/chartex" xmlns:cx8="http://schemas.microsoft.com/office/drawing/2016/5/14/chartex" xmlns:mc="http://schemas.openxmlformats.org/markup-compatibility/2006" xmlns:m="http://schemas.openxmlformats.org/officeDocument/2006/math" xmlns:aink="http://schemas.microsoft.com/office/drawing/2016/ink" xmlns:am3d="http://schemas.microsoft.com/office/drawing/2017/model3d" xmlns:oel="http://schemas.microsoft.com/office/2019/extlst" xmlns:r="http://schemas.openxmlformats.org/officeDocument/2006/relationships" xmlns:wp14="http://schemas.microsoft.com/office/word/2010/wordprocessingDrawing" xmlns:wp="http://schemas.openxmlformats.org/drawingml/2006/wordprocessingDrawing" xmlns:wpg="http://schemas.microsoft.com/office/word/2010/wordprocessingGroup" xmlns:wpi="http://schemas.microsoft.com/office/word/2010/wordprocessingInk" xmlns:wps="http://schemas.microsoft.com/office/word/2010/wordprocessingShape" xmlns:o="urn:schemas-microsoft-com:office:office" xmlns:v="urn:schemas-microsoft-com:vml" xmlns:w10="urn:schemas-microsoft-com:office:word" xmlns:w="http://schemas.openxmlformats.org/wordprocessingml/2006/main" xmlns:w14="http://schemas.microsoft.com/office/word/2010/wordml" xmlns:w15="http://schemas.microsoft.com/office/word/2012/wordml" xmlns:w16cex="http://schemas.microsoft.com/office/word/2018/wordml/cex" xmlns:w16cid="http://schemas.microsoft.com/office/word/2016/wordml/cid" xmlns:w16="http://schemas.microsoft.com/office/word/2018/wordml" xmlns:w16sdtdh="http://schemas.microsoft.com/office/word/2020/wordml/sdtdatahash" xmlns:w16sdtfl="http://schemas.microsoft.com/office/word/2024/wordml/sdtformatlock" xmlns:w16se="http://schemas.microsoft.com/office/word/2015/wordml/symex" xmlns:w16du="http://schemas.microsoft.com/office/word/2023/wordml/word16du" xmlns:wne="http://schemas.microsoft.com/office/word/2006/wordml" mc:Ignorable="w14 w15 w16se w16cid w16 w16cex w16sdtdh w16sdtfl w16du wp14">
+<w:numbering xmlns:wpc="http://schemas.microsoft.com/office/word/2010/wordprocessingCanvas" xmlns:cx="http://schemas.microsoft.com/office/drawing/2014/chartex" xmlns:cx1="http://schemas.microsoft.com/office/drawing/2015/9/8/chartex" xmlns:cx2="http://schemas.microsoft.com/office/drawing/2015/10/21/chartex" xmlns:cx3="http://schemas.microsoft.com/office/drawing/2016/5/9/chartex" xmlns:cx4="http://schemas.microsoft.com/office/drawing/2016/5/10/chartex" xmlns:cx5="http://schemas.microsoft.com/office/drawing/2016/5/11/chartex" xmlns:cx6="http://schemas.microsoft.com/office/drawing/2016/5/12/chartex" xmlns:cx7="http://schemas.microsoft.com/office/drawing/2016/5/13/chartex" xmlns:cx8="http://schemas.microsoft.com/office/drawing/2016/5/14/chartex" xmlns:mc="http://schemas.openxmlformats.org/markup-compatibility/2006" xmlns:aink="http://schemas.microsoft.com/office/drawing/2016/ink" xmlns:am3d="http://schemas.microsoft.com/office/drawing/2017/model3d" xmlns:o="urn:schemas-microsoft-com:office:office" xmlns:oel="http://schemas.microsoft.com/office/2019/extlst" xmlns:r="http://schemas.openxmlformats.org/officeDocument/2006/relationships" xmlns:m="http://schemas.openxmlformats.org/officeDocument/2006/math" xmlns:v="urn:schemas-microsoft-com:vml" xmlns:wp14="http://schemas.microsoft.com/office/word/2010/wordprocessingDrawing" xmlns:wp="http://schemas.openxmlformats.org/drawingml/2006/wordprocessingDrawing" xmlns:w10="urn:schemas-microsoft-com:office:word" xmlns:w="http://schemas.openxmlformats.org/wordprocessingml/2006/main" xmlns:w14="http://schemas.microsoft.com/office/word/2010/wordml" xmlns:w15="http://schemas.microsoft.com/office/word/2012/wordml" xmlns:w16cex="http://schemas.microsoft.com/office/word/2018/wordml/cex" xmlns:w16cid="http://schemas.microsoft.com/office/word/2016/wordml/cid" xmlns:w16="http://schemas.microsoft.com/office/word/2018/wordml" xmlns:w16du="http://schemas.microsoft.com/office/word/2023/wordml/word16du" xmlns:w16sdtdh="http://schemas.microsoft.com/office/word/2020/wordml/sdtdatahash" xmlns:w16sdtfl="http://schemas.microsoft.com/office/word/2024/wordml/sdtformatlock" xmlns:w16se="http://schemas.microsoft.com/office/word/2015/wordml/symex" xmlns:wpg="http://schemas.microsoft.com/office/word/2010/wordprocessingGroup" xmlns:wpi="http://schemas.microsoft.com/office/word/2010/wordprocessingInk" xmlns:wne="http://schemas.microsoft.com/office/word/2006/wordml" xmlns:wps="http://schemas.microsoft.com/office/word/2010/wordprocessingShape" mc:Ignorable="w14 w15 w16se w16cid w16 w16cex w16sdtdh w16sdtfl w16du wp14">
   <w:numPicBullet w:numPicBulletId="0">
     <w:pict>
       <v:shapetype id="_x0000_t75" coordsize="21600,21600" o:spt="75" o:preferrelative="t" path="m@4@5l@4@11@9@11@9@5xe" filled="f" stroked="f">
@@ -5670,7 +5684,7 @@
         <v:path o:extrusionok="f" gradientshapeok="t" o:connecttype="rect"/>
         <o:lock v:ext="edit" aspectratio="t"/>
       </v:shapetype>
-      <v:shape id="_x0000_i1025" type="#_x0000_t75" style="width:320.65pt;height:249.9pt" o:bullet="t" filled="t">
+      <v:shape id="_x0000_i1025" type="#_x0000_t75" style="width:321pt;height:249.75pt" o:bullet="t" filled="t">
         <v:fill color2="black"/>
         <v:imagedata r:id="rId1" o:title=""/>
       </v:shape>
@@ -8164,7 +8178,7 @@
 </file>
 
 <file path=word/styles.xml><?xml version="1.0" encoding="utf-8"?>
-<w:styles xmlns:mc="http://schemas.openxmlformats.org/markup-compatibility/2006" xmlns:r="http://schemas.openxmlformats.org/officeDocument/2006/relationships" xmlns:w="http://schemas.openxmlformats.org/wordprocessingml/2006/main" xmlns:w14="http://schemas.microsoft.com/office/word/2010/wordml" xmlns:w15="http://schemas.microsoft.com/office/word/2012/wordml" xmlns:w16cex="http://schemas.microsoft.com/office/word/2018/wordml/cex" xmlns:w16cid="http://schemas.microsoft.com/office/word/2016/wordml/cid" xmlns:w16="http://schemas.microsoft.com/office/word/2018/wordml" xmlns:w16sdtdh="http://schemas.microsoft.com/office/word/2020/wordml/sdtdatahash" xmlns:w16sdtfl="http://schemas.microsoft.com/office/word/2024/wordml/sdtformatlock" xmlns:w16se="http://schemas.microsoft.com/office/word/2015/wordml/symex" xmlns:w16du="http://schemas.microsoft.com/office/word/2023/wordml/word16du" mc:Ignorable="w14 w15 w16se w16cid w16 w16cex w16sdtdh w16sdtfl w16du">
+<w:styles xmlns:mc="http://schemas.openxmlformats.org/markup-compatibility/2006" xmlns:r="http://schemas.openxmlformats.org/officeDocument/2006/relationships" xmlns:w="http://schemas.openxmlformats.org/wordprocessingml/2006/main" xmlns:w14="http://schemas.microsoft.com/office/word/2010/wordml" xmlns:w15="http://schemas.microsoft.com/office/word/2012/wordml" xmlns:w16cex="http://schemas.microsoft.com/office/word/2018/wordml/cex" xmlns:w16cid="http://schemas.microsoft.com/office/word/2016/wordml/cid" xmlns:w16="http://schemas.microsoft.com/office/word/2018/wordml" xmlns:w16du="http://schemas.microsoft.com/office/word/2023/wordml/word16du" xmlns:w16sdtdh="http://schemas.microsoft.com/office/word/2020/wordml/sdtdatahash" xmlns:w16sdtfl="http://schemas.microsoft.com/office/word/2024/wordml/sdtformatlock" xmlns:w16se="http://schemas.microsoft.com/office/word/2015/wordml/symex" mc:Ignorable="w14 w15 w16se w16cid w16 w16cex w16sdtdh w16sdtfl w16du">
   <w:docDefaults>
     <w:rPrDefault>
       <w:rPr>

</xml_diff>

<commit_message>
Aggiunta identificativi per i requisiti funzionali e non funzionali e aggiunta del System Delivery Document con relativa data di consegna a Deliverables & Deadlines
</commit_message>
<xml_diff>
--- a/Deliverables/ProblemStatement_GGEyewear.docx
+++ b/Deliverables/ProblemStatement_GGEyewear.docx
@@ -180,7 +180,7 @@
           <w:sz w:val="36"/>
           <w:lang w:val="en-US"/>
         </w:rPr>
-        <w:t>6</w:t>
+        <w:t>7</w:t>
       </w:r>
       <w:r>
         <w:rPr>
@@ -1830,6 +1830,129 @@
           </w:p>
         </w:tc>
       </w:tr>
+      <w:tr>
+        <w:trPr>
+          <w:trHeight w:val="230"/>
+        </w:trPr>
+        <w:tc>
+          <w:tcPr>
+            <w:tcW w:w="1927" w:type="dxa"/>
+            <w:tcBorders>
+              <w:top w:val="single" w:sz="4" w:space="0" w:color="auto"/>
+              <w:left w:val="single" w:sz="4" w:space="0" w:color="auto"/>
+              <w:bottom w:val="single" w:sz="4" w:space="0" w:color="auto"/>
+              <w:right w:val="single" w:sz="4" w:space="0" w:color="auto"/>
+            </w:tcBorders>
+          </w:tcPr>
+          <w:p>
+            <w:pPr>
+              <w:pStyle w:val="Contenutotabella"/>
+              <w:rPr>
+                <w:sz w:val="20"/>
+              </w:rPr>
+            </w:pPr>
+            <w:r>
+              <w:rPr>
+                <w:sz w:val="20"/>
+              </w:rPr>
+              <w:t>14/10/2026</w:t>
+            </w:r>
+          </w:p>
+        </w:tc>
+        <w:tc>
+          <w:tcPr>
+            <w:tcW w:w="964" w:type="dxa"/>
+            <w:tcBorders>
+              <w:top w:val="single" w:sz="4" w:space="0" w:color="auto"/>
+              <w:left w:val="single" w:sz="4" w:space="0" w:color="auto"/>
+              <w:bottom w:val="single" w:sz="4" w:space="0" w:color="auto"/>
+              <w:right w:val="single" w:sz="4" w:space="0" w:color="auto"/>
+            </w:tcBorders>
+          </w:tcPr>
+          <w:p>
+            <w:pPr>
+              <w:pStyle w:val="Contenutotabella"/>
+              <w:rPr>
+                <w:sz w:val="20"/>
+              </w:rPr>
+            </w:pPr>
+            <w:r>
+              <w:rPr>
+                <w:sz w:val="20"/>
+              </w:rPr>
+              <w:t>1.7</w:t>
+            </w:r>
+          </w:p>
+        </w:tc>
+        <w:tc>
+          <w:tcPr>
+            <w:tcW w:w="4336" w:type="dxa"/>
+            <w:tcBorders>
+              <w:top w:val="single" w:sz="4" w:space="0" w:color="auto"/>
+              <w:left w:val="single" w:sz="4" w:space="0" w:color="auto"/>
+              <w:bottom w:val="single" w:sz="4" w:space="0" w:color="auto"/>
+              <w:right w:val="single" w:sz="4" w:space="0" w:color="auto"/>
+            </w:tcBorders>
+          </w:tcPr>
+          <w:p>
+            <w:pPr>
+              <w:pStyle w:val="Contenutotabella"/>
+              <w:rPr>
+                <w:sz w:val="20"/>
+              </w:rPr>
+            </w:pPr>
+            <w:r>
+              <w:rPr>
+                <w:sz w:val="20"/>
+              </w:rPr>
+              <w:t>Aggiunt</w:t>
+            </w:r>
+            <w:r>
+              <w:rPr>
+                <w:sz w:val="20"/>
+              </w:rPr>
+              <w:t xml:space="preserve">a degli identificativi dei requisiti funzionali e non funzionali e aggiunta del </w:t>
+            </w:r>
+            <w:r>
+              <w:rPr>
+                <w:sz w:val="20"/>
+              </w:rPr>
+              <w:t>System Delivery Document</w:t>
+            </w:r>
+            <w:r>
+              <w:rPr>
+                <w:sz w:val="20"/>
+              </w:rPr>
+              <w:t xml:space="preserve"> a Deliverables &amp; Deadlines</w:t>
+            </w:r>
+          </w:p>
+        </w:tc>
+        <w:tc>
+          <w:tcPr>
+            <w:tcW w:w="2410" w:type="dxa"/>
+            <w:tcBorders>
+              <w:top w:val="single" w:sz="4" w:space="0" w:color="auto"/>
+              <w:left w:val="single" w:sz="4" w:space="0" w:color="auto"/>
+              <w:bottom w:val="single" w:sz="4" w:space="0" w:color="auto"/>
+              <w:right w:val="single" w:sz="4" w:space="0" w:color="auto"/>
+            </w:tcBorders>
+          </w:tcPr>
+          <w:p>
+            <w:pPr>
+              <w:pStyle w:val="Contenutotabella"/>
+              <w:rPr>
+                <w:sz w:val="20"/>
+              </w:rPr>
+            </w:pPr>
+            <w:r>
+              <w:rPr>
+                <w:sz w:val="20"/>
+              </w:rPr>
+              <w:t>Gennaro Esposito</w:t>
+            </w:r>
+          </w:p>
+        </w:tc>
+      </w:tr>
     </w:tbl>
     <w:p>
       <w:pPr>
@@ -1903,9 +2026,10 @@
           <w:tab w:val="left" w:pos="566"/>
         </w:tabs>
         <w:rPr>
-          <w:rFonts w:ascii="Aptos" w:eastAsia="Times New Roman" w:hAnsi="Aptos" w:cs="Times New Roman"/>
+          <w:rFonts w:asciiTheme="minorHAnsi" w:eastAsiaTheme="minorEastAsia" w:hAnsiTheme="minorHAnsi" w:cstheme="minorBidi"/>
           <w:noProof/>
           <w:kern w:val="2"/>
+          <w14:ligatures w14:val="standardContextual"/>
         </w:rPr>
       </w:pPr>
       <w:r>
@@ -1917,7 +2041,7 @@
       <w:r>
         <w:fldChar w:fldCharType="separate"/>
       </w:r>
-      <w:hyperlink w:anchor="_Toc242815305" w:history="1">
+      <w:hyperlink w:anchor="_Toc242864813" w:history="1">
         <w:r>
           <w:rPr>
             <w:rStyle w:val="Collegamentoipertestuale"/>
@@ -1927,9 +2051,10 @@
         </w:r>
         <w:r>
           <w:rPr>
-            <w:rFonts w:ascii="Aptos" w:eastAsia="Times New Roman" w:hAnsi="Aptos" w:cs="Times New Roman"/>
+            <w:rFonts w:asciiTheme="minorHAnsi" w:eastAsiaTheme="minorEastAsia" w:hAnsiTheme="minorHAnsi" w:cstheme="minorBidi"/>
             <w:noProof/>
             <w:kern w:val="2"/>
+            <w14:ligatures w14:val="standardContextual"/>
           </w:rPr>
           <w:tab/>
         </w:r>
@@ -1959,7 +2084,7 @@
             <w:noProof/>
             <w:webHidden/>
           </w:rPr>
-          <w:instrText xml:space="preserve"> PAGEREF _Toc242815305 \h </w:instrText>
+          <w:instrText xml:space="preserve"> PAGEREF _Toc242864813 \h </w:instrText>
         </w:r>
         <w:r>
           <w:rPr>
@@ -1997,12 +2122,13 @@
           <w:tab w:val="left" w:pos="566"/>
         </w:tabs>
         <w:rPr>
-          <w:rFonts w:ascii="Aptos" w:eastAsia="Times New Roman" w:hAnsi="Aptos" w:cs="Times New Roman"/>
+          <w:rFonts w:asciiTheme="minorHAnsi" w:eastAsiaTheme="minorEastAsia" w:hAnsiTheme="minorHAnsi" w:cstheme="minorBidi"/>
           <w:noProof/>
           <w:kern w:val="2"/>
+          <w14:ligatures w14:val="standardContextual"/>
         </w:rPr>
       </w:pPr>
-      <w:hyperlink w:anchor="_Toc242815306" w:history="1">
+      <w:hyperlink w:anchor="_Toc242864814" w:history="1">
         <w:r>
           <w:rPr>
             <w:rStyle w:val="Collegamentoipertestuale"/>
@@ -2012,9 +2138,10 @@
         </w:r>
         <w:r>
           <w:rPr>
-            <w:rFonts w:ascii="Aptos" w:eastAsia="Times New Roman" w:hAnsi="Aptos" w:cs="Times New Roman"/>
+            <w:rFonts w:asciiTheme="minorHAnsi" w:eastAsiaTheme="minorEastAsia" w:hAnsiTheme="minorHAnsi" w:cstheme="minorBidi"/>
             <w:noProof/>
             <w:kern w:val="2"/>
+            <w14:ligatures w14:val="standardContextual"/>
           </w:rPr>
           <w:tab/>
         </w:r>
@@ -2044,7 +2171,7 @@
             <w:noProof/>
             <w:webHidden/>
           </w:rPr>
-          <w:instrText xml:space="preserve"> PAGEREF _Toc242815306 \h </w:instrText>
+          <w:instrText xml:space="preserve"> PAGEREF _Toc242864814 \h </w:instrText>
         </w:r>
         <w:r>
           <w:rPr>
@@ -2082,12 +2209,13 @@
           <w:tab w:val="left" w:pos="849"/>
         </w:tabs>
         <w:rPr>
-          <w:rFonts w:ascii="Aptos" w:eastAsia="Times New Roman" w:hAnsi="Aptos" w:cs="Times New Roman"/>
+          <w:rFonts w:asciiTheme="minorHAnsi" w:eastAsiaTheme="minorEastAsia" w:hAnsiTheme="minorHAnsi" w:cstheme="minorBidi"/>
           <w:noProof/>
           <w:kern w:val="2"/>
+          <w14:ligatures w14:val="standardContextual"/>
         </w:rPr>
       </w:pPr>
-      <w:hyperlink w:anchor="_Toc242815307" w:history="1">
+      <w:hyperlink w:anchor="_Toc242864815" w:history="1">
         <w:r>
           <w:rPr>
             <w:rStyle w:val="Collegamentoipertestuale"/>
@@ -2097,9 +2225,10 @@
         </w:r>
         <w:r>
           <w:rPr>
-            <w:rFonts w:ascii="Aptos" w:eastAsia="Times New Roman" w:hAnsi="Aptos" w:cs="Times New Roman"/>
+            <w:rFonts w:asciiTheme="minorHAnsi" w:eastAsiaTheme="minorEastAsia" w:hAnsiTheme="minorHAnsi" w:cstheme="minorBidi"/>
             <w:noProof/>
             <w:kern w:val="2"/>
+            <w14:ligatures w14:val="standardContextual"/>
           </w:rPr>
           <w:tab/>
         </w:r>
@@ -2129,7 +2258,7 @@
             <w:noProof/>
             <w:webHidden/>
           </w:rPr>
-          <w:instrText xml:space="preserve"> PAGEREF _Toc242815307 \h </w:instrText>
+          <w:instrText xml:space="preserve"> PAGEREF _Toc242864815 \h </w:instrText>
         </w:r>
         <w:r>
           <w:rPr>
@@ -2167,12 +2296,13 @@
           <w:tab w:val="left" w:pos="849"/>
         </w:tabs>
         <w:rPr>
-          <w:rFonts w:ascii="Aptos" w:eastAsia="Times New Roman" w:hAnsi="Aptos" w:cs="Times New Roman"/>
+          <w:rFonts w:asciiTheme="minorHAnsi" w:eastAsiaTheme="minorEastAsia" w:hAnsiTheme="minorHAnsi" w:cstheme="minorBidi"/>
           <w:noProof/>
           <w:kern w:val="2"/>
+          <w14:ligatures w14:val="standardContextual"/>
         </w:rPr>
       </w:pPr>
-      <w:hyperlink w:anchor="_Toc242815308" w:history="1">
+      <w:hyperlink w:anchor="_Toc242864816" w:history="1">
         <w:r>
           <w:rPr>
             <w:rStyle w:val="Collegamentoipertestuale"/>
@@ -2182,9 +2312,10 @@
         </w:r>
         <w:r>
           <w:rPr>
-            <w:rFonts w:ascii="Aptos" w:eastAsia="Times New Roman" w:hAnsi="Aptos" w:cs="Times New Roman"/>
+            <w:rFonts w:asciiTheme="minorHAnsi" w:eastAsiaTheme="minorEastAsia" w:hAnsiTheme="minorHAnsi" w:cstheme="minorBidi"/>
             <w:noProof/>
             <w:kern w:val="2"/>
+            <w14:ligatures w14:val="standardContextual"/>
           </w:rPr>
           <w:tab/>
         </w:r>
@@ -2214,7 +2345,7 @@
             <w:noProof/>
             <w:webHidden/>
           </w:rPr>
-          <w:instrText xml:space="preserve"> PAGEREF _Toc242815308 \h </w:instrText>
+          <w:instrText xml:space="preserve"> PAGEREF _Toc242864816 \h </w:instrText>
         </w:r>
         <w:r>
           <w:rPr>
@@ -2252,12 +2383,13 @@
           <w:tab w:val="left" w:pos="849"/>
         </w:tabs>
         <w:rPr>
-          <w:rFonts w:ascii="Aptos" w:eastAsia="Times New Roman" w:hAnsi="Aptos" w:cs="Times New Roman"/>
+          <w:rFonts w:asciiTheme="minorHAnsi" w:eastAsiaTheme="minorEastAsia" w:hAnsiTheme="minorHAnsi" w:cstheme="minorBidi"/>
           <w:noProof/>
           <w:kern w:val="2"/>
+          <w14:ligatures w14:val="standardContextual"/>
         </w:rPr>
       </w:pPr>
-      <w:hyperlink w:anchor="_Toc242815309" w:history="1">
+      <w:hyperlink w:anchor="_Toc242864817" w:history="1">
         <w:r>
           <w:rPr>
             <w:rStyle w:val="Collegamentoipertestuale"/>
@@ -2267,9 +2399,10 @@
         </w:r>
         <w:r>
           <w:rPr>
-            <w:rFonts w:ascii="Aptos" w:eastAsia="Times New Roman" w:hAnsi="Aptos" w:cs="Times New Roman"/>
+            <w:rFonts w:asciiTheme="minorHAnsi" w:eastAsiaTheme="minorEastAsia" w:hAnsiTheme="minorHAnsi" w:cstheme="minorBidi"/>
             <w:noProof/>
             <w:kern w:val="2"/>
+            <w14:ligatures w14:val="standardContextual"/>
           </w:rPr>
           <w:tab/>
         </w:r>
@@ -2299,7 +2432,7 @@
             <w:noProof/>
             <w:webHidden/>
           </w:rPr>
-          <w:instrText xml:space="preserve"> PAGEREF _Toc242815309 \h </w:instrText>
+          <w:instrText xml:space="preserve"> PAGEREF _Toc242864817 \h </w:instrText>
         </w:r>
         <w:r>
           <w:rPr>
@@ -2337,12 +2470,13 @@
           <w:tab w:val="left" w:pos="849"/>
         </w:tabs>
         <w:rPr>
-          <w:rFonts w:ascii="Aptos" w:eastAsia="Times New Roman" w:hAnsi="Aptos" w:cs="Times New Roman"/>
+          <w:rFonts w:asciiTheme="minorHAnsi" w:eastAsiaTheme="minorEastAsia" w:hAnsiTheme="minorHAnsi" w:cstheme="minorBidi"/>
           <w:noProof/>
           <w:kern w:val="2"/>
+          <w14:ligatures w14:val="standardContextual"/>
         </w:rPr>
       </w:pPr>
-      <w:hyperlink w:anchor="_Toc242815310" w:history="1">
+      <w:hyperlink w:anchor="_Toc242864818" w:history="1">
         <w:r>
           <w:rPr>
             <w:rStyle w:val="Collegamentoipertestuale"/>
@@ -2352,9 +2486,10 @@
         </w:r>
         <w:r>
           <w:rPr>
-            <w:rFonts w:ascii="Aptos" w:eastAsia="Times New Roman" w:hAnsi="Aptos" w:cs="Times New Roman"/>
+            <w:rFonts w:asciiTheme="minorHAnsi" w:eastAsiaTheme="minorEastAsia" w:hAnsiTheme="minorHAnsi" w:cstheme="minorBidi"/>
             <w:noProof/>
             <w:kern w:val="2"/>
+            <w14:ligatures w14:val="standardContextual"/>
           </w:rPr>
           <w:tab/>
         </w:r>
@@ -2384,7 +2519,7 @@
             <w:noProof/>
             <w:webHidden/>
           </w:rPr>
-          <w:instrText xml:space="preserve"> PAGEREF _Toc242815310 \h </w:instrText>
+          <w:instrText xml:space="preserve"> PAGEREF _Toc242864818 \h </w:instrText>
         </w:r>
         <w:r>
           <w:rPr>
@@ -2422,12 +2557,13 @@
           <w:tab w:val="left" w:pos="566"/>
         </w:tabs>
         <w:rPr>
-          <w:rFonts w:ascii="Aptos" w:eastAsia="Times New Roman" w:hAnsi="Aptos" w:cs="Times New Roman"/>
+          <w:rFonts w:asciiTheme="minorHAnsi" w:eastAsiaTheme="minorEastAsia" w:hAnsiTheme="minorHAnsi" w:cstheme="minorBidi"/>
           <w:noProof/>
           <w:kern w:val="2"/>
+          <w14:ligatures w14:val="standardContextual"/>
         </w:rPr>
       </w:pPr>
-      <w:hyperlink w:anchor="_Toc242815311" w:history="1">
+      <w:hyperlink w:anchor="_Toc242864819" w:history="1">
         <w:r>
           <w:rPr>
             <w:rStyle w:val="Collegamentoipertestuale"/>
@@ -2437,9 +2573,10 @@
         </w:r>
         <w:r>
           <w:rPr>
-            <w:rFonts w:ascii="Aptos" w:eastAsia="Times New Roman" w:hAnsi="Aptos" w:cs="Times New Roman"/>
+            <w:rFonts w:asciiTheme="minorHAnsi" w:eastAsiaTheme="minorEastAsia" w:hAnsiTheme="minorHAnsi" w:cstheme="minorBidi"/>
             <w:noProof/>
             <w:kern w:val="2"/>
+            <w14:ligatures w14:val="standardContextual"/>
           </w:rPr>
           <w:tab/>
         </w:r>
@@ -2469,7 +2606,7 @@
             <w:noProof/>
             <w:webHidden/>
           </w:rPr>
-          <w:instrText xml:space="preserve"> PAGEREF _Toc242815311 \h </w:instrText>
+          <w:instrText xml:space="preserve"> PAGEREF _Toc242864819 \h </w:instrText>
         </w:r>
         <w:r>
           <w:rPr>
@@ -2507,12 +2644,13 @@
           <w:tab w:val="left" w:pos="566"/>
         </w:tabs>
         <w:rPr>
-          <w:rFonts w:ascii="Aptos" w:eastAsia="Times New Roman" w:hAnsi="Aptos" w:cs="Times New Roman"/>
+          <w:rFonts w:asciiTheme="minorHAnsi" w:eastAsiaTheme="minorEastAsia" w:hAnsiTheme="minorHAnsi" w:cstheme="minorBidi"/>
           <w:noProof/>
           <w:kern w:val="2"/>
+          <w14:ligatures w14:val="standardContextual"/>
         </w:rPr>
       </w:pPr>
-      <w:hyperlink w:anchor="_Toc242815312" w:history="1">
+      <w:hyperlink w:anchor="_Toc242864820" w:history="1">
         <w:r>
           <w:rPr>
             <w:rStyle w:val="Collegamentoipertestuale"/>
@@ -2522,9 +2660,10 @@
         </w:r>
         <w:r>
           <w:rPr>
-            <w:rFonts w:ascii="Aptos" w:eastAsia="Times New Roman" w:hAnsi="Aptos" w:cs="Times New Roman"/>
+            <w:rFonts w:asciiTheme="minorHAnsi" w:eastAsiaTheme="minorEastAsia" w:hAnsiTheme="minorHAnsi" w:cstheme="minorBidi"/>
             <w:noProof/>
             <w:kern w:val="2"/>
+            <w14:ligatures w14:val="standardContextual"/>
           </w:rPr>
           <w:tab/>
         </w:r>
@@ -2554,7 +2693,7 @@
             <w:noProof/>
             <w:webHidden/>
           </w:rPr>
-          <w:instrText xml:space="preserve"> PAGEREF _Toc242815312 \h </w:instrText>
+          <w:instrText xml:space="preserve"> PAGEREF _Toc242864820 \h </w:instrText>
         </w:r>
         <w:r>
           <w:rPr>
@@ -2592,12 +2731,13 @@
           <w:tab w:val="left" w:pos="1132"/>
         </w:tabs>
         <w:rPr>
-          <w:rFonts w:ascii="Aptos" w:eastAsia="Times New Roman" w:hAnsi="Aptos" w:cs="Times New Roman"/>
+          <w:rFonts w:asciiTheme="minorHAnsi" w:eastAsiaTheme="minorEastAsia" w:hAnsiTheme="minorHAnsi" w:cstheme="minorBidi"/>
           <w:noProof/>
           <w:kern w:val="2"/>
+          <w14:ligatures w14:val="standardContextual"/>
         </w:rPr>
       </w:pPr>
-      <w:hyperlink w:anchor="_Toc242815313" w:history="1">
+      <w:hyperlink w:anchor="_Toc242864821" w:history="1">
         <w:r>
           <w:rPr>
             <w:rStyle w:val="Collegamentoipertestuale"/>
@@ -2607,9 +2747,10 @@
         </w:r>
         <w:r>
           <w:rPr>
-            <w:rFonts w:ascii="Aptos" w:eastAsia="Times New Roman" w:hAnsi="Aptos" w:cs="Times New Roman"/>
+            <w:rFonts w:asciiTheme="minorHAnsi" w:eastAsiaTheme="minorEastAsia" w:hAnsiTheme="minorHAnsi" w:cstheme="minorBidi"/>
             <w:noProof/>
             <w:kern w:val="2"/>
+            <w14:ligatures w14:val="standardContextual"/>
           </w:rPr>
           <w:tab/>
         </w:r>
@@ -2639,7 +2780,7 @@
             <w:noProof/>
             <w:webHidden/>
           </w:rPr>
-          <w:instrText xml:space="preserve"> PAGEREF _Toc242815313 \h </w:instrText>
+          <w:instrText xml:space="preserve"> PAGEREF _Toc242864821 \h </w:instrText>
         </w:r>
         <w:r>
           <w:rPr>
@@ -2677,12 +2818,13 @@
           <w:tab w:val="left" w:pos="1132"/>
         </w:tabs>
         <w:rPr>
-          <w:rFonts w:ascii="Aptos" w:eastAsia="Times New Roman" w:hAnsi="Aptos" w:cs="Times New Roman"/>
+          <w:rFonts w:asciiTheme="minorHAnsi" w:eastAsiaTheme="minorEastAsia" w:hAnsiTheme="minorHAnsi" w:cstheme="minorBidi"/>
           <w:noProof/>
           <w:kern w:val="2"/>
+          <w14:ligatures w14:val="standardContextual"/>
         </w:rPr>
       </w:pPr>
-      <w:hyperlink w:anchor="_Toc242815314" w:history="1">
+      <w:hyperlink w:anchor="_Toc242864822" w:history="1">
         <w:r>
           <w:rPr>
             <w:rStyle w:val="Collegamentoipertestuale"/>
@@ -2692,9 +2834,10 @@
         </w:r>
         <w:r>
           <w:rPr>
-            <w:rFonts w:ascii="Aptos" w:eastAsia="Times New Roman" w:hAnsi="Aptos" w:cs="Times New Roman"/>
+            <w:rFonts w:asciiTheme="minorHAnsi" w:eastAsiaTheme="minorEastAsia" w:hAnsiTheme="minorHAnsi" w:cstheme="minorBidi"/>
             <w:noProof/>
             <w:kern w:val="2"/>
+            <w14:ligatures w14:val="standardContextual"/>
           </w:rPr>
           <w:tab/>
         </w:r>
@@ -2724,7 +2867,7 @@
             <w:noProof/>
             <w:webHidden/>
           </w:rPr>
-          <w:instrText xml:space="preserve"> PAGEREF _Toc242815314 \h </w:instrText>
+          <w:instrText xml:space="preserve"> PAGEREF _Toc242864822 \h </w:instrText>
         </w:r>
         <w:r>
           <w:rPr>
@@ -2762,12 +2905,13 @@
           <w:tab w:val="left" w:pos="1132"/>
         </w:tabs>
         <w:rPr>
-          <w:rFonts w:ascii="Aptos" w:eastAsia="Times New Roman" w:hAnsi="Aptos" w:cs="Times New Roman"/>
+          <w:rFonts w:asciiTheme="minorHAnsi" w:eastAsiaTheme="minorEastAsia" w:hAnsiTheme="minorHAnsi" w:cstheme="minorBidi"/>
           <w:noProof/>
           <w:kern w:val="2"/>
+          <w14:ligatures w14:val="standardContextual"/>
         </w:rPr>
       </w:pPr>
-      <w:hyperlink w:anchor="_Toc242815315" w:history="1">
+      <w:hyperlink w:anchor="_Toc242864823" w:history="1">
         <w:r>
           <w:rPr>
             <w:rStyle w:val="Collegamentoipertestuale"/>
@@ -2777,9 +2921,10 @@
         </w:r>
         <w:r>
           <w:rPr>
-            <w:rFonts w:ascii="Aptos" w:eastAsia="Times New Roman" w:hAnsi="Aptos" w:cs="Times New Roman"/>
+            <w:rFonts w:asciiTheme="minorHAnsi" w:eastAsiaTheme="minorEastAsia" w:hAnsiTheme="minorHAnsi" w:cstheme="minorBidi"/>
             <w:noProof/>
             <w:kern w:val="2"/>
+            <w14:ligatures w14:val="standardContextual"/>
           </w:rPr>
           <w:tab/>
         </w:r>
@@ -2809,7 +2954,7 @@
             <w:noProof/>
             <w:webHidden/>
           </w:rPr>
-          <w:instrText xml:space="preserve"> PAGEREF _Toc242815315 \h </w:instrText>
+          <w:instrText xml:space="preserve"> PAGEREF _Toc242864823 \h </w:instrText>
         </w:r>
         <w:r>
           <w:rPr>
@@ -2847,12 +2992,13 @@
           <w:tab w:val="left" w:pos="1132"/>
         </w:tabs>
         <w:rPr>
-          <w:rFonts w:ascii="Aptos" w:eastAsia="Times New Roman" w:hAnsi="Aptos" w:cs="Times New Roman"/>
+          <w:rFonts w:asciiTheme="minorHAnsi" w:eastAsiaTheme="minorEastAsia" w:hAnsiTheme="minorHAnsi" w:cstheme="minorBidi"/>
           <w:noProof/>
           <w:kern w:val="2"/>
+          <w14:ligatures w14:val="standardContextual"/>
         </w:rPr>
       </w:pPr>
-      <w:hyperlink w:anchor="_Toc242815316" w:history="1">
+      <w:hyperlink w:anchor="_Toc242864824" w:history="1">
         <w:r>
           <w:rPr>
             <w:rStyle w:val="Collegamentoipertestuale"/>
@@ -2862,9 +3008,10 @@
         </w:r>
         <w:r>
           <w:rPr>
-            <w:rFonts w:ascii="Aptos" w:eastAsia="Times New Roman" w:hAnsi="Aptos" w:cs="Times New Roman"/>
+            <w:rFonts w:asciiTheme="minorHAnsi" w:eastAsiaTheme="minorEastAsia" w:hAnsiTheme="minorHAnsi" w:cstheme="minorBidi"/>
             <w:noProof/>
             <w:kern w:val="2"/>
+            <w14:ligatures w14:val="standardContextual"/>
           </w:rPr>
           <w:tab/>
         </w:r>
@@ -2894,7 +3041,7 @@
             <w:noProof/>
             <w:webHidden/>
           </w:rPr>
-          <w:instrText xml:space="preserve"> PAGEREF _Toc242815316 \h </w:instrText>
+          <w:instrText xml:space="preserve"> PAGEREF _Toc242864824 \h </w:instrText>
         </w:r>
         <w:r>
           <w:rPr>
@@ -2914,7 +3061,7 @@
             <w:noProof/>
             <w:webHidden/>
           </w:rPr>
-          <w:t>6</w:t>
+          <w:t>7</w:t>
         </w:r>
         <w:r>
           <w:rPr>
@@ -2932,12 +3079,13 @@
           <w:tab w:val="left" w:pos="566"/>
         </w:tabs>
         <w:rPr>
-          <w:rFonts w:ascii="Aptos" w:eastAsia="Times New Roman" w:hAnsi="Aptos" w:cs="Times New Roman"/>
+          <w:rFonts w:asciiTheme="minorHAnsi" w:eastAsiaTheme="minorEastAsia" w:hAnsiTheme="minorHAnsi" w:cstheme="minorBidi"/>
           <w:noProof/>
           <w:kern w:val="2"/>
+          <w14:ligatures w14:val="standardContextual"/>
         </w:rPr>
       </w:pPr>
-      <w:hyperlink w:anchor="_Toc242815317" w:history="1">
+      <w:hyperlink w:anchor="_Toc242864825" w:history="1">
         <w:r>
           <w:rPr>
             <w:rStyle w:val="Collegamentoipertestuale"/>
@@ -2947,9 +3095,10 @@
         </w:r>
         <w:r>
           <w:rPr>
-            <w:rFonts w:ascii="Aptos" w:eastAsia="Times New Roman" w:hAnsi="Aptos" w:cs="Times New Roman"/>
+            <w:rFonts w:asciiTheme="minorHAnsi" w:eastAsiaTheme="minorEastAsia" w:hAnsiTheme="minorHAnsi" w:cstheme="minorBidi"/>
             <w:noProof/>
             <w:kern w:val="2"/>
+            <w14:ligatures w14:val="standardContextual"/>
           </w:rPr>
           <w:tab/>
         </w:r>
@@ -2979,7 +3128,7 @@
             <w:noProof/>
             <w:webHidden/>
           </w:rPr>
-          <w:instrText xml:space="preserve"> PAGEREF _Toc242815317 \h </w:instrText>
+          <w:instrText xml:space="preserve"> PAGEREF _Toc242864825 \h </w:instrText>
         </w:r>
         <w:r>
           <w:rPr>
@@ -3017,12 +3166,13 @@
           <w:tab w:val="left" w:pos="566"/>
         </w:tabs>
         <w:rPr>
-          <w:rFonts w:ascii="Aptos" w:eastAsia="Times New Roman" w:hAnsi="Aptos" w:cs="Times New Roman"/>
+          <w:rFonts w:asciiTheme="minorHAnsi" w:eastAsiaTheme="minorEastAsia" w:hAnsiTheme="minorHAnsi" w:cstheme="minorBidi"/>
           <w:noProof/>
           <w:kern w:val="2"/>
+          <w14:ligatures w14:val="standardContextual"/>
         </w:rPr>
       </w:pPr>
-      <w:hyperlink w:anchor="_Toc242815318" w:history="1">
+      <w:hyperlink w:anchor="_Toc242864826" w:history="1">
         <w:r>
           <w:rPr>
             <w:rStyle w:val="Collegamentoipertestuale"/>
@@ -3032,9 +3182,10 @@
         </w:r>
         <w:r>
           <w:rPr>
-            <w:rFonts w:ascii="Aptos" w:eastAsia="Times New Roman" w:hAnsi="Aptos" w:cs="Times New Roman"/>
+            <w:rFonts w:asciiTheme="minorHAnsi" w:eastAsiaTheme="minorEastAsia" w:hAnsiTheme="minorHAnsi" w:cstheme="minorBidi"/>
             <w:noProof/>
             <w:kern w:val="2"/>
+            <w14:ligatures w14:val="standardContextual"/>
           </w:rPr>
           <w:tab/>
         </w:r>
@@ -3064,7 +3215,7 @@
             <w:noProof/>
             <w:webHidden/>
           </w:rPr>
-          <w:instrText xml:space="preserve"> PAGEREF _Toc242815318 \h </w:instrText>
+          <w:instrText xml:space="preserve"> PAGEREF _Toc242864826 \h </w:instrText>
         </w:r>
         <w:r>
           <w:rPr>
@@ -3141,7 +3292,7 @@
         <w:jc w:val="left"/>
       </w:pPr>
       <w:bookmarkStart w:id="0" w:name="_Ref242705112"/>
-      <w:bookmarkStart w:id="1" w:name="_Toc242815305"/>
+      <w:bookmarkStart w:id="1" w:name="_Toc242864813"/>
       <w:r>
         <w:lastRenderedPageBreak/>
         <w:t>PROBLEM DOMAIN</w:t>
@@ -3178,7 +3329,7 @@
         <w:ind w:left="426" w:hanging="426"/>
         <w:jc w:val="left"/>
       </w:pPr>
-      <w:bookmarkStart w:id="2" w:name="_Toc242815306"/>
+      <w:bookmarkStart w:id="2" w:name="_Toc242864814"/>
       <w:r>
         <w:t>SCENARIOS</w:t>
       </w:r>
@@ -3196,7 +3347,7 @@
       <w:r>
         <w:t xml:space="preserve"> </w:t>
       </w:r>
-      <w:bookmarkStart w:id="4" w:name="_Toc242815307"/>
+      <w:bookmarkStart w:id="4" w:name="_Toc242864815"/>
       <w:r>
         <w:t>Scenario 1</w:t>
       </w:r>
@@ -3459,7 +3610,7 @@
       <w:r>
         <w:t xml:space="preserve"> </w:t>
       </w:r>
-      <w:bookmarkStart w:id="5" w:name="_Toc242815308"/>
+      <w:bookmarkStart w:id="5" w:name="_Toc242864816"/>
       <w:r>
         <w:t>Scenario 2</w:t>
       </w:r>
@@ -3630,7 +3781,7 @@
       <w:r>
         <w:t xml:space="preserve"> </w:t>
       </w:r>
-      <w:bookmarkStart w:id="6" w:name="_Toc242815309"/>
+      <w:bookmarkStart w:id="6" w:name="_Toc242864817"/>
       <w:r>
         <w:t>Scenario 3</w:t>
       </w:r>
@@ -3793,7 +3944,7 @@
       <w:r>
         <w:t xml:space="preserve"> </w:t>
       </w:r>
-      <w:bookmarkStart w:id="7" w:name="_Toc242815310"/>
+      <w:bookmarkStart w:id="7" w:name="_Toc242864818"/>
       <w:r>
         <w:t>Scenario 4</w:t>
       </w:r>
@@ -3899,7 +4050,7 @@
         <w:ind w:left="426" w:hanging="426"/>
         <w:jc w:val="left"/>
       </w:pPr>
-      <w:bookmarkStart w:id="8" w:name="_Toc242815311"/>
+      <w:bookmarkStart w:id="8" w:name="_Toc242864819"/>
       <w:r>
         <w:t>FUNCTIONAL REQUIREMENTS</w:t>
       </w:r>
@@ -3914,6 +4065,13 @@
         <w:ind w:hanging="294"/>
       </w:pPr>
       <w:r>
+        <w:rPr>
+          <w:b/>
+          <w:bCs/>
+        </w:rPr>
+        <w:t xml:space="preserve">RF1: </w:t>
+      </w:r>
+      <w:r>
         <w:t xml:space="preserve">Il sistema deve consentire ai clienti di registrarsi </w:t>
       </w:r>
       <w:r>
@@ -3953,6 +4111,13 @@
         <w:ind w:hanging="294"/>
       </w:pPr>
       <w:r>
+        <w:rPr>
+          <w:b/>
+          <w:bCs/>
+        </w:rPr>
+        <w:t xml:space="preserve">RF2: </w:t>
+      </w:r>
+      <w:r>
         <w:t xml:space="preserve">Il cliente deve poter visualizzare e modificare le proprie informazioni </w:t>
       </w:r>
       <w:r>
@@ -3971,6 +4136,13 @@
         <w:ind w:hanging="294"/>
       </w:pPr>
       <w:r>
+        <w:rPr>
+          <w:b/>
+          <w:bCs/>
+        </w:rPr>
+        <w:t xml:space="preserve">RF3: </w:t>
+      </w:r>
+      <w:r>
         <w:t>I</w:t>
       </w:r>
       <w:r>
@@ -3989,6 +4161,16 @@
         <w:ind w:hanging="294"/>
       </w:pPr>
       <w:r>
+        <w:rPr>
+          <w:b/>
+          <w:bCs/>
+        </w:rPr>
+        <w:t>RF4:</w:t>
+      </w:r>
+      <w:r>
+        <w:t xml:space="preserve"> </w:t>
+      </w:r>
+      <w:r>
         <w:t>Il sistema deve permettere la navigazione del catalogo e la possibilità di applicare filtri alla ricerca come per genere, forma della montatura, colore, prezzo, oppure ricercare un modello tramite la barra di ricerca, e deve poter vedere tramite un tag se un prodotto è un’esclusiva online</w:t>
       </w:r>
     </w:p>
@@ -4001,6 +4183,16 @@
         <w:ind w:hanging="294"/>
       </w:pPr>
       <w:r>
+        <w:rPr>
+          <w:b/>
+          <w:bCs/>
+        </w:rPr>
+        <w:t>RF5:</w:t>
+      </w:r>
+      <w:r>
+        <w:t xml:space="preserve"> </w:t>
+      </w:r>
+      <w:r>
         <w:t>Ogni prodotto deve mostrare una scheda dettagliata con immagini, descrizione, vari colori disponibili e prezzo</w:t>
       </w:r>
     </w:p>
@@ -4013,6 +4205,16 @@
         <w:ind w:hanging="294"/>
       </w:pPr>
       <w:r>
+        <w:rPr>
+          <w:b/>
+          <w:bCs/>
+        </w:rPr>
+        <w:t>RF6:</w:t>
+      </w:r>
+      <w:r>
+        <w:t xml:space="preserve"> </w:t>
+      </w:r>
+      <w:r>
         <w:t>Il cliente deve poter aggiungere/rimuovere prodotti al carrello</w:t>
       </w:r>
       <w:r>
@@ -4028,6 +4230,16 @@
         <w:ind w:hanging="294"/>
       </w:pPr>
       <w:r>
+        <w:rPr>
+          <w:b/>
+          <w:bCs/>
+        </w:rPr>
+        <w:t>RF7:</w:t>
+      </w:r>
+      <w:r>
+        <w:t xml:space="preserve"> </w:t>
+      </w:r>
+      <w:r>
         <w:t>Ne</w:t>
       </w:r>
       <w:r>
@@ -4061,13 +4273,23 @@
         <w:ind w:left="709" w:hanging="283"/>
       </w:pPr>
       <w:r>
+        <w:rPr>
+          <w:b/>
+          <w:bCs/>
+        </w:rPr>
+        <w:lastRenderedPageBreak/>
+        <w:t>RF8:</w:t>
+      </w:r>
+      <w:r>
+        <w:t xml:space="preserve"> </w:t>
+      </w:r>
+      <w:r>
         <w:t>Il Product Manager deve poter aggiungere nuovi modelli di occhiali al catalogo,</w:t>
       </w:r>
       <w:r>
         <w:t xml:space="preserve"> </w:t>
       </w:r>
       <w:r>
-        <w:lastRenderedPageBreak/>
         <w:t>specificando prezzi, immagini, e quantità disponibili, e classificarli come esclusiva online o scontati</w:t>
       </w:r>
     </w:p>
@@ -4080,6 +4302,16 @@
         <w:ind w:left="709" w:hanging="283"/>
       </w:pPr>
       <w:r>
+        <w:rPr>
+          <w:b/>
+          <w:bCs/>
+        </w:rPr>
+        <w:t>RF9:</w:t>
+      </w:r>
+      <w:r>
+        <w:t xml:space="preserve"> </w:t>
+      </w:r>
+      <w:r>
         <w:t>Il Product Manager deve poter nascondere o disattivare prodotti dal catalogo pubblico (</w:t>
       </w:r>
       <w:r>
@@ -4098,6 +4330,16 @@
         <w:ind w:left="709" w:hanging="283"/>
       </w:pPr>
       <w:r>
+        <w:rPr>
+          <w:b/>
+          <w:bCs/>
+        </w:rPr>
+        <w:t>RF10:</w:t>
+      </w:r>
+      <w:r>
+        <w:t xml:space="preserve"> </w:t>
+      </w:r>
+      <w:r>
         <w:t>L’Order Manager</w:t>
       </w:r>
       <w:r>
@@ -4112,6 +4354,16 @@
         </w:numPr>
         <w:ind w:left="709" w:hanging="283"/>
       </w:pPr>
+      <w:r>
+        <w:rPr>
+          <w:b/>
+          <w:bCs/>
+        </w:rPr>
+        <w:t>RF11:</w:t>
+      </w:r>
+      <w:r>
+        <w:t xml:space="preserve"> </w:t>
+      </w:r>
       <w:r>
         <w:t>Il Market Analyzer deve poter accedere a una sua area gestionale dove può vedere una tabella con le statistiche degli ordini</w:t>
       </w:r>
@@ -4127,7 +4379,7 @@
         <w:ind w:left="426" w:hanging="426"/>
         <w:jc w:val="left"/>
       </w:pPr>
-      <w:bookmarkStart w:id="9" w:name="_Toc242815312"/>
+      <w:bookmarkStart w:id="9" w:name="_Toc242864820"/>
       <w:r>
         <w:t>NON</w:t>
       </w:r>
@@ -4149,7 +4401,7 @@
         <w:spacing w:before="100"/>
         <w:ind w:left="426" w:hanging="284"/>
       </w:pPr>
-      <w:bookmarkStart w:id="10" w:name="_Toc242815313"/>
+      <w:bookmarkStart w:id="10" w:name="_Toc242864821"/>
       <w:r>
         <w:t>Usability</w:t>
       </w:r>
@@ -4169,6 +4421,16 @@
         </w:rPr>
       </w:pPr>
       <w:r>
+        <w:rPr>
+          <w:b/>
+          <w:bCs/>
+        </w:rPr>
+        <w:t>RNF1:</w:t>
+      </w:r>
+      <w:r>
+        <w:t xml:space="preserve"> </w:t>
+      </w:r>
+      <w:r>
         <w:t xml:space="preserve">Il sistema deve offrire un layout flessibile in grado di adattarsi automaticamente alle diverse risoluzioni e formati di schermo (smartphone, tablet, laptop e desktop). </w:t>
       </w:r>
       <w:r>
@@ -4192,6 +4454,16 @@
         </w:numPr>
         <w:ind w:left="709" w:hanging="283"/>
       </w:pPr>
+      <w:r>
+        <w:rPr>
+          <w:b/>
+          <w:bCs/>
+        </w:rPr>
+        <w:t>RNF2:</w:t>
+      </w:r>
+      <w:r>
+        <w:t xml:space="preserve"> </w:t>
+      </w:r>
       <w:r>
         <w:t>Nelle situazioni in cui una schermata o un componente non presenta contenuti da mostrare (es. carrello degli acquisti vuoto, nessun ordine effettuato, nessun risultato corrispondente a un filtro di ricerca), il sistema non deve mai restituire schermate bianche o layout frammentati. Deve invece mostrare messaggi visivi descrittivi che spieghino chiaramente lo stato attuale e suggeriscano l'azione successiva da compiere</w:t>
       </w:r>
@@ -4211,6 +4483,16 @@
           <w:bCs/>
         </w:rPr>
       </w:pPr>
+      <w:r>
+        <w:rPr>
+          <w:b/>
+          <w:bCs/>
+        </w:rPr>
+        <w:t>RNF3:</w:t>
+      </w:r>
+      <w:r>
+        <w:t xml:space="preserve"> </w:t>
+      </w:r>
       <w:r>
         <w:t>Il sistema deve rendere costantemente evidente all'utente il risultato delle proprie azioni attraverso notifiche visive, come banner cromatici di conferma (suc</w:t>
       </w:r>
@@ -4238,6 +4520,16 @@
         </w:rPr>
       </w:pPr>
       <w:r>
+        <w:rPr>
+          <w:b/>
+          <w:bCs/>
+        </w:rPr>
+        <w:t>RNF4:</w:t>
+      </w:r>
+      <w:r>
+        <w:t xml:space="preserve"> </w:t>
+      </w:r>
+      <w:r>
         <w:t xml:space="preserve">Le </w:t>
       </w:r>
       <w:r>
@@ -4259,7 +4551,7 @@
         </w:tabs>
         <w:ind w:left="426" w:hanging="284"/>
       </w:pPr>
-      <w:bookmarkStart w:id="11" w:name="_Toc242815314"/>
+      <w:bookmarkStart w:id="11" w:name="_Toc242864822"/>
       <w:r>
         <w:t>Performance</w:t>
       </w:r>
@@ -4279,6 +4571,16 @@
         </w:rPr>
       </w:pPr>
       <w:r>
+        <w:rPr>
+          <w:b/>
+          <w:bCs/>
+        </w:rPr>
+        <w:t>RNF5:</w:t>
+      </w:r>
+      <w:r>
+        <w:t xml:space="preserve"> </w:t>
+      </w:r>
+      <w:r>
         <w:t>L'interfaccia utente deve garantire una navigazione fluida riducendo al minimo i tempi di attesa e i ricaricamenti dell'intera pagina, i quali comporterebbero fastidiose interruzioni visive e attese stimate tra 0,5 e 3 secondi per ogni singola azione. Le operazioni frequenti</w:t>
       </w:r>
       <w:r>
@@ -4300,7 +4602,7 @@
         </w:tabs>
         <w:ind w:left="426" w:hanging="284"/>
       </w:pPr>
-      <w:bookmarkStart w:id="12" w:name="_Toc242815315"/>
+      <w:bookmarkStart w:id="12" w:name="_Toc242864823"/>
       <w:r>
         <w:t>Reliability</w:t>
       </w:r>
@@ -4315,6 +4617,16 @@
         <w:spacing w:before="100" w:after="120"/>
         <w:ind w:left="709" w:hanging="284"/>
       </w:pPr>
+      <w:r>
+        <w:rPr>
+          <w:b/>
+          <w:bCs/>
+        </w:rPr>
+        <w:t>RNF6:</w:t>
+      </w:r>
+      <w:r>
+        <w:t xml:space="preserve"> </w:t>
+      </w:r>
       <w:r>
         <w:t>Per garantire affidabilità e sicurezza dei dati sensibili dei clienti e dei dipendenti, il sistema deve essere in grado di resistere a specifici attacchi di sicurezza. Vengono, pertanto, richieste all'utente la scelta di password robuste a protezione del suo account. Password che verranno poi criptate per i fini di sicurezza e conservate all'interno di un database (DB) protetto da un Firewall.</w:t>
       </w:r>
@@ -4331,7 +4643,7 @@
         </w:tabs>
         <w:ind w:left="426" w:hanging="284"/>
       </w:pPr>
-      <w:bookmarkStart w:id="13" w:name="_Toc242815316"/>
+      <w:bookmarkStart w:id="13" w:name="_Toc242864824"/>
       <w:r>
         <w:lastRenderedPageBreak/>
         <w:t>Supportability</w:t>
@@ -4349,6 +4661,16 @@
         <w:jc w:val="both"/>
       </w:pPr>
       <w:r>
+        <w:rPr>
+          <w:b/>
+          <w:bCs/>
+        </w:rPr>
+        <w:t>RNF7:</w:t>
+      </w:r>
+      <w:r>
+        <w:t xml:space="preserve"> </w:t>
+      </w:r>
+      <w:r>
         <w:t>L'aspetto grafico</w:t>
       </w:r>
       <w:r>
@@ -4395,7 +4717,7 @@
         <w:ind w:left="426" w:hanging="426"/>
         <w:jc w:val="left"/>
       </w:pPr>
-      <w:bookmarkStart w:id="14" w:name="_Toc242815317"/>
+      <w:bookmarkStart w:id="14" w:name="_Toc242864825"/>
       <w:r>
         <w:t>TARGET ENVIRONMENT</w:t>
       </w:r>
@@ -4579,7 +4901,7 @@
         <w:ind w:left="425" w:hanging="425"/>
         <w:jc w:val="left"/>
       </w:pPr>
-      <w:bookmarkStart w:id="15" w:name="_Toc242815318"/>
+      <w:bookmarkStart w:id="15" w:name="_Toc242864826"/>
       <w:r>
         <w:t>DELIVERABLE &amp; DEADLINES</w:t>
       </w:r>
@@ -5067,14 +5389,67 @@
                 <w:sz w:val="22"/>
                 <w:szCs w:val="22"/>
               </w:rPr>
-              <w:t>8</w:t>
+              <w:t>29 dicembre</w:t>
             </w:r>
-            <w:r>
+          </w:p>
+        </w:tc>
+      </w:tr>
+      <w:tr>
+        <w:trPr>
+          <w:trHeight w:val="233"/>
+        </w:trPr>
+        <w:tc>
+          <w:tcPr>
+            <w:tcW w:w="5812" w:type="dxa"/>
+            <w:tcBorders>
+              <w:top w:val="single" w:sz="4" w:space="0" w:color="auto"/>
+              <w:left w:val="single" w:sz="1" w:space="0" w:color="000000"/>
+              <w:bottom w:val="single" w:sz="4" w:space="0" w:color="auto"/>
+            </w:tcBorders>
+          </w:tcPr>
+          <w:p>
+            <w:pPr>
+              <w:pStyle w:val="Contenutotabella"/>
               <w:rPr>
                 <w:sz w:val="22"/>
                 <w:szCs w:val="22"/>
               </w:rPr>
-              <w:t xml:space="preserve"> gennaio</w:t>
+            </w:pPr>
+            <w:r>
+              <w:rPr>
+                <w:sz w:val="22"/>
+                <w:szCs w:val="22"/>
+              </w:rPr>
+              <w:t>Documenti di Esecuzione del Test</w:t>
+            </w:r>
+          </w:p>
+        </w:tc>
+        <w:tc>
+          <w:tcPr>
+            <w:tcW w:w="2162" w:type="dxa"/>
+            <w:tcBorders>
+              <w:top w:val="single" w:sz="4" w:space="0" w:color="auto"/>
+              <w:left w:val="single" w:sz="1" w:space="0" w:color="000000"/>
+              <w:bottom w:val="single" w:sz="4" w:space="0" w:color="auto"/>
+              <w:right w:val="single" w:sz="1" w:space="0" w:color="000000"/>
+            </w:tcBorders>
+            <w:vAlign w:val="center"/>
+          </w:tcPr>
+          <w:p>
+            <w:pPr>
+              <w:pStyle w:val="Contenutotabella"/>
+              <w:jc w:val="center"/>
+              <w:rPr>
+                <w:sz w:val="22"/>
+                <w:szCs w:val="22"/>
+              </w:rPr>
+            </w:pPr>
+            <w:r>
+              <w:rPr>
+                <w:sz w:val="22"/>
+                <w:szCs w:val="22"/>
+              </w:rPr>
+              <w:t>29 dicembre</w:t>
             </w:r>
           </w:p>
         </w:tc>
@@ -5105,7 +5480,21 @@
                 <w:sz w:val="22"/>
                 <w:szCs w:val="22"/>
               </w:rPr>
-              <w:t>Documenti di Esecuzione del Test</w:t>
+              <w:t xml:space="preserve">System Delivery Document (Consegna finale del codice sorgente e </w:t>
+            </w:r>
+            <w:r>
+              <w:rPr>
+                <w:sz w:val="22"/>
+                <w:szCs w:val="22"/>
+              </w:rPr>
+              <w:t>documentazione</w:t>
+            </w:r>
+            <w:r>
+              <w:rPr>
+                <w:sz w:val="22"/>
+                <w:szCs w:val="22"/>
+              </w:rPr>
+              <w:t>)</w:t>
             </w:r>
           </w:p>
         </w:tc>
@@ -5134,51 +5523,13 @@
                 <w:sz w:val="22"/>
                 <w:szCs w:val="22"/>
               </w:rPr>
-              <w:t>8</w:t>
-            </w:r>
-            <w:r>
-              <w:rPr>
-                <w:sz w:val="22"/>
-                <w:szCs w:val="22"/>
-              </w:rPr>
-              <w:t xml:space="preserve"> gennaio</w:t>
+              <w:t>8 gennaio</w:t>
             </w:r>
           </w:p>
         </w:tc>
       </w:tr>
     </w:tbl>
     <w:p/>
-    <w:p/>
-    <w:p/>
-    <w:p/>
-    <w:p/>
-    <w:p/>
-    <w:p>
-      <w:pPr>
-        <w:rPr>
-          <w:rFonts w:ascii="Arial" w:hAnsi="Arial"/>
-          <w:b/>
-          <w:sz w:val="32"/>
-        </w:rPr>
-      </w:pPr>
-    </w:p>
-    <w:p>
-      <w:pPr>
-        <w:ind w:left="709"/>
-        <w:rPr>
-          <w:rFonts w:ascii="Arial" w:hAnsi="Arial"/>
-          <w:b/>
-        </w:rPr>
-      </w:pPr>
-    </w:p>
-    <w:p>
-      <w:pPr>
-        <w:rPr>
-          <w:rFonts w:ascii="Arial" w:hAnsi="Arial"/>
-          <w:b/>
-        </w:rPr>
-      </w:pPr>
-    </w:p>
     <w:sectPr>
       <w:footnotePr>
         <w:pos w:val="beneathText"/>
@@ -5527,7 +5878,7 @@
               <w:b w:val="0"/>
               <w:sz w:val="20"/>
             </w:rPr>
-            <w:t>6</w:t>
+            <w:t>7</w:t>
           </w:r>
         </w:p>
       </w:tc>
@@ -5599,7 +5950,7 @@
             <w:rPr>
               <w:sz w:val="20"/>
             </w:rPr>
-            <w:t>3</w:t>
+            <w:t>4</w:t>
           </w:r>
           <w:r>
             <w:rPr>

</xml_diff>

<commit_message>
finiti alcuni requisiti funzionali lasciati incompleti a seguito di chiarimenti con il team
</commit_message>
<xml_diff>
--- a/Deliverables/ProblemStatement_GGEyewear.docx
+++ b/Deliverables/ProblemStatement_GGEyewear.docx
@@ -267,7 +267,7 @@
           <w:szCs w:val="28"/>
         </w:rPr>
         <w:pict w14:anchorId="575A38CD">
-          <v:shape id="Immagine 1" o:spid="_x0000_i1026" type="#_x0000_t75" style="width:280.5pt;height:70.5pt;visibility:visible;mso-wrap-style:square">
+          <v:shape id="Immagine 1" o:spid="_x0000_i1026" type="#_x0000_t75" style="width:280.8pt;height:70.2pt;visibility:visible;mso-wrap-style:square">
             <v:imagedata r:id="rId8" o:title=""/>
           </v:shape>
         </w:pict>
@@ -2026,10 +2026,9 @@
           <w:tab w:val="left" w:pos="566"/>
         </w:tabs>
         <w:rPr>
-          <w:rFonts w:asciiTheme="minorHAnsi" w:eastAsiaTheme="minorEastAsia" w:hAnsiTheme="minorHAnsi" w:cstheme="minorBidi"/>
+          <w:rFonts w:ascii="Aptos" w:eastAsia="Times New Roman" w:hAnsi="Aptos" w:cs="Times New Roman"/>
           <w:noProof/>
           <w:kern w:val="2"/>
-          <w14:ligatures w14:val="standardContextual"/>
         </w:rPr>
       </w:pPr>
       <w:r>
@@ -2051,10 +2050,9 @@
         </w:r>
         <w:r>
           <w:rPr>
-            <w:rFonts w:asciiTheme="minorHAnsi" w:eastAsiaTheme="minorEastAsia" w:hAnsiTheme="minorHAnsi" w:cstheme="minorBidi"/>
+            <w:rFonts w:ascii="Aptos" w:eastAsia="Times New Roman" w:hAnsi="Aptos" w:cs="Times New Roman"/>
             <w:noProof/>
             <w:kern w:val="2"/>
-            <w14:ligatures w14:val="standardContextual"/>
           </w:rPr>
           <w:tab/>
         </w:r>
@@ -2122,10 +2120,9 @@
           <w:tab w:val="left" w:pos="566"/>
         </w:tabs>
         <w:rPr>
-          <w:rFonts w:asciiTheme="minorHAnsi" w:eastAsiaTheme="minorEastAsia" w:hAnsiTheme="minorHAnsi" w:cstheme="minorBidi"/>
+          <w:rFonts w:ascii="Aptos" w:eastAsia="Times New Roman" w:hAnsi="Aptos" w:cs="Times New Roman"/>
           <w:noProof/>
           <w:kern w:val="2"/>
-          <w14:ligatures w14:val="standardContextual"/>
         </w:rPr>
       </w:pPr>
       <w:hyperlink w:anchor="_Toc242864814" w:history="1">
@@ -2138,10 +2135,9 @@
         </w:r>
         <w:r>
           <w:rPr>
-            <w:rFonts w:asciiTheme="minorHAnsi" w:eastAsiaTheme="minorEastAsia" w:hAnsiTheme="minorHAnsi" w:cstheme="minorBidi"/>
+            <w:rFonts w:ascii="Aptos" w:eastAsia="Times New Roman" w:hAnsi="Aptos" w:cs="Times New Roman"/>
             <w:noProof/>
             <w:kern w:val="2"/>
-            <w14:ligatures w14:val="standardContextual"/>
           </w:rPr>
           <w:tab/>
         </w:r>
@@ -2209,10 +2205,9 @@
           <w:tab w:val="left" w:pos="849"/>
         </w:tabs>
         <w:rPr>
-          <w:rFonts w:asciiTheme="minorHAnsi" w:eastAsiaTheme="minorEastAsia" w:hAnsiTheme="minorHAnsi" w:cstheme="minorBidi"/>
+          <w:rFonts w:ascii="Aptos" w:eastAsia="Times New Roman" w:hAnsi="Aptos" w:cs="Times New Roman"/>
           <w:noProof/>
           <w:kern w:val="2"/>
-          <w14:ligatures w14:val="standardContextual"/>
         </w:rPr>
       </w:pPr>
       <w:hyperlink w:anchor="_Toc242864815" w:history="1">
@@ -2225,10 +2220,9 @@
         </w:r>
         <w:r>
           <w:rPr>
-            <w:rFonts w:asciiTheme="minorHAnsi" w:eastAsiaTheme="minorEastAsia" w:hAnsiTheme="minorHAnsi" w:cstheme="minorBidi"/>
+            <w:rFonts w:ascii="Aptos" w:eastAsia="Times New Roman" w:hAnsi="Aptos" w:cs="Times New Roman"/>
             <w:noProof/>
             <w:kern w:val="2"/>
-            <w14:ligatures w14:val="standardContextual"/>
           </w:rPr>
           <w:tab/>
         </w:r>
@@ -2296,10 +2290,9 @@
           <w:tab w:val="left" w:pos="849"/>
         </w:tabs>
         <w:rPr>
-          <w:rFonts w:asciiTheme="minorHAnsi" w:eastAsiaTheme="minorEastAsia" w:hAnsiTheme="minorHAnsi" w:cstheme="minorBidi"/>
+          <w:rFonts w:ascii="Aptos" w:eastAsia="Times New Roman" w:hAnsi="Aptos" w:cs="Times New Roman"/>
           <w:noProof/>
           <w:kern w:val="2"/>
-          <w14:ligatures w14:val="standardContextual"/>
         </w:rPr>
       </w:pPr>
       <w:hyperlink w:anchor="_Toc242864816" w:history="1">
@@ -2312,10 +2305,9 @@
         </w:r>
         <w:r>
           <w:rPr>
-            <w:rFonts w:asciiTheme="minorHAnsi" w:eastAsiaTheme="minorEastAsia" w:hAnsiTheme="minorHAnsi" w:cstheme="minorBidi"/>
+            <w:rFonts w:ascii="Aptos" w:eastAsia="Times New Roman" w:hAnsi="Aptos" w:cs="Times New Roman"/>
             <w:noProof/>
             <w:kern w:val="2"/>
-            <w14:ligatures w14:val="standardContextual"/>
           </w:rPr>
           <w:tab/>
         </w:r>
@@ -2383,10 +2375,9 @@
           <w:tab w:val="left" w:pos="849"/>
         </w:tabs>
         <w:rPr>
-          <w:rFonts w:asciiTheme="minorHAnsi" w:eastAsiaTheme="minorEastAsia" w:hAnsiTheme="minorHAnsi" w:cstheme="minorBidi"/>
+          <w:rFonts w:ascii="Aptos" w:eastAsia="Times New Roman" w:hAnsi="Aptos" w:cs="Times New Roman"/>
           <w:noProof/>
           <w:kern w:val="2"/>
-          <w14:ligatures w14:val="standardContextual"/>
         </w:rPr>
       </w:pPr>
       <w:hyperlink w:anchor="_Toc242864817" w:history="1">
@@ -2399,10 +2390,9 @@
         </w:r>
         <w:r>
           <w:rPr>
-            <w:rFonts w:asciiTheme="minorHAnsi" w:eastAsiaTheme="minorEastAsia" w:hAnsiTheme="minorHAnsi" w:cstheme="minorBidi"/>
+            <w:rFonts w:ascii="Aptos" w:eastAsia="Times New Roman" w:hAnsi="Aptos" w:cs="Times New Roman"/>
             <w:noProof/>
             <w:kern w:val="2"/>
-            <w14:ligatures w14:val="standardContextual"/>
           </w:rPr>
           <w:tab/>
         </w:r>
@@ -2470,10 +2460,9 @@
           <w:tab w:val="left" w:pos="849"/>
         </w:tabs>
         <w:rPr>
-          <w:rFonts w:asciiTheme="minorHAnsi" w:eastAsiaTheme="minorEastAsia" w:hAnsiTheme="minorHAnsi" w:cstheme="minorBidi"/>
+          <w:rFonts w:ascii="Aptos" w:eastAsia="Times New Roman" w:hAnsi="Aptos" w:cs="Times New Roman"/>
           <w:noProof/>
           <w:kern w:val="2"/>
-          <w14:ligatures w14:val="standardContextual"/>
         </w:rPr>
       </w:pPr>
       <w:hyperlink w:anchor="_Toc242864818" w:history="1">
@@ -2486,10 +2475,9 @@
         </w:r>
         <w:r>
           <w:rPr>
-            <w:rFonts w:asciiTheme="minorHAnsi" w:eastAsiaTheme="minorEastAsia" w:hAnsiTheme="minorHAnsi" w:cstheme="minorBidi"/>
+            <w:rFonts w:ascii="Aptos" w:eastAsia="Times New Roman" w:hAnsi="Aptos" w:cs="Times New Roman"/>
             <w:noProof/>
             <w:kern w:val="2"/>
-            <w14:ligatures w14:val="standardContextual"/>
           </w:rPr>
           <w:tab/>
         </w:r>
@@ -2557,10 +2545,9 @@
           <w:tab w:val="left" w:pos="566"/>
         </w:tabs>
         <w:rPr>
-          <w:rFonts w:asciiTheme="minorHAnsi" w:eastAsiaTheme="minorEastAsia" w:hAnsiTheme="minorHAnsi" w:cstheme="minorBidi"/>
+          <w:rFonts w:ascii="Aptos" w:eastAsia="Times New Roman" w:hAnsi="Aptos" w:cs="Times New Roman"/>
           <w:noProof/>
           <w:kern w:val="2"/>
-          <w14:ligatures w14:val="standardContextual"/>
         </w:rPr>
       </w:pPr>
       <w:hyperlink w:anchor="_Toc242864819" w:history="1">
@@ -2573,10 +2560,9 @@
         </w:r>
         <w:r>
           <w:rPr>
-            <w:rFonts w:asciiTheme="minorHAnsi" w:eastAsiaTheme="minorEastAsia" w:hAnsiTheme="minorHAnsi" w:cstheme="minorBidi"/>
+            <w:rFonts w:ascii="Aptos" w:eastAsia="Times New Roman" w:hAnsi="Aptos" w:cs="Times New Roman"/>
             <w:noProof/>
             <w:kern w:val="2"/>
-            <w14:ligatures w14:val="standardContextual"/>
           </w:rPr>
           <w:tab/>
         </w:r>
@@ -2644,10 +2630,9 @@
           <w:tab w:val="left" w:pos="566"/>
         </w:tabs>
         <w:rPr>
-          <w:rFonts w:asciiTheme="minorHAnsi" w:eastAsiaTheme="minorEastAsia" w:hAnsiTheme="minorHAnsi" w:cstheme="minorBidi"/>
+          <w:rFonts w:ascii="Aptos" w:eastAsia="Times New Roman" w:hAnsi="Aptos" w:cs="Times New Roman"/>
           <w:noProof/>
           <w:kern w:val="2"/>
-          <w14:ligatures w14:val="standardContextual"/>
         </w:rPr>
       </w:pPr>
       <w:hyperlink w:anchor="_Toc242864820" w:history="1">
@@ -2660,10 +2645,9 @@
         </w:r>
         <w:r>
           <w:rPr>
-            <w:rFonts w:asciiTheme="minorHAnsi" w:eastAsiaTheme="minorEastAsia" w:hAnsiTheme="minorHAnsi" w:cstheme="minorBidi"/>
+            <w:rFonts w:ascii="Aptos" w:eastAsia="Times New Roman" w:hAnsi="Aptos" w:cs="Times New Roman"/>
             <w:noProof/>
             <w:kern w:val="2"/>
-            <w14:ligatures w14:val="standardContextual"/>
           </w:rPr>
           <w:tab/>
         </w:r>
@@ -2731,10 +2715,9 @@
           <w:tab w:val="left" w:pos="1132"/>
         </w:tabs>
         <w:rPr>
-          <w:rFonts w:asciiTheme="minorHAnsi" w:eastAsiaTheme="minorEastAsia" w:hAnsiTheme="minorHAnsi" w:cstheme="minorBidi"/>
+          <w:rFonts w:ascii="Aptos" w:eastAsia="Times New Roman" w:hAnsi="Aptos" w:cs="Times New Roman"/>
           <w:noProof/>
           <w:kern w:val="2"/>
-          <w14:ligatures w14:val="standardContextual"/>
         </w:rPr>
       </w:pPr>
       <w:hyperlink w:anchor="_Toc242864821" w:history="1">
@@ -2747,10 +2730,9 @@
         </w:r>
         <w:r>
           <w:rPr>
-            <w:rFonts w:asciiTheme="minorHAnsi" w:eastAsiaTheme="minorEastAsia" w:hAnsiTheme="minorHAnsi" w:cstheme="minorBidi"/>
+            <w:rFonts w:ascii="Aptos" w:eastAsia="Times New Roman" w:hAnsi="Aptos" w:cs="Times New Roman"/>
             <w:noProof/>
             <w:kern w:val="2"/>
-            <w14:ligatures w14:val="standardContextual"/>
           </w:rPr>
           <w:tab/>
         </w:r>
@@ -2818,10 +2800,9 @@
           <w:tab w:val="left" w:pos="1132"/>
         </w:tabs>
         <w:rPr>
-          <w:rFonts w:asciiTheme="minorHAnsi" w:eastAsiaTheme="minorEastAsia" w:hAnsiTheme="minorHAnsi" w:cstheme="minorBidi"/>
+          <w:rFonts w:ascii="Aptos" w:eastAsia="Times New Roman" w:hAnsi="Aptos" w:cs="Times New Roman"/>
           <w:noProof/>
           <w:kern w:val="2"/>
-          <w14:ligatures w14:val="standardContextual"/>
         </w:rPr>
       </w:pPr>
       <w:hyperlink w:anchor="_Toc242864822" w:history="1">
@@ -2834,10 +2815,9 @@
         </w:r>
         <w:r>
           <w:rPr>
-            <w:rFonts w:asciiTheme="minorHAnsi" w:eastAsiaTheme="minorEastAsia" w:hAnsiTheme="minorHAnsi" w:cstheme="minorBidi"/>
+            <w:rFonts w:ascii="Aptos" w:eastAsia="Times New Roman" w:hAnsi="Aptos" w:cs="Times New Roman"/>
             <w:noProof/>
             <w:kern w:val="2"/>
-            <w14:ligatures w14:val="standardContextual"/>
           </w:rPr>
           <w:tab/>
         </w:r>
@@ -2905,10 +2885,9 @@
           <w:tab w:val="left" w:pos="1132"/>
         </w:tabs>
         <w:rPr>
-          <w:rFonts w:asciiTheme="minorHAnsi" w:eastAsiaTheme="minorEastAsia" w:hAnsiTheme="minorHAnsi" w:cstheme="minorBidi"/>
+          <w:rFonts w:ascii="Aptos" w:eastAsia="Times New Roman" w:hAnsi="Aptos" w:cs="Times New Roman"/>
           <w:noProof/>
           <w:kern w:val="2"/>
-          <w14:ligatures w14:val="standardContextual"/>
         </w:rPr>
       </w:pPr>
       <w:hyperlink w:anchor="_Toc242864823" w:history="1">
@@ -2921,10 +2900,9 @@
         </w:r>
         <w:r>
           <w:rPr>
-            <w:rFonts w:asciiTheme="minorHAnsi" w:eastAsiaTheme="minorEastAsia" w:hAnsiTheme="minorHAnsi" w:cstheme="minorBidi"/>
+            <w:rFonts w:ascii="Aptos" w:eastAsia="Times New Roman" w:hAnsi="Aptos" w:cs="Times New Roman"/>
             <w:noProof/>
             <w:kern w:val="2"/>
-            <w14:ligatures w14:val="standardContextual"/>
           </w:rPr>
           <w:tab/>
         </w:r>
@@ -2992,10 +2970,9 @@
           <w:tab w:val="left" w:pos="1132"/>
         </w:tabs>
         <w:rPr>
-          <w:rFonts w:asciiTheme="minorHAnsi" w:eastAsiaTheme="minorEastAsia" w:hAnsiTheme="minorHAnsi" w:cstheme="minorBidi"/>
+          <w:rFonts w:ascii="Aptos" w:eastAsia="Times New Roman" w:hAnsi="Aptos" w:cs="Times New Roman"/>
           <w:noProof/>
           <w:kern w:val="2"/>
-          <w14:ligatures w14:val="standardContextual"/>
         </w:rPr>
       </w:pPr>
       <w:hyperlink w:anchor="_Toc242864824" w:history="1">
@@ -3008,10 +2985,9 @@
         </w:r>
         <w:r>
           <w:rPr>
-            <w:rFonts w:asciiTheme="minorHAnsi" w:eastAsiaTheme="minorEastAsia" w:hAnsiTheme="minorHAnsi" w:cstheme="minorBidi"/>
+            <w:rFonts w:ascii="Aptos" w:eastAsia="Times New Roman" w:hAnsi="Aptos" w:cs="Times New Roman"/>
             <w:noProof/>
             <w:kern w:val="2"/>
-            <w14:ligatures w14:val="standardContextual"/>
           </w:rPr>
           <w:tab/>
         </w:r>
@@ -3079,10 +3055,9 @@
           <w:tab w:val="left" w:pos="566"/>
         </w:tabs>
         <w:rPr>
-          <w:rFonts w:asciiTheme="minorHAnsi" w:eastAsiaTheme="minorEastAsia" w:hAnsiTheme="minorHAnsi" w:cstheme="minorBidi"/>
+          <w:rFonts w:ascii="Aptos" w:eastAsia="Times New Roman" w:hAnsi="Aptos" w:cs="Times New Roman"/>
           <w:noProof/>
           <w:kern w:val="2"/>
-          <w14:ligatures w14:val="standardContextual"/>
         </w:rPr>
       </w:pPr>
       <w:hyperlink w:anchor="_Toc242864825" w:history="1">
@@ -3095,10 +3070,9 @@
         </w:r>
         <w:r>
           <w:rPr>
-            <w:rFonts w:asciiTheme="minorHAnsi" w:eastAsiaTheme="minorEastAsia" w:hAnsiTheme="minorHAnsi" w:cstheme="minorBidi"/>
+            <w:rFonts w:ascii="Aptos" w:eastAsia="Times New Roman" w:hAnsi="Aptos" w:cs="Times New Roman"/>
             <w:noProof/>
             <w:kern w:val="2"/>
-            <w14:ligatures w14:val="standardContextual"/>
           </w:rPr>
           <w:tab/>
         </w:r>
@@ -3166,10 +3140,9 @@
           <w:tab w:val="left" w:pos="566"/>
         </w:tabs>
         <w:rPr>
-          <w:rFonts w:asciiTheme="minorHAnsi" w:eastAsiaTheme="minorEastAsia" w:hAnsiTheme="minorHAnsi" w:cstheme="minorBidi"/>
+          <w:rFonts w:ascii="Aptos" w:eastAsia="Times New Roman" w:hAnsi="Aptos" w:cs="Times New Roman"/>
           <w:noProof/>
           <w:kern w:val="2"/>
-          <w14:ligatures w14:val="standardContextual"/>
         </w:rPr>
       </w:pPr>
       <w:hyperlink w:anchor="_Toc242864826" w:history="1">
@@ -3182,10 +3155,9 @@
         </w:r>
         <w:r>
           <w:rPr>
-            <w:rFonts w:asciiTheme="minorHAnsi" w:eastAsiaTheme="minorEastAsia" w:hAnsiTheme="minorHAnsi" w:cstheme="minorBidi"/>
+            <w:rFonts w:ascii="Aptos" w:eastAsia="Times New Roman" w:hAnsi="Aptos" w:cs="Times New Roman"/>
             <w:noProof/>
             <w:kern w:val="2"/>
-            <w14:ligatures w14:val="standardContextual"/>
           </w:rPr>
           <w:tab/>
         </w:r>
@@ -3803,7 +3775,13 @@
         <w:ind w:left="709"/>
       </w:pPr>
       <w:r>
-        <w:t>Vittoria decide di voler portare una nuova linea di occhiali come prodotto disponibile solo sul negozio online per attrarre nuova clientela. D</w:t>
+        <w:t xml:space="preserve">Vittoria decide di voler portare una nuova linea di occhiali come prodotto disponibile </w:t>
+      </w:r>
+      <w:r>
+        <w:t>sia nel negozio fisico sia</w:t>
+      </w:r>
+      <w:r>
+        <w:t xml:space="preserve"> sul negozio online per attrarre nuova clientela. D</w:t>
       </w:r>
       <w:r>
         <w:t xml:space="preserve">opo aver </w:t>
@@ -4171,7 +4149,10 @@
         <w:t xml:space="preserve"> </w:t>
       </w:r>
       <w:r>
-        <w:t>Il sistema deve permettere la navigazione del catalogo e la possibilità di applicare filtri alla ricerca come per genere, forma della montatura, colore, prezzo, oppure ricercare un modello tramite la barra di ricerca, e deve poter vedere tramite un tag se un prodotto è un’esclusiva online</w:t>
+        <w:t xml:space="preserve">Il sistema deve permettere la navigazione del catalogo e la possibilità di applicare filtri alla ricerca come per genere, forma della montatura, colore, prezzo, oppure ricercare un modello tramite la barra di ricerca, e deve poter vedere tramite un tag se un prodotto è </w:t>
+      </w:r>
+      <w:r>
+        <w:t>scontato</w:t>
       </w:r>
     </w:p>
     <w:p>
@@ -4258,7 +4239,11 @@
         <w:t xml:space="preserve"> indirizzo di spedizione e dati di pagamento</w:t>
       </w:r>
       <w:r>
-        <w:t>) con validazioni immediate sulle modifiche dei campi</w:t>
+        <w:t xml:space="preserve">) con validazioni immediate </w:t>
+      </w:r>
+      <w:r>
+        <w:lastRenderedPageBreak/>
+        <w:t>sulle modifiche dei campi</w:t>
       </w:r>
       <w:r>
         <w:t>.</w:t>
@@ -4277,7 +4262,6 @@
           <w:b/>
           <w:bCs/>
         </w:rPr>
-        <w:lastRenderedPageBreak/>
         <w:t>RF8:</w:t>
       </w:r>
       <w:r>
@@ -4290,7 +4274,7 @@
         <w:t xml:space="preserve"> </w:t>
       </w:r>
       <w:r>
-        <w:t>specificando prezzi, immagini, e quantità disponibili, e classificarli come esclusiva online o scontati</w:t>
+        <w:t>specificando prezzi, immagini, e quantità disponibili, e classificarli come scontati</w:t>
       </w:r>
     </w:p>
     <w:p>
@@ -6035,7 +6019,7 @@
         <v:path o:extrusionok="f" gradientshapeok="t" o:connecttype="rect"/>
         <o:lock v:ext="edit" aspectratio="t"/>
       </v:shapetype>
-      <v:shape id="_x0000_i1025" type="#_x0000_t75" style="width:321pt;height:249.75pt" o:bullet="t" filled="t">
+      <v:shape id="_x0000_i1046" type="#_x0000_t75" style="width:321pt;height:249.6pt" o:bullet="t" filled="t">
         <v:fill color2="black"/>
         <v:imagedata r:id="rId1" o:title=""/>
       </v:shape>

</xml_diff>

<commit_message>
Aggiunta di un requisitio funzionale per il Product Manager: può modificare le caratteristiche dei prodotti
</commit_message>
<xml_diff>
--- a/Deliverables/ProblemStatement_GGEyewear.docx
+++ b/Deliverables/ProblemStatement_GGEyewear.docx
@@ -180,7 +180,7 @@
           <w:sz w:val="36"/>
           <w:lang w:val="en-US"/>
         </w:rPr>
-        <w:t>7</w:t>
+        <w:t>8</w:t>
       </w:r>
       <w:r>
         <w:rPr>
@@ -266,11 +266,54 @@
           <w:sz w:val="28"/>
           <w:szCs w:val="28"/>
         </w:rPr>
-        <w:pict w14:anchorId="575A38CD">
-          <v:shape id="Immagine 1" o:spid="_x0000_i1026" type="#_x0000_t75" style="width:280.8pt;height:70.2pt;visibility:visible;mso-wrap-style:square">
-            <v:imagedata r:id="rId8" o:title=""/>
-          </v:shape>
-        </w:pict>
+        <w:drawing>
+          <wp:inline distT="0" distB="0" distL="0" distR="0" wp14:anchorId="575A38CD" wp14:editId="44FEA33E">
+            <wp:extent cx="3571875" cy="895350"/>
+            <wp:effectExtent l="0" t="0" r="0" b="0"/>
+            <wp:docPr id="2" name="Immagine 1"/>
+            <wp:cNvGraphicFramePr>
+              <a:graphicFrameLocks xmlns:a="http://schemas.openxmlformats.org/drawingml/2006/main" noChangeAspect="1"/>
+            </wp:cNvGraphicFramePr>
+            <a:graphic xmlns:a="http://schemas.openxmlformats.org/drawingml/2006/main">
+              <a:graphicData uri="http://schemas.openxmlformats.org/drawingml/2006/picture">
+                <pic:pic xmlns:pic="http://schemas.openxmlformats.org/drawingml/2006/picture">
+                  <pic:nvPicPr>
+                    <pic:cNvPr id="0" name="Immagine 1"/>
+                    <pic:cNvPicPr>
+                      <a:picLocks noChangeAspect="1" noChangeArrowheads="1"/>
+                    </pic:cNvPicPr>
+                  </pic:nvPicPr>
+                  <pic:blipFill>
+                    <a:blip r:embed="rId8">
+                      <a:extLst>
+                        <a:ext uri="{28A0092B-C50C-407E-A947-70E740481C1C}">
+                          <a14:useLocalDpi xmlns:a14="http://schemas.microsoft.com/office/drawing/2010/main" val="0"/>
+                        </a:ext>
+                      </a:extLst>
+                    </a:blip>
+                    <a:srcRect/>
+                    <a:stretch>
+                      <a:fillRect/>
+                    </a:stretch>
+                  </pic:blipFill>
+                  <pic:spPr bwMode="auto">
+                    <a:xfrm>
+                      <a:off x="0" y="0"/>
+                      <a:ext cx="3571875" cy="895350"/>
+                    </a:xfrm>
+                    <a:prstGeom prst="rect">
+                      <a:avLst/>
+                    </a:prstGeom>
+                    <a:noFill/>
+                    <a:ln>
+                      <a:noFill/>
+                    </a:ln>
+                  </pic:spPr>
+                </pic:pic>
+              </a:graphicData>
+            </a:graphic>
+          </wp:inline>
+        </w:drawing>
       </w:r>
     </w:p>
     <w:p>
@@ -363,7 +406,7 @@
         <w:rPr>
           <w:sz w:val="32"/>
         </w:rPr>
-        <w:t>1</w:t>
+        <w:t>2</w:t>
       </w:r>
       <w:r>
         <w:rPr>
@@ -1911,7 +1954,21 @@
               <w:rPr>
                 <w:sz w:val="20"/>
               </w:rPr>
-              <w:t xml:space="preserve">a degli identificativi dei requisiti funzionali e non funzionali e aggiunta del </w:t>
+              <w:t xml:space="preserve">a degli identificativi </w:t>
+            </w:r>
+            <w:proofErr w:type="gramStart"/>
+            <w:r>
+              <w:rPr>
+                <w:sz w:val="20"/>
+              </w:rPr>
+              <w:t>dei</w:t>
+            </w:r>
+            <w:proofErr w:type="gramEnd"/>
+            <w:r>
+              <w:rPr>
+                <w:sz w:val="20"/>
+              </w:rPr>
+              <w:t xml:space="preserve"> requisiti funzionali e non funzionali e aggiunta del </w:t>
             </w:r>
             <w:r>
               <w:rPr>
@@ -1924,6 +1981,111 @@
                 <w:sz w:val="20"/>
               </w:rPr>
               <w:t xml:space="preserve"> a Deliverables &amp; Deadlines</w:t>
+            </w:r>
+          </w:p>
+        </w:tc>
+        <w:tc>
+          <w:tcPr>
+            <w:tcW w:w="2410" w:type="dxa"/>
+            <w:tcBorders>
+              <w:top w:val="single" w:sz="4" w:space="0" w:color="auto"/>
+              <w:left w:val="single" w:sz="4" w:space="0" w:color="auto"/>
+              <w:bottom w:val="single" w:sz="4" w:space="0" w:color="auto"/>
+              <w:right w:val="single" w:sz="4" w:space="0" w:color="auto"/>
+            </w:tcBorders>
+          </w:tcPr>
+          <w:p>
+            <w:pPr>
+              <w:pStyle w:val="Contenutotabella"/>
+              <w:rPr>
+                <w:sz w:val="20"/>
+              </w:rPr>
+            </w:pPr>
+            <w:r>
+              <w:rPr>
+                <w:sz w:val="20"/>
+              </w:rPr>
+              <w:t>Gennaro Esposito</w:t>
+            </w:r>
+          </w:p>
+        </w:tc>
+      </w:tr>
+      <w:tr>
+        <w:trPr>
+          <w:trHeight w:val="230"/>
+        </w:trPr>
+        <w:tc>
+          <w:tcPr>
+            <w:tcW w:w="1927" w:type="dxa"/>
+            <w:tcBorders>
+              <w:top w:val="single" w:sz="4" w:space="0" w:color="auto"/>
+              <w:left w:val="single" w:sz="4" w:space="0" w:color="auto"/>
+              <w:bottom w:val="single" w:sz="4" w:space="0" w:color="auto"/>
+              <w:right w:val="single" w:sz="4" w:space="0" w:color="auto"/>
+            </w:tcBorders>
+          </w:tcPr>
+          <w:p>
+            <w:pPr>
+              <w:pStyle w:val="Contenutotabella"/>
+              <w:rPr>
+                <w:sz w:val="20"/>
+              </w:rPr>
+            </w:pPr>
+            <w:r>
+              <w:rPr>
+                <w:sz w:val="20"/>
+              </w:rPr>
+              <w:t>23/10/2026</w:t>
+            </w:r>
+          </w:p>
+        </w:tc>
+        <w:tc>
+          <w:tcPr>
+            <w:tcW w:w="964" w:type="dxa"/>
+            <w:tcBorders>
+              <w:top w:val="single" w:sz="4" w:space="0" w:color="auto"/>
+              <w:left w:val="single" w:sz="4" w:space="0" w:color="auto"/>
+              <w:bottom w:val="single" w:sz="4" w:space="0" w:color="auto"/>
+              <w:right w:val="single" w:sz="4" w:space="0" w:color="auto"/>
+            </w:tcBorders>
+          </w:tcPr>
+          <w:p>
+            <w:pPr>
+              <w:pStyle w:val="Contenutotabella"/>
+              <w:rPr>
+                <w:sz w:val="20"/>
+              </w:rPr>
+            </w:pPr>
+            <w:r>
+              <w:rPr>
+                <w:sz w:val="20"/>
+              </w:rPr>
+              <w:t>1.8</w:t>
+            </w:r>
+          </w:p>
+        </w:tc>
+        <w:tc>
+          <w:tcPr>
+            <w:tcW w:w="4336" w:type="dxa"/>
+            <w:tcBorders>
+              <w:top w:val="single" w:sz="4" w:space="0" w:color="auto"/>
+              <w:left w:val="single" w:sz="4" w:space="0" w:color="auto"/>
+              <w:bottom w:val="single" w:sz="4" w:space="0" w:color="auto"/>
+              <w:right w:val="single" w:sz="4" w:space="0" w:color="auto"/>
+            </w:tcBorders>
+          </w:tcPr>
+          <w:p>
+            <w:pPr>
+              <w:pStyle w:val="Contenutotabella"/>
+              <w:rPr>
+                <w:sz w:val="20"/>
+              </w:rPr>
+            </w:pPr>
+            <w:r>
+              <w:rPr>
+                <w:sz w:val="20"/>
+              </w:rPr>
+              <w:t>Aggiunta di un requisiti funzionale per il Product Manager, riguardante la modifica dei prodotti</w:t>
             </w:r>
           </w:p>
         </w:tc>
@@ -2571,7 +2733,21 @@
             <w:rStyle w:val="Collegamentoipertestuale"/>
             <w:noProof/>
           </w:rPr>
-          <w:t>FUNCTIONAL REQUIREMENTS</w:t>
+          <w:t>FUNCTIONAL R</w:t>
+        </w:r>
+        <w:r>
+          <w:rPr>
+            <w:rStyle w:val="Collegamentoipertestuale"/>
+            <w:noProof/>
+          </w:rPr>
+          <w:t>E</w:t>
+        </w:r>
+        <w:r>
+          <w:rPr>
+            <w:rStyle w:val="Collegamentoipertestuale"/>
+            <w:noProof/>
+          </w:rPr>
+          <w:t>QUIREMENTS</w:t>
         </w:r>
         <w:r>
           <w:rPr>
@@ -4104,6 +4280,9 @@
       <w:r>
         <w:t xml:space="preserve"> sua area personale</w:t>
       </w:r>
+      <w:r>
+        <w:t>.</w:t>
+      </w:r>
     </w:p>
     <w:p>
       <w:pPr>
@@ -4129,6 +4308,9 @@
       <w:r>
         <w:t>i ognuno di essi</w:t>
       </w:r>
+      <w:r>
+        <w:t>.</w:t>
+      </w:r>
     </w:p>
     <w:p>
       <w:pPr>
@@ -4154,6 +4336,9 @@
       <w:r>
         <w:t>scontato</w:t>
       </w:r>
+      <w:r>
+        <w:t>.</w:t>
+      </w:r>
     </w:p>
     <w:p>
       <w:pPr>
@@ -4176,6 +4361,9 @@
       <w:r>
         <w:t>Ogni prodotto deve mostrare una scheda dettagliata con immagini, descrizione, vari colori disponibili e prezzo</w:t>
       </w:r>
+      <w:r>
+        <w:t>.</w:t>
+      </w:r>
     </w:p>
     <w:p>
       <w:pPr>
@@ -4274,7 +4462,10 @@
         <w:t xml:space="preserve"> </w:t>
       </w:r>
       <w:r>
-        <w:t>specificando prezzi, immagini, e quantità disponibili, e classificarli come scontati</w:t>
+        <w:t>specificando prezzi, immagini, e quantità disponibili</w:t>
+      </w:r>
+      <w:r>
+        <w:t>.</w:t>
       </w:r>
     </w:p>
     <w:p>
@@ -4296,13 +4487,13 @@
         <w:t xml:space="preserve"> </w:t>
       </w:r>
       <w:r>
-        <w:t>Il Product Manager deve poter nascondere o disattivare prodotti dal catalogo pubblico (</w:t>
-      </w:r>
-      <w:r>
-        <w:t>equivalente a</w:t>
-      </w:r>
-      <w:r>
-        <w:t xml:space="preserve"> eliminare il prodotto per gli utenti con una soft delete in modo che sia disponibile comunque per lo storico)</w:t>
+        <w:t>Il Product Manager deve poter nascondere o disattivare prodotti dal catalogo pubblico</w:t>
+      </w:r>
+      <w:r>
+        <w:t xml:space="preserve"> (i prodotti continueranno a esser disponibili per lo storico)</w:t>
+      </w:r>
+      <w:r>
+        <w:t>.</w:t>
       </w:r>
     </w:p>
     <w:p>
@@ -4321,13 +4512,40 @@
         <w:t>RF10:</w:t>
       </w:r>
       <w:r>
+        <w:t xml:space="preserve"> Il Product Manager deve poter </w:t>
+      </w:r>
+      <w:r>
+        <w:t xml:space="preserve">modificare tutte le caratteristiche e gli aspetti di ogni </w:t>
+      </w:r>
+      <w:r>
+        <w:t>modell</w:t>
+      </w:r>
+      <w:r>
+        <w:t>o</w:t>
+      </w:r>
+      <w:r>
+        <w:t xml:space="preserve"> di occhial</w:t>
+      </w:r>
+      <w:r>
+        <w:t>e presente ne</w:t>
+      </w:r>
+      <w:r>
+        <w:t>l catalogo</w:t>
+      </w:r>
+      <w:r>
+        <w:t xml:space="preserve"> (prezzo,</w:t>
+      </w:r>
+      <w:r>
+        <w:t xml:space="preserve"> immagini,</w:t>
+      </w:r>
+      <w:r>
         <w:t xml:space="preserve"> </w:t>
       </w:r>
       <w:r>
-        <w:t>L’Order Manager</w:t>
-      </w:r>
-      <w:r>
-        <w:t xml:space="preserve"> deve accedere a una sua area gestionale che mostra i nuovi ordini ricevuti e da preparare nel negozio locale</w:t>
+        <w:t>quantità disponibili,</w:t>
+      </w:r>
+      <w:r>
+        <w:t xml:space="preserve"> …).</w:t>
       </w:r>
     </w:p>
     <w:p>
@@ -4343,13 +4561,72 @@
           <w:b/>
           <w:bCs/>
         </w:rPr>
-        <w:t>RF11:</w:t>
+        <w:t>RF1</w:t>
+      </w:r>
+      <w:r>
+        <w:rPr>
+          <w:b/>
+          <w:bCs/>
+        </w:rPr>
+        <w:t>1</w:t>
+      </w:r>
+      <w:r>
+        <w:rPr>
+          <w:b/>
+          <w:bCs/>
+        </w:rPr>
+        <w:t>:</w:t>
       </w:r>
       <w:r>
         <w:t xml:space="preserve"> </w:t>
       </w:r>
       <w:r>
+        <w:t>L’Order Manager</w:t>
+      </w:r>
+      <w:r>
+        <w:t xml:space="preserve"> deve accedere a una sua area gestionale che mostra i nuovi ordini ricevuti e da preparare nel negozio locale</w:t>
+      </w:r>
+      <w:r>
+        <w:t>.</w:t>
+      </w:r>
+    </w:p>
+    <w:p>
+      <w:pPr>
+        <w:numPr>
+          <w:ilvl w:val="0"/>
+          <w:numId w:val="15"/>
+        </w:numPr>
+        <w:ind w:left="709" w:hanging="283"/>
+      </w:pPr>
+      <w:r>
+        <w:rPr>
+          <w:b/>
+          <w:bCs/>
+        </w:rPr>
+        <w:t>RF1</w:t>
+      </w:r>
+      <w:r>
+        <w:rPr>
+          <w:b/>
+          <w:bCs/>
+        </w:rPr>
+        <w:t>2</w:t>
+      </w:r>
+      <w:r>
+        <w:rPr>
+          <w:b/>
+          <w:bCs/>
+        </w:rPr>
+        <w:t>:</w:t>
+      </w:r>
+      <w:r>
+        <w:t xml:space="preserve"> </w:t>
+      </w:r>
+      <w:r>
         <w:t>Il Market Analyzer deve poter accedere a una sua area gestionale dove può vedere una tabella con le statistiche degli ordini</w:t>
+      </w:r>
+      <w:r>
+        <w:t>.</w:t>
       </w:r>
     </w:p>
     <w:p/>
@@ -4612,7 +4889,11 @@
         <w:t xml:space="preserve"> </w:t>
       </w:r>
       <w:r>
-        <w:t>Per garantire affidabilità e sicurezza dei dati sensibili dei clienti e dei dipendenti, il sistema deve essere in grado di resistere a specifici attacchi di sicurezza. Vengono, pertanto, richieste all'utente la scelta di password robuste a protezione del suo account. Password che verranno poi criptate per i fini di sicurezza e conservate all'interno di un database (DB) protetto da un Firewall.</w:t>
+        <w:t xml:space="preserve">Per garantire affidabilità e sicurezza dei dati sensibili dei clienti e dei dipendenti, il sistema deve essere in grado di resistere a specifici attacchi di sicurezza. Vengono, pertanto, richieste all'utente la scelta di password robuste a protezione del suo account. Password che verranno poi criptate per i fini di sicurezza e conservate all'interno di un database (DB) </w:t>
+      </w:r>
+      <w:r>
+        <w:lastRenderedPageBreak/>
+        <w:t>protetto da un Firewall.</w:t>
       </w:r>
     </w:p>
     <w:p>
@@ -4629,7 +4910,6 @@
       </w:pPr>
       <w:bookmarkStart w:id="13" w:name="_Toc242864824"/>
       <w:r>
-        <w:lastRenderedPageBreak/>
         <w:t>Supportability</w:t>
       </w:r>
       <w:bookmarkEnd w:id="13"/>
@@ -5862,7 +6142,7 @@
               <w:b w:val="0"/>
               <w:sz w:val="20"/>
             </w:rPr>
-            <w:t>7</w:t>
+            <w:t>8</w:t>
           </w:r>
         </w:p>
       </w:tc>
@@ -5928,13 +6208,7 @@
             <w:rPr>
               <w:sz w:val="20"/>
             </w:rPr>
-            <w:t>1</w:t>
-          </w:r>
-          <w:r>
-            <w:rPr>
-              <w:sz w:val="20"/>
-            </w:rPr>
-            <w:t>4</w:t>
+            <w:t>23</w:t>
           </w:r>
           <w:r>
             <w:rPr>
@@ -6019,7 +6293,7 @@
         <v:path o:extrusionok="f" gradientshapeok="t" o:connecttype="rect"/>
         <o:lock v:ext="edit" aspectratio="t"/>
       </v:shapetype>
-      <v:shape id="_x0000_i1046" type="#_x0000_t75" style="width:321pt;height:249.6pt" o:bullet="t" filled="t">
+      <v:shape id="_x0000_i1025" type="#_x0000_t75" style="width:321pt;height:249.75pt" o:bullet="t" filled="t">
         <v:fill color2="black"/>
         <v:imagedata r:id="rId1" o:title=""/>
       </v:shape>

</xml_diff>

<commit_message>
Aggiunti scenari per l'inserimento di un prodotto e per l'analisi degli acquisti. Aggiunti requisiti funzionali riguardanti recensioni e Market Analyzer
</commit_message>
<xml_diff>
--- a/Deliverables/ProblemStatement_GGEyewear.docx
+++ b/Deliverables/ProblemStatement_GGEyewear.docx
@@ -2733,21 +2733,7 @@
             <w:rStyle w:val="Collegamentoipertestuale"/>
             <w:noProof/>
           </w:rPr>
-          <w:t>FUNCTIONAL R</w:t>
-        </w:r>
-        <w:r>
-          <w:rPr>
-            <w:rStyle w:val="Collegamentoipertestuale"/>
-            <w:noProof/>
-          </w:rPr>
-          <w:t>E</w:t>
-        </w:r>
-        <w:r>
-          <w:rPr>
-            <w:rStyle w:val="Collegamentoipertestuale"/>
-            <w:noProof/>
-          </w:rPr>
-          <w:t>QUIREMENTS</w:t>
+          <w:t>FUNCTIONAL REQUIREMENTS</w:t>
         </w:r>
         <w:r>
           <w:rPr>
@@ -4176,10 +4162,22 @@
         <w:t xml:space="preserve"> i prodotti in base a periodi di tempo</w:t>
       </w:r>
       <w:r>
-        <w:t xml:space="preserve"> (1 settimana, 1 mese, 1 anno)</w:t>
-      </w:r>
-      <w:r>
-        <w:t>, prezzi crescenti / decrescenti (per poter fare stime sul potere di acquisto dei clienti) e valutazioni medie</w:t>
+        <w:t xml:space="preserve"> (</w:t>
+      </w:r>
+      <w:r>
+        <w:t xml:space="preserve">es. </w:t>
+      </w:r>
+      <w:r>
+        <w:t>1 settimana, 1 mese, 1 anno)</w:t>
+      </w:r>
+      <w:r>
+        <w:t xml:space="preserve">, </w:t>
+      </w:r>
+      <w:r>
+        <w:t>fasce di prezzo</w:t>
+      </w:r>
+      <w:r>
+        <w:t xml:space="preserve"> (per poter fare stime sul potere di acquisto dei clienti) e valutazioni medie</w:t>
       </w:r>
       <w:r>
         <w:t>. Non sono presenti in questa tabella i dati personali dei clienti</w:t>
@@ -4359,7 +4357,16 @@
         <w:t xml:space="preserve"> </w:t>
       </w:r>
       <w:r>
-        <w:t>Ogni prodotto deve mostrare una scheda dettagliata con immagini, descrizione, vari colori disponibili e prezzo</w:t>
+        <w:t>Ogni prodotto deve mostrare una scheda dettagliata con immagini, descrizione, vari colori disponibili</w:t>
+      </w:r>
+      <w:r>
+        <w:t>,</w:t>
+      </w:r>
+      <w:r>
+        <w:t xml:space="preserve"> prezzo</w:t>
+      </w:r>
+      <w:r>
+        <w:t xml:space="preserve"> e recensioni annesse</w:t>
       </w:r>
       <w:r>
         <w:t>.</w:t>
@@ -4512,40 +4519,7 @@
         <w:t>RF10:</w:t>
       </w:r>
       <w:r>
-        <w:t xml:space="preserve"> Il Product Manager deve poter </w:t>
-      </w:r>
-      <w:r>
-        <w:t xml:space="preserve">modificare tutte le caratteristiche e gli aspetti di ogni </w:t>
-      </w:r>
-      <w:r>
-        <w:t>modell</w:t>
-      </w:r>
-      <w:r>
-        <w:t>o</w:t>
-      </w:r>
-      <w:r>
-        <w:t xml:space="preserve"> di occhial</w:t>
-      </w:r>
-      <w:r>
-        <w:t>e presente ne</w:t>
-      </w:r>
-      <w:r>
-        <w:t>l catalogo</w:t>
-      </w:r>
-      <w:r>
-        <w:t xml:space="preserve"> (prezzo,</w:t>
-      </w:r>
-      <w:r>
-        <w:t xml:space="preserve"> immagini,</w:t>
-      </w:r>
-      <w:r>
-        <w:t xml:space="preserve"> </w:t>
-      </w:r>
-      <w:r>
-        <w:t>quantità disponibili,</w:t>
-      </w:r>
-      <w:r>
-        <w:t xml:space="preserve"> …).</w:t>
+        <w:t xml:space="preserve"> Il Product Manager deve poter modificare tutte le caratteristiche e gli aspetti di ogni modello di occhiale presente nel catalogo (prezzo, immagini, quantità disponibili, …).</w:t>
       </w:r>
     </w:p>
     <w:p>

</xml_diff>